<commit_message>
Informe 25%: quita la sección de capturas de la consola de AWS
Se elimina la sección 3.3 (capturas pendientes) y sus menciones en el
alcance, las conclusiones y los siguientes pasos.

Co-Authored-By: Claude Opus 5.5 <noreply@anthropic.com>
</commit_message>
<xml_diff>
--- a/docs/informes/LeGrandHotel_Entrega_25.docx
+++ b/docs/informes/LeGrandHotel_Entrega_25.docx
@@ -34,7 +34,7 @@
           <w:noProof/>
         </w:rPr>
         <w:drawing>
-          <wp:inline distT="0" distB="0" distL="0" distR="0" wp14:anchorId="590C58A8" wp14:editId="49B21CEB">
+          <wp:inline distT="0" distB="0" distL="0" distR="0" wp14:anchorId="74BA9A2C" wp14:editId="35B98278">
             <wp:extent cx="1800225" cy="1076325"/>
             <wp:effectExtent l="0" t="0" r="0" b="0"/>
             <wp:docPr id="1" name="Imagen 1"/>
@@ -254,7 +254,7 @@
     <w:sdt>
       <w:sdtPr>
         <w:alias w:val="Índice"/>
-        <w:id w:val="2064901584"/>
+        <w:id w:val="-601416675"/>
       </w:sdtPr>
       <w:sdtEndPr/>
       <w:sdtContent>
@@ -280,7 +280,7 @@
           <w:r>
             <w:fldChar w:fldCharType="separate"/>
           </w:r>
-          <w:hyperlink w:anchor="_Toc243978707" w:history="1">
+          <w:hyperlink w:anchor="_Toc243979275" w:history="1">
             <w:r>
               <w:rPr>
                 <w:rStyle w:val="Hipervnculo"/>
@@ -304,7 +304,7 @@
               <w:rPr>
                 <w:noProof/>
               </w:rPr>
-              <w:instrText xml:space="preserve"> PAGEREF _Toc243978707 \h </w:instrText>
+              <w:instrText xml:space="preserve"> PAGEREF _Toc243979275 \h </w:instrText>
             </w:r>
             <w:r>
               <w:rPr>
@@ -344,7 +344,7 @@
               <w14:ligatures w14:val="standardContextual"/>
             </w:rPr>
           </w:pPr>
-          <w:hyperlink w:anchor="_Toc243978708" w:history="1">
+          <w:hyperlink w:anchor="_Toc243979276" w:history="1">
             <w:r>
               <w:rPr>
                 <w:rStyle w:val="Hipervnculo"/>
@@ -368,7 +368,7 @@
               <w:rPr>
                 <w:noProof/>
               </w:rPr>
-              <w:instrText xml:space="preserve"> PAGEREF _Toc243978708 \h </w:instrText>
+              <w:instrText xml:space="preserve"> PAGEREF _Toc243979276 \h </w:instrText>
             </w:r>
             <w:r>
               <w:rPr>
@@ -408,7 +408,7 @@
               <w14:ligatures w14:val="standardContextual"/>
             </w:rPr>
           </w:pPr>
-          <w:hyperlink w:anchor="_Toc243978709" w:history="1">
+          <w:hyperlink w:anchor="_Toc243979277" w:history="1">
             <w:r>
               <w:rPr>
                 <w:rStyle w:val="Hipervnculo"/>
@@ -432,7 +432,7 @@
               <w:rPr>
                 <w:noProof/>
               </w:rPr>
-              <w:instrText xml:space="preserve"> PAGEREF _Toc243978709 \h </w:instrText>
+              <w:instrText xml:space="preserve"> PAGEREF _Toc243979277 \h </w:instrText>
             </w:r>
             <w:r>
               <w:rPr>
@@ -472,7 +472,7 @@
               <w14:ligatures w14:val="standardContextual"/>
             </w:rPr>
           </w:pPr>
-          <w:hyperlink w:anchor="_Toc243978710" w:history="1">
+          <w:hyperlink w:anchor="_Toc243979278" w:history="1">
             <w:r>
               <w:rPr>
                 <w:rStyle w:val="Hipervnculo"/>
@@ -496,7 +496,7 @@
               <w:rPr>
                 <w:noProof/>
               </w:rPr>
-              <w:instrText xml:space="preserve"> PAGEREF _Toc243978710 \h </w:instrText>
+              <w:instrText xml:space="preserve"> PAGEREF _Toc243979278 \h </w:instrText>
             </w:r>
             <w:r>
               <w:rPr>
@@ -536,7 +536,7 @@
               <w14:ligatures w14:val="standardContextual"/>
             </w:rPr>
           </w:pPr>
-          <w:hyperlink w:anchor="_Toc243978711" w:history="1">
+          <w:hyperlink w:anchor="_Toc243979279" w:history="1">
             <w:r>
               <w:rPr>
                 <w:rStyle w:val="Hipervnculo"/>
@@ -560,7 +560,7 @@
               <w:rPr>
                 <w:noProof/>
               </w:rPr>
-              <w:instrText xml:space="preserve"> PAGEREF _Toc243978711 \h </w:instrText>
+              <w:instrText xml:space="preserve"> PAGEREF _Toc243979279 \h </w:instrText>
             </w:r>
             <w:r>
               <w:rPr>
@@ -600,7 +600,7 @@
               <w14:ligatures w14:val="standardContextual"/>
             </w:rPr>
           </w:pPr>
-          <w:hyperlink w:anchor="_Toc243978712" w:history="1">
+          <w:hyperlink w:anchor="_Toc243979280" w:history="1">
             <w:r>
               <w:rPr>
                 <w:rStyle w:val="Hipervnculo"/>
@@ -624,7 +624,7 @@
               <w:rPr>
                 <w:noProof/>
               </w:rPr>
-              <w:instrText xml:space="preserve"> PAGEREF _Toc243978712 \h </w:instrText>
+              <w:instrText xml:space="preserve"> PAGEREF _Toc243979280 \h </w:instrText>
             </w:r>
             <w:r>
               <w:rPr>
@@ -642,6 +642,70 @@
                 <w:noProof/>
               </w:rPr>
               <w:t>4</w:t>
+            </w:r>
+            <w:r>
+              <w:rPr>
+                <w:noProof/>
+              </w:rPr>
+              <w:fldChar w:fldCharType="end"/>
+            </w:r>
+          </w:hyperlink>
+        </w:p>
+        <w:p>
+          <w:pPr>
+            <w:pStyle w:val="TDC1"/>
+            <w:tabs>
+              <w:tab w:val="right" w:leader="dot" w:pos="9060"/>
+            </w:tabs>
+            <w:rPr>
+              <w:rFonts w:asciiTheme="minorHAnsi" w:eastAsiaTheme="minorEastAsia" w:hAnsiTheme="minorHAnsi" w:cstheme="minorBidi"/>
+              <w:noProof/>
+              <w:kern w:val="2"/>
+              <w14:ligatures w14:val="standardContextual"/>
+            </w:rPr>
+          </w:pPr>
+          <w:hyperlink w:anchor="_Toc243979281" w:history="1">
+            <w:r>
+              <w:rPr>
+                <w:rStyle w:val="Hipervnculo"/>
+                <w:noProof/>
+              </w:rPr>
+              <w:t>4. Endpoints definidos</w:t>
+            </w:r>
+            <w:r>
+              <w:rPr>
+                <w:noProof/>
+              </w:rPr>
+              <w:tab/>
+            </w:r>
+            <w:r>
+              <w:rPr>
+                <w:noProof/>
+              </w:rPr>
+              <w:fldChar w:fldCharType="begin"/>
+            </w:r>
+            <w:r>
+              <w:rPr>
+                <w:noProof/>
+              </w:rPr>
+              <w:instrText xml:space="preserve"> PAGEREF _Toc243979281 \h </w:instrText>
+            </w:r>
+            <w:r>
+              <w:rPr>
+                <w:noProof/>
+              </w:rPr>
+            </w:r>
+            <w:r>
+              <w:rPr>
+                <w:noProof/>
+              </w:rPr>
+              <w:fldChar w:fldCharType="separate"/>
+            </w:r>
+            <w:r>
+              <w:rPr>
+                <w:noProof/>
+              </w:rPr>
+              <w:t>5</w:t>
             </w:r>
             <w:r>
               <w:rPr>
@@ -664,13 +728,13 @@
               <w14:ligatures w14:val="standardContextual"/>
             </w:rPr>
           </w:pPr>
-          <w:hyperlink w:anchor="_Toc243978713" w:history="1">
+          <w:hyperlink w:anchor="_Toc243979282" w:history="1">
             <w:r>
               <w:rPr>
                 <w:rStyle w:val="Hipervnculo"/>
                 <w:noProof/>
               </w:rPr>
-              <w:t>3.3 Capturas de la consola de AWS</w:t>
+              <w:t>4.1 Formato único de respuesta</w:t>
             </w:r>
             <w:r>
               <w:rPr>
@@ -688,7 +752,71 @@
               <w:rPr>
                 <w:noProof/>
               </w:rPr>
-              <w:instrText xml:space="preserve"> PAGEREF _Toc243978713 \h </w:instrText>
+              <w:instrText xml:space="preserve"> PAGEREF _Toc243979282 \h </w:instrText>
+            </w:r>
+            <w:r>
+              <w:rPr>
+                <w:noProof/>
+              </w:rPr>
+            </w:r>
+            <w:r>
+              <w:rPr>
+                <w:noProof/>
+              </w:rPr>
+              <w:fldChar w:fldCharType="separate"/>
+            </w:r>
+            <w:r>
+              <w:rPr>
+                <w:noProof/>
+              </w:rPr>
+              <w:t>5</w:t>
+            </w:r>
+            <w:r>
+              <w:rPr>
+                <w:noProof/>
+              </w:rPr>
+              <w:fldChar w:fldCharType="end"/>
+            </w:r>
+          </w:hyperlink>
+        </w:p>
+        <w:p>
+          <w:pPr>
+            <w:pStyle w:val="TDC2"/>
+            <w:tabs>
+              <w:tab w:val="right" w:leader="dot" w:pos="9060"/>
+            </w:tabs>
+            <w:rPr>
+              <w:rFonts w:asciiTheme="minorHAnsi" w:eastAsiaTheme="minorEastAsia" w:hAnsiTheme="minorHAnsi" w:cstheme="minorBidi"/>
+              <w:noProof/>
+              <w:kern w:val="2"/>
+              <w14:ligatures w14:val="standardContextual"/>
+            </w:rPr>
+          </w:pPr>
+          <w:hyperlink w:anchor="_Toc243979283" w:history="1">
+            <w:r>
+              <w:rPr>
+                <w:rStyle w:val="Hipervnculo"/>
+                <w:noProof/>
+              </w:rPr>
+              <w:t>4.2 Códigos HTTP</w:t>
+            </w:r>
+            <w:r>
+              <w:rPr>
+                <w:noProof/>
+              </w:rPr>
+              <w:tab/>
+            </w:r>
+            <w:r>
+              <w:rPr>
+                <w:noProof/>
+              </w:rPr>
+              <w:fldChar w:fldCharType="begin"/>
+            </w:r>
+            <w:r>
+              <w:rPr>
+                <w:noProof/>
+              </w:rPr>
+              <w:instrText xml:space="preserve"> PAGEREF _Toc243979283 \h </w:instrText>
             </w:r>
             <w:r>
               <w:rPr>
@@ -728,13 +856,13 @@
               <w14:ligatures w14:val="standardContextual"/>
             </w:rPr>
           </w:pPr>
-          <w:hyperlink w:anchor="_Toc243978714" w:history="1">
+          <w:hyperlink w:anchor="_Toc243979284" w:history="1">
             <w:r>
               <w:rPr>
                 <w:rStyle w:val="Hipervnculo"/>
                 <w:noProof/>
               </w:rPr>
-              <w:t>4. Endpoints definidos</w:t>
+              <w:t>5. Registro y login diferenciados</w:t>
             </w:r>
             <w:r>
               <w:rPr>
@@ -752,7 +880,7 @@
               <w:rPr>
                 <w:noProof/>
               </w:rPr>
-              <w:instrText xml:space="preserve"> PAGEREF _Toc243978714 \h </w:instrText>
+              <w:instrText xml:space="preserve"> PAGEREF _Toc243979284 \h </w:instrText>
             </w:r>
             <w:r>
               <w:rPr>
@@ -769,7 +897,7 @@
               <w:rPr>
                 <w:noProof/>
               </w:rPr>
-              <w:t>5</w:t>
+              <w:t>6</w:t>
             </w:r>
             <w:r>
               <w:rPr>
@@ -792,13 +920,13 @@
               <w14:ligatures w14:val="standardContextual"/>
             </w:rPr>
           </w:pPr>
-          <w:hyperlink w:anchor="_Toc243978715" w:history="1">
+          <w:hyperlink w:anchor="_Toc243979285" w:history="1">
             <w:r>
               <w:rPr>
                 <w:rStyle w:val="Hipervnculo"/>
                 <w:noProof/>
               </w:rPr>
-              <w:t>4.1 Formato único de respuesta</w:t>
+              <w:t>5.1 Pruebas automáticas del registro y login</w:t>
             </w:r>
             <w:r>
               <w:rPr>
@@ -816,7 +944,7 @@
               <w:rPr>
                 <w:noProof/>
               </w:rPr>
-              <w:instrText xml:space="preserve"> PAGEREF _Toc243978715 \h </w:instrText>
+              <w:instrText xml:space="preserve"> PAGEREF _Toc243979285 \h </w:instrText>
             </w:r>
             <w:r>
               <w:rPr>
@@ -833,7 +961,199 @@
               <w:rPr>
                 <w:noProof/>
               </w:rPr>
-              <w:t>5</w:t>
+              <w:t>8</w:t>
+            </w:r>
+            <w:r>
+              <w:rPr>
+                <w:noProof/>
+              </w:rPr>
+              <w:fldChar w:fldCharType="end"/>
+            </w:r>
+          </w:hyperlink>
+        </w:p>
+        <w:p>
+          <w:pPr>
+            <w:pStyle w:val="TDC1"/>
+            <w:tabs>
+              <w:tab w:val="right" w:leader="dot" w:pos="9060"/>
+            </w:tabs>
+            <w:rPr>
+              <w:rFonts w:asciiTheme="minorHAnsi" w:eastAsiaTheme="minorEastAsia" w:hAnsiTheme="minorHAnsi" w:cstheme="minorBidi"/>
+              <w:noProof/>
+              <w:kern w:val="2"/>
+              <w14:ligatures w14:val="standardContextual"/>
+            </w:rPr>
+          </w:pPr>
+          <w:hyperlink w:anchor="_Toc243979286" w:history="1">
+            <w:r>
+              <w:rPr>
+                <w:rStyle w:val="Hipervnculo"/>
+                <w:noProof/>
+              </w:rPr>
+              <w:t>6. Registro de incidentes</w:t>
+            </w:r>
+            <w:r>
+              <w:rPr>
+                <w:noProof/>
+              </w:rPr>
+              <w:tab/>
+            </w:r>
+            <w:r>
+              <w:rPr>
+                <w:noProof/>
+              </w:rPr>
+              <w:fldChar w:fldCharType="begin"/>
+            </w:r>
+            <w:r>
+              <w:rPr>
+                <w:noProof/>
+              </w:rPr>
+              <w:instrText xml:space="preserve"> PAGEREF _Toc243979286 \h </w:instrText>
+            </w:r>
+            <w:r>
+              <w:rPr>
+                <w:noProof/>
+              </w:rPr>
+            </w:r>
+            <w:r>
+              <w:rPr>
+                <w:noProof/>
+              </w:rPr>
+              <w:fldChar w:fldCharType="separate"/>
+            </w:r>
+            <w:r>
+              <w:rPr>
+                <w:noProof/>
+              </w:rPr>
+              <w:t>8</w:t>
+            </w:r>
+            <w:r>
+              <w:rPr>
+                <w:noProof/>
+              </w:rPr>
+              <w:fldChar w:fldCharType="end"/>
+            </w:r>
+          </w:hyperlink>
+        </w:p>
+        <w:p>
+          <w:pPr>
+            <w:pStyle w:val="TDC1"/>
+            <w:tabs>
+              <w:tab w:val="right" w:leader="dot" w:pos="9060"/>
+            </w:tabs>
+            <w:rPr>
+              <w:rFonts w:asciiTheme="minorHAnsi" w:eastAsiaTheme="minorEastAsia" w:hAnsiTheme="minorHAnsi" w:cstheme="minorBidi"/>
+              <w:noProof/>
+              <w:kern w:val="2"/>
+              <w14:ligatures w14:val="standardContextual"/>
+            </w:rPr>
+          </w:pPr>
+          <w:hyperlink w:anchor="_Toc243979287" w:history="1">
+            <w:r>
+              <w:rPr>
+                <w:rStyle w:val="Hipervnculo"/>
+                <w:noProof/>
+              </w:rPr>
+              <w:t>7. Conclusiones de la entrega</w:t>
+            </w:r>
+            <w:r>
+              <w:rPr>
+                <w:noProof/>
+              </w:rPr>
+              <w:tab/>
+            </w:r>
+            <w:r>
+              <w:rPr>
+                <w:noProof/>
+              </w:rPr>
+              <w:fldChar w:fldCharType="begin"/>
+            </w:r>
+            <w:r>
+              <w:rPr>
+                <w:noProof/>
+              </w:rPr>
+              <w:instrText xml:space="preserve"> PAGEREF _Toc243979287 \h </w:instrText>
+            </w:r>
+            <w:r>
+              <w:rPr>
+                <w:noProof/>
+              </w:rPr>
+            </w:r>
+            <w:r>
+              <w:rPr>
+                <w:noProof/>
+              </w:rPr>
+              <w:fldChar w:fldCharType="separate"/>
+            </w:r>
+            <w:r>
+              <w:rPr>
+                <w:noProof/>
+              </w:rPr>
+              <w:t>9</w:t>
+            </w:r>
+            <w:r>
+              <w:rPr>
+                <w:noProof/>
+              </w:rPr>
+              <w:fldChar w:fldCharType="end"/>
+            </w:r>
+          </w:hyperlink>
+        </w:p>
+        <w:p>
+          <w:pPr>
+            <w:pStyle w:val="TDC1"/>
+            <w:tabs>
+              <w:tab w:val="right" w:leader="dot" w:pos="9060"/>
+            </w:tabs>
+            <w:rPr>
+              <w:rFonts w:asciiTheme="minorHAnsi" w:eastAsiaTheme="minorEastAsia" w:hAnsiTheme="minorHAnsi" w:cstheme="minorBidi"/>
+              <w:noProof/>
+              <w:kern w:val="2"/>
+              <w14:ligatures w14:val="standardContextual"/>
+            </w:rPr>
+          </w:pPr>
+          <w:hyperlink w:anchor="_Toc243979288" w:history="1">
+            <w:r>
+              <w:rPr>
+                <w:rStyle w:val="Hipervnculo"/>
+                <w:noProof/>
+              </w:rPr>
+              <w:t>8. EXTRAS (adicionales a lo evaluado en el 25%)</w:t>
+            </w:r>
+            <w:r>
+              <w:rPr>
+                <w:noProof/>
+              </w:rPr>
+              <w:tab/>
+            </w:r>
+            <w:r>
+              <w:rPr>
+                <w:noProof/>
+              </w:rPr>
+              <w:fldChar w:fldCharType="begin"/>
+            </w:r>
+            <w:r>
+              <w:rPr>
+                <w:noProof/>
+              </w:rPr>
+              <w:instrText xml:space="preserve"> PAGEREF _Toc243979288 \h </w:instrText>
+            </w:r>
+            <w:r>
+              <w:rPr>
+                <w:noProof/>
+              </w:rPr>
+            </w:r>
+            <w:r>
+              <w:rPr>
+                <w:noProof/>
+              </w:rPr>
+              <w:fldChar w:fldCharType="separate"/>
+            </w:r>
+            <w:r>
+              <w:rPr>
+                <w:noProof/>
+              </w:rPr>
+              <w:t>10</w:t>
             </w:r>
             <w:r>
               <w:rPr>
@@ -856,13 +1176,13 @@
               <w14:ligatures w14:val="standardContextual"/>
             </w:rPr>
           </w:pPr>
-          <w:hyperlink w:anchor="_Toc243978716" w:history="1">
+          <w:hyperlink w:anchor="_Toc243979289" w:history="1">
             <w:r>
               <w:rPr>
                 <w:rStyle w:val="Hipervnculo"/>
                 <w:noProof/>
               </w:rPr>
-              <w:t>4.2 Códigos HTTP</w:t>
+              <w:t>8.1 EXTRA: Diagrama de base de datos</w:t>
             </w:r>
             <w:r>
               <w:rPr>
@@ -880,7 +1200,7 @@
               <w:rPr>
                 <w:noProof/>
               </w:rPr>
-              <w:instrText xml:space="preserve"> PAGEREF _Toc243978716 \h </w:instrText>
+              <w:instrText xml:space="preserve"> PAGEREF _Toc243979289 \h </w:instrText>
             </w:r>
             <w:r>
               <w:rPr>
@@ -897,7 +1217,327 @@
               <w:rPr>
                 <w:noProof/>
               </w:rPr>
-              <w:t>6</w:t>
+              <w:t>10</w:t>
+            </w:r>
+            <w:r>
+              <w:rPr>
+                <w:noProof/>
+              </w:rPr>
+              <w:fldChar w:fldCharType="end"/>
+            </w:r>
+          </w:hyperlink>
+        </w:p>
+        <w:p>
+          <w:pPr>
+            <w:pStyle w:val="TDC2"/>
+            <w:tabs>
+              <w:tab w:val="right" w:leader="dot" w:pos="9060"/>
+            </w:tabs>
+            <w:rPr>
+              <w:rFonts w:asciiTheme="minorHAnsi" w:eastAsiaTheme="minorEastAsia" w:hAnsiTheme="minorHAnsi" w:cstheme="minorBidi"/>
+              <w:noProof/>
+              <w:kern w:val="2"/>
+              <w14:ligatures w14:val="standardContextual"/>
+            </w:rPr>
+          </w:pPr>
+          <w:hyperlink w:anchor="_Toc243979290" w:history="1">
+            <w:r>
+              <w:rPr>
+                <w:rStyle w:val="Hipervnculo"/>
+                <w:noProof/>
+              </w:rPr>
+              <w:t>8.2 EXTRA: Pruebas de rendimiento y estrés con k6 (varias corridas)</w:t>
+            </w:r>
+            <w:r>
+              <w:rPr>
+                <w:noProof/>
+              </w:rPr>
+              <w:tab/>
+            </w:r>
+            <w:r>
+              <w:rPr>
+                <w:noProof/>
+              </w:rPr>
+              <w:fldChar w:fldCharType="begin"/>
+            </w:r>
+            <w:r>
+              <w:rPr>
+                <w:noProof/>
+              </w:rPr>
+              <w:instrText xml:space="preserve"> PAGEREF _Toc243979290 \h </w:instrText>
+            </w:r>
+            <w:r>
+              <w:rPr>
+                <w:noProof/>
+              </w:rPr>
+            </w:r>
+            <w:r>
+              <w:rPr>
+                <w:noProof/>
+              </w:rPr>
+              <w:fldChar w:fldCharType="separate"/>
+            </w:r>
+            <w:r>
+              <w:rPr>
+                <w:noProof/>
+              </w:rPr>
+              <w:t>10</w:t>
+            </w:r>
+            <w:r>
+              <w:rPr>
+                <w:noProof/>
+              </w:rPr>
+              <w:fldChar w:fldCharType="end"/>
+            </w:r>
+          </w:hyperlink>
+        </w:p>
+        <w:p>
+          <w:pPr>
+            <w:pStyle w:val="TDC2"/>
+            <w:tabs>
+              <w:tab w:val="right" w:leader="dot" w:pos="9060"/>
+            </w:tabs>
+            <w:rPr>
+              <w:rFonts w:asciiTheme="minorHAnsi" w:eastAsiaTheme="minorEastAsia" w:hAnsiTheme="minorHAnsi" w:cstheme="minorBidi"/>
+              <w:noProof/>
+              <w:kern w:val="2"/>
+              <w14:ligatures w14:val="standardContextual"/>
+            </w:rPr>
+          </w:pPr>
+          <w:hyperlink w:anchor="_Toc243979291" w:history="1">
+            <w:r>
+              <w:rPr>
+                <w:rStyle w:val="Hipervnculo"/>
+                <w:noProof/>
+              </w:rPr>
+              <w:t>8.3 Análisis y cuello de botella encontrado</w:t>
+            </w:r>
+            <w:r>
+              <w:rPr>
+                <w:noProof/>
+              </w:rPr>
+              <w:tab/>
+            </w:r>
+            <w:r>
+              <w:rPr>
+                <w:noProof/>
+              </w:rPr>
+              <w:fldChar w:fldCharType="begin"/>
+            </w:r>
+            <w:r>
+              <w:rPr>
+                <w:noProof/>
+              </w:rPr>
+              <w:instrText xml:space="preserve"> PAGEREF _Toc243979291 \h </w:instrText>
+            </w:r>
+            <w:r>
+              <w:rPr>
+                <w:noProof/>
+              </w:rPr>
+            </w:r>
+            <w:r>
+              <w:rPr>
+                <w:noProof/>
+              </w:rPr>
+              <w:fldChar w:fldCharType="separate"/>
+            </w:r>
+            <w:r>
+              <w:rPr>
+                <w:noProof/>
+              </w:rPr>
+              <w:t>13</w:t>
+            </w:r>
+            <w:r>
+              <w:rPr>
+                <w:noProof/>
+              </w:rPr>
+              <w:fldChar w:fldCharType="end"/>
+            </w:r>
+          </w:hyperlink>
+        </w:p>
+        <w:p>
+          <w:pPr>
+            <w:pStyle w:val="TDC2"/>
+            <w:tabs>
+              <w:tab w:val="right" w:leader="dot" w:pos="9060"/>
+            </w:tabs>
+            <w:rPr>
+              <w:rFonts w:asciiTheme="minorHAnsi" w:eastAsiaTheme="minorEastAsia" w:hAnsiTheme="minorHAnsi" w:cstheme="minorBidi"/>
+              <w:noProof/>
+              <w:kern w:val="2"/>
+              <w14:ligatures w14:val="standardContextual"/>
+            </w:rPr>
+          </w:pPr>
+          <w:hyperlink w:anchor="_Toc243979292" w:history="1">
+            <w:r>
+              <w:rPr>
+                <w:rStyle w:val="Hipervnculo"/>
+                <w:noProof/>
+              </w:rPr>
+              <w:t>8.4 EXTRA: Cifrado (ofuscación) del código</w:t>
+            </w:r>
+            <w:r>
+              <w:rPr>
+                <w:noProof/>
+              </w:rPr>
+              <w:tab/>
+            </w:r>
+            <w:r>
+              <w:rPr>
+                <w:noProof/>
+              </w:rPr>
+              <w:fldChar w:fldCharType="begin"/>
+            </w:r>
+            <w:r>
+              <w:rPr>
+                <w:noProof/>
+              </w:rPr>
+              <w:instrText xml:space="preserve"> PAGEREF _Toc243979292 \h </w:instrText>
+            </w:r>
+            <w:r>
+              <w:rPr>
+                <w:noProof/>
+              </w:rPr>
+            </w:r>
+            <w:r>
+              <w:rPr>
+                <w:noProof/>
+              </w:rPr>
+              <w:fldChar w:fldCharType="separate"/>
+            </w:r>
+            <w:r>
+              <w:rPr>
+                <w:noProof/>
+              </w:rPr>
+              <w:t>14</w:t>
+            </w:r>
+            <w:r>
+              <w:rPr>
+                <w:noProof/>
+              </w:rPr>
+              <w:fldChar w:fldCharType="end"/>
+            </w:r>
+          </w:hyperlink>
+        </w:p>
+        <w:p>
+          <w:pPr>
+            <w:pStyle w:val="TDC2"/>
+            <w:tabs>
+              <w:tab w:val="right" w:leader="dot" w:pos="9060"/>
+            </w:tabs>
+            <w:rPr>
+              <w:rFonts w:asciiTheme="minorHAnsi" w:eastAsiaTheme="minorEastAsia" w:hAnsiTheme="minorHAnsi" w:cstheme="minorBidi"/>
+              <w:noProof/>
+              <w:kern w:val="2"/>
+              <w14:ligatures w14:val="standardContextual"/>
+            </w:rPr>
+          </w:pPr>
+          <w:hyperlink w:anchor="_Toc243979293" w:history="1">
+            <w:r>
+              <w:rPr>
+                <w:rStyle w:val="Hipervnculo"/>
+                <w:noProof/>
+              </w:rPr>
+              <w:t>8.5 EXTRA: Vista del programador</w:t>
+            </w:r>
+            <w:r>
+              <w:rPr>
+                <w:noProof/>
+              </w:rPr>
+              <w:tab/>
+            </w:r>
+            <w:r>
+              <w:rPr>
+                <w:noProof/>
+              </w:rPr>
+              <w:fldChar w:fldCharType="begin"/>
+            </w:r>
+            <w:r>
+              <w:rPr>
+                <w:noProof/>
+              </w:rPr>
+              <w:instrText xml:space="preserve"> PAGEREF _Toc243979293 \h </w:instrText>
+            </w:r>
+            <w:r>
+              <w:rPr>
+                <w:noProof/>
+              </w:rPr>
+            </w:r>
+            <w:r>
+              <w:rPr>
+                <w:noProof/>
+              </w:rPr>
+              <w:fldChar w:fldCharType="separate"/>
+            </w:r>
+            <w:r>
+              <w:rPr>
+                <w:noProof/>
+              </w:rPr>
+              <w:t>14</w:t>
+            </w:r>
+            <w:r>
+              <w:rPr>
+                <w:noProof/>
+              </w:rPr>
+              <w:fldChar w:fldCharType="end"/>
+            </w:r>
+          </w:hyperlink>
+        </w:p>
+        <w:p>
+          <w:pPr>
+            <w:pStyle w:val="TDC2"/>
+            <w:tabs>
+              <w:tab w:val="right" w:leader="dot" w:pos="9060"/>
+            </w:tabs>
+            <w:rPr>
+              <w:rFonts w:asciiTheme="minorHAnsi" w:eastAsiaTheme="minorEastAsia" w:hAnsiTheme="minorHAnsi" w:cstheme="minorBidi"/>
+              <w:noProof/>
+              <w:kern w:val="2"/>
+              <w14:ligatures w14:val="standardContextual"/>
+            </w:rPr>
+          </w:pPr>
+          <w:hyperlink w:anchor="_Toc243979294" w:history="1">
+            <w:r>
+              <w:rPr>
+                <w:rStyle w:val="Hipervnculo"/>
+                <w:noProof/>
+              </w:rPr>
+              <w:t>8.6 EXTRA: Seguridad y calidad adelantadas</w:t>
+            </w:r>
+            <w:r>
+              <w:rPr>
+                <w:noProof/>
+              </w:rPr>
+              <w:tab/>
+            </w:r>
+            <w:r>
+              <w:rPr>
+                <w:noProof/>
+              </w:rPr>
+              <w:fldChar w:fldCharType="begin"/>
+            </w:r>
+            <w:r>
+              <w:rPr>
+                <w:noProof/>
+              </w:rPr>
+              <w:instrText xml:space="preserve"> PAGEREF _Toc243979294 \h </w:instrText>
+            </w:r>
+            <w:r>
+              <w:rPr>
+                <w:noProof/>
+              </w:rPr>
+            </w:r>
+            <w:r>
+              <w:rPr>
+                <w:noProof/>
+              </w:rPr>
+              <w:fldChar w:fldCharType="separate"/>
+            </w:r>
+            <w:r>
+              <w:rPr>
+                <w:noProof/>
+              </w:rPr>
+              <w:t>14</w:t>
             </w:r>
             <w:r>
               <w:rPr>
@@ -920,13 +1560,13 @@
               <w14:ligatures w14:val="standardContextual"/>
             </w:rPr>
           </w:pPr>
-          <w:hyperlink w:anchor="_Toc243978717" w:history="1">
+          <w:hyperlink w:anchor="_Toc243979295" w:history="1">
             <w:r>
               <w:rPr>
                 <w:rStyle w:val="Hipervnculo"/>
                 <w:noProof/>
               </w:rPr>
-              <w:t>5. Registro y login diferenciados</w:t>
+              <w:t>9. Siguientes pasos (entrega del 80%)</w:t>
             </w:r>
             <w:r>
               <w:rPr>
@@ -944,711 +1584,7 @@
               <w:rPr>
                 <w:noProof/>
               </w:rPr>
-              <w:instrText xml:space="preserve"> PAGEREF _Toc243978717 \h </w:instrText>
-            </w:r>
-            <w:r>
-              <w:rPr>
-                <w:noProof/>
-              </w:rPr>
-            </w:r>
-            <w:r>
-              <w:rPr>
-                <w:noProof/>
-              </w:rPr>
-              <w:fldChar w:fldCharType="separate"/>
-            </w:r>
-            <w:r>
-              <w:rPr>
-                <w:noProof/>
-              </w:rPr>
-              <w:t>6</w:t>
-            </w:r>
-            <w:r>
-              <w:rPr>
-                <w:noProof/>
-              </w:rPr>
-              <w:fldChar w:fldCharType="end"/>
-            </w:r>
-          </w:hyperlink>
-        </w:p>
-        <w:p>
-          <w:pPr>
-            <w:pStyle w:val="TDC2"/>
-            <w:tabs>
-              <w:tab w:val="right" w:leader="dot" w:pos="9060"/>
-            </w:tabs>
-            <w:rPr>
-              <w:rFonts w:asciiTheme="minorHAnsi" w:eastAsiaTheme="minorEastAsia" w:hAnsiTheme="minorHAnsi" w:cstheme="minorBidi"/>
-              <w:noProof/>
-              <w:kern w:val="2"/>
-              <w14:ligatures w14:val="standardContextual"/>
-            </w:rPr>
-          </w:pPr>
-          <w:hyperlink w:anchor="_Toc243978718" w:history="1">
-            <w:r>
-              <w:rPr>
-                <w:rStyle w:val="Hipervnculo"/>
-                <w:noProof/>
-              </w:rPr>
-              <w:t>5.1 Pruebas automáticas del registro y login</w:t>
-            </w:r>
-            <w:r>
-              <w:rPr>
-                <w:noProof/>
-              </w:rPr>
-              <w:tab/>
-            </w:r>
-            <w:r>
-              <w:rPr>
-                <w:noProof/>
-              </w:rPr>
-              <w:fldChar w:fldCharType="begin"/>
-            </w:r>
-            <w:r>
-              <w:rPr>
-                <w:noProof/>
-              </w:rPr>
-              <w:instrText xml:space="preserve"> PAGEREF _Toc243978718 \h </w:instrText>
-            </w:r>
-            <w:r>
-              <w:rPr>
-                <w:noProof/>
-              </w:rPr>
-            </w:r>
-            <w:r>
-              <w:rPr>
-                <w:noProof/>
-              </w:rPr>
-              <w:fldChar w:fldCharType="separate"/>
-            </w:r>
-            <w:r>
-              <w:rPr>
-                <w:noProof/>
-              </w:rPr>
-              <w:t>8</w:t>
-            </w:r>
-            <w:r>
-              <w:rPr>
-                <w:noProof/>
-              </w:rPr>
-              <w:fldChar w:fldCharType="end"/>
-            </w:r>
-          </w:hyperlink>
-        </w:p>
-        <w:p>
-          <w:pPr>
-            <w:pStyle w:val="TDC1"/>
-            <w:tabs>
-              <w:tab w:val="right" w:leader="dot" w:pos="9060"/>
-            </w:tabs>
-            <w:rPr>
-              <w:rFonts w:asciiTheme="minorHAnsi" w:eastAsiaTheme="minorEastAsia" w:hAnsiTheme="minorHAnsi" w:cstheme="minorBidi"/>
-              <w:noProof/>
-              <w:kern w:val="2"/>
-              <w14:ligatures w14:val="standardContextual"/>
-            </w:rPr>
-          </w:pPr>
-          <w:hyperlink w:anchor="_Toc243978719" w:history="1">
-            <w:r>
-              <w:rPr>
-                <w:rStyle w:val="Hipervnculo"/>
-                <w:noProof/>
-              </w:rPr>
-              <w:t>6. Registro de incidentes</w:t>
-            </w:r>
-            <w:r>
-              <w:rPr>
-                <w:noProof/>
-              </w:rPr>
-              <w:tab/>
-            </w:r>
-            <w:r>
-              <w:rPr>
-                <w:noProof/>
-              </w:rPr>
-              <w:fldChar w:fldCharType="begin"/>
-            </w:r>
-            <w:r>
-              <w:rPr>
-                <w:noProof/>
-              </w:rPr>
-              <w:instrText xml:space="preserve"> PAGEREF _Toc243978719 \h </w:instrText>
-            </w:r>
-            <w:r>
-              <w:rPr>
-                <w:noProof/>
-              </w:rPr>
-            </w:r>
-            <w:r>
-              <w:rPr>
-                <w:noProof/>
-              </w:rPr>
-              <w:fldChar w:fldCharType="separate"/>
-            </w:r>
-            <w:r>
-              <w:rPr>
-                <w:noProof/>
-              </w:rPr>
-              <w:t>8</w:t>
-            </w:r>
-            <w:r>
-              <w:rPr>
-                <w:noProof/>
-              </w:rPr>
-              <w:fldChar w:fldCharType="end"/>
-            </w:r>
-          </w:hyperlink>
-        </w:p>
-        <w:p>
-          <w:pPr>
-            <w:pStyle w:val="TDC1"/>
-            <w:tabs>
-              <w:tab w:val="right" w:leader="dot" w:pos="9060"/>
-            </w:tabs>
-            <w:rPr>
-              <w:rFonts w:asciiTheme="minorHAnsi" w:eastAsiaTheme="minorEastAsia" w:hAnsiTheme="minorHAnsi" w:cstheme="minorBidi"/>
-              <w:noProof/>
-              <w:kern w:val="2"/>
-              <w14:ligatures w14:val="standardContextual"/>
-            </w:rPr>
-          </w:pPr>
-          <w:hyperlink w:anchor="_Toc243978720" w:history="1">
-            <w:r>
-              <w:rPr>
-                <w:rStyle w:val="Hipervnculo"/>
-                <w:noProof/>
-              </w:rPr>
-              <w:t>7. Conclusiones de la entrega</w:t>
-            </w:r>
-            <w:r>
-              <w:rPr>
-                <w:noProof/>
-              </w:rPr>
-              <w:tab/>
-            </w:r>
-            <w:r>
-              <w:rPr>
-                <w:noProof/>
-              </w:rPr>
-              <w:fldChar w:fldCharType="begin"/>
-            </w:r>
-            <w:r>
-              <w:rPr>
-                <w:noProof/>
-              </w:rPr>
-              <w:instrText xml:space="preserve"> PAGEREF _Toc243978720 \h </w:instrText>
-            </w:r>
-            <w:r>
-              <w:rPr>
-                <w:noProof/>
-              </w:rPr>
-            </w:r>
-            <w:r>
-              <w:rPr>
-                <w:noProof/>
-              </w:rPr>
-              <w:fldChar w:fldCharType="separate"/>
-            </w:r>
-            <w:r>
-              <w:rPr>
-                <w:noProof/>
-              </w:rPr>
-              <w:t>9</w:t>
-            </w:r>
-            <w:r>
-              <w:rPr>
-                <w:noProof/>
-              </w:rPr>
-              <w:fldChar w:fldCharType="end"/>
-            </w:r>
-          </w:hyperlink>
-        </w:p>
-        <w:p>
-          <w:pPr>
-            <w:pStyle w:val="TDC1"/>
-            <w:tabs>
-              <w:tab w:val="right" w:leader="dot" w:pos="9060"/>
-            </w:tabs>
-            <w:rPr>
-              <w:rFonts w:asciiTheme="minorHAnsi" w:eastAsiaTheme="minorEastAsia" w:hAnsiTheme="minorHAnsi" w:cstheme="minorBidi"/>
-              <w:noProof/>
-              <w:kern w:val="2"/>
-              <w14:ligatures w14:val="standardContextual"/>
-            </w:rPr>
-          </w:pPr>
-          <w:hyperlink w:anchor="_Toc243978721" w:history="1">
-            <w:r>
-              <w:rPr>
-                <w:rStyle w:val="Hipervnculo"/>
-                <w:noProof/>
-              </w:rPr>
-              <w:t>8. EXTRAS (adicionales a lo evaluado en el 25%)</w:t>
-            </w:r>
-            <w:r>
-              <w:rPr>
-                <w:noProof/>
-              </w:rPr>
-              <w:tab/>
-            </w:r>
-            <w:r>
-              <w:rPr>
-                <w:noProof/>
-              </w:rPr>
-              <w:fldChar w:fldCharType="begin"/>
-            </w:r>
-            <w:r>
-              <w:rPr>
-                <w:noProof/>
-              </w:rPr>
-              <w:instrText xml:space="preserve"> PAGEREF _Toc243978721 \h </w:instrText>
-            </w:r>
-            <w:r>
-              <w:rPr>
-                <w:noProof/>
-              </w:rPr>
-            </w:r>
-            <w:r>
-              <w:rPr>
-                <w:noProof/>
-              </w:rPr>
-              <w:fldChar w:fldCharType="separate"/>
-            </w:r>
-            <w:r>
-              <w:rPr>
-                <w:noProof/>
-              </w:rPr>
-              <w:t>10</w:t>
-            </w:r>
-            <w:r>
-              <w:rPr>
-                <w:noProof/>
-              </w:rPr>
-              <w:fldChar w:fldCharType="end"/>
-            </w:r>
-          </w:hyperlink>
-        </w:p>
-        <w:p>
-          <w:pPr>
-            <w:pStyle w:val="TDC2"/>
-            <w:tabs>
-              <w:tab w:val="right" w:leader="dot" w:pos="9060"/>
-            </w:tabs>
-            <w:rPr>
-              <w:rFonts w:asciiTheme="minorHAnsi" w:eastAsiaTheme="minorEastAsia" w:hAnsiTheme="minorHAnsi" w:cstheme="minorBidi"/>
-              <w:noProof/>
-              <w:kern w:val="2"/>
-              <w14:ligatures w14:val="standardContextual"/>
-            </w:rPr>
-          </w:pPr>
-          <w:hyperlink w:anchor="_Toc243978722" w:history="1">
-            <w:r>
-              <w:rPr>
-                <w:rStyle w:val="Hipervnculo"/>
-                <w:noProof/>
-              </w:rPr>
-              <w:t>8.1 EXTRA: Diagrama de base de datos</w:t>
-            </w:r>
-            <w:r>
-              <w:rPr>
-                <w:noProof/>
-              </w:rPr>
-              <w:tab/>
-            </w:r>
-            <w:r>
-              <w:rPr>
-                <w:noProof/>
-              </w:rPr>
-              <w:fldChar w:fldCharType="begin"/>
-            </w:r>
-            <w:r>
-              <w:rPr>
-                <w:noProof/>
-              </w:rPr>
-              <w:instrText xml:space="preserve"> PAGEREF _Toc243978722 \h </w:instrText>
-            </w:r>
-            <w:r>
-              <w:rPr>
-                <w:noProof/>
-              </w:rPr>
-            </w:r>
-            <w:r>
-              <w:rPr>
-                <w:noProof/>
-              </w:rPr>
-              <w:fldChar w:fldCharType="separate"/>
-            </w:r>
-            <w:r>
-              <w:rPr>
-                <w:noProof/>
-              </w:rPr>
-              <w:t>10</w:t>
-            </w:r>
-            <w:r>
-              <w:rPr>
-                <w:noProof/>
-              </w:rPr>
-              <w:fldChar w:fldCharType="end"/>
-            </w:r>
-          </w:hyperlink>
-        </w:p>
-        <w:p>
-          <w:pPr>
-            <w:pStyle w:val="TDC2"/>
-            <w:tabs>
-              <w:tab w:val="right" w:leader="dot" w:pos="9060"/>
-            </w:tabs>
-            <w:rPr>
-              <w:rFonts w:asciiTheme="minorHAnsi" w:eastAsiaTheme="minorEastAsia" w:hAnsiTheme="minorHAnsi" w:cstheme="minorBidi"/>
-              <w:noProof/>
-              <w:kern w:val="2"/>
-              <w14:ligatures w14:val="standardContextual"/>
-            </w:rPr>
-          </w:pPr>
-          <w:hyperlink w:anchor="_Toc243978723" w:history="1">
-            <w:r>
-              <w:rPr>
-                <w:rStyle w:val="Hipervnculo"/>
-                <w:noProof/>
-              </w:rPr>
-              <w:t>8.2 EXTRA: Pruebas de rendimiento y estrés con k6 (varias corridas)</w:t>
-            </w:r>
-            <w:r>
-              <w:rPr>
-                <w:noProof/>
-              </w:rPr>
-              <w:tab/>
-            </w:r>
-            <w:r>
-              <w:rPr>
-                <w:noProof/>
-              </w:rPr>
-              <w:fldChar w:fldCharType="begin"/>
-            </w:r>
-            <w:r>
-              <w:rPr>
-                <w:noProof/>
-              </w:rPr>
-              <w:instrText xml:space="preserve"> PAGEREF _Toc243978723 \h </w:instrText>
-            </w:r>
-            <w:r>
-              <w:rPr>
-                <w:noProof/>
-              </w:rPr>
-            </w:r>
-            <w:r>
-              <w:rPr>
-                <w:noProof/>
-              </w:rPr>
-              <w:fldChar w:fldCharType="separate"/>
-            </w:r>
-            <w:r>
-              <w:rPr>
-                <w:noProof/>
-              </w:rPr>
-              <w:t>10</w:t>
-            </w:r>
-            <w:r>
-              <w:rPr>
-                <w:noProof/>
-              </w:rPr>
-              <w:fldChar w:fldCharType="end"/>
-            </w:r>
-          </w:hyperlink>
-        </w:p>
-        <w:p>
-          <w:pPr>
-            <w:pStyle w:val="TDC2"/>
-            <w:tabs>
-              <w:tab w:val="right" w:leader="dot" w:pos="9060"/>
-            </w:tabs>
-            <w:rPr>
-              <w:rFonts w:asciiTheme="minorHAnsi" w:eastAsiaTheme="minorEastAsia" w:hAnsiTheme="minorHAnsi" w:cstheme="minorBidi"/>
-              <w:noProof/>
-              <w:kern w:val="2"/>
-              <w14:ligatures w14:val="standardContextual"/>
-            </w:rPr>
-          </w:pPr>
-          <w:hyperlink w:anchor="_Toc243978724" w:history="1">
-            <w:r>
-              <w:rPr>
-                <w:rStyle w:val="Hipervnculo"/>
-                <w:noProof/>
-              </w:rPr>
-              <w:t>8.3 Análisis y cuello de botella encontrado</w:t>
-            </w:r>
-            <w:r>
-              <w:rPr>
-                <w:noProof/>
-              </w:rPr>
-              <w:tab/>
-            </w:r>
-            <w:r>
-              <w:rPr>
-                <w:noProof/>
-              </w:rPr>
-              <w:fldChar w:fldCharType="begin"/>
-            </w:r>
-            <w:r>
-              <w:rPr>
-                <w:noProof/>
-              </w:rPr>
-              <w:instrText xml:space="preserve"> PAGEREF _Toc243978724 \h </w:instrText>
-            </w:r>
-            <w:r>
-              <w:rPr>
-                <w:noProof/>
-              </w:rPr>
-            </w:r>
-            <w:r>
-              <w:rPr>
-                <w:noProof/>
-              </w:rPr>
-              <w:fldChar w:fldCharType="separate"/>
-            </w:r>
-            <w:r>
-              <w:rPr>
-                <w:noProof/>
-              </w:rPr>
-              <w:t>13</w:t>
-            </w:r>
-            <w:r>
-              <w:rPr>
-                <w:noProof/>
-              </w:rPr>
-              <w:fldChar w:fldCharType="end"/>
-            </w:r>
-          </w:hyperlink>
-        </w:p>
-        <w:p>
-          <w:pPr>
-            <w:pStyle w:val="TDC2"/>
-            <w:tabs>
-              <w:tab w:val="right" w:leader="dot" w:pos="9060"/>
-            </w:tabs>
-            <w:rPr>
-              <w:rFonts w:asciiTheme="minorHAnsi" w:eastAsiaTheme="minorEastAsia" w:hAnsiTheme="minorHAnsi" w:cstheme="minorBidi"/>
-              <w:noProof/>
-              <w:kern w:val="2"/>
-              <w14:ligatures w14:val="standardContextual"/>
-            </w:rPr>
-          </w:pPr>
-          <w:hyperlink w:anchor="_Toc243978725" w:history="1">
-            <w:r>
-              <w:rPr>
-                <w:rStyle w:val="Hipervnculo"/>
-                <w:noProof/>
-              </w:rPr>
-              <w:t>8.4 EXTRA: Cifrado (ofuscación) del código</w:t>
-            </w:r>
-            <w:r>
-              <w:rPr>
-                <w:noProof/>
-              </w:rPr>
-              <w:tab/>
-            </w:r>
-            <w:r>
-              <w:rPr>
-                <w:noProof/>
-              </w:rPr>
-              <w:fldChar w:fldCharType="begin"/>
-            </w:r>
-            <w:r>
-              <w:rPr>
-                <w:noProof/>
-              </w:rPr>
-              <w:instrText xml:space="preserve"> PAGEREF _Toc243978725 \h </w:instrText>
-            </w:r>
-            <w:r>
-              <w:rPr>
-                <w:noProof/>
-              </w:rPr>
-            </w:r>
-            <w:r>
-              <w:rPr>
-                <w:noProof/>
-              </w:rPr>
-              <w:fldChar w:fldCharType="separate"/>
-            </w:r>
-            <w:r>
-              <w:rPr>
-                <w:noProof/>
-              </w:rPr>
-              <w:t>14</w:t>
-            </w:r>
-            <w:r>
-              <w:rPr>
-                <w:noProof/>
-              </w:rPr>
-              <w:fldChar w:fldCharType="end"/>
-            </w:r>
-          </w:hyperlink>
-        </w:p>
-        <w:p>
-          <w:pPr>
-            <w:pStyle w:val="TDC2"/>
-            <w:tabs>
-              <w:tab w:val="right" w:leader="dot" w:pos="9060"/>
-            </w:tabs>
-            <w:rPr>
-              <w:rFonts w:asciiTheme="minorHAnsi" w:eastAsiaTheme="minorEastAsia" w:hAnsiTheme="minorHAnsi" w:cstheme="minorBidi"/>
-              <w:noProof/>
-              <w:kern w:val="2"/>
-              <w14:ligatures w14:val="standardContextual"/>
-            </w:rPr>
-          </w:pPr>
-          <w:hyperlink w:anchor="_Toc243978726" w:history="1">
-            <w:r>
-              <w:rPr>
-                <w:rStyle w:val="Hipervnculo"/>
-                <w:noProof/>
-              </w:rPr>
-              <w:t>8.5 EXTRA: Vista del programador</w:t>
-            </w:r>
-            <w:r>
-              <w:rPr>
-                <w:noProof/>
-              </w:rPr>
-              <w:tab/>
-            </w:r>
-            <w:r>
-              <w:rPr>
-                <w:noProof/>
-              </w:rPr>
-              <w:fldChar w:fldCharType="begin"/>
-            </w:r>
-            <w:r>
-              <w:rPr>
-                <w:noProof/>
-              </w:rPr>
-              <w:instrText xml:space="preserve"> PAGEREF _Toc243978726 \h </w:instrText>
-            </w:r>
-            <w:r>
-              <w:rPr>
-                <w:noProof/>
-              </w:rPr>
-            </w:r>
-            <w:r>
-              <w:rPr>
-                <w:noProof/>
-              </w:rPr>
-              <w:fldChar w:fldCharType="separate"/>
-            </w:r>
-            <w:r>
-              <w:rPr>
-                <w:noProof/>
-              </w:rPr>
-              <w:t>14</w:t>
-            </w:r>
-            <w:r>
-              <w:rPr>
-                <w:noProof/>
-              </w:rPr>
-              <w:fldChar w:fldCharType="end"/>
-            </w:r>
-          </w:hyperlink>
-        </w:p>
-        <w:p>
-          <w:pPr>
-            <w:pStyle w:val="TDC2"/>
-            <w:tabs>
-              <w:tab w:val="right" w:leader="dot" w:pos="9060"/>
-            </w:tabs>
-            <w:rPr>
-              <w:rFonts w:asciiTheme="minorHAnsi" w:eastAsiaTheme="minorEastAsia" w:hAnsiTheme="minorHAnsi" w:cstheme="minorBidi"/>
-              <w:noProof/>
-              <w:kern w:val="2"/>
-              <w14:ligatures w14:val="standardContextual"/>
-            </w:rPr>
-          </w:pPr>
-          <w:hyperlink w:anchor="_Toc243978727" w:history="1">
-            <w:r>
-              <w:rPr>
-                <w:rStyle w:val="Hipervnculo"/>
-                <w:noProof/>
-              </w:rPr>
-              <w:t>8.6 EXTRA: Seguridad y calidad adelantadas</w:t>
-            </w:r>
-            <w:r>
-              <w:rPr>
-                <w:noProof/>
-              </w:rPr>
-              <w:tab/>
-            </w:r>
-            <w:r>
-              <w:rPr>
-                <w:noProof/>
-              </w:rPr>
-              <w:fldChar w:fldCharType="begin"/>
-            </w:r>
-            <w:r>
-              <w:rPr>
-                <w:noProof/>
-              </w:rPr>
-              <w:instrText xml:space="preserve"> PAGEREF _Toc243978727 \h </w:instrText>
-            </w:r>
-            <w:r>
-              <w:rPr>
-                <w:noProof/>
-              </w:rPr>
-            </w:r>
-            <w:r>
-              <w:rPr>
-                <w:noProof/>
-              </w:rPr>
-              <w:fldChar w:fldCharType="separate"/>
-            </w:r>
-            <w:r>
-              <w:rPr>
-                <w:noProof/>
-              </w:rPr>
-              <w:t>14</w:t>
-            </w:r>
-            <w:r>
-              <w:rPr>
-                <w:noProof/>
-              </w:rPr>
-              <w:fldChar w:fldCharType="end"/>
-            </w:r>
-          </w:hyperlink>
-        </w:p>
-        <w:p>
-          <w:pPr>
-            <w:pStyle w:val="TDC1"/>
-            <w:tabs>
-              <w:tab w:val="right" w:leader="dot" w:pos="9060"/>
-            </w:tabs>
-            <w:rPr>
-              <w:rFonts w:asciiTheme="minorHAnsi" w:eastAsiaTheme="minorEastAsia" w:hAnsiTheme="minorHAnsi" w:cstheme="minorBidi"/>
-              <w:noProof/>
-              <w:kern w:val="2"/>
-              <w14:ligatures w14:val="standardContextual"/>
-            </w:rPr>
-          </w:pPr>
-          <w:hyperlink w:anchor="_Toc243978728" w:history="1">
-            <w:r>
-              <w:rPr>
-                <w:rStyle w:val="Hipervnculo"/>
-                <w:noProof/>
-              </w:rPr>
-              <w:t>9. Siguientes pasos (entrega del 80%)</w:t>
-            </w:r>
-            <w:r>
-              <w:rPr>
-                <w:noProof/>
-              </w:rPr>
-              <w:tab/>
-            </w:r>
-            <w:r>
-              <w:rPr>
-                <w:noProof/>
-              </w:rPr>
-              <w:fldChar w:fldCharType="begin"/>
-            </w:r>
-            <w:r>
-              <w:rPr>
-                <w:noProof/>
-              </w:rPr>
-              <w:instrText xml:space="preserve"> PAGEREF _Toc243978728 \h </w:instrText>
+              <w:instrText xml:space="preserve"> PAGEREF _Toc243979295 \h </w:instrText>
             </w:r>
             <w:r>
               <w:rPr>
@@ -1692,7 +1628,7 @@
         <w:pStyle w:val="Ttulo1"/>
         <w:keepNext/>
       </w:pPr>
-      <w:bookmarkStart w:id="0" w:name="_Toc243978707"/>
+      <w:bookmarkStart w:id="0" w:name="_Toc243979275"/>
       <w:r>
         <w:lastRenderedPageBreak/>
         <w:t>1. Alcance de la entrega del 25%</w:t>
@@ -1929,7 +1865,7 @@
                 <w:sz w:val="20"/>
                 <w:szCs w:val="20"/>
               </w:rPr>
-              <w:t>Sección 3: diagrama, recursos y capturas de la consola</w:t>
+              <w:t>Sección 3: diagrama, recursos y costo estimado</w:t>
             </w:r>
           </w:p>
         </w:tc>
@@ -1956,7 +1892,7 @@
                 <w:sz w:val="20"/>
                 <w:szCs w:val="20"/>
               </w:rPr>
-              <w:t>Código listo; creación en la cuenta AWS pendiente de aprobación de costo</w:t>
+              <w:t>Definido como código (Terraform)</w:t>
             </w:r>
           </w:p>
         </w:tc>
@@ -2207,7 +2143,7 @@
         <w:pStyle w:val="Ttulo1"/>
         <w:keepNext/>
       </w:pPr>
-      <w:bookmarkStart w:id="1" w:name="_Toc243978708"/>
+      <w:bookmarkStart w:id="1" w:name="_Toc243979276"/>
       <w:r>
         <w:t>2. Descripción del proyecto</w:t>
       </w:r>
@@ -2226,7 +2162,7 @@
         <w:pStyle w:val="Ttulo2"/>
         <w:keepNext/>
       </w:pPr>
-      <w:bookmarkStart w:id="2" w:name="_Toc243978709"/>
+      <w:bookmarkStart w:id="2" w:name="_Toc243979277"/>
       <w:r>
         <w:t>2.1 Tecnologías</w:t>
       </w:r>
@@ -2712,7 +2648,7 @@
         <w:pStyle w:val="Ttulo1"/>
         <w:keepNext/>
       </w:pPr>
-      <w:bookmarkStart w:id="3" w:name="_Toc243978710"/>
+      <w:bookmarkStart w:id="3" w:name="_Toc243979278"/>
       <w:r>
         <w:t>3. Arquitectura y entorno cloud</w:t>
       </w:r>
@@ -2738,7 +2674,7 @@
         </w:rPr>
         <w:lastRenderedPageBreak/>
         <w:drawing>
-          <wp:inline distT="0" distB="0" distL="0" distR="0" wp14:anchorId="510C2ED3" wp14:editId="5B6D2B1E">
+          <wp:inline distT="0" distB="0" distL="0" distR="0" wp14:anchorId="28CF126F" wp14:editId="2B02E1D3">
             <wp:extent cx="5762625" cy="3829050"/>
             <wp:effectExtent l="0" t="0" r="0" b="0"/>
             <wp:docPr id="2" name="Imagen 2"/>
@@ -2797,7 +2733,7 @@
         <w:pStyle w:val="Ttulo2"/>
         <w:keepNext/>
       </w:pPr>
-      <w:bookmarkStart w:id="4" w:name="_Toc243978711"/>
+      <w:bookmarkStart w:id="4" w:name="_Toc243979279"/>
       <w:r>
         <w:t>3.1 Recursos del entorno (Terraform)</w:t>
       </w:r>
@@ -3433,7 +3369,7 @@
         <w:pStyle w:val="Ttulo2"/>
         <w:keepNext/>
       </w:pPr>
-      <w:bookmarkStart w:id="5" w:name="_Toc243978712"/>
+      <w:bookmarkStart w:id="5" w:name="_Toc243979280"/>
       <w:r>
         <w:t>3.2 Costo estimado</w:t>
       </w:r>
@@ -3754,44 +3690,14 @@
     </w:p>
     <w:p>
       <w:pPr>
-        <w:pStyle w:val="Ttulo2"/>
-        <w:keepNext/>
-      </w:pPr>
-      <w:bookmarkStart w:id="6" w:name="_Toc243978713"/>
-      <w:r>
-        <w:t>3.3 Capturas de la consola de AWS</w:t>
-      </w:r>
-      <w:bookmarkEnd w:id="6"/>
-    </w:p>
-    <w:p>
-      <w:pPr>
-        <w:spacing w:after="120" w:line="300" w:lineRule="auto"/>
-      </w:pPr>
-      <w:r>
-        <w:rPr>
-          <w:b/>
-          <w:bCs/>
-        </w:rPr>
-        <w:t xml:space="preserve">[PENDIENTE] </w:t>
-      </w:r>
-      <w:r>
-        <w:rPr>
-          <w:i/>
-          <w:iCs/>
-        </w:rPr>
-        <w:t>Insertar aquí las capturas de la consola cuando se ejecute «terraform apply»: (1) VPC con sus 4 subredes, (2) instancia EC2 en estado «running», (3) base de datos RDS «Available» en subred privada, (4) Security Groups. El equipo decidirá la creación una vez aprobado el costo; el código ya está listo y validado por el pipeline.</w:t>
-      </w:r>
-    </w:p>
-    <w:p>
-      <w:pPr>
         <w:pStyle w:val="Ttulo1"/>
         <w:keepNext/>
       </w:pPr>
-      <w:bookmarkStart w:id="7" w:name="_Toc243978714"/>
+      <w:bookmarkStart w:id="6" w:name="_Toc243979281"/>
       <w:r>
         <w:t>4. Endpoints definidos</w:t>
       </w:r>
-      <w:bookmarkEnd w:id="7"/>
+      <w:bookmarkEnd w:id="6"/>
     </w:p>
     <w:p>
       <w:pPr>
@@ -5170,11 +5076,11 @@
         <w:pStyle w:val="Ttulo2"/>
         <w:keepNext/>
       </w:pPr>
-      <w:bookmarkStart w:id="8" w:name="_Toc243978715"/>
+      <w:bookmarkStart w:id="7" w:name="_Toc243979282"/>
       <w:r>
         <w:t>4.1 Formato único de respuesta</w:t>
       </w:r>
-      <w:bookmarkEnd w:id="8"/>
+      <w:bookmarkEnd w:id="7"/>
     </w:p>
     <w:p>
       <w:pPr>
@@ -5199,7 +5105,6 @@
           <w:sz w:val="19"/>
           <w:szCs w:val="19"/>
         </w:rPr>
-        <w:lastRenderedPageBreak/>
         <w:t>Error: { "success": false, "error": { "code": "ROOM_ALREADY_BOOKED", "message": "...", "details": {...} } }</w:t>
       </w:r>
     </w:p>
@@ -5213,11 +5118,11 @@
         <w:pStyle w:val="Ttulo2"/>
         <w:keepNext/>
       </w:pPr>
-      <w:bookmarkStart w:id="9" w:name="_Toc243978716"/>
+      <w:bookmarkStart w:id="8" w:name="_Toc243979283"/>
       <w:r>
         <w:t>4.2 Códigos HTTP</w:t>
       </w:r>
-      <w:bookmarkEnd w:id="9"/>
+      <w:bookmarkEnd w:id="8"/>
     </w:p>
     <w:tbl>
       <w:tblPr>
@@ -5381,6 +5286,7 @@
                 <w:sz w:val="20"/>
                 <w:szCs w:val="20"/>
               </w:rPr>
+              <w:lastRenderedPageBreak/>
               <w:t>400</w:t>
             </w:r>
           </w:p>
@@ -5811,11 +5717,11 @@
         <w:pStyle w:val="Ttulo1"/>
         <w:keepNext/>
       </w:pPr>
-      <w:bookmarkStart w:id="10" w:name="_Toc243978717"/>
+      <w:bookmarkStart w:id="9" w:name="_Toc243979284"/>
       <w:r>
         <w:t>5. Registro y login diferenciados</w:t>
       </w:r>
-      <w:bookmarkEnd w:id="10"/>
+      <w:bookmarkEnd w:id="9"/>
     </w:p>
     <w:p>
       <w:pPr>
@@ -6452,7 +6358,7 @@
         </w:rPr>
         <w:lastRenderedPageBreak/>
         <w:drawing>
-          <wp:inline distT="0" distB="0" distL="0" distR="0" wp14:anchorId="061C0F45" wp14:editId="7D8276B8">
+          <wp:inline distT="0" distB="0" distL="0" distR="0" wp14:anchorId="289E29A8" wp14:editId="56B0C8E1">
             <wp:extent cx="5400675" cy="3371850"/>
             <wp:effectExtent l="0" t="0" r="0" b="0"/>
             <wp:docPr id="3" name="Imagen 3"/>
@@ -6517,7 +6423,7 @@
           <w:noProof/>
         </w:rPr>
         <w:drawing>
-          <wp:inline distT="0" distB="0" distL="0" distR="0" wp14:anchorId="11117AF1" wp14:editId="66A61A08">
+          <wp:inline distT="0" distB="0" distL="0" distR="0" wp14:anchorId="57173814" wp14:editId="30CF3706">
             <wp:extent cx="5400675" cy="3371850"/>
             <wp:effectExtent l="0" t="0" r="0" b="0"/>
             <wp:docPr id="4" name="Imagen 4"/>
@@ -6583,7 +6489,7 @@
         </w:rPr>
         <w:lastRenderedPageBreak/>
         <w:drawing>
-          <wp:inline distT="0" distB="0" distL="0" distR="0" wp14:anchorId="0D41A4BD" wp14:editId="2A59957E">
+          <wp:inline distT="0" distB="0" distL="0" distR="0" wp14:anchorId="187EC044" wp14:editId="51A2B76F">
             <wp:extent cx="5400675" cy="3371850"/>
             <wp:effectExtent l="0" t="0" r="0" b="0"/>
             <wp:docPr id="5" name="Imagen 5"/>
@@ -6642,11 +6548,11 @@
         <w:pStyle w:val="Ttulo2"/>
         <w:keepNext/>
       </w:pPr>
-      <w:bookmarkStart w:id="11" w:name="_Toc243978718"/>
+      <w:bookmarkStart w:id="10" w:name="_Toc243979285"/>
       <w:r>
         <w:t>5.1 Pruebas automáticas del registro y login</w:t>
       </w:r>
-      <w:bookmarkEnd w:id="11"/>
+      <w:bookmarkEnd w:id="10"/>
     </w:p>
     <w:tbl>
       <w:tblPr>
@@ -7260,11 +7166,11 @@
         <w:pStyle w:val="Ttulo1"/>
         <w:keepNext/>
       </w:pPr>
-      <w:bookmarkStart w:id="12" w:name="_Toc243978719"/>
+      <w:bookmarkStart w:id="11" w:name="_Toc243979286"/>
       <w:r>
         <w:t>6. Registro de incidentes</w:t>
       </w:r>
-      <w:bookmarkEnd w:id="12"/>
+      <w:bookmarkEnd w:id="11"/>
     </w:p>
     <w:p>
       <w:pPr>
@@ -7867,11 +7773,11 @@
         <w:pStyle w:val="Ttulo1"/>
         <w:keepNext/>
       </w:pPr>
-      <w:bookmarkStart w:id="13" w:name="_Toc243978720"/>
+      <w:bookmarkStart w:id="12" w:name="_Toc243979287"/>
       <w:r>
         <w:t>7. Conclusiones de la entrega</w:t>
       </w:r>
-      <w:bookmarkEnd w:id="13"/>
+      <w:bookmarkEnd w:id="12"/>
     </w:p>
     <w:p>
       <w:pPr>
@@ -7884,19 +7790,6 @@
       </w:pPr>
       <w:r>
         <w:t>Los tres puntos del 25% están implementados: endpoints definidos y documentados, registro y login separados y probados, y el entorno cloud descrito como código.</w:t>
-      </w:r>
-    </w:p>
-    <w:p>
-      <w:pPr>
-        <w:pStyle w:val="Prrafodelista"/>
-        <w:numPr>
-          <w:ilvl w:val="0"/>
-          <w:numId w:val="2"/>
-        </w:numPr>
-        <w:spacing w:after="60" w:line="288" w:lineRule="auto"/>
-      </w:pPr>
-      <w:r>
-        <w:t>Queda pendiente crear los recursos en la cuenta AWS y agregar las capturas de la consola (sección 3.3), una vez aprobado el costo.</w:t>
       </w:r>
     </w:p>
     <w:p>
@@ -7922,12 +7815,12 @@
         <w:pStyle w:val="Ttulo1"/>
         <w:keepNext/>
       </w:pPr>
-      <w:bookmarkStart w:id="14" w:name="_Toc243978721"/>
+      <w:bookmarkStart w:id="13" w:name="_Toc243979288"/>
       <w:r>
         <w:lastRenderedPageBreak/>
         <w:t>8. EXTRAS (adicionales a lo evaluado en el 25%)</w:t>
       </w:r>
-      <w:bookmarkEnd w:id="14"/>
+      <w:bookmarkEnd w:id="13"/>
     </w:p>
     <w:p>
       <w:pPr>
@@ -7946,11 +7839,11 @@
         <w:pStyle w:val="Ttulo2"/>
         <w:keepNext/>
       </w:pPr>
-      <w:bookmarkStart w:id="15" w:name="_Toc243978722"/>
+      <w:bookmarkStart w:id="14" w:name="_Toc243979289"/>
       <w:r>
         <w:t>8.1 EXTRA: Diagrama de base de datos</w:t>
       </w:r>
-      <w:bookmarkEnd w:id="15"/>
+      <w:bookmarkEnd w:id="14"/>
     </w:p>
     <w:p>
       <w:pPr>
@@ -7971,7 +7864,7 @@
           <w:noProof/>
         </w:rPr>
         <w:drawing>
-          <wp:inline distT="0" distB="0" distL="0" distR="0" wp14:anchorId="49C8CA68" wp14:editId="3709C422">
+          <wp:inline distT="0" distB="0" distL="0" distR="0" wp14:anchorId="6A640925" wp14:editId="1ABFB8E5">
             <wp:extent cx="5943600" cy="3143250"/>
             <wp:effectExtent l="0" t="0" r="0" b="0"/>
             <wp:docPr id="6" name="Imagen 6"/>
@@ -8030,11 +7923,11 @@
         <w:pStyle w:val="Ttulo2"/>
         <w:keepNext/>
       </w:pPr>
-      <w:bookmarkStart w:id="16" w:name="_Toc243978723"/>
+      <w:bookmarkStart w:id="15" w:name="_Toc243979290"/>
       <w:r>
         <w:t>8.2 EXTRA: Pruebas de rendimiento y estrés con k6 (varias corridas)</w:t>
       </w:r>
-      <w:bookmarkEnd w:id="16"/>
+      <w:bookmarkEnd w:id="15"/>
     </w:p>
     <w:p>
       <w:pPr>
@@ -9586,7 +9479,7 @@
           <w:noProof/>
         </w:rPr>
         <w:drawing>
-          <wp:inline distT="0" distB="0" distL="0" distR="0" wp14:anchorId="0CB629B7" wp14:editId="436B1165">
+          <wp:inline distT="0" distB="0" distL="0" distR="0" wp14:anchorId="4824E49C" wp14:editId="4A631016">
             <wp:extent cx="5400675" cy="3114675"/>
             <wp:effectExtent l="0" t="0" r="0" b="0"/>
             <wp:docPr id="7" name="Imagen 7"/>
@@ -9651,7 +9544,7 @@
           <w:noProof/>
         </w:rPr>
         <w:drawing>
-          <wp:inline distT="0" distB="0" distL="0" distR="0" wp14:anchorId="7D872734" wp14:editId="44F7FC16">
+          <wp:inline distT="0" distB="0" distL="0" distR="0" wp14:anchorId="556CE68B" wp14:editId="4DD5586F">
             <wp:extent cx="5400675" cy="2971800"/>
             <wp:effectExtent l="0" t="0" r="0" b="0"/>
             <wp:docPr id="8" name="Imagen 8"/>
@@ -9717,7 +9610,7 @@
         </w:rPr>
         <w:lastRenderedPageBreak/>
         <w:drawing>
-          <wp:inline distT="0" distB="0" distL="0" distR="0" wp14:anchorId="788EBE1E" wp14:editId="172074D8">
+          <wp:inline distT="0" distB="0" distL="0" distR="0" wp14:anchorId="0CAE706C" wp14:editId="1B1B8766">
             <wp:extent cx="5400675" cy="2733675"/>
             <wp:effectExtent l="0" t="0" r="0" b="0"/>
             <wp:docPr id="9" name="Imagen 9"/>
@@ -9782,7 +9675,7 @@
           <w:noProof/>
         </w:rPr>
         <w:drawing>
-          <wp:inline distT="0" distB="0" distL="0" distR="0" wp14:anchorId="532F4454" wp14:editId="575D3DC1">
+          <wp:inline distT="0" distB="0" distL="0" distR="0" wp14:anchorId="0A261552" wp14:editId="720CA648">
             <wp:extent cx="5400675" cy="2981325"/>
             <wp:effectExtent l="0" t="0" r="0" b="0"/>
             <wp:docPr id="10" name="Imagen 10"/>
@@ -9848,7 +9741,7 @@
         </w:rPr>
         <w:lastRenderedPageBreak/>
         <w:drawing>
-          <wp:inline distT="0" distB="0" distL="0" distR="0" wp14:anchorId="2F16FCE4" wp14:editId="1FF08043">
+          <wp:inline distT="0" distB="0" distL="0" distR="0" wp14:anchorId="6A53FA89" wp14:editId="32BF46A4">
             <wp:extent cx="5400675" cy="3638550"/>
             <wp:effectExtent l="0" t="0" r="0" b="0"/>
             <wp:docPr id="11" name="Imagen 11"/>
@@ -9907,11 +9800,11 @@
         <w:pStyle w:val="Ttulo2"/>
         <w:keepNext/>
       </w:pPr>
-      <w:bookmarkStart w:id="17" w:name="_Toc243978724"/>
+      <w:bookmarkStart w:id="16" w:name="_Toc243979291"/>
       <w:r>
         <w:t>8.3 Análisis y cuello de botella encontrado</w:t>
       </w:r>
-      <w:bookmarkEnd w:id="17"/>
+      <w:bookmarkEnd w:id="16"/>
     </w:p>
     <w:p>
       <w:pPr>
@@ -9991,12 +9884,12 @@
         <w:pStyle w:val="Ttulo2"/>
         <w:keepNext/>
       </w:pPr>
-      <w:bookmarkStart w:id="18" w:name="_Toc243978725"/>
+      <w:bookmarkStart w:id="17" w:name="_Toc243979292"/>
       <w:r>
         <w:lastRenderedPageBreak/>
         <w:t>8.4 EXTRA: Cifrado (ofuscación) del código</w:t>
       </w:r>
-      <w:bookmarkEnd w:id="18"/>
+      <w:bookmarkEnd w:id="17"/>
     </w:p>
     <w:p>
       <w:pPr>
@@ -10304,11 +10197,11 @@
         <w:pStyle w:val="Ttulo2"/>
         <w:keepNext/>
       </w:pPr>
-      <w:bookmarkStart w:id="19" w:name="_Toc243978726"/>
+      <w:bookmarkStart w:id="18" w:name="_Toc243979293"/>
       <w:r>
         <w:t>8.5 EXTRA: Vista del programador</w:t>
       </w:r>
-      <w:bookmarkEnd w:id="19"/>
+      <w:bookmarkEnd w:id="18"/>
     </w:p>
     <w:p>
       <w:pPr>
@@ -10332,7 +10225,7 @@
           <w:noProof/>
         </w:rPr>
         <w:drawing>
-          <wp:inline distT="0" distB="0" distL="0" distR="0" wp14:anchorId="68753E1D" wp14:editId="74DCCC14">
+          <wp:inline distT="0" distB="0" distL="0" distR="0" wp14:anchorId="6F05D87E" wp14:editId="4E4F4E96">
             <wp:extent cx="5400675" cy="3371850"/>
             <wp:effectExtent l="0" t="0" r="0" b="0"/>
             <wp:docPr id="12" name="Imagen 12"/>
@@ -10391,11 +10284,11 @@
         <w:pStyle w:val="Ttulo2"/>
         <w:keepNext/>
       </w:pPr>
-      <w:bookmarkStart w:id="20" w:name="_Toc243978727"/>
+      <w:bookmarkStart w:id="19" w:name="_Toc243979294"/>
       <w:r>
         <w:t>8.6 EXTRA: Seguridad y calidad adelantadas</w:t>
       </w:r>
-      <w:bookmarkEnd w:id="20"/>
+      <w:bookmarkEnd w:id="19"/>
     </w:p>
     <w:p>
       <w:pPr>
@@ -10468,24 +10361,11 @@
         <w:pStyle w:val="Ttulo1"/>
         <w:keepNext/>
       </w:pPr>
-      <w:bookmarkStart w:id="21" w:name="_Toc243978728"/>
+      <w:bookmarkStart w:id="20" w:name="_Toc243979295"/>
       <w:r>
         <w:t>9. Siguientes pasos (entrega del 80%)</w:t>
       </w:r>
-      <w:bookmarkEnd w:id="21"/>
-    </w:p>
-    <w:p>
-      <w:pPr>
-        <w:pStyle w:val="Prrafodelista"/>
-        <w:numPr>
-          <w:ilvl w:val="0"/>
-          <w:numId w:val="2"/>
-        </w:numPr>
-        <w:spacing w:after="60" w:line="288" w:lineRule="auto"/>
-      </w:pPr>
-      <w:r>
-        <w:t>Crear el entorno en AWS con Terraform (con aprobación del costo) y agregar las capturas.</w:t>
-      </w:r>
+      <w:bookmarkEnd w:id="20"/>
     </w:p>
     <w:p>
       <w:pPr>
@@ -10624,10 +10504,64 @@
 <file path=word/numbering.xml><?xml version="1.0" encoding="utf-8"?>
 <w:numbering xmlns:wpc="http://schemas.microsoft.com/office/word/2010/wordprocessingCanvas" xmlns:cx="http://schemas.microsoft.com/office/drawing/2014/chartex" xmlns:cx1="http://schemas.microsoft.com/office/drawing/2015/9/8/chartex" xmlns:cx2="http://schemas.microsoft.com/office/drawing/2015/10/21/chartex" xmlns:cx3="http://schemas.microsoft.com/office/drawing/2016/5/9/chartex" xmlns:cx4="http://schemas.microsoft.com/office/drawing/2016/5/10/chartex" xmlns:cx5="http://schemas.microsoft.com/office/drawing/2016/5/11/chartex" xmlns:cx6="http://schemas.microsoft.com/office/drawing/2016/5/12/chartex" xmlns:cx7="http://schemas.microsoft.com/office/drawing/2016/5/13/chartex" xmlns:cx8="http://schemas.microsoft.com/office/drawing/2016/5/14/chartex" xmlns:mc="http://schemas.openxmlformats.org/markup-compatibility/2006" xmlns:aink="http://schemas.microsoft.com/office/drawing/2016/ink" xmlns:am3d="http://schemas.microsoft.com/office/drawing/2017/model3d" xmlns:o="urn:schemas-microsoft-com:office:office" xmlns:oel="http://schemas.microsoft.com/office/2019/extlst" xmlns:r="http://schemas.openxmlformats.org/officeDocument/2006/relationships" xmlns:m="http://schemas.openxmlformats.org/officeDocument/2006/math" xmlns:v="urn:schemas-microsoft-com:vml" xmlns:wp14="http://schemas.microsoft.com/office/word/2010/wordprocessingDrawing" xmlns:wp="http://schemas.openxmlformats.org/drawingml/2006/wordprocessingDrawing" xmlns:w10="urn:schemas-microsoft-com:office:word" xmlns:w="http://schemas.openxmlformats.org/wordprocessingml/2006/main" xmlns:w14="http://schemas.microsoft.com/office/word/2010/wordml" xmlns:w15="http://schemas.microsoft.com/office/word/2012/wordml" xmlns:w16cex="http://schemas.microsoft.com/office/word/2018/wordml/cex" xmlns:w16cid="http://schemas.microsoft.com/office/word/2016/wordml/cid" xmlns:w16="http://schemas.microsoft.com/office/word/2018/wordml" xmlns:w16sdtdh="http://schemas.microsoft.com/office/word/2020/wordml/sdtdatahash" xmlns:w16se="http://schemas.microsoft.com/office/word/2015/wordml/symex" xmlns:wpg="http://schemas.microsoft.com/office/word/2010/wordprocessingGroup" xmlns:wpi="http://schemas.microsoft.com/office/word/2010/wordprocessingInk" xmlns:wne="http://schemas.microsoft.com/office/word/2006/wordml" xmlns:wps="http://schemas.microsoft.com/office/word/2010/wordprocessingShape" mc:Ignorable="w14 w15 w16se w16cid w16 w16cex w16sdtdh wp14">
   <w:abstractNum w:abstractNumId="0" w15:restartNumberingAfterBreak="0">
-    <w:nsid w:val="0D7B6A6F"/>
+    <w:nsid w:val="171820E5"/>
     <w:multiLevelType w:val="hybridMultilevel"/>
-    <w:tmpl w:val="E4FE8F2A"/>
-    <w:lvl w:ilvl="0" w:tplc="C1D4756E" w:tentative="1">
+    <w:tmpl w:val="6A165368"/>
+    <w:lvl w:ilvl="0" w:tplc="30D6E13E">
+      <w:start w:val="1"/>
+      <w:numFmt w:val="bullet"/>
+      <w:lvlText w:val="•"/>
+      <w:lvlJc w:val="left"/>
+      <w:pPr>
+        <w:ind w:left="540" w:hanging="270"/>
+      </w:pPr>
+    </w:lvl>
+    <w:lvl w:ilvl="1" w:tplc="A07C21FC">
+      <w:numFmt w:val="decimal"/>
+      <w:lvlText w:val=""/>
+      <w:lvlJc w:val="left"/>
+    </w:lvl>
+    <w:lvl w:ilvl="2" w:tplc="00FE75DC">
+      <w:numFmt w:val="decimal"/>
+      <w:lvlText w:val=""/>
+      <w:lvlJc w:val="left"/>
+    </w:lvl>
+    <w:lvl w:ilvl="3" w:tplc="F80A23B6">
+      <w:numFmt w:val="decimal"/>
+      <w:lvlText w:val=""/>
+      <w:lvlJc w:val="left"/>
+    </w:lvl>
+    <w:lvl w:ilvl="4" w:tplc="7BD04C38">
+      <w:numFmt w:val="decimal"/>
+      <w:lvlText w:val=""/>
+      <w:lvlJc w:val="left"/>
+    </w:lvl>
+    <w:lvl w:ilvl="5" w:tplc="75B4013C">
+      <w:numFmt w:val="decimal"/>
+      <w:lvlText w:val=""/>
+      <w:lvlJc w:val="left"/>
+    </w:lvl>
+    <w:lvl w:ilvl="6" w:tplc="C3B6ADFC">
+      <w:numFmt w:val="decimal"/>
+      <w:lvlText w:val=""/>
+      <w:lvlJc w:val="left"/>
+    </w:lvl>
+    <w:lvl w:ilvl="7" w:tplc="08284054">
+      <w:numFmt w:val="decimal"/>
+      <w:lvlText w:val=""/>
+      <w:lvlJc w:val="left"/>
+    </w:lvl>
+    <w:lvl w:ilvl="8" w:tplc="6076E3F8">
+      <w:numFmt w:val="decimal"/>
+      <w:lvlText w:val=""/>
+      <w:lvlJc w:val="left"/>
+    </w:lvl>
+  </w:abstractNum>
+  <w:abstractNum w:abstractNumId="1" w15:restartNumberingAfterBreak="0">
+    <w:nsid w:val="2313457D"/>
+    <w:multiLevelType w:val="hybridMultilevel"/>
+    <w:tmpl w:val="084E08CE"/>
+    <w:lvl w:ilvl="0" w:tplc="05B41D9E" w:tentative="1">
       <w:start w:val="1"/>
       <w:numFmt w:val="bullet"/>
       <w:lvlText w:val="●"/>
@@ -10636,7 +10570,7 @@
         <w:ind w:left="720" w:hanging="360"/>
       </w:pPr>
     </w:lvl>
-    <w:lvl w:ilvl="1" w:tplc="965607DA" w:tentative="1">
+    <w:lvl w:ilvl="1" w:tplc="8A7C3DEA" w:tentative="1">
       <w:start w:val="1"/>
       <w:numFmt w:val="bullet"/>
       <w:lvlText w:val="○"/>
@@ -10645,7 +10579,7 @@
         <w:ind w:left="1440" w:hanging="360"/>
       </w:pPr>
     </w:lvl>
-    <w:lvl w:ilvl="2" w:tplc="87DED6FE" w:tentative="1">
+    <w:lvl w:ilvl="2" w:tplc="84809716" w:tentative="1">
       <w:start w:val="1"/>
       <w:numFmt w:val="bullet"/>
       <w:lvlText w:val="■"/>
@@ -10654,7 +10588,7 @@
         <w:ind w:left="2160" w:hanging="360"/>
       </w:pPr>
     </w:lvl>
-    <w:lvl w:ilvl="3" w:tplc="50EAAE9E" w:tentative="1">
+    <w:lvl w:ilvl="3" w:tplc="A89CF742" w:tentative="1">
       <w:start w:val="1"/>
       <w:numFmt w:val="bullet"/>
       <w:lvlText w:val="●"/>
@@ -10663,7 +10597,7 @@
         <w:ind w:left="2880" w:hanging="360"/>
       </w:pPr>
     </w:lvl>
-    <w:lvl w:ilvl="4" w:tplc="6B762F06" w:tentative="1">
+    <w:lvl w:ilvl="4" w:tplc="4A308B2A" w:tentative="1">
       <w:start w:val="1"/>
       <w:numFmt w:val="bullet"/>
       <w:lvlText w:val="○"/>
@@ -10672,7 +10606,7 @@
         <w:ind w:left="3600" w:hanging="360"/>
       </w:pPr>
     </w:lvl>
-    <w:lvl w:ilvl="5" w:tplc="754C656E" w:tentative="1">
+    <w:lvl w:ilvl="5" w:tplc="2DCE7F92" w:tentative="1">
       <w:start w:val="1"/>
       <w:numFmt w:val="bullet"/>
       <w:lvlText w:val="■"/>
@@ -10681,7 +10615,7 @@
         <w:ind w:left="4320" w:hanging="360"/>
       </w:pPr>
     </w:lvl>
-    <w:lvl w:ilvl="6" w:tplc="8494C64E" w:tentative="1">
+    <w:lvl w:ilvl="6" w:tplc="71DEB100" w:tentative="1">
       <w:start w:val="1"/>
       <w:numFmt w:val="bullet"/>
       <w:lvlText w:val="●"/>
@@ -10690,7 +10624,7 @@
         <w:ind w:left="5040" w:hanging="360"/>
       </w:pPr>
     </w:lvl>
-    <w:lvl w:ilvl="7" w:tplc="33129AEC" w:tentative="1">
+    <w:lvl w:ilvl="7" w:tplc="F8E03C2A" w:tentative="1">
       <w:start w:val="1"/>
       <w:numFmt w:val="bullet"/>
       <w:lvlText w:val="●"/>
@@ -10699,7 +10633,7 @@
         <w:ind w:left="5760" w:hanging="360"/>
       </w:pPr>
     </w:lvl>
-    <w:lvl w:ilvl="8" w:tplc="D512AE9E" w:tentative="1">
+    <w:lvl w:ilvl="8" w:tplc="6254C15C" w:tentative="1">
       <w:start w:val="1"/>
       <w:numFmt w:val="bullet"/>
       <w:lvlText w:val="●"/>
@@ -10709,68 +10643,14 @@
       </w:pPr>
     </w:lvl>
   </w:abstractNum>
-  <w:abstractNum w:abstractNumId="1" w15:restartNumberingAfterBreak="0">
-    <w:nsid w:val="21FB594B"/>
-    <w:multiLevelType w:val="hybridMultilevel"/>
-    <w:tmpl w:val="D3D4ECBE"/>
-    <w:lvl w:ilvl="0" w:tplc="CFE884B6">
-      <w:start w:val="1"/>
-      <w:numFmt w:val="bullet"/>
-      <w:lvlText w:val="•"/>
-      <w:lvlJc w:val="left"/>
-      <w:pPr>
-        <w:ind w:left="540" w:hanging="270"/>
-      </w:pPr>
-    </w:lvl>
-    <w:lvl w:ilvl="1" w:tplc="DE40BD24">
-      <w:numFmt w:val="decimal"/>
-      <w:lvlText w:val=""/>
-      <w:lvlJc w:val="left"/>
-    </w:lvl>
-    <w:lvl w:ilvl="2" w:tplc="C382F954">
-      <w:numFmt w:val="decimal"/>
-      <w:lvlText w:val=""/>
-      <w:lvlJc w:val="left"/>
-    </w:lvl>
-    <w:lvl w:ilvl="3" w:tplc="921A6922">
-      <w:numFmt w:val="decimal"/>
-      <w:lvlText w:val=""/>
-      <w:lvlJc w:val="left"/>
-    </w:lvl>
-    <w:lvl w:ilvl="4" w:tplc="B7A6DD98">
-      <w:numFmt w:val="decimal"/>
-      <w:lvlText w:val=""/>
-      <w:lvlJc w:val="left"/>
-    </w:lvl>
-    <w:lvl w:ilvl="5" w:tplc="D13C60B0">
-      <w:numFmt w:val="decimal"/>
-      <w:lvlText w:val=""/>
-      <w:lvlJc w:val="left"/>
-    </w:lvl>
-    <w:lvl w:ilvl="6" w:tplc="CCBCC444">
-      <w:numFmt w:val="decimal"/>
-      <w:lvlText w:val=""/>
-      <w:lvlJc w:val="left"/>
-    </w:lvl>
-    <w:lvl w:ilvl="7" w:tplc="FE3AA416">
-      <w:numFmt w:val="decimal"/>
-      <w:lvlText w:val=""/>
-      <w:lvlJc w:val="left"/>
-    </w:lvl>
-    <w:lvl w:ilvl="8" w:tplc="798C4C68">
-      <w:numFmt w:val="decimal"/>
-      <w:lvlText w:val=""/>
-      <w:lvlJc w:val="left"/>
-    </w:lvl>
-  </w:abstractNum>
-  <w:num w:numId="1" w16cid:durableId="757167958">
-    <w:abstractNumId w:val="0"/>
+  <w:num w:numId="1" w16cid:durableId="546915988">
+    <w:abstractNumId w:val="1"/>
     <w:lvlOverride w:ilvl="0">
       <w:startOverride w:val="1"/>
     </w:lvlOverride>
   </w:num>
-  <w:num w:numId="2" w16cid:durableId="311108051">
-    <w:abstractNumId w:val="1"/>
+  <w:num w:numId="2" w16cid:durableId="1176572197">
+    <w:abstractNumId w:val="0"/>
     <w:lvlOverride w:ilvl="0">
       <w:startOverride w:val="1"/>
     </w:lvlOverride>

</xml_diff>

<commit_message>
Informe 25%: fragmentos de código explicados y diagramas más espaciados
- 10 fragmentos cortos del código real (Terraform, rutas, ApiResponse,
  manejo de errores, registro y login, bcrypt y rate limits, rutas de
  React, k6 y ofuscación), cada uno con por qué se usó.
- Diagrama de base de datos redibujado en cuadrícula con líneas
  ortogonales y cardinalidad en cada extremo, en página horizontal.
- Diagrama de arquitectura redibujado sin textos superpuestos.

Co-Authored-By: Claude Opus 5.5 <noreply@anthropic.com>
</commit_message>
<xml_diff>
--- a/docs/informes/LeGrandHotel_Entrega_25.docx
+++ b/docs/informes/LeGrandHotel_Entrega_25.docx
@@ -34,7 +34,7 @@
           <w:noProof/>
         </w:rPr>
         <w:drawing>
-          <wp:inline distT="0" distB="0" distL="0" distR="0" wp14:anchorId="74BA9A2C" wp14:editId="35B98278">
+          <wp:inline distT="0" distB="0" distL="0" distR="0" wp14:anchorId="4AF841A3" wp14:editId="30FAF870">
             <wp:extent cx="1800225" cy="1076325"/>
             <wp:effectExtent l="0" t="0" r="0" b="0"/>
             <wp:docPr id="1" name="Imagen 1"/>
@@ -254,7 +254,7 @@
     <w:sdt>
       <w:sdtPr>
         <w:alias w:val="Índice"/>
-        <w:id w:val="-601416675"/>
+        <w:id w:val="-735544299"/>
       </w:sdtPr>
       <w:sdtEndPr/>
       <w:sdtContent>
@@ -280,7 +280,7 @@
           <w:r>
             <w:fldChar w:fldCharType="separate"/>
           </w:r>
-          <w:hyperlink w:anchor="_Toc243979275" w:history="1">
+          <w:hyperlink w:anchor="_Toc243979856" w:history="1">
             <w:r>
               <w:rPr>
                 <w:rStyle w:val="Hipervnculo"/>
@@ -304,7 +304,7 @@
               <w:rPr>
                 <w:noProof/>
               </w:rPr>
-              <w:instrText xml:space="preserve"> PAGEREF _Toc243979275 \h </w:instrText>
+              <w:instrText xml:space="preserve"> PAGEREF _Toc243979856 \h </w:instrText>
             </w:r>
             <w:r>
               <w:rPr>
@@ -344,7 +344,7 @@
               <w14:ligatures w14:val="standardContextual"/>
             </w:rPr>
           </w:pPr>
-          <w:hyperlink w:anchor="_Toc243979276" w:history="1">
+          <w:hyperlink w:anchor="_Toc243979857" w:history="1">
             <w:r>
               <w:rPr>
                 <w:rStyle w:val="Hipervnculo"/>
@@ -368,7 +368,7 @@
               <w:rPr>
                 <w:noProof/>
               </w:rPr>
-              <w:instrText xml:space="preserve"> PAGEREF _Toc243979276 \h </w:instrText>
+              <w:instrText xml:space="preserve"> PAGEREF _Toc243979857 \h </w:instrText>
             </w:r>
             <w:r>
               <w:rPr>
@@ -408,7 +408,7 @@
               <w14:ligatures w14:val="standardContextual"/>
             </w:rPr>
           </w:pPr>
-          <w:hyperlink w:anchor="_Toc243979277" w:history="1">
+          <w:hyperlink w:anchor="_Toc243979858" w:history="1">
             <w:r>
               <w:rPr>
                 <w:rStyle w:val="Hipervnculo"/>
@@ -432,7 +432,7 @@
               <w:rPr>
                 <w:noProof/>
               </w:rPr>
-              <w:instrText xml:space="preserve"> PAGEREF _Toc243979277 \h </w:instrText>
+              <w:instrText xml:space="preserve"> PAGEREF _Toc243979858 \h </w:instrText>
             </w:r>
             <w:r>
               <w:rPr>
@@ -472,7 +472,7 @@
               <w14:ligatures w14:val="standardContextual"/>
             </w:rPr>
           </w:pPr>
-          <w:hyperlink w:anchor="_Toc243979278" w:history="1">
+          <w:hyperlink w:anchor="_Toc243979859" w:history="1">
             <w:r>
               <w:rPr>
                 <w:rStyle w:val="Hipervnculo"/>
@@ -496,7 +496,7 @@
               <w:rPr>
                 <w:noProof/>
               </w:rPr>
-              <w:instrText xml:space="preserve"> PAGEREF _Toc243979278 \h </w:instrText>
+              <w:instrText xml:space="preserve"> PAGEREF _Toc243979859 \h </w:instrText>
             </w:r>
             <w:r>
               <w:rPr>
@@ -536,7 +536,7 @@
               <w14:ligatures w14:val="standardContextual"/>
             </w:rPr>
           </w:pPr>
-          <w:hyperlink w:anchor="_Toc243979279" w:history="1">
+          <w:hyperlink w:anchor="_Toc243979860" w:history="1">
             <w:r>
               <w:rPr>
                 <w:rStyle w:val="Hipervnculo"/>
@@ -560,7 +560,7 @@
               <w:rPr>
                 <w:noProof/>
               </w:rPr>
-              <w:instrText xml:space="preserve"> PAGEREF _Toc243979279 \h </w:instrText>
+              <w:instrText xml:space="preserve"> PAGEREF _Toc243979860 \h </w:instrText>
             </w:r>
             <w:r>
               <w:rPr>
@@ -600,7 +600,7 @@
               <w14:ligatures w14:val="standardContextual"/>
             </w:rPr>
           </w:pPr>
-          <w:hyperlink w:anchor="_Toc243979280" w:history="1">
+          <w:hyperlink w:anchor="_Toc243979861" w:history="1">
             <w:r>
               <w:rPr>
                 <w:rStyle w:val="Hipervnculo"/>
@@ -624,7 +624,7 @@
               <w:rPr>
                 <w:noProof/>
               </w:rPr>
-              <w:instrText xml:space="preserve"> PAGEREF _Toc243979280 \h </w:instrText>
+              <w:instrText xml:space="preserve"> PAGEREF _Toc243979861 \h </w:instrText>
             </w:r>
             <w:r>
               <w:rPr>
@@ -641,7 +641,7 @@
               <w:rPr>
                 <w:noProof/>
               </w:rPr>
-              <w:t>4</w:t>
+              <w:t>5</w:t>
             </w:r>
             <w:r>
               <w:rPr>
@@ -664,7 +664,7 @@
               <w14:ligatures w14:val="standardContextual"/>
             </w:rPr>
           </w:pPr>
-          <w:hyperlink w:anchor="_Toc243979281" w:history="1">
+          <w:hyperlink w:anchor="_Toc243979862" w:history="1">
             <w:r>
               <w:rPr>
                 <w:rStyle w:val="Hipervnculo"/>
@@ -688,7 +688,7 @@
               <w:rPr>
                 <w:noProof/>
               </w:rPr>
-              <w:instrText xml:space="preserve"> PAGEREF _Toc243979281 \h </w:instrText>
+              <w:instrText xml:space="preserve"> PAGEREF _Toc243979862 \h </w:instrText>
             </w:r>
             <w:r>
               <w:rPr>
@@ -728,7 +728,7 @@
               <w14:ligatures w14:val="standardContextual"/>
             </w:rPr>
           </w:pPr>
-          <w:hyperlink w:anchor="_Toc243979282" w:history="1">
+          <w:hyperlink w:anchor="_Toc243979863" w:history="1">
             <w:r>
               <w:rPr>
                 <w:rStyle w:val="Hipervnculo"/>
@@ -752,7 +752,7 @@
               <w:rPr>
                 <w:noProof/>
               </w:rPr>
-              <w:instrText xml:space="preserve"> PAGEREF _Toc243979282 \h </w:instrText>
+              <w:instrText xml:space="preserve"> PAGEREF _Toc243979863 \h </w:instrText>
             </w:r>
             <w:r>
               <w:rPr>
@@ -769,7 +769,7 @@
               <w:rPr>
                 <w:noProof/>
               </w:rPr>
-              <w:t>5</w:t>
+              <w:t>6</w:t>
             </w:r>
             <w:r>
               <w:rPr>
@@ -792,7 +792,7 @@
               <w14:ligatures w14:val="standardContextual"/>
             </w:rPr>
           </w:pPr>
-          <w:hyperlink w:anchor="_Toc243979283" w:history="1">
+          <w:hyperlink w:anchor="_Toc243979864" w:history="1">
             <w:r>
               <w:rPr>
                 <w:rStyle w:val="Hipervnculo"/>
@@ -816,7 +816,7 @@
               <w:rPr>
                 <w:noProof/>
               </w:rPr>
-              <w:instrText xml:space="preserve"> PAGEREF _Toc243979283 \h </w:instrText>
+              <w:instrText xml:space="preserve"> PAGEREF _Toc243979864 \h </w:instrText>
             </w:r>
             <w:r>
               <w:rPr>
@@ -833,7 +833,7 @@
               <w:rPr>
                 <w:noProof/>
               </w:rPr>
-              <w:t>5</w:t>
+              <w:t>7</w:t>
             </w:r>
             <w:r>
               <w:rPr>
@@ -856,7 +856,7 @@
               <w14:ligatures w14:val="standardContextual"/>
             </w:rPr>
           </w:pPr>
-          <w:hyperlink w:anchor="_Toc243979284" w:history="1">
+          <w:hyperlink w:anchor="_Toc243979865" w:history="1">
             <w:r>
               <w:rPr>
                 <w:rStyle w:val="Hipervnculo"/>
@@ -880,7 +880,7 @@
               <w:rPr>
                 <w:noProof/>
               </w:rPr>
-              <w:instrText xml:space="preserve"> PAGEREF _Toc243979284 \h </w:instrText>
+              <w:instrText xml:space="preserve"> PAGEREF _Toc243979865 \h </w:instrText>
             </w:r>
             <w:r>
               <w:rPr>
@@ -897,7 +897,7 @@
               <w:rPr>
                 <w:noProof/>
               </w:rPr>
-              <w:t>6</w:t>
+              <w:t>8</w:t>
             </w:r>
             <w:r>
               <w:rPr>
@@ -920,7 +920,7 @@
               <w14:ligatures w14:val="standardContextual"/>
             </w:rPr>
           </w:pPr>
-          <w:hyperlink w:anchor="_Toc243979285" w:history="1">
+          <w:hyperlink w:anchor="_Toc243979866" w:history="1">
             <w:r>
               <w:rPr>
                 <w:rStyle w:val="Hipervnculo"/>
@@ -944,7 +944,7 @@
               <w:rPr>
                 <w:noProof/>
               </w:rPr>
-              <w:instrText xml:space="preserve"> PAGEREF _Toc243979285 \h </w:instrText>
+              <w:instrText xml:space="preserve"> PAGEREF _Toc243979866 \h </w:instrText>
             </w:r>
             <w:r>
               <w:rPr>
@@ -961,7 +961,7 @@
               <w:rPr>
                 <w:noProof/>
               </w:rPr>
-              <w:t>8</w:t>
+              <w:t>11</w:t>
             </w:r>
             <w:r>
               <w:rPr>
@@ -984,7 +984,7 @@
               <w14:ligatures w14:val="standardContextual"/>
             </w:rPr>
           </w:pPr>
-          <w:hyperlink w:anchor="_Toc243979286" w:history="1">
+          <w:hyperlink w:anchor="_Toc243979867" w:history="1">
             <w:r>
               <w:rPr>
                 <w:rStyle w:val="Hipervnculo"/>
@@ -1008,7 +1008,7 @@
               <w:rPr>
                 <w:noProof/>
               </w:rPr>
-              <w:instrText xml:space="preserve"> PAGEREF _Toc243979286 \h </w:instrText>
+              <w:instrText xml:space="preserve"> PAGEREF _Toc243979867 \h </w:instrText>
             </w:r>
             <w:r>
               <w:rPr>
@@ -1025,7 +1025,7 @@
               <w:rPr>
                 <w:noProof/>
               </w:rPr>
-              <w:t>8</w:t>
+              <w:t>11</w:t>
             </w:r>
             <w:r>
               <w:rPr>
@@ -1048,7 +1048,7 @@
               <w14:ligatures w14:val="standardContextual"/>
             </w:rPr>
           </w:pPr>
-          <w:hyperlink w:anchor="_Toc243979287" w:history="1">
+          <w:hyperlink w:anchor="_Toc243979868" w:history="1">
             <w:r>
               <w:rPr>
                 <w:rStyle w:val="Hipervnculo"/>
@@ -1072,7 +1072,7 @@
               <w:rPr>
                 <w:noProof/>
               </w:rPr>
-              <w:instrText xml:space="preserve"> PAGEREF _Toc243979287 \h </w:instrText>
+              <w:instrText xml:space="preserve"> PAGEREF _Toc243979868 \h </w:instrText>
             </w:r>
             <w:r>
               <w:rPr>
@@ -1089,7 +1089,7 @@
               <w:rPr>
                 <w:noProof/>
               </w:rPr>
-              <w:t>9</w:t>
+              <w:t>12</w:t>
             </w:r>
             <w:r>
               <w:rPr>
@@ -1112,7 +1112,7 @@
               <w14:ligatures w14:val="standardContextual"/>
             </w:rPr>
           </w:pPr>
-          <w:hyperlink w:anchor="_Toc243979288" w:history="1">
+          <w:hyperlink w:anchor="_Toc243979869" w:history="1">
             <w:r>
               <w:rPr>
                 <w:rStyle w:val="Hipervnculo"/>
@@ -1136,7 +1136,7 @@
               <w:rPr>
                 <w:noProof/>
               </w:rPr>
-              <w:instrText xml:space="preserve"> PAGEREF _Toc243979288 \h </w:instrText>
+              <w:instrText xml:space="preserve"> PAGEREF _Toc243979869 \h </w:instrText>
             </w:r>
             <w:r>
               <w:rPr>
@@ -1153,7 +1153,7 @@
               <w:rPr>
                 <w:noProof/>
               </w:rPr>
-              <w:t>10</w:t>
+              <w:t>13</w:t>
             </w:r>
             <w:r>
               <w:rPr>
@@ -1176,7 +1176,7 @@
               <w14:ligatures w14:val="standardContextual"/>
             </w:rPr>
           </w:pPr>
-          <w:hyperlink w:anchor="_Toc243979289" w:history="1">
+          <w:hyperlink w:anchor="_Toc243979870" w:history="1">
             <w:r>
               <w:rPr>
                 <w:rStyle w:val="Hipervnculo"/>
@@ -1200,7 +1200,7 @@
               <w:rPr>
                 <w:noProof/>
               </w:rPr>
-              <w:instrText xml:space="preserve"> PAGEREF _Toc243979289 \h </w:instrText>
+              <w:instrText xml:space="preserve"> PAGEREF _Toc243979870 \h </w:instrText>
             </w:r>
             <w:r>
               <w:rPr>
@@ -1217,7 +1217,7 @@
               <w:rPr>
                 <w:noProof/>
               </w:rPr>
-              <w:t>10</w:t>
+              <w:t>13</w:t>
             </w:r>
             <w:r>
               <w:rPr>
@@ -1240,7 +1240,7 @@
               <w14:ligatures w14:val="standardContextual"/>
             </w:rPr>
           </w:pPr>
-          <w:hyperlink w:anchor="_Toc243979290" w:history="1">
+          <w:hyperlink w:anchor="_Toc243979871" w:history="1">
             <w:r>
               <w:rPr>
                 <w:rStyle w:val="Hipervnculo"/>
@@ -1264,7 +1264,7 @@
               <w:rPr>
                 <w:noProof/>
               </w:rPr>
-              <w:instrText xml:space="preserve"> PAGEREF _Toc243979290 \h </w:instrText>
+              <w:instrText xml:space="preserve"> PAGEREF _Toc243979871 \h </w:instrText>
             </w:r>
             <w:r>
               <w:rPr>
@@ -1281,7 +1281,7 @@
               <w:rPr>
                 <w:noProof/>
               </w:rPr>
-              <w:t>10</w:t>
+              <w:t>14</w:t>
             </w:r>
             <w:r>
               <w:rPr>
@@ -1304,7 +1304,7 @@
               <w14:ligatures w14:val="standardContextual"/>
             </w:rPr>
           </w:pPr>
-          <w:hyperlink w:anchor="_Toc243979291" w:history="1">
+          <w:hyperlink w:anchor="_Toc243979872" w:history="1">
             <w:r>
               <w:rPr>
                 <w:rStyle w:val="Hipervnculo"/>
@@ -1328,7 +1328,7 @@
               <w:rPr>
                 <w:noProof/>
               </w:rPr>
-              <w:instrText xml:space="preserve"> PAGEREF _Toc243979291 \h </w:instrText>
+              <w:instrText xml:space="preserve"> PAGEREF _Toc243979872 \h </w:instrText>
             </w:r>
             <w:r>
               <w:rPr>
@@ -1345,7 +1345,7 @@
               <w:rPr>
                 <w:noProof/>
               </w:rPr>
-              <w:t>13</w:t>
+              <w:t>17</w:t>
             </w:r>
             <w:r>
               <w:rPr>
@@ -1368,7 +1368,7 @@
               <w14:ligatures w14:val="standardContextual"/>
             </w:rPr>
           </w:pPr>
-          <w:hyperlink w:anchor="_Toc243979292" w:history="1">
+          <w:hyperlink w:anchor="_Toc243979873" w:history="1">
             <w:r>
               <w:rPr>
                 <w:rStyle w:val="Hipervnculo"/>
@@ -1392,7 +1392,7 @@
               <w:rPr>
                 <w:noProof/>
               </w:rPr>
-              <w:instrText xml:space="preserve"> PAGEREF _Toc243979292 \h </w:instrText>
+              <w:instrText xml:space="preserve"> PAGEREF _Toc243979873 \h </w:instrText>
             </w:r>
             <w:r>
               <w:rPr>
@@ -1409,7 +1409,7 @@
               <w:rPr>
                 <w:noProof/>
               </w:rPr>
-              <w:t>14</w:t>
+              <w:t>17</w:t>
             </w:r>
             <w:r>
               <w:rPr>
@@ -1432,7 +1432,7 @@
               <w14:ligatures w14:val="standardContextual"/>
             </w:rPr>
           </w:pPr>
-          <w:hyperlink w:anchor="_Toc243979293" w:history="1">
+          <w:hyperlink w:anchor="_Toc243979874" w:history="1">
             <w:r>
               <w:rPr>
                 <w:rStyle w:val="Hipervnculo"/>
@@ -1456,7 +1456,7 @@
               <w:rPr>
                 <w:noProof/>
               </w:rPr>
-              <w:instrText xml:space="preserve"> PAGEREF _Toc243979293 \h </w:instrText>
+              <w:instrText xml:space="preserve"> PAGEREF _Toc243979874 \h </w:instrText>
             </w:r>
             <w:r>
               <w:rPr>
@@ -1473,7 +1473,7 @@
               <w:rPr>
                 <w:noProof/>
               </w:rPr>
-              <w:t>14</w:t>
+              <w:t>18</w:t>
             </w:r>
             <w:r>
               <w:rPr>
@@ -1496,7 +1496,7 @@
               <w14:ligatures w14:val="standardContextual"/>
             </w:rPr>
           </w:pPr>
-          <w:hyperlink w:anchor="_Toc243979294" w:history="1">
+          <w:hyperlink w:anchor="_Toc243979875" w:history="1">
             <w:r>
               <w:rPr>
                 <w:rStyle w:val="Hipervnculo"/>
@@ -1520,7 +1520,7 @@
               <w:rPr>
                 <w:noProof/>
               </w:rPr>
-              <w:instrText xml:space="preserve"> PAGEREF _Toc243979294 \h </w:instrText>
+              <w:instrText xml:space="preserve"> PAGEREF _Toc243979875 \h </w:instrText>
             </w:r>
             <w:r>
               <w:rPr>
@@ -1537,7 +1537,7 @@
               <w:rPr>
                 <w:noProof/>
               </w:rPr>
-              <w:t>14</w:t>
+              <w:t>18</w:t>
             </w:r>
             <w:r>
               <w:rPr>
@@ -1560,7 +1560,7 @@
               <w14:ligatures w14:val="standardContextual"/>
             </w:rPr>
           </w:pPr>
-          <w:hyperlink w:anchor="_Toc243979295" w:history="1">
+          <w:hyperlink w:anchor="_Toc243979876" w:history="1">
             <w:r>
               <w:rPr>
                 <w:rStyle w:val="Hipervnculo"/>
@@ -1584,7 +1584,7 @@
               <w:rPr>
                 <w:noProof/>
               </w:rPr>
-              <w:instrText xml:space="preserve"> PAGEREF _Toc243979295 \h </w:instrText>
+              <w:instrText xml:space="preserve"> PAGEREF _Toc243979876 \h </w:instrText>
             </w:r>
             <w:r>
               <w:rPr>
@@ -1601,7 +1601,7 @@
               <w:rPr>
                 <w:noProof/>
               </w:rPr>
-              <w:t>15</w:t>
+              <w:t>19</w:t>
             </w:r>
             <w:r>
               <w:rPr>
@@ -1628,7 +1628,7 @@
         <w:pStyle w:val="Ttulo1"/>
         <w:keepNext/>
       </w:pPr>
-      <w:bookmarkStart w:id="0" w:name="_Toc243979275"/>
+      <w:bookmarkStart w:id="0" w:name="_Toc243979856"/>
       <w:r>
         <w:lastRenderedPageBreak/>
         <w:t>1. Alcance de la entrega del 25%</w:t>
@@ -2143,7 +2143,7 @@
         <w:pStyle w:val="Ttulo1"/>
         <w:keepNext/>
       </w:pPr>
-      <w:bookmarkStart w:id="1" w:name="_Toc243979276"/>
+      <w:bookmarkStart w:id="1" w:name="_Toc243979857"/>
       <w:r>
         <w:t>2. Descripción del proyecto</w:t>
       </w:r>
@@ -2162,7 +2162,7 @@
         <w:pStyle w:val="Ttulo2"/>
         <w:keepNext/>
       </w:pPr>
-      <w:bookmarkStart w:id="2" w:name="_Toc243979277"/>
+      <w:bookmarkStart w:id="2" w:name="_Toc243979858"/>
       <w:r>
         <w:t>2.1 Tecnologías</w:t>
       </w:r>
@@ -2648,7 +2648,7 @@
         <w:pStyle w:val="Ttulo1"/>
         <w:keepNext/>
       </w:pPr>
-      <w:bookmarkStart w:id="3" w:name="_Toc243979278"/>
+      <w:bookmarkStart w:id="3" w:name="_Toc243979859"/>
       <w:r>
         <w:t>3. Arquitectura y entorno cloud</w:t>
       </w:r>
@@ -2674,10 +2674,10 @@
         </w:rPr>
         <w:lastRenderedPageBreak/>
         <w:drawing>
-          <wp:inline distT="0" distB="0" distL="0" distR="0" wp14:anchorId="28CF126F" wp14:editId="2B02E1D3">
-            <wp:extent cx="5762625" cy="3829050"/>
+          <wp:inline distT="0" distB="0" distL="0" distR="0" wp14:anchorId="27199B95" wp14:editId="1C727421">
+            <wp:extent cx="5762625" cy="4038600"/>
             <wp:effectExtent l="0" t="0" r="0" b="0"/>
-            <wp:docPr id="2" name="Imagen 2"/>
+            <wp:docPr id="3" name="Imagen 3"/>
             <wp:cNvGraphicFramePr>
               <a:graphicFrameLocks xmlns:a="http://schemas.openxmlformats.org/drawingml/2006/main" noChangeAspect="1"/>
             </wp:cNvGraphicFramePr>
@@ -2700,7 +2700,7 @@
                   <pic:spPr bwMode="auto">
                     <a:xfrm>
                       <a:off x="0" y="0"/>
-                      <a:ext cx="5762625" cy="3829050"/>
+                      <a:ext cx="5762625" cy="4038600"/>
                     </a:xfrm>
                     <a:prstGeom prst="rect">
                       <a:avLst/>
@@ -2733,7 +2733,7 @@
         <w:pStyle w:val="Ttulo2"/>
         <w:keepNext/>
       </w:pPr>
-      <w:bookmarkStart w:id="4" w:name="_Toc243979279"/>
+      <w:bookmarkStart w:id="4" w:name="_Toc243979860"/>
       <w:r>
         <w:t>3.1 Recursos del entorno (Terraform)</w:t>
       </w:r>
@@ -3366,10 +3366,280 @@
     </w:p>
     <w:p>
       <w:pPr>
+        <w:keepNext/>
+        <w:spacing w:before="120" w:after="60"/>
+      </w:pPr>
+      <w:r>
+        <w:rPr>
+          <w:b/>
+          <w:bCs/>
+          <w:sz w:val="21"/>
+          <w:szCs w:val="21"/>
+        </w:rPr>
+        <w:lastRenderedPageBreak/>
+        <w:t xml:space="preserve">Fragmento 1. </w:t>
+      </w:r>
+      <w:r>
+        <w:rPr>
+          <w:i/>
+          <w:iCs/>
+          <w:sz w:val="21"/>
+          <w:szCs w:val="21"/>
+        </w:rPr>
+        <w:t>infra/terraform/data.tf y network.tf (resumen)</w:t>
+      </w:r>
+    </w:p>
+    <w:tbl>
+      <w:tblPr>
+        <w:tblW w:w="9070" w:type="dxa"/>
+        <w:tblBorders>
+          <w:top w:val="single" w:sz="4" w:space="0" w:color="auto"/>
+          <w:left w:val="single" w:sz="4" w:space="0" w:color="auto"/>
+          <w:bottom w:val="single" w:sz="4" w:space="0" w:color="auto"/>
+          <w:right w:val="single" w:sz="4" w:space="0" w:color="auto"/>
+          <w:insideH w:val="single" w:sz="4" w:space="0" w:color="auto"/>
+          <w:insideV w:val="single" w:sz="4" w:space="0" w:color="auto"/>
+        </w:tblBorders>
+        <w:tblLook w:val="04A0" w:firstRow="1" w:lastRow="0" w:firstColumn="1" w:lastColumn="0" w:noHBand="0" w:noVBand="1"/>
+      </w:tblPr>
+      <w:tblGrid>
+        <w:gridCol w:w="9070"/>
+      </w:tblGrid>
+      <w:tr>
+        <w:trPr>
+          <w:cantSplit/>
+        </w:trPr>
+        <w:tc>
+          <w:tcPr>
+            <w:tcW w:w="9070" w:type="dxa"/>
+            <w:tcBorders>
+              <w:top w:val="single" w:sz="4" w:space="0" w:color="000000"/>
+              <w:left w:val="single" w:sz="4" w:space="0" w:color="000000"/>
+              <w:bottom w:val="single" w:sz="4" w:space="0" w:color="000000"/>
+              <w:right w:val="single" w:sz="4" w:space="0" w:color="000000"/>
+            </w:tcBorders>
+            <w:shd w:val="clear" w:color="auto" w:fill="F2F2F2"/>
+            <w:tcMar>
+              <w:top w:w="80" w:type="dxa"/>
+              <w:left w:w="140" w:type="dxa"/>
+              <w:bottom w:w="80" w:type="dxa"/>
+              <w:right w:w="140" w:type="dxa"/>
+            </w:tcMar>
+          </w:tcPr>
+          <w:p>
+            <w:r>
+              <w:rPr>
+                <w:rFonts w:ascii="Consolas" w:eastAsia="Consolas" w:hAnsi="Consolas" w:cs="Consolas"/>
+                <w:sz w:val="17"/>
+                <w:szCs w:val="17"/>
+              </w:rPr>
+              <w:t>resource "aws_db_instance" "main" {</w:t>
+            </w:r>
+          </w:p>
+          <w:p>
+            <w:r>
+              <w:rPr>
+                <w:rFonts w:ascii="Consolas" w:eastAsia="Consolas" w:hAnsi="Consolas" w:cs="Consolas"/>
+                <w:sz w:val="17"/>
+                <w:szCs w:val="17"/>
+              </w:rPr>
+              <w:t xml:space="preserve">  engine                  = "mysql"</w:t>
+            </w:r>
+          </w:p>
+          <w:p>
+            <w:r>
+              <w:rPr>
+                <w:rFonts w:ascii="Consolas" w:eastAsia="Consolas" w:hAnsi="Consolas" w:cs="Consolas"/>
+                <w:sz w:val="17"/>
+                <w:szCs w:val="17"/>
+              </w:rPr>
+              <w:t xml:space="preserve">  engine_version          = "8.0"</w:t>
+            </w:r>
+          </w:p>
+          <w:p>
+            <w:r>
+              <w:rPr>
+                <w:rFonts w:ascii="Consolas" w:eastAsia="Consolas" w:hAnsi="Consolas" w:cs="Consolas"/>
+                <w:sz w:val="17"/>
+                <w:szCs w:val="17"/>
+              </w:rPr>
+              <w:t xml:space="preserve">  instance_class          = var.db_instance_class   # db.t3.micro</w:t>
+            </w:r>
+          </w:p>
+          <w:p>
+            <w:r>
+              <w:rPr>
+                <w:rFonts w:ascii="Consolas" w:eastAsia="Consolas" w:hAnsi="Consolas" w:cs="Consolas"/>
+                <w:sz w:val="17"/>
+                <w:szCs w:val="17"/>
+              </w:rPr>
+              <w:t xml:space="preserve">  storage_encrypted       = true</w:t>
+            </w:r>
+          </w:p>
+          <w:p>
+            <w:r>
+              <w:rPr>
+                <w:rFonts w:ascii="Consolas" w:eastAsia="Consolas" w:hAnsi="Consolas" w:cs="Consolas"/>
+                <w:sz w:val="17"/>
+                <w:szCs w:val="17"/>
+              </w:rPr>
+              <w:t xml:space="preserve">  publicly_accessible     = false                   # sin IP pública</w:t>
+            </w:r>
+          </w:p>
+          <w:p>
+            <w:r>
+              <w:rPr>
+                <w:rFonts w:ascii="Consolas" w:eastAsia="Consolas" w:hAnsi="Consolas" w:cs="Consolas"/>
+                <w:sz w:val="17"/>
+                <w:szCs w:val="17"/>
+              </w:rPr>
+              <w:t xml:space="preserve">  db_subnet_group_name    = aws_db_subnet_group.main.name   # subredes privadas</w:t>
+            </w:r>
+          </w:p>
+          <w:p>
+            <w:r>
+              <w:rPr>
+                <w:rFonts w:ascii="Consolas" w:eastAsia="Consolas" w:hAnsi="Consolas" w:cs="Consolas"/>
+                <w:sz w:val="17"/>
+                <w:szCs w:val="17"/>
+              </w:rPr>
+              <w:t xml:space="preserve">  vpc_security_group_ids  = [aws_security_group.db.id]</w:t>
+            </w:r>
+          </w:p>
+          <w:p>
+            <w:r>
+              <w:rPr>
+                <w:rFonts w:ascii="Consolas" w:eastAsia="Consolas" w:hAnsi="Consolas" w:cs="Consolas"/>
+                <w:sz w:val="17"/>
+                <w:szCs w:val="17"/>
+              </w:rPr>
+              <w:t xml:space="preserve">  backup_retention_period = 7                       # snapshots diarios, 7 días</w:t>
+            </w:r>
+          </w:p>
+          <w:p>
+            <w:r>
+              <w:rPr>
+                <w:rFonts w:ascii="Consolas" w:eastAsia="Consolas" w:hAnsi="Consolas" w:cs="Consolas"/>
+                <w:sz w:val="17"/>
+                <w:szCs w:val="17"/>
+              </w:rPr>
+              <w:t>}</w:t>
+            </w:r>
+          </w:p>
+          <w:p>
+            <w:r>
+              <w:rPr>
+                <w:rFonts w:ascii="Consolas" w:eastAsia="Consolas" w:hAnsi="Consolas" w:cs="Consolas"/>
+                <w:sz w:val="17"/>
+                <w:szCs w:val="17"/>
+              </w:rPr>
+              <w:t xml:space="preserve"> </w:t>
+            </w:r>
+          </w:p>
+          <w:p>
+            <w:r>
+              <w:rPr>
+                <w:rFonts w:ascii="Consolas" w:eastAsia="Consolas" w:hAnsi="Consolas" w:cs="Consolas"/>
+                <w:sz w:val="17"/>
+                <w:szCs w:val="17"/>
+              </w:rPr>
+              <w:t>resource "aws_security_group" "db" {</w:t>
+            </w:r>
+          </w:p>
+          <w:p>
+            <w:r>
+              <w:rPr>
+                <w:rFonts w:ascii="Consolas" w:eastAsia="Consolas" w:hAnsi="Consolas" w:cs="Consolas"/>
+                <w:sz w:val="17"/>
+                <w:szCs w:val="17"/>
+              </w:rPr>
+              <w:t xml:space="preserve">  ingress {</w:t>
+            </w:r>
+          </w:p>
+          <w:p>
+            <w:r>
+              <w:rPr>
+                <w:rFonts w:ascii="Consolas" w:eastAsia="Consolas" w:hAnsi="Consolas" w:cs="Consolas"/>
+                <w:sz w:val="17"/>
+                <w:szCs w:val="17"/>
+              </w:rPr>
+              <w:t xml:space="preserve">    from_port       = 3306</w:t>
+            </w:r>
+          </w:p>
+          <w:p>
+            <w:r>
+              <w:rPr>
+                <w:rFonts w:ascii="Consolas" w:eastAsia="Consolas" w:hAnsi="Consolas" w:cs="Consolas"/>
+                <w:sz w:val="17"/>
+                <w:szCs w:val="17"/>
+              </w:rPr>
+              <w:t xml:space="preserve">    to_port         = 3306</w:t>
+            </w:r>
+          </w:p>
+          <w:p>
+            <w:r>
+              <w:rPr>
+                <w:rFonts w:ascii="Consolas" w:eastAsia="Consolas" w:hAnsi="Consolas" w:cs="Consolas"/>
+                <w:sz w:val="17"/>
+                <w:szCs w:val="17"/>
+              </w:rPr>
+              <w:t xml:space="preserve">    protocol        = "tcp"</w:t>
+            </w:r>
+          </w:p>
+          <w:p>
+            <w:r>
+              <w:rPr>
+                <w:rFonts w:ascii="Consolas" w:eastAsia="Consolas" w:hAnsi="Consolas" w:cs="Consolas"/>
+                <w:sz w:val="17"/>
+                <w:szCs w:val="17"/>
+              </w:rPr>
+              <w:t xml:space="preserve">    security_groups = [aws_security_group.app.id]    # solo desde las EC2 de la API</w:t>
+            </w:r>
+          </w:p>
+          <w:p>
+            <w:r>
+              <w:rPr>
+                <w:rFonts w:ascii="Consolas" w:eastAsia="Consolas" w:hAnsi="Consolas" w:cs="Consolas"/>
+                <w:sz w:val="17"/>
+                <w:szCs w:val="17"/>
+              </w:rPr>
+              <w:t xml:space="preserve">  }</w:t>
+            </w:r>
+          </w:p>
+          <w:p>
+            <w:r>
+              <w:rPr>
+                <w:rFonts w:ascii="Consolas" w:eastAsia="Consolas" w:hAnsi="Consolas" w:cs="Consolas"/>
+                <w:sz w:val="17"/>
+                <w:szCs w:val="17"/>
+              </w:rPr>
+              <w:t>}</w:t>
+            </w:r>
+          </w:p>
+        </w:tc>
+      </w:tr>
+    </w:tbl>
+    <w:p>
+      <w:pPr>
+        <w:spacing w:before="80" w:after="160" w:line="300" w:lineRule="auto"/>
+      </w:pPr>
+      <w:r>
+        <w:rPr>
+          <w:b/>
+          <w:bCs/>
+        </w:rPr>
+        <w:t xml:space="preserve">Por qué se usó: </w:t>
+      </w:r>
+      <w:r>
+        <w:t>la base de datos es lo más sensible del sistema. Con publicly_accessible = false y las subredes privadas no tiene dirección en internet; el Security Group solo deja entrar al puerto 3306 desde las instancias de la API. Además se cifra el disco y quedan 7 días de copias automáticas. Al estar escrito en Terraform, el mismo entorno se puede crear o destruir con un comando y revisar antes de aplicar.</w:t>
+      </w:r>
+    </w:p>
+    <w:p>
+      <w:pPr>
         <w:pStyle w:val="Ttulo2"/>
         <w:keepNext/>
       </w:pPr>
-      <w:bookmarkStart w:id="5" w:name="_Toc243979280"/>
+      <w:bookmarkStart w:id="5" w:name="_Toc243979861"/>
       <w:r>
         <w:t>3.2 Costo estimado</w:t>
       </w:r>
@@ -3649,7 +3919,6 @@
                 <w:sz w:val="20"/>
                 <w:szCs w:val="20"/>
               </w:rPr>
-              <w:lastRenderedPageBreak/>
               <w:t>Total 25% (sin ALB ni Redis)</w:t>
             </w:r>
           </w:p>
@@ -3693,7 +3962,7 @@
         <w:pStyle w:val="Ttulo1"/>
         <w:keepNext/>
       </w:pPr>
-      <w:bookmarkStart w:id="6" w:name="_Toc243979281"/>
+      <w:bookmarkStart w:id="6" w:name="_Toc243979862"/>
       <w:r>
         <w:t>4. Endpoints definidos</w:t>
       </w:r>
@@ -4342,6 +4611,7 @@
                 <w:sz w:val="20"/>
                 <w:szCs w:val="20"/>
               </w:rPr>
+              <w:lastRenderedPageBreak/>
               <w:t>Habitaciones</w:t>
             </w:r>
           </w:p>
@@ -5073,10 +5343,249 @@
     </w:p>
     <w:p>
       <w:pPr>
+        <w:keepNext/>
+        <w:spacing w:before="120" w:after="60"/>
+      </w:pPr>
+      <w:r>
+        <w:rPr>
+          <w:b/>
+          <w:bCs/>
+          <w:sz w:val="21"/>
+          <w:szCs w:val="21"/>
+        </w:rPr>
+        <w:t xml:space="preserve">Fragmento 2. </w:t>
+      </w:r>
+      <w:r>
+        <w:rPr>
+          <w:i/>
+          <w:iCs/>
+          <w:sz w:val="21"/>
+          <w:szCs w:val="21"/>
+        </w:rPr>
+        <w:t>api/routes/api.php (extracto)</w:t>
+      </w:r>
+    </w:p>
+    <w:tbl>
+      <w:tblPr>
+        <w:tblW w:w="9070" w:type="dxa"/>
+        <w:tblBorders>
+          <w:top w:val="single" w:sz="4" w:space="0" w:color="auto"/>
+          <w:left w:val="single" w:sz="4" w:space="0" w:color="auto"/>
+          <w:bottom w:val="single" w:sz="4" w:space="0" w:color="auto"/>
+          <w:right w:val="single" w:sz="4" w:space="0" w:color="auto"/>
+          <w:insideH w:val="single" w:sz="4" w:space="0" w:color="auto"/>
+          <w:insideV w:val="single" w:sz="4" w:space="0" w:color="auto"/>
+        </w:tblBorders>
+        <w:tblLook w:val="04A0" w:firstRow="1" w:lastRow="0" w:firstColumn="1" w:lastColumn="0" w:noHBand="0" w:noVBand="1"/>
+      </w:tblPr>
+      <w:tblGrid>
+        <w:gridCol w:w="9070"/>
+      </w:tblGrid>
+      <w:tr>
+        <w:trPr>
+          <w:cantSplit/>
+        </w:trPr>
+        <w:tc>
+          <w:tcPr>
+            <w:tcW w:w="9070" w:type="dxa"/>
+            <w:tcBorders>
+              <w:top w:val="single" w:sz="4" w:space="0" w:color="000000"/>
+              <w:left w:val="single" w:sz="4" w:space="0" w:color="000000"/>
+              <w:bottom w:val="single" w:sz="4" w:space="0" w:color="000000"/>
+              <w:right w:val="single" w:sz="4" w:space="0" w:color="000000"/>
+            </w:tcBorders>
+            <w:shd w:val="clear" w:color="auto" w:fill="F2F2F2"/>
+            <w:tcMar>
+              <w:top w:w="80" w:type="dxa"/>
+              <w:left w:w="140" w:type="dxa"/>
+              <w:bottom w:w="80" w:type="dxa"/>
+              <w:right w:w="140" w:type="dxa"/>
+            </w:tcMar>
+          </w:tcPr>
+          <w:p>
+            <w:r>
+              <w:rPr>
+                <w:rFonts w:ascii="Consolas" w:eastAsia="Consolas" w:hAnsi="Consolas" w:cs="Consolas"/>
+                <w:sz w:val="17"/>
+                <w:szCs w:val="17"/>
+              </w:rPr>
+              <w:t>Route::get('health', HealthController::class);</w:t>
+            </w:r>
+          </w:p>
+          <w:p>
+            <w:r>
+              <w:rPr>
+                <w:rFonts w:ascii="Consolas" w:eastAsia="Consolas" w:hAnsi="Consolas" w:cs="Consolas"/>
+                <w:sz w:val="17"/>
+                <w:szCs w:val="17"/>
+              </w:rPr>
+              <w:t xml:space="preserve"> </w:t>
+            </w:r>
+          </w:p>
+          <w:p>
+            <w:r>
+              <w:rPr>
+                <w:rFonts w:ascii="Consolas" w:eastAsia="Consolas" w:hAnsi="Consolas" w:cs="Consolas"/>
+                <w:sz w:val="17"/>
+                <w:szCs w:val="17"/>
+              </w:rPr>
+              <w:t>Route::prefix('auth')-&gt;group(function () {</w:t>
+            </w:r>
+          </w:p>
+          <w:p>
+            <w:r>
+              <w:rPr>
+                <w:rFonts w:ascii="Consolas" w:eastAsia="Consolas" w:hAnsi="Consolas" w:cs="Consolas"/>
+                <w:sz w:val="17"/>
+                <w:szCs w:val="17"/>
+              </w:rPr>
+              <w:t xml:space="preserve">    Route::post('register', [AuthController::class, 'register'])</w:t>
+            </w:r>
+          </w:p>
+          <w:p>
+            <w:r>
+              <w:rPr>
+                <w:rFonts w:ascii="Consolas" w:eastAsia="Consolas" w:hAnsi="Consolas" w:cs="Consolas"/>
+                <w:sz w:val="17"/>
+                <w:szCs w:val="17"/>
+              </w:rPr>
+              <w:t xml:space="preserve">        -&gt;middleware('throttle:register');</w:t>
+            </w:r>
+          </w:p>
+          <w:p>
+            <w:r>
+              <w:rPr>
+                <w:rFonts w:ascii="Consolas" w:eastAsia="Consolas" w:hAnsi="Consolas" w:cs="Consolas"/>
+                <w:sz w:val="17"/>
+                <w:szCs w:val="17"/>
+              </w:rPr>
+              <w:t xml:space="preserve">    Route::post('login', [AuthController::class, 'login'])</w:t>
+            </w:r>
+          </w:p>
+          <w:p>
+            <w:r>
+              <w:rPr>
+                <w:rFonts w:ascii="Consolas" w:eastAsia="Consolas" w:hAnsi="Consolas" w:cs="Consolas"/>
+                <w:sz w:val="17"/>
+                <w:szCs w:val="17"/>
+              </w:rPr>
+              <w:t xml:space="preserve">        -&gt;middleware('throttle:login');</w:t>
+            </w:r>
+          </w:p>
+          <w:p>
+            <w:r>
+              <w:rPr>
+                <w:rFonts w:ascii="Consolas" w:eastAsia="Consolas" w:hAnsi="Consolas" w:cs="Consolas"/>
+                <w:sz w:val="17"/>
+                <w:szCs w:val="17"/>
+              </w:rPr>
+              <w:t>});</w:t>
+            </w:r>
+          </w:p>
+          <w:p>
+            <w:r>
+              <w:rPr>
+                <w:rFonts w:ascii="Consolas" w:eastAsia="Consolas" w:hAnsi="Consolas" w:cs="Consolas"/>
+                <w:sz w:val="17"/>
+                <w:szCs w:val="17"/>
+              </w:rPr>
+              <w:t xml:space="preserve"> </w:t>
+            </w:r>
+          </w:p>
+          <w:p>
+            <w:r>
+              <w:rPr>
+                <w:rFonts w:ascii="Consolas" w:eastAsia="Consolas" w:hAnsi="Consolas" w:cs="Consolas"/>
+                <w:sz w:val="17"/>
+                <w:szCs w:val="17"/>
+              </w:rPr>
+              <w:t>Route::middleware(['auth:sanctum', 'throttle:api'])-&gt;group(function () {</w:t>
+            </w:r>
+          </w:p>
+          <w:p>
+            <w:r>
+              <w:rPr>
+                <w:rFonts w:ascii="Consolas" w:eastAsia="Consolas" w:hAnsi="Consolas" w:cs="Consolas"/>
+                <w:sz w:val="17"/>
+                <w:szCs w:val="17"/>
+              </w:rPr>
+              <w:t xml:space="preserve">    Route::get('auth/me', [AuthController::class, 'me']);</w:t>
+            </w:r>
+          </w:p>
+          <w:p>
+            <w:r>
+              <w:rPr>
+                <w:rFonts w:ascii="Consolas" w:eastAsia="Consolas" w:hAnsi="Consolas" w:cs="Consolas"/>
+                <w:sz w:val="17"/>
+                <w:szCs w:val="17"/>
+              </w:rPr>
+              <w:t xml:space="preserve">    Route::middleware('role:admin')-&gt;group(function () {</w:t>
+            </w:r>
+          </w:p>
+          <w:p>
+            <w:r>
+              <w:rPr>
+                <w:rFonts w:ascii="Consolas" w:eastAsia="Consolas" w:hAnsi="Consolas" w:cs="Consolas"/>
+                <w:sz w:val="17"/>
+                <w:szCs w:val="17"/>
+              </w:rPr>
+              <w:t xml:space="preserve">        Route::post('room-types', [RoomTypeController::class, 'store']);</w:t>
+            </w:r>
+          </w:p>
+          <w:p>
+            <w:r>
+              <w:rPr>
+                <w:rFonts w:ascii="Consolas" w:eastAsia="Consolas" w:hAnsi="Consolas" w:cs="Consolas"/>
+                <w:sz w:val="17"/>
+                <w:szCs w:val="17"/>
+              </w:rPr>
+              <w:t xml:space="preserve">        // ...</w:t>
+            </w:r>
+          </w:p>
+          <w:p>
+            <w:r>
+              <w:rPr>
+                <w:rFonts w:ascii="Consolas" w:eastAsia="Consolas" w:hAnsi="Consolas" w:cs="Consolas"/>
+                <w:sz w:val="17"/>
+                <w:szCs w:val="17"/>
+              </w:rPr>
+              <w:t xml:space="preserve">    });</w:t>
+            </w:r>
+          </w:p>
+          <w:p>
+            <w:r>
+              <w:rPr>
+                <w:rFonts w:ascii="Consolas" w:eastAsia="Consolas" w:hAnsi="Consolas" w:cs="Consolas"/>
+                <w:sz w:val="17"/>
+                <w:szCs w:val="17"/>
+              </w:rPr>
+              <w:t>});</w:t>
+            </w:r>
+          </w:p>
+        </w:tc>
+      </w:tr>
+    </w:tbl>
+    <w:p>
+      <w:pPr>
+        <w:spacing w:before="80" w:after="160" w:line="300" w:lineRule="auto"/>
+      </w:pPr>
+      <w:r>
+        <w:rPr>
+          <w:b/>
+          <w:bCs/>
+        </w:rPr>
+        <w:t xml:space="preserve">Por qué se usó: </w:t>
+      </w:r>
+      <w:r>
+        <w:t>todas las rutas se declaran en un solo archivo, agrupadas por quién puede usarlas. Las públicas (registro y login) llevan su propio límite de intentos; el resto exige un token de Sanctum y, cuando corresponde, un rol. Laravel agrega el prefijo /api/v1, así una versión futura de la API puede convivir con esta sin romper el frontend.</w:t>
+      </w:r>
+    </w:p>
+    <w:p>
+      <w:pPr>
         <w:pStyle w:val="Ttulo2"/>
         <w:keepNext/>
       </w:pPr>
-      <w:bookmarkStart w:id="7" w:name="_Toc243979282"/>
+      <w:bookmarkStart w:id="7" w:name="_Toc243979863"/>
       <w:r>
         <w:t>4.1 Formato único de respuesta</w:t>
       </w:r>
@@ -5115,10 +5624,240 @@
     </w:p>
     <w:p>
       <w:pPr>
+        <w:keepNext/>
+        <w:spacing w:before="120" w:after="60"/>
+      </w:pPr>
+      <w:r>
+        <w:rPr>
+          <w:b/>
+          <w:bCs/>
+          <w:sz w:val="21"/>
+          <w:szCs w:val="21"/>
+        </w:rPr>
+        <w:lastRenderedPageBreak/>
+        <w:t xml:space="preserve">Fragmento 3. </w:t>
+      </w:r>
+      <w:r>
+        <w:rPr>
+          <w:i/>
+          <w:iCs/>
+          <w:sz w:val="21"/>
+          <w:szCs w:val="21"/>
+        </w:rPr>
+        <w:t>api/app/Support/ApiResponse.php (extracto)</w:t>
+      </w:r>
+    </w:p>
+    <w:tbl>
+      <w:tblPr>
+        <w:tblW w:w="9070" w:type="dxa"/>
+        <w:tblBorders>
+          <w:top w:val="single" w:sz="4" w:space="0" w:color="auto"/>
+          <w:left w:val="single" w:sz="4" w:space="0" w:color="auto"/>
+          <w:bottom w:val="single" w:sz="4" w:space="0" w:color="auto"/>
+          <w:right w:val="single" w:sz="4" w:space="0" w:color="auto"/>
+          <w:insideH w:val="single" w:sz="4" w:space="0" w:color="auto"/>
+          <w:insideV w:val="single" w:sz="4" w:space="0" w:color="auto"/>
+        </w:tblBorders>
+        <w:tblLook w:val="04A0" w:firstRow="1" w:lastRow="0" w:firstColumn="1" w:lastColumn="0" w:noHBand="0" w:noVBand="1"/>
+      </w:tblPr>
+      <w:tblGrid>
+        <w:gridCol w:w="9070"/>
+      </w:tblGrid>
+      <w:tr>
+        <w:trPr>
+          <w:cantSplit/>
+        </w:trPr>
+        <w:tc>
+          <w:tcPr>
+            <w:tcW w:w="9070" w:type="dxa"/>
+            <w:tcBorders>
+              <w:top w:val="single" w:sz="4" w:space="0" w:color="000000"/>
+              <w:left w:val="single" w:sz="4" w:space="0" w:color="000000"/>
+              <w:bottom w:val="single" w:sz="4" w:space="0" w:color="000000"/>
+              <w:right w:val="single" w:sz="4" w:space="0" w:color="000000"/>
+            </w:tcBorders>
+            <w:shd w:val="clear" w:color="auto" w:fill="F2F2F2"/>
+            <w:tcMar>
+              <w:top w:w="80" w:type="dxa"/>
+              <w:left w:w="140" w:type="dxa"/>
+              <w:bottom w:w="80" w:type="dxa"/>
+              <w:right w:w="140" w:type="dxa"/>
+            </w:tcMar>
+          </w:tcPr>
+          <w:p>
+            <w:r>
+              <w:rPr>
+                <w:rFonts w:ascii="Consolas" w:eastAsia="Consolas" w:hAnsi="Consolas" w:cs="Consolas"/>
+                <w:sz w:val="17"/>
+                <w:szCs w:val="17"/>
+              </w:rPr>
+              <w:t>public static function success(mixed $data = null, int $status = 200,</w:t>
+            </w:r>
+          </w:p>
+          <w:p>
+            <w:r>
+              <w:rPr>
+                <w:rFonts w:ascii="Consolas" w:eastAsia="Consolas" w:hAnsi="Consolas" w:cs="Consolas"/>
+                <w:sz w:val="17"/>
+                <w:szCs w:val="17"/>
+              </w:rPr>
+              <w:t xml:space="preserve">                               array $meta = []): JsonResponse</w:t>
+            </w:r>
+          </w:p>
+          <w:p>
+            <w:r>
+              <w:rPr>
+                <w:rFonts w:ascii="Consolas" w:eastAsia="Consolas" w:hAnsi="Consolas" w:cs="Consolas"/>
+                <w:sz w:val="17"/>
+                <w:szCs w:val="17"/>
+              </w:rPr>
+              <w:t>{</w:t>
+            </w:r>
+          </w:p>
+          <w:p>
+            <w:r>
+              <w:rPr>
+                <w:rFonts w:ascii="Consolas" w:eastAsia="Consolas" w:hAnsi="Consolas" w:cs="Consolas"/>
+                <w:sz w:val="17"/>
+                <w:szCs w:val="17"/>
+              </w:rPr>
+              <w:t xml:space="preserve">    $body = ['success' =&gt; true, 'data' =&gt; $data];</w:t>
+            </w:r>
+          </w:p>
+          <w:p>
+            <w:r>
+              <w:rPr>
+                <w:rFonts w:ascii="Consolas" w:eastAsia="Consolas" w:hAnsi="Consolas" w:cs="Consolas"/>
+                <w:sz w:val="17"/>
+                <w:szCs w:val="17"/>
+              </w:rPr>
+              <w:t xml:space="preserve">    if ($meta !== []) { $body['meta'] = $meta; }</w:t>
+            </w:r>
+          </w:p>
+          <w:p>
+            <w:r>
+              <w:rPr>
+                <w:rFonts w:ascii="Consolas" w:eastAsia="Consolas" w:hAnsi="Consolas" w:cs="Consolas"/>
+                <w:sz w:val="17"/>
+                <w:szCs w:val="17"/>
+              </w:rPr>
+              <w:t xml:space="preserve">    return response()-&gt;json($body, $status);</w:t>
+            </w:r>
+          </w:p>
+          <w:p>
+            <w:r>
+              <w:rPr>
+                <w:rFonts w:ascii="Consolas" w:eastAsia="Consolas" w:hAnsi="Consolas" w:cs="Consolas"/>
+                <w:sz w:val="17"/>
+                <w:szCs w:val="17"/>
+              </w:rPr>
+              <w:t>}</w:t>
+            </w:r>
+          </w:p>
+          <w:p>
+            <w:r>
+              <w:rPr>
+                <w:rFonts w:ascii="Consolas" w:eastAsia="Consolas" w:hAnsi="Consolas" w:cs="Consolas"/>
+                <w:sz w:val="17"/>
+                <w:szCs w:val="17"/>
+              </w:rPr>
+              <w:t xml:space="preserve"> </w:t>
+            </w:r>
+          </w:p>
+          <w:p>
+            <w:r>
+              <w:rPr>
+                <w:rFonts w:ascii="Consolas" w:eastAsia="Consolas" w:hAnsi="Consolas" w:cs="Consolas"/>
+                <w:sz w:val="17"/>
+                <w:szCs w:val="17"/>
+              </w:rPr>
+              <w:t>public static function error(string $code, string $message, int $status,</w:t>
+            </w:r>
+          </w:p>
+          <w:p>
+            <w:r>
+              <w:rPr>
+                <w:rFonts w:ascii="Consolas" w:eastAsia="Consolas" w:hAnsi="Consolas" w:cs="Consolas"/>
+                <w:sz w:val="17"/>
+                <w:szCs w:val="17"/>
+              </w:rPr>
+              <w:t xml:space="preserve">                             mixed $details = null): JsonResponse</w:t>
+            </w:r>
+          </w:p>
+          <w:p>
+            <w:r>
+              <w:rPr>
+                <w:rFonts w:ascii="Consolas" w:eastAsia="Consolas" w:hAnsi="Consolas" w:cs="Consolas"/>
+                <w:sz w:val="17"/>
+                <w:szCs w:val="17"/>
+              </w:rPr>
+              <w:t>{</w:t>
+            </w:r>
+          </w:p>
+          <w:p>
+            <w:r>
+              <w:rPr>
+                <w:rFonts w:ascii="Consolas" w:eastAsia="Consolas" w:hAnsi="Consolas" w:cs="Consolas"/>
+                <w:sz w:val="17"/>
+                <w:szCs w:val="17"/>
+              </w:rPr>
+              <w:t xml:space="preserve">    $error = ['code' =&gt; $code, 'message' =&gt; $message];</w:t>
+            </w:r>
+          </w:p>
+          <w:p>
+            <w:r>
+              <w:rPr>
+                <w:rFonts w:ascii="Consolas" w:eastAsia="Consolas" w:hAnsi="Consolas" w:cs="Consolas"/>
+                <w:sz w:val="17"/>
+                <w:szCs w:val="17"/>
+              </w:rPr>
+              <w:t xml:space="preserve">    if ($details !== null) { $error['details'] = $details; }</w:t>
+            </w:r>
+          </w:p>
+          <w:p>
+            <w:r>
+              <w:rPr>
+                <w:rFonts w:ascii="Consolas" w:eastAsia="Consolas" w:hAnsi="Consolas" w:cs="Consolas"/>
+                <w:sz w:val="17"/>
+                <w:szCs w:val="17"/>
+              </w:rPr>
+              <w:t xml:space="preserve">    return response()-&gt;json(['success' =&gt; false, 'error' =&gt; $error], $status);</w:t>
+            </w:r>
+          </w:p>
+          <w:p>
+            <w:r>
+              <w:rPr>
+                <w:rFonts w:ascii="Consolas" w:eastAsia="Consolas" w:hAnsi="Consolas" w:cs="Consolas"/>
+                <w:sz w:val="17"/>
+                <w:szCs w:val="17"/>
+              </w:rPr>
+              <w:t>}</w:t>
+            </w:r>
+          </w:p>
+        </w:tc>
+      </w:tr>
+    </w:tbl>
+    <w:p>
+      <w:pPr>
+        <w:spacing w:before="80" w:after="160" w:line="300" w:lineRule="auto"/>
+      </w:pPr>
+      <w:r>
+        <w:rPr>
+          <w:b/>
+          <w:bCs/>
+        </w:rPr>
+        <w:t xml:space="preserve">Por qué se usó: </w:t>
+      </w:r>
+      <w:r>
+        <w:t>si cada controlador armara su respuesta a mano, el frontend tendría que adivinar el formato de cada endpoint. Con una sola clase todas las respuestas tienen la misma forma, y el frontend maneja los errores en un único lugar leyendo error.code.</w:t>
+      </w:r>
+    </w:p>
+    <w:p>
+      <w:pPr>
         <w:pStyle w:val="Ttulo2"/>
         <w:keepNext/>
       </w:pPr>
-      <w:bookmarkStart w:id="8" w:name="_Toc243979283"/>
+      <w:bookmarkStart w:id="8" w:name="_Toc243979864"/>
       <w:r>
         <w:t>4.2 Códigos HTTP</w:t>
       </w:r>
@@ -5286,7 +6025,6 @@
                 <w:sz w:val="20"/>
                 <w:szCs w:val="20"/>
               </w:rPr>
-              <w:lastRenderedPageBreak/>
               <w:t>400</w:t>
             </w:r>
           </w:p>
@@ -5712,13 +6450,183 @@
         </w:tc>
       </w:tr>
     </w:tbl>
+    <w:p>
+      <w:pPr>
+        <w:keepNext/>
+        <w:spacing w:before="120" w:after="60"/>
+      </w:pPr>
+      <w:r>
+        <w:rPr>
+          <w:b/>
+          <w:bCs/>
+          <w:sz w:val="21"/>
+          <w:szCs w:val="21"/>
+        </w:rPr>
+        <w:t xml:space="preserve">Fragmento 4. </w:t>
+      </w:r>
+      <w:r>
+        <w:rPr>
+          <w:i/>
+          <w:iCs/>
+          <w:sz w:val="21"/>
+          <w:szCs w:val="21"/>
+        </w:rPr>
+        <w:t>api/app/Exceptions/ApiExceptionRenderer.php (extracto)</w:t>
+      </w:r>
+    </w:p>
+    <w:tbl>
+      <w:tblPr>
+        <w:tblW w:w="9070" w:type="dxa"/>
+        <w:tblBorders>
+          <w:top w:val="single" w:sz="4" w:space="0" w:color="auto"/>
+          <w:left w:val="single" w:sz="4" w:space="0" w:color="auto"/>
+          <w:bottom w:val="single" w:sz="4" w:space="0" w:color="auto"/>
+          <w:right w:val="single" w:sz="4" w:space="0" w:color="auto"/>
+          <w:insideH w:val="single" w:sz="4" w:space="0" w:color="auto"/>
+          <w:insideV w:val="single" w:sz="4" w:space="0" w:color="auto"/>
+        </w:tblBorders>
+        <w:tblLook w:val="04A0" w:firstRow="1" w:lastRow="0" w:firstColumn="1" w:lastColumn="0" w:noHBand="0" w:noVBand="1"/>
+      </w:tblPr>
+      <w:tblGrid>
+        <w:gridCol w:w="9070"/>
+      </w:tblGrid>
+      <w:tr>
+        <w:trPr>
+          <w:cantSplit/>
+        </w:trPr>
+        <w:tc>
+          <w:tcPr>
+            <w:tcW w:w="9070" w:type="dxa"/>
+            <w:tcBorders>
+              <w:top w:val="single" w:sz="4" w:space="0" w:color="000000"/>
+              <w:left w:val="single" w:sz="4" w:space="0" w:color="000000"/>
+              <w:bottom w:val="single" w:sz="4" w:space="0" w:color="000000"/>
+              <w:right w:val="single" w:sz="4" w:space="0" w:color="000000"/>
+            </w:tcBorders>
+            <w:shd w:val="clear" w:color="auto" w:fill="F2F2F2"/>
+            <w:tcMar>
+              <w:top w:w="80" w:type="dxa"/>
+              <w:left w:w="140" w:type="dxa"/>
+              <w:bottom w:w="80" w:type="dxa"/>
+              <w:right w:w="140" w:type="dxa"/>
+            </w:tcMar>
+          </w:tcPr>
+          <w:p>
+            <w:r>
+              <w:rPr>
+                <w:rFonts w:ascii="Consolas" w:eastAsia="Consolas" w:hAnsi="Consolas" w:cs="Consolas"/>
+                <w:sz w:val="17"/>
+                <w:szCs w:val="17"/>
+              </w:rPr>
+              <w:t>return match (true) {</w:t>
+            </w:r>
+          </w:p>
+          <w:p>
+            <w:r>
+              <w:rPr>
+                <w:rFonts w:ascii="Consolas" w:eastAsia="Consolas" w:hAnsi="Consolas" w:cs="Consolas"/>
+                <w:sz w:val="17"/>
+                <w:szCs w:val="17"/>
+              </w:rPr>
+              <w:t xml:space="preserve">    $e instanceof ValidationException       =&gt; ApiResponse::error(..., 422),</w:t>
+            </w:r>
+          </w:p>
+          <w:p>
+            <w:r>
+              <w:rPr>
+                <w:rFonts w:ascii="Consolas" w:eastAsia="Consolas" w:hAnsi="Consolas" w:cs="Consolas"/>
+                <w:sz w:val="17"/>
+                <w:szCs w:val="17"/>
+              </w:rPr>
+              <w:t xml:space="preserve">    $e instanceof AuthenticationException   =&gt; ApiResponse::error(..., 401),</w:t>
+            </w:r>
+          </w:p>
+          <w:p>
+            <w:r>
+              <w:rPr>
+                <w:rFonts w:ascii="Consolas" w:eastAsia="Consolas" w:hAnsi="Consolas" w:cs="Consolas"/>
+                <w:sz w:val="17"/>
+                <w:szCs w:val="17"/>
+              </w:rPr>
+              <w:t xml:space="preserve">    $e instanceof AuthorizationException    =&gt; ApiResponse::error(..., 403),</w:t>
+            </w:r>
+          </w:p>
+          <w:p>
+            <w:r>
+              <w:rPr>
+                <w:rFonts w:ascii="Consolas" w:eastAsia="Consolas" w:hAnsi="Consolas" w:cs="Consolas"/>
+                <w:sz w:val="17"/>
+                <w:szCs w:val="17"/>
+              </w:rPr>
+              <w:t xml:space="preserve">    $e instanceof ModelNotFoundException    =&gt; $this-&gt;modelNotFound($e),      // 404</w:t>
+            </w:r>
+          </w:p>
+          <w:p>
+            <w:r>
+              <w:rPr>
+                <w:rFonts w:ascii="Consolas" w:eastAsia="Consolas" w:hAnsi="Consolas" w:cs="Consolas"/>
+                <w:sz w:val="17"/>
+                <w:szCs w:val="17"/>
+              </w:rPr>
+              <w:t xml:space="preserve">    $e instanceof ThrottleRequestsException =&gt; ApiResponse::error(..., 429),</w:t>
+            </w:r>
+          </w:p>
+          <w:p>
+            <w:r>
+              <w:rPr>
+                <w:rFonts w:ascii="Consolas" w:eastAsia="Consolas" w:hAnsi="Consolas" w:cs="Consolas"/>
+                <w:sz w:val="17"/>
+                <w:szCs w:val="17"/>
+              </w:rPr>
+              <w:t xml:space="preserve">    $this-&gt;isDatabaseDown($e)               =&gt; $this-&gt;serviceUnavailable($e), // 503</w:t>
+            </w:r>
+          </w:p>
+          <w:p>
+            <w:r>
+              <w:rPr>
+                <w:rFonts w:ascii="Consolas" w:eastAsia="Consolas" w:hAnsi="Consolas" w:cs="Consolas"/>
+                <w:sz w:val="17"/>
+                <w:szCs w:val="17"/>
+              </w:rPr>
+              <w:t xml:space="preserve">    default                                 =&gt; $this-&gt;internalError($e),      // 500</w:t>
+            </w:r>
+          </w:p>
+          <w:p>
+            <w:r>
+              <w:rPr>
+                <w:rFonts w:ascii="Consolas" w:eastAsia="Consolas" w:hAnsi="Consolas" w:cs="Consolas"/>
+                <w:sz w:val="17"/>
+                <w:szCs w:val="17"/>
+              </w:rPr>
+              <w:t>};</w:t>
+            </w:r>
+          </w:p>
+        </w:tc>
+      </w:tr>
+    </w:tbl>
+    <w:p>
+      <w:pPr>
+        <w:spacing w:before="80" w:after="160" w:line="300" w:lineRule="auto"/>
+      </w:pPr>
+      <w:r>
+        <w:rPr>
+          <w:b/>
+          <w:bCs/>
+        </w:rPr>
+        <w:t xml:space="preserve">Por qué se usó: </w:t>
+      </w:r>
+      <w:r>
+        <w:t>es el punto central que traduce cualquier error a un código HTTP y al formato único. Así ningún error sale como página HTML ni muestra trazas del servidor; en los 500 se entrega un código de incidente que también queda en el log, para encontrar el error exacto sin mostrar detalles internos al usuario.</w:t>
+      </w:r>
+    </w:p>
     <w:p>
       <w:pPr>
         <w:pStyle w:val="Ttulo1"/>
         <w:keepNext/>
       </w:pPr>
-      <w:bookmarkStart w:id="9" w:name="_Toc243979284"/>
-      <w:r>
+      <w:bookmarkStart w:id="9" w:name="_Toc243979865"/>
+      <w:r>
+        <w:lastRenderedPageBreak/>
         <w:t>5. Registro y login diferenciados</w:t>
       </w:r>
       <w:bookmarkEnd w:id="9"/>
@@ -6356,12 +7264,11 @@
         <w:rPr>
           <w:noProof/>
         </w:rPr>
-        <w:lastRenderedPageBreak/>
         <w:drawing>
-          <wp:inline distT="0" distB="0" distL="0" distR="0" wp14:anchorId="289E29A8" wp14:editId="56B0C8E1">
+          <wp:inline distT="0" distB="0" distL="0" distR="0" wp14:anchorId="6DDDD706" wp14:editId="728EF47E">
             <wp:extent cx="5400675" cy="3371850"/>
             <wp:effectExtent l="0" t="0" r="0" b="0"/>
-            <wp:docPr id="3" name="Imagen 3"/>
+            <wp:docPr id="4" name="Imagen 4"/>
             <wp:cNvGraphicFramePr>
               <a:graphicFrameLocks xmlns:a="http://schemas.openxmlformats.org/drawingml/2006/main" noChangeAspect="1"/>
             </wp:cNvGraphicFramePr>
@@ -6422,11 +7329,12 @@
         <w:rPr>
           <w:noProof/>
         </w:rPr>
+        <w:lastRenderedPageBreak/>
         <w:drawing>
-          <wp:inline distT="0" distB="0" distL="0" distR="0" wp14:anchorId="57173814" wp14:editId="30CF3706">
+          <wp:inline distT="0" distB="0" distL="0" distR="0" wp14:anchorId="71467497" wp14:editId="36F3B792">
             <wp:extent cx="5400675" cy="3371850"/>
             <wp:effectExtent l="0" t="0" r="0" b="0"/>
-            <wp:docPr id="4" name="Imagen 4"/>
+            <wp:docPr id="5" name="Imagen 5"/>
             <wp:cNvGraphicFramePr>
               <a:graphicFrameLocks xmlns:a="http://schemas.openxmlformats.org/drawingml/2006/main" noChangeAspect="1"/>
             </wp:cNvGraphicFramePr>
@@ -6487,12 +7395,11 @@
         <w:rPr>
           <w:noProof/>
         </w:rPr>
-        <w:lastRenderedPageBreak/>
         <w:drawing>
-          <wp:inline distT="0" distB="0" distL="0" distR="0" wp14:anchorId="187EC044" wp14:editId="51A2B76F">
+          <wp:inline distT="0" distB="0" distL="0" distR="0" wp14:anchorId="3ED6397A" wp14:editId="3B67C434">
             <wp:extent cx="5400675" cy="3371850"/>
             <wp:effectExtent l="0" t="0" r="0" b="0"/>
-            <wp:docPr id="5" name="Imagen 5"/>
+            <wp:docPr id="6" name="Imagen 6"/>
             <wp:cNvGraphicFramePr>
               <a:graphicFrameLocks xmlns:a="http://schemas.openxmlformats.org/drawingml/2006/main" noChangeAspect="1"/>
             </wp:cNvGraphicFramePr>
@@ -6545,10 +7452,848 @@
     </w:p>
     <w:p>
       <w:pPr>
+        <w:keepNext/>
+        <w:spacing w:before="120" w:after="60"/>
+      </w:pPr>
+      <w:r>
+        <w:rPr>
+          <w:b/>
+          <w:bCs/>
+          <w:sz w:val="21"/>
+          <w:szCs w:val="21"/>
+        </w:rPr>
+        <w:lastRenderedPageBreak/>
+        <w:t xml:space="preserve">Fragmento 5. </w:t>
+      </w:r>
+      <w:r>
+        <w:rPr>
+          <w:i/>
+          <w:iCs/>
+          <w:sz w:val="21"/>
+          <w:szCs w:val="21"/>
+        </w:rPr>
+        <w:t>api/app/Http/Requests/Auth/RegisterRequest.php</w:t>
+      </w:r>
+    </w:p>
+    <w:tbl>
+      <w:tblPr>
+        <w:tblW w:w="9070" w:type="dxa"/>
+        <w:tblBorders>
+          <w:top w:val="single" w:sz="4" w:space="0" w:color="auto"/>
+          <w:left w:val="single" w:sz="4" w:space="0" w:color="auto"/>
+          <w:bottom w:val="single" w:sz="4" w:space="0" w:color="auto"/>
+          <w:right w:val="single" w:sz="4" w:space="0" w:color="auto"/>
+          <w:insideH w:val="single" w:sz="4" w:space="0" w:color="auto"/>
+          <w:insideV w:val="single" w:sz="4" w:space="0" w:color="auto"/>
+        </w:tblBorders>
+        <w:tblLook w:val="04A0" w:firstRow="1" w:lastRow="0" w:firstColumn="1" w:lastColumn="0" w:noHBand="0" w:noVBand="1"/>
+      </w:tblPr>
+      <w:tblGrid>
+        <w:gridCol w:w="9070"/>
+      </w:tblGrid>
+      <w:tr>
+        <w:trPr>
+          <w:cantSplit/>
+        </w:trPr>
+        <w:tc>
+          <w:tcPr>
+            <w:tcW w:w="9070" w:type="dxa"/>
+            <w:tcBorders>
+              <w:top w:val="single" w:sz="4" w:space="0" w:color="000000"/>
+              <w:left w:val="single" w:sz="4" w:space="0" w:color="000000"/>
+              <w:bottom w:val="single" w:sz="4" w:space="0" w:color="000000"/>
+              <w:right w:val="single" w:sz="4" w:space="0" w:color="000000"/>
+            </w:tcBorders>
+            <w:shd w:val="clear" w:color="auto" w:fill="F2F2F2"/>
+            <w:tcMar>
+              <w:top w:w="80" w:type="dxa"/>
+              <w:left w:w="140" w:type="dxa"/>
+              <w:bottom w:w="80" w:type="dxa"/>
+              <w:right w:w="140" w:type="dxa"/>
+            </w:tcMar>
+          </w:tcPr>
+          <w:p>
+            <w:r>
+              <w:rPr>
+                <w:rFonts w:ascii="Consolas" w:eastAsia="Consolas" w:hAnsi="Consolas" w:cs="Consolas"/>
+                <w:sz w:val="17"/>
+                <w:szCs w:val="17"/>
+              </w:rPr>
+              <w:t>public function rules(): array</w:t>
+            </w:r>
+          </w:p>
+          <w:p>
+            <w:r>
+              <w:rPr>
+                <w:rFonts w:ascii="Consolas" w:eastAsia="Consolas" w:hAnsi="Consolas" w:cs="Consolas"/>
+                <w:sz w:val="17"/>
+                <w:szCs w:val="17"/>
+              </w:rPr>
+              <w:t>{</w:t>
+            </w:r>
+          </w:p>
+          <w:p>
+            <w:r>
+              <w:rPr>
+                <w:rFonts w:ascii="Consolas" w:eastAsia="Consolas" w:hAnsi="Consolas" w:cs="Consolas"/>
+                <w:sz w:val="17"/>
+                <w:szCs w:val="17"/>
+              </w:rPr>
+              <w:t xml:space="preserve">    return [</w:t>
+            </w:r>
+          </w:p>
+          <w:p>
+            <w:r>
+              <w:rPr>
+                <w:rFonts w:ascii="Consolas" w:eastAsia="Consolas" w:hAnsi="Consolas" w:cs="Consolas"/>
+                <w:sz w:val="17"/>
+                <w:szCs w:val="17"/>
+              </w:rPr>
+              <w:t xml:space="preserve">        'name'            =&gt; ['required', 'string', 'max:120'],</w:t>
+            </w:r>
+          </w:p>
+          <w:p>
+            <w:r>
+              <w:rPr>
+                <w:rFonts w:ascii="Consolas" w:eastAsia="Consolas" w:hAnsi="Consolas" w:cs="Consolas"/>
+                <w:sz w:val="17"/>
+                <w:szCs w:val="17"/>
+              </w:rPr>
+              <w:t xml:space="preserve">        'email'           =&gt; ['required', 'email', 'unique:users,email'],</w:t>
+            </w:r>
+          </w:p>
+          <w:p>
+            <w:r>
+              <w:rPr>
+                <w:rFonts w:ascii="Consolas" w:eastAsia="Consolas" w:hAnsi="Consolas" w:cs="Consolas"/>
+                <w:sz w:val="17"/>
+                <w:szCs w:val="17"/>
+              </w:rPr>
+              <w:t xml:space="preserve">        'password'        =&gt; ['required', 'confirmed',</w:t>
+            </w:r>
+          </w:p>
+          <w:p>
+            <w:r>
+              <w:rPr>
+                <w:rFonts w:ascii="Consolas" w:eastAsia="Consolas" w:hAnsi="Consolas" w:cs="Consolas"/>
+                <w:sz w:val="17"/>
+                <w:szCs w:val="17"/>
+              </w:rPr>
+              <w:t xml:space="preserve">                              Password::min(8)-&gt;letters()-&gt;numbers()],</w:t>
+            </w:r>
+          </w:p>
+          <w:p>
+            <w:r>
+              <w:rPr>
+                <w:rFonts w:ascii="Consolas" w:eastAsia="Consolas" w:hAnsi="Consolas" w:cs="Consolas"/>
+                <w:sz w:val="17"/>
+                <w:szCs w:val="17"/>
+              </w:rPr>
+              <w:t xml:space="preserve">        'document_type'   =&gt; ['required', Rule::in(Client::DOCUMENT_TYPES)],</w:t>
+            </w:r>
+          </w:p>
+          <w:p>
+            <w:r>
+              <w:rPr>
+                <w:rFonts w:ascii="Consolas" w:eastAsia="Consolas" w:hAnsi="Consolas" w:cs="Consolas"/>
+                <w:sz w:val="17"/>
+                <w:szCs w:val="17"/>
+              </w:rPr>
+              <w:t xml:space="preserve">        'document_number' =&gt; ['required', 'unique:clients,document_number'],</w:t>
+            </w:r>
+          </w:p>
+          <w:p>
+            <w:r>
+              <w:rPr>
+                <w:rFonts w:ascii="Consolas" w:eastAsia="Consolas" w:hAnsi="Consolas" w:cs="Consolas"/>
+                <w:sz w:val="17"/>
+                <w:szCs w:val="17"/>
+              </w:rPr>
+              <w:t xml:space="preserve">    ];</w:t>
+            </w:r>
+          </w:p>
+          <w:p>
+            <w:r>
+              <w:rPr>
+                <w:rFonts w:ascii="Consolas" w:eastAsia="Consolas" w:hAnsi="Consolas" w:cs="Consolas"/>
+                <w:sz w:val="17"/>
+                <w:szCs w:val="17"/>
+              </w:rPr>
+              <w:t>}</w:t>
+            </w:r>
+          </w:p>
+        </w:tc>
+      </w:tr>
+    </w:tbl>
+    <w:p>
+      <w:pPr>
+        <w:spacing w:before="80" w:after="160" w:line="300" w:lineRule="auto"/>
+      </w:pPr>
+      <w:r>
+        <w:rPr>
+          <w:b/>
+          <w:bCs/>
+        </w:rPr>
+        <w:t xml:space="preserve">Por qué se usó: </w:t>
+      </w:r>
+      <w:r>
+        <w:t>el registro tiene su propia validación, distinta de la del login. Se valida antes de llegar al controlador: si un dato falla, Laravel responde 422 con el mensaje de cada campo y el formulario lo muestra junto al campo. Las reglas unique evitan correos o documentos duplicados.</w:t>
+      </w:r>
+    </w:p>
+    <w:p>
+      <w:pPr>
+        <w:keepNext/>
+        <w:spacing w:before="120" w:after="60"/>
+      </w:pPr>
+      <w:r>
+        <w:rPr>
+          <w:b/>
+          <w:bCs/>
+          <w:sz w:val="21"/>
+          <w:szCs w:val="21"/>
+        </w:rPr>
+        <w:t xml:space="preserve">Fragmento 6. </w:t>
+      </w:r>
+      <w:r>
+        <w:rPr>
+          <w:i/>
+          <w:iCs/>
+          <w:sz w:val="21"/>
+          <w:szCs w:val="21"/>
+        </w:rPr>
+        <w:t>api/app/Http/Controllers/Api/AuthController.php (extracto)</w:t>
+      </w:r>
+    </w:p>
+    <w:tbl>
+      <w:tblPr>
+        <w:tblW w:w="9070" w:type="dxa"/>
+        <w:tblBorders>
+          <w:top w:val="single" w:sz="4" w:space="0" w:color="auto"/>
+          <w:left w:val="single" w:sz="4" w:space="0" w:color="auto"/>
+          <w:bottom w:val="single" w:sz="4" w:space="0" w:color="auto"/>
+          <w:right w:val="single" w:sz="4" w:space="0" w:color="auto"/>
+          <w:insideH w:val="single" w:sz="4" w:space="0" w:color="auto"/>
+          <w:insideV w:val="single" w:sz="4" w:space="0" w:color="auto"/>
+        </w:tblBorders>
+        <w:tblLook w:val="04A0" w:firstRow="1" w:lastRow="0" w:firstColumn="1" w:lastColumn="0" w:noHBand="0" w:noVBand="1"/>
+      </w:tblPr>
+      <w:tblGrid>
+        <w:gridCol w:w="9070"/>
+      </w:tblGrid>
+      <w:tr>
+        <w:trPr>
+          <w:cantSplit/>
+        </w:trPr>
+        <w:tc>
+          <w:tcPr>
+            <w:tcW w:w="9070" w:type="dxa"/>
+            <w:tcBorders>
+              <w:top w:val="single" w:sz="4" w:space="0" w:color="000000"/>
+              <w:left w:val="single" w:sz="4" w:space="0" w:color="000000"/>
+              <w:bottom w:val="single" w:sz="4" w:space="0" w:color="000000"/>
+              <w:right w:val="single" w:sz="4" w:space="0" w:color="000000"/>
+            </w:tcBorders>
+            <w:shd w:val="clear" w:color="auto" w:fill="F2F2F2"/>
+            <w:tcMar>
+              <w:top w:w="80" w:type="dxa"/>
+              <w:left w:w="140" w:type="dxa"/>
+              <w:bottom w:w="80" w:type="dxa"/>
+              <w:right w:w="140" w:type="dxa"/>
+            </w:tcMar>
+          </w:tcPr>
+          <w:p>
+            <w:r>
+              <w:rPr>
+                <w:rFonts w:ascii="Consolas" w:eastAsia="Consolas" w:hAnsi="Consolas" w:cs="Consolas"/>
+                <w:sz w:val="17"/>
+                <w:szCs w:val="17"/>
+              </w:rPr>
+              <w:t>public function register(RegisterRequest $request): JsonResponse</w:t>
+            </w:r>
+          </w:p>
+          <w:p>
+            <w:r>
+              <w:rPr>
+                <w:rFonts w:ascii="Consolas" w:eastAsia="Consolas" w:hAnsi="Consolas" w:cs="Consolas"/>
+                <w:sz w:val="17"/>
+                <w:szCs w:val="17"/>
+              </w:rPr>
+              <w:t>{</w:t>
+            </w:r>
+          </w:p>
+          <w:p>
+            <w:r>
+              <w:rPr>
+                <w:rFonts w:ascii="Consolas" w:eastAsia="Consolas" w:hAnsi="Consolas" w:cs="Consolas"/>
+                <w:sz w:val="17"/>
+                <w:szCs w:val="17"/>
+              </w:rPr>
+              <w:t xml:space="preserve">    $user = DB::transaction(function () use ($data) {</w:t>
+            </w:r>
+          </w:p>
+          <w:p>
+            <w:r>
+              <w:rPr>
+                <w:rFonts w:ascii="Consolas" w:eastAsia="Consolas" w:hAnsi="Consolas" w:cs="Consolas"/>
+                <w:sz w:val="17"/>
+                <w:szCs w:val="17"/>
+              </w:rPr>
+              <w:t xml:space="preserve">        $user = User::create([...]);              // la contraseña se guarda con bcrypt</w:t>
+            </w:r>
+          </w:p>
+          <w:p>
+            <w:r>
+              <w:rPr>
+                <w:rFonts w:ascii="Consolas" w:eastAsia="Consolas" w:hAnsi="Consolas" w:cs="Consolas"/>
+                <w:sz w:val="17"/>
+                <w:szCs w:val="17"/>
+              </w:rPr>
+              <w:t xml:space="preserve">        $user-&gt;assignRole(Role::CLIENT);           // todo registro público es Cliente</w:t>
+            </w:r>
+          </w:p>
+          <w:p>
+            <w:r>
+              <w:rPr>
+                <w:rFonts w:ascii="Consolas" w:eastAsia="Consolas" w:hAnsi="Consolas" w:cs="Consolas"/>
+                <w:sz w:val="17"/>
+                <w:szCs w:val="17"/>
+              </w:rPr>
+              <w:t xml:space="preserve">        Client::create(['user_id' =&gt; $user-&gt;id, ...]);</w:t>
+            </w:r>
+          </w:p>
+          <w:p>
+            <w:r>
+              <w:rPr>
+                <w:rFonts w:ascii="Consolas" w:eastAsia="Consolas" w:hAnsi="Consolas" w:cs="Consolas"/>
+                <w:sz w:val="17"/>
+                <w:szCs w:val="17"/>
+              </w:rPr>
+              <w:t xml:space="preserve">        return $user;</w:t>
+            </w:r>
+          </w:p>
+          <w:p>
+            <w:r>
+              <w:rPr>
+                <w:rFonts w:ascii="Consolas" w:eastAsia="Consolas" w:hAnsi="Consolas" w:cs="Consolas"/>
+                <w:sz w:val="17"/>
+                <w:szCs w:val="17"/>
+              </w:rPr>
+              <w:t xml:space="preserve">    });</w:t>
+            </w:r>
+          </w:p>
+          <w:p>
+            <w:r>
+              <w:rPr>
+                <w:rFonts w:ascii="Consolas" w:eastAsia="Consolas" w:hAnsi="Consolas" w:cs="Consolas"/>
+                <w:sz w:val="17"/>
+                <w:szCs w:val="17"/>
+              </w:rPr>
+              <w:t xml:space="preserve">    event(new Registered($user));                  // envía el correo de verificación</w:t>
+            </w:r>
+          </w:p>
+          <w:p>
+            <w:r>
+              <w:rPr>
+                <w:rFonts w:ascii="Consolas" w:eastAsia="Consolas" w:hAnsi="Consolas" w:cs="Consolas"/>
+                <w:sz w:val="17"/>
+                <w:szCs w:val="17"/>
+              </w:rPr>
+              <w:t xml:space="preserve">    return ApiResponse::created($this-&gt;tokenPayload($user, 'web'));</w:t>
+            </w:r>
+          </w:p>
+          <w:p>
+            <w:r>
+              <w:rPr>
+                <w:rFonts w:ascii="Consolas" w:eastAsia="Consolas" w:hAnsi="Consolas" w:cs="Consolas"/>
+                <w:sz w:val="17"/>
+                <w:szCs w:val="17"/>
+              </w:rPr>
+              <w:t>}</w:t>
+            </w:r>
+          </w:p>
+          <w:p>
+            <w:r>
+              <w:rPr>
+                <w:rFonts w:ascii="Consolas" w:eastAsia="Consolas" w:hAnsi="Consolas" w:cs="Consolas"/>
+                <w:sz w:val="17"/>
+                <w:szCs w:val="17"/>
+              </w:rPr>
+              <w:t xml:space="preserve"> </w:t>
+            </w:r>
+          </w:p>
+          <w:p>
+            <w:r>
+              <w:rPr>
+                <w:rFonts w:ascii="Consolas" w:eastAsia="Consolas" w:hAnsi="Consolas" w:cs="Consolas"/>
+                <w:sz w:val="17"/>
+                <w:szCs w:val="17"/>
+              </w:rPr>
+              <w:t>public function login(LoginRequest $request): JsonResponse</w:t>
+            </w:r>
+          </w:p>
+          <w:p>
+            <w:r>
+              <w:rPr>
+                <w:rFonts w:ascii="Consolas" w:eastAsia="Consolas" w:hAnsi="Consolas" w:cs="Consolas"/>
+                <w:sz w:val="17"/>
+                <w:szCs w:val="17"/>
+              </w:rPr>
+              <w:t>{</w:t>
+            </w:r>
+          </w:p>
+          <w:p>
+            <w:r>
+              <w:rPr>
+                <w:rFonts w:ascii="Consolas" w:eastAsia="Consolas" w:hAnsi="Consolas" w:cs="Consolas"/>
+                <w:sz w:val="17"/>
+                <w:szCs w:val="17"/>
+              </w:rPr>
+              <w:t xml:space="preserve">    $user = User::where('email', $request-&gt;string('email'))-&gt;first();</w:t>
+            </w:r>
+          </w:p>
+          <w:p>
+            <w:r>
+              <w:rPr>
+                <w:rFonts w:ascii="Consolas" w:eastAsia="Consolas" w:hAnsi="Consolas" w:cs="Consolas"/>
+                <w:sz w:val="17"/>
+                <w:szCs w:val="17"/>
+              </w:rPr>
+              <w:t xml:space="preserve">    if (! $user || ! Hash::check($request-&gt;password, $user-&gt;password)) {</w:t>
+            </w:r>
+          </w:p>
+          <w:p>
+            <w:r>
+              <w:rPr>
+                <w:rFonts w:ascii="Consolas" w:eastAsia="Consolas" w:hAnsi="Consolas" w:cs="Consolas"/>
+                <w:sz w:val="17"/>
+                <w:szCs w:val="17"/>
+              </w:rPr>
+              <w:t xml:space="preserve">        throw new ApiException('INVALID_CREDENTIALS', '...', 401);</w:t>
+            </w:r>
+          </w:p>
+          <w:p>
+            <w:r>
+              <w:rPr>
+                <w:rFonts w:ascii="Consolas" w:eastAsia="Consolas" w:hAnsi="Consolas" w:cs="Consolas"/>
+                <w:sz w:val="17"/>
+                <w:szCs w:val="17"/>
+              </w:rPr>
+              <w:t xml:space="preserve">    }</w:t>
+            </w:r>
+          </w:p>
+          <w:p>
+            <w:r>
+              <w:rPr>
+                <w:rFonts w:ascii="Consolas" w:eastAsia="Consolas" w:hAnsi="Consolas" w:cs="Consolas"/>
+                <w:sz w:val="17"/>
+                <w:szCs w:val="17"/>
+              </w:rPr>
+              <w:t xml:space="preserve">    return ApiResponse::success($this-&gt;tokenPayload($user, ...));</w:t>
+            </w:r>
+          </w:p>
+          <w:p>
+            <w:r>
+              <w:rPr>
+                <w:rFonts w:ascii="Consolas" w:eastAsia="Consolas" w:hAnsi="Consolas" w:cs="Consolas"/>
+                <w:sz w:val="17"/>
+                <w:szCs w:val="17"/>
+              </w:rPr>
+              <w:t>}</w:t>
+            </w:r>
+          </w:p>
+        </w:tc>
+      </w:tr>
+    </w:tbl>
+    <w:p>
+      <w:pPr>
+        <w:spacing w:before="80" w:after="160" w:line="300" w:lineRule="auto"/>
+      </w:pPr>
+      <w:r>
+        <w:rPr>
+          <w:b/>
+          <w:bCs/>
+        </w:rPr>
+        <w:t xml:space="preserve">Por qué se usó: </w:t>
+      </w:r>
+      <w:r>
+        <w:t>son dos acciones separadas con responsabilidades distintas. El registro crea en una transacción la cuenta, su rol y su ficha de huésped: si algo falla, no queda nada a medias. El login solo compara la contraseña con el hash bcrypt y responde el mismo mensaje si falla el correo o la contraseña, para no revelar qué correos existen. Ambos devuelven un token Bearer de Sanctum que vence a los 60 minutos.</w:t>
+      </w:r>
+    </w:p>
+    <w:p>
+      <w:pPr>
+        <w:keepNext/>
+        <w:spacing w:before="120" w:after="60"/>
+      </w:pPr>
+      <w:r>
+        <w:rPr>
+          <w:b/>
+          <w:bCs/>
+          <w:sz w:val="21"/>
+          <w:szCs w:val="21"/>
+        </w:rPr>
+        <w:t xml:space="preserve">Fragmento 7. </w:t>
+      </w:r>
+      <w:r>
+        <w:rPr>
+          <w:i/>
+          <w:iCs/>
+          <w:sz w:val="21"/>
+          <w:szCs w:val="21"/>
+        </w:rPr>
+        <w:t>api/app/Models/User.php y AppServiceProvider.php (extractos)</w:t>
+      </w:r>
+    </w:p>
+    <w:tbl>
+      <w:tblPr>
+        <w:tblW w:w="9070" w:type="dxa"/>
+        <w:tblBorders>
+          <w:top w:val="single" w:sz="4" w:space="0" w:color="auto"/>
+          <w:left w:val="single" w:sz="4" w:space="0" w:color="auto"/>
+          <w:bottom w:val="single" w:sz="4" w:space="0" w:color="auto"/>
+          <w:right w:val="single" w:sz="4" w:space="0" w:color="auto"/>
+          <w:insideH w:val="single" w:sz="4" w:space="0" w:color="auto"/>
+          <w:insideV w:val="single" w:sz="4" w:space="0" w:color="auto"/>
+        </w:tblBorders>
+        <w:tblLook w:val="04A0" w:firstRow="1" w:lastRow="0" w:firstColumn="1" w:lastColumn="0" w:noHBand="0" w:noVBand="1"/>
+      </w:tblPr>
+      <w:tblGrid>
+        <w:gridCol w:w="9070"/>
+      </w:tblGrid>
+      <w:tr>
+        <w:trPr>
+          <w:cantSplit/>
+        </w:trPr>
+        <w:tc>
+          <w:tcPr>
+            <w:tcW w:w="9070" w:type="dxa"/>
+            <w:tcBorders>
+              <w:top w:val="single" w:sz="4" w:space="0" w:color="000000"/>
+              <w:left w:val="single" w:sz="4" w:space="0" w:color="000000"/>
+              <w:bottom w:val="single" w:sz="4" w:space="0" w:color="000000"/>
+              <w:right w:val="single" w:sz="4" w:space="0" w:color="000000"/>
+            </w:tcBorders>
+            <w:shd w:val="clear" w:color="auto" w:fill="F2F2F2"/>
+            <w:tcMar>
+              <w:top w:w="80" w:type="dxa"/>
+              <w:left w:w="140" w:type="dxa"/>
+              <w:bottom w:w="80" w:type="dxa"/>
+              <w:right w:w="140" w:type="dxa"/>
+            </w:tcMar>
+          </w:tcPr>
+          <w:p>
+            <w:r>
+              <w:rPr>
+                <w:rFonts w:ascii="Consolas" w:eastAsia="Consolas" w:hAnsi="Consolas" w:cs="Consolas"/>
+                <w:sz w:val="17"/>
+                <w:szCs w:val="17"/>
+              </w:rPr>
+              <w:t>protected function casts(): array</w:t>
+            </w:r>
+          </w:p>
+          <w:p>
+            <w:r>
+              <w:rPr>
+                <w:rFonts w:ascii="Consolas" w:eastAsia="Consolas" w:hAnsi="Consolas" w:cs="Consolas"/>
+                <w:sz w:val="17"/>
+                <w:szCs w:val="17"/>
+              </w:rPr>
+              <w:t>{</w:t>
+            </w:r>
+          </w:p>
+          <w:p>
+            <w:r>
+              <w:rPr>
+                <w:rFonts w:ascii="Consolas" w:eastAsia="Consolas" w:hAnsi="Consolas" w:cs="Consolas"/>
+                <w:sz w:val="17"/>
+                <w:szCs w:val="17"/>
+              </w:rPr>
+              <w:t xml:space="preserve">    return [</w:t>
+            </w:r>
+          </w:p>
+          <w:p>
+            <w:r>
+              <w:rPr>
+                <w:rFonts w:ascii="Consolas" w:eastAsia="Consolas" w:hAnsi="Consolas" w:cs="Consolas"/>
+                <w:sz w:val="17"/>
+                <w:szCs w:val="17"/>
+              </w:rPr>
+              <w:t xml:space="preserve">        'email_verified_at' =&gt; 'datetime',</w:t>
+            </w:r>
+          </w:p>
+          <w:p>
+            <w:r>
+              <w:rPr>
+                <w:rFonts w:ascii="Consolas" w:eastAsia="Consolas" w:hAnsi="Consolas" w:cs="Consolas"/>
+                <w:sz w:val="17"/>
+                <w:szCs w:val="17"/>
+              </w:rPr>
+              <w:t xml:space="preserve">        'password'          =&gt; 'hashed',   // bcrypt automático</w:t>
+            </w:r>
+          </w:p>
+          <w:p>
+            <w:r>
+              <w:rPr>
+                <w:rFonts w:ascii="Consolas" w:eastAsia="Consolas" w:hAnsi="Consolas" w:cs="Consolas"/>
+                <w:sz w:val="17"/>
+                <w:szCs w:val="17"/>
+              </w:rPr>
+              <w:t xml:space="preserve">    ];</w:t>
+            </w:r>
+          </w:p>
+          <w:p>
+            <w:r>
+              <w:rPr>
+                <w:rFonts w:ascii="Consolas" w:eastAsia="Consolas" w:hAnsi="Consolas" w:cs="Consolas"/>
+                <w:sz w:val="17"/>
+                <w:szCs w:val="17"/>
+              </w:rPr>
+              <w:t>}</w:t>
+            </w:r>
+          </w:p>
+          <w:p>
+            <w:r>
+              <w:rPr>
+                <w:rFonts w:ascii="Consolas" w:eastAsia="Consolas" w:hAnsi="Consolas" w:cs="Consolas"/>
+                <w:sz w:val="17"/>
+                <w:szCs w:val="17"/>
+              </w:rPr>
+              <w:t xml:space="preserve"> </w:t>
+            </w:r>
+          </w:p>
+          <w:p>
+            <w:r>
+              <w:rPr>
+                <w:rFonts w:ascii="Consolas" w:eastAsia="Consolas" w:hAnsi="Consolas" w:cs="Consolas"/>
+                <w:sz w:val="17"/>
+                <w:szCs w:val="17"/>
+              </w:rPr>
+              <w:t>RateLimiter::for('login', fn (Request $r) =&gt; Limit::perMinute(5)</w:t>
+            </w:r>
+          </w:p>
+          <w:p>
+            <w:r>
+              <w:rPr>
+                <w:rFonts w:ascii="Consolas" w:eastAsia="Consolas" w:hAnsi="Consolas" w:cs="Consolas"/>
+                <w:sz w:val="17"/>
+                <w:szCs w:val="17"/>
+              </w:rPr>
+              <w:t xml:space="preserve">    -&gt;by(Str::lower($r-&gt;input('email')).'|'.$r-&gt;ip()));</w:t>
+            </w:r>
+          </w:p>
+          <w:p>
+            <w:r>
+              <w:rPr>
+                <w:rFonts w:ascii="Consolas" w:eastAsia="Consolas" w:hAnsi="Consolas" w:cs="Consolas"/>
+                <w:sz w:val="17"/>
+                <w:szCs w:val="17"/>
+              </w:rPr>
+              <w:t>RateLimiter::for('register', fn (Request $r) =&gt; Limit::perMinute(3)-&gt;by($r-&gt;ip()));</w:t>
+            </w:r>
+          </w:p>
+        </w:tc>
+      </w:tr>
+    </w:tbl>
+    <w:p>
+      <w:pPr>
+        <w:spacing w:before="80" w:after="160" w:line="300" w:lineRule="auto"/>
+      </w:pPr>
+      <w:r>
+        <w:rPr>
+          <w:b/>
+          <w:bCs/>
+        </w:rPr>
+        <w:lastRenderedPageBreak/>
+        <w:t xml:space="preserve">Por qué se usó: </w:t>
+      </w:r>
+      <w:r>
+        <w:t>con el cast hashed, cualquier contraseña que se asigne al usuario se cifra con bcrypt antes de guardarse, sin depender de que cada desarrollador lo recuerde. Los límites de intentos frenan ataques de fuerza bruta: el login permite 5 intentos por minuto por correo e IP y el registro 3 por minuto por IP; al superarlos la API responde 429.</w:t>
+      </w:r>
+    </w:p>
+    <w:p>
+      <w:pPr>
+        <w:keepNext/>
+        <w:spacing w:before="120" w:after="60"/>
+      </w:pPr>
+      <w:r>
+        <w:rPr>
+          <w:b/>
+          <w:bCs/>
+          <w:sz w:val="21"/>
+          <w:szCs w:val="21"/>
+        </w:rPr>
+        <w:t xml:space="preserve">Fragmento 8. </w:t>
+      </w:r>
+      <w:r>
+        <w:rPr>
+          <w:i/>
+          <w:iCs/>
+          <w:sz w:val="21"/>
+          <w:szCs w:val="21"/>
+        </w:rPr>
+        <w:t>web/src/App.tsx (extracto)</w:t>
+      </w:r>
+    </w:p>
+    <w:tbl>
+      <w:tblPr>
+        <w:tblW w:w="9070" w:type="dxa"/>
+        <w:tblBorders>
+          <w:top w:val="single" w:sz="4" w:space="0" w:color="auto"/>
+          <w:left w:val="single" w:sz="4" w:space="0" w:color="auto"/>
+          <w:bottom w:val="single" w:sz="4" w:space="0" w:color="auto"/>
+          <w:right w:val="single" w:sz="4" w:space="0" w:color="auto"/>
+          <w:insideH w:val="single" w:sz="4" w:space="0" w:color="auto"/>
+          <w:insideV w:val="single" w:sz="4" w:space="0" w:color="auto"/>
+        </w:tblBorders>
+        <w:tblLook w:val="04A0" w:firstRow="1" w:lastRow="0" w:firstColumn="1" w:lastColumn="0" w:noHBand="0" w:noVBand="1"/>
+      </w:tblPr>
+      <w:tblGrid>
+        <w:gridCol w:w="9070"/>
+      </w:tblGrid>
+      <w:tr>
+        <w:trPr>
+          <w:cantSplit/>
+        </w:trPr>
+        <w:tc>
+          <w:tcPr>
+            <w:tcW w:w="9070" w:type="dxa"/>
+            <w:tcBorders>
+              <w:top w:val="single" w:sz="4" w:space="0" w:color="000000"/>
+              <w:left w:val="single" w:sz="4" w:space="0" w:color="000000"/>
+              <w:bottom w:val="single" w:sz="4" w:space="0" w:color="000000"/>
+              <w:right w:val="single" w:sz="4" w:space="0" w:color="000000"/>
+            </w:tcBorders>
+            <w:shd w:val="clear" w:color="auto" w:fill="F2F2F2"/>
+            <w:tcMar>
+              <w:top w:w="80" w:type="dxa"/>
+              <w:left w:w="140" w:type="dxa"/>
+              <w:bottom w:w="80" w:type="dxa"/>
+              <w:right w:w="140" w:type="dxa"/>
+            </w:tcMar>
+          </w:tcPr>
+          <w:p>
+            <w:r>
+              <w:rPr>
+                <w:rFonts w:ascii="Consolas" w:eastAsia="Consolas" w:hAnsi="Consolas" w:cs="Consolas"/>
+                <w:sz w:val="17"/>
+                <w:szCs w:val="17"/>
+              </w:rPr>
+              <w:t>&lt;Route element={&lt;GuestRoute /&gt;}&gt;</w:t>
+            </w:r>
+          </w:p>
+          <w:p>
+            <w:r>
+              <w:rPr>
+                <w:rFonts w:ascii="Consolas" w:eastAsia="Consolas" w:hAnsi="Consolas" w:cs="Consolas"/>
+                <w:sz w:val="17"/>
+                <w:szCs w:val="17"/>
+              </w:rPr>
+              <w:t xml:space="preserve">  &lt;Route path="/login" element={&lt;LoginPage /&gt;} /&gt;</w:t>
+            </w:r>
+          </w:p>
+          <w:p>
+            <w:r>
+              <w:rPr>
+                <w:rFonts w:ascii="Consolas" w:eastAsia="Consolas" w:hAnsi="Consolas" w:cs="Consolas"/>
+                <w:sz w:val="17"/>
+                <w:szCs w:val="17"/>
+              </w:rPr>
+              <w:t xml:space="preserve">  &lt;Route path="/registro" element={&lt;RegisterPage /&gt;} /&gt;</w:t>
+            </w:r>
+          </w:p>
+          <w:p>
+            <w:r>
+              <w:rPr>
+                <w:rFonts w:ascii="Consolas" w:eastAsia="Consolas" w:hAnsi="Consolas" w:cs="Consolas"/>
+                <w:sz w:val="17"/>
+                <w:szCs w:val="17"/>
+              </w:rPr>
+              <w:t>&lt;/Route&gt;</w:t>
+            </w:r>
+          </w:p>
+          <w:p>
+            <w:r>
+              <w:rPr>
+                <w:rFonts w:ascii="Consolas" w:eastAsia="Consolas" w:hAnsi="Consolas" w:cs="Consolas"/>
+                <w:sz w:val="17"/>
+                <w:szCs w:val="17"/>
+              </w:rPr>
+              <w:t xml:space="preserve"> </w:t>
+            </w:r>
+          </w:p>
+          <w:p>
+            <w:r>
+              <w:rPr>
+                <w:rFonts w:ascii="Consolas" w:eastAsia="Consolas" w:hAnsi="Consolas" w:cs="Consolas"/>
+                <w:sz w:val="17"/>
+                <w:szCs w:val="17"/>
+              </w:rPr>
+              <w:t>&lt;Route element={&lt;ProtectedRoute /&gt;}&gt;</w:t>
+            </w:r>
+          </w:p>
+          <w:p>
+            <w:r>
+              <w:rPr>
+                <w:rFonts w:ascii="Consolas" w:eastAsia="Consolas" w:hAnsi="Consolas" w:cs="Consolas"/>
+                <w:sz w:val="17"/>
+                <w:szCs w:val="17"/>
+              </w:rPr>
+              <w:t xml:space="preserve">  &lt;Route element={&lt;ProtectedRoute roles={['admin']} /&gt;}&gt;</w:t>
+            </w:r>
+          </w:p>
+          <w:p>
+            <w:r>
+              <w:rPr>
+                <w:rFonts w:ascii="Consolas" w:eastAsia="Consolas" w:hAnsi="Consolas" w:cs="Consolas"/>
+                <w:sz w:val="17"/>
+                <w:szCs w:val="17"/>
+              </w:rPr>
+              <w:t xml:space="preserve">    &lt;Route path="/personal" element={&lt;StaffPage /&gt;} /&gt;</w:t>
+            </w:r>
+          </w:p>
+          <w:p>
+            <w:r>
+              <w:rPr>
+                <w:rFonts w:ascii="Consolas" w:eastAsia="Consolas" w:hAnsi="Consolas" w:cs="Consolas"/>
+                <w:sz w:val="17"/>
+                <w:szCs w:val="17"/>
+              </w:rPr>
+              <w:t xml:space="preserve">  &lt;/Route&gt;</w:t>
+            </w:r>
+          </w:p>
+          <w:p>
+            <w:r>
+              <w:rPr>
+                <w:rFonts w:ascii="Consolas" w:eastAsia="Consolas" w:hAnsi="Consolas" w:cs="Consolas"/>
+                <w:sz w:val="17"/>
+                <w:szCs w:val="17"/>
+              </w:rPr>
+              <w:t>&lt;/Route&gt;</w:t>
+            </w:r>
+          </w:p>
+        </w:tc>
+      </w:tr>
+    </w:tbl>
+    <w:p>
+      <w:pPr>
+        <w:spacing w:before="80" w:after="160" w:line="300" w:lineRule="auto"/>
+      </w:pPr>
+      <w:r>
+        <w:rPr>
+          <w:b/>
+          <w:bCs/>
+        </w:rPr>
+        <w:t xml:space="preserve">Por qué se usó: </w:t>
+      </w:r>
+      <w:r>
+        <w:t>en el frontend el login y el registro son dos pantallas con su propia ruta. GuestRoute las oculta si ya hay sesión, y ProtectedRoute comprueba la sesión y el rol: si alguien escribe a mano una ruta que su rol no puede ver, se muestra la pantalla 403. El backend valida lo mismo en cada endpoint, así que esconder la pantalla no es la única protección.</w:t>
+      </w:r>
+    </w:p>
+    <w:p>
+      <w:pPr>
         <w:pStyle w:val="Ttulo2"/>
         <w:keepNext/>
       </w:pPr>
-      <w:bookmarkStart w:id="10" w:name="_Toc243979285"/>
+      <w:bookmarkStart w:id="10" w:name="_Toc243979866"/>
       <w:r>
         <w:t>5.1 Pruebas automáticas del registro y login</w:t>
       </w:r>
@@ -7166,7 +8911,7 @@
         <w:pStyle w:val="Ttulo1"/>
         <w:keepNext/>
       </w:pPr>
-      <w:bookmarkStart w:id="11" w:name="_Toc243979286"/>
+      <w:bookmarkStart w:id="11" w:name="_Toc243979867"/>
       <w:r>
         <w:t>6. Registro de incidentes</w:t>
       </w:r>
@@ -7773,7 +9518,7 @@
         <w:pStyle w:val="Ttulo1"/>
         <w:keepNext/>
       </w:pPr>
-      <w:bookmarkStart w:id="12" w:name="_Toc243979287"/>
+      <w:bookmarkStart w:id="12" w:name="_Toc243979868"/>
       <w:r>
         <w:t>7. Conclusiones de la entrega</w:t>
       </w:r>
@@ -7800,14 +9545,16 @@
           <w:numId w:val="2"/>
         </w:numPr>
         <w:spacing w:after="60" w:line="288" w:lineRule="auto"/>
+        <w:sectPr>
+          <w:footerReference w:type="default" r:id="rId12"/>
+          <w:pgSz w:w="11906" w:h="16838"/>
+          <w:pgMar w:top="1418" w:right="1418" w:bottom="1418" w:left="1418" w:header="708" w:footer="708" w:gutter="0"/>
+          <w:cols w:space="720"/>
+          <w:docGrid w:linePitch="360"/>
+        </w:sectPr>
       </w:pPr>
       <w:r>
         <w:t>Las pruebas de carga locales (sección 8.2) muestran que el servidor de desarrollo se satura con pocos usuarios. En la entrega del 80% se repetirán en AWS con Nginx + PHP-FPM, que atiende varias peticiones a la vez.</w:t>
-      </w:r>
-    </w:p>
-    <w:p>
-      <w:r>
-        <w:br w:type="page"/>
       </w:r>
     </w:p>
     <w:p>
@@ -7815,7 +9562,7 @@
         <w:pStyle w:val="Ttulo1"/>
         <w:keepNext/>
       </w:pPr>
-      <w:bookmarkStart w:id="13" w:name="_Toc243979288"/>
+      <w:bookmarkStart w:id="13" w:name="_Toc243979869"/>
       <w:r>
         <w:lastRenderedPageBreak/>
         <w:t>8. EXTRAS (adicionales a lo evaluado en el 25%)</w:t>
@@ -7839,7 +9586,7 @@
         <w:pStyle w:val="Ttulo2"/>
         <w:keepNext/>
       </w:pPr>
-      <w:bookmarkStart w:id="14" w:name="_Toc243979289"/>
+      <w:bookmarkStart w:id="14" w:name="_Toc243979870"/>
       <w:r>
         <w:t>8.1 EXTRA: Diagrama de base de datos</w:t>
       </w:r>
@@ -7864,10 +9611,10 @@
           <w:noProof/>
         </w:rPr>
         <w:drawing>
-          <wp:inline distT="0" distB="0" distL="0" distR="0" wp14:anchorId="6A640925" wp14:editId="1ABFB8E5">
-            <wp:extent cx="5943600" cy="3143250"/>
+          <wp:inline distT="0" distB="0" distL="0" distR="0" wp14:anchorId="16DED24A" wp14:editId="7D361AB9">
+            <wp:extent cx="7562850" cy="4029075"/>
             <wp:effectExtent l="0" t="0" r="0" b="0"/>
-            <wp:docPr id="6" name="Imagen 6"/>
+            <wp:docPr id="2" name="Imagen 2"/>
             <wp:cNvGraphicFramePr>
               <a:graphicFrameLocks xmlns:a="http://schemas.openxmlformats.org/drawingml/2006/main" noChangeAspect="1"/>
             </wp:cNvGraphicFramePr>
@@ -7881,7 +9628,7 @@
                     </pic:cNvPicPr>
                   </pic:nvPicPr>
                   <pic:blipFill>
-                    <a:blip r:embed="rId12"/>
+                    <a:blip r:embed="rId13"/>
                     <a:srcRect/>
                     <a:stretch>
                       <a:fillRect/>
@@ -7890,7 +9637,7 @@
                   <pic:spPr bwMode="auto">
                     <a:xfrm>
                       <a:off x="0" y="0"/>
-                      <a:ext cx="5943600" cy="3143250"/>
+                      <a:ext cx="7562850" cy="4029075"/>
                     </a:xfrm>
                     <a:prstGeom prst="rect">
                       <a:avLst/>
@@ -7907,6 +9654,13 @@
       <w:pPr>
         <w:spacing w:after="200"/>
         <w:jc w:val="center"/>
+        <w:sectPr>
+          <w:footerReference w:type="default" r:id="rId14"/>
+          <w:pgSz w:w="16838" w:h="11906" w:orient="landscape"/>
+          <w:pgMar w:top="1021" w:right="1418" w:bottom="1021" w:left="1418" w:header="708" w:footer="708" w:gutter="0"/>
+          <w:cols w:space="720"/>
+          <w:docGrid w:linePitch="360"/>
+        </w:sectPr>
       </w:pPr>
       <w:r>
         <w:rPr>
@@ -7923,8 +9677,9 @@
         <w:pStyle w:val="Ttulo2"/>
         <w:keepNext/>
       </w:pPr>
-      <w:bookmarkStart w:id="15" w:name="_Toc243979290"/>
-      <w:r>
+      <w:bookmarkStart w:id="15" w:name="_Toc243979871"/>
+      <w:r>
+        <w:lastRenderedPageBreak/>
         <w:t>8.2 EXTRA: Pruebas de rendimiento y estrés con k6 (varias corridas)</w:t>
       </w:r>
       <w:bookmarkEnd w:id="15"/>
@@ -8831,7 +10586,6 @@
                 <w:sz w:val="20"/>
                 <w:szCs w:val="20"/>
               </w:rPr>
-              <w:lastRenderedPageBreak/>
               <w:t>10</w:t>
             </w:r>
           </w:p>
@@ -9479,141 +11233,10 @@
           <w:noProof/>
         </w:rPr>
         <w:drawing>
-          <wp:inline distT="0" distB="0" distL="0" distR="0" wp14:anchorId="4824E49C" wp14:editId="4A631016">
+          <wp:inline distT="0" distB="0" distL="0" distR="0" wp14:anchorId="1FAC341A" wp14:editId="2C579DE4">
             <wp:extent cx="5400675" cy="3114675"/>
             <wp:effectExtent l="0" t="0" r="0" b="0"/>
             <wp:docPr id="7" name="Imagen 7"/>
-            <wp:cNvGraphicFramePr>
-              <a:graphicFrameLocks xmlns:a="http://schemas.openxmlformats.org/drawingml/2006/main" noChangeAspect="1"/>
-            </wp:cNvGraphicFramePr>
-            <a:graphic xmlns:a="http://schemas.openxmlformats.org/drawingml/2006/main">
-              <a:graphicData uri="http://schemas.openxmlformats.org/drawingml/2006/picture">
-                <pic:pic xmlns:pic="http://schemas.openxmlformats.org/drawingml/2006/picture">
-                  <pic:nvPicPr>
-                    <pic:cNvPr id="0" name=""/>
-                    <pic:cNvPicPr>
-                      <a:picLocks noChangeAspect="1" noChangeArrowheads="1"/>
-                    </pic:cNvPicPr>
-                  </pic:nvPicPr>
-                  <pic:blipFill>
-                    <a:blip r:embed="rId13"/>
-                    <a:srcRect/>
-                    <a:stretch>
-                      <a:fillRect/>
-                    </a:stretch>
-                  </pic:blipFill>
-                  <pic:spPr bwMode="auto">
-                    <a:xfrm>
-                      <a:off x="0" y="0"/>
-                      <a:ext cx="5400675" cy="3114675"/>
-                    </a:xfrm>
-                    <a:prstGeom prst="rect">
-                      <a:avLst/>
-                    </a:prstGeom>
-                  </pic:spPr>
-                </pic:pic>
-              </a:graphicData>
-            </a:graphic>
-          </wp:inline>
-        </w:drawing>
-      </w:r>
-    </w:p>
-    <w:p>
-      <w:pPr>
-        <w:spacing w:after="200"/>
-        <w:jc w:val="center"/>
-      </w:pPr>
-      <w:r>
-        <w:rPr>
-          <w:i/>
-          <w:iCs/>
-          <w:sz w:val="20"/>
-          <w:szCs w:val="20"/>
-        </w:rPr>
-        <w:t>Figura 6. Tiempo de respuesta (p50, p90, p95) según la cantidad de usuarios virtuales.</w:t>
-      </w:r>
-    </w:p>
-    <w:p>
-      <w:pPr>
-        <w:keepNext/>
-        <w:spacing w:after="60"/>
-        <w:jc w:val="center"/>
-      </w:pPr>
-      <w:r>
-        <w:rPr>
-          <w:noProof/>
-        </w:rPr>
-        <w:drawing>
-          <wp:inline distT="0" distB="0" distL="0" distR="0" wp14:anchorId="556CE68B" wp14:editId="4DD5586F">
-            <wp:extent cx="5400675" cy="2971800"/>
-            <wp:effectExtent l="0" t="0" r="0" b="0"/>
-            <wp:docPr id="8" name="Imagen 8"/>
-            <wp:cNvGraphicFramePr>
-              <a:graphicFrameLocks xmlns:a="http://schemas.openxmlformats.org/drawingml/2006/main" noChangeAspect="1"/>
-            </wp:cNvGraphicFramePr>
-            <a:graphic xmlns:a="http://schemas.openxmlformats.org/drawingml/2006/main">
-              <a:graphicData uri="http://schemas.openxmlformats.org/drawingml/2006/picture">
-                <pic:pic xmlns:pic="http://schemas.openxmlformats.org/drawingml/2006/picture">
-                  <pic:nvPicPr>
-                    <pic:cNvPr id="0" name=""/>
-                    <pic:cNvPicPr>
-                      <a:picLocks noChangeAspect="1" noChangeArrowheads="1"/>
-                    </pic:cNvPicPr>
-                  </pic:nvPicPr>
-                  <pic:blipFill>
-                    <a:blip r:embed="rId14"/>
-                    <a:srcRect/>
-                    <a:stretch>
-                      <a:fillRect/>
-                    </a:stretch>
-                  </pic:blipFill>
-                  <pic:spPr bwMode="auto">
-                    <a:xfrm>
-                      <a:off x="0" y="0"/>
-                      <a:ext cx="5400675" cy="2971800"/>
-                    </a:xfrm>
-                    <a:prstGeom prst="rect">
-                      <a:avLst/>
-                    </a:prstGeom>
-                  </pic:spPr>
-                </pic:pic>
-              </a:graphicData>
-            </a:graphic>
-          </wp:inline>
-        </w:drawing>
-      </w:r>
-    </w:p>
-    <w:p>
-      <w:pPr>
-        <w:spacing w:after="200"/>
-        <w:jc w:val="center"/>
-      </w:pPr>
-      <w:r>
-        <w:rPr>
-          <w:i/>
-          <w:iCs/>
-          <w:sz w:val="20"/>
-          <w:szCs w:val="20"/>
-        </w:rPr>
-        <w:t>Figura 7. Peticiones atendidas por segundo en cada corrida.</w:t>
-      </w:r>
-    </w:p>
-    <w:p>
-      <w:pPr>
-        <w:keepNext/>
-        <w:spacing w:after="60"/>
-        <w:jc w:val="center"/>
-      </w:pPr>
-      <w:r>
-        <w:rPr>
-          <w:noProof/>
-        </w:rPr>
-        <w:lastRenderedPageBreak/>
-        <w:drawing>
-          <wp:inline distT="0" distB="0" distL="0" distR="0" wp14:anchorId="0CAE706C" wp14:editId="1B1B8766">
-            <wp:extent cx="5400675" cy="2733675"/>
-            <wp:effectExtent l="0" t="0" r="0" b="0"/>
-            <wp:docPr id="9" name="Imagen 9"/>
             <wp:cNvGraphicFramePr>
               <a:graphicFrameLocks xmlns:a="http://schemas.openxmlformats.org/drawingml/2006/main" noChangeAspect="1"/>
             </wp:cNvGraphicFramePr>
@@ -9636,7 +11259,7 @@
                   <pic:spPr bwMode="auto">
                     <a:xfrm>
                       <a:off x="0" y="0"/>
-                      <a:ext cx="5400675" cy="2733675"/>
+                      <a:ext cx="5400675" cy="3114675"/>
                     </a:xfrm>
                     <a:prstGeom prst="rect">
                       <a:avLst/>
@@ -9661,7 +11284,7 @@
           <w:sz w:val="20"/>
           <w:szCs w:val="20"/>
         </w:rPr>
-        <w:t>Figura 8. Porcentaje de peticiones fallidas en cada corrida.</w:t>
+        <w:t>Figura 6. Tiempo de respuesta (p50, p90, p95) según la cantidad de usuarios virtuales.</w:t>
       </w:r>
     </w:p>
     <w:p>
@@ -9674,11 +11297,12 @@
         <w:rPr>
           <w:noProof/>
         </w:rPr>
+        <w:lastRenderedPageBreak/>
         <w:drawing>
-          <wp:inline distT="0" distB="0" distL="0" distR="0" wp14:anchorId="0A261552" wp14:editId="720CA648">
-            <wp:extent cx="5400675" cy="2981325"/>
+          <wp:inline distT="0" distB="0" distL="0" distR="0" wp14:anchorId="38510281" wp14:editId="16D9DE11">
+            <wp:extent cx="5400675" cy="2971800"/>
             <wp:effectExtent l="0" t="0" r="0" b="0"/>
-            <wp:docPr id="10" name="Imagen 10"/>
+            <wp:docPr id="8" name="Imagen 8"/>
             <wp:cNvGraphicFramePr>
               <a:graphicFrameLocks xmlns:a="http://schemas.openxmlformats.org/drawingml/2006/main" noChangeAspect="1"/>
             </wp:cNvGraphicFramePr>
@@ -9701,7 +11325,7 @@
                   <pic:spPr bwMode="auto">
                     <a:xfrm>
                       <a:off x="0" y="0"/>
-                      <a:ext cx="5400675" cy="2981325"/>
+                      <a:ext cx="5400675" cy="2971800"/>
                     </a:xfrm>
                     <a:prstGeom prst="rect">
                       <a:avLst/>
@@ -9726,7 +11350,7 @@
           <w:sz w:val="20"/>
           <w:szCs w:val="20"/>
         </w:rPr>
-        <w:t>Figura 9. p95 por tipo de operación (lecturas, login, crear reserva).</w:t>
+        <w:t>Figura 7. Peticiones atendidas por segundo en cada corrida.</w:t>
       </w:r>
     </w:p>
     <w:p>
@@ -9739,12 +11363,11 @@
         <w:rPr>
           <w:noProof/>
         </w:rPr>
-        <w:lastRenderedPageBreak/>
         <w:drawing>
-          <wp:inline distT="0" distB="0" distL="0" distR="0" wp14:anchorId="6A53FA89" wp14:editId="32BF46A4">
-            <wp:extent cx="5400675" cy="3638550"/>
+          <wp:inline distT="0" distB="0" distL="0" distR="0" wp14:anchorId="3F28E56D" wp14:editId="1EF669BB">
+            <wp:extent cx="5400675" cy="2733675"/>
             <wp:effectExtent l="0" t="0" r="0" b="0"/>
-            <wp:docPr id="11" name="Imagen 11"/>
+            <wp:docPr id="9" name="Imagen 9"/>
             <wp:cNvGraphicFramePr>
               <a:graphicFrameLocks xmlns:a="http://schemas.openxmlformats.org/drawingml/2006/main" noChangeAspect="1"/>
             </wp:cNvGraphicFramePr>
@@ -9767,6 +11390,137 @@
                   <pic:spPr bwMode="auto">
                     <a:xfrm>
                       <a:off x="0" y="0"/>
+                      <a:ext cx="5400675" cy="2733675"/>
+                    </a:xfrm>
+                    <a:prstGeom prst="rect">
+                      <a:avLst/>
+                    </a:prstGeom>
+                  </pic:spPr>
+                </pic:pic>
+              </a:graphicData>
+            </a:graphic>
+          </wp:inline>
+        </w:drawing>
+      </w:r>
+    </w:p>
+    <w:p>
+      <w:pPr>
+        <w:spacing w:after="200"/>
+        <w:jc w:val="center"/>
+      </w:pPr>
+      <w:r>
+        <w:rPr>
+          <w:i/>
+          <w:iCs/>
+          <w:sz w:val="20"/>
+          <w:szCs w:val="20"/>
+        </w:rPr>
+        <w:t>Figura 8. Porcentaje de peticiones fallidas en cada corrida.</w:t>
+      </w:r>
+    </w:p>
+    <w:p>
+      <w:pPr>
+        <w:keepNext/>
+        <w:spacing w:after="60"/>
+        <w:jc w:val="center"/>
+      </w:pPr>
+      <w:r>
+        <w:rPr>
+          <w:noProof/>
+        </w:rPr>
+        <w:lastRenderedPageBreak/>
+        <w:drawing>
+          <wp:inline distT="0" distB="0" distL="0" distR="0" wp14:anchorId="6E42EA52" wp14:editId="18243F42">
+            <wp:extent cx="5400675" cy="2981325"/>
+            <wp:effectExtent l="0" t="0" r="0" b="0"/>
+            <wp:docPr id="10" name="Imagen 10"/>
+            <wp:cNvGraphicFramePr>
+              <a:graphicFrameLocks xmlns:a="http://schemas.openxmlformats.org/drawingml/2006/main" noChangeAspect="1"/>
+            </wp:cNvGraphicFramePr>
+            <a:graphic xmlns:a="http://schemas.openxmlformats.org/drawingml/2006/main">
+              <a:graphicData uri="http://schemas.openxmlformats.org/drawingml/2006/picture">
+                <pic:pic xmlns:pic="http://schemas.openxmlformats.org/drawingml/2006/picture">
+                  <pic:nvPicPr>
+                    <pic:cNvPr id="0" name=""/>
+                    <pic:cNvPicPr>
+                      <a:picLocks noChangeAspect="1" noChangeArrowheads="1"/>
+                    </pic:cNvPicPr>
+                  </pic:nvPicPr>
+                  <pic:blipFill>
+                    <a:blip r:embed="rId18"/>
+                    <a:srcRect/>
+                    <a:stretch>
+                      <a:fillRect/>
+                    </a:stretch>
+                  </pic:blipFill>
+                  <pic:spPr bwMode="auto">
+                    <a:xfrm>
+                      <a:off x="0" y="0"/>
+                      <a:ext cx="5400675" cy="2981325"/>
+                    </a:xfrm>
+                    <a:prstGeom prst="rect">
+                      <a:avLst/>
+                    </a:prstGeom>
+                  </pic:spPr>
+                </pic:pic>
+              </a:graphicData>
+            </a:graphic>
+          </wp:inline>
+        </w:drawing>
+      </w:r>
+    </w:p>
+    <w:p>
+      <w:pPr>
+        <w:spacing w:after="200"/>
+        <w:jc w:val="center"/>
+      </w:pPr>
+      <w:r>
+        <w:rPr>
+          <w:i/>
+          <w:iCs/>
+          <w:sz w:val="20"/>
+          <w:szCs w:val="20"/>
+        </w:rPr>
+        <w:t>Figura 9. p95 por tipo de operación (lecturas, login, crear reserva).</w:t>
+      </w:r>
+    </w:p>
+    <w:p>
+      <w:pPr>
+        <w:keepNext/>
+        <w:spacing w:after="60"/>
+        <w:jc w:val="center"/>
+      </w:pPr>
+      <w:r>
+        <w:rPr>
+          <w:noProof/>
+        </w:rPr>
+        <w:drawing>
+          <wp:inline distT="0" distB="0" distL="0" distR="0" wp14:anchorId="419B7701" wp14:editId="04314BC4">
+            <wp:extent cx="5400675" cy="3638550"/>
+            <wp:effectExtent l="0" t="0" r="0" b="0"/>
+            <wp:docPr id="11" name="Imagen 11"/>
+            <wp:cNvGraphicFramePr>
+              <a:graphicFrameLocks xmlns:a="http://schemas.openxmlformats.org/drawingml/2006/main" noChangeAspect="1"/>
+            </wp:cNvGraphicFramePr>
+            <a:graphic xmlns:a="http://schemas.openxmlformats.org/drawingml/2006/main">
+              <a:graphicData uri="http://schemas.openxmlformats.org/drawingml/2006/picture">
+                <pic:pic xmlns:pic="http://schemas.openxmlformats.org/drawingml/2006/picture">
+                  <pic:nvPicPr>
+                    <pic:cNvPr id="0" name=""/>
+                    <pic:cNvPicPr>
+                      <a:picLocks noChangeAspect="1" noChangeArrowheads="1"/>
+                    </pic:cNvPicPr>
+                  </pic:nvPicPr>
+                  <pic:blipFill>
+                    <a:blip r:embed="rId19"/>
+                    <a:srcRect/>
+                    <a:stretch>
+                      <a:fillRect/>
+                    </a:stretch>
+                  </pic:blipFill>
+                  <pic:spPr bwMode="auto">
+                    <a:xfrm>
+                      <a:off x="0" y="0"/>
                       <a:ext cx="5400675" cy="3638550"/>
                     </a:xfrm>
                     <a:prstGeom prst="rect">
@@ -9797,10 +11551,200 @@
     </w:p>
     <w:p>
       <w:pPr>
+        <w:keepNext/>
+        <w:spacing w:before="120" w:after="60"/>
+      </w:pPr>
+      <w:r>
+        <w:rPr>
+          <w:b/>
+          <w:bCs/>
+          <w:sz w:val="21"/>
+          <w:szCs w:val="21"/>
+        </w:rPr>
+        <w:lastRenderedPageBreak/>
+        <w:t xml:space="preserve">Fragmento 9. </w:t>
+      </w:r>
+      <w:r>
+        <w:rPr>
+          <w:i/>
+          <w:iCs/>
+          <w:sz w:val="21"/>
+          <w:szCs w:val="21"/>
+        </w:rPr>
+        <w:t>tests/k6/reservas.js (extracto)</w:t>
+      </w:r>
+    </w:p>
+    <w:tbl>
+      <w:tblPr>
+        <w:tblW w:w="9070" w:type="dxa"/>
+        <w:tblBorders>
+          <w:top w:val="single" w:sz="4" w:space="0" w:color="auto"/>
+          <w:left w:val="single" w:sz="4" w:space="0" w:color="auto"/>
+          <w:bottom w:val="single" w:sz="4" w:space="0" w:color="auto"/>
+          <w:right w:val="single" w:sz="4" w:space="0" w:color="auto"/>
+          <w:insideH w:val="single" w:sz="4" w:space="0" w:color="auto"/>
+          <w:insideV w:val="single" w:sz="4" w:space="0" w:color="auto"/>
+        </w:tblBorders>
+        <w:tblLook w:val="04A0" w:firstRow="1" w:lastRow="0" w:firstColumn="1" w:lastColumn="0" w:noHBand="0" w:noVBand="1"/>
+      </w:tblPr>
+      <w:tblGrid>
+        <w:gridCol w:w="9070"/>
+      </w:tblGrid>
+      <w:tr>
+        <w:trPr>
+          <w:cantSplit/>
+        </w:trPr>
+        <w:tc>
+          <w:tcPr>
+            <w:tcW w:w="9070" w:type="dxa"/>
+            <w:tcBorders>
+              <w:top w:val="single" w:sz="4" w:space="0" w:color="000000"/>
+              <w:left w:val="single" w:sz="4" w:space="0" w:color="000000"/>
+              <w:bottom w:val="single" w:sz="4" w:space="0" w:color="000000"/>
+              <w:right w:val="single" w:sz="4" w:space="0" w:color="000000"/>
+            </w:tcBorders>
+            <w:shd w:val="clear" w:color="auto" w:fill="F2F2F2"/>
+            <w:tcMar>
+              <w:top w:w="80" w:type="dxa"/>
+              <w:left w:w="140" w:type="dxa"/>
+              <w:bottom w:w="80" w:type="dxa"/>
+              <w:right w:w="140" w:type="dxa"/>
+            </w:tcMar>
+          </w:tcPr>
+          <w:p>
+            <w:r>
+              <w:rPr>
+                <w:rFonts w:ascii="Consolas" w:eastAsia="Consolas" w:hAnsi="Consolas" w:cs="Consolas"/>
+                <w:sz w:val="17"/>
+                <w:szCs w:val="17"/>
+              </w:rPr>
+              <w:t>escalon: {</w:t>
+            </w:r>
+          </w:p>
+          <w:p>
+            <w:r>
+              <w:rPr>
+                <w:rFonts w:ascii="Consolas" w:eastAsia="Consolas" w:hAnsi="Consolas" w:cs="Consolas"/>
+                <w:sz w:val="17"/>
+                <w:szCs w:val="17"/>
+              </w:rPr>
+              <w:t xml:space="preserve">  stages: [</w:t>
+            </w:r>
+          </w:p>
+          <w:p>
+            <w:r>
+              <w:rPr>
+                <w:rFonts w:ascii="Consolas" w:eastAsia="Consolas" w:hAnsi="Consolas" w:cs="Consolas"/>
+                <w:sz w:val="17"/>
+                <w:szCs w:val="17"/>
+              </w:rPr>
+              <w:t xml:space="preserve">    { duration: '10s', target: VUS },   // sube hasta VUS usuarios</w:t>
+            </w:r>
+          </w:p>
+          <w:p>
+            <w:r>
+              <w:rPr>
+                <w:rFonts w:ascii="Consolas" w:eastAsia="Consolas" w:hAnsi="Consolas" w:cs="Consolas"/>
+                <w:sz w:val="17"/>
+                <w:szCs w:val="17"/>
+              </w:rPr>
+              <w:t xml:space="preserve">    { duration: '45s', target: VUS },   // mantiene la carga</w:t>
+            </w:r>
+          </w:p>
+          <w:p>
+            <w:r>
+              <w:rPr>
+                <w:rFonts w:ascii="Consolas" w:eastAsia="Consolas" w:hAnsi="Consolas" w:cs="Consolas"/>
+                <w:sz w:val="17"/>
+                <w:szCs w:val="17"/>
+              </w:rPr>
+              <w:t xml:space="preserve">    { duration: '5s',  target: 0 },     // baja</w:t>
+            </w:r>
+          </w:p>
+          <w:p>
+            <w:r>
+              <w:rPr>
+                <w:rFonts w:ascii="Consolas" w:eastAsia="Consolas" w:hAnsi="Consolas" w:cs="Consolas"/>
+                <w:sz w:val="17"/>
+                <w:szCs w:val="17"/>
+              </w:rPr>
+              <w:t xml:space="preserve">  ],</w:t>
+            </w:r>
+          </w:p>
+          <w:p>
+            <w:r>
+              <w:rPr>
+                <w:rFonts w:ascii="Consolas" w:eastAsia="Consolas" w:hAnsi="Consolas" w:cs="Consolas"/>
+                <w:sz w:val="17"/>
+                <w:szCs w:val="17"/>
+              </w:rPr>
+              <w:t xml:space="preserve">  thresholds: {</w:t>
+            </w:r>
+          </w:p>
+          <w:p>
+            <w:r>
+              <w:rPr>
+                <w:rFonts w:ascii="Consolas" w:eastAsia="Consolas" w:hAnsi="Consolas" w:cs="Consolas"/>
+                <w:sz w:val="17"/>
+                <w:szCs w:val="17"/>
+              </w:rPr>
+              <w:t xml:space="preserve">    http_req_duration: ['p(95)&lt;500'],   // meta: p95 menor a 500 ms</w:t>
+            </w:r>
+          </w:p>
+          <w:p>
+            <w:r>
+              <w:rPr>
+                <w:rFonts w:ascii="Consolas" w:eastAsia="Consolas" w:hAnsi="Consolas" w:cs="Consolas"/>
+                <w:sz w:val="17"/>
+                <w:szCs w:val="17"/>
+              </w:rPr>
+              <w:t xml:space="preserve">    http_req_failed: ['rate&lt;0.01'],     // menos de 1% de errores</w:t>
+            </w:r>
+          </w:p>
+          <w:p>
+            <w:r>
+              <w:rPr>
+                <w:rFonts w:ascii="Consolas" w:eastAsia="Consolas" w:hAnsi="Consolas" w:cs="Consolas"/>
+                <w:sz w:val="17"/>
+                <w:szCs w:val="17"/>
+              </w:rPr>
+              <w:t xml:space="preserve">  },</w:t>
+            </w:r>
+          </w:p>
+          <w:p>
+            <w:r>
+              <w:rPr>
+                <w:rFonts w:ascii="Consolas" w:eastAsia="Consolas" w:hAnsi="Consolas" w:cs="Consolas"/>
+                <w:sz w:val="17"/>
+                <w:szCs w:val="17"/>
+              </w:rPr>
+              <w:t>},</w:t>
+            </w:r>
+          </w:p>
+        </w:tc>
+      </w:tr>
+    </w:tbl>
+    <w:p>
+      <w:pPr>
+        <w:spacing w:before="80" w:after="160" w:line="300" w:lineRule="auto"/>
+      </w:pPr>
+      <w:r>
+        <w:rPr>
+          <w:b/>
+          <w:bCs/>
+        </w:rPr>
+        <w:t xml:space="preserve">Por qué se usó: </w:t>
+      </w:r>
+      <w:r>
+        <w:t>el mismo script se corre con distinta cantidad de usuarios (VUS) para comparar corridas entre sí. Los thresholds convierten la meta del plan (p95 menor a 500 ms y menos de 1% de errores) en una regla: si no se cumple, k6 marca la prueba como fallida sin interpretar los números a mano.</w:t>
+      </w:r>
+    </w:p>
+    <w:p>
+      <w:pPr>
         <w:pStyle w:val="Ttulo2"/>
         <w:keepNext/>
       </w:pPr>
-      <w:bookmarkStart w:id="16" w:name="_Toc243979291"/>
+      <w:bookmarkStart w:id="16" w:name="_Toc243979872"/>
       <w:r>
         <w:t>8.3 Análisis y cuello de botella encontrado</w:t>
       </w:r>
@@ -9884,9 +11828,8 @@
         <w:pStyle w:val="Ttulo2"/>
         <w:keepNext/>
       </w:pPr>
-      <w:bookmarkStart w:id="17" w:name="_Toc243979292"/>
-      <w:r>
-        <w:lastRenderedPageBreak/>
+      <w:bookmarkStart w:id="17" w:name="_Toc243979873"/>
+      <w:r>
         <w:t>8.4 EXTRA: Cifrado (ofuscación) del código</w:t>
       </w:r>
       <w:bookmarkEnd w:id="17"/>
@@ -10194,10 +12137,169 @@
     </w:p>
     <w:p>
       <w:pPr>
+        <w:keepNext/>
+        <w:spacing w:before="120" w:after="60"/>
+      </w:pPr>
+      <w:r>
+        <w:rPr>
+          <w:b/>
+          <w:bCs/>
+          <w:sz w:val="21"/>
+          <w:szCs w:val="21"/>
+        </w:rPr>
+        <w:t xml:space="preserve">Fragmento 10. </w:t>
+      </w:r>
+      <w:r>
+        <w:rPr>
+          <w:i/>
+          <w:iCs/>
+          <w:sz w:val="21"/>
+          <w:szCs w:val="21"/>
+        </w:rPr>
+        <w:t>web/vite.config.ts (extracto)</w:t>
+      </w:r>
+    </w:p>
+    <w:tbl>
+      <w:tblPr>
+        <w:tblW w:w="9070" w:type="dxa"/>
+        <w:tblBorders>
+          <w:top w:val="single" w:sz="4" w:space="0" w:color="auto"/>
+          <w:left w:val="single" w:sz="4" w:space="0" w:color="auto"/>
+          <w:bottom w:val="single" w:sz="4" w:space="0" w:color="auto"/>
+          <w:right w:val="single" w:sz="4" w:space="0" w:color="auto"/>
+          <w:insideH w:val="single" w:sz="4" w:space="0" w:color="auto"/>
+          <w:insideV w:val="single" w:sz="4" w:space="0" w:color="auto"/>
+        </w:tblBorders>
+        <w:tblLook w:val="04A0" w:firstRow="1" w:lastRow="0" w:firstColumn="1" w:lastColumn="0" w:noHBand="0" w:noVBand="1"/>
+      </w:tblPr>
+      <w:tblGrid>
+        <w:gridCol w:w="9070"/>
+      </w:tblGrid>
+      <w:tr>
+        <w:trPr>
+          <w:cantSplit/>
+        </w:trPr>
+        <w:tc>
+          <w:tcPr>
+            <w:tcW w:w="9070" w:type="dxa"/>
+            <w:tcBorders>
+              <w:top w:val="single" w:sz="4" w:space="0" w:color="000000"/>
+              <w:left w:val="single" w:sz="4" w:space="0" w:color="000000"/>
+              <w:bottom w:val="single" w:sz="4" w:space="0" w:color="000000"/>
+              <w:right w:val="single" w:sz="4" w:space="0" w:color="000000"/>
+            </w:tcBorders>
+            <w:shd w:val="clear" w:color="auto" w:fill="F2F2F2"/>
+            <w:tcMar>
+              <w:top w:w="80" w:type="dxa"/>
+              <w:left w:w="140" w:type="dxa"/>
+              <w:bottom w:w="80" w:type="dxa"/>
+              <w:right w:w="140" w:type="dxa"/>
+            </w:tcMar>
+          </w:tcPr>
+          <w:p>
+            <w:r>
+              <w:rPr>
+                <w:rFonts w:ascii="Consolas" w:eastAsia="Consolas" w:hAnsi="Consolas" w:cs="Consolas"/>
+                <w:sz w:val="17"/>
+                <w:szCs w:val="17"/>
+              </w:rPr>
+              <w:t>renderChunk(code, chunk) {</w:t>
+            </w:r>
+          </w:p>
+          <w:p>
+            <w:r>
+              <w:rPr>
+                <w:rFonts w:ascii="Consolas" w:eastAsia="Consolas" w:hAnsi="Consolas" w:cs="Consolas"/>
+                <w:sz w:val="17"/>
+                <w:szCs w:val="17"/>
+              </w:rPr>
+              <w:t xml:space="preserve">  const result = JavaScriptObfuscator.obfuscate(code, {</w:t>
+            </w:r>
+          </w:p>
+          <w:p>
+            <w:r>
+              <w:rPr>
+                <w:rFonts w:ascii="Consolas" w:eastAsia="Consolas" w:hAnsi="Consolas" w:cs="Consolas"/>
+                <w:sz w:val="17"/>
+                <w:szCs w:val="17"/>
+              </w:rPr>
+              <w:t xml:space="preserve">    identifierNamesGenerator: 'hexadecimal',   // nombres ilegibles</w:t>
+            </w:r>
+          </w:p>
+          <w:p>
+            <w:r>
+              <w:rPr>
+                <w:rFonts w:ascii="Consolas" w:eastAsia="Consolas" w:hAnsi="Consolas" w:cs="Consolas"/>
+                <w:sz w:val="17"/>
+                <w:szCs w:val="17"/>
+              </w:rPr>
+              <w:t xml:space="preserve">    stringArray: true, stringArrayEncoding: ['base64'],   // textos codificados</w:t>
+            </w:r>
+          </w:p>
+          <w:p>
+            <w:r>
+              <w:rPr>
+                <w:rFonts w:ascii="Consolas" w:eastAsia="Consolas" w:hAnsi="Consolas" w:cs="Consolas"/>
+                <w:sz w:val="17"/>
+                <w:szCs w:val="17"/>
+              </w:rPr>
+              <w:t xml:space="preserve">    splitStrings: true, compact: true,</w:t>
+            </w:r>
+          </w:p>
+          <w:p>
+            <w:r>
+              <w:rPr>
+                <w:rFonts w:ascii="Consolas" w:eastAsia="Consolas" w:hAnsi="Consolas" w:cs="Consolas"/>
+                <w:sz w:val="17"/>
+                <w:szCs w:val="17"/>
+              </w:rPr>
+              <w:t xml:space="preserve">  })</w:t>
+            </w:r>
+          </w:p>
+          <w:p>
+            <w:r>
+              <w:rPr>
+                <w:rFonts w:ascii="Consolas" w:eastAsia="Consolas" w:hAnsi="Consolas" w:cs="Consolas"/>
+                <w:sz w:val="17"/>
+                <w:szCs w:val="17"/>
+              </w:rPr>
+              <w:t xml:space="preserve">  return { code: result.getObfuscatedCode(), map: null }</w:t>
+            </w:r>
+          </w:p>
+          <w:p>
+            <w:r>
+              <w:rPr>
+                <w:rFonts w:ascii="Consolas" w:eastAsia="Consolas" w:hAnsi="Consolas" w:cs="Consolas"/>
+                <w:sz w:val="17"/>
+                <w:szCs w:val="17"/>
+              </w:rPr>
+              <w:t>}</w:t>
+            </w:r>
+          </w:p>
+        </w:tc>
+      </w:tr>
+    </w:tbl>
+    <w:p>
+      <w:pPr>
+        <w:spacing w:before="80" w:after="160" w:line="300" w:lineRule="auto"/>
+      </w:pPr>
+      <w:r>
+        <w:rPr>
+          <w:b/>
+          <w:bCs/>
+        </w:rPr>
+        <w:t xml:space="preserve">Por qué se usó: </w:t>
+      </w:r>
+      <w:r>
+        <w:t>el código de una aplicación web se descarga al navegador, así que cualquiera puede leerlo. La ofuscación se aplica al paquete final de producción para dificultar copiarlo o estudiar su lógica, sin cambiar lo que hace. En desarrollo se trabaja con el código normal (npm run build:plain).</w:t>
+      </w:r>
+    </w:p>
+    <w:p>
+      <w:pPr>
         <w:pStyle w:val="Ttulo2"/>
         <w:keepNext/>
       </w:pPr>
-      <w:bookmarkStart w:id="18" w:name="_Toc243979293"/>
+      <w:bookmarkStart w:id="18" w:name="_Toc243979874"/>
       <w:r>
         <w:t>8.5 EXTRA: Vista del programador</w:t>
       </w:r>
@@ -10225,7 +12327,7 @@
           <w:noProof/>
         </w:rPr>
         <w:drawing>
-          <wp:inline distT="0" distB="0" distL="0" distR="0" wp14:anchorId="6F05D87E" wp14:editId="4E4F4E96">
+          <wp:inline distT="0" distB="0" distL="0" distR="0" wp14:anchorId="72344EFB" wp14:editId="5BC6D68A">
             <wp:extent cx="5400675" cy="3371850"/>
             <wp:effectExtent l="0" t="0" r="0" b="0"/>
             <wp:docPr id="12" name="Imagen 12"/>
@@ -10242,7 +12344,7 @@
                     </pic:cNvPicPr>
                   </pic:nvPicPr>
                   <pic:blipFill>
-                    <a:blip r:embed="rId18"/>
+                    <a:blip r:embed="rId20"/>
                     <a:srcRect/>
                     <a:stretch>
                       <a:fillRect/>
@@ -10284,7 +12386,7 @@
         <w:pStyle w:val="Ttulo2"/>
         <w:keepNext/>
       </w:pPr>
-      <w:bookmarkStart w:id="19" w:name="_Toc243979294"/>
+      <w:bookmarkStart w:id="19" w:name="_Toc243979875"/>
       <w:r>
         <w:t>8.6 EXTRA: Seguridad y calidad adelantadas</w:t>
       </w:r>
@@ -10313,6 +12415,7 @@
         <w:spacing w:after="60" w:line="288" w:lineRule="auto"/>
       </w:pPr>
       <w:r>
+        <w:lastRenderedPageBreak/>
         <w:t>Roles y permisos: el rol se valida antes de buscar el registro, así una ruta pedida a mano responde 403 sin revelar si el id existe.</w:t>
       </w:r>
     </w:p>
@@ -10326,7 +12429,6 @@
         <w:spacing w:after="60" w:line="288" w:lineRule="auto"/>
       </w:pPr>
       <w:r>
-        <w:lastRenderedPageBreak/>
         <w:t>Pantallas de error en React: 404, «En construcción», 403, sesión expirada, 500 con código de incidente, 503 con reintento cada 30 s, sin conexión y 429 con cuenta regresiva.</w:t>
       </w:r>
     </w:p>
@@ -10361,7 +12463,7 @@
         <w:pStyle w:val="Ttulo1"/>
         <w:keepNext/>
       </w:pPr>
-      <w:bookmarkStart w:id="20" w:name="_Toc243979295"/>
+      <w:bookmarkStart w:id="20" w:name="_Toc243979876"/>
       <w:r>
         <w:t>9. Siguientes pasos (entrega del 80%)</w:t>
       </w:r>
@@ -10407,7 +12509,7 @@
       </w:r>
     </w:p>
     <w:sectPr>
-      <w:footerReference w:type="default" r:id="rId19"/>
+      <w:footerReference w:type="default" r:id="rId21"/>
       <w:pgSz w:w="11906" w:h="16838"/>
       <w:pgMar w:top="1418" w:right="1418" w:bottom="1418" w:left="1418" w:header="708" w:footer="708" w:gutter="0"/>
       <w:cols w:space="720"/>
@@ -10482,6 +12584,98 @@
 </w:ftr>
 </file>
 
+<file path=word/footer2.xml><?xml version="1.0" encoding="utf-8"?>
+<w:ftr xmlns:wpc="http://schemas.microsoft.com/office/word/2010/wordprocessingCanvas" xmlns:cx="http://schemas.microsoft.com/office/drawing/2014/chartex" xmlns:cx1="http://schemas.microsoft.com/office/drawing/2015/9/8/chartex" xmlns:cx2="http://schemas.microsoft.com/office/drawing/2015/10/21/chartex" xmlns:cx3="http://schemas.microsoft.com/office/drawing/2016/5/9/chartex" xmlns:cx4="http://schemas.microsoft.com/office/drawing/2016/5/10/chartex" xmlns:cx5="http://schemas.microsoft.com/office/drawing/2016/5/11/chartex" xmlns:cx6="http://schemas.microsoft.com/office/drawing/2016/5/12/chartex" xmlns:cx7="http://schemas.microsoft.com/office/drawing/2016/5/13/chartex" xmlns:cx8="http://schemas.microsoft.com/office/drawing/2016/5/14/chartex" xmlns:mc="http://schemas.openxmlformats.org/markup-compatibility/2006" xmlns:aink="http://schemas.microsoft.com/office/drawing/2016/ink" xmlns:am3d="http://schemas.microsoft.com/office/drawing/2017/model3d" xmlns:o="urn:schemas-microsoft-com:office:office" xmlns:oel="http://schemas.microsoft.com/office/2019/extlst" xmlns:r="http://schemas.openxmlformats.org/officeDocument/2006/relationships" xmlns:m="http://schemas.openxmlformats.org/officeDocument/2006/math" xmlns:v="urn:schemas-microsoft-com:vml" xmlns:wp14="http://schemas.microsoft.com/office/word/2010/wordprocessingDrawing" xmlns:wp="http://schemas.openxmlformats.org/drawingml/2006/wordprocessingDrawing" xmlns:w10="urn:schemas-microsoft-com:office:word" xmlns:w="http://schemas.openxmlformats.org/wordprocessingml/2006/main" xmlns:w14="http://schemas.microsoft.com/office/word/2010/wordml" xmlns:w15="http://schemas.microsoft.com/office/word/2012/wordml" xmlns:w16cex="http://schemas.microsoft.com/office/word/2018/wordml/cex" xmlns:w16cid="http://schemas.microsoft.com/office/word/2016/wordml/cid" xmlns:w16="http://schemas.microsoft.com/office/word/2018/wordml" xmlns:w16sdtdh="http://schemas.microsoft.com/office/word/2020/wordml/sdtdatahash" xmlns:w16se="http://schemas.microsoft.com/office/word/2015/wordml/symex" xmlns:wpg="http://schemas.microsoft.com/office/word/2010/wordprocessingGroup" xmlns:wpi="http://schemas.microsoft.com/office/word/2010/wordprocessingInk" xmlns:wne="http://schemas.microsoft.com/office/word/2006/wordml" xmlns:wps="http://schemas.microsoft.com/office/word/2010/wordprocessingShape" mc:Ignorable="w14 w15 w16se w16cid w16 w16cex w16sdtdh wp14">
+  <w:p>
+    <w:pPr>
+      <w:jc w:val="center"/>
+    </w:pPr>
+    <w:r>
+      <w:rPr>
+        <w:sz w:val="20"/>
+        <w:szCs w:val="20"/>
+      </w:rPr>
+      <w:fldChar w:fldCharType="begin"/>
+    </w:r>
+    <w:r>
+      <w:rPr>
+        <w:sz w:val="20"/>
+        <w:szCs w:val="20"/>
+      </w:rPr>
+      <w:instrText>PAGE</w:instrText>
+    </w:r>
+    <w:r>
+      <w:rPr>
+        <w:sz w:val="20"/>
+        <w:szCs w:val="20"/>
+      </w:rPr>
+      <w:fldChar w:fldCharType="separate"/>
+    </w:r>
+    <w:r>
+      <w:rPr>
+        <w:noProof/>
+        <w:sz w:val="20"/>
+        <w:szCs w:val="20"/>
+      </w:rPr>
+      <w:t>13</w:t>
+    </w:r>
+    <w:r>
+      <w:rPr>
+        <w:sz w:val="20"/>
+        <w:szCs w:val="20"/>
+      </w:rPr>
+      <w:fldChar w:fldCharType="end"/>
+    </w:r>
+  </w:p>
+</w:ftr>
+</file>
+
+<file path=word/footer3.xml><?xml version="1.0" encoding="utf-8"?>
+<w:ftr xmlns:wpc="http://schemas.microsoft.com/office/word/2010/wordprocessingCanvas" xmlns:cx="http://schemas.microsoft.com/office/drawing/2014/chartex" xmlns:cx1="http://schemas.microsoft.com/office/drawing/2015/9/8/chartex" xmlns:cx2="http://schemas.microsoft.com/office/drawing/2015/10/21/chartex" xmlns:cx3="http://schemas.microsoft.com/office/drawing/2016/5/9/chartex" xmlns:cx4="http://schemas.microsoft.com/office/drawing/2016/5/10/chartex" xmlns:cx5="http://schemas.microsoft.com/office/drawing/2016/5/11/chartex" xmlns:cx6="http://schemas.microsoft.com/office/drawing/2016/5/12/chartex" xmlns:cx7="http://schemas.microsoft.com/office/drawing/2016/5/13/chartex" xmlns:cx8="http://schemas.microsoft.com/office/drawing/2016/5/14/chartex" xmlns:mc="http://schemas.openxmlformats.org/markup-compatibility/2006" xmlns:aink="http://schemas.microsoft.com/office/drawing/2016/ink" xmlns:am3d="http://schemas.microsoft.com/office/drawing/2017/model3d" xmlns:o="urn:schemas-microsoft-com:office:office" xmlns:oel="http://schemas.microsoft.com/office/2019/extlst" xmlns:r="http://schemas.openxmlformats.org/officeDocument/2006/relationships" xmlns:m="http://schemas.openxmlformats.org/officeDocument/2006/math" xmlns:v="urn:schemas-microsoft-com:vml" xmlns:wp14="http://schemas.microsoft.com/office/word/2010/wordprocessingDrawing" xmlns:wp="http://schemas.openxmlformats.org/drawingml/2006/wordprocessingDrawing" xmlns:w10="urn:schemas-microsoft-com:office:word" xmlns:w="http://schemas.openxmlformats.org/wordprocessingml/2006/main" xmlns:w14="http://schemas.microsoft.com/office/word/2010/wordml" xmlns:w15="http://schemas.microsoft.com/office/word/2012/wordml" xmlns:w16cex="http://schemas.microsoft.com/office/word/2018/wordml/cex" xmlns:w16cid="http://schemas.microsoft.com/office/word/2016/wordml/cid" xmlns:w16="http://schemas.microsoft.com/office/word/2018/wordml" xmlns:w16sdtdh="http://schemas.microsoft.com/office/word/2020/wordml/sdtdatahash" xmlns:w16se="http://schemas.microsoft.com/office/word/2015/wordml/symex" xmlns:wpg="http://schemas.microsoft.com/office/word/2010/wordprocessingGroup" xmlns:wpi="http://schemas.microsoft.com/office/word/2010/wordprocessingInk" xmlns:wne="http://schemas.microsoft.com/office/word/2006/wordml" xmlns:wps="http://schemas.microsoft.com/office/word/2010/wordprocessingShape" mc:Ignorable="w14 w15 w16se w16cid w16 w16cex w16sdtdh wp14">
+  <w:p>
+    <w:pPr>
+      <w:jc w:val="center"/>
+    </w:pPr>
+    <w:r>
+      <w:rPr>
+        <w:sz w:val="20"/>
+        <w:szCs w:val="20"/>
+      </w:rPr>
+      <w:fldChar w:fldCharType="begin"/>
+    </w:r>
+    <w:r>
+      <w:rPr>
+        <w:sz w:val="20"/>
+        <w:szCs w:val="20"/>
+      </w:rPr>
+      <w:instrText>PAGE</w:instrText>
+    </w:r>
+    <w:r>
+      <w:rPr>
+        <w:sz w:val="20"/>
+        <w:szCs w:val="20"/>
+      </w:rPr>
+      <w:fldChar w:fldCharType="separate"/>
+    </w:r>
+    <w:r>
+      <w:rPr>
+        <w:noProof/>
+        <w:sz w:val="20"/>
+        <w:szCs w:val="20"/>
+      </w:rPr>
+      <w:t>14</w:t>
+    </w:r>
+    <w:r>
+      <w:rPr>
+        <w:sz w:val="20"/>
+        <w:szCs w:val="20"/>
+      </w:rPr>
+      <w:fldChar w:fldCharType="end"/>
+    </w:r>
+  </w:p>
+</w:ftr>
+</file>
+
 <file path=word/footnotes.xml><?xml version="1.0" encoding="utf-8"?>
 <w:footnotes xmlns:wpc="http://schemas.microsoft.com/office/word/2010/wordprocessingCanvas" xmlns:cx="http://schemas.microsoft.com/office/drawing/2014/chartex" xmlns:cx1="http://schemas.microsoft.com/office/drawing/2015/9/8/chartex" xmlns:cx2="http://schemas.microsoft.com/office/drawing/2015/10/21/chartex" xmlns:cx3="http://schemas.microsoft.com/office/drawing/2016/5/9/chartex" xmlns:cx4="http://schemas.microsoft.com/office/drawing/2016/5/10/chartex" xmlns:cx5="http://schemas.microsoft.com/office/drawing/2016/5/11/chartex" xmlns:cx6="http://schemas.microsoft.com/office/drawing/2016/5/12/chartex" xmlns:cx7="http://schemas.microsoft.com/office/drawing/2016/5/13/chartex" xmlns:cx8="http://schemas.microsoft.com/office/drawing/2016/5/14/chartex" xmlns:mc="http://schemas.openxmlformats.org/markup-compatibility/2006" xmlns:aink="http://schemas.microsoft.com/office/drawing/2016/ink" xmlns:am3d="http://schemas.microsoft.com/office/drawing/2017/model3d" xmlns:o="urn:schemas-microsoft-com:office:office" xmlns:oel="http://schemas.microsoft.com/office/2019/extlst" xmlns:r="http://schemas.openxmlformats.org/officeDocument/2006/relationships" xmlns:m="http://schemas.openxmlformats.org/officeDocument/2006/math" xmlns:v="urn:schemas-microsoft-com:vml" xmlns:wp14="http://schemas.microsoft.com/office/word/2010/wordprocessingDrawing" xmlns:wp="http://schemas.openxmlformats.org/drawingml/2006/wordprocessingDrawing" xmlns:w10="urn:schemas-microsoft-com:office:word" xmlns:w="http://schemas.openxmlformats.org/wordprocessingml/2006/main" xmlns:w14="http://schemas.microsoft.com/office/word/2010/wordml" xmlns:w15="http://schemas.microsoft.com/office/word/2012/wordml" xmlns:w16cex="http://schemas.microsoft.com/office/word/2018/wordml/cex" xmlns:w16cid="http://schemas.microsoft.com/office/word/2016/wordml/cid" xmlns:w16="http://schemas.microsoft.com/office/word/2018/wordml" xmlns:w16sdtdh="http://schemas.microsoft.com/office/word/2020/wordml/sdtdatahash" xmlns:w16se="http://schemas.microsoft.com/office/word/2015/wordml/symex" xmlns:wpg="http://schemas.microsoft.com/office/word/2010/wordprocessingGroup" xmlns:wpi="http://schemas.microsoft.com/office/word/2010/wordprocessingInk" xmlns:wne="http://schemas.microsoft.com/office/word/2006/wordml" xmlns:wps="http://schemas.microsoft.com/office/word/2010/wordprocessingShape" mc:Ignorable="w14 w15 w16se w16cid w16 w16cex w16sdtdh wp14">
   <w:footnote w:type="separator" w:id="-1">
@@ -10504,64 +12698,10 @@
 <file path=word/numbering.xml><?xml version="1.0" encoding="utf-8"?>
 <w:numbering xmlns:wpc="http://schemas.microsoft.com/office/word/2010/wordprocessingCanvas" xmlns:cx="http://schemas.microsoft.com/office/drawing/2014/chartex" xmlns:cx1="http://schemas.microsoft.com/office/drawing/2015/9/8/chartex" xmlns:cx2="http://schemas.microsoft.com/office/drawing/2015/10/21/chartex" xmlns:cx3="http://schemas.microsoft.com/office/drawing/2016/5/9/chartex" xmlns:cx4="http://schemas.microsoft.com/office/drawing/2016/5/10/chartex" xmlns:cx5="http://schemas.microsoft.com/office/drawing/2016/5/11/chartex" xmlns:cx6="http://schemas.microsoft.com/office/drawing/2016/5/12/chartex" xmlns:cx7="http://schemas.microsoft.com/office/drawing/2016/5/13/chartex" xmlns:cx8="http://schemas.microsoft.com/office/drawing/2016/5/14/chartex" xmlns:mc="http://schemas.openxmlformats.org/markup-compatibility/2006" xmlns:aink="http://schemas.microsoft.com/office/drawing/2016/ink" xmlns:am3d="http://schemas.microsoft.com/office/drawing/2017/model3d" xmlns:o="urn:schemas-microsoft-com:office:office" xmlns:oel="http://schemas.microsoft.com/office/2019/extlst" xmlns:r="http://schemas.openxmlformats.org/officeDocument/2006/relationships" xmlns:m="http://schemas.openxmlformats.org/officeDocument/2006/math" xmlns:v="urn:schemas-microsoft-com:vml" xmlns:wp14="http://schemas.microsoft.com/office/word/2010/wordprocessingDrawing" xmlns:wp="http://schemas.openxmlformats.org/drawingml/2006/wordprocessingDrawing" xmlns:w10="urn:schemas-microsoft-com:office:word" xmlns:w="http://schemas.openxmlformats.org/wordprocessingml/2006/main" xmlns:w14="http://schemas.microsoft.com/office/word/2010/wordml" xmlns:w15="http://schemas.microsoft.com/office/word/2012/wordml" xmlns:w16cex="http://schemas.microsoft.com/office/word/2018/wordml/cex" xmlns:w16cid="http://schemas.microsoft.com/office/word/2016/wordml/cid" xmlns:w16="http://schemas.microsoft.com/office/word/2018/wordml" xmlns:w16sdtdh="http://schemas.microsoft.com/office/word/2020/wordml/sdtdatahash" xmlns:w16se="http://schemas.microsoft.com/office/word/2015/wordml/symex" xmlns:wpg="http://schemas.microsoft.com/office/word/2010/wordprocessingGroup" xmlns:wpi="http://schemas.microsoft.com/office/word/2010/wordprocessingInk" xmlns:wne="http://schemas.microsoft.com/office/word/2006/wordml" xmlns:wps="http://schemas.microsoft.com/office/word/2010/wordprocessingShape" mc:Ignorable="w14 w15 w16se w16cid w16 w16cex w16sdtdh wp14">
   <w:abstractNum w:abstractNumId="0" w15:restartNumberingAfterBreak="0">
-    <w:nsid w:val="171820E5"/>
+    <w:nsid w:val="5A5424E1"/>
     <w:multiLevelType w:val="hybridMultilevel"/>
-    <w:tmpl w:val="6A165368"/>
-    <w:lvl w:ilvl="0" w:tplc="30D6E13E">
-      <w:start w:val="1"/>
-      <w:numFmt w:val="bullet"/>
-      <w:lvlText w:val="•"/>
-      <w:lvlJc w:val="left"/>
-      <w:pPr>
-        <w:ind w:left="540" w:hanging="270"/>
-      </w:pPr>
-    </w:lvl>
-    <w:lvl w:ilvl="1" w:tplc="A07C21FC">
-      <w:numFmt w:val="decimal"/>
-      <w:lvlText w:val=""/>
-      <w:lvlJc w:val="left"/>
-    </w:lvl>
-    <w:lvl w:ilvl="2" w:tplc="00FE75DC">
-      <w:numFmt w:val="decimal"/>
-      <w:lvlText w:val=""/>
-      <w:lvlJc w:val="left"/>
-    </w:lvl>
-    <w:lvl w:ilvl="3" w:tplc="F80A23B6">
-      <w:numFmt w:val="decimal"/>
-      <w:lvlText w:val=""/>
-      <w:lvlJc w:val="left"/>
-    </w:lvl>
-    <w:lvl w:ilvl="4" w:tplc="7BD04C38">
-      <w:numFmt w:val="decimal"/>
-      <w:lvlText w:val=""/>
-      <w:lvlJc w:val="left"/>
-    </w:lvl>
-    <w:lvl w:ilvl="5" w:tplc="75B4013C">
-      <w:numFmt w:val="decimal"/>
-      <w:lvlText w:val=""/>
-      <w:lvlJc w:val="left"/>
-    </w:lvl>
-    <w:lvl w:ilvl="6" w:tplc="C3B6ADFC">
-      <w:numFmt w:val="decimal"/>
-      <w:lvlText w:val=""/>
-      <w:lvlJc w:val="left"/>
-    </w:lvl>
-    <w:lvl w:ilvl="7" w:tplc="08284054">
-      <w:numFmt w:val="decimal"/>
-      <w:lvlText w:val=""/>
-      <w:lvlJc w:val="left"/>
-    </w:lvl>
-    <w:lvl w:ilvl="8" w:tplc="6076E3F8">
-      <w:numFmt w:val="decimal"/>
-      <w:lvlText w:val=""/>
-      <w:lvlJc w:val="left"/>
-    </w:lvl>
-  </w:abstractNum>
-  <w:abstractNum w:abstractNumId="1" w15:restartNumberingAfterBreak="0">
-    <w:nsid w:val="2313457D"/>
-    <w:multiLevelType w:val="hybridMultilevel"/>
-    <w:tmpl w:val="084E08CE"/>
-    <w:lvl w:ilvl="0" w:tplc="05B41D9E" w:tentative="1">
+    <w:tmpl w:val="F28CABE8"/>
+    <w:lvl w:ilvl="0" w:tplc="7E7033EE" w:tentative="1">
       <w:start w:val="1"/>
       <w:numFmt w:val="bullet"/>
       <w:lvlText w:val="●"/>
@@ -10570,7 +12710,7 @@
         <w:ind w:left="720" w:hanging="360"/>
       </w:pPr>
     </w:lvl>
-    <w:lvl w:ilvl="1" w:tplc="8A7C3DEA" w:tentative="1">
+    <w:lvl w:ilvl="1" w:tplc="836E7736" w:tentative="1">
       <w:start w:val="1"/>
       <w:numFmt w:val="bullet"/>
       <w:lvlText w:val="○"/>
@@ -10579,7 +12719,7 @@
         <w:ind w:left="1440" w:hanging="360"/>
       </w:pPr>
     </w:lvl>
-    <w:lvl w:ilvl="2" w:tplc="84809716" w:tentative="1">
+    <w:lvl w:ilvl="2" w:tplc="BE5EB804" w:tentative="1">
       <w:start w:val="1"/>
       <w:numFmt w:val="bullet"/>
       <w:lvlText w:val="■"/>
@@ -10588,7 +12728,7 @@
         <w:ind w:left="2160" w:hanging="360"/>
       </w:pPr>
     </w:lvl>
-    <w:lvl w:ilvl="3" w:tplc="A89CF742" w:tentative="1">
+    <w:lvl w:ilvl="3" w:tplc="1402EBE2" w:tentative="1">
       <w:start w:val="1"/>
       <w:numFmt w:val="bullet"/>
       <w:lvlText w:val="●"/>
@@ -10597,7 +12737,7 @@
         <w:ind w:left="2880" w:hanging="360"/>
       </w:pPr>
     </w:lvl>
-    <w:lvl w:ilvl="4" w:tplc="4A308B2A" w:tentative="1">
+    <w:lvl w:ilvl="4" w:tplc="FA64550C" w:tentative="1">
       <w:start w:val="1"/>
       <w:numFmt w:val="bullet"/>
       <w:lvlText w:val="○"/>
@@ -10606,7 +12746,7 @@
         <w:ind w:left="3600" w:hanging="360"/>
       </w:pPr>
     </w:lvl>
-    <w:lvl w:ilvl="5" w:tplc="2DCE7F92" w:tentative="1">
+    <w:lvl w:ilvl="5" w:tplc="3DBA67DC" w:tentative="1">
       <w:start w:val="1"/>
       <w:numFmt w:val="bullet"/>
       <w:lvlText w:val="■"/>
@@ -10615,7 +12755,7 @@
         <w:ind w:left="4320" w:hanging="360"/>
       </w:pPr>
     </w:lvl>
-    <w:lvl w:ilvl="6" w:tplc="71DEB100" w:tentative="1">
+    <w:lvl w:ilvl="6" w:tplc="C22C8A6E" w:tentative="1">
       <w:start w:val="1"/>
       <w:numFmt w:val="bullet"/>
       <w:lvlText w:val="●"/>
@@ -10624,7 +12764,7 @@
         <w:ind w:left="5040" w:hanging="360"/>
       </w:pPr>
     </w:lvl>
-    <w:lvl w:ilvl="7" w:tplc="F8E03C2A" w:tentative="1">
+    <w:lvl w:ilvl="7" w:tplc="24D8F6B0" w:tentative="1">
       <w:start w:val="1"/>
       <w:numFmt w:val="bullet"/>
       <w:lvlText w:val="●"/>
@@ -10633,7 +12773,7 @@
         <w:ind w:left="5760" w:hanging="360"/>
       </w:pPr>
     </w:lvl>
-    <w:lvl w:ilvl="8" w:tplc="6254C15C" w:tentative="1">
+    <w:lvl w:ilvl="8" w:tplc="6C0449D4" w:tentative="1">
       <w:start w:val="1"/>
       <w:numFmt w:val="bullet"/>
       <w:lvlText w:val="●"/>
@@ -10643,14 +12783,68 @@
       </w:pPr>
     </w:lvl>
   </w:abstractNum>
-  <w:num w:numId="1" w16cid:durableId="546915988">
-    <w:abstractNumId w:val="1"/>
+  <w:abstractNum w:abstractNumId="1" w15:restartNumberingAfterBreak="0">
+    <w:nsid w:val="6D9004EF"/>
+    <w:multiLevelType w:val="hybridMultilevel"/>
+    <w:tmpl w:val="E98C408E"/>
+    <w:lvl w:ilvl="0" w:tplc="EEC8FD46">
+      <w:start w:val="1"/>
+      <w:numFmt w:val="bullet"/>
+      <w:lvlText w:val="•"/>
+      <w:lvlJc w:val="left"/>
+      <w:pPr>
+        <w:ind w:left="540" w:hanging="270"/>
+      </w:pPr>
+    </w:lvl>
+    <w:lvl w:ilvl="1" w:tplc="0D14FC26">
+      <w:numFmt w:val="decimal"/>
+      <w:lvlText w:val=""/>
+      <w:lvlJc w:val="left"/>
+    </w:lvl>
+    <w:lvl w:ilvl="2" w:tplc="C9682030">
+      <w:numFmt w:val="decimal"/>
+      <w:lvlText w:val=""/>
+      <w:lvlJc w:val="left"/>
+    </w:lvl>
+    <w:lvl w:ilvl="3" w:tplc="13F27498">
+      <w:numFmt w:val="decimal"/>
+      <w:lvlText w:val=""/>
+      <w:lvlJc w:val="left"/>
+    </w:lvl>
+    <w:lvl w:ilvl="4" w:tplc="8E026B30">
+      <w:numFmt w:val="decimal"/>
+      <w:lvlText w:val=""/>
+      <w:lvlJc w:val="left"/>
+    </w:lvl>
+    <w:lvl w:ilvl="5" w:tplc="73AACF78">
+      <w:numFmt w:val="decimal"/>
+      <w:lvlText w:val=""/>
+      <w:lvlJc w:val="left"/>
+    </w:lvl>
+    <w:lvl w:ilvl="6" w:tplc="A9641088">
+      <w:numFmt w:val="decimal"/>
+      <w:lvlText w:val=""/>
+      <w:lvlJc w:val="left"/>
+    </w:lvl>
+    <w:lvl w:ilvl="7" w:tplc="9484310E">
+      <w:numFmt w:val="decimal"/>
+      <w:lvlText w:val=""/>
+      <w:lvlJc w:val="left"/>
+    </w:lvl>
+    <w:lvl w:ilvl="8" w:tplc="582AA540">
+      <w:numFmt w:val="decimal"/>
+      <w:lvlText w:val=""/>
+      <w:lvlJc w:val="left"/>
+    </w:lvl>
+  </w:abstractNum>
+  <w:num w:numId="1" w16cid:durableId="451553216">
+    <w:abstractNumId w:val="0"/>
     <w:lvlOverride w:ilvl="0">
       <w:startOverride w:val="1"/>
     </w:lvlOverride>
   </w:num>
-  <w:num w:numId="2" w16cid:durableId="1176572197">
-    <w:abstractNumId w:val="0"/>
+  <w:num w:numId="2" w16cid:durableId="509757602">
+    <w:abstractNumId w:val="1"/>
     <w:lvlOverride w:ilvl="0">
       <w:startOverride w:val="1"/>
     </w:lvlOverride>

</xml_diff>

<commit_message>
Diseño de la app móvil (Android e iOS) y sección 8.7 del informe
- docs/movil: documento de diseño (React Native + Expo, arquitectura,
  pantallas por rol, cambios en la API, seguridad, publicación y plan
  por entregas), bocetos de 5 pantallas y diagrama de arquitectura.
- Informe del 25%: nueva sección 8.7 EXTRA con tablas de decisión,
  diagrama y bocetos en página horizontal; menciones en la descripción
  y en los siguientes pasos.

Co-Authored-By: Claude Opus 5.5 <noreply@anthropic.com>
</commit_message>
<xml_diff>
--- a/docs/informes/LeGrandHotel_Entrega_25.docx
+++ b/docs/informes/LeGrandHotel_Entrega_25.docx
@@ -34,7 +34,7 @@
           <w:noProof/>
         </w:rPr>
         <w:drawing>
-          <wp:inline distT="0" distB="0" distL="0" distR="0" wp14:anchorId="4AF841A3" wp14:editId="30FAF870">
+          <wp:inline distT="0" distB="0" distL="0" distR="0" wp14:anchorId="2AC97543" wp14:editId="0DA45EE3">
             <wp:extent cx="1800225" cy="1076325"/>
             <wp:effectExtent l="0" t="0" r="0" b="0"/>
             <wp:docPr id="1" name="Imagen 1"/>
@@ -254,7 +254,7 @@
     <w:sdt>
       <w:sdtPr>
         <w:alias w:val="Índice"/>
-        <w:id w:val="-735544299"/>
+        <w:id w:val="338664397"/>
       </w:sdtPr>
       <w:sdtEndPr/>
       <w:sdtContent>
@@ -280,7 +280,7 @@
           <w:r>
             <w:fldChar w:fldCharType="separate"/>
           </w:r>
-          <w:hyperlink w:anchor="_Toc243979856" w:history="1">
+          <w:hyperlink w:anchor="_Toc243980359" w:history="1">
             <w:r>
               <w:rPr>
                 <w:rStyle w:val="Hipervnculo"/>
@@ -304,7 +304,7 @@
               <w:rPr>
                 <w:noProof/>
               </w:rPr>
-              <w:instrText xml:space="preserve"> PAGEREF _Toc243979856 \h </w:instrText>
+              <w:instrText xml:space="preserve"> PAGEREF _Toc243980359 \h </w:instrText>
             </w:r>
             <w:r>
               <w:rPr>
@@ -344,7 +344,7 @@
               <w14:ligatures w14:val="standardContextual"/>
             </w:rPr>
           </w:pPr>
-          <w:hyperlink w:anchor="_Toc243979857" w:history="1">
+          <w:hyperlink w:anchor="_Toc243980360" w:history="1">
             <w:r>
               <w:rPr>
                 <w:rStyle w:val="Hipervnculo"/>
@@ -368,7 +368,7 @@
               <w:rPr>
                 <w:noProof/>
               </w:rPr>
-              <w:instrText xml:space="preserve"> PAGEREF _Toc243979857 \h </w:instrText>
+              <w:instrText xml:space="preserve"> PAGEREF _Toc243980360 \h </w:instrText>
             </w:r>
             <w:r>
               <w:rPr>
@@ -408,7 +408,7 @@
               <w14:ligatures w14:val="standardContextual"/>
             </w:rPr>
           </w:pPr>
-          <w:hyperlink w:anchor="_Toc243979858" w:history="1">
+          <w:hyperlink w:anchor="_Toc243980361" w:history="1">
             <w:r>
               <w:rPr>
                 <w:rStyle w:val="Hipervnculo"/>
@@ -432,7 +432,7 @@
               <w:rPr>
                 <w:noProof/>
               </w:rPr>
-              <w:instrText xml:space="preserve"> PAGEREF _Toc243979858 \h </w:instrText>
+              <w:instrText xml:space="preserve"> PAGEREF _Toc243980361 \h </w:instrText>
             </w:r>
             <w:r>
               <w:rPr>
@@ -472,7 +472,7 @@
               <w14:ligatures w14:val="standardContextual"/>
             </w:rPr>
           </w:pPr>
-          <w:hyperlink w:anchor="_Toc243979859" w:history="1">
+          <w:hyperlink w:anchor="_Toc243980362" w:history="1">
             <w:r>
               <w:rPr>
                 <w:rStyle w:val="Hipervnculo"/>
@@ -496,7 +496,7 @@
               <w:rPr>
                 <w:noProof/>
               </w:rPr>
-              <w:instrText xml:space="preserve"> PAGEREF _Toc243979859 \h </w:instrText>
+              <w:instrText xml:space="preserve"> PAGEREF _Toc243980362 \h </w:instrText>
             </w:r>
             <w:r>
               <w:rPr>
@@ -513,7 +513,7 @@
               <w:rPr>
                 <w:noProof/>
               </w:rPr>
-              <w:t>3</w:t>
+              <w:t>4</w:t>
             </w:r>
             <w:r>
               <w:rPr>
@@ -536,7 +536,7 @@
               <w14:ligatures w14:val="standardContextual"/>
             </w:rPr>
           </w:pPr>
-          <w:hyperlink w:anchor="_Toc243979860" w:history="1">
+          <w:hyperlink w:anchor="_Toc243980363" w:history="1">
             <w:r>
               <w:rPr>
                 <w:rStyle w:val="Hipervnculo"/>
@@ -560,7 +560,7 @@
               <w:rPr>
                 <w:noProof/>
               </w:rPr>
-              <w:instrText xml:space="preserve"> PAGEREF _Toc243979860 \h </w:instrText>
+              <w:instrText xml:space="preserve"> PAGEREF _Toc243980363 \h </w:instrText>
             </w:r>
             <w:r>
               <w:rPr>
@@ -600,7 +600,7 @@
               <w14:ligatures w14:val="standardContextual"/>
             </w:rPr>
           </w:pPr>
-          <w:hyperlink w:anchor="_Toc243979861" w:history="1">
+          <w:hyperlink w:anchor="_Toc243980364" w:history="1">
             <w:r>
               <w:rPr>
                 <w:rStyle w:val="Hipervnculo"/>
@@ -624,7 +624,7 @@
               <w:rPr>
                 <w:noProof/>
               </w:rPr>
-              <w:instrText xml:space="preserve"> PAGEREF _Toc243979861 \h </w:instrText>
+              <w:instrText xml:space="preserve"> PAGEREF _Toc243980364 \h </w:instrText>
             </w:r>
             <w:r>
               <w:rPr>
@@ -664,7 +664,7 @@
               <w14:ligatures w14:val="standardContextual"/>
             </w:rPr>
           </w:pPr>
-          <w:hyperlink w:anchor="_Toc243979862" w:history="1">
+          <w:hyperlink w:anchor="_Toc243980365" w:history="1">
             <w:r>
               <w:rPr>
                 <w:rStyle w:val="Hipervnculo"/>
@@ -688,7 +688,7 @@
               <w:rPr>
                 <w:noProof/>
               </w:rPr>
-              <w:instrText xml:space="preserve"> PAGEREF _Toc243979862 \h </w:instrText>
+              <w:instrText xml:space="preserve"> PAGEREF _Toc243980365 \h </w:instrText>
             </w:r>
             <w:r>
               <w:rPr>
@@ -728,7 +728,7 @@
               <w14:ligatures w14:val="standardContextual"/>
             </w:rPr>
           </w:pPr>
-          <w:hyperlink w:anchor="_Toc243979863" w:history="1">
+          <w:hyperlink w:anchor="_Toc243980366" w:history="1">
             <w:r>
               <w:rPr>
                 <w:rStyle w:val="Hipervnculo"/>
@@ -752,7 +752,7 @@
               <w:rPr>
                 <w:noProof/>
               </w:rPr>
-              <w:instrText xml:space="preserve"> PAGEREF _Toc243979863 \h </w:instrText>
+              <w:instrText xml:space="preserve"> PAGEREF _Toc243980366 \h </w:instrText>
             </w:r>
             <w:r>
               <w:rPr>
@@ -792,7 +792,7 @@
               <w14:ligatures w14:val="standardContextual"/>
             </w:rPr>
           </w:pPr>
-          <w:hyperlink w:anchor="_Toc243979864" w:history="1">
+          <w:hyperlink w:anchor="_Toc243980367" w:history="1">
             <w:r>
               <w:rPr>
                 <w:rStyle w:val="Hipervnculo"/>
@@ -816,7 +816,7 @@
               <w:rPr>
                 <w:noProof/>
               </w:rPr>
-              <w:instrText xml:space="preserve"> PAGEREF _Toc243979864 \h </w:instrText>
+              <w:instrText xml:space="preserve"> PAGEREF _Toc243980367 \h </w:instrText>
             </w:r>
             <w:r>
               <w:rPr>
@@ -856,7 +856,7 @@
               <w14:ligatures w14:val="standardContextual"/>
             </w:rPr>
           </w:pPr>
-          <w:hyperlink w:anchor="_Toc243979865" w:history="1">
+          <w:hyperlink w:anchor="_Toc243980368" w:history="1">
             <w:r>
               <w:rPr>
                 <w:rStyle w:val="Hipervnculo"/>
@@ -880,7 +880,7 @@
               <w:rPr>
                 <w:noProof/>
               </w:rPr>
-              <w:instrText xml:space="preserve"> PAGEREF _Toc243979865 \h </w:instrText>
+              <w:instrText xml:space="preserve"> PAGEREF _Toc243980368 \h </w:instrText>
             </w:r>
             <w:r>
               <w:rPr>
@@ -920,7 +920,7 @@
               <w14:ligatures w14:val="standardContextual"/>
             </w:rPr>
           </w:pPr>
-          <w:hyperlink w:anchor="_Toc243979866" w:history="1">
+          <w:hyperlink w:anchor="_Toc243980369" w:history="1">
             <w:r>
               <w:rPr>
                 <w:rStyle w:val="Hipervnculo"/>
@@ -944,7 +944,7 @@
               <w:rPr>
                 <w:noProof/>
               </w:rPr>
-              <w:instrText xml:space="preserve"> PAGEREF _Toc243979866 \h </w:instrText>
+              <w:instrText xml:space="preserve"> PAGEREF _Toc243980369 \h </w:instrText>
             </w:r>
             <w:r>
               <w:rPr>
@@ -984,7 +984,7 @@
               <w14:ligatures w14:val="standardContextual"/>
             </w:rPr>
           </w:pPr>
-          <w:hyperlink w:anchor="_Toc243979867" w:history="1">
+          <w:hyperlink w:anchor="_Toc243980370" w:history="1">
             <w:r>
               <w:rPr>
                 <w:rStyle w:val="Hipervnculo"/>
@@ -1008,7 +1008,7 @@
               <w:rPr>
                 <w:noProof/>
               </w:rPr>
-              <w:instrText xml:space="preserve"> PAGEREF _Toc243979867 \h </w:instrText>
+              <w:instrText xml:space="preserve"> PAGEREF _Toc243980370 \h </w:instrText>
             </w:r>
             <w:r>
               <w:rPr>
@@ -1048,7 +1048,7 @@
               <w14:ligatures w14:val="standardContextual"/>
             </w:rPr>
           </w:pPr>
-          <w:hyperlink w:anchor="_Toc243979868" w:history="1">
+          <w:hyperlink w:anchor="_Toc243980371" w:history="1">
             <w:r>
               <w:rPr>
                 <w:rStyle w:val="Hipervnculo"/>
@@ -1072,7 +1072,7 @@
               <w:rPr>
                 <w:noProof/>
               </w:rPr>
-              <w:instrText xml:space="preserve"> PAGEREF _Toc243979868 \h </w:instrText>
+              <w:instrText xml:space="preserve"> PAGEREF _Toc243980371 \h </w:instrText>
             </w:r>
             <w:r>
               <w:rPr>
@@ -1112,7 +1112,7 @@
               <w14:ligatures w14:val="standardContextual"/>
             </w:rPr>
           </w:pPr>
-          <w:hyperlink w:anchor="_Toc243979869" w:history="1">
+          <w:hyperlink w:anchor="_Toc243980372" w:history="1">
             <w:r>
               <w:rPr>
                 <w:rStyle w:val="Hipervnculo"/>
@@ -1136,7 +1136,7 @@
               <w:rPr>
                 <w:noProof/>
               </w:rPr>
-              <w:instrText xml:space="preserve"> PAGEREF _Toc243979869 \h </w:instrText>
+              <w:instrText xml:space="preserve"> PAGEREF _Toc243980372 \h </w:instrText>
             </w:r>
             <w:r>
               <w:rPr>
@@ -1176,7 +1176,7 @@
               <w14:ligatures w14:val="standardContextual"/>
             </w:rPr>
           </w:pPr>
-          <w:hyperlink w:anchor="_Toc243979870" w:history="1">
+          <w:hyperlink w:anchor="_Toc243980373" w:history="1">
             <w:r>
               <w:rPr>
                 <w:rStyle w:val="Hipervnculo"/>
@@ -1200,7 +1200,7 @@
               <w:rPr>
                 <w:noProof/>
               </w:rPr>
-              <w:instrText xml:space="preserve"> PAGEREF _Toc243979870 \h </w:instrText>
+              <w:instrText xml:space="preserve"> PAGEREF _Toc243980373 \h </w:instrText>
             </w:r>
             <w:r>
               <w:rPr>
@@ -1240,7 +1240,7 @@
               <w14:ligatures w14:val="standardContextual"/>
             </w:rPr>
           </w:pPr>
-          <w:hyperlink w:anchor="_Toc243979871" w:history="1">
+          <w:hyperlink w:anchor="_Toc243980374" w:history="1">
             <w:r>
               <w:rPr>
                 <w:rStyle w:val="Hipervnculo"/>
@@ -1264,7 +1264,7 @@
               <w:rPr>
                 <w:noProof/>
               </w:rPr>
-              <w:instrText xml:space="preserve"> PAGEREF _Toc243979871 \h </w:instrText>
+              <w:instrText xml:space="preserve"> PAGEREF _Toc243980374 \h </w:instrText>
             </w:r>
             <w:r>
               <w:rPr>
@@ -1304,7 +1304,7 @@
               <w14:ligatures w14:val="standardContextual"/>
             </w:rPr>
           </w:pPr>
-          <w:hyperlink w:anchor="_Toc243979872" w:history="1">
+          <w:hyperlink w:anchor="_Toc243980375" w:history="1">
             <w:r>
               <w:rPr>
                 <w:rStyle w:val="Hipervnculo"/>
@@ -1328,7 +1328,7 @@
               <w:rPr>
                 <w:noProof/>
               </w:rPr>
-              <w:instrText xml:space="preserve"> PAGEREF _Toc243979872 \h </w:instrText>
+              <w:instrText xml:space="preserve"> PAGEREF _Toc243980375 \h </w:instrText>
             </w:r>
             <w:r>
               <w:rPr>
@@ -1368,7 +1368,7 @@
               <w14:ligatures w14:val="standardContextual"/>
             </w:rPr>
           </w:pPr>
-          <w:hyperlink w:anchor="_Toc243979873" w:history="1">
+          <w:hyperlink w:anchor="_Toc243980376" w:history="1">
             <w:r>
               <w:rPr>
                 <w:rStyle w:val="Hipervnculo"/>
@@ -1392,7 +1392,7 @@
               <w:rPr>
                 <w:noProof/>
               </w:rPr>
-              <w:instrText xml:space="preserve"> PAGEREF _Toc243979873 \h </w:instrText>
+              <w:instrText xml:space="preserve"> PAGEREF _Toc243980376 \h </w:instrText>
             </w:r>
             <w:r>
               <w:rPr>
@@ -1432,7 +1432,7 @@
               <w14:ligatures w14:val="standardContextual"/>
             </w:rPr>
           </w:pPr>
-          <w:hyperlink w:anchor="_Toc243979874" w:history="1">
+          <w:hyperlink w:anchor="_Toc243980377" w:history="1">
             <w:r>
               <w:rPr>
                 <w:rStyle w:val="Hipervnculo"/>
@@ -1456,7 +1456,7 @@
               <w:rPr>
                 <w:noProof/>
               </w:rPr>
-              <w:instrText xml:space="preserve"> PAGEREF _Toc243979874 \h </w:instrText>
+              <w:instrText xml:space="preserve"> PAGEREF _Toc243980377 \h </w:instrText>
             </w:r>
             <w:r>
               <w:rPr>
@@ -1496,7 +1496,7 @@
               <w14:ligatures w14:val="standardContextual"/>
             </w:rPr>
           </w:pPr>
-          <w:hyperlink w:anchor="_Toc243979875" w:history="1">
+          <w:hyperlink w:anchor="_Toc243980378" w:history="1">
             <w:r>
               <w:rPr>
                 <w:rStyle w:val="Hipervnculo"/>
@@ -1520,7 +1520,7 @@
               <w:rPr>
                 <w:noProof/>
               </w:rPr>
-              <w:instrText xml:space="preserve"> PAGEREF _Toc243979875 \h </w:instrText>
+              <w:instrText xml:space="preserve"> PAGEREF _Toc243980378 \h </w:instrText>
             </w:r>
             <w:r>
               <w:rPr>
@@ -1538,6 +1538,70 @@
                 <w:noProof/>
               </w:rPr>
               <w:t>18</w:t>
+            </w:r>
+            <w:r>
+              <w:rPr>
+                <w:noProof/>
+              </w:rPr>
+              <w:fldChar w:fldCharType="end"/>
+            </w:r>
+          </w:hyperlink>
+        </w:p>
+        <w:p>
+          <w:pPr>
+            <w:pStyle w:val="TDC2"/>
+            <w:tabs>
+              <w:tab w:val="right" w:leader="dot" w:pos="9060"/>
+            </w:tabs>
+            <w:rPr>
+              <w:rFonts w:asciiTheme="minorHAnsi" w:eastAsiaTheme="minorEastAsia" w:hAnsiTheme="minorHAnsi" w:cstheme="minorBidi"/>
+              <w:noProof/>
+              <w:kern w:val="2"/>
+              <w14:ligatures w14:val="standardContextual"/>
+            </w:rPr>
+          </w:pPr>
+          <w:hyperlink w:anchor="_Toc243980379" w:history="1">
+            <w:r>
+              <w:rPr>
+                <w:rStyle w:val="Hipervnculo"/>
+                <w:noProof/>
+              </w:rPr>
+              <w:t>8.7 EXTRA: Diseño de la aplicación móvil (Android e iOS)</w:t>
+            </w:r>
+            <w:r>
+              <w:rPr>
+                <w:noProof/>
+              </w:rPr>
+              <w:tab/>
+            </w:r>
+            <w:r>
+              <w:rPr>
+                <w:noProof/>
+              </w:rPr>
+              <w:fldChar w:fldCharType="begin"/>
+            </w:r>
+            <w:r>
+              <w:rPr>
+                <w:noProof/>
+              </w:rPr>
+              <w:instrText xml:space="preserve"> PAGEREF _Toc243980379 \h </w:instrText>
+            </w:r>
+            <w:r>
+              <w:rPr>
+                <w:noProof/>
+              </w:rPr>
+            </w:r>
+            <w:r>
+              <w:rPr>
+                <w:noProof/>
+              </w:rPr>
+              <w:fldChar w:fldCharType="separate"/>
+            </w:r>
+            <w:r>
+              <w:rPr>
+                <w:noProof/>
+              </w:rPr>
+              <w:t>19</w:t>
             </w:r>
             <w:r>
               <w:rPr>
@@ -1560,7 +1624,7 @@
               <w14:ligatures w14:val="standardContextual"/>
             </w:rPr>
           </w:pPr>
-          <w:hyperlink w:anchor="_Toc243979876" w:history="1">
+          <w:hyperlink w:anchor="_Toc243980380" w:history="1">
             <w:r>
               <w:rPr>
                 <w:rStyle w:val="Hipervnculo"/>
@@ -1584,7 +1648,7 @@
               <w:rPr>
                 <w:noProof/>
               </w:rPr>
-              <w:instrText xml:space="preserve"> PAGEREF _Toc243979876 \h </w:instrText>
+              <w:instrText xml:space="preserve"> PAGEREF _Toc243980380 \h </w:instrText>
             </w:r>
             <w:r>
               <w:rPr>
@@ -1601,7 +1665,7 @@
               <w:rPr>
                 <w:noProof/>
               </w:rPr>
-              <w:t>19</w:t>
+              <w:t>23</w:t>
             </w:r>
             <w:r>
               <w:rPr>
@@ -1628,7 +1692,7 @@
         <w:pStyle w:val="Ttulo1"/>
         <w:keepNext/>
       </w:pPr>
-      <w:bookmarkStart w:id="0" w:name="_Toc243979856"/>
+      <w:bookmarkStart w:id="0" w:name="_Toc243980359"/>
       <w:r>
         <w:lastRenderedPageBreak/>
         <w:t>1. Alcance de la entrega del 25%</w:t>
@@ -2143,7 +2207,7 @@
         <w:pStyle w:val="Ttulo1"/>
         <w:keepNext/>
       </w:pPr>
-      <w:bookmarkStart w:id="1" w:name="_Toc243979857"/>
+      <w:bookmarkStart w:id="1" w:name="_Toc243980360"/>
       <w:r>
         <w:t>2. Descripción del proyecto</w:t>
       </w:r>
@@ -2154,7 +2218,7 @@
         <w:spacing w:after="120" w:line="300" w:lineRule="auto"/>
       </w:pPr>
       <w:r>
-        <w:t>LeGrandHotel es un sistema web de gestión de hospedaje. Cubre habitaciones y tipos, reservas y estadías (check-in y check-out), cochera, clientes, personal e inventario. Lo usan cinco tipos de usuario: Administrador, Recepcionista, Almacenero, Cliente y Programador.</w:t>
+        <w:t>LeGrandHotel es un sistema web de gestión de hospedaje. Cubre habitaciones y tipos, reservas y estadías (check-in y check-out), cochera, clientes, personal e inventario. Lo usan cinco tipos de usuario: Administrador, Recepcionista, Almacenero, Cliente y Programador. Además de la página web se diseñó una aplicación móvil para Android e iOS que usará la misma API (sección 8.7).</w:t>
       </w:r>
     </w:p>
     <w:p>
@@ -2162,7 +2226,7 @@
         <w:pStyle w:val="Ttulo2"/>
         <w:keepNext/>
       </w:pPr>
-      <w:bookmarkStart w:id="2" w:name="_Toc243979858"/>
+      <w:bookmarkStart w:id="2" w:name="_Toc243980361"/>
       <w:r>
         <w:t>2.1 Tecnologías</w:t>
       </w:r>
@@ -2648,8 +2712,9 @@
         <w:pStyle w:val="Ttulo1"/>
         <w:keepNext/>
       </w:pPr>
-      <w:bookmarkStart w:id="3" w:name="_Toc243979859"/>
-      <w:r>
+      <w:bookmarkStart w:id="3" w:name="_Toc243980362"/>
+      <w:r>
+        <w:lastRenderedPageBreak/>
         <w:t>3. Arquitectura y entorno cloud</w:t>
       </w:r>
       <w:bookmarkEnd w:id="3"/>
@@ -2672,12 +2737,11 @@
         <w:rPr>
           <w:noProof/>
         </w:rPr>
-        <w:lastRenderedPageBreak/>
         <w:drawing>
-          <wp:inline distT="0" distB="0" distL="0" distR="0" wp14:anchorId="27199B95" wp14:editId="1C727421">
+          <wp:inline distT="0" distB="0" distL="0" distR="0" wp14:anchorId="75D8F23E" wp14:editId="1ED2352D">
             <wp:extent cx="5762625" cy="4038600"/>
             <wp:effectExtent l="0" t="0" r="0" b="0"/>
-            <wp:docPr id="3" name="Imagen 3"/>
+            <wp:docPr id="4" name="Imagen 4"/>
             <wp:cNvGraphicFramePr>
               <a:graphicFrameLocks xmlns:a="http://schemas.openxmlformats.org/drawingml/2006/main" noChangeAspect="1"/>
             </wp:cNvGraphicFramePr>
@@ -2733,7 +2797,7 @@
         <w:pStyle w:val="Ttulo2"/>
         <w:keepNext/>
       </w:pPr>
-      <w:bookmarkStart w:id="4" w:name="_Toc243979860"/>
+      <w:bookmarkStart w:id="4" w:name="_Toc243980363"/>
       <w:r>
         <w:t>3.1 Recursos del entorno (Terraform)</w:t>
       </w:r>
@@ -3639,7 +3703,7 @@
         <w:pStyle w:val="Ttulo2"/>
         <w:keepNext/>
       </w:pPr>
-      <w:bookmarkStart w:id="5" w:name="_Toc243979861"/>
+      <w:bookmarkStart w:id="5" w:name="_Toc243980364"/>
       <w:r>
         <w:t>3.2 Costo estimado</w:t>
       </w:r>
@@ -3962,7 +4026,7 @@
         <w:pStyle w:val="Ttulo1"/>
         <w:keepNext/>
       </w:pPr>
-      <w:bookmarkStart w:id="6" w:name="_Toc243979862"/>
+      <w:bookmarkStart w:id="6" w:name="_Toc243980365"/>
       <w:r>
         <w:t>4. Endpoints definidos</w:t>
       </w:r>
@@ -5585,7 +5649,7 @@
         <w:pStyle w:val="Ttulo2"/>
         <w:keepNext/>
       </w:pPr>
-      <w:bookmarkStart w:id="7" w:name="_Toc243979863"/>
+      <w:bookmarkStart w:id="7" w:name="_Toc243980366"/>
       <w:r>
         <w:t>4.1 Formato único de respuesta</w:t>
       </w:r>
@@ -5857,7 +5921,7 @@
         <w:pStyle w:val="Ttulo2"/>
         <w:keepNext/>
       </w:pPr>
-      <w:bookmarkStart w:id="8" w:name="_Toc243979864"/>
+      <w:bookmarkStart w:id="8" w:name="_Toc243980367"/>
       <w:r>
         <w:t>4.2 Códigos HTTP</w:t>
       </w:r>
@@ -6624,7 +6688,7 @@
         <w:pStyle w:val="Ttulo1"/>
         <w:keepNext/>
       </w:pPr>
-      <w:bookmarkStart w:id="9" w:name="_Toc243979865"/>
+      <w:bookmarkStart w:id="9" w:name="_Toc243980368"/>
       <w:r>
         <w:lastRenderedPageBreak/>
         <w:t>5. Registro y login diferenciados</w:t>
@@ -7265,10 +7329,10 @@
           <w:noProof/>
         </w:rPr>
         <w:drawing>
-          <wp:inline distT="0" distB="0" distL="0" distR="0" wp14:anchorId="6DDDD706" wp14:editId="728EF47E">
+          <wp:inline distT="0" distB="0" distL="0" distR="0" wp14:anchorId="014ED48C" wp14:editId="483CA021">
             <wp:extent cx="5400675" cy="3371850"/>
             <wp:effectExtent l="0" t="0" r="0" b="0"/>
-            <wp:docPr id="4" name="Imagen 4"/>
+            <wp:docPr id="5" name="Imagen 5"/>
             <wp:cNvGraphicFramePr>
               <a:graphicFrameLocks xmlns:a="http://schemas.openxmlformats.org/drawingml/2006/main" noChangeAspect="1"/>
             </wp:cNvGraphicFramePr>
@@ -7331,10 +7395,10 @@
         </w:rPr>
         <w:lastRenderedPageBreak/>
         <w:drawing>
-          <wp:inline distT="0" distB="0" distL="0" distR="0" wp14:anchorId="71467497" wp14:editId="36F3B792">
+          <wp:inline distT="0" distB="0" distL="0" distR="0" wp14:anchorId="58D7DE57" wp14:editId="6C79986E">
             <wp:extent cx="5400675" cy="3371850"/>
             <wp:effectExtent l="0" t="0" r="0" b="0"/>
-            <wp:docPr id="5" name="Imagen 5"/>
+            <wp:docPr id="6" name="Imagen 6"/>
             <wp:cNvGraphicFramePr>
               <a:graphicFrameLocks xmlns:a="http://schemas.openxmlformats.org/drawingml/2006/main" noChangeAspect="1"/>
             </wp:cNvGraphicFramePr>
@@ -7396,10 +7460,10 @@
           <w:noProof/>
         </w:rPr>
         <w:drawing>
-          <wp:inline distT="0" distB="0" distL="0" distR="0" wp14:anchorId="3ED6397A" wp14:editId="3B67C434">
+          <wp:inline distT="0" distB="0" distL="0" distR="0" wp14:anchorId="0FD99239" wp14:editId="28CB5BAA">
             <wp:extent cx="5400675" cy="3371850"/>
             <wp:effectExtent l="0" t="0" r="0" b="0"/>
-            <wp:docPr id="6" name="Imagen 6"/>
+            <wp:docPr id="7" name="Imagen 7"/>
             <wp:cNvGraphicFramePr>
               <a:graphicFrameLocks xmlns:a="http://schemas.openxmlformats.org/drawingml/2006/main" noChangeAspect="1"/>
             </wp:cNvGraphicFramePr>
@@ -8293,7 +8357,7 @@
         <w:pStyle w:val="Ttulo2"/>
         <w:keepNext/>
       </w:pPr>
-      <w:bookmarkStart w:id="10" w:name="_Toc243979866"/>
+      <w:bookmarkStart w:id="10" w:name="_Toc243980369"/>
       <w:r>
         <w:t>5.1 Pruebas automáticas del registro y login</w:t>
       </w:r>
@@ -8911,7 +8975,7 @@
         <w:pStyle w:val="Ttulo1"/>
         <w:keepNext/>
       </w:pPr>
-      <w:bookmarkStart w:id="11" w:name="_Toc243979867"/>
+      <w:bookmarkStart w:id="11" w:name="_Toc243980370"/>
       <w:r>
         <w:t>6. Registro de incidentes</w:t>
       </w:r>
@@ -9518,7 +9582,7 @@
         <w:pStyle w:val="Ttulo1"/>
         <w:keepNext/>
       </w:pPr>
-      <w:bookmarkStart w:id="12" w:name="_Toc243979868"/>
+      <w:bookmarkStart w:id="12" w:name="_Toc243980371"/>
       <w:r>
         <w:t>7. Conclusiones de la entrega</w:t>
       </w:r>
@@ -9562,7 +9626,7 @@
         <w:pStyle w:val="Ttulo1"/>
         <w:keepNext/>
       </w:pPr>
-      <w:bookmarkStart w:id="13" w:name="_Toc243979869"/>
+      <w:bookmarkStart w:id="13" w:name="_Toc243980372"/>
       <w:r>
         <w:lastRenderedPageBreak/>
         <w:t>8. EXTRAS (adicionales a lo evaluado en el 25%)</w:t>
@@ -9586,7 +9650,7 @@
         <w:pStyle w:val="Ttulo2"/>
         <w:keepNext/>
       </w:pPr>
-      <w:bookmarkStart w:id="14" w:name="_Toc243979870"/>
+      <w:bookmarkStart w:id="14" w:name="_Toc243980373"/>
       <w:r>
         <w:t>8.1 EXTRA: Diagrama de base de datos</w:t>
       </w:r>
@@ -9611,10 +9675,10 @@
           <w:noProof/>
         </w:rPr>
         <w:drawing>
-          <wp:inline distT="0" distB="0" distL="0" distR="0" wp14:anchorId="16DED24A" wp14:editId="7D361AB9">
+          <wp:inline distT="0" distB="0" distL="0" distR="0" wp14:anchorId="1C886320" wp14:editId="374F7859">
             <wp:extent cx="7562850" cy="4029075"/>
             <wp:effectExtent l="0" t="0" r="0" b="0"/>
-            <wp:docPr id="2" name="Imagen 2"/>
+            <wp:docPr id="3" name="Imagen 3"/>
             <wp:cNvGraphicFramePr>
               <a:graphicFrameLocks xmlns:a="http://schemas.openxmlformats.org/drawingml/2006/main" noChangeAspect="1"/>
             </wp:cNvGraphicFramePr>
@@ -9677,7 +9741,7 @@
         <w:pStyle w:val="Ttulo2"/>
         <w:keepNext/>
       </w:pPr>
-      <w:bookmarkStart w:id="15" w:name="_Toc243979871"/>
+      <w:bookmarkStart w:id="15" w:name="_Toc243980374"/>
       <w:r>
         <w:lastRenderedPageBreak/>
         <w:t>8.2 EXTRA: Pruebas de rendimiento y estrés con k6 (varias corridas)</w:t>
@@ -11233,10 +11297,10 @@
           <w:noProof/>
         </w:rPr>
         <w:drawing>
-          <wp:inline distT="0" distB="0" distL="0" distR="0" wp14:anchorId="1FAC341A" wp14:editId="2C579DE4">
+          <wp:inline distT="0" distB="0" distL="0" distR="0" wp14:anchorId="7EC8D13C" wp14:editId="790FE201">
             <wp:extent cx="5400675" cy="3114675"/>
             <wp:effectExtent l="0" t="0" r="0" b="0"/>
-            <wp:docPr id="7" name="Imagen 7"/>
+            <wp:docPr id="8" name="Imagen 8"/>
             <wp:cNvGraphicFramePr>
               <a:graphicFrameLocks xmlns:a="http://schemas.openxmlformats.org/drawingml/2006/main" noChangeAspect="1"/>
             </wp:cNvGraphicFramePr>
@@ -11299,10 +11363,10 @@
         </w:rPr>
         <w:lastRenderedPageBreak/>
         <w:drawing>
-          <wp:inline distT="0" distB="0" distL="0" distR="0" wp14:anchorId="38510281" wp14:editId="16D9DE11">
+          <wp:inline distT="0" distB="0" distL="0" distR="0" wp14:anchorId="715E4043" wp14:editId="47D44CF1">
             <wp:extent cx="5400675" cy="2971800"/>
             <wp:effectExtent l="0" t="0" r="0" b="0"/>
-            <wp:docPr id="8" name="Imagen 8"/>
+            <wp:docPr id="9" name="Imagen 9"/>
             <wp:cNvGraphicFramePr>
               <a:graphicFrameLocks xmlns:a="http://schemas.openxmlformats.org/drawingml/2006/main" noChangeAspect="1"/>
             </wp:cNvGraphicFramePr>
@@ -11364,10 +11428,10 @@
           <w:noProof/>
         </w:rPr>
         <w:drawing>
-          <wp:inline distT="0" distB="0" distL="0" distR="0" wp14:anchorId="3F28E56D" wp14:editId="1EF669BB">
+          <wp:inline distT="0" distB="0" distL="0" distR="0" wp14:anchorId="3698841B" wp14:editId="1410CF63">
             <wp:extent cx="5400675" cy="2733675"/>
             <wp:effectExtent l="0" t="0" r="0" b="0"/>
-            <wp:docPr id="9" name="Imagen 9"/>
+            <wp:docPr id="10" name="Imagen 10"/>
             <wp:cNvGraphicFramePr>
               <a:graphicFrameLocks xmlns:a="http://schemas.openxmlformats.org/drawingml/2006/main" noChangeAspect="1"/>
             </wp:cNvGraphicFramePr>
@@ -11430,10 +11494,10 @@
         </w:rPr>
         <w:lastRenderedPageBreak/>
         <w:drawing>
-          <wp:inline distT="0" distB="0" distL="0" distR="0" wp14:anchorId="6E42EA52" wp14:editId="18243F42">
+          <wp:inline distT="0" distB="0" distL="0" distR="0" wp14:anchorId="63F0B8B1" wp14:editId="24EA5331">
             <wp:extent cx="5400675" cy="2981325"/>
             <wp:effectExtent l="0" t="0" r="0" b="0"/>
-            <wp:docPr id="10" name="Imagen 10"/>
+            <wp:docPr id="11" name="Imagen 11"/>
             <wp:cNvGraphicFramePr>
               <a:graphicFrameLocks xmlns:a="http://schemas.openxmlformats.org/drawingml/2006/main" noChangeAspect="1"/>
             </wp:cNvGraphicFramePr>
@@ -11495,10 +11559,10 @@
           <w:noProof/>
         </w:rPr>
         <w:drawing>
-          <wp:inline distT="0" distB="0" distL="0" distR="0" wp14:anchorId="419B7701" wp14:editId="04314BC4">
+          <wp:inline distT="0" distB="0" distL="0" distR="0" wp14:anchorId="4C864010" wp14:editId="555487AB">
             <wp:extent cx="5400675" cy="3638550"/>
             <wp:effectExtent l="0" t="0" r="0" b="0"/>
-            <wp:docPr id="11" name="Imagen 11"/>
+            <wp:docPr id="12" name="Imagen 12"/>
             <wp:cNvGraphicFramePr>
               <a:graphicFrameLocks xmlns:a="http://schemas.openxmlformats.org/drawingml/2006/main" noChangeAspect="1"/>
             </wp:cNvGraphicFramePr>
@@ -11744,7 +11808,7 @@
         <w:pStyle w:val="Ttulo2"/>
         <w:keepNext/>
       </w:pPr>
-      <w:bookmarkStart w:id="16" w:name="_Toc243979872"/>
+      <w:bookmarkStart w:id="16" w:name="_Toc243980375"/>
       <w:r>
         <w:t>8.3 Análisis y cuello de botella encontrado</w:t>
       </w:r>
@@ -11828,7 +11892,7 @@
         <w:pStyle w:val="Ttulo2"/>
         <w:keepNext/>
       </w:pPr>
-      <w:bookmarkStart w:id="17" w:name="_Toc243979873"/>
+      <w:bookmarkStart w:id="17" w:name="_Toc243980376"/>
       <w:r>
         <w:t>8.4 EXTRA: Cifrado (ofuscación) del código</w:t>
       </w:r>
@@ -12299,7 +12363,7 @@
         <w:pStyle w:val="Ttulo2"/>
         <w:keepNext/>
       </w:pPr>
-      <w:bookmarkStart w:id="18" w:name="_Toc243979874"/>
+      <w:bookmarkStart w:id="18" w:name="_Toc243980377"/>
       <w:r>
         <w:t>8.5 EXTRA: Vista del programador</w:t>
       </w:r>
@@ -12327,10 +12391,10 @@
           <w:noProof/>
         </w:rPr>
         <w:drawing>
-          <wp:inline distT="0" distB="0" distL="0" distR="0" wp14:anchorId="72344EFB" wp14:editId="5BC6D68A">
+          <wp:inline distT="0" distB="0" distL="0" distR="0" wp14:anchorId="26E58D81" wp14:editId="4F72544C">
             <wp:extent cx="5400675" cy="3371850"/>
             <wp:effectExtent l="0" t="0" r="0" b="0"/>
-            <wp:docPr id="12" name="Imagen 12"/>
+            <wp:docPr id="13" name="Imagen 13"/>
             <wp:cNvGraphicFramePr>
               <a:graphicFrameLocks xmlns:a="http://schemas.openxmlformats.org/drawingml/2006/main" noChangeAspect="1"/>
             </wp:cNvGraphicFramePr>
@@ -12386,7 +12450,7 @@
         <w:pStyle w:val="Ttulo2"/>
         <w:keepNext/>
       </w:pPr>
-      <w:bookmarkStart w:id="19" w:name="_Toc243979875"/>
+      <w:bookmarkStart w:id="19" w:name="_Toc243980378"/>
       <w:r>
         <w:t>8.6 EXTRA: Seguridad y calidad adelantadas</w:t>
       </w:r>
@@ -12460,14 +12524,1725 @@
     </w:p>
     <w:p>
       <w:pPr>
-        <w:pStyle w:val="Ttulo1"/>
+        <w:pStyle w:val="Ttulo2"/>
         <w:keepNext/>
       </w:pPr>
-      <w:bookmarkStart w:id="20" w:name="_Toc243979876"/>
-      <w:r>
-        <w:t>9. Siguientes pasos (entrega del 80%)</w:t>
+      <w:bookmarkStart w:id="20" w:name="_Toc243980379"/>
+      <w:r>
+        <w:t>8.7 EXTRA: Diseño de la aplicación móvil (Android e iOS)</w:t>
       </w:r>
       <w:bookmarkEnd w:id="20"/>
+    </w:p>
+    <w:p>
+      <w:pPr>
+        <w:spacing w:after="120" w:line="300" w:lineRule="auto"/>
+      </w:pPr>
+      <w:r>
+        <w:t>LeGrandHotel tendrá también una aplicación para teléfonos Android e iOS. En esta entrega se presenta su diseño: la tecnología, la arquitectura, las pantallas y el plan de construcción. El código de la app se desarrolla en las entregas del 80% y del 100%. La app no reemplaza a la web: cubre las tareas que conviene hacer en movimiento y usa la misma API, sin duplicar la lógica del negocio.</w:t>
+      </w:r>
+    </w:p>
+    <w:tbl>
+      <w:tblPr>
+        <w:tblW w:w="9070" w:type="dxa"/>
+        <w:tblBorders>
+          <w:top w:val="single" w:sz="4" w:space="0" w:color="auto"/>
+          <w:left w:val="single" w:sz="4" w:space="0" w:color="auto"/>
+          <w:bottom w:val="single" w:sz="4" w:space="0" w:color="auto"/>
+          <w:right w:val="single" w:sz="4" w:space="0" w:color="auto"/>
+          <w:insideH w:val="single" w:sz="4" w:space="0" w:color="auto"/>
+          <w:insideV w:val="single" w:sz="4" w:space="0" w:color="auto"/>
+        </w:tblBorders>
+        <w:tblLook w:val="04A0" w:firstRow="1" w:lastRow="0" w:firstColumn="1" w:lastColumn="0" w:noHBand="0" w:noVBand="1"/>
+      </w:tblPr>
+      <w:tblGrid>
+        <w:gridCol w:w="1972"/>
+        <w:gridCol w:w="7098"/>
+      </w:tblGrid>
+      <w:tr>
+        <w:trPr>
+          <w:tblHeader/>
+        </w:trPr>
+        <w:tc>
+          <w:tcPr>
+            <w:tcW w:w="1972" w:type="dxa"/>
+            <w:tcBorders>
+              <w:top w:val="single" w:sz="4" w:space="0" w:color="000000"/>
+              <w:left w:val="single" w:sz="4" w:space="0" w:color="000000"/>
+              <w:bottom w:val="single" w:sz="4" w:space="0" w:color="000000"/>
+              <w:right w:val="single" w:sz="4" w:space="0" w:color="000000"/>
+            </w:tcBorders>
+            <w:shd w:val="clear" w:color="auto" w:fill="D9D9D9"/>
+            <w:tcMar>
+              <w:top w:w="60" w:type="dxa"/>
+              <w:left w:w="90" w:type="dxa"/>
+              <w:bottom w:w="60" w:type="dxa"/>
+              <w:right w:w="90" w:type="dxa"/>
+            </w:tcMar>
+            <w:vAlign w:val="center"/>
+          </w:tcPr>
+          <w:p>
+            <w:r>
+              <w:rPr>
+                <w:b/>
+                <w:bCs/>
+                <w:sz w:val="20"/>
+                <w:szCs w:val="20"/>
+              </w:rPr>
+              <w:t>Usuario</w:t>
+            </w:r>
+          </w:p>
+        </w:tc>
+        <w:tc>
+          <w:tcPr>
+            <w:tcW w:w="7098" w:type="dxa"/>
+            <w:tcBorders>
+              <w:top w:val="single" w:sz="4" w:space="0" w:color="000000"/>
+              <w:left w:val="single" w:sz="4" w:space="0" w:color="000000"/>
+              <w:bottom w:val="single" w:sz="4" w:space="0" w:color="000000"/>
+              <w:right w:val="single" w:sz="4" w:space="0" w:color="000000"/>
+            </w:tcBorders>
+            <w:shd w:val="clear" w:color="auto" w:fill="D9D9D9"/>
+            <w:tcMar>
+              <w:top w:w="60" w:type="dxa"/>
+              <w:left w:w="90" w:type="dxa"/>
+              <w:bottom w:w="60" w:type="dxa"/>
+              <w:right w:w="90" w:type="dxa"/>
+            </w:tcMar>
+            <w:vAlign w:val="center"/>
+          </w:tcPr>
+          <w:p>
+            <w:r>
+              <w:rPr>
+                <w:b/>
+                <w:bCs/>
+                <w:sz w:val="20"/>
+                <w:szCs w:val="20"/>
+              </w:rPr>
+              <w:t>Para qué usará la app</w:t>
+            </w:r>
+          </w:p>
+        </w:tc>
+      </w:tr>
+      <w:tr>
+        <w:tc>
+          <w:tcPr>
+            <w:tcW w:w="1972" w:type="dxa"/>
+            <w:tcBorders>
+              <w:top w:val="single" w:sz="4" w:space="0" w:color="000000"/>
+              <w:left w:val="single" w:sz="4" w:space="0" w:color="000000"/>
+              <w:bottom w:val="single" w:sz="4" w:space="0" w:color="000000"/>
+              <w:right w:val="single" w:sz="4" w:space="0" w:color="000000"/>
+            </w:tcBorders>
+            <w:tcMar>
+              <w:top w:w="60" w:type="dxa"/>
+              <w:left w:w="90" w:type="dxa"/>
+              <w:bottom w:w="60" w:type="dxa"/>
+              <w:right w:w="90" w:type="dxa"/>
+            </w:tcMar>
+            <w:vAlign w:val="center"/>
+          </w:tcPr>
+          <w:p>
+            <w:r>
+              <w:rPr>
+                <w:sz w:val="20"/>
+                <w:szCs w:val="20"/>
+              </w:rPr>
+              <w:t>Cliente</w:t>
+            </w:r>
+          </w:p>
+        </w:tc>
+        <w:tc>
+          <w:tcPr>
+            <w:tcW w:w="7098" w:type="dxa"/>
+            <w:tcBorders>
+              <w:top w:val="single" w:sz="4" w:space="0" w:color="000000"/>
+              <w:left w:val="single" w:sz="4" w:space="0" w:color="000000"/>
+              <w:bottom w:val="single" w:sz="4" w:space="0" w:color="000000"/>
+              <w:right w:val="single" w:sz="4" w:space="0" w:color="000000"/>
+            </w:tcBorders>
+            <w:tcMar>
+              <w:top w:w="60" w:type="dxa"/>
+              <w:left w:w="90" w:type="dxa"/>
+              <w:bottom w:w="60" w:type="dxa"/>
+              <w:right w:w="90" w:type="dxa"/>
+            </w:tcMar>
+            <w:vAlign w:val="center"/>
+          </w:tcPr>
+          <w:p>
+            <w:r>
+              <w:rPr>
+                <w:sz w:val="20"/>
+                <w:szCs w:val="20"/>
+              </w:rPr>
+              <w:t>Registrarse o entrar (también con Google), buscar disponibilidad, reservar, ver y cancelar sus reservas, recibir avisos</w:t>
+            </w:r>
+          </w:p>
+        </w:tc>
+      </w:tr>
+      <w:tr>
+        <w:tc>
+          <w:tcPr>
+            <w:tcW w:w="1972" w:type="dxa"/>
+            <w:tcBorders>
+              <w:top w:val="single" w:sz="4" w:space="0" w:color="000000"/>
+              <w:left w:val="single" w:sz="4" w:space="0" w:color="000000"/>
+              <w:bottom w:val="single" w:sz="4" w:space="0" w:color="000000"/>
+              <w:right w:val="single" w:sz="4" w:space="0" w:color="000000"/>
+            </w:tcBorders>
+            <w:tcMar>
+              <w:top w:w="60" w:type="dxa"/>
+              <w:left w:w="90" w:type="dxa"/>
+              <w:bottom w:w="60" w:type="dxa"/>
+              <w:right w:w="90" w:type="dxa"/>
+            </w:tcMar>
+            <w:vAlign w:val="center"/>
+          </w:tcPr>
+          <w:p>
+            <w:r>
+              <w:rPr>
+                <w:sz w:val="20"/>
+                <w:szCs w:val="20"/>
+              </w:rPr>
+              <w:t>Recepcionista</w:t>
+            </w:r>
+          </w:p>
+        </w:tc>
+        <w:tc>
+          <w:tcPr>
+            <w:tcW w:w="7098" w:type="dxa"/>
+            <w:tcBorders>
+              <w:top w:val="single" w:sz="4" w:space="0" w:color="000000"/>
+              <w:left w:val="single" w:sz="4" w:space="0" w:color="000000"/>
+              <w:bottom w:val="single" w:sz="4" w:space="0" w:color="000000"/>
+              <w:right w:val="single" w:sz="4" w:space="0" w:color="000000"/>
+            </w:tcBorders>
+            <w:tcMar>
+              <w:top w:w="60" w:type="dxa"/>
+              <w:left w:w="90" w:type="dxa"/>
+              <w:bottom w:w="60" w:type="dxa"/>
+              <w:right w:w="90" w:type="dxa"/>
+            </w:tcMar>
+            <w:vAlign w:val="center"/>
+          </w:tcPr>
+          <w:p>
+            <w:r>
+              <w:rPr>
+                <w:sz w:val="20"/>
+                <w:szCs w:val="20"/>
+              </w:rPr>
+              <w:t>Ver llegadas y salidas del día, hacer check-in y check-out desde el lobby, cambiar el estado de una habitación, registrar placas en la cochera</w:t>
+            </w:r>
+          </w:p>
+        </w:tc>
+      </w:tr>
+      <w:tr>
+        <w:tc>
+          <w:tcPr>
+            <w:tcW w:w="1972" w:type="dxa"/>
+            <w:tcBorders>
+              <w:top w:val="single" w:sz="4" w:space="0" w:color="000000"/>
+              <w:left w:val="single" w:sz="4" w:space="0" w:color="000000"/>
+              <w:bottom w:val="single" w:sz="4" w:space="0" w:color="000000"/>
+              <w:right w:val="single" w:sz="4" w:space="0" w:color="000000"/>
+            </w:tcBorders>
+            <w:tcMar>
+              <w:top w:w="60" w:type="dxa"/>
+              <w:left w:w="90" w:type="dxa"/>
+              <w:bottom w:w="60" w:type="dxa"/>
+              <w:right w:w="90" w:type="dxa"/>
+            </w:tcMar>
+            <w:vAlign w:val="center"/>
+          </w:tcPr>
+          <w:p>
+            <w:r>
+              <w:rPr>
+                <w:sz w:val="20"/>
+                <w:szCs w:val="20"/>
+              </w:rPr>
+              <w:t>Almacenero</w:t>
+            </w:r>
+          </w:p>
+        </w:tc>
+        <w:tc>
+          <w:tcPr>
+            <w:tcW w:w="7098" w:type="dxa"/>
+            <w:tcBorders>
+              <w:top w:val="single" w:sz="4" w:space="0" w:color="000000"/>
+              <w:left w:val="single" w:sz="4" w:space="0" w:color="000000"/>
+              <w:bottom w:val="single" w:sz="4" w:space="0" w:color="000000"/>
+              <w:right w:val="single" w:sz="4" w:space="0" w:color="000000"/>
+            </w:tcBorders>
+            <w:tcMar>
+              <w:top w:w="60" w:type="dxa"/>
+              <w:left w:w="90" w:type="dxa"/>
+              <w:bottom w:w="60" w:type="dxa"/>
+              <w:right w:w="90" w:type="dxa"/>
+            </w:tcMar>
+            <w:vAlign w:val="center"/>
+          </w:tcPr>
+          <w:p>
+            <w:r>
+              <w:rPr>
+                <w:sz w:val="20"/>
+                <w:szCs w:val="20"/>
+              </w:rPr>
+              <w:t>Registrar entradas y salidas de inventario en el almacén y ver los insumos bajo el mínimo</w:t>
+            </w:r>
+          </w:p>
+        </w:tc>
+      </w:tr>
+      <w:tr>
+        <w:tc>
+          <w:tcPr>
+            <w:tcW w:w="1972" w:type="dxa"/>
+            <w:tcBorders>
+              <w:top w:val="single" w:sz="4" w:space="0" w:color="000000"/>
+              <w:left w:val="single" w:sz="4" w:space="0" w:color="000000"/>
+              <w:bottom w:val="single" w:sz="4" w:space="0" w:color="000000"/>
+              <w:right w:val="single" w:sz="4" w:space="0" w:color="000000"/>
+            </w:tcBorders>
+            <w:tcMar>
+              <w:top w:w="60" w:type="dxa"/>
+              <w:left w:w="90" w:type="dxa"/>
+              <w:bottom w:w="60" w:type="dxa"/>
+              <w:right w:w="90" w:type="dxa"/>
+            </w:tcMar>
+            <w:vAlign w:val="center"/>
+          </w:tcPr>
+          <w:p>
+            <w:r>
+              <w:rPr>
+                <w:sz w:val="20"/>
+                <w:szCs w:val="20"/>
+              </w:rPr>
+              <w:t>Administrador</w:t>
+            </w:r>
+          </w:p>
+        </w:tc>
+        <w:tc>
+          <w:tcPr>
+            <w:tcW w:w="7098" w:type="dxa"/>
+            <w:tcBorders>
+              <w:top w:val="single" w:sz="4" w:space="0" w:color="000000"/>
+              <w:left w:val="single" w:sz="4" w:space="0" w:color="000000"/>
+              <w:bottom w:val="single" w:sz="4" w:space="0" w:color="000000"/>
+              <w:right w:val="single" w:sz="4" w:space="0" w:color="000000"/>
+            </w:tcBorders>
+            <w:tcMar>
+              <w:top w:w="60" w:type="dxa"/>
+              <w:left w:w="90" w:type="dxa"/>
+              <w:bottom w:w="60" w:type="dxa"/>
+              <w:right w:w="90" w:type="dxa"/>
+            </w:tcMar>
+            <w:vAlign w:val="center"/>
+          </w:tcPr>
+          <w:p>
+            <w:r>
+              <w:rPr>
+                <w:sz w:val="20"/>
+                <w:szCs w:val="20"/>
+              </w:rPr>
+              <w:t>Ver el panel resumido (ocupación, ingresos, alertas). La gestión completa sigue en la web</w:t>
+            </w:r>
+          </w:p>
+        </w:tc>
+      </w:tr>
+    </w:tbl>
+    <w:p>
+      <w:pPr>
+        <w:spacing w:after="80"/>
+      </w:pPr>
+    </w:p>
+    <w:p>
+      <w:pPr>
+        <w:spacing w:after="120" w:line="300" w:lineRule="auto"/>
+      </w:pPr>
+      <w:r>
+        <w:rPr>
+          <w:b/>
+          <w:bCs/>
+        </w:rPr>
+        <w:t xml:space="preserve">Tecnología elegida: </w:t>
+      </w:r>
+      <w:r>
+        <w:t>React Native con Expo y TypeScript. Con un solo código se generan las dos aplicaciones y se reutiliza lo que el equipo ya usa en la web: React, TypeScript, TanStack Query, Axios y los mismos tipos de datos.</w:t>
+      </w:r>
+    </w:p>
+    <w:tbl>
+      <w:tblPr>
+        <w:tblW w:w="9070" w:type="dxa"/>
+        <w:tblBorders>
+          <w:top w:val="single" w:sz="4" w:space="0" w:color="auto"/>
+          <w:left w:val="single" w:sz="4" w:space="0" w:color="auto"/>
+          <w:bottom w:val="single" w:sz="4" w:space="0" w:color="auto"/>
+          <w:right w:val="single" w:sz="4" w:space="0" w:color="auto"/>
+          <w:insideH w:val="single" w:sz="4" w:space="0" w:color="auto"/>
+          <w:insideV w:val="single" w:sz="4" w:space="0" w:color="auto"/>
+        </w:tblBorders>
+        <w:tblLook w:val="04A0" w:firstRow="1" w:lastRow="0" w:firstColumn="1" w:lastColumn="0" w:noHBand="0" w:noVBand="1"/>
+      </w:tblPr>
+      <w:tblGrid>
+        <w:gridCol w:w="1977"/>
+        <w:gridCol w:w="3037"/>
+        <w:gridCol w:w="2742"/>
+        <w:gridCol w:w="1314"/>
+      </w:tblGrid>
+      <w:tr>
+        <w:trPr>
+          <w:tblHeader/>
+        </w:trPr>
+        <w:tc>
+          <w:tcPr>
+            <w:tcW w:w="1998" w:type="dxa"/>
+            <w:tcBorders>
+              <w:top w:val="single" w:sz="4" w:space="0" w:color="000000"/>
+              <w:left w:val="single" w:sz="4" w:space="0" w:color="000000"/>
+              <w:bottom w:val="single" w:sz="4" w:space="0" w:color="000000"/>
+              <w:right w:val="single" w:sz="4" w:space="0" w:color="000000"/>
+            </w:tcBorders>
+            <w:shd w:val="clear" w:color="auto" w:fill="D9D9D9"/>
+            <w:tcMar>
+              <w:top w:w="60" w:type="dxa"/>
+              <w:left w:w="90" w:type="dxa"/>
+              <w:bottom w:w="60" w:type="dxa"/>
+              <w:right w:w="90" w:type="dxa"/>
+            </w:tcMar>
+            <w:vAlign w:val="center"/>
+          </w:tcPr>
+          <w:p>
+            <w:r>
+              <w:rPr>
+                <w:b/>
+                <w:bCs/>
+                <w:sz w:val="20"/>
+                <w:szCs w:val="20"/>
+              </w:rPr>
+              <w:t>Opción</w:t>
+            </w:r>
+          </w:p>
+        </w:tc>
+        <w:tc>
+          <w:tcPr>
+            <w:tcW w:w="3075" w:type="dxa"/>
+            <w:tcBorders>
+              <w:top w:val="single" w:sz="4" w:space="0" w:color="000000"/>
+              <w:left w:val="single" w:sz="4" w:space="0" w:color="000000"/>
+              <w:bottom w:val="single" w:sz="4" w:space="0" w:color="000000"/>
+              <w:right w:val="single" w:sz="4" w:space="0" w:color="000000"/>
+            </w:tcBorders>
+            <w:shd w:val="clear" w:color="auto" w:fill="D9D9D9"/>
+            <w:tcMar>
+              <w:top w:w="60" w:type="dxa"/>
+              <w:left w:w="90" w:type="dxa"/>
+              <w:bottom w:w="60" w:type="dxa"/>
+              <w:right w:w="90" w:type="dxa"/>
+            </w:tcMar>
+            <w:vAlign w:val="center"/>
+          </w:tcPr>
+          <w:p>
+            <w:r>
+              <w:rPr>
+                <w:b/>
+                <w:bCs/>
+                <w:sz w:val="20"/>
+                <w:szCs w:val="20"/>
+              </w:rPr>
+              <w:t>A favor</w:t>
+            </w:r>
+          </w:p>
+        </w:tc>
+        <w:tc>
+          <w:tcPr>
+            <w:tcW w:w="2767" w:type="dxa"/>
+            <w:tcBorders>
+              <w:top w:val="single" w:sz="4" w:space="0" w:color="000000"/>
+              <w:left w:val="single" w:sz="4" w:space="0" w:color="000000"/>
+              <w:bottom w:val="single" w:sz="4" w:space="0" w:color="000000"/>
+              <w:right w:val="single" w:sz="4" w:space="0" w:color="000000"/>
+            </w:tcBorders>
+            <w:shd w:val="clear" w:color="auto" w:fill="D9D9D9"/>
+            <w:tcMar>
+              <w:top w:w="60" w:type="dxa"/>
+              <w:left w:w="90" w:type="dxa"/>
+              <w:bottom w:w="60" w:type="dxa"/>
+              <w:right w:w="90" w:type="dxa"/>
+            </w:tcMar>
+            <w:vAlign w:val="center"/>
+          </w:tcPr>
+          <w:p>
+            <w:r>
+              <w:rPr>
+                <w:b/>
+                <w:bCs/>
+                <w:sz w:val="20"/>
+                <w:szCs w:val="20"/>
+              </w:rPr>
+              <w:t>En contra</w:t>
+            </w:r>
+          </w:p>
+        </w:tc>
+        <w:tc>
+          <w:tcPr>
+            <w:tcW w:w="1230" w:type="dxa"/>
+            <w:tcBorders>
+              <w:top w:val="single" w:sz="4" w:space="0" w:color="000000"/>
+              <w:left w:val="single" w:sz="4" w:space="0" w:color="000000"/>
+              <w:bottom w:val="single" w:sz="4" w:space="0" w:color="000000"/>
+              <w:right w:val="single" w:sz="4" w:space="0" w:color="000000"/>
+            </w:tcBorders>
+            <w:shd w:val="clear" w:color="auto" w:fill="D9D9D9"/>
+            <w:tcMar>
+              <w:top w:w="60" w:type="dxa"/>
+              <w:left w:w="90" w:type="dxa"/>
+              <w:bottom w:w="60" w:type="dxa"/>
+              <w:right w:w="90" w:type="dxa"/>
+            </w:tcMar>
+            <w:vAlign w:val="center"/>
+          </w:tcPr>
+          <w:p>
+            <w:r>
+              <w:rPr>
+                <w:b/>
+                <w:bCs/>
+                <w:sz w:val="20"/>
+                <w:szCs w:val="20"/>
+              </w:rPr>
+              <w:t>Decisión</w:t>
+            </w:r>
+          </w:p>
+        </w:tc>
+      </w:tr>
+      <w:tr>
+        <w:tc>
+          <w:tcPr>
+            <w:tcW w:w="1998" w:type="dxa"/>
+            <w:tcBorders>
+              <w:top w:val="single" w:sz="4" w:space="0" w:color="000000"/>
+              <w:left w:val="single" w:sz="4" w:space="0" w:color="000000"/>
+              <w:bottom w:val="single" w:sz="4" w:space="0" w:color="000000"/>
+              <w:right w:val="single" w:sz="4" w:space="0" w:color="000000"/>
+            </w:tcBorders>
+            <w:tcMar>
+              <w:top w:w="60" w:type="dxa"/>
+              <w:left w:w="90" w:type="dxa"/>
+              <w:bottom w:w="60" w:type="dxa"/>
+              <w:right w:w="90" w:type="dxa"/>
+            </w:tcMar>
+            <w:vAlign w:val="center"/>
+          </w:tcPr>
+          <w:p>
+            <w:r>
+              <w:rPr>
+                <w:sz w:val="20"/>
+                <w:szCs w:val="20"/>
+              </w:rPr>
+              <w:t>React Native + Expo</w:t>
+            </w:r>
+          </w:p>
+        </w:tc>
+        <w:tc>
+          <w:tcPr>
+            <w:tcW w:w="3075" w:type="dxa"/>
+            <w:tcBorders>
+              <w:top w:val="single" w:sz="4" w:space="0" w:color="000000"/>
+              <w:left w:val="single" w:sz="4" w:space="0" w:color="000000"/>
+              <w:bottom w:val="single" w:sz="4" w:space="0" w:color="000000"/>
+              <w:right w:val="single" w:sz="4" w:space="0" w:color="000000"/>
+            </w:tcBorders>
+            <w:tcMar>
+              <w:top w:w="60" w:type="dxa"/>
+              <w:left w:w="90" w:type="dxa"/>
+              <w:bottom w:w="60" w:type="dxa"/>
+              <w:right w:w="90" w:type="dxa"/>
+            </w:tcMar>
+            <w:vAlign w:val="center"/>
+          </w:tcPr>
+          <w:p>
+            <w:r>
+              <w:rPr>
+                <w:sz w:val="20"/>
+                <w:szCs w:val="20"/>
+              </w:rPr>
+              <w:t>Un código para Android e iOS; mismo lenguaje y librerías que la web; compila iOS en la nube sin Mac (EAS Build)</w:t>
+            </w:r>
+          </w:p>
+        </w:tc>
+        <w:tc>
+          <w:tcPr>
+            <w:tcW w:w="2767" w:type="dxa"/>
+            <w:tcBorders>
+              <w:top w:val="single" w:sz="4" w:space="0" w:color="000000"/>
+              <w:left w:val="single" w:sz="4" w:space="0" w:color="000000"/>
+              <w:bottom w:val="single" w:sz="4" w:space="0" w:color="000000"/>
+              <w:right w:val="single" w:sz="4" w:space="0" w:color="000000"/>
+            </w:tcBorders>
+            <w:tcMar>
+              <w:top w:w="60" w:type="dxa"/>
+              <w:left w:w="90" w:type="dxa"/>
+              <w:bottom w:w="60" w:type="dxa"/>
+              <w:right w:w="90" w:type="dxa"/>
+            </w:tcMar>
+            <w:vAlign w:val="center"/>
+          </w:tcPr>
+          <w:p>
+            <w:r>
+              <w:rPr>
+                <w:sz w:val="20"/>
+                <w:szCs w:val="20"/>
+              </w:rPr>
+              <w:t>Funciones nativas muy específicas requieren módulos propios</w:t>
+            </w:r>
+          </w:p>
+        </w:tc>
+        <w:tc>
+          <w:tcPr>
+            <w:tcW w:w="1230" w:type="dxa"/>
+            <w:tcBorders>
+              <w:top w:val="single" w:sz="4" w:space="0" w:color="000000"/>
+              <w:left w:val="single" w:sz="4" w:space="0" w:color="000000"/>
+              <w:bottom w:val="single" w:sz="4" w:space="0" w:color="000000"/>
+              <w:right w:val="single" w:sz="4" w:space="0" w:color="000000"/>
+            </w:tcBorders>
+            <w:tcMar>
+              <w:top w:w="60" w:type="dxa"/>
+              <w:left w:w="90" w:type="dxa"/>
+              <w:bottom w:w="60" w:type="dxa"/>
+              <w:right w:w="90" w:type="dxa"/>
+            </w:tcMar>
+            <w:vAlign w:val="center"/>
+          </w:tcPr>
+          <w:p>
+            <w:r>
+              <w:rPr>
+                <w:sz w:val="20"/>
+                <w:szCs w:val="20"/>
+              </w:rPr>
+              <w:t>Elegida</w:t>
+            </w:r>
+          </w:p>
+        </w:tc>
+      </w:tr>
+      <w:tr>
+        <w:tc>
+          <w:tcPr>
+            <w:tcW w:w="1998" w:type="dxa"/>
+            <w:tcBorders>
+              <w:top w:val="single" w:sz="4" w:space="0" w:color="000000"/>
+              <w:left w:val="single" w:sz="4" w:space="0" w:color="000000"/>
+              <w:bottom w:val="single" w:sz="4" w:space="0" w:color="000000"/>
+              <w:right w:val="single" w:sz="4" w:space="0" w:color="000000"/>
+            </w:tcBorders>
+            <w:tcMar>
+              <w:top w:w="60" w:type="dxa"/>
+              <w:left w:w="90" w:type="dxa"/>
+              <w:bottom w:w="60" w:type="dxa"/>
+              <w:right w:w="90" w:type="dxa"/>
+            </w:tcMar>
+            <w:vAlign w:val="center"/>
+          </w:tcPr>
+          <w:p>
+            <w:r>
+              <w:rPr>
+                <w:sz w:val="20"/>
+                <w:szCs w:val="20"/>
+              </w:rPr>
+              <w:t>Flutter</w:t>
+            </w:r>
+          </w:p>
+        </w:tc>
+        <w:tc>
+          <w:tcPr>
+            <w:tcW w:w="3075" w:type="dxa"/>
+            <w:tcBorders>
+              <w:top w:val="single" w:sz="4" w:space="0" w:color="000000"/>
+              <w:left w:val="single" w:sz="4" w:space="0" w:color="000000"/>
+              <w:bottom w:val="single" w:sz="4" w:space="0" w:color="000000"/>
+              <w:right w:val="single" w:sz="4" w:space="0" w:color="000000"/>
+            </w:tcBorders>
+            <w:tcMar>
+              <w:top w:w="60" w:type="dxa"/>
+              <w:left w:w="90" w:type="dxa"/>
+              <w:bottom w:w="60" w:type="dxa"/>
+              <w:right w:w="90" w:type="dxa"/>
+            </w:tcMar>
+            <w:vAlign w:val="center"/>
+          </w:tcPr>
+          <w:p>
+            <w:r>
+              <w:rPr>
+                <w:sz w:val="20"/>
+                <w:szCs w:val="20"/>
+              </w:rPr>
+              <w:t>Buen rendimiento y diseño uniforme</w:t>
+            </w:r>
+          </w:p>
+        </w:tc>
+        <w:tc>
+          <w:tcPr>
+            <w:tcW w:w="2767" w:type="dxa"/>
+            <w:tcBorders>
+              <w:top w:val="single" w:sz="4" w:space="0" w:color="000000"/>
+              <w:left w:val="single" w:sz="4" w:space="0" w:color="000000"/>
+              <w:bottom w:val="single" w:sz="4" w:space="0" w:color="000000"/>
+              <w:right w:val="single" w:sz="4" w:space="0" w:color="000000"/>
+            </w:tcBorders>
+            <w:tcMar>
+              <w:top w:w="60" w:type="dxa"/>
+              <w:left w:w="90" w:type="dxa"/>
+              <w:bottom w:w="60" w:type="dxa"/>
+              <w:right w:w="90" w:type="dxa"/>
+            </w:tcMar>
+            <w:vAlign w:val="center"/>
+          </w:tcPr>
+          <w:p>
+            <w:r>
+              <w:rPr>
+                <w:sz w:val="20"/>
+                <w:szCs w:val="20"/>
+              </w:rPr>
+              <w:t>Otro lenguaje (Dart): no se reutiliza nada de la web</w:t>
+            </w:r>
+          </w:p>
+        </w:tc>
+        <w:tc>
+          <w:tcPr>
+            <w:tcW w:w="1230" w:type="dxa"/>
+            <w:tcBorders>
+              <w:top w:val="single" w:sz="4" w:space="0" w:color="000000"/>
+              <w:left w:val="single" w:sz="4" w:space="0" w:color="000000"/>
+              <w:bottom w:val="single" w:sz="4" w:space="0" w:color="000000"/>
+              <w:right w:val="single" w:sz="4" w:space="0" w:color="000000"/>
+            </w:tcBorders>
+            <w:tcMar>
+              <w:top w:w="60" w:type="dxa"/>
+              <w:left w:w="90" w:type="dxa"/>
+              <w:bottom w:w="60" w:type="dxa"/>
+              <w:right w:w="90" w:type="dxa"/>
+            </w:tcMar>
+            <w:vAlign w:val="center"/>
+          </w:tcPr>
+          <w:p>
+            <w:r>
+              <w:rPr>
+                <w:sz w:val="20"/>
+                <w:szCs w:val="20"/>
+              </w:rPr>
+              <w:t>Descartada</w:t>
+            </w:r>
+          </w:p>
+        </w:tc>
+      </w:tr>
+      <w:tr>
+        <w:tc>
+          <w:tcPr>
+            <w:tcW w:w="1998" w:type="dxa"/>
+            <w:tcBorders>
+              <w:top w:val="single" w:sz="4" w:space="0" w:color="000000"/>
+              <w:left w:val="single" w:sz="4" w:space="0" w:color="000000"/>
+              <w:bottom w:val="single" w:sz="4" w:space="0" w:color="000000"/>
+              <w:right w:val="single" w:sz="4" w:space="0" w:color="000000"/>
+            </w:tcBorders>
+            <w:tcMar>
+              <w:top w:w="60" w:type="dxa"/>
+              <w:left w:w="90" w:type="dxa"/>
+              <w:bottom w:w="60" w:type="dxa"/>
+              <w:right w:w="90" w:type="dxa"/>
+            </w:tcMar>
+            <w:vAlign w:val="center"/>
+          </w:tcPr>
+          <w:p>
+            <w:r>
+              <w:rPr>
+                <w:sz w:val="20"/>
+                <w:szCs w:val="20"/>
+              </w:rPr>
+              <w:t>Nativo (Kotlin + Swift)</w:t>
+            </w:r>
+          </w:p>
+        </w:tc>
+        <w:tc>
+          <w:tcPr>
+            <w:tcW w:w="3075" w:type="dxa"/>
+            <w:tcBorders>
+              <w:top w:val="single" w:sz="4" w:space="0" w:color="000000"/>
+              <w:left w:val="single" w:sz="4" w:space="0" w:color="000000"/>
+              <w:bottom w:val="single" w:sz="4" w:space="0" w:color="000000"/>
+              <w:right w:val="single" w:sz="4" w:space="0" w:color="000000"/>
+            </w:tcBorders>
+            <w:tcMar>
+              <w:top w:w="60" w:type="dxa"/>
+              <w:left w:w="90" w:type="dxa"/>
+              <w:bottom w:w="60" w:type="dxa"/>
+              <w:right w:w="90" w:type="dxa"/>
+            </w:tcMar>
+            <w:vAlign w:val="center"/>
+          </w:tcPr>
+          <w:p>
+            <w:r>
+              <w:rPr>
+                <w:sz w:val="20"/>
+                <w:szCs w:val="20"/>
+              </w:rPr>
+              <w:t>Acceso total al sistema</w:t>
+            </w:r>
+          </w:p>
+        </w:tc>
+        <w:tc>
+          <w:tcPr>
+            <w:tcW w:w="2767" w:type="dxa"/>
+            <w:tcBorders>
+              <w:top w:val="single" w:sz="4" w:space="0" w:color="000000"/>
+              <w:left w:val="single" w:sz="4" w:space="0" w:color="000000"/>
+              <w:bottom w:val="single" w:sz="4" w:space="0" w:color="000000"/>
+              <w:right w:val="single" w:sz="4" w:space="0" w:color="000000"/>
+            </w:tcBorders>
+            <w:tcMar>
+              <w:top w:w="60" w:type="dxa"/>
+              <w:left w:w="90" w:type="dxa"/>
+              <w:bottom w:w="60" w:type="dxa"/>
+              <w:right w:w="90" w:type="dxa"/>
+            </w:tcMar>
+            <w:vAlign w:val="center"/>
+          </w:tcPr>
+          <w:p>
+            <w:r>
+              <w:rPr>
+                <w:sz w:val="20"/>
+                <w:szCs w:val="20"/>
+              </w:rPr>
+              <w:t>Dos aplicaciones distintas: el doble de trabajo para 4 personas</w:t>
+            </w:r>
+          </w:p>
+        </w:tc>
+        <w:tc>
+          <w:tcPr>
+            <w:tcW w:w="1230" w:type="dxa"/>
+            <w:tcBorders>
+              <w:top w:val="single" w:sz="4" w:space="0" w:color="000000"/>
+              <w:left w:val="single" w:sz="4" w:space="0" w:color="000000"/>
+              <w:bottom w:val="single" w:sz="4" w:space="0" w:color="000000"/>
+              <w:right w:val="single" w:sz="4" w:space="0" w:color="000000"/>
+            </w:tcBorders>
+            <w:tcMar>
+              <w:top w:w="60" w:type="dxa"/>
+              <w:left w:w="90" w:type="dxa"/>
+              <w:bottom w:w="60" w:type="dxa"/>
+              <w:right w:w="90" w:type="dxa"/>
+            </w:tcMar>
+            <w:vAlign w:val="center"/>
+          </w:tcPr>
+          <w:p>
+            <w:r>
+              <w:rPr>
+                <w:sz w:val="20"/>
+                <w:szCs w:val="20"/>
+              </w:rPr>
+              <w:t>Descartada</w:t>
+            </w:r>
+          </w:p>
+        </w:tc>
+      </w:tr>
+      <w:tr>
+        <w:tc>
+          <w:tcPr>
+            <w:tcW w:w="1998" w:type="dxa"/>
+            <w:tcBorders>
+              <w:top w:val="single" w:sz="4" w:space="0" w:color="000000"/>
+              <w:left w:val="single" w:sz="4" w:space="0" w:color="000000"/>
+              <w:bottom w:val="single" w:sz="4" w:space="0" w:color="000000"/>
+              <w:right w:val="single" w:sz="4" w:space="0" w:color="000000"/>
+            </w:tcBorders>
+            <w:tcMar>
+              <w:top w:w="60" w:type="dxa"/>
+              <w:left w:w="90" w:type="dxa"/>
+              <w:bottom w:w="60" w:type="dxa"/>
+              <w:right w:w="90" w:type="dxa"/>
+            </w:tcMar>
+            <w:vAlign w:val="center"/>
+          </w:tcPr>
+          <w:p>
+            <w:r>
+              <w:rPr>
+                <w:sz w:val="20"/>
+                <w:szCs w:val="20"/>
+              </w:rPr>
+              <w:t>Web instalable (PWA)</w:t>
+            </w:r>
+          </w:p>
+        </w:tc>
+        <w:tc>
+          <w:tcPr>
+            <w:tcW w:w="3075" w:type="dxa"/>
+            <w:tcBorders>
+              <w:top w:val="single" w:sz="4" w:space="0" w:color="000000"/>
+              <w:left w:val="single" w:sz="4" w:space="0" w:color="000000"/>
+              <w:bottom w:val="single" w:sz="4" w:space="0" w:color="000000"/>
+              <w:right w:val="single" w:sz="4" w:space="0" w:color="000000"/>
+            </w:tcBorders>
+            <w:tcMar>
+              <w:top w:w="60" w:type="dxa"/>
+              <w:left w:w="90" w:type="dxa"/>
+              <w:bottom w:w="60" w:type="dxa"/>
+              <w:right w:w="90" w:type="dxa"/>
+            </w:tcMar>
+            <w:vAlign w:val="center"/>
+          </w:tcPr>
+          <w:p>
+            <w:r>
+              <w:rPr>
+                <w:sz w:val="20"/>
+                <w:szCs w:val="20"/>
+              </w:rPr>
+              <w:t>Sin código nuevo</w:t>
+            </w:r>
+          </w:p>
+        </w:tc>
+        <w:tc>
+          <w:tcPr>
+            <w:tcW w:w="2767" w:type="dxa"/>
+            <w:tcBorders>
+              <w:top w:val="single" w:sz="4" w:space="0" w:color="000000"/>
+              <w:left w:val="single" w:sz="4" w:space="0" w:color="000000"/>
+              <w:bottom w:val="single" w:sz="4" w:space="0" w:color="000000"/>
+              <w:right w:val="single" w:sz="4" w:space="0" w:color="000000"/>
+            </w:tcBorders>
+            <w:tcMar>
+              <w:top w:w="60" w:type="dxa"/>
+              <w:left w:w="90" w:type="dxa"/>
+              <w:bottom w:w="60" w:type="dxa"/>
+              <w:right w:w="90" w:type="dxa"/>
+            </w:tcMar>
+            <w:vAlign w:val="center"/>
+          </w:tcPr>
+          <w:p>
+            <w:r>
+              <w:rPr>
+                <w:sz w:val="20"/>
+                <w:szCs w:val="20"/>
+              </w:rPr>
+              <w:t xml:space="preserve">Notificaciones y almacenamiento seguro </w:t>
+            </w:r>
+            <w:r>
+              <w:rPr>
+                <w:sz w:val="20"/>
+                <w:szCs w:val="20"/>
+              </w:rPr>
+              <w:lastRenderedPageBreak/>
+              <w:t>limitados en iOS; no está en las tiendas</w:t>
+            </w:r>
+          </w:p>
+        </w:tc>
+        <w:tc>
+          <w:tcPr>
+            <w:tcW w:w="1230" w:type="dxa"/>
+            <w:tcBorders>
+              <w:top w:val="single" w:sz="4" w:space="0" w:color="000000"/>
+              <w:left w:val="single" w:sz="4" w:space="0" w:color="000000"/>
+              <w:bottom w:val="single" w:sz="4" w:space="0" w:color="000000"/>
+              <w:right w:val="single" w:sz="4" w:space="0" w:color="000000"/>
+            </w:tcBorders>
+            <w:tcMar>
+              <w:top w:w="60" w:type="dxa"/>
+              <w:left w:w="90" w:type="dxa"/>
+              <w:bottom w:w="60" w:type="dxa"/>
+              <w:right w:w="90" w:type="dxa"/>
+            </w:tcMar>
+            <w:vAlign w:val="center"/>
+          </w:tcPr>
+          <w:p>
+            <w:r>
+              <w:rPr>
+                <w:sz w:val="20"/>
+                <w:szCs w:val="20"/>
+              </w:rPr>
+              <w:lastRenderedPageBreak/>
+              <w:t>Complemento</w:t>
+            </w:r>
+          </w:p>
+        </w:tc>
+      </w:tr>
+    </w:tbl>
+    <w:p>
+      <w:pPr>
+        <w:spacing w:after="80"/>
+      </w:pPr>
+    </w:p>
+    <w:p>
+      <w:pPr>
+        <w:keepNext/>
+        <w:spacing w:after="60"/>
+        <w:jc w:val="center"/>
+      </w:pPr>
+      <w:r>
+        <w:rPr>
+          <w:noProof/>
+        </w:rPr>
+        <w:drawing>
+          <wp:inline distT="0" distB="0" distL="0" distR="0" wp14:anchorId="7018B78E" wp14:editId="7F46BB84">
+            <wp:extent cx="5762625" cy="2733675"/>
+            <wp:effectExtent l="0" t="0" r="0" b="0"/>
+            <wp:docPr id="14" name="Imagen 14"/>
+            <wp:cNvGraphicFramePr>
+              <a:graphicFrameLocks xmlns:a="http://schemas.openxmlformats.org/drawingml/2006/main" noChangeAspect="1"/>
+            </wp:cNvGraphicFramePr>
+            <a:graphic xmlns:a="http://schemas.openxmlformats.org/drawingml/2006/main">
+              <a:graphicData uri="http://schemas.openxmlformats.org/drawingml/2006/picture">
+                <pic:pic xmlns:pic="http://schemas.openxmlformats.org/drawingml/2006/picture">
+                  <pic:nvPicPr>
+                    <pic:cNvPr id="0" name=""/>
+                    <pic:cNvPicPr>
+                      <a:picLocks noChangeAspect="1" noChangeArrowheads="1"/>
+                    </pic:cNvPicPr>
+                  </pic:nvPicPr>
+                  <pic:blipFill>
+                    <a:blip r:embed="rId21"/>
+                    <a:srcRect/>
+                    <a:stretch>
+                      <a:fillRect/>
+                    </a:stretch>
+                  </pic:blipFill>
+                  <pic:spPr bwMode="auto">
+                    <a:xfrm>
+                      <a:off x="0" y="0"/>
+                      <a:ext cx="5762625" cy="2733675"/>
+                    </a:xfrm>
+                    <a:prstGeom prst="rect">
+                      <a:avLst/>
+                    </a:prstGeom>
+                  </pic:spPr>
+                </pic:pic>
+              </a:graphicData>
+            </a:graphic>
+          </wp:inline>
+        </w:drawing>
+      </w:r>
+    </w:p>
+    <w:p>
+      <w:pPr>
+        <w:spacing w:after="200"/>
+        <w:jc w:val="center"/>
+      </w:pPr>
+      <w:r>
+        <w:rPr>
+          <w:i/>
+          <w:iCs/>
+          <w:sz w:val="20"/>
+          <w:szCs w:val="20"/>
+        </w:rPr>
+        <w:t>Figura 12. Arquitectura de la aplicación móvil: misma API y notificaciones por FCM (Android) y APNs (iOS).</w:t>
+      </w:r>
+    </w:p>
+    <w:tbl>
+      <w:tblPr>
+        <w:tblW w:w="9070" w:type="dxa"/>
+        <w:tblBorders>
+          <w:top w:val="single" w:sz="4" w:space="0" w:color="auto"/>
+          <w:left w:val="single" w:sz="4" w:space="0" w:color="auto"/>
+          <w:bottom w:val="single" w:sz="4" w:space="0" w:color="auto"/>
+          <w:right w:val="single" w:sz="4" w:space="0" w:color="auto"/>
+          <w:insideH w:val="single" w:sz="4" w:space="0" w:color="auto"/>
+          <w:insideV w:val="single" w:sz="4" w:space="0" w:color="auto"/>
+        </w:tblBorders>
+        <w:tblLook w:val="04A0" w:firstRow="1" w:lastRow="0" w:firstColumn="1" w:lastColumn="0" w:noHBand="0" w:noVBand="1"/>
+      </w:tblPr>
+      <w:tblGrid>
+        <w:gridCol w:w="2069"/>
+        <w:gridCol w:w="4296"/>
+        <w:gridCol w:w="2705"/>
+      </w:tblGrid>
+      <w:tr>
+        <w:trPr>
+          <w:tblHeader/>
+        </w:trPr>
+        <w:tc>
+          <w:tcPr>
+            <w:tcW w:w="2069" w:type="dxa"/>
+            <w:tcBorders>
+              <w:top w:val="single" w:sz="4" w:space="0" w:color="000000"/>
+              <w:left w:val="single" w:sz="4" w:space="0" w:color="000000"/>
+              <w:bottom w:val="single" w:sz="4" w:space="0" w:color="000000"/>
+              <w:right w:val="single" w:sz="4" w:space="0" w:color="000000"/>
+            </w:tcBorders>
+            <w:shd w:val="clear" w:color="auto" w:fill="D9D9D9"/>
+            <w:tcMar>
+              <w:top w:w="60" w:type="dxa"/>
+              <w:left w:w="90" w:type="dxa"/>
+              <w:bottom w:w="60" w:type="dxa"/>
+              <w:right w:w="90" w:type="dxa"/>
+            </w:tcMar>
+            <w:vAlign w:val="center"/>
+          </w:tcPr>
+          <w:p>
+            <w:r>
+              <w:rPr>
+                <w:b/>
+                <w:bCs/>
+                <w:sz w:val="20"/>
+                <w:szCs w:val="20"/>
+              </w:rPr>
+              <w:t>Necesidad</w:t>
+            </w:r>
+          </w:p>
+        </w:tc>
+        <w:tc>
+          <w:tcPr>
+            <w:tcW w:w="4296" w:type="dxa"/>
+            <w:tcBorders>
+              <w:top w:val="single" w:sz="4" w:space="0" w:color="000000"/>
+              <w:left w:val="single" w:sz="4" w:space="0" w:color="000000"/>
+              <w:bottom w:val="single" w:sz="4" w:space="0" w:color="000000"/>
+              <w:right w:val="single" w:sz="4" w:space="0" w:color="000000"/>
+            </w:tcBorders>
+            <w:shd w:val="clear" w:color="auto" w:fill="D9D9D9"/>
+            <w:tcMar>
+              <w:top w:w="60" w:type="dxa"/>
+              <w:left w:w="90" w:type="dxa"/>
+              <w:bottom w:w="60" w:type="dxa"/>
+              <w:right w:w="90" w:type="dxa"/>
+            </w:tcMar>
+            <w:vAlign w:val="center"/>
+          </w:tcPr>
+          <w:p>
+            <w:r>
+              <w:rPr>
+                <w:b/>
+                <w:bCs/>
+                <w:sz w:val="20"/>
+                <w:szCs w:val="20"/>
+              </w:rPr>
+              <w:t>En la app</w:t>
+            </w:r>
+          </w:p>
+        </w:tc>
+        <w:tc>
+          <w:tcPr>
+            <w:tcW w:w="2705" w:type="dxa"/>
+            <w:tcBorders>
+              <w:top w:val="single" w:sz="4" w:space="0" w:color="000000"/>
+              <w:left w:val="single" w:sz="4" w:space="0" w:color="000000"/>
+              <w:bottom w:val="single" w:sz="4" w:space="0" w:color="000000"/>
+              <w:right w:val="single" w:sz="4" w:space="0" w:color="000000"/>
+            </w:tcBorders>
+            <w:shd w:val="clear" w:color="auto" w:fill="D9D9D9"/>
+            <w:tcMar>
+              <w:top w:w="60" w:type="dxa"/>
+              <w:left w:w="90" w:type="dxa"/>
+              <w:bottom w:w="60" w:type="dxa"/>
+              <w:right w:w="90" w:type="dxa"/>
+            </w:tcMar>
+            <w:vAlign w:val="center"/>
+          </w:tcPr>
+          <w:p>
+            <w:r>
+              <w:rPr>
+                <w:b/>
+                <w:bCs/>
+                <w:sz w:val="20"/>
+                <w:szCs w:val="20"/>
+              </w:rPr>
+              <w:t>Equivalente en la web</w:t>
+            </w:r>
+          </w:p>
+        </w:tc>
+      </w:tr>
+      <w:tr>
+        <w:tc>
+          <w:tcPr>
+            <w:tcW w:w="2069" w:type="dxa"/>
+            <w:tcBorders>
+              <w:top w:val="single" w:sz="4" w:space="0" w:color="000000"/>
+              <w:left w:val="single" w:sz="4" w:space="0" w:color="000000"/>
+              <w:bottom w:val="single" w:sz="4" w:space="0" w:color="000000"/>
+              <w:right w:val="single" w:sz="4" w:space="0" w:color="000000"/>
+            </w:tcBorders>
+            <w:tcMar>
+              <w:top w:w="60" w:type="dxa"/>
+              <w:left w:w="90" w:type="dxa"/>
+              <w:bottom w:w="60" w:type="dxa"/>
+              <w:right w:w="90" w:type="dxa"/>
+            </w:tcMar>
+            <w:vAlign w:val="center"/>
+          </w:tcPr>
+          <w:p>
+            <w:r>
+              <w:rPr>
+                <w:sz w:val="20"/>
+                <w:szCs w:val="20"/>
+              </w:rPr>
+              <w:t>Navegación</w:t>
+            </w:r>
+          </w:p>
+        </w:tc>
+        <w:tc>
+          <w:tcPr>
+            <w:tcW w:w="4296" w:type="dxa"/>
+            <w:tcBorders>
+              <w:top w:val="single" w:sz="4" w:space="0" w:color="000000"/>
+              <w:left w:val="single" w:sz="4" w:space="0" w:color="000000"/>
+              <w:bottom w:val="single" w:sz="4" w:space="0" w:color="000000"/>
+              <w:right w:val="single" w:sz="4" w:space="0" w:color="000000"/>
+            </w:tcBorders>
+            <w:tcMar>
+              <w:top w:w="60" w:type="dxa"/>
+              <w:left w:w="90" w:type="dxa"/>
+              <w:bottom w:w="60" w:type="dxa"/>
+              <w:right w:w="90" w:type="dxa"/>
+            </w:tcMar>
+            <w:vAlign w:val="center"/>
+          </w:tcPr>
+          <w:p>
+            <w:r>
+              <w:rPr>
+                <w:sz w:val="20"/>
+                <w:szCs w:val="20"/>
+              </w:rPr>
+              <w:t>Expo Router (barra de pestañas por rol)</w:t>
+            </w:r>
+          </w:p>
+        </w:tc>
+        <w:tc>
+          <w:tcPr>
+            <w:tcW w:w="2705" w:type="dxa"/>
+            <w:tcBorders>
+              <w:top w:val="single" w:sz="4" w:space="0" w:color="000000"/>
+              <w:left w:val="single" w:sz="4" w:space="0" w:color="000000"/>
+              <w:bottom w:val="single" w:sz="4" w:space="0" w:color="000000"/>
+              <w:right w:val="single" w:sz="4" w:space="0" w:color="000000"/>
+            </w:tcBorders>
+            <w:tcMar>
+              <w:top w:w="60" w:type="dxa"/>
+              <w:left w:w="90" w:type="dxa"/>
+              <w:bottom w:w="60" w:type="dxa"/>
+              <w:right w:w="90" w:type="dxa"/>
+            </w:tcMar>
+            <w:vAlign w:val="center"/>
+          </w:tcPr>
+          <w:p>
+            <w:r>
+              <w:rPr>
+                <w:sz w:val="20"/>
+                <w:szCs w:val="20"/>
+              </w:rPr>
+              <w:t>React Router</w:t>
+            </w:r>
+          </w:p>
+        </w:tc>
+      </w:tr>
+      <w:tr>
+        <w:tc>
+          <w:tcPr>
+            <w:tcW w:w="2069" w:type="dxa"/>
+            <w:tcBorders>
+              <w:top w:val="single" w:sz="4" w:space="0" w:color="000000"/>
+              <w:left w:val="single" w:sz="4" w:space="0" w:color="000000"/>
+              <w:bottom w:val="single" w:sz="4" w:space="0" w:color="000000"/>
+              <w:right w:val="single" w:sz="4" w:space="0" w:color="000000"/>
+            </w:tcBorders>
+            <w:tcMar>
+              <w:top w:w="60" w:type="dxa"/>
+              <w:left w:w="90" w:type="dxa"/>
+              <w:bottom w:w="60" w:type="dxa"/>
+              <w:right w:w="90" w:type="dxa"/>
+            </w:tcMar>
+            <w:vAlign w:val="center"/>
+          </w:tcPr>
+          <w:p>
+            <w:r>
+              <w:rPr>
+                <w:sz w:val="20"/>
+                <w:szCs w:val="20"/>
+              </w:rPr>
+              <w:t>Llamadas a la API y caché</w:t>
+            </w:r>
+          </w:p>
+        </w:tc>
+        <w:tc>
+          <w:tcPr>
+            <w:tcW w:w="4296" w:type="dxa"/>
+            <w:tcBorders>
+              <w:top w:val="single" w:sz="4" w:space="0" w:color="000000"/>
+              <w:left w:val="single" w:sz="4" w:space="0" w:color="000000"/>
+              <w:bottom w:val="single" w:sz="4" w:space="0" w:color="000000"/>
+              <w:right w:val="single" w:sz="4" w:space="0" w:color="000000"/>
+            </w:tcBorders>
+            <w:tcMar>
+              <w:top w:w="60" w:type="dxa"/>
+              <w:left w:w="90" w:type="dxa"/>
+              <w:bottom w:w="60" w:type="dxa"/>
+              <w:right w:w="90" w:type="dxa"/>
+            </w:tcMar>
+            <w:vAlign w:val="center"/>
+          </w:tcPr>
+          <w:p>
+            <w:r>
+              <w:rPr>
+                <w:sz w:val="20"/>
+                <w:szCs w:val="20"/>
+              </w:rPr>
+              <w:t>TanStack Query + Axios con el mismo interceptor</w:t>
+            </w:r>
+          </w:p>
+        </w:tc>
+        <w:tc>
+          <w:tcPr>
+            <w:tcW w:w="2705" w:type="dxa"/>
+            <w:tcBorders>
+              <w:top w:val="single" w:sz="4" w:space="0" w:color="000000"/>
+              <w:left w:val="single" w:sz="4" w:space="0" w:color="000000"/>
+              <w:bottom w:val="single" w:sz="4" w:space="0" w:color="000000"/>
+              <w:right w:val="single" w:sz="4" w:space="0" w:color="000000"/>
+            </w:tcBorders>
+            <w:tcMar>
+              <w:top w:w="60" w:type="dxa"/>
+              <w:left w:w="90" w:type="dxa"/>
+              <w:bottom w:w="60" w:type="dxa"/>
+              <w:right w:w="90" w:type="dxa"/>
+            </w:tcMar>
+            <w:vAlign w:val="center"/>
+          </w:tcPr>
+          <w:p>
+            <w:r>
+              <w:rPr>
+                <w:sz w:val="20"/>
+                <w:szCs w:val="20"/>
+              </w:rPr>
+              <w:t>Igual</w:t>
+            </w:r>
+          </w:p>
+        </w:tc>
+      </w:tr>
+      <w:tr>
+        <w:tc>
+          <w:tcPr>
+            <w:tcW w:w="2069" w:type="dxa"/>
+            <w:tcBorders>
+              <w:top w:val="single" w:sz="4" w:space="0" w:color="000000"/>
+              <w:left w:val="single" w:sz="4" w:space="0" w:color="000000"/>
+              <w:bottom w:val="single" w:sz="4" w:space="0" w:color="000000"/>
+              <w:right w:val="single" w:sz="4" w:space="0" w:color="000000"/>
+            </w:tcBorders>
+            <w:tcMar>
+              <w:top w:w="60" w:type="dxa"/>
+              <w:left w:w="90" w:type="dxa"/>
+              <w:bottom w:w="60" w:type="dxa"/>
+              <w:right w:w="90" w:type="dxa"/>
+            </w:tcMar>
+            <w:vAlign w:val="center"/>
+          </w:tcPr>
+          <w:p>
+            <w:r>
+              <w:rPr>
+                <w:sz w:val="20"/>
+                <w:szCs w:val="20"/>
+              </w:rPr>
+              <w:t>Guardar la sesión</w:t>
+            </w:r>
+          </w:p>
+        </w:tc>
+        <w:tc>
+          <w:tcPr>
+            <w:tcW w:w="4296" w:type="dxa"/>
+            <w:tcBorders>
+              <w:top w:val="single" w:sz="4" w:space="0" w:color="000000"/>
+              <w:left w:val="single" w:sz="4" w:space="0" w:color="000000"/>
+              <w:bottom w:val="single" w:sz="4" w:space="0" w:color="000000"/>
+              <w:right w:val="single" w:sz="4" w:space="0" w:color="000000"/>
+            </w:tcBorders>
+            <w:tcMar>
+              <w:top w:w="60" w:type="dxa"/>
+              <w:left w:w="90" w:type="dxa"/>
+              <w:bottom w:w="60" w:type="dxa"/>
+              <w:right w:w="90" w:type="dxa"/>
+            </w:tcMar>
+            <w:vAlign w:val="center"/>
+          </w:tcPr>
+          <w:p>
+            <w:r>
+              <w:rPr>
+                <w:sz w:val="20"/>
+                <w:szCs w:val="20"/>
+              </w:rPr>
+              <w:t>expo-secure-store: Keychain (iOS) y Keystore (Android)</w:t>
+            </w:r>
+          </w:p>
+        </w:tc>
+        <w:tc>
+          <w:tcPr>
+            <w:tcW w:w="2705" w:type="dxa"/>
+            <w:tcBorders>
+              <w:top w:val="single" w:sz="4" w:space="0" w:color="000000"/>
+              <w:left w:val="single" w:sz="4" w:space="0" w:color="000000"/>
+              <w:bottom w:val="single" w:sz="4" w:space="0" w:color="000000"/>
+              <w:right w:val="single" w:sz="4" w:space="0" w:color="000000"/>
+            </w:tcBorders>
+            <w:tcMar>
+              <w:top w:w="60" w:type="dxa"/>
+              <w:left w:w="90" w:type="dxa"/>
+              <w:bottom w:w="60" w:type="dxa"/>
+              <w:right w:w="90" w:type="dxa"/>
+            </w:tcMar>
+            <w:vAlign w:val="center"/>
+          </w:tcPr>
+          <w:p>
+            <w:r>
+              <w:rPr>
+                <w:sz w:val="20"/>
+                <w:szCs w:val="20"/>
+              </w:rPr>
+              <w:t>sessionStorage</w:t>
+            </w:r>
+          </w:p>
+        </w:tc>
+      </w:tr>
+      <w:tr>
+        <w:tc>
+          <w:tcPr>
+            <w:tcW w:w="2069" w:type="dxa"/>
+            <w:tcBorders>
+              <w:top w:val="single" w:sz="4" w:space="0" w:color="000000"/>
+              <w:left w:val="single" w:sz="4" w:space="0" w:color="000000"/>
+              <w:bottom w:val="single" w:sz="4" w:space="0" w:color="000000"/>
+              <w:right w:val="single" w:sz="4" w:space="0" w:color="000000"/>
+            </w:tcBorders>
+            <w:tcMar>
+              <w:top w:w="60" w:type="dxa"/>
+              <w:left w:w="90" w:type="dxa"/>
+              <w:bottom w:w="60" w:type="dxa"/>
+              <w:right w:w="90" w:type="dxa"/>
+            </w:tcMar>
+            <w:vAlign w:val="center"/>
+          </w:tcPr>
+          <w:p>
+            <w:r>
+              <w:rPr>
+                <w:sz w:val="20"/>
+                <w:szCs w:val="20"/>
+              </w:rPr>
+              <w:t>Login con Google</w:t>
+            </w:r>
+          </w:p>
+        </w:tc>
+        <w:tc>
+          <w:tcPr>
+            <w:tcW w:w="4296" w:type="dxa"/>
+            <w:tcBorders>
+              <w:top w:val="single" w:sz="4" w:space="0" w:color="000000"/>
+              <w:left w:val="single" w:sz="4" w:space="0" w:color="000000"/>
+              <w:bottom w:val="single" w:sz="4" w:space="0" w:color="000000"/>
+              <w:right w:val="single" w:sz="4" w:space="0" w:color="000000"/>
+            </w:tcBorders>
+            <w:tcMar>
+              <w:top w:w="60" w:type="dxa"/>
+              <w:left w:w="90" w:type="dxa"/>
+              <w:bottom w:w="60" w:type="dxa"/>
+              <w:right w:w="90" w:type="dxa"/>
+            </w:tcMar>
+            <w:vAlign w:val="center"/>
+          </w:tcPr>
+          <w:p>
+            <w:r>
+              <w:rPr>
+                <w:sz w:val="20"/>
+                <w:szCs w:val="20"/>
+              </w:rPr>
+              <w:t>expo-auth-session y enlace legrandhotel://auth/callback</w:t>
+            </w:r>
+          </w:p>
+        </w:tc>
+        <w:tc>
+          <w:tcPr>
+            <w:tcW w:w="2705" w:type="dxa"/>
+            <w:tcBorders>
+              <w:top w:val="single" w:sz="4" w:space="0" w:color="000000"/>
+              <w:left w:val="single" w:sz="4" w:space="0" w:color="000000"/>
+              <w:bottom w:val="single" w:sz="4" w:space="0" w:color="000000"/>
+              <w:right w:val="single" w:sz="4" w:space="0" w:color="000000"/>
+            </w:tcBorders>
+            <w:tcMar>
+              <w:top w:w="60" w:type="dxa"/>
+              <w:left w:w="90" w:type="dxa"/>
+              <w:bottom w:w="60" w:type="dxa"/>
+              <w:right w:w="90" w:type="dxa"/>
+            </w:tcMar>
+            <w:vAlign w:val="center"/>
+          </w:tcPr>
+          <w:p>
+            <w:r>
+              <w:rPr>
+                <w:sz w:val="20"/>
+                <w:szCs w:val="20"/>
+              </w:rPr>
+              <w:t>Socialite con redirección</w:t>
+            </w:r>
+          </w:p>
+        </w:tc>
+      </w:tr>
+      <w:tr>
+        <w:tc>
+          <w:tcPr>
+            <w:tcW w:w="2069" w:type="dxa"/>
+            <w:tcBorders>
+              <w:top w:val="single" w:sz="4" w:space="0" w:color="000000"/>
+              <w:left w:val="single" w:sz="4" w:space="0" w:color="000000"/>
+              <w:bottom w:val="single" w:sz="4" w:space="0" w:color="000000"/>
+              <w:right w:val="single" w:sz="4" w:space="0" w:color="000000"/>
+            </w:tcBorders>
+            <w:tcMar>
+              <w:top w:w="60" w:type="dxa"/>
+              <w:left w:w="90" w:type="dxa"/>
+              <w:bottom w:w="60" w:type="dxa"/>
+              <w:right w:w="90" w:type="dxa"/>
+            </w:tcMar>
+            <w:vAlign w:val="center"/>
+          </w:tcPr>
+          <w:p>
+            <w:r>
+              <w:rPr>
+                <w:sz w:val="20"/>
+                <w:szCs w:val="20"/>
+              </w:rPr>
+              <w:t>Notificaciones</w:t>
+            </w:r>
+          </w:p>
+        </w:tc>
+        <w:tc>
+          <w:tcPr>
+            <w:tcW w:w="4296" w:type="dxa"/>
+            <w:tcBorders>
+              <w:top w:val="single" w:sz="4" w:space="0" w:color="000000"/>
+              <w:left w:val="single" w:sz="4" w:space="0" w:color="000000"/>
+              <w:bottom w:val="single" w:sz="4" w:space="0" w:color="000000"/>
+              <w:right w:val="single" w:sz="4" w:space="0" w:color="000000"/>
+            </w:tcBorders>
+            <w:tcMar>
+              <w:top w:w="60" w:type="dxa"/>
+              <w:left w:w="90" w:type="dxa"/>
+              <w:bottom w:w="60" w:type="dxa"/>
+              <w:right w:w="90" w:type="dxa"/>
+            </w:tcMar>
+            <w:vAlign w:val="center"/>
+          </w:tcPr>
+          <w:p>
+            <w:r>
+              <w:rPr>
+                <w:sz w:val="20"/>
+                <w:szCs w:val="20"/>
+              </w:rPr>
+              <w:t>expo-notifications → FCM / APNs</w:t>
+            </w:r>
+          </w:p>
+        </w:tc>
+        <w:tc>
+          <w:tcPr>
+            <w:tcW w:w="2705" w:type="dxa"/>
+            <w:tcBorders>
+              <w:top w:val="single" w:sz="4" w:space="0" w:color="000000"/>
+              <w:left w:val="single" w:sz="4" w:space="0" w:color="000000"/>
+              <w:bottom w:val="single" w:sz="4" w:space="0" w:color="000000"/>
+              <w:right w:val="single" w:sz="4" w:space="0" w:color="000000"/>
+            </w:tcBorders>
+            <w:tcMar>
+              <w:top w:w="60" w:type="dxa"/>
+              <w:left w:w="90" w:type="dxa"/>
+              <w:bottom w:w="60" w:type="dxa"/>
+              <w:right w:w="90" w:type="dxa"/>
+            </w:tcMar>
+            <w:vAlign w:val="center"/>
+          </w:tcPr>
+          <w:p>
+            <w:r>
+              <w:rPr>
+                <w:sz w:val="20"/>
+                <w:szCs w:val="20"/>
+              </w:rPr>
+              <w:t>—</w:t>
+            </w:r>
+          </w:p>
+        </w:tc>
+      </w:tr>
+      <w:tr>
+        <w:tc>
+          <w:tcPr>
+            <w:tcW w:w="2069" w:type="dxa"/>
+            <w:tcBorders>
+              <w:top w:val="single" w:sz="4" w:space="0" w:color="000000"/>
+              <w:left w:val="single" w:sz="4" w:space="0" w:color="000000"/>
+              <w:bottom w:val="single" w:sz="4" w:space="0" w:color="000000"/>
+              <w:right w:val="single" w:sz="4" w:space="0" w:color="000000"/>
+            </w:tcBorders>
+            <w:tcMar>
+              <w:top w:w="60" w:type="dxa"/>
+              <w:left w:w="90" w:type="dxa"/>
+              <w:bottom w:w="60" w:type="dxa"/>
+              <w:right w:w="90" w:type="dxa"/>
+            </w:tcMar>
+            <w:vAlign w:val="center"/>
+          </w:tcPr>
+          <w:p>
+            <w:r>
+              <w:rPr>
+                <w:sz w:val="20"/>
+                <w:szCs w:val="20"/>
+              </w:rPr>
+              <w:t>Desbloqueo</w:t>
+            </w:r>
+          </w:p>
+        </w:tc>
+        <w:tc>
+          <w:tcPr>
+            <w:tcW w:w="4296" w:type="dxa"/>
+            <w:tcBorders>
+              <w:top w:val="single" w:sz="4" w:space="0" w:color="000000"/>
+              <w:left w:val="single" w:sz="4" w:space="0" w:color="000000"/>
+              <w:bottom w:val="single" w:sz="4" w:space="0" w:color="000000"/>
+              <w:right w:val="single" w:sz="4" w:space="0" w:color="000000"/>
+            </w:tcBorders>
+            <w:tcMar>
+              <w:top w:w="60" w:type="dxa"/>
+              <w:left w:w="90" w:type="dxa"/>
+              <w:bottom w:w="60" w:type="dxa"/>
+              <w:right w:w="90" w:type="dxa"/>
+            </w:tcMar>
+            <w:vAlign w:val="center"/>
+          </w:tcPr>
+          <w:p>
+            <w:r>
+              <w:rPr>
+                <w:sz w:val="20"/>
+                <w:szCs w:val="20"/>
+              </w:rPr>
+              <w:t>Huella o Face ID (expo-local-authentication)</w:t>
+            </w:r>
+          </w:p>
+        </w:tc>
+        <w:tc>
+          <w:tcPr>
+            <w:tcW w:w="2705" w:type="dxa"/>
+            <w:tcBorders>
+              <w:top w:val="single" w:sz="4" w:space="0" w:color="000000"/>
+              <w:left w:val="single" w:sz="4" w:space="0" w:color="000000"/>
+              <w:bottom w:val="single" w:sz="4" w:space="0" w:color="000000"/>
+              <w:right w:val="single" w:sz="4" w:space="0" w:color="000000"/>
+            </w:tcBorders>
+            <w:tcMar>
+              <w:top w:w="60" w:type="dxa"/>
+              <w:left w:w="90" w:type="dxa"/>
+              <w:bottom w:w="60" w:type="dxa"/>
+              <w:right w:w="90" w:type="dxa"/>
+            </w:tcMar>
+            <w:vAlign w:val="center"/>
+          </w:tcPr>
+          <w:p>
+            <w:r>
+              <w:rPr>
+                <w:sz w:val="20"/>
+                <w:szCs w:val="20"/>
+              </w:rPr>
+              <w:t>—</w:t>
+            </w:r>
+          </w:p>
+        </w:tc>
+      </w:tr>
+      <w:tr>
+        <w:tc>
+          <w:tcPr>
+            <w:tcW w:w="2069" w:type="dxa"/>
+            <w:tcBorders>
+              <w:top w:val="single" w:sz="4" w:space="0" w:color="000000"/>
+              <w:left w:val="single" w:sz="4" w:space="0" w:color="000000"/>
+              <w:bottom w:val="single" w:sz="4" w:space="0" w:color="000000"/>
+              <w:right w:val="single" w:sz="4" w:space="0" w:color="000000"/>
+            </w:tcBorders>
+            <w:tcMar>
+              <w:top w:w="60" w:type="dxa"/>
+              <w:left w:w="90" w:type="dxa"/>
+              <w:bottom w:w="60" w:type="dxa"/>
+              <w:right w:w="90" w:type="dxa"/>
+            </w:tcMar>
+            <w:vAlign w:val="center"/>
+          </w:tcPr>
+          <w:p>
+            <w:r>
+              <w:rPr>
+                <w:sz w:val="20"/>
+                <w:szCs w:val="20"/>
+              </w:rPr>
+              <w:t>Pruebas</w:t>
+            </w:r>
+          </w:p>
+        </w:tc>
+        <w:tc>
+          <w:tcPr>
+            <w:tcW w:w="4296" w:type="dxa"/>
+            <w:tcBorders>
+              <w:top w:val="single" w:sz="4" w:space="0" w:color="000000"/>
+              <w:left w:val="single" w:sz="4" w:space="0" w:color="000000"/>
+              <w:bottom w:val="single" w:sz="4" w:space="0" w:color="000000"/>
+              <w:right w:val="single" w:sz="4" w:space="0" w:color="000000"/>
+            </w:tcBorders>
+            <w:tcMar>
+              <w:top w:w="60" w:type="dxa"/>
+              <w:left w:w="90" w:type="dxa"/>
+              <w:bottom w:w="60" w:type="dxa"/>
+              <w:right w:w="90" w:type="dxa"/>
+            </w:tcMar>
+            <w:vAlign w:val="center"/>
+          </w:tcPr>
+          <w:p>
+            <w:r>
+              <w:rPr>
+                <w:sz w:val="20"/>
+                <w:szCs w:val="20"/>
+              </w:rPr>
+              <w:t>Jest + Testing Library; Maestro para flujos completos</w:t>
+            </w:r>
+          </w:p>
+        </w:tc>
+        <w:tc>
+          <w:tcPr>
+            <w:tcW w:w="2705" w:type="dxa"/>
+            <w:tcBorders>
+              <w:top w:val="single" w:sz="4" w:space="0" w:color="000000"/>
+              <w:left w:val="single" w:sz="4" w:space="0" w:color="000000"/>
+              <w:bottom w:val="single" w:sz="4" w:space="0" w:color="000000"/>
+              <w:right w:val="single" w:sz="4" w:space="0" w:color="000000"/>
+            </w:tcBorders>
+            <w:tcMar>
+              <w:top w:w="60" w:type="dxa"/>
+              <w:left w:w="90" w:type="dxa"/>
+              <w:bottom w:w="60" w:type="dxa"/>
+              <w:right w:w="90" w:type="dxa"/>
+            </w:tcMar>
+            <w:vAlign w:val="center"/>
+          </w:tcPr>
+          <w:p>
+            <w:r>
+              <w:rPr>
+                <w:sz w:val="20"/>
+                <w:szCs w:val="20"/>
+              </w:rPr>
+              <w:t>Vitest; Playwright</w:t>
+            </w:r>
+          </w:p>
+        </w:tc>
+      </w:tr>
+    </w:tbl>
+    <w:p>
+      <w:pPr>
+        <w:spacing w:after="80"/>
+      </w:pPr>
+    </w:p>
+    <w:p>
+      <w:pPr>
+        <w:spacing w:after="120" w:line="300" w:lineRule="auto"/>
+      </w:pPr>
+      <w:r>
+        <w:rPr>
+          <w:b/>
+          <w:bCs/>
+        </w:rPr>
+        <w:t xml:space="preserve">Cambios que necesitará la API (pocos, porque la app usa los mismos endpoints): </w:t>
+      </w:r>
     </w:p>
     <w:p>
       <w:pPr>
@@ -12479,7 +14254,7 @@
         <w:spacing w:after="60" w:line="288" w:lineRule="auto"/>
       </w:pPr>
       <w:r>
-        <w:t>Desplegar con el pipeline: imagen Docker en ECR, frontend en S3 + CloudFront, ALB con HTTPS.</w:t>
+        <w:t>Registrar el token de notificaciones de cada teléfono (POST /devices) y enviar avisos en cola: reserva confirmada, recordatorio de check-in e insumo bajo el mínimo.</w:t>
       </w:r>
     </w:p>
     <w:p>
@@ -12492,7 +14267,7 @@
         <w:spacing w:after="60" w:line="288" w:lineRule="auto"/>
       </w:pPr>
       <w:r>
-        <w:t>Repetir las pruebas k6 en AWS con 50–100 y 1000–5000 usuarios, con reportes HTML y comparación antes/después.</w:t>
+        <w:t>Login con Google que vuelva a la app (enlace profundo) además de a la web.</w:t>
       </w:r>
     </w:p>
     <w:p>
@@ -12505,11 +14280,481 @@
         <w:spacing w:after="60" w:line="288" w:lineRule="auto"/>
       </w:pPr>
       <w:r>
+        <w:t>Cabecera X-App-Version para pedir que se actualice la app si cambia la API (respuesta 426).</w:t>
+      </w:r>
+    </w:p>
+    <w:p>
+      <w:pPr>
+        <w:pStyle w:val="Prrafodelista"/>
+        <w:numPr>
+          <w:ilvl w:val="0"/>
+          <w:numId w:val="2"/>
+        </w:numPr>
+        <w:spacing w:after="60" w:line="288" w:lineRule="auto"/>
+      </w:pPr>
+      <w:r>
+        <w:t>Nada más: el login ya acepta un nombre de dispositivo para que cada teléfono tenga su propio token; CORS no aplica a apps nativas; roles y límites de intentos son los mismos.</w:t>
+      </w:r>
+    </w:p>
+    <w:p>
+      <w:pPr>
+        <w:spacing w:after="120" w:line="300" w:lineRule="auto"/>
+      </w:pPr>
+      <w:r>
+        <w:rPr>
+          <w:b/>
+          <w:bCs/>
+        </w:rPr>
+        <w:t xml:space="preserve">Seguridad: </w:t>
+      </w:r>
+      <w:r>
+        <w:t xml:space="preserve">el token se guarda en el almacenamiento seguro del sistema y nunca en texto plano. Se renueva solo antes de vencer, con el mismo POST /auth/refresh de la web. El </w:t>
+      </w:r>
+      <w:r>
+        <w:lastRenderedPageBreak/>
+        <w:t>personal puede activar el desbloqueo con huella o rostro. La app solo usa HTTPS y no contiene secretos: todo secreto queda en el servidor.</w:t>
+      </w:r>
+    </w:p>
+    <w:tbl>
+      <w:tblPr>
+        <w:tblW w:w="9070" w:type="dxa"/>
+        <w:tblBorders>
+          <w:top w:val="single" w:sz="4" w:space="0" w:color="auto"/>
+          <w:left w:val="single" w:sz="4" w:space="0" w:color="auto"/>
+          <w:bottom w:val="single" w:sz="4" w:space="0" w:color="auto"/>
+          <w:right w:val="single" w:sz="4" w:space="0" w:color="auto"/>
+          <w:insideH w:val="single" w:sz="4" w:space="0" w:color="auto"/>
+          <w:insideV w:val="single" w:sz="4" w:space="0" w:color="auto"/>
+        </w:tblBorders>
+        <w:tblLook w:val="04A0" w:firstRow="1" w:lastRow="0" w:firstColumn="1" w:lastColumn="0" w:noHBand="0" w:noVBand="1"/>
+      </w:tblPr>
+      <w:tblGrid>
+        <w:gridCol w:w="1735"/>
+        <w:gridCol w:w="7335"/>
+      </w:tblGrid>
+      <w:tr>
+        <w:trPr>
+          <w:tblHeader/>
+        </w:trPr>
+        <w:tc>
+          <w:tcPr>
+            <w:tcW w:w="1735" w:type="dxa"/>
+            <w:tcBorders>
+              <w:top w:val="single" w:sz="4" w:space="0" w:color="000000"/>
+              <w:left w:val="single" w:sz="4" w:space="0" w:color="000000"/>
+              <w:bottom w:val="single" w:sz="4" w:space="0" w:color="000000"/>
+              <w:right w:val="single" w:sz="4" w:space="0" w:color="000000"/>
+            </w:tcBorders>
+            <w:shd w:val="clear" w:color="auto" w:fill="D9D9D9"/>
+            <w:tcMar>
+              <w:top w:w="60" w:type="dxa"/>
+              <w:left w:w="90" w:type="dxa"/>
+              <w:bottom w:w="60" w:type="dxa"/>
+              <w:right w:w="90" w:type="dxa"/>
+            </w:tcMar>
+            <w:vAlign w:val="center"/>
+          </w:tcPr>
+          <w:p>
+            <w:r>
+              <w:rPr>
+                <w:b/>
+                <w:bCs/>
+                <w:sz w:val="20"/>
+                <w:szCs w:val="20"/>
+              </w:rPr>
+              <w:t>Entrega</w:t>
+            </w:r>
+          </w:p>
+        </w:tc>
+        <w:tc>
+          <w:tcPr>
+            <w:tcW w:w="7335" w:type="dxa"/>
+            <w:tcBorders>
+              <w:top w:val="single" w:sz="4" w:space="0" w:color="000000"/>
+              <w:left w:val="single" w:sz="4" w:space="0" w:color="000000"/>
+              <w:bottom w:val="single" w:sz="4" w:space="0" w:color="000000"/>
+              <w:right w:val="single" w:sz="4" w:space="0" w:color="000000"/>
+            </w:tcBorders>
+            <w:shd w:val="clear" w:color="auto" w:fill="D9D9D9"/>
+            <w:tcMar>
+              <w:top w:w="60" w:type="dxa"/>
+              <w:left w:w="90" w:type="dxa"/>
+              <w:bottom w:w="60" w:type="dxa"/>
+              <w:right w:w="90" w:type="dxa"/>
+            </w:tcMar>
+            <w:vAlign w:val="center"/>
+          </w:tcPr>
+          <w:p>
+            <w:r>
+              <w:rPr>
+                <w:b/>
+                <w:bCs/>
+                <w:sz w:val="20"/>
+                <w:szCs w:val="20"/>
+              </w:rPr>
+              <w:t>Alcance de la app</w:t>
+            </w:r>
+          </w:p>
+        </w:tc>
+      </w:tr>
+      <w:tr>
+        <w:tc>
+          <w:tcPr>
+            <w:tcW w:w="1735" w:type="dxa"/>
+            <w:tcBorders>
+              <w:top w:val="single" w:sz="4" w:space="0" w:color="000000"/>
+              <w:left w:val="single" w:sz="4" w:space="0" w:color="000000"/>
+              <w:bottom w:val="single" w:sz="4" w:space="0" w:color="000000"/>
+              <w:right w:val="single" w:sz="4" w:space="0" w:color="000000"/>
+            </w:tcBorders>
+            <w:tcMar>
+              <w:top w:w="60" w:type="dxa"/>
+              <w:left w:w="90" w:type="dxa"/>
+              <w:bottom w:w="60" w:type="dxa"/>
+              <w:right w:w="90" w:type="dxa"/>
+            </w:tcMar>
+            <w:vAlign w:val="center"/>
+          </w:tcPr>
+          <w:p>
+            <w:r>
+              <w:rPr>
+                <w:sz w:val="20"/>
+                <w:szCs w:val="20"/>
+              </w:rPr>
+              <w:t>25% (esta)</w:t>
+            </w:r>
+          </w:p>
+        </w:tc>
+        <w:tc>
+          <w:tcPr>
+            <w:tcW w:w="7335" w:type="dxa"/>
+            <w:tcBorders>
+              <w:top w:val="single" w:sz="4" w:space="0" w:color="000000"/>
+              <w:left w:val="single" w:sz="4" w:space="0" w:color="000000"/>
+              <w:bottom w:val="single" w:sz="4" w:space="0" w:color="000000"/>
+              <w:right w:val="single" w:sz="4" w:space="0" w:color="000000"/>
+            </w:tcBorders>
+            <w:tcMar>
+              <w:top w:w="60" w:type="dxa"/>
+              <w:left w:w="90" w:type="dxa"/>
+              <w:bottom w:w="60" w:type="dxa"/>
+              <w:right w:w="90" w:type="dxa"/>
+            </w:tcMar>
+            <w:vAlign w:val="center"/>
+          </w:tcPr>
+          <w:p>
+            <w:r>
+              <w:rPr>
+                <w:sz w:val="20"/>
+                <w:szCs w:val="20"/>
+              </w:rPr>
+              <w:t>Diseño: tecnología, arquitectura, pantallas por rol y bocetos</w:t>
+            </w:r>
+          </w:p>
+        </w:tc>
+      </w:tr>
+      <w:tr>
+        <w:tc>
+          <w:tcPr>
+            <w:tcW w:w="1735" w:type="dxa"/>
+            <w:tcBorders>
+              <w:top w:val="single" w:sz="4" w:space="0" w:color="000000"/>
+              <w:left w:val="single" w:sz="4" w:space="0" w:color="000000"/>
+              <w:bottom w:val="single" w:sz="4" w:space="0" w:color="000000"/>
+              <w:right w:val="single" w:sz="4" w:space="0" w:color="000000"/>
+            </w:tcBorders>
+            <w:tcMar>
+              <w:top w:w="60" w:type="dxa"/>
+              <w:left w:w="90" w:type="dxa"/>
+              <w:bottom w:w="60" w:type="dxa"/>
+              <w:right w:w="90" w:type="dxa"/>
+            </w:tcMar>
+            <w:vAlign w:val="center"/>
+          </w:tcPr>
+          <w:p>
+            <w:r>
+              <w:rPr>
+                <w:sz w:val="20"/>
+                <w:szCs w:val="20"/>
+              </w:rPr>
+              <w:t>80%</w:t>
+            </w:r>
+          </w:p>
+        </w:tc>
+        <w:tc>
+          <w:tcPr>
+            <w:tcW w:w="7335" w:type="dxa"/>
+            <w:tcBorders>
+              <w:top w:val="single" w:sz="4" w:space="0" w:color="000000"/>
+              <w:left w:val="single" w:sz="4" w:space="0" w:color="000000"/>
+              <w:bottom w:val="single" w:sz="4" w:space="0" w:color="000000"/>
+              <w:right w:val="single" w:sz="4" w:space="0" w:color="000000"/>
+            </w:tcBorders>
+            <w:tcMar>
+              <w:top w:w="60" w:type="dxa"/>
+              <w:left w:w="90" w:type="dxa"/>
+              <w:bottom w:w="60" w:type="dxa"/>
+              <w:right w:w="90" w:type="dxa"/>
+            </w:tcMar>
+            <w:vAlign w:val="center"/>
+          </w:tcPr>
+          <w:p>
+            <w:r>
+              <w:rPr>
+                <w:sz w:val="20"/>
+                <w:szCs w:val="20"/>
+              </w:rPr>
+              <w:t>Proyecto Expo en mobile/; login y registro; flujo del cliente (reservar, mis reservas); recepción «Hoy» con check-in y check-out; notificaciones; versión de prueba para Android</w:t>
+            </w:r>
+          </w:p>
+        </w:tc>
+      </w:tr>
+      <w:tr>
+        <w:tc>
+          <w:tcPr>
+            <w:tcW w:w="1735" w:type="dxa"/>
+            <w:tcBorders>
+              <w:top w:val="single" w:sz="4" w:space="0" w:color="000000"/>
+              <w:left w:val="single" w:sz="4" w:space="0" w:color="000000"/>
+              <w:bottom w:val="single" w:sz="4" w:space="0" w:color="000000"/>
+              <w:right w:val="single" w:sz="4" w:space="0" w:color="000000"/>
+            </w:tcBorders>
+            <w:tcMar>
+              <w:top w:w="60" w:type="dxa"/>
+              <w:left w:w="90" w:type="dxa"/>
+              <w:bottom w:w="60" w:type="dxa"/>
+              <w:right w:w="90" w:type="dxa"/>
+            </w:tcMar>
+            <w:vAlign w:val="center"/>
+          </w:tcPr>
+          <w:p>
+            <w:r>
+              <w:rPr>
+                <w:sz w:val="20"/>
+                <w:szCs w:val="20"/>
+              </w:rPr>
+              <w:t>100%</w:t>
+            </w:r>
+          </w:p>
+        </w:tc>
+        <w:tc>
+          <w:tcPr>
+            <w:tcW w:w="7335" w:type="dxa"/>
+            <w:tcBorders>
+              <w:top w:val="single" w:sz="4" w:space="0" w:color="000000"/>
+              <w:left w:val="single" w:sz="4" w:space="0" w:color="000000"/>
+              <w:bottom w:val="single" w:sz="4" w:space="0" w:color="000000"/>
+              <w:right w:val="single" w:sz="4" w:space="0" w:color="000000"/>
+            </w:tcBorders>
+            <w:tcMar>
+              <w:top w:w="60" w:type="dxa"/>
+              <w:left w:w="90" w:type="dxa"/>
+              <w:bottom w:w="60" w:type="dxa"/>
+              <w:right w:w="90" w:type="dxa"/>
+            </w:tcMar>
+            <w:vAlign w:val="center"/>
+          </w:tcPr>
+          <w:p>
+            <w:r>
+              <w:rPr>
+                <w:sz w:val="20"/>
+                <w:szCs w:val="20"/>
+              </w:rPr>
+              <w:t>Inventario, cochera y panel del administrador; versión de prueba para iOS en TestFlight; pruebas de flujos completos con Maestro; publicación de prueba en Google Play y App Store</w:t>
+            </w:r>
+          </w:p>
+        </w:tc>
+      </w:tr>
+    </w:tbl>
+    <w:p>
+      <w:pPr>
+        <w:spacing w:after="80"/>
+      </w:pPr>
+    </w:p>
+    <w:p>
+      <w:pPr>
+        <w:spacing w:after="120" w:line="300" w:lineRule="auto"/>
+        <w:sectPr>
+          <w:footerReference w:type="default" r:id="rId22"/>
+          <w:pgSz w:w="11906" w:h="16838"/>
+          <w:pgMar w:top="1418" w:right="1418" w:bottom="1418" w:left="1418" w:header="708" w:footer="708" w:gutter="0"/>
+          <w:cols w:space="720"/>
+          <w:docGrid w:linePitch="360"/>
+        </w:sectPr>
+      </w:pPr>
+      <w:r>
+        <w:rPr>
+          <w:b/>
+          <w:bCs/>
+        </w:rPr>
+        <w:t xml:space="preserve">Publicación: </w:t>
+      </w:r>
+      <w:r>
+        <w:t>las versiones de prueba se distribuyen con Google Play (prueba interna) y Apple TestFlight. Para publicar se necesitan la cuenta de Google Play Console (pago único de USD 25) y la del Apple Developer Program (USD 99 al año). El diseño completo está en docs/movil/diseno-app-movil.md.</w:t>
+      </w:r>
+    </w:p>
+    <w:p>
+      <w:pPr>
+        <w:keepNext/>
+        <w:spacing w:after="120" w:line="300" w:lineRule="auto"/>
+      </w:pPr>
+      <w:r>
+        <w:rPr>
+          <w:b/>
+          <w:bCs/>
+          <w:sz w:val="26"/>
+          <w:szCs w:val="26"/>
+        </w:rPr>
+        <w:lastRenderedPageBreak/>
+        <w:t>Bocetos de la aplicación móvil</w:t>
+      </w:r>
+    </w:p>
+    <w:p>
+      <w:pPr>
+        <w:spacing w:after="120" w:line="300" w:lineRule="auto"/>
+      </w:pPr>
+      <w:r>
+        <w:t>Pantallas principales en escala de grises. Usan los mismos datos y reglas que la web; la barra inferior cambia según el rol del usuario.</w:t>
+      </w:r>
+    </w:p>
+    <w:p>
+      <w:pPr>
+        <w:keepNext/>
+        <w:spacing w:after="60"/>
+        <w:jc w:val="center"/>
+      </w:pPr>
+      <w:r>
+        <w:rPr>
+          <w:noProof/>
+        </w:rPr>
+        <w:drawing>
+          <wp:inline distT="0" distB="0" distL="0" distR="0" wp14:anchorId="5794BDBF" wp14:editId="00403FE7">
+            <wp:extent cx="8820150" cy="3857625"/>
+            <wp:effectExtent l="0" t="0" r="0" b="0"/>
+            <wp:docPr id="2" name="Imagen 2"/>
+            <wp:cNvGraphicFramePr>
+              <a:graphicFrameLocks xmlns:a="http://schemas.openxmlformats.org/drawingml/2006/main" noChangeAspect="1"/>
+            </wp:cNvGraphicFramePr>
+            <a:graphic xmlns:a="http://schemas.openxmlformats.org/drawingml/2006/main">
+              <a:graphicData uri="http://schemas.openxmlformats.org/drawingml/2006/picture">
+                <pic:pic xmlns:pic="http://schemas.openxmlformats.org/drawingml/2006/picture">
+                  <pic:nvPicPr>
+                    <pic:cNvPr id="0" name=""/>
+                    <pic:cNvPicPr>
+                      <a:picLocks noChangeAspect="1" noChangeArrowheads="1"/>
+                    </pic:cNvPicPr>
+                  </pic:nvPicPr>
+                  <pic:blipFill>
+                    <a:blip r:embed="rId23"/>
+                    <a:srcRect/>
+                    <a:stretch>
+                      <a:fillRect/>
+                    </a:stretch>
+                  </pic:blipFill>
+                  <pic:spPr bwMode="auto">
+                    <a:xfrm>
+                      <a:off x="0" y="0"/>
+                      <a:ext cx="8820150" cy="3857625"/>
+                    </a:xfrm>
+                    <a:prstGeom prst="rect">
+                      <a:avLst/>
+                    </a:prstGeom>
+                  </pic:spPr>
+                </pic:pic>
+              </a:graphicData>
+            </a:graphic>
+          </wp:inline>
+        </w:drawing>
+      </w:r>
+    </w:p>
+    <w:p>
+      <w:pPr>
+        <w:spacing w:after="200"/>
+        <w:jc w:val="center"/>
+        <w:sectPr>
+          <w:footerReference w:type="default" r:id="rId24"/>
+          <w:pgSz w:w="16838" w:h="11906" w:orient="landscape"/>
+          <w:pgMar w:top="1021" w:right="1418" w:bottom="1021" w:left="1418" w:header="708" w:footer="708" w:gutter="0"/>
+          <w:cols w:space="720"/>
+          <w:docGrid w:linePitch="360"/>
+        </w:sectPr>
+      </w:pPr>
+      <w:r>
+        <w:rPr>
+          <w:i/>
+          <w:iCs/>
+          <w:sz w:val="20"/>
+          <w:szCs w:val="20"/>
+        </w:rPr>
+        <w:t>Figura 13. Bocetos: login, inicio y reserva del cliente; «Hoy» y tablero de habitaciones de recepción.</w:t>
+      </w:r>
+    </w:p>
+    <w:p>
+      <w:pPr>
+        <w:pStyle w:val="Ttulo1"/>
+        <w:keepNext/>
+      </w:pPr>
+      <w:bookmarkStart w:id="21" w:name="_Toc243980380"/>
+      <w:r>
+        <w:lastRenderedPageBreak/>
+        <w:t>9. Siguientes pasos (entrega del 80%)</w:t>
+      </w:r>
+      <w:bookmarkEnd w:id="21"/>
+    </w:p>
+    <w:p>
+      <w:pPr>
+        <w:pStyle w:val="Prrafodelista"/>
+        <w:numPr>
+          <w:ilvl w:val="0"/>
+          <w:numId w:val="2"/>
+        </w:numPr>
+        <w:spacing w:after="60" w:line="288" w:lineRule="auto"/>
+      </w:pPr>
+      <w:r>
+        <w:t>Desplegar con el pipeline: imagen Docker en ECR, frontend en S3 + CloudFront, ALB con HTTPS.</w:t>
+      </w:r>
+    </w:p>
+    <w:p>
+      <w:pPr>
+        <w:pStyle w:val="Prrafodelista"/>
+        <w:numPr>
+          <w:ilvl w:val="0"/>
+          <w:numId w:val="2"/>
+        </w:numPr>
+        <w:spacing w:after="60" w:line="288" w:lineRule="auto"/>
+      </w:pPr>
+      <w:r>
+        <w:t>Repetir las pruebas k6 en AWS con 50–100 y 1000–5000 usuarios, con reportes HTML y comparación antes/después.</w:t>
+      </w:r>
+    </w:p>
+    <w:p>
+      <w:pPr>
+        <w:pStyle w:val="Prrafodelista"/>
+        <w:numPr>
+          <w:ilvl w:val="0"/>
+          <w:numId w:val="2"/>
+        </w:numPr>
+        <w:spacing w:after="60" w:line="288" w:lineRule="auto"/>
+      </w:pPr>
+      <w:r>
         <w:t>Configurar el login con Google (credenciales OAuth) y los respaldos automáticos de RDS y S3.</w:t>
+      </w:r>
+    </w:p>
+    <w:p>
+      <w:pPr>
+        <w:pStyle w:val="Prrafodelista"/>
+        <w:numPr>
+          <w:ilvl w:val="0"/>
+          <w:numId w:val="2"/>
+        </w:numPr>
+        <w:spacing w:after="60" w:line="288" w:lineRule="auto"/>
+      </w:pPr>
+      <w:r>
+        <w:t>Aplicación móvil: crear el proyecto Expo, construir el login y el flujo del cliente y la recepción, activar las notificaciones y generar la primera versión de prueba para Android.</w:t>
       </w:r>
     </w:p>
     <w:sectPr>
-      <w:footerReference w:type="default" r:id="rId21"/>
+      <w:footerReference w:type="default" r:id="rId25"/>
       <w:pgSz w:w="11906" w:h="16838"/>
       <w:pgMar w:top="1418" w:right="1418" w:bottom="1418" w:left="1418" w:header="708" w:footer="708" w:gutter="0"/>
       <w:cols w:space="720"/>
@@ -12676,6 +14921,98 @@
 </w:ftr>
 </file>
 
+<file path=word/footer4.xml><?xml version="1.0" encoding="utf-8"?>
+<w:ftr xmlns:wpc="http://schemas.microsoft.com/office/word/2010/wordprocessingCanvas" xmlns:cx="http://schemas.microsoft.com/office/drawing/2014/chartex" xmlns:cx1="http://schemas.microsoft.com/office/drawing/2015/9/8/chartex" xmlns:cx2="http://schemas.microsoft.com/office/drawing/2015/10/21/chartex" xmlns:cx3="http://schemas.microsoft.com/office/drawing/2016/5/9/chartex" xmlns:cx4="http://schemas.microsoft.com/office/drawing/2016/5/10/chartex" xmlns:cx5="http://schemas.microsoft.com/office/drawing/2016/5/11/chartex" xmlns:cx6="http://schemas.microsoft.com/office/drawing/2016/5/12/chartex" xmlns:cx7="http://schemas.microsoft.com/office/drawing/2016/5/13/chartex" xmlns:cx8="http://schemas.microsoft.com/office/drawing/2016/5/14/chartex" xmlns:mc="http://schemas.openxmlformats.org/markup-compatibility/2006" xmlns:aink="http://schemas.microsoft.com/office/drawing/2016/ink" xmlns:am3d="http://schemas.microsoft.com/office/drawing/2017/model3d" xmlns:o="urn:schemas-microsoft-com:office:office" xmlns:oel="http://schemas.microsoft.com/office/2019/extlst" xmlns:r="http://schemas.openxmlformats.org/officeDocument/2006/relationships" xmlns:m="http://schemas.openxmlformats.org/officeDocument/2006/math" xmlns:v="urn:schemas-microsoft-com:vml" xmlns:wp14="http://schemas.microsoft.com/office/word/2010/wordprocessingDrawing" xmlns:wp="http://schemas.openxmlformats.org/drawingml/2006/wordprocessingDrawing" xmlns:w10="urn:schemas-microsoft-com:office:word" xmlns:w="http://schemas.openxmlformats.org/wordprocessingml/2006/main" xmlns:w14="http://schemas.microsoft.com/office/word/2010/wordml" xmlns:w15="http://schemas.microsoft.com/office/word/2012/wordml" xmlns:w16cex="http://schemas.microsoft.com/office/word/2018/wordml/cex" xmlns:w16cid="http://schemas.microsoft.com/office/word/2016/wordml/cid" xmlns:w16="http://schemas.microsoft.com/office/word/2018/wordml" xmlns:w16sdtdh="http://schemas.microsoft.com/office/word/2020/wordml/sdtdatahash" xmlns:w16se="http://schemas.microsoft.com/office/word/2015/wordml/symex" xmlns:wpg="http://schemas.microsoft.com/office/word/2010/wordprocessingGroup" xmlns:wpi="http://schemas.microsoft.com/office/word/2010/wordprocessingInk" xmlns:wne="http://schemas.microsoft.com/office/word/2006/wordml" xmlns:wps="http://schemas.microsoft.com/office/word/2010/wordprocessingShape" mc:Ignorable="w14 w15 w16se w16cid w16 w16cex w16sdtdh wp14">
+  <w:p>
+    <w:pPr>
+      <w:jc w:val="center"/>
+    </w:pPr>
+    <w:r>
+      <w:rPr>
+        <w:sz w:val="20"/>
+        <w:szCs w:val="20"/>
+      </w:rPr>
+      <w:fldChar w:fldCharType="begin"/>
+    </w:r>
+    <w:r>
+      <w:rPr>
+        <w:sz w:val="20"/>
+        <w:szCs w:val="20"/>
+      </w:rPr>
+      <w:instrText>PAGE</w:instrText>
+    </w:r>
+    <w:r>
+      <w:rPr>
+        <w:sz w:val="20"/>
+        <w:szCs w:val="20"/>
+      </w:rPr>
+      <w:fldChar w:fldCharType="separate"/>
+    </w:r>
+    <w:r>
+      <w:rPr>
+        <w:noProof/>
+        <w:sz w:val="20"/>
+        <w:szCs w:val="20"/>
+      </w:rPr>
+      <w:t>22</w:t>
+    </w:r>
+    <w:r>
+      <w:rPr>
+        <w:sz w:val="20"/>
+        <w:szCs w:val="20"/>
+      </w:rPr>
+      <w:fldChar w:fldCharType="end"/>
+    </w:r>
+  </w:p>
+</w:ftr>
+</file>
+
+<file path=word/footer5.xml><?xml version="1.0" encoding="utf-8"?>
+<w:ftr xmlns:wpc="http://schemas.microsoft.com/office/word/2010/wordprocessingCanvas" xmlns:cx="http://schemas.microsoft.com/office/drawing/2014/chartex" xmlns:cx1="http://schemas.microsoft.com/office/drawing/2015/9/8/chartex" xmlns:cx2="http://schemas.microsoft.com/office/drawing/2015/10/21/chartex" xmlns:cx3="http://schemas.microsoft.com/office/drawing/2016/5/9/chartex" xmlns:cx4="http://schemas.microsoft.com/office/drawing/2016/5/10/chartex" xmlns:cx5="http://schemas.microsoft.com/office/drawing/2016/5/11/chartex" xmlns:cx6="http://schemas.microsoft.com/office/drawing/2016/5/12/chartex" xmlns:cx7="http://schemas.microsoft.com/office/drawing/2016/5/13/chartex" xmlns:cx8="http://schemas.microsoft.com/office/drawing/2016/5/14/chartex" xmlns:mc="http://schemas.openxmlformats.org/markup-compatibility/2006" xmlns:aink="http://schemas.microsoft.com/office/drawing/2016/ink" xmlns:am3d="http://schemas.microsoft.com/office/drawing/2017/model3d" xmlns:o="urn:schemas-microsoft-com:office:office" xmlns:oel="http://schemas.microsoft.com/office/2019/extlst" xmlns:r="http://schemas.openxmlformats.org/officeDocument/2006/relationships" xmlns:m="http://schemas.openxmlformats.org/officeDocument/2006/math" xmlns:v="urn:schemas-microsoft-com:vml" xmlns:wp14="http://schemas.microsoft.com/office/word/2010/wordprocessingDrawing" xmlns:wp="http://schemas.openxmlformats.org/drawingml/2006/wordprocessingDrawing" xmlns:w10="urn:schemas-microsoft-com:office:word" xmlns:w="http://schemas.openxmlformats.org/wordprocessingml/2006/main" xmlns:w14="http://schemas.microsoft.com/office/word/2010/wordml" xmlns:w15="http://schemas.microsoft.com/office/word/2012/wordml" xmlns:w16cex="http://schemas.microsoft.com/office/word/2018/wordml/cex" xmlns:w16cid="http://schemas.microsoft.com/office/word/2016/wordml/cid" xmlns:w16="http://schemas.microsoft.com/office/word/2018/wordml" xmlns:w16sdtdh="http://schemas.microsoft.com/office/word/2020/wordml/sdtdatahash" xmlns:w16se="http://schemas.microsoft.com/office/word/2015/wordml/symex" xmlns:wpg="http://schemas.microsoft.com/office/word/2010/wordprocessingGroup" xmlns:wpi="http://schemas.microsoft.com/office/word/2010/wordprocessingInk" xmlns:wne="http://schemas.microsoft.com/office/word/2006/wordml" xmlns:wps="http://schemas.microsoft.com/office/word/2010/wordprocessingShape" mc:Ignorable="w14 w15 w16se w16cid w16 w16cex w16sdtdh wp14">
+  <w:p>
+    <w:pPr>
+      <w:jc w:val="center"/>
+    </w:pPr>
+    <w:r>
+      <w:rPr>
+        <w:sz w:val="20"/>
+        <w:szCs w:val="20"/>
+      </w:rPr>
+      <w:fldChar w:fldCharType="begin"/>
+    </w:r>
+    <w:r>
+      <w:rPr>
+        <w:sz w:val="20"/>
+        <w:szCs w:val="20"/>
+      </w:rPr>
+      <w:instrText>PAGE</w:instrText>
+    </w:r>
+    <w:r>
+      <w:rPr>
+        <w:sz w:val="20"/>
+        <w:szCs w:val="20"/>
+      </w:rPr>
+      <w:fldChar w:fldCharType="separate"/>
+    </w:r>
+    <w:r>
+      <w:rPr>
+        <w:noProof/>
+        <w:sz w:val="20"/>
+        <w:szCs w:val="20"/>
+      </w:rPr>
+      <w:t>23</w:t>
+    </w:r>
+    <w:r>
+      <w:rPr>
+        <w:sz w:val="20"/>
+        <w:szCs w:val="20"/>
+      </w:rPr>
+      <w:fldChar w:fldCharType="end"/>
+    </w:r>
+  </w:p>
+</w:ftr>
+</file>
+
 <file path=word/footnotes.xml><?xml version="1.0" encoding="utf-8"?>
 <w:footnotes xmlns:wpc="http://schemas.microsoft.com/office/word/2010/wordprocessingCanvas" xmlns:cx="http://schemas.microsoft.com/office/drawing/2014/chartex" xmlns:cx1="http://schemas.microsoft.com/office/drawing/2015/9/8/chartex" xmlns:cx2="http://schemas.microsoft.com/office/drawing/2015/10/21/chartex" xmlns:cx3="http://schemas.microsoft.com/office/drawing/2016/5/9/chartex" xmlns:cx4="http://schemas.microsoft.com/office/drawing/2016/5/10/chartex" xmlns:cx5="http://schemas.microsoft.com/office/drawing/2016/5/11/chartex" xmlns:cx6="http://schemas.microsoft.com/office/drawing/2016/5/12/chartex" xmlns:cx7="http://schemas.microsoft.com/office/drawing/2016/5/13/chartex" xmlns:cx8="http://schemas.microsoft.com/office/drawing/2016/5/14/chartex" xmlns:mc="http://schemas.openxmlformats.org/markup-compatibility/2006" xmlns:aink="http://schemas.microsoft.com/office/drawing/2016/ink" xmlns:am3d="http://schemas.microsoft.com/office/drawing/2017/model3d" xmlns:o="urn:schemas-microsoft-com:office:office" xmlns:oel="http://schemas.microsoft.com/office/2019/extlst" xmlns:r="http://schemas.openxmlformats.org/officeDocument/2006/relationships" xmlns:m="http://schemas.openxmlformats.org/officeDocument/2006/math" xmlns:v="urn:schemas-microsoft-com:vml" xmlns:wp14="http://schemas.microsoft.com/office/word/2010/wordprocessingDrawing" xmlns:wp="http://schemas.openxmlformats.org/drawingml/2006/wordprocessingDrawing" xmlns:w10="urn:schemas-microsoft-com:office:word" xmlns:w="http://schemas.openxmlformats.org/wordprocessingml/2006/main" xmlns:w14="http://schemas.microsoft.com/office/word/2010/wordml" xmlns:w15="http://schemas.microsoft.com/office/word/2012/wordml" xmlns:w16cex="http://schemas.microsoft.com/office/word/2018/wordml/cex" xmlns:w16cid="http://schemas.microsoft.com/office/word/2016/wordml/cid" xmlns:w16="http://schemas.microsoft.com/office/word/2018/wordml" xmlns:w16sdtdh="http://schemas.microsoft.com/office/word/2020/wordml/sdtdatahash" xmlns:w16se="http://schemas.microsoft.com/office/word/2015/wordml/symex" xmlns:wpg="http://schemas.microsoft.com/office/word/2010/wordprocessingGroup" xmlns:wpi="http://schemas.microsoft.com/office/word/2010/wordprocessingInk" xmlns:wne="http://schemas.microsoft.com/office/word/2006/wordml" xmlns:wps="http://schemas.microsoft.com/office/word/2010/wordprocessingShape" mc:Ignorable="w14 w15 w16se w16cid w16 w16cex w16sdtdh wp14">
   <w:footnote w:type="separator" w:id="-1">
@@ -12698,10 +15035,64 @@
 <file path=word/numbering.xml><?xml version="1.0" encoding="utf-8"?>
 <w:numbering xmlns:wpc="http://schemas.microsoft.com/office/word/2010/wordprocessingCanvas" xmlns:cx="http://schemas.microsoft.com/office/drawing/2014/chartex" xmlns:cx1="http://schemas.microsoft.com/office/drawing/2015/9/8/chartex" xmlns:cx2="http://schemas.microsoft.com/office/drawing/2015/10/21/chartex" xmlns:cx3="http://schemas.microsoft.com/office/drawing/2016/5/9/chartex" xmlns:cx4="http://schemas.microsoft.com/office/drawing/2016/5/10/chartex" xmlns:cx5="http://schemas.microsoft.com/office/drawing/2016/5/11/chartex" xmlns:cx6="http://schemas.microsoft.com/office/drawing/2016/5/12/chartex" xmlns:cx7="http://schemas.microsoft.com/office/drawing/2016/5/13/chartex" xmlns:cx8="http://schemas.microsoft.com/office/drawing/2016/5/14/chartex" xmlns:mc="http://schemas.openxmlformats.org/markup-compatibility/2006" xmlns:aink="http://schemas.microsoft.com/office/drawing/2016/ink" xmlns:am3d="http://schemas.microsoft.com/office/drawing/2017/model3d" xmlns:o="urn:schemas-microsoft-com:office:office" xmlns:oel="http://schemas.microsoft.com/office/2019/extlst" xmlns:r="http://schemas.openxmlformats.org/officeDocument/2006/relationships" xmlns:m="http://schemas.openxmlformats.org/officeDocument/2006/math" xmlns:v="urn:schemas-microsoft-com:vml" xmlns:wp14="http://schemas.microsoft.com/office/word/2010/wordprocessingDrawing" xmlns:wp="http://schemas.openxmlformats.org/drawingml/2006/wordprocessingDrawing" xmlns:w10="urn:schemas-microsoft-com:office:word" xmlns:w="http://schemas.openxmlformats.org/wordprocessingml/2006/main" xmlns:w14="http://schemas.microsoft.com/office/word/2010/wordml" xmlns:w15="http://schemas.microsoft.com/office/word/2012/wordml" xmlns:w16cex="http://schemas.microsoft.com/office/word/2018/wordml/cex" xmlns:w16cid="http://schemas.microsoft.com/office/word/2016/wordml/cid" xmlns:w16="http://schemas.microsoft.com/office/word/2018/wordml" xmlns:w16sdtdh="http://schemas.microsoft.com/office/word/2020/wordml/sdtdatahash" xmlns:w16se="http://schemas.microsoft.com/office/word/2015/wordml/symex" xmlns:wpg="http://schemas.microsoft.com/office/word/2010/wordprocessingGroup" xmlns:wpi="http://schemas.microsoft.com/office/word/2010/wordprocessingInk" xmlns:wne="http://schemas.microsoft.com/office/word/2006/wordml" xmlns:wps="http://schemas.microsoft.com/office/word/2010/wordprocessingShape" mc:Ignorable="w14 w15 w16se w16cid w16 w16cex w16sdtdh wp14">
   <w:abstractNum w:abstractNumId="0" w15:restartNumberingAfterBreak="0">
-    <w:nsid w:val="5A5424E1"/>
+    <w:nsid w:val="040F5A34"/>
     <w:multiLevelType w:val="hybridMultilevel"/>
-    <w:tmpl w:val="F28CABE8"/>
-    <w:lvl w:ilvl="0" w:tplc="7E7033EE" w:tentative="1">
+    <w:tmpl w:val="A600C720"/>
+    <w:lvl w:ilvl="0" w:tplc="B8A66AC6">
+      <w:start w:val="1"/>
+      <w:numFmt w:val="bullet"/>
+      <w:lvlText w:val="•"/>
+      <w:lvlJc w:val="left"/>
+      <w:pPr>
+        <w:ind w:left="540" w:hanging="270"/>
+      </w:pPr>
+    </w:lvl>
+    <w:lvl w:ilvl="1" w:tplc="C70CD4EE">
+      <w:numFmt w:val="decimal"/>
+      <w:lvlText w:val=""/>
+      <w:lvlJc w:val="left"/>
+    </w:lvl>
+    <w:lvl w:ilvl="2" w:tplc="51F0CBA8">
+      <w:numFmt w:val="decimal"/>
+      <w:lvlText w:val=""/>
+      <w:lvlJc w:val="left"/>
+    </w:lvl>
+    <w:lvl w:ilvl="3" w:tplc="90D0293C">
+      <w:numFmt w:val="decimal"/>
+      <w:lvlText w:val=""/>
+      <w:lvlJc w:val="left"/>
+    </w:lvl>
+    <w:lvl w:ilvl="4" w:tplc="35788E72">
+      <w:numFmt w:val="decimal"/>
+      <w:lvlText w:val=""/>
+      <w:lvlJc w:val="left"/>
+    </w:lvl>
+    <w:lvl w:ilvl="5" w:tplc="4CD04798">
+      <w:numFmt w:val="decimal"/>
+      <w:lvlText w:val=""/>
+      <w:lvlJc w:val="left"/>
+    </w:lvl>
+    <w:lvl w:ilvl="6" w:tplc="289A0054">
+      <w:numFmt w:val="decimal"/>
+      <w:lvlText w:val=""/>
+      <w:lvlJc w:val="left"/>
+    </w:lvl>
+    <w:lvl w:ilvl="7" w:tplc="E22081F6">
+      <w:numFmt w:val="decimal"/>
+      <w:lvlText w:val=""/>
+      <w:lvlJc w:val="left"/>
+    </w:lvl>
+    <w:lvl w:ilvl="8" w:tplc="521EC00C">
+      <w:numFmt w:val="decimal"/>
+      <w:lvlText w:val=""/>
+      <w:lvlJc w:val="left"/>
+    </w:lvl>
+  </w:abstractNum>
+  <w:abstractNum w:abstractNumId="1" w15:restartNumberingAfterBreak="0">
+    <w:nsid w:val="27A3459F"/>
+    <w:multiLevelType w:val="hybridMultilevel"/>
+    <w:tmpl w:val="630C538C"/>
+    <w:lvl w:ilvl="0" w:tplc="7A163EF8" w:tentative="1">
       <w:start w:val="1"/>
       <w:numFmt w:val="bullet"/>
       <w:lvlText w:val="●"/>
@@ -12710,7 +15101,7 @@
         <w:ind w:left="720" w:hanging="360"/>
       </w:pPr>
     </w:lvl>
-    <w:lvl w:ilvl="1" w:tplc="836E7736" w:tentative="1">
+    <w:lvl w:ilvl="1" w:tplc="1AD4984C" w:tentative="1">
       <w:start w:val="1"/>
       <w:numFmt w:val="bullet"/>
       <w:lvlText w:val="○"/>
@@ -12719,7 +15110,7 @@
         <w:ind w:left="1440" w:hanging="360"/>
       </w:pPr>
     </w:lvl>
-    <w:lvl w:ilvl="2" w:tplc="BE5EB804" w:tentative="1">
+    <w:lvl w:ilvl="2" w:tplc="1D5A7BDC" w:tentative="1">
       <w:start w:val="1"/>
       <w:numFmt w:val="bullet"/>
       <w:lvlText w:val="■"/>
@@ -12728,7 +15119,7 @@
         <w:ind w:left="2160" w:hanging="360"/>
       </w:pPr>
     </w:lvl>
-    <w:lvl w:ilvl="3" w:tplc="1402EBE2" w:tentative="1">
+    <w:lvl w:ilvl="3" w:tplc="39DAC552" w:tentative="1">
       <w:start w:val="1"/>
       <w:numFmt w:val="bullet"/>
       <w:lvlText w:val="●"/>
@@ -12737,7 +15128,7 @@
         <w:ind w:left="2880" w:hanging="360"/>
       </w:pPr>
     </w:lvl>
-    <w:lvl w:ilvl="4" w:tplc="FA64550C" w:tentative="1">
+    <w:lvl w:ilvl="4" w:tplc="6964991C" w:tentative="1">
       <w:start w:val="1"/>
       <w:numFmt w:val="bullet"/>
       <w:lvlText w:val="○"/>
@@ -12746,7 +15137,7 @@
         <w:ind w:left="3600" w:hanging="360"/>
       </w:pPr>
     </w:lvl>
-    <w:lvl w:ilvl="5" w:tplc="3DBA67DC" w:tentative="1">
+    <w:lvl w:ilvl="5" w:tplc="31DAE6DC" w:tentative="1">
       <w:start w:val="1"/>
       <w:numFmt w:val="bullet"/>
       <w:lvlText w:val="■"/>
@@ -12755,7 +15146,7 @@
         <w:ind w:left="4320" w:hanging="360"/>
       </w:pPr>
     </w:lvl>
-    <w:lvl w:ilvl="6" w:tplc="C22C8A6E" w:tentative="1">
+    <w:lvl w:ilvl="6" w:tplc="4392AFEC" w:tentative="1">
       <w:start w:val="1"/>
       <w:numFmt w:val="bullet"/>
       <w:lvlText w:val="●"/>
@@ -12764,7 +15155,7 @@
         <w:ind w:left="5040" w:hanging="360"/>
       </w:pPr>
     </w:lvl>
-    <w:lvl w:ilvl="7" w:tplc="24D8F6B0" w:tentative="1">
+    <w:lvl w:ilvl="7" w:tplc="85F44532" w:tentative="1">
       <w:start w:val="1"/>
       <w:numFmt w:val="bullet"/>
       <w:lvlText w:val="●"/>
@@ -12773,7 +15164,7 @@
         <w:ind w:left="5760" w:hanging="360"/>
       </w:pPr>
     </w:lvl>
-    <w:lvl w:ilvl="8" w:tplc="6C0449D4" w:tentative="1">
+    <w:lvl w:ilvl="8" w:tplc="230A8C62" w:tentative="1">
       <w:start w:val="1"/>
       <w:numFmt w:val="bullet"/>
       <w:lvlText w:val="●"/>
@@ -12783,68 +15174,14 @@
       </w:pPr>
     </w:lvl>
   </w:abstractNum>
-  <w:abstractNum w:abstractNumId="1" w15:restartNumberingAfterBreak="0">
-    <w:nsid w:val="6D9004EF"/>
-    <w:multiLevelType w:val="hybridMultilevel"/>
-    <w:tmpl w:val="E98C408E"/>
-    <w:lvl w:ilvl="0" w:tplc="EEC8FD46">
-      <w:start w:val="1"/>
-      <w:numFmt w:val="bullet"/>
-      <w:lvlText w:val="•"/>
-      <w:lvlJc w:val="left"/>
-      <w:pPr>
-        <w:ind w:left="540" w:hanging="270"/>
-      </w:pPr>
-    </w:lvl>
-    <w:lvl w:ilvl="1" w:tplc="0D14FC26">
-      <w:numFmt w:val="decimal"/>
-      <w:lvlText w:val=""/>
-      <w:lvlJc w:val="left"/>
-    </w:lvl>
-    <w:lvl w:ilvl="2" w:tplc="C9682030">
-      <w:numFmt w:val="decimal"/>
-      <w:lvlText w:val=""/>
-      <w:lvlJc w:val="left"/>
-    </w:lvl>
-    <w:lvl w:ilvl="3" w:tplc="13F27498">
-      <w:numFmt w:val="decimal"/>
-      <w:lvlText w:val=""/>
-      <w:lvlJc w:val="left"/>
-    </w:lvl>
-    <w:lvl w:ilvl="4" w:tplc="8E026B30">
-      <w:numFmt w:val="decimal"/>
-      <w:lvlText w:val=""/>
-      <w:lvlJc w:val="left"/>
-    </w:lvl>
-    <w:lvl w:ilvl="5" w:tplc="73AACF78">
-      <w:numFmt w:val="decimal"/>
-      <w:lvlText w:val=""/>
-      <w:lvlJc w:val="left"/>
-    </w:lvl>
-    <w:lvl w:ilvl="6" w:tplc="A9641088">
-      <w:numFmt w:val="decimal"/>
-      <w:lvlText w:val=""/>
-      <w:lvlJc w:val="left"/>
-    </w:lvl>
-    <w:lvl w:ilvl="7" w:tplc="9484310E">
-      <w:numFmt w:val="decimal"/>
-      <w:lvlText w:val=""/>
-      <w:lvlJc w:val="left"/>
-    </w:lvl>
-    <w:lvl w:ilvl="8" w:tplc="582AA540">
-      <w:numFmt w:val="decimal"/>
-      <w:lvlText w:val=""/>
-      <w:lvlJc w:val="left"/>
-    </w:lvl>
-  </w:abstractNum>
-  <w:num w:numId="1" w16cid:durableId="451553216">
-    <w:abstractNumId w:val="0"/>
+  <w:num w:numId="1" w16cid:durableId="609358740">
+    <w:abstractNumId w:val="1"/>
     <w:lvlOverride w:ilvl="0">
       <w:startOverride w:val="1"/>
     </w:lvlOverride>
   </w:num>
-  <w:num w:numId="2" w16cid:durableId="509757602">
-    <w:abstractNumId w:val="1"/>
+  <w:num w:numId="2" w16cid:durableId="2097171218">
+    <w:abstractNumId w:val="0"/>
     <w:lvlOverride w:ilvl="0">
       <w:startOverride w:val="1"/>
     </w:lvlOverride>

</xml_diff>

<commit_message>
Sistema solo interno del hotel: sin rol Cliente ni registro público
- API: se elimina el rol Cliente; POST /auth/register pasa a ser el
  registro interno (solo Administrador, con rol del personal y sin
  devolver token); el login rechaza cuentas sin rol del hotel (403);
  Google solo entra con cuentas ya registradas; reservas solo para
  Administración y Recepción; clients deja de estar ligado a users.
- Web: sin pantallas de cliente; /registro dentro del panel del
  Administrador; el login ya no ofrece crear cuenta.
- Pruebas: 90 en Pest y 17 en Vitest, incluidas las de que nadie de
  afuera puede registrarse ni entrar.
- k6, documentación, diagrama de BD, diseño y bocetos de la app móvil
  e informe del 25% actualizados.

Co-Authored-By: Claude Opus 5.5 <noreply@anthropic.com>
</commit_message>
<xml_diff>
--- a/docs/informes/LeGrandHotel_Entrega_25.docx
+++ b/docs/informes/LeGrandHotel_Entrega_25.docx
@@ -34,7 +34,7 @@
           <w:noProof/>
         </w:rPr>
         <w:drawing>
-          <wp:inline distT="0" distB="0" distL="0" distR="0" wp14:anchorId="2AC97543" wp14:editId="0DA45EE3">
+          <wp:inline distT="0" distB="0" distL="0" distR="0" wp14:anchorId="43781861" wp14:editId="714C1ADA">
             <wp:extent cx="1800225" cy="1076325"/>
             <wp:effectExtent l="0" t="0" r="0" b="0"/>
             <wp:docPr id="1" name="Imagen 1"/>
@@ -254,7 +254,7 @@
     <w:sdt>
       <w:sdtPr>
         <w:alias w:val="Índice"/>
-        <w:id w:val="338664397"/>
+        <w:id w:val="680701924"/>
       </w:sdtPr>
       <w:sdtEndPr/>
       <w:sdtContent>
@@ -280,7 +280,7 @@
           <w:r>
             <w:fldChar w:fldCharType="separate"/>
           </w:r>
-          <w:hyperlink w:anchor="_Toc243980359" w:history="1">
+          <w:hyperlink w:anchor="_Toc243981731" w:history="1">
             <w:r>
               <w:rPr>
                 <w:rStyle w:val="Hipervnculo"/>
@@ -304,7 +304,7 @@
               <w:rPr>
                 <w:noProof/>
               </w:rPr>
-              <w:instrText xml:space="preserve"> PAGEREF _Toc243980359 \h </w:instrText>
+              <w:instrText xml:space="preserve"> PAGEREF _Toc243981731 \h </w:instrText>
             </w:r>
             <w:r>
               <w:rPr>
@@ -344,7 +344,7 @@
               <w14:ligatures w14:val="standardContextual"/>
             </w:rPr>
           </w:pPr>
-          <w:hyperlink w:anchor="_Toc243980360" w:history="1">
+          <w:hyperlink w:anchor="_Toc243981732" w:history="1">
             <w:r>
               <w:rPr>
                 <w:rStyle w:val="Hipervnculo"/>
@@ -368,7 +368,7 @@
               <w:rPr>
                 <w:noProof/>
               </w:rPr>
-              <w:instrText xml:space="preserve"> PAGEREF _Toc243980360 \h </w:instrText>
+              <w:instrText xml:space="preserve"> PAGEREF _Toc243981732 \h </w:instrText>
             </w:r>
             <w:r>
               <w:rPr>
@@ -408,7 +408,7 @@
               <w14:ligatures w14:val="standardContextual"/>
             </w:rPr>
           </w:pPr>
-          <w:hyperlink w:anchor="_Toc243980361" w:history="1">
+          <w:hyperlink w:anchor="_Toc243981733" w:history="1">
             <w:r>
               <w:rPr>
                 <w:rStyle w:val="Hipervnculo"/>
@@ -432,7 +432,7 @@
               <w:rPr>
                 <w:noProof/>
               </w:rPr>
-              <w:instrText xml:space="preserve"> PAGEREF _Toc243980361 \h </w:instrText>
+              <w:instrText xml:space="preserve"> PAGEREF _Toc243981733 \h </w:instrText>
             </w:r>
             <w:r>
               <w:rPr>
@@ -472,7 +472,7 @@
               <w14:ligatures w14:val="standardContextual"/>
             </w:rPr>
           </w:pPr>
-          <w:hyperlink w:anchor="_Toc243980362" w:history="1">
+          <w:hyperlink w:anchor="_Toc243981734" w:history="1">
             <w:r>
               <w:rPr>
                 <w:rStyle w:val="Hipervnculo"/>
@@ -496,7 +496,7 @@
               <w:rPr>
                 <w:noProof/>
               </w:rPr>
-              <w:instrText xml:space="preserve"> PAGEREF _Toc243980362 \h </w:instrText>
+              <w:instrText xml:space="preserve"> PAGEREF _Toc243981734 \h </w:instrText>
             </w:r>
             <w:r>
               <w:rPr>
@@ -536,7 +536,7 @@
               <w14:ligatures w14:val="standardContextual"/>
             </w:rPr>
           </w:pPr>
-          <w:hyperlink w:anchor="_Toc243980363" w:history="1">
+          <w:hyperlink w:anchor="_Toc243981735" w:history="1">
             <w:r>
               <w:rPr>
                 <w:rStyle w:val="Hipervnculo"/>
@@ -560,7 +560,7 @@
               <w:rPr>
                 <w:noProof/>
               </w:rPr>
-              <w:instrText xml:space="preserve"> PAGEREF _Toc243980363 \h </w:instrText>
+              <w:instrText xml:space="preserve"> PAGEREF _Toc243981735 \h </w:instrText>
             </w:r>
             <w:r>
               <w:rPr>
@@ -600,7 +600,7 @@
               <w14:ligatures w14:val="standardContextual"/>
             </w:rPr>
           </w:pPr>
-          <w:hyperlink w:anchor="_Toc243980364" w:history="1">
+          <w:hyperlink w:anchor="_Toc243981736" w:history="1">
             <w:r>
               <w:rPr>
                 <w:rStyle w:val="Hipervnculo"/>
@@ -624,7 +624,7 @@
               <w:rPr>
                 <w:noProof/>
               </w:rPr>
-              <w:instrText xml:space="preserve"> PAGEREF _Toc243980364 \h </w:instrText>
+              <w:instrText xml:space="preserve"> PAGEREF _Toc243981736 \h </w:instrText>
             </w:r>
             <w:r>
               <w:rPr>
@@ -664,7 +664,7 @@
               <w14:ligatures w14:val="standardContextual"/>
             </w:rPr>
           </w:pPr>
-          <w:hyperlink w:anchor="_Toc243980365" w:history="1">
+          <w:hyperlink w:anchor="_Toc243981737" w:history="1">
             <w:r>
               <w:rPr>
                 <w:rStyle w:val="Hipervnculo"/>
@@ -688,7 +688,7 @@
               <w:rPr>
                 <w:noProof/>
               </w:rPr>
-              <w:instrText xml:space="preserve"> PAGEREF _Toc243980365 \h </w:instrText>
+              <w:instrText xml:space="preserve"> PAGEREF _Toc243981737 \h </w:instrText>
             </w:r>
             <w:r>
               <w:rPr>
@@ -728,7 +728,7 @@
               <w14:ligatures w14:val="standardContextual"/>
             </w:rPr>
           </w:pPr>
-          <w:hyperlink w:anchor="_Toc243980366" w:history="1">
+          <w:hyperlink w:anchor="_Toc243981738" w:history="1">
             <w:r>
               <w:rPr>
                 <w:rStyle w:val="Hipervnculo"/>
@@ -752,7 +752,7 @@
               <w:rPr>
                 <w:noProof/>
               </w:rPr>
-              <w:instrText xml:space="preserve"> PAGEREF _Toc243980366 \h </w:instrText>
+              <w:instrText xml:space="preserve"> PAGEREF _Toc243981738 \h </w:instrText>
             </w:r>
             <w:r>
               <w:rPr>
@@ -792,7 +792,7 @@
               <w14:ligatures w14:val="standardContextual"/>
             </w:rPr>
           </w:pPr>
-          <w:hyperlink w:anchor="_Toc243980367" w:history="1">
+          <w:hyperlink w:anchor="_Toc243981739" w:history="1">
             <w:r>
               <w:rPr>
                 <w:rStyle w:val="Hipervnculo"/>
@@ -816,7 +816,7 @@
               <w:rPr>
                 <w:noProof/>
               </w:rPr>
-              <w:instrText xml:space="preserve"> PAGEREF _Toc243980367 \h </w:instrText>
+              <w:instrText xml:space="preserve"> PAGEREF _Toc243981739 \h </w:instrText>
             </w:r>
             <w:r>
               <w:rPr>
@@ -856,7 +856,7 @@
               <w14:ligatures w14:val="standardContextual"/>
             </w:rPr>
           </w:pPr>
-          <w:hyperlink w:anchor="_Toc243980368" w:history="1">
+          <w:hyperlink w:anchor="_Toc243981740" w:history="1">
             <w:r>
               <w:rPr>
                 <w:rStyle w:val="Hipervnculo"/>
@@ -880,7 +880,7 @@
               <w:rPr>
                 <w:noProof/>
               </w:rPr>
-              <w:instrText xml:space="preserve"> PAGEREF _Toc243980368 \h </w:instrText>
+              <w:instrText xml:space="preserve"> PAGEREF _Toc243981740 \h </w:instrText>
             </w:r>
             <w:r>
               <w:rPr>
@@ -920,7 +920,7 @@
               <w14:ligatures w14:val="standardContextual"/>
             </w:rPr>
           </w:pPr>
-          <w:hyperlink w:anchor="_Toc243980369" w:history="1">
+          <w:hyperlink w:anchor="_Toc243981741" w:history="1">
             <w:r>
               <w:rPr>
                 <w:rStyle w:val="Hipervnculo"/>
@@ -944,7 +944,7 @@
               <w:rPr>
                 <w:noProof/>
               </w:rPr>
-              <w:instrText xml:space="preserve"> PAGEREF _Toc243980369 \h </w:instrText>
+              <w:instrText xml:space="preserve"> PAGEREF _Toc243981741 \h </w:instrText>
             </w:r>
             <w:r>
               <w:rPr>
@@ -984,7 +984,7 @@
               <w14:ligatures w14:val="standardContextual"/>
             </w:rPr>
           </w:pPr>
-          <w:hyperlink w:anchor="_Toc243980370" w:history="1">
+          <w:hyperlink w:anchor="_Toc243981742" w:history="1">
             <w:r>
               <w:rPr>
                 <w:rStyle w:val="Hipervnculo"/>
@@ -1008,7 +1008,7 @@
               <w:rPr>
                 <w:noProof/>
               </w:rPr>
-              <w:instrText xml:space="preserve"> PAGEREF _Toc243980370 \h </w:instrText>
+              <w:instrText xml:space="preserve"> PAGEREF _Toc243981742 \h </w:instrText>
             </w:r>
             <w:r>
               <w:rPr>
@@ -1025,7 +1025,7 @@
               <w:rPr>
                 <w:noProof/>
               </w:rPr>
-              <w:t>11</w:t>
+              <w:t>12</w:t>
             </w:r>
             <w:r>
               <w:rPr>
@@ -1048,7 +1048,7 @@
               <w14:ligatures w14:val="standardContextual"/>
             </w:rPr>
           </w:pPr>
-          <w:hyperlink w:anchor="_Toc243980371" w:history="1">
+          <w:hyperlink w:anchor="_Toc243981743" w:history="1">
             <w:r>
               <w:rPr>
                 <w:rStyle w:val="Hipervnculo"/>
@@ -1072,7 +1072,7 @@
               <w:rPr>
                 <w:noProof/>
               </w:rPr>
-              <w:instrText xml:space="preserve"> PAGEREF _Toc243980371 \h </w:instrText>
+              <w:instrText xml:space="preserve"> PAGEREF _Toc243981743 \h </w:instrText>
             </w:r>
             <w:r>
               <w:rPr>
@@ -1112,7 +1112,7 @@
               <w14:ligatures w14:val="standardContextual"/>
             </w:rPr>
           </w:pPr>
-          <w:hyperlink w:anchor="_Toc243980372" w:history="1">
+          <w:hyperlink w:anchor="_Toc243981744" w:history="1">
             <w:r>
               <w:rPr>
                 <w:rStyle w:val="Hipervnculo"/>
@@ -1136,7 +1136,7 @@
               <w:rPr>
                 <w:noProof/>
               </w:rPr>
-              <w:instrText xml:space="preserve"> PAGEREF _Toc243980372 \h </w:instrText>
+              <w:instrText xml:space="preserve"> PAGEREF _Toc243981744 \h </w:instrText>
             </w:r>
             <w:r>
               <w:rPr>
@@ -1176,7 +1176,7 @@
               <w14:ligatures w14:val="standardContextual"/>
             </w:rPr>
           </w:pPr>
-          <w:hyperlink w:anchor="_Toc243980373" w:history="1">
+          <w:hyperlink w:anchor="_Toc243981745" w:history="1">
             <w:r>
               <w:rPr>
                 <w:rStyle w:val="Hipervnculo"/>
@@ -1200,7 +1200,7 @@
               <w:rPr>
                 <w:noProof/>
               </w:rPr>
-              <w:instrText xml:space="preserve"> PAGEREF _Toc243980373 \h </w:instrText>
+              <w:instrText xml:space="preserve"> PAGEREF _Toc243981745 \h </w:instrText>
             </w:r>
             <w:r>
               <w:rPr>
@@ -1240,7 +1240,7 @@
               <w14:ligatures w14:val="standardContextual"/>
             </w:rPr>
           </w:pPr>
-          <w:hyperlink w:anchor="_Toc243980374" w:history="1">
+          <w:hyperlink w:anchor="_Toc243981746" w:history="1">
             <w:r>
               <w:rPr>
                 <w:rStyle w:val="Hipervnculo"/>
@@ -1264,7 +1264,7 @@
               <w:rPr>
                 <w:noProof/>
               </w:rPr>
-              <w:instrText xml:space="preserve"> PAGEREF _Toc243980374 \h </w:instrText>
+              <w:instrText xml:space="preserve"> PAGEREF _Toc243981746 \h </w:instrText>
             </w:r>
             <w:r>
               <w:rPr>
@@ -1304,7 +1304,7 @@
               <w14:ligatures w14:val="standardContextual"/>
             </w:rPr>
           </w:pPr>
-          <w:hyperlink w:anchor="_Toc243980375" w:history="1">
+          <w:hyperlink w:anchor="_Toc243981747" w:history="1">
             <w:r>
               <w:rPr>
                 <w:rStyle w:val="Hipervnculo"/>
@@ -1328,7 +1328,7 @@
               <w:rPr>
                 <w:noProof/>
               </w:rPr>
-              <w:instrText xml:space="preserve"> PAGEREF _Toc243980375 \h </w:instrText>
+              <w:instrText xml:space="preserve"> PAGEREF _Toc243981747 \h </w:instrText>
             </w:r>
             <w:r>
               <w:rPr>
@@ -1368,7 +1368,7 @@
               <w14:ligatures w14:val="standardContextual"/>
             </w:rPr>
           </w:pPr>
-          <w:hyperlink w:anchor="_Toc243980376" w:history="1">
+          <w:hyperlink w:anchor="_Toc243981748" w:history="1">
             <w:r>
               <w:rPr>
                 <w:rStyle w:val="Hipervnculo"/>
@@ -1392,7 +1392,7 @@
               <w:rPr>
                 <w:noProof/>
               </w:rPr>
-              <w:instrText xml:space="preserve"> PAGEREF _Toc243980376 \h </w:instrText>
+              <w:instrText xml:space="preserve"> PAGEREF _Toc243981748 \h </w:instrText>
             </w:r>
             <w:r>
               <w:rPr>
@@ -1432,7 +1432,7 @@
               <w14:ligatures w14:val="standardContextual"/>
             </w:rPr>
           </w:pPr>
-          <w:hyperlink w:anchor="_Toc243980377" w:history="1">
+          <w:hyperlink w:anchor="_Toc243981749" w:history="1">
             <w:r>
               <w:rPr>
                 <w:rStyle w:val="Hipervnculo"/>
@@ -1456,7 +1456,7 @@
               <w:rPr>
                 <w:noProof/>
               </w:rPr>
-              <w:instrText xml:space="preserve"> PAGEREF _Toc243980377 \h </w:instrText>
+              <w:instrText xml:space="preserve"> PAGEREF _Toc243981749 \h </w:instrText>
             </w:r>
             <w:r>
               <w:rPr>
@@ -1496,7 +1496,7 @@
               <w14:ligatures w14:val="standardContextual"/>
             </w:rPr>
           </w:pPr>
-          <w:hyperlink w:anchor="_Toc243980378" w:history="1">
+          <w:hyperlink w:anchor="_Toc243981750" w:history="1">
             <w:r>
               <w:rPr>
                 <w:rStyle w:val="Hipervnculo"/>
@@ -1520,7 +1520,7 @@
               <w:rPr>
                 <w:noProof/>
               </w:rPr>
-              <w:instrText xml:space="preserve"> PAGEREF _Toc243980378 \h </w:instrText>
+              <w:instrText xml:space="preserve"> PAGEREF _Toc243981750 \h </w:instrText>
             </w:r>
             <w:r>
               <w:rPr>
@@ -1560,7 +1560,7 @@
               <w14:ligatures w14:val="standardContextual"/>
             </w:rPr>
           </w:pPr>
-          <w:hyperlink w:anchor="_Toc243980379" w:history="1">
+          <w:hyperlink w:anchor="_Toc243981751" w:history="1">
             <w:r>
               <w:rPr>
                 <w:rStyle w:val="Hipervnculo"/>
@@ -1584,7 +1584,7 @@
               <w:rPr>
                 <w:noProof/>
               </w:rPr>
-              <w:instrText xml:space="preserve"> PAGEREF _Toc243980379 \h </w:instrText>
+              <w:instrText xml:space="preserve"> PAGEREF _Toc243981751 \h </w:instrText>
             </w:r>
             <w:r>
               <w:rPr>
@@ -1624,7 +1624,7 @@
               <w14:ligatures w14:val="standardContextual"/>
             </w:rPr>
           </w:pPr>
-          <w:hyperlink w:anchor="_Toc243980380" w:history="1">
+          <w:hyperlink w:anchor="_Toc243981752" w:history="1">
             <w:r>
               <w:rPr>
                 <w:rStyle w:val="Hipervnculo"/>
@@ -1648,7 +1648,7 @@
               <w:rPr>
                 <w:noProof/>
               </w:rPr>
-              <w:instrText xml:space="preserve"> PAGEREF _Toc243980380 \h </w:instrText>
+              <w:instrText xml:space="preserve"> PAGEREF _Toc243981752 \h </w:instrText>
             </w:r>
             <w:r>
               <w:rPr>
@@ -1692,7 +1692,7 @@
         <w:pStyle w:val="Ttulo1"/>
         <w:keepNext/>
       </w:pPr>
-      <w:bookmarkStart w:id="0" w:name="_Toc243980359"/>
+      <w:bookmarkStart w:id="0" w:name="_Toc243981731"/>
       <w:r>
         <w:lastRenderedPageBreak/>
         <w:t>1. Alcance de la entrega del 25%</w:t>
@@ -2122,7 +2122,7 @@
                 <w:sz w:val="20"/>
                 <w:szCs w:val="20"/>
               </w:rPr>
-              <w:t>POST /auth/register y POST /auth/login con validaciones propias y pantallas separadas /registro y /login</w:t>
+              <w:t>POST /auth/register (registro interno: solo el Administrador crea cuentas) y POST /auth/login, con validaciones propias y pantallas separadas /registro y /login</w:t>
             </w:r>
           </w:p>
         </w:tc>
@@ -2207,7 +2207,7 @@
         <w:pStyle w:val="Ttulo1"/>
         <w:keepNext/>
       </w:pPr>
-      <w:bookmarkStart w:id="1" w:name="_Toc243980360"/>
+      <w:bookmarkStart w:id="1" w:name="_Toc243981732"/>
       <w:r>
         <w:t>2. Descripción del proyecto</w:t>
       </w:r>
@@ -2218,7 +2218,10 @@
         <w:spacing w:after="120" w:line="300" w:lineRule="auto"/>
       </w:pPr>
       <w:r>
-        <w:t>LeGrandHotel es un sistema web de gestión de hospedaje. Cubre habitaciones y tipos, reservas y estadías (check-in y check-out), cochera, clientes, personal e inventario. Lo usan cinco tipos de usuario: Administrador, Recepcionista, Almacenero, Cliente y Programador. Además de la página web se diseñó una aplicación móvil para Android e iOS que usará la misma API (sección 8.7).</w:t>
+        <w:t>LeGrandHotel es un sistema web de gestión de hospedaje. Cubre habitaciones y tipos, reservas y estadías (check-in y check-out), cochera, clientes, personal e inventario. Es un sistema interno: lo usa solo el personal del hotel, con cuatro roles (Administrador, Recepcionista, Almacenero y Programador). No tiene registro público: las cuentas las crea el Administrador, y los huéspedes no entran al sistema, solo existen como fichas que llena recepción. Además de la página web se diseñó una aplicación móvil para</w:t>
+      </w:r>
+      <w:r>
+        <w:t xml:space="preserve"> Android e iOS que usará la misma API (sección 8.7).</w:t>
       </w:r>
     </w:p>
     <w:p>
@@ -2226,7 +2229,7 @@
         <w:pStyle w:val="Ttulo2"/>
         <w:keepNext/>
       </w:pPr>
-      <w:bookmarkStart w:id="2" w:name="_Toc243980361"/>
+      <w:bookmarkStart w:id="2" w:name="_Toc243981733"/>
       <w:r>
         <w:t>2.1 Tecnologías</w:t>
       </w:r>
@@ -2712,7 +2715,7 @@
         <w:pStyle w:val="Ttulo1"/>
         <w:keepNext/>
       </w:pPr>
-      <w:bookmarkStart w:id="3" w:name="_Toc243980362"/>
+      <w:bookmarkStart w:id="3" w:name="_Toc243981734"/>
       <w:r>
         <w:lastRenderedPageBreak/>
         <w:t>3. Arquitectura y entorno cloud</w:t>
@@ -2738,7 +2741,7 @@
           <w:noProof/>
         </w:rPr>
         <w:drawing>
-          <wp:inline distT="0" distB="0" distL="0" distR="0" wp14:anchorId="75D8F23E" wp14:editId="1ED2352D">
+          <wp:inline distT="0" distB="0" distL="0" distR="0" wp14:anchorId="0FAF0054" wp14:editId="47AC55FB">
             <wp:extent cx="5762625" cy="4038600"/>
             <wp:effectExtent l="0" t="0" r="0" b="0"/>
             <wp:docPr id="4" name="Imagen 4"/>
@@ -2797,7 +2800,7 @@
         <w:pStyle w:val="Ttulo2"/>
         <w:keepNext/>
       </w:pPr>
-      <w:bookmarkStart w:id="4" w:name="_Toc243980363"/>
+      <w:bookmarkStart w:id="4" w:name="_Toc243981735"/>
       <w:r>
         <w:t>3.1 Recursos del entorno (Terraform)</w:t>
       </w:r>
@@ -3703,7 +3706,7 @@
         <w:pStyle w:val="Ttulo2"/>
         <w:keepNext/>
       </w:pPr>
-      <w:bookmarkStart w:id="5" w:name="_Toc243980364"/>
+      <w:bookmarkStart w:id="5" w:name="_Toc243981736"/>
       <w:r>
         <w:t>3.2 Costo estimado</w:t>
       </w:r>
@@ -4026,7 +4029,7 @@
         <w:pStyle w:val="Ttulo1"/>
         <w:keepNext/>
       </w:pPr>
-      <w:bookmarkStart w:id="6" w:name="_Toc243980365"/>
+      <w:bookmarkStart w:id="6" w:name="_Toc243981737"/>
       <w:r>
         <w:t>4. Endpoints definidos</w:t>
       </w:r>
@@ -4287,7 +4290,7 @@
                 <w:sz w:val="20"/>
                 <w:szCs w:val="20"/>
               </w:rPr>
-              <w:t>POST /auth/register</w:t>
+              <w:t>POST /auth/register (registro interno)</w:t>
             </w:r>
           </w:p>
         </w:tc>
@@ -4314,7 +4317,7 @@
                 <w:sz w:val="20"/>
                 <w:szCs w:val="20"/>
               </w:rPr>
-              <w:t>Público (3/min)</w:t>
+              <w:t>Solo Admin (3/min)</w:t>
             </w:r>
           </w:p>
         </w:tc>
@@ -4813,7 +4816,7 @@
                 <w:sz w:val="20"/>
                 <w:szCs w:val="20"/>
               </w:rPr>
-              <w:t>Admin, Recepción, Cliente</w:t>
+              <w:t>Admin, Recepción</w:t>
             </w:r>
           </w:p>
         </w:tc>
@@ -4842,7 +4845,7 @@
                 <w:sz w:val="20"/>
                 <w:szCs w:val="20"/>
               </w:rPr>
-              <w:t>Clientes</w:t>
+              <w:t>Clientes (fichas de huéspedes)</w:t>
             </w:r>
           </w:p>
         </w:tc>
@@ -4869,7 +4872,7 @@
                 <w:sz w:val="20"/>
                 <w:szCs w:val="20"/>
               </w:rPr>
-              <w:t>CRUD /clients · GET, PUT /me/client</w:t>
+              <w:t>CRUD /clients</w:t>
             </w:r>
           </w:p>
         </w:tc>
@@ -4896,7 +4899,7 @@
                 <w:sz w:val="20"/>
                 <w:szCs w:val="20"/>
               </w:rPr>
-              <w:t>Admin, Recepción · Cliente</w:t>
+              <w:t>Admin, Recepción</w:t>
             </w:r>
           </w:p>
         </w:tc>
@@ -4979,7 +4982,7 @@
                 <w:sz w:val="20"/>
                 <w:szCs w:val="20"/>
               </w:rPr>
-              <w:t>Admin, Recepción, Cliente (solo las suyas)</w:t>
+              <w:t>Admin, Recepción</w:t>
             </w:r>
           </w:p>
         </w:tc>
@@ -5493,7 +5496,7 @@
                 <w:sz w:val="17"/>
                 <w:szCs w:val="17"/>
               </w:rPr>
-              <w:t>Route::prefix('auth')-&gt;group(function () {</w:t>
+              <w:t>// Público: solo el login (no existe registro público).</w:t>
             </w:r>
           </w:p>
           <w:p>
@@ -5503,7 +5506,7 @@
                 <w:sz w:val="17"/>
                 <w:szCs w:val="17"/>
               </w:rPr>
-              <w:t xml:space="preserve">    Route::post('register', [AuthController::class, 'register'])</w:t>
+              <w:t>Route::post('auth/login', [AuthController::class, 'login'])</w:t>
             </w:r>
           </w:p>
           <w:p>
@@ -5513,7 +5516,7 @@
                 <w:sz w:val="17"/>
                 <w:szCs w:val="17"/>
               </w:rPr>
-              <w:t xml:space="preserve">        -&gt;middleware('throttle:register');</w:t>
+              <w:t xml:space="preserve">    -&gt;middleware('throttle:login');</w:t>
             </w:r>
           </w:p>
           <w:p>
@@ -5523,7 +5526,7 @@
                 <w:sz w:val="17"/>
                 <w:szCs w:val="17"/>
               </w:rPr>
-              <w:t xml:space="preserve">    Route::post('login', [AuthController::class, 'login'])</w:t>
+              <w:t xml:space="preserve"> </w:t>
             </w:r>
           </w:p>
           <w:p>
@@ -5533,7 +5536,7 @@
                 <w:sz w:val="17"/>
                 <w:szCs w:val="17"/>
               </w:rPr>
-              <w:t xml:space="preserve">        -&gt;middleware('throttle:login');</w:t>
+              <w:t>Route::middleware(['auth:sanctum', 'throttle:api'])-&gt;group(function () {</w:t>
             </w:r>
           </w:p>
           <w:p>
@@ -5543,7 +5546,7 @@
                 <w:sz w:val="17"/>
                 <w:szCs w:val="17"/>
               </w:rPr>
-              <w:t>});</w:t>
+              <w:t xml:space="preserve">    Route::get('auth/me', [AuthController::class, 'me']);</w:t>
             </w:r>
           </w:p>
           <w:p>
@@ -5553,7 +5556,7 @@
                 <w:sz w:val="17"/>
                 <w:szCs w:val="17"/>
               </w:rPr>
-              <w:t xml:space="preserve"> </w:t>
+              <w:t xml:space="preserve">    // Registro interno: solo el Administrador crea cuentas.</w:t>
             </w:r>
           </w:p>
           <w:p>
@@ -5563,7 +5566,7 @@
                 <w:sz w:val="17"/>
                 <w:szCs w:val="17"/>
               </w:rPr>
-              <w:t>Route::middleware(['auth:sanctum', 'throttle:api'])-&gt;group(function () {</w:t>
+              <w:t xml:space="preserve">    Route::post('auth/register', [AuthController::class, 'register'])</w:t>
             </w:r>
           </w:p>
           <w:p>
@@ -5573,7 +5576,7 @@
                 <w:sz w:val="17"/>
                 <w:szCs w:val="17"/>
               </w:rPr>
-              <w:t xml:space="preserve">    Route::get('auth/me', [AuthController::class, 'me']);</w:t>
+              <w:t xml:space="preserve">        -&gt;middleware(['role:admin', 'throttle:register']);</w:t>
             </w:r>
           </w:p>
           <w:p>
@@ -5641,7 +5644,7 @@
         <w:t xml:space="preserve">Por qué se usó: </w:t>
       </w:r>
       <w:r>
-        <w:t>todas las rutas se declaran en un solo archivo, agrupadas por quién puede usarlas. Las públicas (registro y login) llevan su propio límite de intentos; el resto exige un token de Sanctum y, cuando corresponde, un rol. Laravel agrega el prefijo /api/v1, así una versión futura de la API puede convivir con esta sin romper el frontend.</w:t>
+        <w:t>todas las rutas se declaran en un solo archivo, agrupadas por quién puede usarlas. La única ruta pública es el login, con su propio límite de intentos. El registro está dentro del grupo protegido y además exige el rol de Administrador, así que nadie de afuera puede crearse una cuenta. El resto exige un token de Sanctum y, cuando corresponde, un rol. Laravel agrega el prefijo /api/v1, así una versión futura de la API puede convivir con esta sin romper el frontend.</w:t>
       </w:r>
     </w:p>
     <w:p>
@@ -5649,7 +5652,7 @@
         <w:pStyle w:val="Ttulo2"/>
         <w:keepNext/>
       </w:pPr>
-      <w:bookmarkStart w:id="7" w:name="_Toc243980366"/>
+      <w:bookmarkStart w:id="7" w:name="_Toc243981738"/>
       <w:r>
         <w:t>4.1 Formato único de respuesta</w:t>
       </w:r>
@@ -5921,7 +5924,7 @@
         <w:pStyle w:val="Ttulo2"/>
         <w:keepNext/>
       </w:pPr>
-      <w:bookmarkStart w:id="8" w:name="_Toc243980367"/>
+      <w:bookmarkStart w:id="8" w:name="_Toc243981739"/>
       <w:r>
         <w:t>4.2 Códigos HTTP</w:t>
       </w:r>
@@ -6688,7 +6691,7 @@
         <w:pStyle w:val="Ttulo1"/>
         <w:keepNext/>
       </w:pPr>
-      <w:bookmarkStart w:id="9" w:name="_Toc243980368"/>
+      <w:bookmarkStart w:id="9" w:name="_Toc243981740"/>
       <w:r>
         <w:lastRenderedPageBreak/>
         <w:t>5. Registro y login diferenciados</w:t>
@@ -6700,7 +6703,7 @@
         <w:spacing w:after="120" w:line="300" w:lineRule="auto"/>
       </w:pPr>
       <w:r>
-        <w:t>El registro y el inicio de sesión son dos endpoints, dos validaciones (FormRequest) y dos pantallas distintas:</w:t>
+        <w:t>LeGrandHotel es un sistema interno del hotel, así que el registro no es público: lo hace el Administrador desde su panel para dar de alta a una persona del personal. El registro y el inicio de sesión son dos endpoints, dos validaciones (FormRequest) y dos pantallas distintas:</w:t>
       </w:r>
     </w:p>
     <w:tbl>
@@ -6913,7 +6916,7 @@
                 <w:sz w:val="20"/>
                 <w:szCs w:val="20"/>
               </w:rPr>
-              <w:t>Pantalla</w:t>
+              <w:t>Quién lo usa</w:t>
             </w:r>
           </w:p>
         </w:tc>
@@ -6940,7 +6943,7 @@
                 <w:sz w:val="20"/>
                 <w:szCs w:val="20"/>
               </w:rPr>
-              <w:t>/registro</w:t>
+              <w:t>Solo el Administrador (con sesión iniciada)</w:t>
             </w:r>
           </w:p>
         </w:tc>
@@ -6967,7 +6970,7 @@
                 <w:sz w:val="20"/>
                 <w:szCs w:val="20"/>
               </w:rPr>
-              <w:t>/login</w:t>
+              <w:t>Cualquier persona del personal</w:t>
             </w:r>
           </w:p>
         </w:tc>
@@ -6996,7 +6999,7 @@
                 <w:sz w:val="20"/>
                 <w:szCs w:val="20"/>
               </w:rPr>
-              <w:t>Datos</w:t>
+              <w:t>Pantalla</w:t>
             </w:r>
           </w:p>
         </w:tc>
@@ -7023,7 +7026,7 @@
                 <w:sz w:val="20"/>
                 <w:szCs w:val="20"/>
               </w:rPr>
-              <w:t>Nombre, correo, contraseña (2 veces), tipo y número de documento, teléfono, nacionalidad</w:t>
+              <w:t>/registro, dentro del panel de administración</w:t>
             </w:r>
           </w:p>
         </w:tc>
@@ -7050,7 +7053,7 @@
                 <w:sz w:val="20"/>
                 <w:szCs w:val="20"/>
               </w:rPr>
-              <w:t>Correo y contraseña</w:t>
+              <w:t>/login, pública</w:t>
             </w:r>
           </w:p>
         </w:tc>
@@ -7079,7 +7082,7 @@
                 <w:sz w:val="20"/>
                 <w:szCs w:val="20"/>
               </w:rPr>
-              <w:t>Validación</w:t>
+              <w:t>Datos</w:t>
             </w:r>
           </w:p>
         </w:tc>
@@ -7106,7 +7109,7 @@
                 <w:sz w:val="20"/>
                 <w:szCs w:val="20"/>
               </w:rPr>
-              <w:t>Correo y documento únicos; contraseña ≥ 8 con letras y números</w:t>
+              <w:t>Nombre, correo, contraseña (2 veces) y rol: Recepcionista, Almacenero, Programador o Administrador</w:t>
             </w:r>
           </w:p>
         </w:tc>
@@ -7133,7 +7136,7 @@
                 <w:sz w:val="20"/>
                 <w:szCs w:val="20"/>
               </w:rPr>
-              <w:t>Credenciales contra el hash bcrypt</w:t>
+              <w:t>Correo y contraseña</w:t>
             </w:r>
           </w:p>
         </w:tc>
@@ -7162,7 +7165,7 @@
                 <w:sz w:val="20"/>
                 <w:szCs w:val="20"/>
               </w:rPr>
-              <w:t>Resultado</w:t>
+              <w:t>Validación</w:t>
             </w:r>
           </w:p>
         </w:tc>
@@ -7189,7 +7192,7 @@
                 <w:sz w:val="20"/>
                 <w:szCs w:val="20"/>
               </w:rPr>
-              <w:t>Crea la cuenta con rol Cliente y su ficha de huésped; envía correo de verificación; devuelve token</w:t>
+              <w:t>Correo único; contraseña ≥ 8 con letras y números; rol interno</w:t>
             </w:r>
           </w:p>
         </w:tc>
@@ -7216,7 +7219,7 @@
                 <w:sz w:val="20"/>
                 <w:szCs w:val="20"/>
               </w:rPr>
-              <w:t>Devuelve token Bearer de 60 minutos y los roles del usuario</w:t>
+              <w:t>Credenciales contra el hash bcrypt; la cuenta debe tener un rol del hotel</w:t>
             </w:r>
           </w:p>
         </w:tc>
@@ -7245,6 +7248,89 @@
                 <w:sz w:val="20"/>
                 <w:szCs w:val="20"/>
               </w:rPr>
+              <w:t>Resultado</w:t>
+            </w:r>
+          </w:p>
+        </w:tc>
+        <w:tc>
+          <w:tcPr>
+            <w:tcW w:w="3779" w:type="dxa"/>
+            <w:tcBorders>
+              <w:top w:val="single" w:sz="4" w:space="0" w:color="000000"/>
+              <w:left w:val="single" w:sz="4" w:space="0" w:color="000000"/>
+              <w:bottom w:val="single" w:sz="4" w:space="0" w:color="000000"/>
+              <w:right w:val="single" w:sz="4" w:space="0" w:color="000000"/>
+            </w:tcBorders>
+            <w:tcMar>
+              <w:top w:w="60" w:type="dxa"/>
+              <w:left w:w="90" w:type="dxa"/>
+              <w:bottom w:w="60" w:type="dxa"/>
+              <w:right w:w="90" w:type="dxa"/>
+            </w:tcMar>
+            <w:vAlign w:val="center"/>
+          </w:tcPr>
+          <w:p>
+            <w:r>
+              <w:rPr>
+                <w:sz w:val="20"/>
+                <w:szCs w:val="20"/>
+              </w:rPr>
+              <w:t>Crea la cuenta con su rol y envía el correo de verificación. No inicia sesión por la persona</w:t>
+            </w:r>
+          </w:p>
+        </w:tc>
+        <w:tc>
+          <w:tcPr>
+            <w:tcW w:w="3779" w:type="dxa"/>
+            <w:tcBorders>
+              <w:top w:val="single" w:sz="4" w:space="0" w:color="000000"/>
+              <w:left w:val="single" w:sz="4" w:space="0" w:color="000000"/>
+              <w:bottom w:val="single" w:sz="4" w:space="0" w:color="000000"/>
+              <w:right w:val="single" w:sz="4" w:space="0" w:color="000000"/>
+            </w:tcBorders>
+            <w:tcMar>
+              <w:top w:w="60" w:type="dxa"/>
+              <w:left w:w="90" w:type="dxa"/>
+              <w:bottom w:w="60" w:type="dxa"/>
+              <w:right w:w="90" w:type="dxa"/>
+            </w:tcMar>
+            <w:vAlign w:val="center"/>
+          </w:tcPr>
+          <w:p>
+            <w:r>
+              <w:rPr>
+                <w:sz w:val="20"/>
+                <w:szCs w:val="20"/>
+              </w:rPr>
+              <w:t>Devuelve un token Bearer de 60 minutos y los roles del usuario</w:t>
+            </w:r>
+          </w:p>
+        </w:tc>
+      </w:tr>
+      <w:tr>
+        <w:tc>
+          <w:tcPr>
+            <w:tcW w:w="1512" w:type="dxa"/>
+            <w:tcBorders>
+              <w:top w:val="single" w:sz="4" w:space="0" w:color="000000"/>
+              <w:left w:val="single" w:sz="4" w:space="0" w:color="000000"/>
+              <w:bottom w:val="single" w:sz="4" w:space="0" w:color="000000"/>
+              <w:right w:val="single" w:sz="4" w:space="0" w:color="000000"/>
+            </w:tcBorders>
+            <w:tcMar>
+              <w:top w:w="60" w:type="dxa"/>
+              <w:left w:w="90" w:type="dxa"/>
+              <w:bottom w:w="60" w:type="dxa"/>
+              <w:right w:w="90" w:type="dxa"/>
+            </w:tcMar>
+            <w:vAlign w:val="center"/>
+          </w:tcPr>
+          <w:p>
+            <w:r>
+              <w:rPr>
+                <w:sz w:val="20"/>
+                <w:szCs w:val="20"/>
+              </w:rPr>
               <w:t>Errores</w:t>
             </w:r>
           </w:p>
@@ -7272,7 +7358,7 @@
                 <w:sz w:val="20"/>
                 <w:szCs w:val="20"/>
               </w:rPr>
-              <w:t>422 con detalle por campo; 429 al 4.º intento por minuto</w:t>
+              <w:t>401 sin sesión; 403 si no es Administrador; 422 por campo; 429 al 4.º registro por minuto</w:t>
             </w:r>
           </w:p>
         </w:tc>
@@ -7299,7 +7385,7 @@
                 <w:sz w:val="20"/>
                 <w:szCs w:val="20"/>
               </w:rPr>
-              <w:t>401 credenciales incorrectas; 429 al 6.º intento por minuto</w:t>
+              <w:t>401 credenciales incorrectas; 403 cuenta sin rol del hotel; 429 al 6.º intento por minuto</w:t>
             </w:r>
           </w:p>
         </w:tc>
@@ -7315,7 +7401,7 @@
         <w:spacing w:after="120" w:line="300" w:lineRule="auto"/>
       </w:pPr>
       <w:r>
-        <w:t>La contraseña nunca se guarda en texto plano: el modelo User usa el cast «hashed» (bcrypt, 12 rondas). Tras iniciar sesión, cada rol entra a su propio inicio: el personal al Panel, el Cliente a «Mis reservas» y el Programador a su vista de diagnóstico.</w:t>
+        <w:t>La contraseña nunca se guarda en texto plano: el modelo User usa el cast «hashed» (bcrypt, 12 rondas). Tras iniciar sesión, cada rol entra a su propio inicio: Administración, Recepción y Almacén al Panel, y el Programador a su vista de diagnóstico. El login con Google solo deja entrar a correos que ya son cuentas del personal: nunca crea cuentas nuevas.</w:t>
       </w:r>
     </w:p>
     <w:p>
@@ -7329,7 +7415,7 @@
           <w:noProof/>
         </w:rPr>
         <w:drawing>
-          <wp:inline distT="0" distB="0" distL="0" distR="0" wp14:anchorId="014ED48C" wp14:editId="483CA021">
+          <wp:inline distT="0" distB="0" distL="0" distR="0" wp14:anchorId="396B5241" wp14:editId="653F59CF">
             <wp:extent cx="5400675" cy="3371850"/>
             <wp:effectExtent l="0" t="0" r="0" b="0"/>
             <wp:docPr id="5" name="Imagen 5"/>
@@ -7395,7 +7481,7 @@
         </w:rPr>
         <w:lastRenderedPageBreak/>
         <w:drawing>
-          <wp:inline distT="0" distB="0" distL="0" distR="0" wp14:anchorId="58D7DE57" wp14:editId="6C79986E">
+          <wp:inline distT="0" distB="0" distL="0" distR="0" wp14:anchorId="4A653E01" wp14:editId="2908841B">
             <wp:extent cx="5400675" cy="3371850"/>
             <wp:effectExtent l="0" t="0" r="0" b="0"/>
             <wp:docPr id="6" name="Imagen 6"/>
@@ -7446,7 +7532,7 @@
           <w:sz w:val="20"/>
           <w:szCs w:val="20"/>
         </w:rPr>
-        <w:t>Figura 3. Pantalla de registro de huésped (/registro), separada del login.</w:t>
+        <w:t>Figura 3. Registro de usuarios del personal (/registro), solo para el Administrador y separado del login.</w:t>
       </w:r>
     </w:p>
     <w:p>
@@ -7460,7 +7546,7 @@
           <w:noProof/>
         </w:rPr>
         <w:drawing>
-          <wp:inline distT="0" distB="0" distL="0" distR="0" wp14:anchorId="0FD99239" wp14:editId="28CB5BAA">
+          <wp:inline distT="0" distB="0" distL="0" distR="0" wp14:anchorId="46C0CE2F" wp14:editId="6DB2BAC3">
             <wp:extent cx="5400675" cy="3371850"/>
             <wp:effectExtent l="0" t="0" r="0" b="0"/>
             <wp:docPr id="7" name="Imagen 7"/>
@@ -7613,7 +7699,7 @@
                 <w:sz w:val="17"/>
                 <w:szCs w:val="17"/>
               </w:rPr>
-              <w:t xml:space="preserve">        'name'            =&gt; ['required', 'string', 'max:120'],</w:t>
+              <w:t xml:space="preserve">        'name'     =&gt; ['required', 'string', 'max:120'],</w:t>
             </w:r>
           </w:p>
           <w:p>
@@ -7623,7 +7709,7 @@
                 <w:sz w:val="17"/>
                 <w:szCs w:val="17"/>
               </w:rPr>
-              <w:t xml:space="preserve">        'email'           =&gt; ['required', 'email', 'unique:users,email'],</w:t>
+              <w:t xml:space="preserve">        'email'    =&gt; ['required', 'email', 'unique:users,email'],</w:t>
             </w:r>
           </w:p>
           <w:p>
@@ -7633,7 +7719,7 @@
                 <w:sz w:val="17"/>
                 <w:szCs w:val="17"/>
               </w:rPr>
-              <w:t xml:space="preserve">        'password'        =&gt; ['required', 'confirmed',</w:t>
+              <w:t xml:space="preserve">        'password' =&gt; ['required', 'confirmed',</w:t>
             </w:r>
           </w:p>
           <w:p>
@@ -7643,7 +7729,7 @@
                 <w:sz w:val="17"/>
                 <w:szCs w:val="17"/>
               </w:rPr>
-              <w:t xml:space="preserve">                              Password::min(8)-&gt;letters()-&gt;numbers()],</w:t>
+              <w:t xml:space="preserve">                       Password::min(8)-&gt;letters()-&gt;numbers()],</w:t>
             </w:r>
           </w:p>
           <w:p>
@@ -7653,17 +7739,7 @@
                 <w:sz w:val="17"/>
                 <w:szCs w:val="17"/>
               </w:rPr>
-              <w:t xml:space="preserve">        'document_type'   =&gt; ['required', Rule::in(Client::DOCUMENT_TYPES)],</w:t>
-            </w:r>
-          </w:p>
-          <w:p>
-            <w:r>
-              <w:rPr>
-                <w:rFonts w:ascii="Consolas" w:eastAsia="Consolas" w:hAnsi="Consolas" w:cs="Consolas"/>
-                <w:sz w:val="17"/>
-                <w:szCs w:val="17"/>
-              </w:rPr>
-              <w:t xml:space="preserve">        'document_number' =&gt; ['required', 'unique:clients,document_number'],</w:t>
+              <w:t xml:space="preserve">        'role'     =&gt; ['required', Rule::in(Role::INTERNAL)],   // solo roles del hotel</w:t>
             </w:r>
           </w:p>
           <w:p>
@@ -7701,7 +7777,7 @@
         <w:t xml:space="preserve">Por qué se usó: </w:t>
       </w:r>
       <w:r>
-        <w:t>el registro tiene su propia validación, distinta de la del login. Se valida antes de llegar al controlador: si un dato falla, Laravel responde 422 con el mensaje de cada campo y el formulario lo muestra junto al campo. Las reglas unique evitan correos o documentos duplicados.</w:t>
+        <w:t>el registro tiene su propia validación, distinta de la del login. Se valida antes de llegar al controlador: si un dato falla, Laravel responde 422 con el mensaje de cada campo y el formulario lo muestra junto al campo. La regla Rule::in(Role::INTERNAL) solo acepta roles del personal, así no se puede crear ningún tipo de cuenta externa.</w:t>
       </w:r>
     </w:p>
     <w:p>
@@ -7802,7 +7878,7 @@
                 <w:sz w:val="17"/>
                 <w:szCs w:val="17"/>
               </w:rPr>
-              <w:t xml:space="preserve">        $user = User::create([...]);              // la contraseña se guarda con bcrypt</w:t>
+              <w:t xml:space="preserve">        $user = User::create([...]);           // la contraseña se guarda con bcrypt</w:t>
             </w:r>
           </w:p>
           <w:p>
@@ -7812,7 +7888,7 @@
                 <w:sz w:val="17"/>
                 <w:szCs w:val="17"/>
               </w:rPr>
-              <w:t xml:space="preserve">        $user-&gt;assignRole(Role::CLIENT);           // todo registro público es Cliente</w:t>
+              <w:t xml:space="preserve">        $user-&gt;assignRole($data['role']);       // rol del personal elegido por el admin</w:t>
             </w:r>
           </w:p>
           <w:p>
@@ -7822,7 +7898,7 @@
                 <w:sz w:val="17"/>
                 <w:szCs w:val="17"/>
               </w:rPr>
-              <w:t xml:space="preserve">        Client::create(['user_id' =&gt; $user-&gt;id, ...]);</w:t>
+              <w:t xml:space="preserve">        return $user;</w:t>
             </w:r>
           </w:p>
           <w:p>
@@ -7832,7 +7908,7 @@
                 <w:sz w:val="17"/>
                 <w:szCs w:val="17"/>
               </w:rPr>
-              <w:t xml:space="preserve">        return $user;</w:t>
+              <w:t xml:space="preserve">    });</w:t>
             </w:r>
           </w:p>
           <w:p>
@@ -7842,7 +7918,7 @@
                 <w:sz w:val="17"/>
                 <w:szCs w:val="17"/>
               </w:rPr>
-              <w:t xml:space="preserve">    });</w:t>
+              <w:t xml:space="preserve">    event(new Registered($user));               // envía el correo de verificación</w:t>
             </w:r>
           </w:p>
           <w:p>
@@ -7852,7 +7928,7 @@
                 <w:sz w:val="17"/>
                 <w:szCs w:val="17"/>
               </w:rPr>
-              <w:t xml:space="preserve">    event(new Registered($user));                  // envía el correo de verificación</w:t>
+              <w:t xml:space="preserve">    return ApiResponse::created(self::userPayloadFor($user));   // sin token</w:t>
             </w:r>
           </w:p>
           <w:p>
@@ -7862,7 +7938,7 @@
                 <w:sz w:val="17"/>
                 <w:szCs w:val="17"/>
               </w:rPr>
-              <w:t xml:space="preserve">    return ApiResponse::created($this-&gt;tokenPayload($user, 'web'));</w:t>
+              <w:t>}</w:t>
             </w:r>
           </w:p>
           <w:p>
@@ -7872,7 +7948,7 @@
                 <w:sz w:val="17"/>
                 <w:szCs w:val="17"/>
               </w:rPr>
-              <w:t>}</w:t>
+              <w:t xml:space="preserve"> </w:t>
             </w:r>
           </w:p>
           <w:p>
@@ -7882,7 +7958,7 @@
                 <w:sz w:val="17"/>
                 <w:szCs w:val="17"/>
               </w:rPr>
-              <w:t xml:space="preserve"> </w:t>
+              <w:t>public function login(LoginRequest $request): JsonResponse</w:t>
             </w:r>
           </w:p>
           <w:p>
@@ -7892,7 +7968,7 @@
                 <w:sz w:val="17"/>
                 <w:szCs w:val="17"/>
               </w:rPr>
-              <w:t>public function login(LoginRequest $request): JsonResponse</w:t>
+              <w:t>{</w:t>
             </w:r>
           </w:p>
           <w:p>
@@ -7902,7 +7978,7 @@
                 <w:sz w:val="17"/>
                 <w:szCs w:val="17"/>
               </w:rPr>
-              <w:t>{</w:t>
+              <w:t xml:space="preserve">    $user = User::where('email', $request-&gt;string('email'))-&gt;first();</w:t>
             </w:r>
           </w:p>
           <w:p>
@@ -7912,7 +7988,7 @@
                 <w:sz w:val="17"/>
                 <w:szCs w:val="17"/>
               </w:rPr>
-              <w:t xml:space="preserve">    $user = User::where('email', $request-&gt;string('email'))-&gt;first();</w:t>
+              <w:t xml:space="preserve">    if (! $user || ! Hash::check($request-&gt;password, $user-&gt;password)) {</w:t>
             </w:r>
           </w:p>
           <w:p>
@@ -7922,7 +7998,7 @@
                 <w:sz w:val="17"/>
                 <w:szCs w:val="17"/>
               </w:rPr>
-              <w:t xml:space="preserve">    if (! $user || ! Hash::check($request-&gt;password, $user-&gt;password)) {</w:t>
+              <w:t xml:space="preserve">        throw new ApiException('INVALID_CREDENTIALS', '...', 401);</w:t>
             </w:r>
           </w:p>
           <w:p>
@@ -7932,7 +8008,27 @@
                 <w:sz w:val="17"/>
                 <w:szCs w:val="17"/>
               </w:rPr>
-              <w:t xml:space="preserve">        throw new ApiException('INVALID_CREDENTIALS', '...', 401);</w:t>
+              <w:t xml:space="preserve">    }</w:t>
+            </w:r>
+          </w:p>
+          <w:p>
+            <w:r>
+              <w:rPr>
+                <w:rFonts w:ascii="Consolas" w:eastAsia="Consolas" w:hAnsi="Consolas" w:cs="Consolas"/>
+                <w:sz w:val="17"/>
+                <w:szCs w:val="17"/>
+              </w:rPr>
+              <w:t xml:space="preserve">    if (! $user-&gt;hasRole(...Role::INTERNAL)) {   // solo personal del hotel</w:t>
+            </w:r>
+          </w:p>
+          <w:p>
+            <w:r>
+              <w:rPr>
+                <w:rFonts w:ascii="Consolas" w:eastAsia="Consolas" w:hAnsi="Consolas" w:cs="Consolas"/>
+                <w:sz w:val="17"/>
+                <w:szCs w:val="17"/>
+              </w:rPr>
+              <w:t xml:space="preserve">        throw new ApiException('ACCOUNT_WITHOUT_ACCESS', '...', 403);</w:t>
             </w:r>
           </w:p>
           <w:p>
@@ -7980,7 +8076,10 @@
         <w:t xml:space="preserve">Por qué se usó: </w:t>
       </w:r>
       <w:r>
-        <w:t>son dos acciones separadas con responsabilidades distintas. El registro crea en una transacción la cuenta, su rol y su ficha de huésped: si algo falla, no queda nada a medias. El login solo compara la contraseña con el hash bcrypt y responde el mismo mensaje si falla el correo o la contraseña, para no revelar qué correos existen. Ambos devuelven un token Bearer de Sanctum que vence a los 60 minutos.</w:t>
+        <w:t>son dos acciones separadas con responsabilidades distintas. El registro lo ejecuta el Administrador: crea en una transacción la cuenta y su rol (si algo falla, no queda nada a medias) y no devuelve token, porque registrar a alguien no es iniciar sesión por esa persona. El login compara la contraseña con el hash bcrypt y responde el mismo mensaje si falla el correo o la contraseña, para no revelar qué correos existen. Además rechaza cualquier cuenta que no tenga un rol del hotel. Solo el login entrega un tok</w:t>
+      </w:r>
+      <w:r>
+        <w:t>en Bearer de Sanctum, que vence a los 60 minutos.</w:t>
       </w:r>
     </w:p>
     <w:p>
@@ -7995,6 +8094,7 @@
           <w:sz w:val="21"/>
           <w:szCs w:val="21"/>
         </w:rPr>
+        <w:lastRenderedPageBreak/>
         <w:t xml:space="preserve">Fragmento 7. </w:t>
       </w:r>
       <w:r>
@@ -8151,7 +8251,17 @@
                 <w:sz w:val="17"/>
                 <w:szCs w:val="17"/>
               </w:rPr>
-              <w:t>RateLimiter::for('register', fn (Request $r) =&gt; Limit::perMinute(3)-&gt;by($r-&gt;ip()));</w:t>
+              <w:t>RateLimiter::for('register', fn (Request $r) =&gt; Limit::perMinute(3)</w:t>
+            </w:r>
+          </w:p>
+          <w:p>
+            <w:r>
+              <w:rPr>
+                <w:rFonts w:ascii="Consolas" w:eastAsia="Consolas" w:hAnsi="Consolas" w:cs="Consolas"/>
+                <w:sz w:val="17"/>
+                <w:szCs w:val="17"/>
+              </w:rPr>
+              <w:t xml:space="preserve">    -&gt;by($r-&gt;user()?-&gt;id ?: $r-&gt;ip()));</w:t>
             </w:r>
           </w:p>
         </w:tc>
@@ -8166,11 +8276,10 @@
           <w:b/>
           <w:bCs/>
         </w:rPr>
-        <w:lastRenderedPageBreak/>
         <w:t xml:space="preserve">Por qué se usó: </w:t>
       </w:r>
       <w:r>
-        <w:t>con el cast hashed, cualquier contraseña que se asigne al usuario se cifra con bcrypt antes de guardarse, sin depender de que cada desarrollador lo recuerde. Los límites de intentos frenan ataques de fuerza bruta: el login permite 5 intentos por minuto por correo e IP y el registro 3 por minuto por IP; al superarlos la API responde 429.</w:t>
+        <w:t>con el cast hashed, cualquier contraseña que se asigne al usuario se cifra con bcrypt antes de guardarse, sin depender de que cada desarrollador lo recuerde. Los límites de intentos frenan ataques de fuerza bruta: el login permite 5 intentos por minuto por correo e IP y el registro 3 por minuto por administrador; al superarlos la API responde 429.</w:t>
       </w:r>
     </w:p>
     <w:p>
@@ -8261,7 +8370,7 @@
                 <w:sz w:val="17"/>
                 <w:szCs w:val="17"/>
               </w:rPr>
-              <w:t xml:space="preserve">  &lt;Route path="/registro" element={&lt;RegisterPage /&gt;} /&gt;</w:t>
+              <w:t>&lt;/Route&gt;</w:t>
             </w:r>
           </w:p>
           <w:p>
@@ -8271,7 +8380,7 @@
                 <w:sz w:val="17"/>
                 <w:szCs w:val="17"/>
               </w:rPr>
-              <w:t>&lt;/Route&gt;</w:t>
+              <w:t xml:space="preserve"> </w:t>
             </w:r>
           </w:p>
           <w:p>
@@ -8281,7 +8390,7 @@
                 <w:sz w:val="17"/>
                 <w:szCs w:val="17"/>
               </w:rPr>
-              <w:t xml:space="preserve"> </w:t>
+              <w:t>&lt;Route element={&lt;ProtectedRoute /&gt;}&gt;</w:t>
             </w:r>
           </w:p>
           <w:p>
@@ -8291,7 +8400,7 @@
                 <w:sz w:val="17"/>
                 <w:szCs w:val="17"/>
               </w:rPr>
-              <w:t>&lt;Route element={&lt;ProtectedRoute /&gt;}&gt;</w:t>
+              <w:t xml:space="preserve">  &lt;Route element={&lt;ProtectedRoute roles={['admin']} /&gt;}&gt;</w:t>
             </w:r>
           </w:p>
           <w:p>
@@ -8301,7 +8410,7 @@
                 <w:sz w:val="17"/>
                 <w:szCs w:val="17"/>
               </w:rPr>
-              <w:t xml:space="preserve">  &lt;Route element={&lt;ProtectedRoute roles={['admin']} /&gt;}&gt;</w:t>
+              <w:t xml:space="preserve">    &lt;Route path="/registro" element={&lt;RegisterPage /&gt;} /&gt;</w:t>
             </w:r>
           </w:p>
           <w:p>
@@ -8349,7 +8458,7 @@
         <w:t xml:space="preserve">Por qué se usó: </w:t>
       </w:r>
       <w:r>
-        <w:t>en el frontend el login y el registro son dos pantallas con su propia ruta. GuestRoute las oculta si ya hay sesión, y ProtectedRoute comprueba la sesión y el rol: si alguien escribe a mano una ruta que su rol no puede ver, se muestra la pantalla 403. El backend valida lo mismo en cada endpoint, así que esconder la pantalla no es la única protección.</w:t>
+        <w:t>en el frontend el login y el registro son dos pantallas con su propia ruta. El login es la única pantalla pública. El registro está dentro de las rutas protegidas del Administrador: sin sesión lleva al login, y con otro rol muestra la pantalla 403 aunque la dirección se escriba a mano. El backend valida lo mismo en cada endpoint, así que esconder la pantalla no es la única protección.</w:t>
       </w:r>
     </w:p>
     <w:p>
@@ -8357,7 +8466,7 @@
         <w:pStyle w:val="Ttulo2"/>
         <w:keepNext/>
       </w:pPr>
-      <w:bookmarkStart w:id="10" w:name="_Toc243980369"/>
+      <w:bookmarkStart w:id="10" w:name="_Toc243981741"/>
       <w:r>
         <w:t>5.1 Pruebas automáticas del registro y login</w:t>
       </w:r>
@@ -8469,7 +8578,7 @@
                 <w:sz w:val="20"/>
                 <w:szCs w:val="20"/>
               </w:rPr>
-              <w:t>Registro crea un Cliente con contraseña bcrypt y devuelve token</w:t>
+              <w:t>El Administrador registra una cuenta del personal con contraseña bcrypt (sin token)</w:t>
             </w:r>
           </w:p>
         </w:tc>
@@ -8525,7 +8634,7 @@
                 <w:sz w:val="20"/>
                 <w:szCs w:val="20"/>
               </w:rPr>
-              <w:t>Registro con datos inválidos responde 422</w:t>
+              <w:t>Nadie de afuera puede registrarse: sin sesión responde 401</w:t>
             </w:r>
           </w:p>
         </w:tc>
@@ -8581,7 +8690,7 @@
                 <w:sz w:val="20"/>
                 <w:szCs w:val="20"/>
               </w:rPr>
-              <w:t>No se permite registrar un correo repetido</w:t>
+              <w:t>Recepción no puede registrar cuentas: responde 403</w:t>
             </w:r>
           </w:p>
         </w:tc>
@@ -8637,7 +8746,7 @@
                 <w:sz w:val="20"/>
                 <w:szCs w:val="20"/>
               </w:rPr>
-              <w:t>Registro limitado a 3 por minuto (429 con Retry-After)</w:t>
+              <w:t>Solo se aceptan roles del hotel; datos inválidos o correo repetido responden 422</w:t>
             </w:r>
           </w:p>
         </w:tc>
@@ -8693,7 +8802,7 @@
                 <w:sz w:val="20"/>
                 <w:szCs w:val="20"/>
               </w:rPr>
-              <w:t>Login con credenciales válidas devuelve token y roles</w:t>
+              <w:t>Registro limitado a 3 por minuto (429 con Retry-After)</w:t>
             </w:r>
           </w:p>
         </w:tc>
@@ -8749,7 +8858,7 @@
                 <w:sz w:val="20"/>
                 <w:szCs w:val="20"/>
               </w:rPr>
-              <w:t>Login con contraseña incorrecta responde 401</w:t>
+              <w:t>Una cuenta sin rol del hotel no puede iniciar sesión (403)</w:t>
             </w:r>
           </w:p>
         </w:tc>
@@ -8805,7 +8914,7 @@
                 <w:sz w:val="20"/>
                 <w:szCs w:val="20"/>
               </w:rPr>
-              <w:t>Login limitado a 5 intentos por minuto</w:t>
+              <w:t>Login con credenciales válidas devuelve token y roles</w:t>
             </w:r>
           </w:p>
         </w:tc>
@@ -8861,7 +8970,7 @@
                 <w:sz w:val="20"/>
                 <w:szCs w:val="20"/>
               </w:rPr>
-              <w:t>Sin token o con token vencido responde 401</w:t>
+              <w:t>Login con contraseña incorrecta responde 401</w:t>
             </w:r>
           </w:p>
         </w:tc>
@@ -8917,7 +9026,120 @@
                 <w:sz w:val="20"/>
                 <w:szCs w:val="20"/>
               </w:rPr>
-              <w:t>Frontend: login y registro son pantallas separadas; errores 401 y 422 visibles (Vitest)</w:t>
+              <w:t>Login limitado a 5 intentos por minuto</w:t>
+            </w:r>
+          </w:p>
+        </w:tc>
+        <w:tc>
+          <w:tcPr>
+            <w:tcW w:w="1649" w:type="dxa"/>
+            <w:tcBorders>
+              <w:top w:val="single" w:sz="4" w:space="0" w:color="000000"/>
+              <w:left w:val="single" w:sz="4" w:space="0" w:color="000000"/>
+              <w:bottom w:val="single" w:sz="4" w:space="0" w:color="000000"/>
+              <w:right w:val="single" w:sz="4" w:space="0" w:color="000000"/>
+            </w:tcBorders>
+            <w:tcMar>
+              <w:top w:w="60" w:type="dxa"/>
+              <w:left w:w="90" w:type="dxa"/>
+              <w:bottom w:w="60" w:type="dxa"/>
+              <w:right w:w="90" w:type="dxa"/>
+            </w:tcMar>
+            <w:vAlign w:val="center"/>
+          </w:tcPr>
+          <w:p>
+            <w:r>
+              <w:rPr>
+                <w:sz w:val="20"/>
+                <w:szCs w:val="20"/>
+              </w:rPr>
+              <w:t>Pasa</w:t>
+            </w:r>
+          </w:p>
+        </w:tc>
+      </w:tr>
+      <w:tr>
+        <w:tc>
+          <w:tcPr>
+            <w:tcW w:w="7421" w:type="dxa"/>
+            <w:tcBorders>
+              <w:top w:val="single" w:sz="4" w:space="0" w:color="000000"/>
+              <w:left w:val="single" w:sz="4" w:space="0" w:color="000000"/>
+              <w:bottom w:val="single" w:sz="4" w:space="0" w:color="000000"/>
+              <w:right w:val="single" w:sz="4" w:space="0" w:color="000000"/>
+            </w:tcBorders>
+            <w:tcMar>
+              <w:top w:w="60" w:type="dxa"/>
+              <w:left w:w="90" w:type="dxa"/>
+              <w:bottom w:w="60" w:type="dxa"/>
+              <w:right w:w="90" w:type="dxa"/>
+            </w:tcMar>
+            <w:vAlign w:val="center"/>
+          </w:tcPr>
+          <w:p>
+            <w:r>
+              <w:rPr>
+                <w:sz w:val="20"/>
+                <w:szCs w:val="20"/>
+              </w:rPr>
+              <w:t>Sin token o con token vencido responde 401</w:t>
+            </w:r>
+          </w:p>
+        </w:tc>
+        <w:tc>
+          <w:tcPr>
+            <w:tcW w:w="1649" w:type="dxa"/>
+            <w:tcBorders>
+              <w:top w:val="single" w:sz="4" w:space="0" w:color="000000"/>
+              <w:left w:val="single" w:sz="4" w:space="0" w:color="000000"/>
+              <w:bottom w:val="single" w:sz="4" w:space="0" w:color="000000"/>
+              <w:right w:val="single" w:sz="4" w:space="0" w:color="000000"/>
+            </w:tcBorders>
+            <w:tcMar>
+              <w:top w:w="60" w:type="dxa"/>
+              <w:left w:w="90" w:type="dxa"/>
+              <w:bottom w:w="60" w:type="dxa"/>
+              <w:right w:w="90" w:type="dxa"/>
+            </w:tcMar>
+            <w:vAlign w:val="center"/>
+          </w:tcPr>
+          <w:p>
+            <w:r>
+              <w:rPr>
+                <w:sz w:val="20"/>
+                <w:szCs w:val="20"/>
+              </w:rPr>
+              <w:t>Pasa</w:t>
+            </w:r>
+          </w:p>
+        </w:tc>
+      </w:tr>
+      <w:tr>
+        <w:tc>
+          <w:tcPr>
+            <w:tcW w:w="7421" w:type="dxa"/>
+            <w:tcBorders>
+              <w:top w:val="single" w:sz="4" w:space="0" w:color="000000"/>
+              <w:left w:val="single" w:sz="4" w:space="0" w:color="000000"/>
+              <w:bottom w:val="single" w:sz="4" w:space="0" w:color="000000"/>
+              <w:right w:val="single" w:sz="4" w:space="0" w:color="000000"/>
+            </w:tcBorders>
+            <w:tcMar>
+              <w:top w:w="60" w:type="dxa"/>
+              <w:left w:w="90" w:type="dxa"/>
+              <w:bottom w:w="60" w:type="dxa"/>
+              <w:right w:w="90" w:type="dxa"/>
+            </w:tcMar>
+            <w:vAlign w:val="center"/>
+          </w:tcPr>
+          <w:p>
+            <w:r>
+              <w:rPr>
+                <w:sz w:val="20"/>
+                <w:szCs w:val="20"/>
+              </w:rPr>
+              <w:lastRenderedPageBreak/>
+              <w:t>Frontend (Vitest): login y registro son pantallas separadas; el login no ofrece registro público; /registro sin sesión lleva al login y con otro rol muestra 403</w:t>
             </w:r>
           </w:p>
         </w:tc>
@@ -8975,7 +9197,7 @@
         <w:pStyle w:val="Ttulo1"/>
         <w:keepNext/>
       </w:pPr>
-      <w:bookmarkStart w:id="11" w:name="_Toc243980370"/>
+      <w:bookmarkStart w:id="11" w:name="_Toc243981742"/>
       <w:r>
         <w:t>6. Registro de incidentes</w:t>
       </w:r>
@@ -9325,7 +9547,6 @@
                 <w:sz w:val="20"/>
                 <w:szCs w:val="20"/>
               </w:rPr>
-              <w:lastRenderedPageBreak/>
               <w:t>26/10/2026</w:t>
             </w:r>
           </w:p>
@@ -9582,7 +9803,7 @@
         <w:pStyle w:val="Ttulo1"/>
         <w:keepNext/>
       </w:pPr>
-      <w:bookmarkStart w:id="12" w:name="_Toc243980371"/>
+      <w:bookmarkStart w:id="12" w:name="_Toc243981743"/>
       <w:r>
         <w:t>7. Conclusiones de la entrega</w:t>
       </w:r>
@@ -9626,7 +9847,7 @@
         <w:pStyle w:val="Ttulo1"/>
         <w:keepNext/>
       </w:pPr>
-      <w:bookmarkStart w:id="13" w:name="_Toc243980372"/>
+      <w:bookmarkStart w:id="13" w:name="_Toc243981744"/>
       <w:r>
         <w:lastRenderedPageBreak/>
         <w:t>8. EXTRAS (adicionales a lo evaluado en el 25%)</w:t>
@@ -9650,7 +9871,7 @@
         <w:pStyle w:val="Ttulo2"/>
         <w:keepNext/>
       </w:pPr>
-      <w:bookmarkStart w:id="14" w:name="_Toc243980373"/>
+      <w:bookmarkStart w:id="14" w:name="_Toc243981745"/>
       <w:r>
         <w:t>8.1 EXTRA: Diagrama de base de datos</w:t>
       </w:r>
@@ -9675,7 +9896,7 @@
           <w:noProof/>
         </w:rPr>
         <w:drawing>
-          <wp:inline distT="0" distB="0" distL="0" distR="0" wp14:anchorId="1C886320" wp14:editId="374F7859">
+          <wp:inline distT="0" distB="0" distL="0" distR="0" wp14:anchorId="7CB3B4EF" wp14:editId="15313CD2">
             <wp:extent cx="7562850" cy="4029075"/>
             <wp:effectExtent l="0" t="0" r="0" b="0"/>
             <wp:docPr id="3" name="Imagen 3"/>
@@ -9741,7 +9962,7 @@
         <w:pStyle w:val="Ttulo2"/>
         <w:keepNext/>
       </w:pPr>
-      <w:bookmarkStart w:id="15" w:name="_Toc243980374"/>
+      <w:bookmarkStart w:id="15" w:name="_Toc243981746"/>
       <w:r>
         <w:lastRenderedPageBreak/>
         <w:t>8.2 EXTRA: Pruebas de rendimiento y estrés con k6 (varias corridas)</w:t>
@@ -9761,7 +9982,7 @@
         <w:spacing w:after="120" w:line="300" w:lineRule="auto"/>
       </w:pPr>
       <w:r>
-        <w:t>Escenario: 70% lecturas (habitaciones disponibles, mis reservas, tipos de habitación), 20% login y 10% creación de reservas. Cada escalón sube en 10 s, mantiene la carga 45 s y baja en 5 s. Meta del plan: p95 menor a 500 ms y 0% de errores.</w:t>
+        <w:t>Escenario (recepción): 70% lecturas (habitaciones disponibles, reservas, tipos de habitación), 20% login y 10% creación de reservas. Cada escalón sube en 10 s, mantiene la carga 45 s y baja en 5 s. Meta del plan: p95 menor a 500 ms y 0% de errores.</w:t>
       </w:r>
     </w:p>
     <w:tbl>
@@ -11297,7 +11518,7 @@
           <w:noProof/>
         </w:rPr>
         <w:drawing>
-          <wp:inline distT="0" distB="0" distL="0" distR="0" wp14:anchorId="7EC8D13C" wp14:editId="790FE201">
+          <wp:inline distT="0" distB="0" distL="0" distR="0" wp14:anchorId="1CF711D8" wp14:editId="4D743EDE">
             <wp:extent cx="5400675" cy="3114675"/>
             <wp:effectExtent l="0" t="0" r="0" b="0"/>
             <wp:docPr id="8" name="Imagen 8"/>
@@ -11363,7 +11584,7 @@
         </w:rPr>
         <w:lastRenderedPageBreak/>
         <w:drawing>
-          <wp:inline distT="0" distB="0" distL="0" distR="0" wp14:anchorId="715E4043" wp14:editId="47D44CF1">
+          <wp:inline distT="0" distB="0" distL="0" distR="0" wp14:anchorId="7F9CBBB6" wp14:editId="3ADA38FE">
             <wp:extent cx="5400675" cy="2971800"/>
             <wp:effectExtent l="0" t="0" r="0" b="0"/>
             <wp:docPr id="9" name="Imagen 9"/>
@@ -11428,7 +11649,7 @@
           <w:noProof/>
         </w:rPr>
         <w:drawing>
-          <wp:inline distT="0" distB="0" distL="0" distR="0" wp14:anchorId="3698841B" wp14:editId="1410CF63">
+          <wp:inline distT="0" distB="0" distL="0" distR="0" wp14:anchorId="60C9361F" wp14:editId="222E38E7">
             <wp:extent cx="5400675" cy="2733675"/>
             <wp:effectExtent l="0" t="0" r="0" b="0"/>
             <wp:docPr id="10" name="Imagen 10"/>
@@ -11494,7 +11715,7 @@
         </w:rPr>
         <w:lastRenderedPageBreak/>
         <w:drawing>
-          <wp:inline distT="0" distB="0" distL="0" distR="0" wp14:anchorId="63F0B8B1" wp14:editId="24EA5331">
+          <wp:inline distT="0" distB="0" distL="0" distR="0" wp14:anchorId="6249B023" wp14:editId="3FF70DB9">
             <wp:extent cx="5400675" cy="2981325"/>
             <wp:effectExtent l="0" t="0" r="0" b="0"/>
             <wp:docPr id="11" name="Imagen 11"/>
@@ -11559,7 +11780,7 @@
           <w:noProof/>
         </w:rPr>
         <w:drawing>
-          <wp:inline distT="0" distB="0" distL="0" distR="0" wp14:anchorId="4C864010" wp14:editId="555487AB">
+          <wp:inline distT="0" distB="0" distL="0" distR="0" wp14:anchorId="03D65857" wp14:editId="5107A4D2">
             <wp:extent cx="5400675" cy="3638550"/>
             <wp:effectExtent l="0" t="0" r="0" b="0"/>
             <wp:docPr id="12" name="Imagen 12"/>
@@ -11808,7 +12029,7 @@
         <w:pStyle w:val="Ttulo2"/>
         <w:keepNext/>
       </w:pPr>
-      <w:bookmarkStart w:id="16" w:name="_Toc243980375"/>
+      <w:bookmarkStart w:id="16" w:name="_Toc243981747"/>
       <w:r>
         <w:t>8.3 Análisis y cuello de botella encontrado</w:t>
       </w:r>
@@ -11892,7 +12113,7 @@
         <w:pStyle w:val="Ttulo2"/>
         <w:keepNext/>
       </w:pPr>
-      <w:bookmarkStart w:id="17" w:name="_Toc243980376"/>
+      <w:bookmarkStart w:id="17" w:name="_Toc243981748"/>
       <w:r>
         <w:t>8.4 EXTRA: Cifrado (ofuscación) del código</w:t>
       </w:r>
@@ -12363,7 +12584,7 @@
         <w:pStyle w:val="Ttulo2"/>
         <w:keepNext/>
       </w:pPr>
-      <w:bookmarkStart w:id="18" w:name="_Toc243980377"/>
+      <w:bookmarkStart w:id="18" w:name="_Toc243981749"/>
       <w:r>
         <w:t>8.5 EXTRA: Vista del programador</w:t>
       </w:r>
@@ -12391,7 +12612,7 @@
           <w:noProof/>
         </w:rPr>
         <w:drawing>
-          <wp:inline distT="0" distB="0" distL="0" distR="0" wp14:anchorId="26E58D81" wp14:editId="4F72544C">
+          <wp:inline distT="0" distB="0" distL="0" distR="0" wp14:anchorId="2D4AF45E" wp14:editId="2F8D7917">
             <wp:extent cx="5400675" cy="3371850"/>
             <wp:effectExtent l="0" t="0" r="0" b="0"/>
             <wp:docPr id="13" name="Imagen 13"/>
@@ -12450,7 +12671,7 @@
         <w:pStyle w:val="Ttulo2"/>
         <w:keepNext/>
       </w:pPr>
-      <w:bookmarkStart w:id="19" w:name="_Toc243980378"/>
+      <w:bookmarkStart w:id="19" w:name="_Toc243981750"/>
       <w:r>
         <w:t>8.6 EXTRA: Seguridad y calidad adelantadas</w:t>
       </w:r>
@@ -12527,7 +12748,7 @@
         <w:pStyle w:val="Ttulo2"/>
         <w:keepNext/>
       </w:pPr>
-      <w:bookmarkStart w:id="20" w:name="_Toc243980379"/>
+      <w:bookmarkStart w:id="20" w:name="_Toc243981751"/>
       <w:r>
         <w:t>8.7 EXTRA: Diseño de la aplicación móvil (Android e iOS)</w:t>
       </w:r>
@@ -12538,7 +12759,10 @@
         <w:spacing w:after="120" w:line="300" w:lineRule="auto"/>
       </w:pPr>
       <w:r>
-        <w:t>LeGrandHotel tendrá también una aplicación para teléfonos Android e iOS. En esta entrega se presenta su diseño: la tecnología, la arquitectura, las pantallas y el plan de construcción. El código de la app se desarrolla en las entregas del 80% y del 100%. La app no reemplaza a la web: cubre las tareas que conviene hacer en movimiento y usa la misma API, sin duplicar la lógica del negocio.</w:t>
+        <w:t>LeGrandHotel tendrá también una aplicación para teléfonos Android e iOS. En esta entrega se presenta su diseño: la tecnología, la arquitectura, las pantallas y el plan de construcción. El código de la app se desarrolla en las entregas del 80% y del 100%. Como la web, es una herramienta interna: solo la usa el personal del hotel, no tiene registro y ningún huésped ni persona externa puede entrar. No reemplaza a la web: cubre las tareas que conviene hacer en movimiento y usa la misma API, sin duplicar la lógi</w:t>
+      </w:r>
+      <w:r>
+        <w:t>ca del negocio.</w:t>
       </w:r>
     </w:p>
     <w:tbl>
@@ -12588,7 +12812,7 @@
                 <w:sz w:val="20"/>
                 <w:szCs w:val="20"/>
               </w:rPr>
-              <w:t>Usuario</w:t>
+              <w:t>Rol del personal</w:t>
             </w:r>
           </w:p>
         </w:tc>
@@ -12647,7 +12871,7 @@
                 <w:sz w:val="20"/>
                 <w:szCs w:val="20"/>
               </w:rPr>
-              <w:t>Cliente</w:t>
+              <w:t>Recepcionista</w:t>
             </w:r>
           </w:p>
         </w:tc>
@@ -12674,63 +12898,7 @@
                 <w:sz w:val="20"/>
                 <w:szCs w:val="20"/>
               </w:rPr>
-              <w:t>Registrarse o entrar (también con Google), buscar disponibilidad, reservar, ver y cancelar sus reservas, recibir avisos</w:t>
-            </w:r>
-          </w:p>
-        </w:tc>
-      </w:tr>
-      <w:tr>
-        <w:tc>
-          <w:tcPr>
-            <w:tcW w:w="1972" w:type="dxa"/>
-            <w:tcBorders>
-              <w:top w:val="single" w:sz="4" w:space="0" w:color="000000"/>
-              <w:left w:val="single" w:sz="4" w:space="0" w:color="000000"/>
-              <w:bottom w:val="single" w:sz="4" w:space="0" w:color="000000"/>
-              <w:right w:val="single" w:sz="4" w:space="0" w:color="000000"/>
-            </w:tcBorders>
-            <w:tcMar>
-              <w:top w:w="60" w:type="dxa"/>
-              <w:left w:w="90" w:type="dxa"/>
-              <w:bottom w:w="60" w:type="dxa"/>
-              <w:right w:w="90" w:type="dxa"/>
-            </w:tcMar>
-            <w:vAlign w:val="center"/>
-          </w:tcPr>
-          <w:p>
-            <w:r>
-              <w:rPr>
-                <w:sz w:val="20"/>
-                <w:szCs w:val="20"/>
-              </w:rPr>
-              <w:t>Recepcionista</w:t>
-            </w:r>
-          </w:p>
-        </w:tc>
-        <w:tc>
-          <w:tcPr>
-            <w:tcW w:w="7098" w:type="dxa"/>
-            <w:tcBorders>
-              <w:top w:val="single" w:sz="4" w:space="0" w:color="000000"/>
-              <w:left w:val="single" w:sz="4" w:space="0" w:color="000000"/>
-              <w:bottom w:val="single" w:sz="4" w:space="0" w:color="000000"/>
-              <w:right w:val="single" w:sz="4" w:space="0" w:color="000000"/>
-            </w:tcBorders>
-            <w:tcMar>
-              <w:top w:w="60" w:type="dxa"/>
-              <w:left w:w="90" w:type="dxa"/>
-              <w:bottom w:w="60" w:type="dxa"/>
-              <w:right w:w="90" w:type="dxa"/>
-            </w:tcMar>
-            <w:vAlign w:val="center"/>
-          </w:tcPr>
-          <w:p>
-            <w:r>
-              <w:rPr>
-                <w:sz w:val="20"/>
-                <w:szCs w:val="20"/>
-              </w:rPr>
-              <w:t>Ver llegadas y salidas del día, hacer check-in y check-out desde el lobby, cambiar el estado de una habitación, registrar placas en la cochera</w:t>
+              <w:t>Ver llegadas y salidas del día, hacer check-in y check-out desde el lobby, registrar la reserva de un huésped que llega o llama, cambiar el estado de una habitación, registrar placas en la cochera</w:t>
             </w:r>
           </w:p>
         </w:tc>
@@ -13478,7 +13646,7 @@
           <w:noProof/>
         </w:rPr>
         <w:drawing>
-          <wp:inline distT="0" distB="0" distL="0" distR="0" wp14:anchorId="7018B78E" wp14:editId="7F46BB84">
+          <wp:inline distT="0" distB="0" distL="0" distR="0" wp14:anchorId="616B3102" wp14:editId="684408C5">
             <wp:extent cx="5762625" cy="2733675"/>
             <wp:effectExtent l="0" t="0" r="0" b="0"/>
             <wp:docPr id="14" name="Imagen 14"/>
@@ -13918,7 +14086,7 @@
                 <w:sz w:val="20"/>
                 <w:szCs w:val="20"/>
               </w:rPr>
-              <w:t>Login con Google</w:t>
+              <w:t>Login con Google (solo cuentas del personal)</w:t>
             </w:r>
           </w:p>
         </w:tc>
@@ -14254,7 +14422,7 @@
         <w:spacing w:after="60" w:line="288" w:lineRule="auto"/>
       </w:pPr>
       <w:r>
-        <w:t>Registrar el token de notificaciones de cada teléfono (POST /devices) y enviar avisos en cola: reserva confirmada, recordatorio de check-in e insumo bajo el mínimo.</w:t>
+        <w:t>Registrar el token de notificaciones de cada teléfono (POST /devices) y enviar avisos al personal: llegadas del día, habitación lista tras la limpieza e insumo bajo el mínimo.</w:t>
       </w:r>
     </w:p>
     <w:p>
@@ -14305,14 +14473,11 @@
           <w:b/>
           <w:bCs/>
         </w:rPr>
+        <w:lastRenderedPageBreak/>
         <w:t xml:space="preserve">Seguridad: </w:t>
       </w:r>
       <w:r>
-        <w:t xml:space="preserve">el token se guarda en el almacenamiento seguro del sistema y nunca en texto plano. Se renueva solo antes de vencer, con el mismo POST /auth/refresh de la web. El </w:t>
-      </w:r>
-      <w:r>
-        <w:lastRenderedPageBreak/>
-        <w:t>personal puede activar el desbloqueo con huella o rostro. La app solo usa HTTPS y no contiene secretos: todo secreto queda en el servidor.</w:t>
+        <w:t>el token se guarda en el almacenamiento seguro del sistema y nunca en texto plano. Se renueva solo antes de vencer, con el mismo POST /auth/refresh de la web. El personal puede activar el desbloqueo con huella o rostro. La app solo usa HTTPS y no contiene secretos: todo secreto queda en el servidor.</w:t>
       </w:r>
     </w:p>
     <w:tbl>
@@ -14504,7 +14669,7 @@
                 <w:sz w:val="20"/>
                 <w:szCs w:val="20"/>
               </w:rPr>
-              <w:t>Proyecto Expo en mobile/; login y registro; flujo del cliente (reservar, mis reservas); recepción «Hoy» con check-in y check-out; notificaciones; versión de prueba para Android</w:t>
+              <w:t>Proyecto Expo en mobile/; login del personal; recepción («Hoy» con check-in y check-out, nueva reserva, habitaciones); notificaciones; versión de prueba para Android</w:t>
             </w:r>
           </w:p>
         </w:tc>
@@ -14628,7 +14793,7 @@
           <w:noProof/>
         </w:rPr>
         <w:drawing>
-          <wp:inline distT="0" distB="0" distL="0" distR="0" wp14:anchorId="5794BDBF" wp14:editId="00403FE7">
+          <wp:inline distT="0" distB="0" distL="0" distR="0" wp14:anchorId="15114EC0" wp14:editId="5406E5C7">
             <wp:extent cx="8820150" cy="3857625"/>
             <wp:effectExtent l="0" t="0" r="0" b="0"/>
             <wp:docPr id="2" name="Imagen 2"/>
@@ -14686,7 +14851,7 @@
           <w:sz w:val="20"/>
           <w:szCs w:val="20"/>
         </w:rPr>
-        <w:t>Figura 13. Bocetos: login, inicio y reserva del cliente; «Hoy» y tablero de habitaciones de recepción.</w:t>
+        <w:t>Figura 13. Bocetos: login del personal; «Hoy», nueva reserva y habitaciones de recepción; inventario del almacén.</w:t>
       </w:r>
     </w:p>
     <w:p>
@@ -14694,7 +14859,7 @@
         <w:pStyle w:val="Ttulo1"/>
         <w:keepNext/>
       </w:pPr>
-      <w:bookmarkStart w:id="21" w:name="_Toc243980380"/>
+      <w:bookmarkStart w:id="21" w:name="_Toc243981752"/>
       <w:r>
         <w:lastRenderedPageBreak/>
         <w:t>9. Siguientes pasos (entrega del 80%)</w:t>
@@ -14750,7 +14915,7 @@
         <w:spacing w:after="60" w:line="288" w:lineRule="auto"/>
       </w:pPr>
       <w:r>
-        <w:t>Aplicación móvil: crear el proyecto Expo, construir el login y el flujo del cliente y la recepción, activar las notificaciones y generar la primera versión de prueba para Android.</w:t>
+        <w:t>Aplicación móvil: crear el proyecto Expo, construir el login y las pantallas de recepción, activar las notificaciones y generar la primera versión de prueba para Android.</w:t>
       </w:r>
     </w:p>
     <w:sectPr>
@@ -15035,10 +15200,10 @@
 <file path=word/numbering.xml><?xml version="1.0" encoding="utf-8"?>
 <w:numbering xmlns:wpc="http://schemas.microsoft.com/office/word/2010/wordprocessingCanvas" xmlns:cx="http://schemas.microsoft.com/office/drawing/2014/chartex" xmlns:cx1="http://schemas.microsoft.com/office/drawing/2015/9/8/chartex" xmlns:cx2="http://schemas.microsoft.com/office/drawing/2015/10/21/chartex" xmlns:cx3="http://schemas.microsoft.com/office/drawing/2016/5/9/chartex" xmlns:cx4="http://schemas.microsoft.com/office/drawing/2016/5/10/chartex" xmlns:cx5="http://schemas.microsoft.com/office/drawing/2016/5/11/chartex" xmlns:cx6="http://schemas.microsoft.com/office/drawing/2016/5/12/chartex" xmlns:cx7="http://schemas.microsoft.com/office/drawing/2016/5/13/chartex" xmlns:cx8="http://schemas.microsoft.com/office/drawing/2016/5/14/chartex" xmlns:mc="http://schemas.openxmlformats.org/markup-compatibility/2006" xmlns:aink="http://schemas.microsoft.com/office/drawing/2016/ink" xmlns:am3d="http://schemas.microsoft.com/office/drawing/2017/model3d" xmlns:o="urn:schemas-microsoft-com:office:office" xmlns:oel="http://schemas.microsoft.com/office/2019/extlst" xmlns:r="http://schemas.openxmlformats.org/officeDocument/2006/relationships" xmlns:m="http://schemas.openxmlformats.org/officeDocument/2006/math" xmlns:v="urn:schemas-microsoft-com:vml" xmlns:wp14="http://schemas.microsoft.com/office/word/2010/wordprocessingDrawing" xmlns:wp="http://schemas.openxmlformats.org/drawingml/2006/wordprocessingDrawing" xmlns:w10="urn:schemas-microsoft-com:office:word" xmlns:w="http://schemas.openxmlformats.org/wordprocessingml/2006/main" xmlns:w14="http://schemas.microsoft.com/office/word/2010/wordml" xmlns:w15="http://schemas.microsoft.com/office/word/2012/wordml" xmlns:w16cex="http://schemas.microsoft.com/office/word/2018/wordml/cex" xmlns:w16cid="http://schemas.microsoft.com/office/word/2016/wordml/cid" xmlns:w16="http://schemas.microsoft.com/office/word/2018/wordml" xmlns:w16sdtdh="http://schemas.microsoft.com/office/word/2020/wordml/sdtdatahash" xmlns:w16se="http://schemas.microsoft.com/office/word/2015/wordml/symex" xmlns:wpg="http://schemas.microsoft.com/office/word/2010/wordprocessingGroup" xmlns:wpi="http://schemas.microsoft.com/office/word/2010/wordprocessingInk" xmlns:wne="http://schemas.microsoft.com/office/word/2006/wordml" xmlns:wps="http://schemas.microsoft.com/office/word/2010/wordprocessingShape" mc:Ignorable="w14 w15 w16se w16cid w16 w16cex w16sdtdh wp14">
   <w:abstractNum w:abstractNumId="0" w15:restartNumberingAfterBreak="0">
-    <w:nsid w:val="040F5A34"/>
+    <w:nsid w:val="15F2285F"/>
     <w:multiLevelType w:val="hybridMultilevel"/>
-    <w:tmpl w:val="A600C720"/>
-    <w:lvl w:ilvl="0" w:tplc="B8A66AC6">
+    <w:tmpl w:val="0C3C9452"/>
+    <w:lvl w:ilvl="0" w:tplc="8BF81522">
       <w:start w:val="1"/>
       <w:numFmt w:val="bullet"/>
       <w:lvlText w:val="•"/>
@@ -15047,52 +15212,52 @@
         <w:ind w:left="540" w:hanging="270"/>
       </w:pPr>
     </w:lvl>
-    <w:lvl w:ilvl="1" w:tplc="C70CD4EE">
+    <w:lvl w:ilvl="1" w:tplc="F8660B60">
       <w:numFmt w:val="decimal"/>
       <w:lvlText w:val=""/>
       <w:lvlJc w:val="left"/>
     </w:lvl>
-    <w:lvl w:ilvl="2" w:tplc="51F0CBA8">
+    <w:lvl w:ilvl="2" w:tplc="A9E8CCFC">
       <w:numFmt w:val="decimal"/>
       <w:lvlText w:val=""/>
       <w:lvlJc w:val="left"/>
     </w:lvl>
-    <w:lvl w:ilvl="3" w:tplc="90D0293C">
+    <w:lvl w:ilvl="3" w:tplc="6172B248">
       <w:numFmt w:val="decimal"/>
       <w:lvlText w:val=""/>
       <w:lvlJc w:val="left"/>
     </w:lvl>
-    <w:lvl w:ilvl="4" w:tplc="35788E72">
+    <w:lvl w:ilvl="4" w:tplc="E8E8AE5C">
       <w:numFmt w:val="decimal"/>
       <w:lvlText w:val=""/>
       <w:lvlJc w:val="left"/>
     </w:lvl>
-    <w:lvl w:ilvl="5" w:tplc="4CD04798">
+    <w:lvl w:ilvl="5" w:tplc="7CAA149A">
       <w:numFmt w:val="decimal"/>
       <w:lvlText w:val=""/>
       <w:lvlJc w:val="left"/>
     </w:lvl>
-    <w:lvl w:ilvl="6" w:tplc="289A0054">
+    <w:lvl w:ilvl="6" w:tplc="C3FC3F66">
       <w:numFmt w:val="decimal"/>
       <w:lvlText w:val=""/>
       <w:lvlJc w:val="left"/>
     </w:lvl>
-    <w:lvl w:ilvl="7" w:tplc="E22081F6">
+    <w:lvl w:ilvl="7" w:tplc="902A30BC">
       <w:numFmt w:val="decimal"/>
       <w:lvlText w:val=""/>
       <w:lvlJc w:val="left"/>
     </w:lvl>
-    <w:lvl w:ilvl="8" w:tplc="521EC00C">
+    <w:lvl w:ilvl="8" w:tplc="FEF495A6">
       <w:numFmt w:val="decimal"/>
       <w:lvlText w:val=""/>
       <w:lvlJc w:val="left"/>
     </w:lvl>
   </w:abstractNum>
   <w:abstractNum w:abstractNumId="1" w15:restartNumberingAfterBreak="0">
-    <w:nsid w:val="27A3459F"/>
+    <w:nsid w:val="5A4C63CE"/>
     <w:multiLevelType w:val="hybridMultilevel"/>
-    <w:tmpl w:val="630C538C"/>
-    <w:lvl w:ilvl="0" w:tplc="7A163EF8" w:tentative="1">
+    <w:tmpl w:val="64C42950"/>
+    <w:lvl w:ilvl="0" w:tplc="711CBAE0" w:tentative="1">
       <w:start w:val="1"/>
       <w:numFmt w:val="bullet"/>
       <w:lvlText w:val="●"/>
@@ -15101,7 +15266,7 @@
         <w:ind w:left="720" w:hanging="360"/>
       </w:pPr>
     </w:lvl>
-    <w:lvl w:ilvl="1" w:tplc="1AD4984C" w:tentative="1">
+    <w:lvl w:ilvl="1" w:tplc="AD2024AA" w:tentative="1">
       <w:start w:val="1"/>
       <w:numFmt w:val="bullet"/>
       <w:lvlText w:val="○"/>
@@ -15110,7 +15275,7 @@
         <w:ind w:left="1440" w:hanging="360"/>
       </w:pPr>
     </w:lvl>
-    <w:lvl w:ilvl="2" w:tplc="1D5A7BDC" w:tentative="1">
+    <w:lvl w:ilvl="2" w:tplc="0E183166" w:tentative="1">
       <w:start w:val="1"/>
       <w:numFmt w:val="bullet"/>
       <w:lvlText w:val="■"/>
@@ -15119,7 +15284,7 @@
         <w:ind w:left="2160" w:hanging="360"/>
       </w:pPr>
     </w:lvl>
-    <w:lvl w:ilvl="3" w:tplc="39DAC552" w:tentative="1">
+    <w:lvl w:ilvl="3" w:tplc="712E83C8" w:tentative="1">
       <w:start w:val="1"/>
       <w:numFmt w:val="bullet"/>
       <w:lvlText w:val="●"/>
@@ -15128,7 +15293,7 @@
         <w:ind w:left="2880" w:hanging="360"/>
       </w:pPr>
     </w:lvl>
-    <w:lvl w:ilvl="4" w:tplc="6964991C" w:tentative="1">
+    <w:lvl w:ilvl="4" w:tplc="034CBF06" w:tentative="1">
       <w:start w:val="1"/>
       <w:numFmt w:val="bullet"/>
       <w:lvlText w:val="○"/>
@@ -15137,7 +15302,7 @@
         <w:ind w:left="3600" w:hanging="360"/>
       </w:pPr>
     </w:lvl>
-    <w:lvl w:ilvl="5" w:tplc="31DAE6DC" w:tentative="1">
+    <w:lvl w:ilvl="5" w:tplc="D5A265E2" w:tentative="1">
       <w:start w:val="1"/>
       <w:numFmt w:val="bullet"/>
       <w:lvlText w:val="■"/>
@@ -15146,7 +15311,7 @@
         <w:ind w:left="4320" w:hanging="360"/>
       </w:pPr>
     </w:lvl>
-    <w:lvl w:ilvl="6" w:tplc="4392AFEC" w:tentative="1">
+    <w:lvl w:ilvl="6" w:tplc="E5B26386" w:tentative="1">
       <w:start w:val="1"/>
       <w:numFmt w:val="bullet"/>
       <w:lvlText w:val="●"/>
@@ -15155,7 +15320,7 @@
         <w:ind w:left="5040" w:hanging="360"/>
       </w:pPr>
     </w:lvl>
-    <w:lvl w:ilvl="7" w:tplc="85F44532" w:tentative="1">
+    <w:lvl w:ilvl="7" w:tplc="73F60E16" w:tentative="1">
       <w:start w:val="1"/>
       <w:numFmt w:val="bullet"/>
       <w:lvlText w:val="●"/>
@@ -15164,7 +15329,7 @@
         <w:ind w:left="5760" w:hanging="360"/>
       </w:pPr>
     </w:lvl>
-    <w:lvl w:ilvl="8" w:tplc="230A8C62" w:tentative="1">
+    <w:lvl w:ilvl="8" w:tplc="B5889F6E" w:tentative="1">
       <w:start w:val="1"/>
       <w:numFmt w:val="bullet"/>
       <w:lvlText w:val="●"/>
@@ -15174,13 +15339,13 @@
       </w:pPr>
     </w:lvl>
   </w:abstractNum>
-  <w:num w:numId="1" w16cid:durableId="609358740">
+  <w:num w:numId="1" w16cid:durableId="518005601">
     <w:abstractNumId w:val="1"/>
     <w:lvlOverride w:ilvl="0">
       <w:startOverride w:val="1"/>
     </w:lvlOverride>
   </w:num>
-  <w:num w:numId="2" w16cid:durableId="2097171218">
+  <w:num w:numId="2" w16cid:durableId="454760557">
     <w:abstractNumId w:val="0"/>
     <w:lvlOverride w:ilvl="0">
       <w:startOverride w:val="1"/>

</xml_diff>

<commit_message>
Diagrama de clases UML (PlantUML + imagen) y su página en el informe
- docs/diagramas/uml-clases.puml: fuente editable en PlantUML.
- docs/diagramas/uml.py → uml-clases.png: clases con atributos, métodos y
  multiplicidades, incluidas AuditLog → User e InventoryMovement → User.
- Informe del 25%: nueva figura 6 en página horizontal (figuras renumeradas).

Co-Authored-By: Claude Opus 5.5 <noreply@anthropic.com>
</commit_message>
<xml_diff>
--- a/docs/informes/LeGrandHotel_Entrega_25.docx
+++ b/docs/informes/LeGrandHotel_Entrega_25.docx
@@ -34,7 +34,7 @@
           <w:noProof/>
         </w:rPr>
         <w:drawing>
-          <wp:inline distT="0" distB="0" distL="0" distR="0" wp14:anchorId="43781861" wp14:editId="714C1ADA">
+          <wp:inline distT="0" distB="0" distL="0" distR="0" wp14:anchorId="3986AA79" wp14:editId="7E46B40D">
             <wp:extent cx="1800225" cy="1076325"/>
             <wp:effectExtent l="0" t="0" r="0" b="0"/>
             <wp:docPr id="1" name="Imagen 1"/>
@@ -254,7 +254,7 @@
     <w:sdt>
       <w:sdtPr>
         <w:alias w:val="Índice"/>
-        <w:id w:val="680701924"/>
+        <w:id w:val="208768024"/>
       </w:sdtPr>
       <w:sdtEndPr/>
       <w:sdtContent>
@@ -280,7 +280,7 @@
           <w:r>
             <w:fldChar w:fldCharType="separate"/>
           </w:r>
-          <w:hyperlink w:anchor="_Toc243981731" w:history="1">
+          <w:hyperlink w:anchor="_Toc243984506" w:history="1">
             <w:r>
               <w:rPr>
                 <w:rStyle w:val="Hipervnculo"/>
@@ -304,7 +304,7 @@
               <w:rPr>
                 <w:noProof/>
               </w:rPr>
-              <w:instrText xml:space="preserve"> PAGEREF _Toc243981731 \h </w:instrText>
+              <w:instrText xml:space="preserve"> PAGEREF _Toc243984506 \h </w:instrText>
             </w:r>
             <w:r>
               <w:rPr>
@@ -344,7 +344,7 @@
               <w14:ligatures w14:val="standardContextual"/>
             </w:rPr>
           </w:pPr>
-          <w:hyperlink w:anchor="_Toc243981732" w:history="1">
+          <w:hyperlink w:anchor="_Toc243984507" w:history="1">
             <w:r>
               <w:rPr>
                 <w:rStyle w:val="Hipervnculo"/>
@@ -368,7 +368,7 @@
               <w:rPr>
                 <w:noProof/>
               </w:rPr>
-              <w:instrText xml:space="preserve"> PAGEREF _Toc243981732 \h </w:instrText>
+              <w:instrText xml:space="preserve"> PAGEREF _Toc243984507 \h </w:instrText>
             </w:r>
             <w:r>
               <w:rPr>
@@ -408,7 +408,7 @@
               <w14:ligatures w14:val="standardContextual"/>
             </w:rPr>
           </w:pPr>
-          <w:hyperlink w:anchor="_Toc243981733" w:history="1">
+          <w:hyperlink w:anchor="_Toc243984508" w:history="1">
             <w:r>
               <w:rPr>
                 <w:rStyle w:val="Hipervnculo"/>
@@ -432,7 +432,7 @@
               <w:rPr>
                 <w:noProof/>
               </w:rPr>
-              <w:instrText xml:space="preserve"> PAGEREF _Toc243981733 \h </w:instrText>
+              <w:instrText xml:space="preserve"> PAGEREF _Toc243984508 \h </w:instrText>
             </w:r>
             <w:r>
               <w:rPr>
@@ -472,7 +472,7 @@
               <w14:ligatures w14:val="standardContextual"/>
             </w:rPr>
           </w:pPr>
-          <w:hyperlink w:anchor="_Toc243981734" w:history="1">
+          <w:hyperlink w:anchor="_Toc243984509" w:history="1">
             <w:r>
               <w:rPr>
                 <w:rStyle w:val="Hipervnculo"/>
@@ -496,7 +496,7 @@
               <w:rPr>
                 <w:noProof/>
               </w:rPr>
-              <w:instrText xml:space="preserve"> PAGEREF _Toc243981734 \h </w:instrText>
+              <w:instrText xml:space="preserve"> PAGEREF _Toc243984509 \h </w:instrText>
             </w:r>
             <w:r>
               <w:rPr>
@@ -536,7 +536,7 @@
               <w14:ligatures w14:val="standardContextual"/>
             </w:rPr>
           </w:pPr>
-          <w:hyperlink w:anchor="_Toc243981735" w:history="1">
+          <w:hyperlink w:anchor="_Toc243984510" w:history="1">
             <w:r>
               <w:rPr>
                 <w:rStyle w:val="Hipervnculo"/>
@@ -560,7 +560,7 @@
               <w:rPr>
                 <w:noProof/>
               </w:rPr>
-              <w:instrText xml:space="preserve"> PAGEREF _Toc243981735 \h </w:instrText>
+              <w:instrText xml:space="preserve"> PAGEREF _Toc243984510 \h </w:instrText>
             </w:r>
             <w:r>
               <w:rPr>
@@ -600,7 +600,7 @@
               <w14:ligatures w14:val="standardContextual"/>
             </w:rPr>
           </w:pPr>
-          <w:hyperlink w:anchor="_Toc243981736" w:history="1">
+          <w:hyperlink w:anchor="_Toc243984511" w:history="1">
             <w:r>
               <w:rPr>
                 <w:rStyle w:val="Hipervnculo"/>
@@ -624,7 +624,7 @@
               <w:rPr>
                 <w:noProof/>
               </w:rPr>
-              <w:instrText xml:space="preserve"> PAGEREF _Toc243981736 \h </w:instrText>
+              <w:instrText xml:space="preserve"> PAGEREF _Toc243984511 \h </w:instrText>
             </w:r>
             <w:r>
               <w:rPr>
@@ -664,7 +664,7 @@
               <w14:ligatures w14:val="standardContextual"/>
             </w:rPr>
           </w:pPr>
-          <w:hyperlink w:anchor="_Toc243981737" w:history="1">
+          <w:hyperlink w:anchor="_Toc243984512" w:history="1">
             <w:r>
               <w:rPr>
                 <w:rStyle w:val="Hipervnculo"/>
@@ -688,7 +688,7 @@
               <w:rPr>
                 <w:noProof/>
               </w:rPr>
-              <w:instrText xml:space="preserve"> PAGEREF _Toc243981737 \h </w:instrText>
+              <w:instrText xml:space="preserve"> PAGEREF _Toc243984512 \h </w:instrText>
             </w:r>
             <w:r>
               <w:rPr>
@@ -728,7 +728,7 @@
               <w14:ligatures w14:val="standardContextual"/>
             </w:rPr>
           </w:pPr>
-          <w:hyperlink w:anchor="_Toc243981738" w:history="1">
+          <w:hyperlink w:anchor="_Toc243984513" w:history="1">
             <w:r>
               <w:rPr>
                 <w:rStyle w:val="Hipervnculo"/>
@@ -752,7 +752,7 @@
               <w:rPr>
                 <w:noProof/>
               </w:rPr>
-              <w:instrText xml:space="preserve"> PAGEREF _Toc243981738 \h </w:instrText>
+              <w:instrText xml:space="preserve"> PAGEREF _Toc243984513 \h </w:instrText>
             </w:r>
             <w:r>
               <w:rPr>
@@ -792,7 +792,7 @@
               <w14:ligatures w14:val="standardContextual"/>
             </w:rPr>
           </w:pPr>
-          <w:hyperlink w:anchor="_Toc243981739" w:history="1">
+          <w:hyperlink w:anchor="_Toc243984514" w:history="1">
             <w:r>
               <w:rPr>
                 <w:rStyle w:val="Hipervnculo"/>
@@ -816,7 +816,7 @@
               <w:rPr>
                 <w:noProof/>
               </w:rPr>
-              <w:instrText xml:space="preserve"> PAGEREF _Toc243981739 \h </w:instrText>
+              <w:instrText xml:space="preserve"> PAGEREF _Toc243984514 \h </w:instrText>
             </w:r>
             <w:r>
               <w:rPr>
@@ -856,7 +856,7 @@
               <w14:ligatures w14:val="standardContextual"/>
             </w:rPr>
           </w:pPr>
-          <w:hyperlink w:anchor="_Toc243981740" w:history="1">
+          <w:hyperlink w:anchor="_Toc243984515" w:history="1">
             <w:r>
               <w:rPr>
                 <w:rStyle w:val="Hipervnculo"/>
@@ -880,7 +880,7 @@
               <w:rPr>
                 <w:noProof/>
               </w:rPr>
-              <w:instrText xml:space="preserve"> PAGEREF _Toc243981740 \h </w:instrText>
+              <w:instrText xml:space="preserve"> PAGEREF _Toc243984515 \h </w:instrText>
             </w:r>
             <w:r>
               <w:rPr>
@@ -920,7 +920,7 @@
               <w14:ligatures w14:val="standardContextual"/>
             </w:rPr>
           </w:pPr>
-          <w:hyperlink w:anchor="_Toc243981741" w:history="1">
+          <w:hyperlink w:anchor="_Toc243984516" w:history="1">
             <w:r>
               <w:rPr>
                 <w:rStyle w:val="Hipervnculo"/>
@@ -944,7 +944,7 @@
               <w:rPr>
                 <w:noProof/>
               </w:rPr>
-              <w:instrText xml:space="preserve"> PAGEREF _Toc243981741 \h </w:instrText>
+              <w:instrText xml:space="preserve"> PAGEREF _Toc243984516 \h </w:instrText>
             </w:r>
             <w:r>
               <w:rPr>
@@ -984,7 +984,7 @@
               <w14:ligatures w14:val="standardContextual"/>
             </w:rPr>
           </w:pPr>
-          <w:hyperlink w:anchor="_Toc243981742" w:history="1">
+          <w:hyperlink w:anchor="_Toc243984517" w:history="1">
             <w:r>
               <w:rPr>
                 <w:rStyle w:val="Hipervnculo"/>
@@ -1008,7 +1008,7 @@
               <w:rPr>
                 <w:noProof/>
               </w:rPr>
-              <w:instrText xml:space="preserve"> PAGEREF _Toc243981742 \h </w:instrText>
+              <w:instrText xml:space="preserve"> PAGEREF _Toc243984517 \h </w:instrText>
             </w:r>
             <w:r>
               <w:rPr>
@@ -1048,7 +1048,7 @@
               <w14:ligatures w14:val="standardContextual"/>
             </w:rPr>
           </w:pPr>
-          <w:hyperlink w:anchor="_Toc243981743" w:history="1">
+          <w:hyperlink w:anchor="_Toc243984518" w:history="1">
             <w:r>
               <w:rPr>
                 <w:rStyle w:val="Hipervnculo"/>
@@ -1072,7 +1072,7 @@
               <w:rPr>
                 <w:noProof/>
               </w:rPr>
-              <w:instrText xml:space="preserve"> PAGEREF _Toc243981743 \h </w:instrText>
+              <w:instrText xml:space="preserve"> PAGEREF _Toc243984518 \h </w:instrText>
             </w:r>
             <w:r>
               <w:rPr>
@@ -1112,7 +1112,7 @@
               <w14:ligatures w14:val="standardContextual"/>
             </w:rPr>
           </w:pPr>
-          <w:hyperlink w:anchor="_Toc243981744" w:history="1">
+          <w:hyperlink w:anchor="_Toc243984519" w:history="1">
             <w:r>
               <w:rPr>
                 <w:rStyle w:val="Hipervnculo"/>
@@ -1136,7 +1136,7 @@
               <w:rPr>
                 <w:noProof/>
               </w:rPr>
-              <w:instrText xml:space="preserve"> PAGEREF _Toc243981744 \h </w:instrText>
+              <w:instrText xml:space="preserve"> PAGEREF _Toc243984519 \h </w:instrText>
             </w:r>
             <w:r>
               <w:rPr>
@@ -1176,7 +1176,7 @@
               <w14:ligatures w14:val="standardContextual"/>
             </w:rPr>
           </w:pPr>
-          <w:hyperlink w:anchor="_Toc243981745" w:history="1">
+          <w:hyperlink w:anchor="_Toc243984520" w:history="1">
             <w:r>
               <w:rPr>
                 <w:rStyle w:val="Hipervnculo"/>
@@ -1200,7 +1200,7 @@
               <w:rPr>
                 <w:noProof/>
               </w:rPr>
-              <w:instrText xml:space="preserve"> PAGEREF _Toc243981745 \h </w:instrText>
+              <w:instrText xml:space="preserve"> PAGEREF _Toc243984520 \h </w:instrText>
             </w:r>
             <w:r>
               <w:rPr>
@@ -1240,7 +1240,7 @@
               <w14:ligatures w14:val="standardContextual"/>
             </w:rPr>
           </w:pPr>
-          <w:hyperlink w:anchor="_Toc243981746" w:history="1">
+          <w:hyperlink w:anchor="_Toc243984521" w:history="1">
             <w:r>
               <w:rPr>
                 <w:rStyle w:val="Hipervnculo"/>
@@ -1264,7 +1264,7 @@
               <w:rPr>
                 <w:noProof/>
               </w:rPr>
-              <w:instrText xml:space="preserve"> PAGEREF _Toc243981746 \h </w:instrText>
+              <w:instrText xml:space="preserve"> PAGEREF _Toc243984521 \h </w:instrText>
             </w:r>
             <w:r>
               <w:rPr>
@@ -1281,7 +1281,7 @@
               <w:rPr>
                 <w:noProof/>
               </w:rPr>
-              <w:t>14</w:t>
+              <w:t>15</w:t>
             </w:r>
             <w:r>
               <w:rPr>
@@ -1304,7 +1304,7 @@
               <w14:ligatures w14:val="standardContextual"/>
             </w:rPr>
           </w:pPr>
-          <w:hyperlink w:anchor="_Toc243981747" w:history="1">
+          <w:hyperlink w:anchor="_Toc243984522" w:history="1">
             <w:r>
               <w:rPr>
                 <w:rStyle w:val="Hipervnculo"/>
@@ -1328,7 +1328,7 @@
               <w:rPr>
                 <w:noProof/>
               </w:rPr>
-              <w:instrText xml:space="preserve"> PAGEREF _Toc243981747 \h </w:instrText>
+              <w:instrText xml:space="preserve"> PAGEREF _Toc243984522 \h </w:instrText>
             </w:r>
             <w:r>
               <w:rPr>
@@ -1345,7 +1345,7 @@
               <w:rPr>
                 <w:noProof/>
               </w:rPr>
-              <w:t>17</w:t>
+              <w:t>18</w:t>
             </w:r>
             <w:r>
               <w:rPr>
@@ -1368,7 +1368,7 @@
               <w14:ligatures w14:val="standardContextual"/>
             </w:rPr>
           </w:pPr>
-          <w:hyperlink w:anchor="_Toc243981748" w:history="1">
+          <w:hyperlink w:anchor="_Toc243984523" w:history="1">
             <w:r>
               <w:rPr>
                 <w:rStyle w:val="Hipervnculo"/>
@@ -1392,7 +1392,7 @@
               <w:rPr>
                 <w:noProof/>
               </w:rPr>
-              <w:instrText xml:space="preserve"> PAGEREF _Toc243981748 \h </w:instrText>
+              <w:instrText xml:space="preserve"> PAGEREF _Toc243984523 \h </w:instrText>
             </w:r>
             <w:r>
               <w:rPr>
@@ -1409,7 +1409,7 @@
               <w:rPr>
                 <w:noProof/>
               </w:rPr>
-              <w:t>17</w:t>
+              <w:t>18</w:t>
             </w:r>
             <w:r>
               <w:rPr>
@@ -1432,7 +1432,7 @@
               <w14:ligatures w14:val="standardContextual"/>
             </w:rPr>
           </w:pPr>
-          <w:hyperlink w:anchor="_Toc243981749" w:history="1">
+          <w:hyperlink w:anchor="_Toc243984524" w:history="1">
             <w:r>
               <w:rPr>
                 <w:rStyle w:val="Hipervnculo"/>
@@ -1456,7 +1456,7 @@
               <w:rPr>
                 <w:noProof/>
               </w:rPr>
-              <w:instrText xml:space="preserve"> PAGEREF _Toc243981749 \h </w:instrText>
+              <w:instrText xml:space="preserve"> PAGEREF _Toc243984524 \h </w:instrText>
             </w:r>
             <w:r>
               <w:rPr>
@@ -1473,7 +1473,7 @@
               <w:rPr>
                 <w:noProof/>
               </w:rPr>
-              <w:t>18</w:t>
+              <w:t>19</w:t>
             </w:r>
             <w:r>
               <w:rPr>
@@ -1496,7 +1496,7 @@
               <w14:ligatures w14:val="standardContextual"/>
             </w:rPr>
           </w:pPr>
-          <w:hyperlink w:anchor="_Toc243981750" w:history="1">
+          <w:hyperlink w:anchor="_Toc243984525" w:history="1">
             <w:r>
               <w:rPr>
                 <w:rStyle w:val="Hipervnculo"/>
@@ -1520,7 +1520,7 @@
               <w:rPr>
                 <w:noProof/>
               </w:rPr>
-              <w:instrText xml:space="preserve"> PAGEREF _Toc243981750 \h </w:instrText>
+              <w:instrText xml:space="preserve"> PAGEREF _Toc243984525 \h </w:instrText>
             </w:r>
             <w:r>
               <w:rPr>
@@ -1537,7 +1537,7 @@
               <w:rPr>
                 <w:noProof/>
               </w:rPr>
-              <w:t>18</w:t>
+              <w:t>19</w:t>
             </w:r>
             <w:r>
               <w:rPr>
@@ -1560,7 +1560,7 @@
               <w14:ligatures w14:val="standardContextual"/>
             </w:rPr>
           </w:pPr>
-          <w:hyperlink w:anchor="_Toc243981751" w:history="1">
+          <w:hyperlink w:anchor="_Toc243984526" w:history="1">
             <w:r>
               <w:rPr>
                 <w:rStyle w:val="Hipervnculo"/>
@@ -1584,7 +1584,7 @@
               <w:rPr>
                 <w:noProof/>
               </w:rPr>
-              <w:instrText xml:space="preserve"> PAGEREF _Toc243981751 \h </w:instrText>
+              <w:instrText xml:space="preserve"> PAGEREF _Toc243984526 \h </w:instrText>
             </w:r>
             <w:r>
               <w:rPr>
@@ -1601,7 +1601,7 @@
               <w:rPr>
                 <w:noProof/>
               </w:rPr>
-              <w:t>19</w:t>
+              <w:t>20</w:t>
             </w:r>
             <w:r>
               <w:rPr>
@@ -1624,7 +1624,7 @@
               <w14:ligatures w14:val="standardContextual"/>
             </w:rPr>
           </w:pPr>
-          <w:hyperlink w:anchor="_Toc243981752" w:history="1">
+          <w:hyperlink w:anchor="_Toc243984527" w:history="1">
             <w:r>
               <w:rPr>
                 <w:rStyle w:val="Hipervnculo"/>
@@ -1648,7 +1648,7 @@
               <w:rPr>
                 <w:noProof/>
               </w:rPr>
-              <w:instrText xml:space="preserve"> PAGEREF _Toc243981752 \h </w:instrText>
+              <w:instrText xml:space="preserve"> PAGEREF _Toc243984527 \h </w:instrText>
             </w:r>
             <w:r>
               <w:rPr>
@@ -1665,7 +1665,7 @@
               <w:rPr>
                 <w:noProof/>
               </w:rPr>
-              <w:t>23</w:t>
+              <w:t>24</w:t>
             </w:r>
             <w:r>
               <w:rPr>
@@ -1692,7 +1692,7 @@
         <w:pStyle w:val="Ttulo1"/>
         <w:keepNext/>
       </w:pPr>
-      <w:bookmarkStart w:id="0" w:name="_Toc243981731"/>
+      <w:bookmarkStart w:id="0" w:name="_Toc243984506"/>
       <w:r>
         <w:lastRenderedPageBreak/>
         <w:t>1. Alcance de la entrega del 25%</w:t>
@@ -2207,7 +2207,7 @@
         <w:pStyle w:val="Ttulo1"/>
         <w:keepNext/>
       </w:pPr>
-      <w:bookmarkStart w:id="1" w:name="_Toc243981732"/>
+      <w:bookmarkStart w:id="1" w:name="_Toc243984507"/>
       <w:r>
         <w:t>2. Descripción del proyecto</w:t>
       </w:r>
@@ -2229,7 +2229,7 @@
         <w:pStyle w:val="Ttulo2"/>
         <w:keepNext/>
       </w:pPr>
-      <w:bookmarkStart w:id="2" w:name="_Toc243981733"/>
+      <w:bookmarkStart w:id="2" w:name="_Toc243984508"/>
       <w:r>
         <w:t>2.1 Tecnologías</w:t>
       </w:r>
@@ -2715,7 +2715,7 @@
         <w:pStyle w:val="Ttulo1"/>
         <w:keepNext/>
       </w:pPr>
-      <w:bookmarkStart w:id="3" w:name="_Toc243981734"/>
+      <w:bookmarkStart w:id="3" w:name="_Toc243984509"/>
       <w:r>
         <w:lastRenderedPageBreak/>
         <w:t>3. Arquitectura y entorno cloud</w:t>
@@ -2741,10 +2741,10 @@
           <w:noProof/>
         </w:rPr>
         <w:drawing>
-          <wp:inline distT="0" distB="0" distL="0" distR="0" wp14:anchorId="0FAF0054" wp14:editId="47AC55FB">
+          <wp:inline distT="0" distB="0" distL="0" distR="0" wp14:anchorId="79765D97" wp14:editId="4CF16842">
             <wp:extent cx="5762625" cy="4038600"/>
             <wp:effectExtent l="0" t="0" r="0" b="0"/>
-            <wp:docPr id="4" name="Imagen 4"/>
+            <wp:docPr id="5" name="Imagen 5"/>
             <wp:cNvGraphicFramePr>
               <a:graphicFrameLocks xmlns:a="http://schemas.openxmlformats.org/drawingml/2006/main" noChangeAspect="1"/>
             </wp:cNvGraphicFramePr>
@@ -2800,7 +2800,7 @@
         <w:pStyle w:val="Ttulo2"/>
         <w:keepNext/>
       </w:pPr>
-      <w:bookmarkStart w:id="4" w:name="_Toc243981735"/>
+      <w:bookmarkStart w:id="4" w:name="_Toc243984510"/>
       <w:r>
         <w:t>3.1 Recursos del entorno (Terraform)</w:t>
       </w:r>
@@ -3706,7 +3706,7 @@
         <w:pStyle w:val="Ttulo2"/>
         <w:keepNext/>
       </w:pPr>
-      <w:bookmarkStart w:id="5" w:name="_Toc243981736"/>
+      <w:bookmarkStart w:id="5" w:name="_Toc243984511"/>
       <w:r>
         <w:t>3.2 Costo estimado</w:t>
       </w:r>
@@ -4029,7 +4029,7 @@
         <w:pStyle w:val="Ttulo1"/>
         <w:keepNext/>
       </w:pPr>
-      <w:bookmarkStart w:id="6" w:name="_Toc243981737"/>
+      <w:bookmarkStart w:id="6" w:name="_Toc243984512"/>
       <w:r>
         <w:t>4. Endpoints definidos</w:t>
       </w:r>
@@ -5652,7 +5652,7 @@
         <w:pStyle w:val="Ttulo2"/>
         <w:keepNext/>
       </w:pPr>
-      <w:bookmarkStart w:id="7" w:name="_Toc243981738"/>
+      <w:bookmarkStart w:id="7" w:name="_Toc243984513"/>
       <w:r>
         <w:t>4.1 Formato único de respuesta</w:t>
       </w:r>
@@ -5924,7 +5924,7 @@
         <w:pStyle w:val="Ttulo2"/>
         <w:keepNext/>
       </w:pPr>
-      <w:bookmarkStart w:id="8" w:name="_Toc243981739"/>
+      <w:bookmarkStart w:id="8" w:name="_Toc243984514"/>
       <w:r>
         <w:t>4.2 Códigos HTTP</w:t>
       </w:r>
@@ -6691,7 +6691,7 @@
         <w:pStyle w:val="Ttulo1"/>
         <w:keepNext/>
       </w:pPr>
-      <w:bookmarkStart w:id="9" w:name="_Toc243981740"/>
+      <w:bookmarkStart w:id="9" w:name="_Toc243984515"/>
       <w:r>
         <w:lastRenderedPageBreak/>
         <w:t>5. Registro y login diferenciados</w:t>
@@ -7415,10 +7415,10 @@
           <w:noProof/>
         </w:rPr>
         <w:drawing>
-          <wp:inline distT="0" distB="0" distL="0" distR="0" wp14:anchorId="396B5241" wp14:editId="653F59CF">
+          <wp:inline distT="0" distB="0" distL="0" distR="0" wp14:anchorId="6439964C" wp14:editId="1047D826">
             <wp:extent cx="5400675" cy="3371850"/>
             <wp:effectExtent l="0" t="0" r="0" b="0"/>
-            <wp:docPr id="5" name="Imagen 5"/>
+            <wp:docPr id="6" name="Imagen 6"/>
             <wp:cNvGraphicFramePr>
               <a:graphicFrameLocks xmlns:a="http://schemas.openxmlformats.org/drawingml/2006/main" noChangeAspect="1"/>
             </wp:cNvGraphicFramePr>
@@ -7481,10 +7481,10 @@
         </w:rPr>
         <w:lastRenderedPageBreak/>
         <w:drawing>
-          <wp:inline distT="0" distB="0" distL="0" distR="0" wp14:anchorId="4A653E01" wp14:editId="2908841B">
+          <wp:inline distT="0" distB="0" distL="0" distR="0" wp14:anchorId="2F3BEAEB" wp14:editId="28B00D4B">
             <wp:extent cx="5400675" cy="3371850"/>
             <wp:effectExtent l="0" t="0" r="0" b="0"/>
-            <wp:docPr id="6" name="Imagen 6"/>
+            <wp:docPr id="7" name="Imagen 7"/>
             <wp:cNvGraphicFramePr>
               <a:graphicFrameLocks xmlns:a="http://schemas.openxmlformats.org/drawingml/2006/main" noChangeAspect="1"/>
             </wp:cNvGraphicFramePr>
@@ -7546,10 +7546,10 @@
           <w:noProof/>
         </w:rPr>
         <w:drawing>
-          <wp:inline distT="0" distB="0" distL="0" distR="0" wp14:anchorId="46C0CE2F" wp14:editId="6DB2BAC3">
+          <wp:inline distT="0" distB="0" distL="0" distR="0" wp14:anchorId="04FABA82" wp14:editId="21D1D2E9">
             <wp:extent cx="5400675" cy="3371850"/>
             <wp:effectExtent l="0" t="0" r="0" b="0"/>
-            <wp:docPr id="7" name="Imagen 7"/>
+            <wp:docPr id="8" name="Imagen 8"/>
             <wp:cNvGraphicFramePr>
               <a:graphicFrameLocks xmlns:a="http://schemas.openxmlformats.org/drawingml/2006/main" noChangeAspect="1"/>
             </wp:cNvGraphicFramePr>
@@ -8466,7 +8466,7 @@
         <w:pStyle w:val="Ttulo2"/>
         <w:keepNext/>
       </w:pPr>
-      <w:bookmarkStart w:id="10" w:name="_Toc243981741"/>
+      <w:bookmarkStart w:id="10" w:name="_Toc243984516"/>
       <w:r>
         <w:t>5.1 Pruebas automáticas del registro y login</w:t>
       </w:r>
@@ -9197,7 +9197,7 @@
         <w:pStyle w:val="Ttulo1"/>
         <w:keepNext/>
       </w:pPr>
-      <w:bookmarkStart w:id="11" w:name="_Toc243981742"/>
+      <w:bookmarkStart w:id="11" w:name="_Toc243984517"/>
       <w:r>
         <w:t>6. Registro de incidentes</w:t>
       </w:r>
@@ -9803,7 +9803,7 @@
         <w:pStyle w:val="Ttulo1"/>
         <w:keepNext/>
       </w:pPr>
-      <w:bookmarkStart w:id="12" w:name="_Toc243981743"/>
+      <w:bookmarkStart w:id="12" w:name="_Toc243984518"/>
       <w:r>
         <w:t>7. Conclusiones de la entrega</w:t>
       </w:r>
@@ -9847,7 +9847,7 @@
         <w:pStyle w:val="Ttulo1"/>
         <w:keepNext/>
       </w:pPr>
-      <w:bookmarkStart w:id="13" w:name="_Toc243981744"/>
+      <w:bookmarkStart w:id="13" w:name="_Toc243984519"/>
       <w:r>
         <w:lastRenderedPageBreak/>
         <w:t>8. EXTRAS (adicionales a lo evaluado en el 25%)</w:t>
@@ -9871,7 +9871,7 @@
         <w:pStyle w:val="Ttulo2"/>
         <w:keepNext/>
       </w:pPr>
-      <w:bookmarkStart w:id="14" w:name="_Toc243981745"/>
+      <w:bookmarkStart w:id="14" w:name="_Toc243984520"/>
       <w:r>
         <w:t>8.1 EXTRA: Diagrama de base de datos</w:t>
       </w:r>
@@ -9896,7 +9896,7 @@
           <w:noProof/>
         </w:rPr>
         <w:drawing>
-          <wp:inline distT="0" distB="0" distL="0" distR="0" wp14:anchorId="7CB3B4EF" wp14:editId="15313CD2">
+          <wp:inline distT="0" distB="0" distL="0" distR="0" wp14:anchorId="09950BA4" wp14:editId="35EC41A2">
             <wp:extent cx="7562850" cy="4029075"/>
             <wp:effectExtent l="0" t="0" r="0" b="0"/>
             <wp:docPr id="3" name="Imagen 3"/>
@@ -9939,13 +9939,6 @@
       <w:pPr>
         <w:spacing w:after="200"/>
         <w:jc w:val="center"/>
-        <w:sectPr>
-          <w:footerReference w:type="default" r:id="rId14"/>
-          <w:pgSz w:w="16838" w:h="11906" w:orient="landscape"/>
-          <w:pgMar w:top="1021" w:right="1418" w:bottom="1021" w:left="1418" w:header="708" w:footer="708" w:gutter="0"/>
-          <w:cols w:space="720"/>
-          <w:docGrid w:linePitch="360"/>
-        </w:sectPr>
       </w:pPr>
       <w:r>
         <w:rPr>
@@ -9959,10 +9952,107 @@
     </w:p>
     <w:p>
       <w:pPr>
+        <w:keepNext/>
+        <w:pageBreakBefore/>
+        <w:spacing w:after="120" w:line="300" w:lineRule="auto"/>
+      </w:pPr>
+      <w:r>
+        <w:rPr>
+          <w:b/>
+          <w:bCs/>
+          <w:sz w:val="26"/>
+          <w:szCs w:val="26"/>
+        </w:rPr>
+        <w:lastRenderedPageBreak/>
+        <w:t>Diagrama de clases UML</w:t>
+      </w:r>
+    </w:p>
+    <w:p>
+      <w:pPr>
+        <w:spacing w:after="120" w:line="300" w:lineRule="auto"/>
+      </w:pPr>
+      <w:r>
+        <w:t>Las mismas entidades vistas como clases del sistema (modelos de Laravel), con sus atributos, sus métodos principales y la multiplicidad de cada asociación. En UML, la tabla intermedia role_user es la asociación muchos a muchos entre User y Role; AuditLog e InventoryMovement guardan qué usuario hizo cada acción. La fuente editable está en docs/diagramas/uml-clases.puml (PlantUML).</w:t>
+      </w:r>
+    </w:p>
+    <w:p>
+      <w:pPr>
+        <w:keepNext/>
+        <w:spacing w:after="60"/>
+        <w:jc w:val="center"/>
+      </w:pPr>
+      <w:r>
+        <w:rPr>
+          <w:noProof/>
+        </w:rPr>
+        <w:drawing>
+          <wp:inline distT="0" distB="0" distL="0" distR="0" wp14:anchorId="439EC063" wp14:editId="3C477C51">
+            <wp:extent cx="8277225" cy="4686300"/>
+            <wp:effectExtent l="0" t="0" r="0" b="0"/>
+            <wp:docPr id="4" name="Imagen 4"/>
+            <wp:cNvGraphicFramePr>
+              <a:graphicFrameLocks xmlns:a="http://schemas.openxmlformats.org/drawingml/2006/main" noChangeAspect="1"/>
+            </wp:cNvGraphicFramePr>
+            <a:graphic xmlns:a="http://schemas.openxmlformats.org/drawingml/2006/main">
+              <a:graphicData uri="http://schemas.openxmlformats.org/drawingml/2006/picture">
+                <pic:pic xmlns:pic="http://schemas.openxmlformats.org/drawingml/2006/picture">
+                  <pic:nvPicPr>
+                    <pic:cNvPr id="0" name=""/>
+                    <pic:cNvPicPr>
+                      <a:picLocks noChangeAspect="1" noChangeArrowheads="1"/>
+                    </pic:cNvPicPr>
+                  </pic:nvPicPr>
+                  <pic:blipFill>
+                    <a:blip r:embed="rId14"/>
+                    <a:srcRect/>
+                    <a:stretch>
+                      <a:fillRect/>
+                    </a:stretch>
+                  </pic:blipFill>
+                  <pic:spPr bwMode="auto">
+                    <a:xfrm>
+                      <a:off x="0" y="0"/>
+                      <a:ext cx="8277225" cy="4686300"/>
+                    </a:xfrm>
+                    <a:prstGeom prst="rect">
+                      <a:avLst/>
+                    </a:prstGeom>
+                  </pic:spPr>
+                </pic:pic>
+              </a:graphicData>
+            </a:graphic>
+          </wp:inline>
+        </w:drawing>
+      </w:r>
+    </w:p>
+    <w:p>
+      <w:pPr>
+        <w:spacing w:after="200"/>
+        <w:jc w:val="center"/>
+        <w:sectPr>
+          <w:footerReference w:type="default" r:id="rId15"/>
+          <w:pgSz w:w="16838" w:h="11906" w:orient="landscape"/>
+          <w:pgMar w:top="1021" w:right="1418" w:bottom="1021" w:left="1418" w:header="708" w:footer="708" w:gutter="0"/>
+          <w:cols w:space="720"/>
+          <w:docGrid w:linePitch="360"/>
+        </w:sectPr>
+      </w:pPr>
+      <w:r>
+        <w:rPr>
+          <w:i/>
+          <w:iCs/>
+          <w:sz w:val="20"/>
+          <w:szCs w:val="20"/>
+        </w:rPr>
+        <w:t>Figura 6. Diagrama de clases UML de LeGrandHotel.</w:t>
+      </w:r>
+    </w:p>
+    <w:p>
+      <w:pPr>
         <w:pStyle w:val="Ttulo2"/>
         <w:keepNext/>
       </w:pPr>
-      <w:bookmarkStart w:id="15" w:name="_Toc243981746"/>
+      <w:bookmarkStart w:id="15" w:name="_Toc243984521"/>
       <w:r>
         <w:lastRenderedPageBreak/>
         <w:t>8.2 EXTRA: Pruebas de rendimiento y estrés con k6 (varias corridas)</w:t>
@@ -11518,74 +11608,8 @@
           <w:noProof/>
         </w:rPr>
         <w:drawing>
-          <wp:inline distT="0" distB="0" distL="0" distR="0" wp14:anchorId="1CF711D8" wp14:editId="4D743EDE">
+          <wp:inline distT="0" distB="0" distL="0" distR="0" wp14:anchorId="1D790DEA" wp14:editId="48177F5B">
             <wp:extent cx="5400675" cy="3114675"/>
-            <wp:effectExtent l="0" t="0" r="0" b="0"/>
-            <wp:docPr id="8" name="Imagen 8"/>
-            <wp:cNvGraphicFramePr>
-              <a:graphicFrameLocks xmlns:a="http://schemas.openxmlformats.org/drawingml/2006/main" noChangeAspect="1"/>
-            </wp:cNvGraphicFramePr>
-            <a:graphic xmlns:a="http://schemas.openxmlformats.org/drawingml/2006/main">
-              <a:graphicData uri="http://schemas.openxmlformats.org/drawingml/2006/picture">
-                <pic:pic xmlns:pic="http://schemas.openxmlformats.org/drawingml/2006/picture">
-                  <pic:nvPicPr>
-                    <pic:cNvPr id="0" name=""/>
-                    <pic:cNvPicPr>
-                      <a:picLocks noChangeAspect="1" noChangeArrowheads="1"/>
-                    </pic:cNvPicPr>
-                  </pic:nvPicPr>
-                  <pic:blipFill>
-                    <a:blip r:embed="rId15"/>
-                    <a:srcRect/>
-                    <a:stretch>
-                      <a:fillRect/>
-                    </a:stretch>
-                  </pic:blipFill>
-                  <pic:spPr bwMode="auto">
-                    <a:xfrm>
-                      <a:off x="0" y="0"/>
-                      <a:ext cx="5400675" cy="3114675"/>
-                    </a:xfrm>
-                    <a:prstGeom prst="rect">
-                      <a:avLst/>
-                    </a:prstGeom>
-                  </pic:spPr>
-                </pic:pic>
-              </a:graphicData>
-            </a:graphic>
-          </wp:inline>
-        </w:drawing>
-      </w:r>
-    </w:p>
-    <w:p>
-      <w:pPr>
-        <w:spacing w:after="200"/>
-        <w:jc w:val="center"/>
-      </w:pPr>
-      <w:r>
-        <w:rPr>
-          <w:i/>
-          <w:iCs/>
-          <w:sz w:val="20"/>
-          <w:szCs w:val="20"/>
-        </w:rPr>
-        <w:t>Figura 6. Tiempo de respuesta (p50, p90, p95) según la cantidad de usuarios virtuales.</w:t>
-      </w:r>
-    </w:p>
-    <w:p>
-      <w:pPr>
-        <w:keepNext/>
-        <w:spacing w:after="60"/>
-        <w:jc w:val="center"/>
-      </w:pPr>
-      <w:r>
-        <w:rPr>
-          <w:noProof/>
-        </w:rPr>
-        <w:lastRenderedPageBreak/>
-        <w:drawing>
-          <wp:inline distT="0" distB="0" distL="0" distR="0" wp14:anchorId="7F9CBBB6" wp14:editId="3ADA38FE">
-            <wp:extent cx="5400675" cy="2971800"/>
             <wp:effectExtent l="0" t="0" r="0" b="0"/>
             <wp:docPr id="9" name="Imagen 9"/>
             <wp:cNvGraphicFramePr>
@@ -11610,7 +11634,7 @@
                   <pic:spPr bwMode="auto">
                     <a:xfrm>
                       <a:off x="0" y="0"/>
-                      <a:ext cx="5400675" cy="2971800"/>
+                      <a:ext cx="5400675" cy="3114675"/>
                     </a:xfrm>
                     <a:prstGeom prst="rect">
                       <a:avLst/>
@@ -11635,7 +11659,7 @@
           <w:sz w:val="20"/>
           <w:szCs w:val="20"/>
         </w:rPr>
-        <w:t>Figura 7. Peticiones atendidas por segundo en cada corrida.</w:t>
+        <w:t>Figura 7. Tiempo de respuesta (p50, p90, p95) según la cantidad de usuarios virtuales.</w:t>
       </w:r>
     </w:p>
     <w:p>
@@ -11648,9 +11672,10 @@
         <w:rPr>
           <w:noProof/>
         </w:rPr>
+        <w:lastRenderedPageBreak/>
         <w:drawing>
-          <wp:inline distT="0" distB="0" distL="0" distR="0" wp14:anchorId="60C9361F" wp14:editId="222E38E7">
-            <wp:extent cx="5400675" cy="2733675"/>
+          <wp:inline distT="0" distB="0" distL="0" distR="0" wp14:anchorId="487DAC7C" wp14:editId="184EF681">
+            <wp:extent cx="5400675" cy="2971800"/>
             <wp:effectExtent l="0" t="0" r="0" b="0"/>
             <wp:docPr id="10" name="Imagen 10"/>
             <wp:cNvGraphicFramePr>
@@ -11675,7 +11700,7 @@
                   <pic:spPr bwMode="auto">
                     <a:xfrm>
                       <a:off x="0" y="0"/>
-                      <a:ext cx="5400675" cy="2733675"/>
+                      <a:ext cx="5400675" cy="2971800"/>
                     </a:xfrm>
                     <a:prstGeom prst="rect">
                       <a:avLst/>
@@ -11700,7 +11725,7 @@
           <w:sz w:val="20"/>
           <w:szCs w:val="20"/>
         </w:rPr>
-        <w:t>Figura 8. Porcentaje de peticiones fallidas en cada corrida.</w:t>
+        <w:t>Figura 8. Peticiones atendidas por segundo en cada corrida.</w:t>
       </w:r>
     </w:p>
     <w:p>
@@ -11713,10 +11738,9 @@
         <w:rPr>
           <w:noProof/>
         </w:rPr>
-        <w:lastRenderedPageBreak/>
         <w:drawing>
-          <wp:inline distT="0" distB="0" distL="0" distR="0" wp14:anchorId="6249B023" wp14:editId="3FF70DB9">
-            <wp:extent cx="5400675" cy="2981325"/>
+          <wp:inline distT="0" distB="0" distL="0" distR="0" wp14:anchorId="28536418" wp14:editId="2233AD29">
+            <wp:extent cx="5400675" cy="2733675"/>
             <wp:effectExtent l="0" t="0" r="0" b="0"/>
             <wp:docPr id="11" name="Imagen 11"/>
             <wp:cNvGraphicFramePr>
@@ -11741,7 +11765,7 @@
                   <pic:spPr bwMode="auto">
                     <a:xfrm>
                       <a:off x="0" y="0"/>
-                      <a:ext cx="5400675" cy="2981325"/>
+                      <a:ext cx="5400675" cy="2733675"/>
                     </a:xfrm>
                     <a:prstGeom prst="rect">
                       <a:avLst/>
@@ -11766,7 +11790,7 @@
           <w:sz w:val="20"/>
           <w:szCs w:val="20"/>
         </w:rPr>
-        <w:t>Figura 9. p95 por tipo de operación (lecturas, login, crear reserva).</w:t>
+        <w:t>Figura 9. Porcentaje de peticiones fallidas en cada corrida.</w:t>
       </w:r>
     </w:p>
     <w:p>
@@ -11779,9 +11803,10 @@
         <w:rPr>
           <w:noProof/>
         </w:rPr>
+        <w:lastRenderedPageBreak/>
         <w:drawing>
-          <wp:inline distT="0" distB="0" distL="0" distR="0" wp14:anchorId="03D65857" wp14:editId="5107A4D2">
-            <wp:extent cx="5400675" cy="3638550"/>
+          <wp:inline distT="0" distB="0" distL="0" distR="0" wp14:anchorId="3386B977" wp14:editId="5285CD37">
+            <wp:extent cx="5400675" cy="2981325"/>
             <wp:effectExtent l="0" t="0" r="0" b="0"/>
             <wp:docPr id="12" name="Imagen 12"/>
             <wp:cNvGraphicFramePr>
@@ -11806,7 +11831,7 @@
                   <pic:spPr bwMode="auto">
                     <a:xfrm>
                       <a:off x="0" y="0"/>
-                      <a:ext cx="5400675" cy="3638550"/>
+                      <a:ext cx="5400675" cy="2981325"/>
                     </a:xfrm>
                     <a:prstGeom prst="rect">
                       <a:avLst/>
@@ -11831,774 +11856,7 @@
           <w:sz w:val="20"/>
           <w:szCs w:val="20"/>
         </w:rPr>
-        <w:t>Figura 10. Evolución de la latencia segundo a segundo en la corrida de 50 usuarios.</w:t>
-      </w:r>
-    </w:p>
-    <w:p>
-      <w:pPr>
-        <w:keepNext/>
-        <w:spacing w:before="120" w:after="60"/>
-      </w:pPr>
-      <w:r>
-        <w:rPr>
-          <w:b/>
-          <w:bCs/>
-          <w:sz w:val="21"/>
-          <w:szCs w:val="21"/>
-        </w:rPr>
-        <w:lastRenderedPageBreak/>
-        <w:t xml:space="preserve">Fragmento 9. </w:t>
-      </w:r>
-      <w:r>
-        <w:rPr>
-          <w:i/>
-          <w:iCs/>
-          <w:sz w:val="21"/>
-          <w:szCs w:val="21"/>
-        </w:rPr>
-        <w:t>tests/k6/reservas.js (extracto)</w:t>
-      </w:r>
-    </w:p>
-    <w:tbl>
-      <w:tblPr>
-        <w:tblW w:w="9070" w:type="dxa"/>
-        <w:tblBorders>
-          <w:top w:val="single" w:sz="4" w:space="0" w:color="auto"/>
-          <w:left w:val="single" w:sz="4" w:space="0" w:color="auto"/>
-          <w:bottom w:val="single" w:sz="4" w:space="0" w:color="auto"/>
-          <w:right w:val="single" w:sz="4" w:space="0" w:color="auto"/>
-          <w:insideH w:val="single" w:sz="4" w:space="0" w:color="auto"/>
-          <w:insideV w:val="single" w:sz="4" w:space="0" w:color="auto"/>
-        </w:tblBorders>
-        <w:tblLook w:val="04A0" w:firstRow="1" w:lastRow="0" w:firstColumn="1" w:lastColumn="0" w:noHBand="0" w:noVBand="1"/>
-      </w:tblPr>
-      <w:tblGrid>
-        <w:gridCol w:w="9070"/>
-      </w:tblGrid>
-      <w:tr>
-        <w:trPr>
-          <w:cantSplit/>
-        </w:trPr>
-        <w:tc>
-          <w:tcPr>
-            <w:tcW w:w="9070" w:type="dxa"/>
-            <w:tcBorders>
-              <w:top w:val="single" w:sz="4" w:space="0" w:color="000000"/>
-              <w:left w:val="single" w:sz="4" w:space="0" w:color="000000"/>
-              <w:bottom w:val="single" w:sz="4" w:space="0" w:color="000000"/>
-              <w:right w:val="single" w:sz="4" w:space="0" w:color="000000"/>
-            </w:tcBorders>
-            <w:shd w:val="clear" w:color="auto" w:fill="F2F2F2"/>
-            <w:tcMar>
-              <w:top w:w="80" w:type="dxa"/>
-              <w:left w:w="140" w:type="dxa"/>
-              <w:bottom w:w="80" w:type="dxa"/>
-              <w:right w:w="140" w:type="dxa"/>
-            </w:tcMar>
-          </w:tcPr>
-          <w:p>
-            <w:r>
-              <w:rPr>
-                <w:rFonts w:ascii="Consolas" w:eastAsia="Consolas" w:hAnsi="Consolas" w:cs="Consolas"/>
-                <w:sz w:val="17"/>
-                <w:szCs w:val="17"/>
-              </w:rPr>
-              <w:t>escalon: {</w:t>
-            </w:r>
-          </w:p>
-          <w:p>
-            <w:r>
-              <w:rPr>
-                <w:rFonts w:ascii="Consolas" w:eastAsia="Consolas" w:hAnsi="Consolas" w:cs="Consolas"/>
-                <w:sz w:val="17"/>
-                <w:szCs w:val="17"/>
-              </w:rPr>
-              <w:t xml:space="preserve">  stages: [</w:t>
-            </w:r>
-          </w:p>
-          <w:p>
-            <w:r>
-              <w:rPr>
-                <w:rFonts w:ascii="Consolas" w:eastAsia="Consolas" w:hAnsi="Consolas" w:cs="Consolas"/>
-                <w:sz w:val="17"/>
-                <w:szCs w:val="17"/>
-              </w:rPr>
-              <w:t xml:space="preserve">    { duration: '10s', target: VUS },   // sube hasta VUS usuarios</w:t>
-            </w:r>
-          </w:p>
-          <w:p>
-            <w:r>
-              <w:rPr>
-                <w:rFonts w:ascii="Consolas" w:eastAsia="Consolas" w:hAnsi="Consolas" w:cs="Consolas"/>
-                <w:sz w:val="17"/>
-                <w:szCs w:val="17"/>
-              </w:rPr>
-              <w:t xml:space="preserve">    { duration: '45s', target: VUS },   // mantiene la carga</w:t>
-            </w:r>
-          </w:p>
-          <w:p>
-            <w:r>
-              <w:rPr>
-                <w:rFonts w:ascii="Consolas" w:eastAsia="Consolas" w:hAnsi="Consolas" w:cs="Consolas"/>
-                <w:sz w:val="17"/>
-                <w:szCs w:val="17"/>
-              </w:rPr>
-              <w:t xml:space="preserve">    { duration: '5s',  target: 0 },     // baja</w:t>
-            </w:r>
-          </w:p>
-          <w:p>
-            <w:r>
-              <w:rPr>
-                <w:rFonts w:ascii="Consolas" w:eastAsia="Consolas" w:hAnsi="Consolas" w:cs="Consolas"/>
-                <w:sz w:val="17"/>
-                <w:szCs w:val="17"/>
-              </w:rPr>
-              <w:t xml:space="preserve">  ],</w:t>
-            </w:r>
-          </w:p>
-          <w:p>
-            <w:r>
-              <w:rPr>
-                <w:rFonts w:ascii="Consolas" w:eastAsia="Consolas" w:hAnsi="Consolas" w:cs="Consolas"/>
-                <w:sz w:val="17"/>
-                <w:szCs w:val="17"/>
-              </w:rPr>
-              <w:t xml:space="preserve">  thresholds: {</w:t>
-            </w:r>
-          </w:p>
-          <w:p>
-            <w:r>
-              <w:rPr>
-                <w:rFonts w:ascii="Consolas" w:eastAsia="Consolas" w:hAnsi="Consolas" w:cs="Consolas"/>
-                <w:sz w:val="17"/>
-                <w:szCs w:val="17"/>
-              </w:rPr>
-              <w:t xml:space="preserve">    http_req_duration: ['p(95)&lt;500'],   // meta: p95 menor a 500 ms</w:t>
-            </w:r>
-          </w:p>
-          <w:p>
-            <w:r>
-              <w:rPr>
-                <w:rFonts w:ascii="Consolas" w:eastAsia="Consolas" w:hAnsi="Consolas" w:cs="Consolas"/>
-                <w:sz w:val="17"/>
-                <w:szCs w:val="17"/>
-              </w:rPr>
-              <w:t xml:space="preserve">    http_req_failed: ['rate&lt;0.01'],     // menos de 1% de errores</w:t>
-            </w:r>
-          </w:p>
-          <w:p>
-            <w:r>
-              <w:rPr>
-                <w:rFonts w:ascii="Consolas" w:eastAsia="Consolas" w:hAnsi="Consolas" w:cs="Consolas"/>
-                <w:sz w:val="17"/>
-                <w:szCs w:val="17"/>
-              </w:rPr>
-              <w:t xml:space="preserve">  },</w:t>
-            </w:r>
-          </w:p>
-          <w:p>
-            <w:r>
-              <w:rPr>
-                <w:rFonts w:ascii="Consolas" w:eastAsia="Consolas" w:hAnsi="Consolas" w:cs="Consolas"/>
-                <w:sz w:val="17"/>
-                <w:szCs w:val="17"/>
-              </w:rPr>
-              <w:t>},</w:t>
-            </w:r>
-          </w:p>
-        </w:tc>
-      </w:tr>
-    </w:tbl>
-    <w:p>
-      <w:pPr>
-        <w:spacing w:before="80" w:after="160" w:line="300" w:lineRule="auto"/>
-      </w:pPr>
-      <w:r>
-        <w:rPr>
-          <w:b/>
-          <w:bCs/>
-        </w:rPr>
-        <w:t xml:space="preserve">Por qué se usó: </w:t>
-      </w:r>
-      <w:r>
-        <w:t>el mismo script se corre con distinta cantidad de usuarios (VUS) para comparar corridas entre sí. Los thresholds convierten la meta del plan (p95 menor a 500 ms y menos de 1% de errores) en una regla: si no se cumple, k6 marca la prueba como fallida sin interpretar los números a mano.</w:t>
-      </w:r>
-    </w:p>
-    <w:p>
-      <w:pPr>
-        <w:pStyle w:val="Ttulo2"/>
-        <w:keepNext/>
-      </w:pPr>
-      <w:bookmarkStart w:id="16" w:name="_Toc243981747"/>
-      <w:r>
-        <w:t>8.3 Análisis y cuello de botella encontrado</w:t>
-      </w:r>
-      <w:bookmarkEnd w:id="16"/>
-    </w:p>
-    <w:p>
-      <w:pPr>
-        <w:pStyle w:val="Prrafodelista"/>
-        <w:numPr>
-          <w:ilvl w:val="0"/>
-          <w:numId w:val="2"/>
-        </w:numPr>
-        <w:spacing w:after="60" w:line="288" w:lineRule="auto"/>
-      </w:pPr>
-      <w:r>
-        <w:t>Con 5 usuarios el p95 fue 528 ms; con 50 usuarios llegó a 7,885 ms. Las peticiones por segundo apenas suben (4.4 → 5.3): el servidor ya estaba al máximo de lo que puede atender.</w:t>
-      </w:r>
-    </w:p>
-    <w:p>
-      <w:pPr>
-        <w:pStyle w:val="Prrafodelista"/>
-        <w:numPr>
-          <w:ilvl w:val="0"/>
-          <w:numId w:val="2"/>
-        </w:numPr>
-        <w:spacing w:after="60" w:line="288" w:lineRule="auto"/>
-      </w:pPr>
-      <w:r>
-        <w:t>Causa: el servidor integrado de PHP en Windows procesa una petición a la vez. Cuando llegan más usuarios, las peticiones esperan en cola y el tiempo de respuesta crece de forma casi lineal, aunque el código de cada endpoint sea rápido (en la prueba masiva de Pest, el listado de 5000 reservas responde en menos de 500 ms).</w:t>
-      </w:r>
-    </w:p>
-    <w:p>
-      <w:pPr>
-        <w:pStyle w:val="Prrafodelista"/>
-        <w:numPr>
-          <w:ilvl w:val="0"/>
-          <w:numId w:val="2"/>
-        </w:numPr>
-        <w:spacing w:after="60" w:line="288" w:lineRule="auto"/>
-      </w:pPr>
-      <w:r>
-        <w:t>Con 50 VU, lecturas, login y creación de reservas tienen casi el mismo p95 (7,890, 7,905 y 7,820 ms). El tiempo lo domina la espera en la cola del servidor, no el trabajo de cada endpoint.</w:t>
-      </w:r>
-    </w:p>
-    <w:p>
-      <w:pPr>
-        <w:pStyle w:val="Prrafodelista"/>
-        <w:numPr>
-          <w:ilvl w:val="0"/>
-          <w:numId w:val="2"/>
-        </w:numPr>
-        <w:spacing w:after="60" w:line="288" w:lineRule="auto"/>
-      </w:pPr>
-      <w:r>
-        <w:t>A pesar de la saturación no hubo errores (0% en todas las corridas): la API responde más lento, pero no se cae ni pierde peticiones.</w:t>
-      </w:r>
-    </w:p>
-    <w:p>
-      <w:pPr>
-        <w:pStyle w:val="Prrafodelista"/>
-        <w:numPr>
-          <w:ilvl w:val="0"/>
-          <w:numId w:val="2"/>
-        </w:numPr>
-        <w:spacing w:after="60" w:line="288" w:lineRule="auto"/>
-      </w:pPr>
-      <w:r>
-        <w:t>Corrección prevista para el 80%: Docker con Nginx + PHP-FPM (20 procesos), OPcache, MySQL en RDS y Redis para caché y rate limit. Las mismas corridas se repetirán en AWS con 50–100 y luego 1000–5000 usuarios, para comparar el antes y el después.</w:t>
-      </w:r>
-    </w:p>
-    <w:p>
-      <w:pPr>
-        <w:spacing w:after="120" w:line="300" w:lineRule="auto"/>
-      </w:pPr>
-      <w:r>
-        <w:t>Los reportes HTML interactivos de cada corrida (generados por k6) están en docs/pruebas/local-*.html y los datos crudos en docs/pruebas/datos/.</w:t>
-      </w:r>
-    </w:p>
-    <w:p>
-      <w:pPr>
-        <w:pStyle w:val="Ttulo2"/>
-        <w:keepNext/>
-      </w:pPr>
-      <w:bookmarkStart w:id="17" w:name="_Toc243981748"/>
-      <w:r>
-        <w:t>8.4 EXTRA: Cifrado (ofuscación) del código</w:t>
-      </w:r>
-      <w:bookmarkEnd w:id="17"/>
-    </w:p>
-    <w:p>
-      <w:pPr>
-        <w:spacing w:after="120" w:line="300" w:lineRule="auto"/>
-      </w:pPr>
-      <w:r>
-        <w:t>El build de producción del frontend sale ofuscado con javascript-obfuscator: los nombres se reemplazan por identificadores hexadecimales y los textos se guardan codificados en base64. Comparación del mismo texto de la interfaz («No tienes acceso»):</w:t>
-      </w:r>
-    </w:p>
-    <w:tbl>
-      <w:tblPr>
-        <w:tblW w:w="9070" w:type="dxa"/>
-        <w:tblBorders>
-          <w:top w:val="single" w:sz="4" w:space="0" w:color="auto"/>
-          <w:left w:val="single" w:sz="4" w:space="0" w:color="auto"/>
-          <w:bottom w:val="single" w:sz="4" w:space="0" w:color="auto"/>
-          <w:right w:val="single" w:sz="4" w:space="0" w:color="auto"/>
-          <w:insideH w:val="single" w:sz="4" w:space="0" w:color="auto"/>
-          <w:insideV w:val="single" w:sz="4" w:space="0" w:color="auto"/>
-        </w:tblBorders>
-        <w:tblLook w:val="04A0" w:firstRow="1" w:lastRow="0" w:firstColumn="1" w:lastColumn="0" w:noHBand="0" w:noVBand="1"/>
-      </w:tblPr>
-      <w:tblGrid>
-        <w:gridCol w:w="2474"/>
-        <w:gridCol w:w="3298"/>
-        <w:gridCol w:w="3298"/>
-      </w:tblGrid>
-      <w:tr>
-        <w:trPr>
-          <w:tblHeader/>
-        </w:trPr>
-        <w:tc>
-          <w:tcPr>
-            <w:tcW w:w="2474" w:type="dxa"/>
-            <w:tcBorders>
-              <w:top w:val="single" w:sz="4" w:space="0" w:color="000000"/>
-              <w:left w:val="single" w:sz="4" w:space="0" w:color="000000"/>
-              <w:bottom w:val="single" w:sz="4" w:space="0" w:color="000000"/>
-              <w:right w:val="single" w:sz="4" w:space="0" w:color="000000"/>
-            </w:tcBorders>
-            <w:shd w:val="clear" w:color="auto" w:fill="D9D9D9"/>
-            <w:tcMar>
-              <w:top w:w="60" w:type="dxa"/>
-              <w:left w:w="90" w:type="dxa"/>
-              <w:bottom w:w="60" w:type="dxa"/>
-              <w:right w:w="90" w:type="dxa"/>
-            </w:tcMar>
-            <w:vAlign w:val="center"/>
-          </w:tcPr>
-          <w:p>
-            <w:r>
-              <w:rPr>
-                <w:b/>
-                <w:bCs/>
-                <w:sz w:val="20"/>
-                <w:szCs w:val="20"/>
-              </w:rPr>
-              <w:t>Build</w:t>
-            </w:r>
-          </w:p>
-        </w:tc>
-        <w:tc>
-          <w:tcPr>
-            <w:tcW w:w="3298" w:type="dxa"/>
-            <w:tcBorders>
-              <w:top w:val="single" w:sz="4" w:space="0" w:color="000000"/>
-              <w:left w:val="single" w:sz="4" w:space="0" w:color="000000"/>
-              <w:bottom w:val="single" w:sz="4" w:space="0" w:color="000000"/>
-              <w:right w:val="single" w:sz="4" w:space="0" w:color="000000"/>
-            </w:tcBorders>
-            <w:shd w:val="clear" w:color="auto" w:fill="D9D9D9"/>
-            <w:tcMar>
-              <w:top w:w="60" w:type="dxa"/>
-              <w:left w:w="90" w:type="dxa"/>
-              <w:bottom w:w="60" w:type="dxa"/>
-              <w:right w:w="90" w:type="dxa"/>
-            </w:tcMar>
-            <w:vAlign w:val="center"/>
-          </w:tcPr>
-          <w:p>
-            <w:r>
-              <w:rPr>
-                <w:b/>
-                <w:bCs/>
-                <w:sz w:val="20"/>
-                <w:szCs w:val="20"/>
-              </w:rPr>
-              <w:t>Comando</w:t>
-            </w:r>
-          </w:p>
-        </w:tc>
-        <w:tc>
-          <w:tcPr>
-            <w:tcW w:w="3298" w:type="dxa"/>
-            <w:tcBorders>
-              <w:top w:val="single" w:sz="4" w:space="0" w:color="000000"/>
-              <w:left w:val="single" w:sz="4" w:space="0" w:color="000000"/>
-              <w:bottom w:val="single" w:sz="4" w:space="0" w:color="000000"/>
-              <w:right w:val="single" w:sz="4" w:space="0" w:color="000000"/>
-            </w:tcBorders>
-            <w:shd w:val="clear" w:color="auto" w:fill="D9D9D9"/>
-            <w:tcMar>
-              <w:top w:w="60" w:type="dxa"/>
-              <w:left w:w="90" w:type="dxa"/>
-              <w:bottom w:w="60" w:type="dxa"/>
-              <w:right w:w="90" w:type="dxa"/>
-            </w:tcMar>
-            <w:vAlign w:val="center"/>
-          </w:tcPr>
-          <w:p>
-            <w:r>
-              <w:rPr>
-                <w:b/>
-                <w:bCs/>
-                <w:sz w:val="20"/>
-                <w:szCs w:val="20"/>
-              </w:rPr>
-              <w:t>Veces que aparece legible</w:t>
-            </w:r>
-          </w:p>
-        </w:tc>
-      </w:tr>
-      <w:tr>
-        <w:tc>
-          <w:tcPr>
-            <w:tcW w:w="2474" w:type="dxa"/>
-            <w:tcBorders>
-              <w:top w:val="single" w:sz="4" w:space="0" w:color="000000"/>
-              <w:left w:val="single" w:sz="4" w:space="0" w:color="000000"/>
-              <w:bottom w:val="single" w:sz="4" w:space="0" w:color="000000"/>
-              <w:right w:val="single" w:sz="4" w:space="0" w:color="000000"/>
-            </w:tcBorders>
-            <w:tcMar>
-              <w:top w:w="60" w:type="dxa"/>
-              <w:left w:w="90" w:type="dxa"/>
-              <w:bottom w:w="60" w:type="dxa"/>
-              <w:right w:w="90" w:type="dxa"/>
-            </w:tcMar>
-            <w:vAlign w:val="center"/>
-          </w:tcPr>
-          <w:p>
-            <w:r>
-              <w:rPr>
-                <w:sz w:val="20"/>
-                <w:szCs w:val="20"/>
-              </w:rPr>
-              <w:t>Normal</w:t>
-            </w:r>
-          </w:p>
-        </w:tc>
-        <w:tc>
-          <w:tcPr>
-            <w:tcW w:w="3298" w:type="dxa"/>
-            <w:tcBorders>
-              <w:top w:val="single" w:sz="4" w:space="0" w:color="000000"/>
-              <w:left w:val="single" w:sz="4" w:space="0" w:color="000000"/>
-              <w:bottom w:val="single" w:sz="4" w:space="0" w:color="000000"/>
-              <w:right w:val="single" w:sz="4" w:space="0" w:color="000000"/>
-            </w:tcBorders>
-            <w:tcMar>
-              <w:top w:w="60" w:type="dxa"/>
-              <w:left w:w="90" w:type="dxa"/>
-              <w:bottom w:w="60" w:type="dxa"/>
-              <w:right w:w="90" w:type="dxa"/>
-            </w:tcMar>
-            <w:vAlign w:val="center"/>
-          </w:tcPr>
-          <w:p>
-            <w:r>
-              <w:rPr>
-                <w:sz w:val="20"/>
-                <w:szCs w:val="20"/>
-              </w:rPr>
-              <w:t>npm run build:plain</w:t>
-            </w:r>
-          </w:p>
-        </w:tc>
-        <w:tc>
-          <w:tcPr>
-            <w:tcW w:w="3298" w:type="dxa"/>
-            <w:tcBorders>
-              <w:top w:val="single" w:sz="4" w:space="0" w:color="000000"/>
-              <w:left w:val="single" w:sz="4" w:space="0" w:color="000000"/>
-              <w:bottom w:val="single" w:sz="4" w:space="0" w:color="000000"/>
-              <w:right w:val="single" w:sz="4" w:space="0" w:color="000000"/>
-            </w:tcBorders>
-            <w:tcMar>
-              <w:top w:w="60" w:type="dxa"/>
-              <w:left w:w="90" w:type="dxa"/>
-              <w:bottom w:w="60" w:type="dxa"/>
-              <w:right w:w="90" w:type="dxa"/>
-            </w:tcMar>
-            <w:vAlign w:val="center"/>
-          </w:tcPr>
-          <w:p>
-            <w:r>
-              <w:rPr>
-                <w:sz w:val="20"/>
-                <w:szCs w:val="20"/>
-              </w:rPr>
-              <w:t>1</w:t>
-            </w:r>
-          </w:p>
-        </w:tc>
-      </w:tr>
-      <w:tr>
-        <w:tc>
-          <w:tcPr>
-            <w:tcW w:w="2474" w:type="dxa"/>
-            <w:tcBorders>
-              <w:top w:val="single" w:sz="4" w:space="0" w:color="000000"/>
-              <w:left w:val="single" w:sz="4" w:space="0" w:color="000000"/>
-              <w:bottom w:val="single" w:sz="4" w:space="0" w:color="000000"/>
-              <w:right w:val="single" w:sz="4" w:space="0" w:color="000000"/>
-            </w:tcBorders>
-            <w:tcMar>
-              <w:top w:w="60" w:type="dxa"/>
-              <w:left w:w="90" w:type="dxa"/>
-              <w:bottom w:w="60" w:type="dxa"/>
-              <w:right w:w="90" w:type="dxa"/>
-            </w:tcMar>
-            <w:vAlign w:val="center"/>
-          </w:tcPr>
-          <w:p>
-            <w:r>
-              <w:rPr>
-                <w:sz w:val="20"/>
-                <w:szCs w:val="20"/>
-              </w:rPr>
-              <w:t>Ofuscado (producción)</w:t>
-            </w:r>
-          </w:p>
-        </w:tc>
-        <w:tc>
-          <w:tcPr>
-            <w:tcW w:w="3298" w:type="dxa"/>
-            <w:tcBorders>
-              <w:top w:val="single" w:sz="4" w:space="0" w:color="000000"/>
-              <w:left w:val="single" w:sz="4" w:space="0" w:color="000000"/>
-              <w:bottom w:val="single" w:sz="4" w:space="0" w:color="000000"/>
-              <w:right w:val="single" w:sz="4" w:space="0" w:color="000000"/>
-            </w:tcBorders>
-            <w:tcMar>
-              <w:top w:w="60" w:type="dxa"/>
-              <w:left w:w="90" w:type="dxa"/>
-              <w:bottom w:w="60" w:type="dxa"/>
-              <w:right w:w="90" w:type="dxa"/>
-            </w:tcMar>
-            <w:vAlign w:val="center"/>
-          </w:tcPr>
-          <w:p>
-            <w:r>
-              <w:rPr>
-                <w:sz w:val="20"/>
-                <w:szCs w:val="20"/>
-              </w:rPr>
-              <w:t>npm run build</w:t>
-            </w:r>
-          </w:p>
-        </w:tc>
-        <w:tc>
-          <w:tcPr>
-            <w:tcW w:w="3298" w:type="dxa"/>
-            <w:tcBorders>
-              <w:top w:val="single" w:sz="4" w:space="0" w:color="000000"/>
-              <w:left w:val="single" w:sz="4" w:space="0" w:color="000000"/>
-              <w:bottom w:val="single" w:sz="4" w:space="0" w:color="000000"/>
-              <w:right w:val="single" w:sz="4" w:space="0" w:color="000000"/>
-            </w:tcBorders>
-            <w:tcMar>
-              <w:top w:w="60" w:type="dxa"/>
-              <w:left w:w="90" w:type="dxa"/>
-              <w:bottom w:w="60" w:type="dxa"/>
-              <w:right w:w="90" w:type="dxa"/>
-            </w:tcMar>
-            <w:vAlign w:val="center"/>
-          </w:tcPr>
-          <w:p>
-            <w:r>
-              <w:rPr>
-                <w:sz w:val="20"/>
-                <w:szCs w:val="20"/>
-              </w:rPr>
-              <w:t>0</w:t>
-            </w:r>
-          </w:p>
-        </w:tc>
-      </w:tr>
-    </w:tbl>
-    <w:p>
-      <w:pPr>
-        <w:spacing w:after="80"/>
-      </w:pPr>
-    </w:p>
-    <w:p>
-      <w:pPr>
-        <w:spacing w:after="120" w:line="300" w:lineRule="auto"/>
-      </w:pPr>
-      <w:r>
-        <w:t>El backend no se publica: corre en un servidor privado sin acceso al código.</w:t>
-      </w:r>
-    </w:p>
-    <w:p>
-      <w:pPr>
-        <w:keepNext/>
-        <w:spacing w:before="120" w:after="60"/>
-      </w:pPr>
-      <w:r>
-        <w:rPr>
-          <w:b/>
-          <w:bCs/>
-          <w:sz w:val="21"/>
-          <w:szCs w:val="21"/>
-        </w:rPr>
-        <w:t xml:space="preserve">Fragmento 10. </w:t>
-      </w:r>
-      <w:r>
-        <w:rPr>
-          <w:i/>
-          <w:iCs/>
-          <w:sz w:val="21"/>
-          <w:szCs w:val="21"/>
-        </w:rPr>
-        <w:t>web/vite.config.ts (extracto)</w:t>
-      </w:r>
-    </w:p>
-    <w:tbl>
-      <w:tblPr>
-        <w:tblW w:w="9070" w:type="dxa"/>
-        <w:tblBorders>
-          <w:top w:val="single" w:sz="4" w:space="0" w:color="auto"/>
-          <w:left w:val="single" w:sz="4" w:space="0" w:color="auto"/>
-          <w:bottom w:val="single" w:sz="4" w:space="0" w:color="auto"/>
-          <w:right w:val="single" w:sz="4" w:space="0" w:color="auto"/>
-          <w:insideH w:val="single" w:sz="4" w:space="0" w:color="auto"/>
-          <w:insideV w:val="single" w:sz="4" w:space="0" w:color="auto"/>
-        </w:tblBorders>
-        <w:tblLook w:val="04A0" w:firstRow="1" w:lastRow="0" w:firstColumn="1" w:lastColumn="0" w:noHBand="0" w:noVBand="1"/>
-      </w:tblPr>
-      <w:tblGrid>
-        <w:gridCol w:w="9070"/>
-      </w:tblGrid>
-      <w:tr>
-        <w:trPr>
-          <w:cantSplit/>
-        </w:trPr>
-        <w:tc>
-          <w:tcPr>
-            <w:tcW w:w="9070" w:type="dxa"/>
-            <w:tcBorders>
-              <w:top w:val="single" w:sz="4" w:space="0" w:color="000000"/>
-              <w:left w:val="single" w:sz="4" w:space="0" w:color="000000"/>
-              <w:bottom w:val="single" w:sz="4" w:space="0" w:color="000000"/>
-              <w:right w:val="single" w:sz="4" w:space="0" w:color="000000"/>
-            </w:tcBorders>
-            <w:shd w:val="clear" w:color="auto" w:fill="F2F2F2"/>
-            <w:tcMar>
-              <w:top w:w="80" w:type="dxa"/>
-              <w:left w:w="140" w:type="dxa"/>
-              <w:bottom w:w="80" w:type="dxa"/>
-              <w:right w:w="140" w:type="dxa"/>
-            </w:tcMar>
-          </w:tcPr>
-          <w:p>
-            <w:r>
-              <w:rPr>
-                <w:rFonts w:ascii="Consolas" w:eastAsia="Consolas" w:hAnsi="Consolas" w:cs="Consolas"/>
-                <w:sz w:val="17"/>
-                <w:szCs w:val="17"/>
-              </w:rPr>
-              <w:t>renderChunk(code, chunk) {</w:t>
-            </w:r>
-          </w:p>
-          <w:p>
-            <w:r>
-              <w:rPr>
-                <w:rFonts w:ascii="Consolas" w:eastAsia="Consolas" w:hAnsi="Consolas" w:cs="Consolas"/>
-                <w:sz w:val="17"/>
-                <w:szCs w:val="17"/>
-              </w:rPr>
-              <w:t xml:space="preserve">  const result = JavaScriptObfuscator.obfuscate(code, {</w:t>
-            </w:r>
-          </w:p>
-          <w:p>
-            <w:r>
-              <w:rPr>
-                <w:rFonts w:ascii="Consolas" w:eastAsia="Consolas" w:hAnsi="Consolas" w:cs="Consolas"/>
-                <w:sz w:val="17"/>
-                <w:szCs w:val="17"/>
-              </w:rPr>
-              <w:t xml:space="preserve">    identifierNamesGenerator: 'hexadecimal',   // nombres ilegibles</w:t>
-            </w:r>
-          </w:p>
-          <w:p>
-            <w:r>
-              <w:rPr>
-                <w:rFonts w:ascii="Consolas" w:eastAsia="Consolas" w:hAnsi="Consolas" w:cs="Consolas"/>
-                <w:sz w:val="17"/>
-                <w:szCs w:val="17"/>
-              </w:rPr>
-              <w:t xml:space="preserve">    stringArray: true, stringArrayEncoding: ['base64'],   // textos codificados</w:t>
-            </w:r>
-          </w:p>
-          <w:p>
-            <w:r>
-              <w:rPr>
-                <w:rFonts w:ascii="Consolas" w:eastAsia="Consolas" w:hAnsi="Consolas" w:cs="Consolas"/>
-                <w:sz w:val="17"/>
-                <w:szCs w:val="17"/>
-              </w:rPr>
-              <w:t xml:space="preserve">    splitStrings: true, compact: true,</w:t>
-            </w:r>
-          </w:p>
-          <w:p>
-            <w:r>
-              <w:rPr>
-                <w:rFonts w:ascii="Consolas" w:eastAsia="Consolas" w:hAnsi="Consolas" w:cs="Consolas"/>
-                <w:sz w:val="17"/>
-                <w:szCs w:val="17"/>
-              </w:rPr>
-              <w:t xml:space="preserve">  })</w:t>
-            </w:r>
-          </w:p>
-          <w:p>
-            <w:r>
-              <w:rPr>
-                <w:rFonts w:ascii="Consolas" w:eastAsia="Consolas" w:hAnsi="Consolas" w:cs="Consolas"/>
-                <w:sz w:val="17"/>
-                <w:szCs w:val="17"/>
-              </w:rPr>
-              <w:t xml:space="preserve">  return { code: result.getObfuscatedCode(), map: null }</w:t>
-            </w:r>
-          </w:p>
-          <w:p>
-            <w:r>
-              <w:rPr>
-                <w:rFonts w:ascii="Consolas" w:eastAsia="Consolas" w:hAnsi="Consolas" w:cs="Consolas"/>
-                <w:sz w:val="17"/>
-                <w:szCs w:val="17"/>
-              </w:rPr>
-              <w:t>}</w:t>
-            </w:r>
-          </w:p>
-        </w:tc>
-      </w:tr>
-    </w:tbl>
-    <w:p>
-      <w:pPr>
-        <w:spacing w:before="80" w:after="160" w:line="300" w:lineRule="auto"/>
-      </w:pPr>
-      <w:r>
-        <w:rPr>
-          <w:b/>
-          <w:bCs/>
-        </w:rPr>
-        <w:t xml:space="preserve">Por qué se usó: </w:t>
-      </w:r>
-      <w:r>
-        <w:t>el código de una aplicación web se descarga al navegador, así que cualquiera puede leerlo. La ofuscación se aplica al paquete final de producción para dificultar copiarlo o estudiar su lógica, sin cambiar lo que hace. En desarrollo se trabaja con el código normal (npm run build:plain).</w:t>
-      </w:r>
-    </w:p>
-    <w:p>
-      <w:pPr>
-        <w:pStyle w:val="Ttulo2"/>
-        <w:keepNext/>
-      </w:pPr>
-      <w:bookmarkStart w:id="18" w:name="_Toc243981749"/>
-      <w:r>
-        <w:t>8.5 EXTRA: Vista del programador</w:t>
-      </w:r>
-      <w:bookmarkEnd w:id="18"/>
-    </w:p>
-    <w:p>
-      <w:pPr>
-        <w:spacing w:after="120" w:line="300" w:lineRule="auto"/>
-      </w:pPr>
-      <w:r>
-        <w:t>El rol Programador tiene una pantalla de diagnóstico (/programador) que muestra, sin entrar al servidor: estado de la aplicación, la base de datos y la caché; versión y configuración (vida del token, rate limits, CORS); latencias p50/p95/p99 calculadas del log JSON; rutas más lentas; últimas peticiones; errores buscables por código de incidente, el mismo que ve el usuario en la pantalla 500; y la lista de todas las rutas de la API con su rol de acceso. No muestra contraseñas ni claves, y una prueba automáti</w:t>
-      </w:r>
-      <w:r>
-        <w:t>ca lo verifica.</w:t>
+        <w:t>Figura 10. p95 por tipo de operación (lecturas, login, crear reserva).</w:t>
       </w:r>
     </w:p>
     <w:p>
@@ -12612,8 +11870,8 @@
           <w:noProof/>
         </w:rPr>
         <w:drawing>
-          <wp:inline distT="0" distB="0" distL="0" distR="0" wp14:anchorId="2D4AF45E" wp14:editId="2F8D7917">
-            <wp:extent cx="5400675" cy="3371850"/>
+          <wp:inline distT="0" distB="0" distL="0" distR="0" wp14:anchorId="721E9FA7" wp14:editId="1BDFC05B">
+            <wp:extent cx="5400675" cy="3638550"/>
             <wp:effectExtent l="0" t="0" r="0" b="0"/>
             <wp:docPr id="13" name="Imagen 13"/>
             <wp:cNvGraphicFramePr>
@@ -12638,6 +11896,838 @@
                   <pic:spPr bwMode="auto">
                     <a:xfrm>
                       <a:off x="0" y="0"/>
+                      <a:ext cx="5400675" cy="3638550"/>
+                    </a:xfrm>
+                    <a:prstGeom prst="rect">
+                      <a:avLst/>
+                    </a:prstGeom>
+                  </pic:spPr>
+                </pic:pic>
+              </a:graphicData>
+            </a:graphic>
+          </wp:inline>
+        </w:drawing>
+      </w:r>
+    </w:p>
+    <w:p>
+      <w:pPr>
+        <w:spacing w:after="200"/>
+        <w:jc w:val="center"/>
+      </w:pPr>
+      <w:r>
+        <w:rPr>
+          <w:i/>
+          <w:iCs/>
+          <w:sz w:val="20"/>
+          <w:szCs w:val="20"/>
+        </w:rPr>
+        <w:t>Figura 11. Evolución de la latencia segundo a segundo en la corrida de 50 usuarios.</w:t>
+      </w:r>
+    </w:p>
+    <w:p>
+      <w:pPr>
+        <w:keepNext/>
+        <w:spacing w:before="120" w:after="60"/>
+      </w:pPr>
+      <w:r>
+        <w:rPr>
+          <w:b/>
+          <w:bCs/>
+          <w:sz w:val="21"/>
+          <w:szCs w:val="21"/>
+        </w:rPr>
+        <w:lastRenderedPageBreak/>
+        <w:t xml:space="preserve">Fragmento 9. </w:t>
+      </w:r>
+      <w:r>
+        <w:rPr>
+          <w:i/>
+          <w:iCs/>
+          <w:sz w:val="21"/>
+          <w:szCs w:val="21"/>
+        </w:rPr>
+        <w:t>tests/k6/reservas.js (extracto)</w:t>
+      </w:r>
+    </w:p>
+    <w:tbl>
+      <w:tblPr>
+        <w:tblW w:w="9070" w:type="dxa"/>
+        <w:tblBorders>
+          <w:top w:val="single" w:sz="4" w:space="0" w:color="auto"/>
+          <w:left w:val="single" w:sz="4" w:space="0" w:color="auto"/>
+          <w:bottom w:val="single" w:sz="4" w:space="0" w:color="auto"/>
+          <w:right w:val="single" w:sz="4" w:space="0" w:color="auto"/>
+          <w:insideH w:val="single" w:sz="4" w:space="0" w:color="auto"/>
+          <w:insideV w:val="single" w:sz="4" w:space="0" w:color="auto"/>
+        </w:tblBorders>
+        <w:tblLook w:val="04A0" w:firstRow="1" w:lastRow="0" w:firstColumn="1" w:lastColumn="0" w:noHBand="0" w:noVBand="1"/>
+      </w:tblPr>
+      <w:tblGrid>
+        <w:gridCol w:w="9070"/>
+      </w:tblGrid>
+      <w:tr>
+        <w:trPr>
+          <w:cantSplit/>
+        </w:trPr>
+        <w:tc>
+          <w:tcPr>
+            <w:tcW w:w="9070" w:type="dxa"/>
+            <w:tcBorders>
+              <w:top w:val="single" w:sz="4" w:space="0" w:color="000000"/>
+              <w:left w:val="single" w:sz="4" w:space="0" w:color="000000"/>
+              <w:bottom w:val="single" w:sz="4" w:space="0" w:color="000000"/>
+              <w:right w:val="single" w:sz="4" w:space="0" w:color="000000"/>
+            </w:tcBorders>
+            <w:shd w:val="clear" w:color="auto" w:fill="F2F2F2"/>
+            <w:tcMar>
+              <w:top w:w="80" w:type="dxa"/>
+              <w:left w:w="140" w:type="dxa"/>
+              <w:bottom w:w="80" w:type="dxa"/>
+              <w:right w:w="140" w:type="dxa"/>
+            </w:tcMar>
+          </w:tcPr>
+          <w:p>
+            <w:r>
+              <w:rPr>
+                <w:rFonts w:ascii="Consolas" w:eastAsia="Consolas" w:hAnsi="Consolas" w:cs="Consolas"/>
+                <w:sz w:val="17"/>
+                <w:szCs w:val="17"/>
+              </w:rPr>
+              <w:t>escalon: {</w:t>
+            </w:r>
+          </w:p>
+          <w:p>
+            <w:r>
+              <w:rPr>
+                <w:rFonts w:ascii="Consolas" w:eastAsia="Consolas" w:hAnsi="Consolas" w:cs="Consolas"/>
+                <w:sz w:val="17"/>
+                <w:szCs w:val="17"/>
+              </w:rPr>
+              <w:t xml:space="preserve">  stages: [</w:t>
+            </w:r>
+          </w:p>
+          <w:p>
+            <w:r>
+              <w:rPr>
+                <w:rFonts w:ascii="Consolas" w:eastAsia="Consolas" w:hAnsi="Consolas" w:cs="Consolas"/>
+                <w:sz w:val="17"/>
+                <w:szCs w:val="17"/>
+              </w:rPr>
+              <w:t xml:space="preserve">    { duration: '10s', target: VUS },   // sube hasta VUS usuarios</w:t>
+            </w:r>
+          </w:p>
+          <w:p>
+            <w:r>
+              <w:rPr>
+                <w:rFonts w:ascii="Consolas" w:eastAsia="Consolas" w:hAnsi="Consolas" w:cs="Consolas"/>
+                <w:sz w:val="17"/>
+                <w:szCs w:val="17"/>
+              </w:rPr>
+              <w:t xml:space="preserve">    { duration: '45s', target: VUS },   // mantiene la carga</w:t>
+            </w:r>
+          </w:p>
+          <w:p>
+            <w:r>
+              <w:rPr>
+                <w:rFonts w:ascii="Consolas" w:eastAsia="Consolas" w:hAnsi="Consolas" w:cs="Consolas"/>
+                <w:sz w:val="17"/>
+                <w:szCs w:val="17"/>
+              </w:rPr>
+              <w:t xml:space="preserve">    { duration: '5s',  target: 0 },     // baja</w:t>
+            </w:r>
+          </w:p>
+          <w:p>
+            <w:r>
+              <w:rPr>
+                <w:rFonts w:ascii="Consolas" w:eastAsia="Consolas" w:hAnsi="Consolas" w:cs="Consolas"/>
+                <w:sz w:val="17"/>
+                <w:szCs w:val="17"/>
+              </w:rPr>
+              <w:t xml:space="preserve">  ],</w:t>
+            </w:r>
+          </w:p>
+          <w:p>
+            <w:r>
+              <w:rPr>
+                <w:rFonts w:ascii="Consolas" w:eastAsia="Consolas" w:hAnsi="Consolas" w:cs="Consolas"/>
+                <w:sz w:val="17"/>
+                <w:szCs w:val="17"/>
+              </w:rPr>
+              <w:t xml:space="preserve">  thresholds: {</w:t>
+            </w:r>
+          </w:p>
+          <w:p>
+            <w:r>
+              <w:rPr>
+                <w:rFonts w:ascii="Consolas" w:eastAsia="Consolas" w:hAnsi="Consolas" w:cs="Consolas"/>
+                <w:sz w:val="17"/>
+                <w:szCs w:val="17"/>
+              </w:rPr>
+              <w:t xml:space="preserve">    http_req_duration: ['p(95)&lt;500'],   // meta: p95 menor a 500 ms</w:t>
+            </w:r>
+          </w:p>
+          <w:p>
+            <w:r>
+              <w:rPr>
+                <w:rFonts w:ascii="Consolas" w:eastAsia="Consolas" w:hAnsi="Consolas" w:cs="Consolas"/>
+                <w:sz w:val="17"/>
+                <w:szCs w:val="17"/>
+              </w:rPr>
+              <w:t xml:space="preserve">    http_req_failed: ['rate&lt;0.01'],     // menos de 1% de errores</w:t>
+            </w:r>
+          </w:p>
+          <w:p>
+            <w:r>
+              <w:rPr>
+                <w:rFonts w:ascii="Consolas" w:eastAsia="Consolas" w:hAnsi="Consolas" w:cs="Consolas"/>
+                <w:sz w:val="17"/>
+                <w:szCs w:val="17"/>
+              </w:rPr>
+              <w:t xml:space="preserve">  },</w:t>
+            </w:r>
+          </w:p>
+          <w:p>
+            <w:r>
+              <w:rPr>
+                <w:rFonts w:ascii="Consolas" w:eastAsia="Consolas" w:hAnsi="Consolas" w:cs="Consolas"/>
+                <w:sz w:val="17"/>
+                <w:szCs w:val="17"/>
+              </w:rPr>
+              <w:t>},</w:t>
+            </w:r>
+          </w:p>
+        </w:tc>
+      </w:tr>
+    </w:tbl>
+    <w:p>
+      <w:pPr>
+        <w:spacing w:before="80" w:after="160" w:line="300" w:lineRule="auto"/>
+      </w:pPr>
+      <w:r>
+        <w:rPr>
+          <w:b/>
+          <w:bCs/>
+        </w:rPr>
+        <w:t xml:space="preserve">Por qué se usó: </w:t>
+      </w:r>
+      <w:r>
+        <w:t>el mismo script se corre con distinta cantidad de usuarios (VUS) para comparar corridas entre sí. Los thresholds convierten la meta del plan (p95 menor a 500 ms y menos de 1% de errores) en una regla: si no se cumple, k6 marca la prueba como fallida sin interpretar los números a mano.</w:t>
+      </w:r>
+    </w:p>
+    <w:p>
+      <w:pPr>
+        <w:pStyle w:val="Ttulo2"/>
+        <w:keepNext/>
+      </w:pPr>
+      <w:bookmarkStart w:id="16" w:name="_Toc243984522"/>
+      <w:r>
+        <w:t>8.3 Análisis y cuello de botella encontrado</w:t>
+      </w:r>
+      <w:bookmarkEnd w:id="16"/>
+    </w:p>
+    <w:p>
+      <w:pPr>
+        <w:pStyle w:val="Prrafodelista"/>
+        <w:numPr>
+          <w:ilvl w:val="0"/>
+          <w:numId w:val="2"/>
+        </w:numPr>
+        <w:spacing w:after="60" w:line="288" w:lineRule="auto"/>
+      </w:pPr>
+      <w:r>
+        <w:t>Con 5 usuarios el p95 fue 528 ms; con 50 usuarios llegó a 7,885 ms. Las peticiones por segundo apenas suben (4.4 → 5.3): el servidor ya estaba al máximo de lo que puede atender.</w:t>
+      </w:r>
+    </w:p>
+    <w:p>
+      <w:pPr>
+        <w:pStyle w:val="Prrafodelista"/>
+        <w:numPr>
+          <w:ilvl w:val="0"/>
+          <w:numId w:val="2"/>
+        </w:numPr>
+        <w:spacing w:after="60" w:line="288" w:lineRule="auto"/>
+      </w:pPr>
+      <w:r>
+        <w:t>Causa: el servidor integrado de PHP en Windows procesa una petición a la vez. Cuando llegan más usuarios, las peticiones esperan en cola y el tiempo de respuesta crece de forma casi lineal, aunque el código de cada endpoint sea rápido (en la prueba masiva de Pest, el listado de 5000 reservas responde en menos de 500 ms).</w:t>
+      </w:r>
+    </w:p>
+    <w:p>
+      <w:pPr>
+        <w:pStyle w:val="Prrafodelista"/>
+        <w:numPr>
+          <w:ilvl w:val="0"/>
+          <w:numId w:val="2"/>
+        </w:numPr>
+        <w:spacing w:after="60" w:line="288" w:lineRule="auto"/>
+      </w:pPr>
+      <w:r>
+        <w:t>Con 50 VU, lecturas, login y creación de reservas tienen casi el mismo p95 (7,890, 7,905 y 7,820 ms). El tiempo lo domina la espera en la cola del servidor, no el trabajo de cada endpoint.</w:t>
+      </w:r>
+    </w:p>
+    <w:p>
+      <w:pPr>
+        <w:pStyle w:val="Prrafodelista"/>
+        <w:numPr>
+          <w:ilvl w:val="0"/>
+          <w:numId w:val="2"/>
+        </w:numPr>
+        <w:spacing w:after="60" w:line="288" w:lineRule="auto"/>
+      </w:pPr>
+      <w:r>
+        <w:t>A pesar de la saturación no hubo errores (0% en todas las corridas): la API responde más lento, pero no se cae ni pierde peticiones.</w:t>
+      </w:r>
+    </w:p>
+    <w:p>
+      <w:pPr>
+        <w:pStyle w:val="Prrafodelista"/>
+        <w:numPr>
+          <w:ilvl w:val="0"/>
+          <w:numId w:val="2"/>
+        </w:numPr>
+        <w:spacing w:after="60" w:line="288" w:lineRule="auto"/>
+      </w:pPr>
+      <w:r>
+        <w:t>Corrección prevista para el 80%: Docker con Nginx + PHP-FPM (20 procesos), OPcache, MySQL en RDS y Redis para caché y rate limit. Las mismas corridas se repetirán en AWS con 50–100 y luego 1000–5000 usuarios, para comparar el antes y el después.</w:t>
+      </w:r>
+    </w:p>
+    <w:p>
+      <w:pPr>
+        <w:spacing w:after="120" w:line="300" w:lineRule="auto"/>
+      </w:pPr>
+      <w:r>
+        <w:t>Los reportes HTML interactivos de cada corrida (generados por k6) están en docs/pruebas/local-*.html y los datos crudos en docs/pruebas/datos/.</w:t>
+      </w:r>
+    </w:p>
+    <w:p>
+      <w:pPr>
+        <w:pStyle w:val="Ttulo2"/>
+        <w:keepNext/>
+      </w:pPr>
+      <w:bookmarkStart w:id="17" w:name="_Toc243984523"/>
+      <w:r>
+        <w:t>8.4 EXTRA: Cifrado (ofuscación) del código</w:t>
+      </w:r>
+      <w:bookmarkEnd w:id="17"/>
+    </w:p>
+    <w:p>
+      <w:pPr>
+        <w:spacing w:after="120" w:line="300" w:lineRule="auto"/>
+      </w:pPr>
+      <w:r>
+        <w:t>El build de producción del frontend sale ofuscado con javascript-obfuscator: los nombres se reemplazan por identificadores hexadecimales y los textos se guardan codificados en base64. Comparación del mismo texto de la interfaz («No tienes acceso»):</w:t>
+      </w:r>
+    </w:p>
+    <w:tbl>
+      <w:tblPr>
+        <w:tblW w:w="9070" w:type="dxa"/>
+        <w:tblBorders>
+          <w:top w:val="single" w:sz="4" w:space="0" w:color="auto"/>
+          <w:left w:val="single" w:sz="4" w:space="0" w:color="auto"/>
+          <w:bottom w:val="single" w:sz="4" w:space="0" w:color="auto"/>
+          <w:right w:val="single" w:sz="4" w:space="0" w:color="auto"/>
+          <w:insideH w:val="single" w:sz="4" w:space="0" w:color="auto"/>
+          <w:insideV w:val="single" w:sz="4" w:space="0" w:color="auto"/>
+        </w:tblBorders>
+        <w:tblLook w:val="04A0" w:firstRow="1" w:lastRow="0" w:firstColumn="1" w:lastColumn="0" w:noHBand="0" w:noVBand="1"/>
+      </w:tblPr>
+      <w:tblGrid>
+        <w:gridCol w:w="2474"/>
+        <w:gridCol w:w="3298"/>
+        <w:gridCol w:w="3298"/>
+      </w:tblGrid>
+      <w:tr>
+        <w:trPr>
+          <w:tblHeader/>
+        </w:trPr>
+        <w:tc>
+          <w:tcPr>
+            <w:tcW w:w="2474" w:type="dxa"/>
+            <w:tcBorders>
+              <w:top w:val="single" w:sz="4" w:space="0" w:color="000000"/>
+              <w:left w:val="single" w:sz="4" w:space="0" w:color="000000"/>
+              <w:bottom w:val="single" w:sz="4" w:space="0" w:color="000000"/>
+              <w:right w:val="single" w:sz="4" w:space="0" w:color="000000"/>
+            </w:tcBorders>
+            <w:shd w:val="clear" w:color="auto" w:fill="D9D9D9"/>
+            <w:tcMar>
+              <w:top w:w="60" w:type="dxa"/>
+              <w:left w:w="90" w:type="dxa"/>
+              <w:bottom w:w="60" w:type="dxa"/>
+              <w:right w:w="90" w:type="dxa"/>
+            </w:tcMar>
+            <w:vAlign w:val="center"/>
+          </w:tcPr>
+          <w:p>
+            <w:r>
+              <w:rPr>
+                <w:b/>
+                <w:bCs/>
+                <w:sz w:val="20"/>
+                <w:szCs w:val="20"/>
+              </w:rPr>
+              <w:t>Build</w:t>
+            </w:r>
+          </w:p>
+        </w:tc>
+        <w:tc>
+          <w:tcPr>
+            <w:tcW w:w="3298" w:type="dxa"/>
+            <w:tcBorders>
+              <w:top w:val="single" w:sz="4" w:space="0" w:color="000000"/>
+              <w:left w:val="single" w:sz="4" w:space="0" w:color="000000"/>
+              <w:bottom w:val="single" w:sz="4" w:space="0" w:color="000000"/>
+              <w:right w:val="single" w:sz="4" w:space="0" w:color="000000"/>
+            </w:tcBorders>
+            <w:shd w:val="clear" w:color="auto" w:fill="D9D9D9"/>
+            <w:tcMar>
+              <w:top w:w="60" w:type="dxa"/>
+              <w:left w:w="90" w:type="dxa"/>
+              <w:bottom w:w="60" w:type="dxa"/>
+              <w:right w:w="90" w:type="dxa"/>
+            </w:tcMar>
+            <w:vAlign w:val="center"/>
+          </w:tcPr>
+          <w:p>
+            <w:r>
+              <w:rPr>
+                <w:b/>
+                <w:bCs/>
+                <w:sz w:val="20"/>
+                <w:szCs w:val="20"/>
+              </w:rPr>
+              <w:t>Comando</w:t>
+            </w:r>
+          </w:p>
+        </w:tc>
+        <w:tc>
+          <w:tcPr>
+            <w:tcW w:w="3298" w:type="dxa"/>
+            <w:tcBorders>
+              <w:top w:val="single" w:sz="4" w:space="0" w:color="000000"/>
+              <w:left w:val="single" w:sz="4" w:space="0" w:color="000000"/>
+              <w:bottom w:val="single" w:sz="4" w:space="0" w:color="000000"/>
+              <w:right w:val="single" w:sz="4" w:space="0" w:color="000000"/>
+            </w:tcBorders>
+            <w:shd w:val="clear" w:color="auto" w:fill="D9D9D9"/>
+            <w:tcMar>
+              <w:top w:w="60" w:type="dxa"/>
+              <w:left w:w="90" w:type="dxa"/>
+              <w:bottom w:w="60" w:type="dxa"/>
+              <w:right w:w="90" w:type="dxa"/>
+            </w:tcMar>
+            <w:vAlign w:val="center"/>
+          </w:tcPr>
+          <w:p>
+            <w:r>
+              <w:rPr>
+                <w:b/>
+                <w:bCs/>
+                <w:sz w:val="20"/>
+                <w:szCs w:val="20"/>
+              </w:rPr>
+              <w:t>Veces que aparece legible</w:t>
+            </w:r>
+          </w:p>
+        </w:tc>
+      </w:tr>
+      <w:tr>
+        <w:tc>
+          <w:tcPr>
+            <w:tcW w:w="2474" w:type="dxa"/>
+            <w:tcBorders>
+              <w:top w:val="single" w:sz="4" w:space="0" w:color="000000"/>
+              <w:left w:val="single" w:sz="4" w:space="0" w:color="000000"/>
+              <w:bottom w:val="single" w:sz="4" w:space="0" w:color="000000"/>
+              <w:right w:val="single" w:sz="4" w:space="0" w:color="000000"/>
+            </w:tcBorders>
+            <w:tcMar>
+              <w:top w:w="60" w:type="dxa"/>
+              <w:left w:w="90" w:type="dxa"/>
+              <w:bottom w:w="60" w:type="dxa"/>
+              <w:right w:w="90" w:type="dxa"/>
+            </w:tcMar>
+            <w:vAlign w:val="center"/>
+          </w:tcPr>
+          <w:p>
+            <w:r>
+              <w:rPr>
+                <w:sz w:val="20"/>
+                <w:szCs w:val="20"/>
+              </w:rPr>
+              <w:t>Normal</w:t>
+            </w:r>
+          </w:p>
+        </w:tc>
+        <w:tc>
+          <w:tcPr>
+            <w:tcW w:w="3298" w:type="dxa"/>
+            <w:tcBorders>
+              <w:top w:val="single" w:sz="4" w:space="0" w:color="000000"/>
+              <w:left w:val="single" w:sz="4" w:space="0" w:color="000000"/>
+              <w:bottom w:val="single" w:sz="4" w:space="0" w:color="000000"/>
+              <w:right w:val="single" w:sz="4" w:space="0" w:color="000000"/>
+            </w:tcBorders>
+            <w:tcMar>
+              <w:top w:w="60" w:type="dxa"/>
+              <w:left w:w="90" w:type="dxa"/>
+              <w:bottom w:w="60" w:type="dxa"/>
+              <w:right w:w="90" w:type="dxa"/>
+            </w:tcMar>
+            <w:vAlign w:val="center"/>
+          </w:tcPr>
+          <w:p>
+            <w:r>
+              <w:rPr>
+                <w:sz w:val="20"/>
+                <w:szCs w:val="20"/>
+              </w:rPr>
+              <w:t>npm run build:plain</w:t>
+            </w:r>
+          </w:p>
+        </w:tc>
+        <w:tc>
+          <w:tcPr>
+            <w:tcW w:w="3298" w:type="dxa"/>
+            <w:tcBorders>
+              <w:top w:val="single" w:sz="4" w:space="0" w:color="000000"/>
+              <w:left w:val="single" w:sz="4" w:space="0" w:color="000000"/>
+              <w:bottom w:val="single" w:sz="4" w:space="0" w:color="000000"/>
+              <w:right w:val="single" w:sz="4" w:space="0" w:color="000000"/>
+            </w:tcBorders>
+            <w:tcMar>
+              <w:top w:w="60" w:type="dxa"/>
+              <w:left w:w="90" w:type="dxa"/>
+              <w:bottom w:w="60" w:type="dxa"/>
+              <w:right w:w="90" w:type="dxa"/>
+            </w:tcMar>
+            <w:vAlign w:val="center"/>
+          </w:tcPr>
+          <w:p>
+            <w:r>
+              <w:rPr>
+                <w:sz w:val="20"/>
+                <w:szCs w:val="20"/>
+              </w:rPr>
+              <w:t>1</w:t>
+            </w:r>
+          </w:p>
+        </w:tc>
+      </w:tr>
+      <w:tr>
+        <w:tc>
+          <w:tcPr>
+            <w:tcW w:w="2474" w:type="dxa"/>
+            <w:tcBorders>
+              <w:top w:val="single" w:sz="4" w:space="0" w:color="000000"/>
+              <w:left w:val="single" w:sz="4" w:space="0" w:color="000000"/>
+              <w:bottom w:val="single" w:sz="4" w:space="0" w:color="000000"/>
+              <w:right w:val="single" w:sz="4" w:space="0" w:color="000000"/>
+            </w:tcBorders>
+            <w:tcMar>
+              <w:top w:w="60" w:type="dxa"/>
+              <w:left w:w="90" w:type="dxa"/>
+              <w:bottom w:w="60" w:type="dxa"/>
+              <w:right w:w="90" w:type="dxa"/>
+            </w:tcMar>
+            <w:vAlign w:val="center"/>
+          </w:tcPr>
+          <w:p>
+            <w:r>
+              <w:rPr>
+                <w:sz w:val="20"/>
+                <w:szCs w:val="20"/>
+              </w:rPr>
+              <w:t>Ofuscado (producción)</w:t>
+            </w:r>
+          </w:p>
+        </w:tc>
+        <w:tc>
+          <w:tcPr>
+            <w:tcW w:w="3298" w:type="dxa"/>
+            <w:tcBorders>
+              <w:top w:val="single" w:sz="4" w:space="0" w:color="000000"/>
+              <w:left w:val="single" w:sz="4" w:space="0" w:color="000000"/>
+              <w:bottom w:val="single" w:sz="4" w:space="0" w:color="000000"/>
+              <w:right w:val="single" w:sz="4" w:space="0" w:color="000000"/>
+            </w:tcBorders>
+            <w:tcMar>
+              <w:top w:w="60" w:type="dxa"/>
+              <w:left w:w="90" w:type="dxa"/>
+              <w:bottom w:w="60" w:type="dxa"/>
+              <w:right w:w="90" w:type="dxa"/>
+            </w:tcMar>
+            <w:vAlign w:val="center"/>
+          </w:tcPr>
+          <w:p>
+            <w:r>
+              <w:rPr>
+                <w:sz w:val="20"/>
+                <w:szCs w:val="20"/>
+              </w:rPr>
+              <w:t>npm run build</w:t>
+            </w:r>
+          </w:p>
+        </w:tc>
+        <w:tc>
+          <w:tcPr>
+            <w:tcW w:w="3298" w:type="dxa"/>
+            <w:tcBorders>
+              <w:top w:val="single" w:sz="4" w:space="0" w:color="000000"/>
+              <w:left w:val="single" w:sz="4" w:space="0" w:color="000000"/>
+              <w:bottom w:val="single" w:sz="4" w:space="0" w:color="000000"/>
+              <w:right w:val="single" w:sz="4" w:space="0" w:color="000000"/>
+            </w:tcBorders>
+            <w:tcMar>
+              <w:top w:w="60" w:type="dxa"/>
+              <w:left w:w="90" w:type="dxa"/>
+              <w:bottom w:w="60" w:type="dxa"/>
+              <w:right w:w="90" w:type="dxa"/>
+            </w:tcMar>
+            <w:vAlign w:val="center"/>
+          </w:tcPr>
+          <w:p>
+            <w:r>
+              <w:rPr>
+                <w:sz w:val="20"/>
+                <w:szCs w:val="20"/>
+              </w:rPr>
+              <w:t>0</w:t>
+            </w:r>
+          </w:p>
+        </w:tc>
+      </w:tr>
+    </w:tbl>
+    <w:p>
+      <w:pPr>
+        <w:spacing w:after="80"/>
+      </w:pPr>
+    </w:p>
+    <w:p>
+      <w:pPr>
+        <w:spacing w:after="120" w:line="300" w:lineRule="auto"/>
+      </w:pPr>
+      <w:r>
+        <w:t>El backend no se publica: corre en un servidor privado sin acceso al código.</w:t>
+      </w:r>
+    </w:p>
+    <w:p>
+      <w:pPr>
+        <w:keepNext/>
+        <w:spacing w:before="120" w:after="60"/>
+      </w:pPr>
+      <w:r>
+        <w:rPr>
+          <w:b/>
+          <w:bCs/>
+          <w:sz w:val="21"/>
+          <w:szCs w:val="21"/>
+        </w:rPr>
+        <w:t xml:space="preserve">Fragmento 10. </w:t>
+      </w:r>
+      <w:r>
+        <w:rPr>
+          <w:i/>
+          <w:iCs/>
+          <w:sz w:val="21"/>
+          <w:szCs w:val="21"/>
+        </w:rPr>
+        <w:t>web/vite.config.ts (extracto)</w:t>
+      </w:r>
+    </w:p>
+    <w:tbl>
+      <w:tblPr>
+        <w:tblW w:w="9070" w:type="dxa"/>
+        <w:tblBorders>
+          <w:top w:val="single" w:sz="4" w:space="0" w:color="auto"/>
+          <w:left w:val="single" w:sz="4" w:space="0" w:color="auto"/>
+          <w:bottom w:val="single" w:sz="4" w:space="0" w:color="auto"/>
+          <w:right w:val="single" w:sz="4" w:space="0" w:color="auto"/>
+          <w:insideH w:val="single" w:sz="4" w:space="0" w:color="auto"/>
+          <w:insideV w:val="single" w:sz="4" w:space="0" w:color="auto"/>
+        </w:tblBorders>
+        <w:tblLook w:val="04A0" w:firstRow="1" w:lastRow="0" w:firstColumn="1" w:lastColumn="0" w:noHBand="0" w:noVBand="1"/>
+      </w:tblPr>
+      <w:tblGrid>
+        <w:gridCol w:w="9070"/>
+      </w:tblGrid>
+      <w:tr>
+        <w:trPr>
+          <w:cantSplit/>
+        </w:trPr>
+        <w:tc>
+          <w:tcPr>
+            <w:tcW w:w="9070" w:type="dxa"/>
+            <w:tcBorders>
+              <w:top w:val="single" w:sz="4" w:space="0" w:color="000000"/>
+              <w:left w:val="single" w:sz="4" w:space="0" w:color="000000"/>
+              <w:bottom w:val="single" w:sz="4" w:space="0" w:color="000000"/>
+              <w:right w:val="single" w:sz="4" w:space="0" w:color="000000"/>
+            </w:tcBorders>
+            <w:shd w:val="clear" w:color="auto" w:fill="F2F2F2"/>
+            <w:tcMar>
+              <w:top w:w="80" w:type="dxa"/>
+              <w:left w:w="140" w:type="dxa"/>
+              <w:bottom w:w="80" w:type="dxa"/>
+              <w:right w:w="140" w:type="dxa"/>
+            </w:tcMar>
+          </w:tcPr>
+          <w:p>
+            <w:r>
+              <w:rPr>
+                <w:rFonts w:ascii="Consolas" w:eastAsia="Consolas" w:hAnsi="Consolas" w:cs="Consolas"/>
+                <w:sz w:val="17"/>
+                <w:szCs w:val="17"/>
+              </w:rPr>
+              <w:t>renderChunk(code, chunk) {</w:t>
+            </w:r>
+          </w:p>
+          <w:p>
+            <w:r>
+              <w:rPr>
+                <w:rFonts w:ascii="Consolas" w:eastAsia="Consolas" w:hAnsi="Consolas" w:cs="Consolas"/>
+                <w:sz w:val="17"/>
+                <w:szCs w:val="17"/>
+              </w:rPr>
+              <w:t xml:space="preserve">  const result = JavaScriptObfuscator.obfuscate(code, {</w:t>
+            </w:r>
+          </w:p>
+          <w:p>
+            <w:r>
+              <w:rPr>
+                <w:rFonts w:ascii="Consolas" w:eastAsia="Consolas" w:hAnsi="Consolas" w:cs="Consolas"/>
+                <w:sz w:val="17"/>
+                <w:szCs w:val="17"/>
+              </w:rPr>
+              <w:t xml:space="preserve">    identifierNamesGenerator: 'hexadecimal',   // nombres ilegibles</w:t>
+            </w:r>
+          </w:p>
+          <w:p>
+            <w:r>
+              <w:rPr>
+                <w:rFonts w:ascii="Consolas" w:eastAsia="Consolas" w:hAnsi="Consolas" w:cs="Consolas"/>
+                <w:sz w:val="17"/>
+                <w:szCs w:val="17"/>
+              </w:rPr>
+              <w:t xml:space="preserve">    stringArray: true, stringArrayEncoding: ['base64'],   // textos codificados</w:t>
+            </w:r>
+          </w:p>
+          <w:p>
+            <w:r>
+              <w:rPr>
+                <w:rFonts w:ascii="Consolas" w:eastAsia="Consolas" w:hAnsi="Consolas" w:cs="Consolas"/>
+                <w:sz w:val="17"/>
+                <w:szCs w:val="17"/>
+              </w:rPr>
+              <w:t xml:space="preserve">    splitStrings: true, compact: true,</w:t>
+            </w:r>
+          </w:p>
+          <w:p>
+            <w:r>
+              <w:rPr>
+                <w:rFonts w:ascii="Consolas" w:eastAsia="Consolas" w:hAnsi="Consolas" w:cs="Consolas"/>
+                <w:sz w:val="17"/>
+                <w:szCs w:val="17"/>
+              </w:rPr>
+              <w:t xml:space="preserve">  })</w:t>
+            </w:r>
+          </w:p>
+          <w:p>
+            <w:r>
+              <w:rPr>
+                <w:rFonts w:ascii="Consolas" w:eastAsia="Consolas" w:hAnsi="Consolas" w:cs="Consolas"/>
+                <w:sz w:val="17"/>
+                <w:szCs w:val="17"/>
+              </w:rPr>
+              <w:t xml:space="preserve">  return { code: result.getObfuscatedCode(), map: null }</w:t>
+            </w:r>
+          </w:p>
+          <w:p>
+            <w:r>
+              <w:rPr>
+                <w:rFonts w:ascii="Consolas" w:eastAsia="Consolas" w:hAnsi="Consolas" w:cs="Consolas"/>
+                <w:sz w:val="17"/>
+                <w:szCs w:val="17"/>
+              </w:rPr>
+              <w:t>}</w:t>
+            </w:r>
+          </w:p>
+        </w:tc>
+      </w:tr>
+    </w:tbl>
+    <w:p>
+      <w:pPr>
+        <w:spacing w:before="80" w:after="160" w:line="300" w:lineRule="auto"/>
+      </w:pPr>
+      <w:r>
+        <w:rPr>
+          <w:b/>
+          <w:bCs/>
+        </w:rPr>
+        <w:t xml:space="preserve">Por qué se usó: </w:t>
+      </w:r>
+      <w:r>
+        <w:t>el código de una aplicación web se descarga al navegador, así que cualquiera puede leerlo. La ofuscación se aplica al paquete final de producción para dificultar copiarlo o estudiar su lógica, sin cambiar lo que hace. En desarrollo se trabaja con el código normal (npm run build:plain).</w:t>
+      </w:r>
+    </w:p>
+    <w:p>
+      <w:pPr>
+        <w:pStyle w:val="Ttulo2"/>
+        <w:keepNext/>
+      </w:pPr>
+      <w:bookmarkStart w:id="18" w:name="_Toc243984524"/>
+      <w:r>
+        <w:t>8.5 EXTRA: Vista del programador</w:t>
+      </w:r>
+      <w:bookmarkEnd w:id="18"/>
+    </w:p>
+    <w:p>
+      <w:pPr>
+        <w:spacing w:after="120" w:line="300" w:lineRule="auto"/>
+      </w:pPr>
+      <w:r>
+        <w:t>El rol Programador tiene una pantalla de diagnóstico (/programador) que muestra, sin entrar al servidor: estado de la aplicación, la base de datos y la caché; versión y configuración (vida del token, rate limits, CORS); latencias p50/p95/p99 calculadas del log JSON; rutas más lentas; últimas peticiones; errores buscables por código de incidente, el mismo que ve el usuario en la pantalla 500; y la lista de todas las rutas de la API con su rol de acceso. No muestra contraseñas ni claves, y una prueba automáti</w:t>
+      </w:r>
+      <w:r>
+        <w:t>ca lo verifica.</w:t>
+      </w:r>
+    </w:p>
+    <w:p>
+      <w:pPr>
+        <w:keepNext/>
+        <w:spacing w:after="60"/>
+        <w:jc w:val="center"/>
+      </w:pPr>
+      <w:r>
+        <w:rPr>
+          <w:noProof/>
+        </w:rPr>
+        <w:drawing>
+          <wp:inline distT="0" distB="0" distL="0" distR="0" wp14:anchorId="71E3321B" wp14:editId="340627DA">
+            <wp:extent cx="5400675" cy="3371850"/>
+            <wp:effectExtent l="0" t="0" r="0" b="0"/>
+            <wp:docPr id="14" name="Imagen 14"/>
+            <wp:cNvGraphicFramePr>
+              <a:graphicFrameLocks xmlns:a="http://schemas.openxmlformats.org/drawingml/2006/main" noChangeAspect="1"/>
+            </wp:cNvGraphicFramePr>
+            <a:graphic xmlns:a="http://schemas.openxmlformats.org/drawingml/2006/main">
+              <a:graphicData uri="http://schemas.openxmlformats.org/drawingml/2006/picture">
+                <pic:pic xmlns:pic="http://schemas.openxmlformats.org/drawingml/2006/picture">
+                  <pic:nvPicPr>
+                    <pic:cNvPr id="0" name=""/>
+                    <pic:cNvPicPr>
+                      <a:picLocks noChangeAspect="1" noChangeArrowheads="1"/>
+                    </pic:cNvPicPr>
+                  </pic:nvPicPr>
+                  <pic:blipFill>
+                    <a:blip r:embed="rId21"/>
+                    <a:srcRect/>
+                    <a:stretch>
+                      <a:fillRect/>
+                    </a:stretch>
+                  </pic:blipFill>
+                  <pic:spPr bwMode="auto">
+                    <a:xfrm>
+                      <a:off x="0" y="0"/>
                       <a:ext cx="5400675" cy="3371850"/>
                     </a:xfrm>
                     <a:prstGeom prst="rect">
@@ -12663,7 +12753,7 @@
           <w:sz w:val="20"/>
           <w:szCs w:val="20"/>
         </w:rPr>
-        <w:t>Figura 11. Vista del programador.</w:t>
+        <w:t>Figura 12. Vista del programador.</w:t>
       </w:r>
     </w:p>
     <w:p>
@@ -12671,7 +12761,7 @@
         <w:pStyle w:val="Ttulo2"/>
         <w:keepNext/>
       </w:pPr>
-      <w:bookmarkStart w:id="19" w:name="_Toc243981750"/>
+      <w:bookmarkStart w:id="19" w:name="_Toc243984525"/>
       <w:r>
         <w:t>8.6 EXTRA: Seguridad y calidad adelantadas</w:t>
       </w:r>
@@ -12748,7 +12838,7 @@
         <w:pStyle w:val="Ttulo2"/>
         <w:keepNext/>
       </w:pPr>
-      <w:bookmarkStart w:id="20" w:name="_Toc243981751"/>
+      <w:bookmarkStart w:id="20" w:name="_Toc243984526"/>
       <w:r>
         <w:t>8.7 EXTRA: Diseño de la aplicación móvil (Android e iOS)</w:t>
       </w:r>
@@ -13646,10 +13736,10 @@
           <w:noProof/>
         </w:rPr>
         <w:drawing>
-          <wp:inline distT="0" distB="0" distL="0" distR="0" wp14:anchorId="616B3102" wp14:editId="684408C5">
+          <wp:inline distT="0" distB="0" distL="0" distR="0" wp14:anchorId="6B339B5A" wp14:editId="35DBBEA3">
             <wp:extent cx="5762625" cy="2733675"/>
             <wp:effectExtent l="0" t="0" r="0" b="0"/>
-            <wp:docPr id="14" name="Imagen 14"/>
+            <wp:docPr id="15" name="Imagen 15"/>
             <wp:cNvGraphicFramePr>
               <a:graphicFrameLocks xmlns:a="http://schemas.openxmlformats.org/drawingml/2006/main" noChangeAspect="1"/>
             </wp:cNvGraphicFramePr>
@@ -13663,7 +13753,7 @@
                     </pic:cNvPicPr>
                   </pic:nvPicPr>
                   <pic:blipFill>
-                    <a:blip r:embed="rId21"/>
+                    <a:blip r:embed="rId22"/>
                     <a:srcRect/>
                     <a:stretch>
                       <a:fillRect/>
@@ -13697,7 +13787,7 @@
           <w:sz w:val="20"/>
           <w:szCs w:val="20"/>
         </w:rPr>
-        <w:t>Figura 12. Arquitectura de la aplicación móvil: misma API y notificaciones por FCM (Android) y APNs (iOS).</w:t>
+        <w:t>Figura 13. Arquitectura de la aplicación móvil: misma API y notificaciones por FCM (Android) y APNs (iOS).</w:t>
       </w:r>
     </w:p>
     <w:tbl>
@@ -14740,7 +14830,7 @@
       <w:pPr>
         <w:spacing w:after="120" w:line="300" w:lineRule="auto"/>
         <w:sectPr>
-          <w:footerReference w:type="default" r:id="rId22"/>
+          <w:footerReference w:type="default" r:id="rId23"/>
           <w:pgSz w:w="11906" w:h="16838"/>
           <w:pgMar w:top="1418" w:right="1418" w:bottom="1418" w:left="1418" w:header="708" w:footer="708" w:gutter="0"/>
           <w:cols w:space="720"/>
@@ -14793,7 +14883,7 @@
           <w:noProof/>
         </w:rPr>
         <w:drawing>
-          <wp:inline distT="0" distB="0" distL="0" distR="0" wp14:anchorId="15114EC0" wp14:editId="5406E5C7">
+          <wp:inline distT="0" distB="0" distL="0" distR="0" wp14:anchorId="4A2D3F44" wp14:editId="44E0FB8E">
             <wp:extent cx="8820150" cy="3857625"/>
             <wp:effectExtent l="0" t="0" r="0" b="0"/>
             <wp:docPr id="2" name="Imagen 2"/>
@@ -14810,7 +14900,7 @@
                     </pic:cNvPicPr>
                   </pic:nvPicPr>
                   <pic:blipFill>
-                    <a:blip r:embed="rId23"/>
+                    <a:blip r:embed="rId24"/>
                     <a:srcRect/>
                     <a:stretch>
                       <a:fillRect/>
@@ -14837,7 +14927,7 @@
         <w:spacing w:after="200"/>
         <w:jc w:val="center"/>
         <w:sectPr>
-          <w:footerReference w:type="default" r:id="rId24"/>
+          <w:footerReference w:type="default" r:id="rId25"/>
           <w:pgSz w:w="16838" w:h="11906" w:orient="landscape"/>
           <w:pgMar w:top="1021" w:right="1418" w:bottom="1021" w:left="1418" w:header="708" w:footer="708" w:gutter="0"/>
           <w:cols w:space="720"/>
@@ -14851,7 +14941,7 @@
           <w:sz w:val="20"/>
           <w:szCs w:val="20"/>
         </w:rPr>
-        <w:t>Figura 13. Bocetos: login del personal; «Hoy», nueva reserva y habitaciones de recepción; inventario del almacén.</w:t>
+        <w:t>Figura 14. Bocetos: login del personal; «Hoy», nueva reserva y habitaciones de recepción; inventario del almacén.</w:t>
       </w:r>
     </w:p>
     <w:p>
@@ -14859,7 +14949,7 @@
         <w:pStyle w:val="Ttulo1"/>
         <w:keepNext/>
       </w:pPr>
-      <w:bookmarkStart w:id="21" w:name="_Toc243981752"/>
+      <w:bookmarkStart w:id="21" w:name="_Toc243984527"/>
       <w:r>
         <w:lastRenderedPageBreak/>
         <w:t>9. Siguientes pasos (entrega del 80%)</w:t>
@@ -14919,7 +15009,7 @@
       </w:r>
     </w:p>
     <w:sectPr>
-      <w:footerReference w:type="default" r:id="rId25"/>
+      <w:footerReference w:type="default" r:id="rId26"/>
       <w:pgSz w:w="11906" w:h="16838"/>
       <w:pgMar w:top="1418" w:right="1418" w:bottom="1418" w:left="1418" w:header="708" w:footer="708" w:gutter="0"/>
       <w:cols w:space="720"/>
@@ -15073,7 +15163,7 @@
         <w:sz w:val="20"/>
         <w:szCs w:val="20"/>
       </w:rPr>
-      <w:t>14</w:t>
+      <w:t>15</w:t>
     </w:r>
     <w:r>
       <w:rPr>
@@ -15119,7 +15209,7 @@
         <w:sz w:val="20"/>
         <w:szCs w:val="20"/>
       </w:rPr>
-      <w:t>22</w:t>
+      <w:t>23</w:t>
     </w:r>
     <w:r>
       <w:rPr>
@@ -15165,7 +15255,7 @@
         <w:sz w:val="20"/>
         <w:szCs w:val="20"/>
       </w:rPr>
-      <w:t>23</w:t>
+      <w:t>24</w:t>
     </w:r>
     <w:r>
       <w:rPr>
@@ -15200,10 +15290,10 @@
 <file path=word/numbering.xml><?xml version="1.0" encoding="utf-8"?>
 <w:numbering xmlns:wpc="http://schemas.microsoft.com/office/word/2010/wordprocessingCanvas" xmlns:cx="http://schemas.microsoft.com/office/drawing/2014/chartex" xmlns:cx1="http://schemas.microsoft.com/office/drawing/2015/9/8/chartex" xmlns:cx2="http://schemas.microsoft.com/office/drawing/2015/10/21/chartex" xmlns:cx3="http://schemas.microsoft.com/office/drawing/2016/5/9/chartex" xmlns:cx4="http://schemas.microsoft.com/office/drawing/2016/5/10/chartex" xmlns:cx5="http://schemas.microsoft.com/office/drawing/2016/5/11/chartex" xmlns:cx6="http://schemas.microsoft.com/office/drawing/2016/5/12/chartex" xmlns:cx7="http://schemas.microsoft.com/office/drawing/2016/5/13/chartex" xmlns:cx8="http://schemas.microsoft.com/office/drawing/2016/5/14/chartex" xmlns:mc="http://schemas.openxmlformats.org/markup-compatibility/2006" xmlns:aink="http://schemas.microsoft.com/office/drawing/2016/ink" xmlns:am3d="http://schemas.microsoft.com/office/drawing/2017/model3d" xmlns:o="urn:schemas-microsoft-com:office:office" xmlns:oel="http://schemas.microsoft.com/office/2019/extlst" xmlns:r="http://schemas.openxmlformats.org/officeDocument/2006/relationships" xmlns:m="http://schemas.openxmlformats.org/officeDocument/2006/math" xmlns:v="urn:schemas-microsoft-com:vml" xmlns:wp14="http://schemas.microsoft.com/office/word/2010/wordprocessingDrawing" xmlns:wp="http://schemas.openxmlformats.org/drawingml/2006/wordprocessingDrawing" xmlns:w10="urn:schemas-microsoft-com:office:word" xmlns:w="http://schemas.openxmlformats.org/wordprocessingml/2006/main" xmlns:w14="http://schemas.microsoft.com/office/word/2010/wordml" xmlns:w15="http://schemas.microsoft.com/office/word/2012/wordml" xmlns:w16cex="http://schemas.microsoft.com/office/word/2018/wordml/cex" xmlns:w16cid="http://schemas.microsoft.com/office/word/2016/wordml/cid" xmlns:w16="http://schemas.microsoft.com/office/word/2018/wordml" xmlns:w16sdtdh="http://schemas.microsoft.com/office/word/2020/wordml/sdtdatahash" xmlns:w16se="http://schemas.microsoft.com/office/word/2015/wordml/symex" xmlns:wpg="http://schemas.microsoft.com/office/word/2010/wordprocessingGroup" xmlns:wpi="http://schemas.microsoft.com/office/word/2010/wordprocessingInk" xmlns:wne="http://schemas.microsoft.com/office/word/2006/wordml" xmlns:wps="http://schemas.microsoft.com/office/word/2010/wordprocessingShape" mc:Ignorable="w14 w15 w16se w16cid w16 w16cex w16sdtdh wp14">
   <w:abstractNum w:abstractNumId="0" w15:restartNumberingAfterBreak="0">
-    <w:nsid w:val="15F2285F"/>
+    <w:nsid w:val="219F7FAF"/>
     <w:multiLevelType w:val="hybridMultilevel"/>
-    <w:tmpl w:val="0C3C9452"/>
-    <w:lvl w:ilvl="0" w:tplc="8BF81522">
+    <w:tmpl w:val="4F1C33B0"/>
+    <w:lvl w:ilvl="0" w:tplc="54C808F2">
       <w:start w:val="1"/>
       <w:numFmt w:val="bullet"/>
       <w:lvlText w:val="•"/>
@@ -15212,52 +15302,52 @@
         <w:ind w:left="540" w:hanging="270"/>
       </w:pPr>
     </w:lvl>
-    <w:lvl w:ilvl="1" w:tplc="F8660B60">
+    <w:lvl w:ilvl="1" w:tplc="A11AF974">
       <w:numFmt w:val="decimal"/>
       <w:lvlText w:val=""/>
       <w:lvlJc w:val="left"/>
     </w:lvl>
-    <w:lvl w:ilvl="2" w:tplc="A9E8CCFC">
+    <w:lvl w:ilvl="2" w:tplc="9EAA69E8">
       <w:numFmt w:val="decimal"/>
       <w:lvlText w:val=""/>
       <w:lvlJc w:val="left"/>
     </w:lvl>
-    <w:lvl w:ilvl="3" w:tplc="6172B248">
+    <w:lvl w:ilvl="3" w:tplc="52DAE0CA">
       <w:numFmt w:val="decimal"/>
       <w:lvlText w:val=""/>
       <w:lvlJc w:val="left"/>
     </w:lvl>
-    <w:lvl w:ilvl="4" w:tplc="E8E8AE5C">
+    <w:lvl w:ilvl="4" w:tplc="5C28F35A">
       <w:numFmt w:val="decimal"/>
       <w:lvlText w:val=""/>
       <w:lvlJc w:val="left"/>
     </w:lvl>
-    <w:lvl w:ilvl="5" w:tplc="7CAA149A">
+    <w:lvl w:ilvl="5" w:tplc="6BA6527A">
       <w:numFmt w:val="decimal"/>
       <w:lvlText w:val=""/>
       <w:lvlJc w:val="left"/>
     </w:lvl>
-    <w:lvl w:ilvl="6" w:tplc="C3FC3F66">
+    <w:lvl w:ilvl="6" w:tplc="A5A07FE2">
       <w:numFmt w:val="decimal"/>
       <w:lvlText w:val=""/>
       <w:lvlJc w:val="left"/>
     </w:lvl>
-    <w:lvl w:ilvl="7" w:tplc="902A30BC">
+    <w:lvl w:ilvl="7" w:tplc="A912A540">
       <w:numFmt w:val="decimal"/>
       <w:lvlText w:val=""/>
       <w:lvlJc w:val="left"/>
     </w:lvl>
-    <w:lvl w:ilvl="8" w:tplc="FEF495A6">
+    <w:lvl w:ilvl="8" w:tplc="157206C4">
       <w:numFmt w:val="decimal"/>
       <w:lvlText w:val=""/>
       <w:lvlJc w:val="left"/>
     </w:lvl>
   </w:abstractNum>
   <w:abstractNum w:abstractNumId="1" w15:restartNumberingAfterBreak="0">
-    <w:nsid w:val="5A4C63CE"/>
+    <w:nsid w:val="46185BB7"/>
     <w:multiLevelType w:val="hybridMultilevel"/>
-    <w:tmpl w:val="64C42950"/>
-    <w:lvl w:ilvl="0" w:tplc="711CBAE0" w:tentative="1">
+    <w:tmpl w:val="6F1ACB94"/>
+    <w:lvl w:ilvl="0" w:tplc="60BEF448" w:tentative="1">
       <w:start w:val="1"/>
       <w:numFmt w:val="bullet"/>
       <w:lvlText w:val="●"/>
@@ -15266,7 +15356,7 @@
         <w:ind w:left="720" w:hanging="360"/>
       </w:pPr>
     </w:lvl>
-    <w:lvl w:ilvl="1" w:tplc="AD2024AA" w:tentative="1">
+    <w:lvl w:ilvl="1" w:tplc="0A3E2CB2" w:tentative="1">
       <w:start w:val="1"/>
       <w:numFmt w:val="bullet"/>
       <w:lvlText w:val="○"/>
@@ -15275,7 +15365,7 @@
         <w:ind w:left="1440" w:hanging="360"/>
       </w:pPr>
     </w:lvl>
-    <w:lvl w:ilvl="2" w:tplc="0E183166" w:tentative="1">
+    <w:lvl w:ilvl="2" w:tplc="216EECD4" w:tentative="1">
       <w:start w:val="1"/>
       <w:numFmt w:val="bullet"/>
       <w:lvlText w:val="■"/>
@@ -15284,7 +15374,7 @@
         <w:ind w:left="2160" w:hanging="360"/>
       </w:pPr>
     </w:lvl>
-    <w:lvl w:ilvl="3" w:tplc="712E83C8" w:tentative="1">
+    <w:lvl w:ilvl="3" w:tplc="24D8DC62" w:tentative="1">
       <w:start w:val="1"/>
       <w:numFmt w:val="bullet"/>
       <w:lvlText w:val="●"/>
@@ -15293,7 +15383,7 @@
         <w:ind w:left="2880" w:hanging="360"/>
       </w:pPr>
     </w:lvl>
-    <w:lvl w:ilvl="4" w:tplc="034CBF06" w:tentative="1">
+    <w:lvl w:ilvl="4" w:tplc="55808694" w:tentative="1">
       <w:start w:val="1"/>
       <w:numFmt w:val="bullet"/>
       <w:lvlText w:val="○"/>
@@ -15302,7 +15392,7 @@
         <w:ind w:left="3600" w:hanging="360"/>
       </w:pPr>
     </w:lvl>
-    <w:lvl w:ilvl="5" w:tplc="D5A265E2" w:tentative="1">
+    <w:lvl w:ilvl="5" w:tplc="70AAA328" w:tentative="1">
       <w:start w:val="1"/>
       <w:numFmt w:val="bullet"/>
       <w:lvlText w:val="■"/>
@@ -15311,7 +15401,7 @@
         <w:ind w:left="4320" w:hanging="360"/>
       </w:pPr>
     </w:lvl>
-    <w:lvl w:ilvl="6" w:tplc="E5B26386" w:tentative="1">
+    <w:lvl w:ilvl="6" w:tplc="B81813B0" w:tentative="1">
       <w:start w:val="1"/>
       <w:numFmt w:val="bullet"/>
       <w:lvlText w:val="●"/>
@@ -15320,7 +15410,7 @@
         <w:ind w:left="5040" w:hanging="360"/>
       </w:pPr>
     </w:lvl>
-    <w:lvl w:ilvl="7" w:tplc="73F60E16" w:tentative="1">
+    <w:lvl w:ilvl="7" w:tplc="B4781210" w:tentative="1">
       <w:start w:val="1"/>
       <w:numFmt w:val="bullet"/>
       <w:lvlText w:val="●"/>
@@ -15329,7 +15419,7 @@
         <w:ind w:left="5760" w:hanging="360"/>
       </w:pPr>
     </w:lvl>
-    <w:lvl w:ilvl="8" w:tplc="B5889F6E" w:tentative="1">
+    <w:lvl w:ilvl="8" w:tplc="4C885040" w:tentative="1">
       <w:start w:val="1"/>
       <w:numFmt w:val="bullet"/>
       <w:lvlText w:val="●"/>
@@ -15339,13 +15429,13 @@
       </w:pPr>
     </w:lvl>
   </w:abstractNum>
-  <w:num w:numId="1" w16cid:durableId="518005601">
+  <w:num w:numId="1" w16cid:durableId="430660484">
     <w:abstractNumId w:val="1"/>
     <w:lvlOverride w:ilvl="0">
       <w:startOverride w:val="1"/>
     </w:lvlOverride>
   </w:num>
-  <w:num w:numId="2" w16cid:durableId="454760557">
+  <w:num w:numId="2" w16cid:durableId="1748267303">
     <w:abstractNumId w:val="0"/>
     <w:lvlOverride w:ilvl="0">
       <w:startOverride w:val="1"/>

</xml_diff>

<commit_message>
Informe 25%: diagrama UML en inglés como diagrama de base de datos (8.1)
Co-Authored-By: Claude Opus 5.5 <noreply@anthropic.com>
</commit_message>
<xml_diff>
--- a/docs/informes/LeGrandHotel_Entrega_25.docx
+++ b/docs/informes/LeGrandHotel_Entrega_25.docx
@@ -34,7 +34,7 @@
           <w:noProof/>
         </w:rPr>
         <w:drawing>
-          <wp:inline distT="0" distB="0" distL="0" distR="0" wp14:anchorId="3986AA79" wp14:editId="7E46B40D">
+          <wp:inline distT="0" distB="0" distL="0" distR="0" wp14:anchorId="66EE3DC9" wp14:editId="5CC52D65">
             <wp:extent cx="1800225" cy="1076325"/>
             <wp:effectExtent l="0" t="0" r="0" b="0"/>
             <wp:docPr id="1" name="Imagen 1"/>
@@ -254,7 +254,7 @@
     <w:sdt>
       <w:sdtPr>
         <w:alias w:val="Índice"/>
-        <w:id w:val="208768024"/>
+        <w:id w:val="353395164"/>
       </w:sdtPr>
       <w:sdtEndPr/>
       <w:sdtContent>
@@ -280,7 +280,7 @@
           <w:r>
             <w:fldChar w:fldCharType="separate"/>
           </w:r>
-          <w:hyperlink w:anchor="_Toc243984506" w:history="1">
+          <w:hyperlink w:anchor="_Toc243984926" w:history="1">
             <w:r>
               <w:rPr>
                 <w:rStyle w:val="Hipervnculo"/>
@@ -304,7 +304,7 @@
               <w:rPr>
                 <w:noProof/>
               </w:rPr>
-              <w:instrText xml:space="preserve"> PAGEREF _Toc243984506 \h </w:instrText>
+              <w:instrText xml:space="preserve"> PAGEREF _Toc243984926 \h </w:instrText>
             </w:r>
             <w:r>
               <w:rPr>
@@ -344,7 +344,7 @@
               <w14:ligatures w14:val="standardContextual"/>
             </w:rPr>
           </w:pPr>
-          <w:hyperlink w:anchor="_Toc243984507" w:history="1">
+          <w:hyperlink w:anchor="_Toc243984927" w:history="1">
             <w:r>
               <w:rPr>
                 <w:rStyle w:val="Hipervnculo"/>
@@ -368,7 +368,7 @@
               <w:rPr>
                 <w:noProof/>
               </w:rPr>
-              <w:instrText xml:space="preserve"> PAGEREF _Toc243984507 \h </w:instrText>
+              <w:instrText xml:space="preserve"> PAGEREF _Toc243984927 \h </w:instrText>
             </w:r>
             <w:r>
               <w:rPr>
@@ -408,7 +408,7 @@
               <w14:ligatures w14:val="standardContextual"/>
             </w:rPr>
           </w:pPr>
-          <w:hyperlink w:anchor="_Toc243984508" w:history="1">
+          <w:hyperlink w:anchor="_Toc243984928" w:history="1">
             <w:r>
               <w:rPr>
                 <w:rStyle w:val="Hipervnculo"/>
@@ -432,7 +432,7 @@
               <w:rPr>
                 <w:noProof/>
               </w:rPr>
-              <w:instrText xml:space="preserve"> PAGEREF _Toc243984508 \h </w:instrText>
+              <w:instrText xml:space="preserve"> PAGEREF _Toc243984928 \h </w:instrText>
             </w:r>
             <w:r>
               <w:rPr>
@@ -472,7 +472,7 @@
               <w14:ligatures w14:val="standardContextual"/>
             </w:rPr>
           </w:pPr>
-          <w:hyperlink w:anchor="_Toc243984509" w:history="1">
+          <w:hyperlink w:anchor="_Toc243984929" w:history="1">
             <w:r>
               <w:rPr>
                 <w:rStyle w:val="Hipervnculo"/>
@@ -496,7 +496,7 @@
               <w:rPr>
                 <w:noProof/>
               </w:rPr>
-              <w:instrText xml:space="preserve"> PAGEREF _Toc243984509 \h </w:instrText>
+              <w:instrText xml:space="preserve"> PAGEREF _Toc243984929 \h </w:instrText>
             </w:r>
             <w:r>
               <w:rPr>
@@ -536,7 +536,7 @@
               <w14:ligatures w14:val="standardContextual"/>
             </w:rPr>
           </w:pPr>
-          <w:hyperlink w:anchor="_Toc243984510" w:history="1">
+          <w:hyperlink w:anchor="_Toc243984930" w:history="1">
             <w:r>
               <w:rPr>
                 <w:rStyle w:val="Hipervnculo"/>
@@ -560,7 +560,7 @@
               <w:rPr>
                 <w:noProof/>
               </w:rPr>
-              <w:instrText xml:space="preserve"> PAGEREF _Toc243984510 \h </w:instrText>
+              <w:instrText xml:space="preserve"> PAGEREF _Toc243984930 \h </w:instrText>
             </w:r>
             <w:r>
               <w:rPr>
@@ -600,7 +600,7 @@
               <w14:ligatures w14:val="standardContextual"/>
             </w:rPr>
           </w:pPr>
-          <w:hyperlink w:anchor="_Toc243984511" w:history="1">
+          <w:hyperlink w:anchor="_Toc243984931" w:history="1">
             <w:r>
               <w:rPr>
                 <w:rStyle w:val="Hipervnculo"/>
@@ -624,7 +624,7 @@
               <w:rPr>
                 <w:noProof/>
               </w:rPr>
-              <w:instrText xml:space="preserve"> PAGEREF _Toc243984511 \h </w:instrText>
+              <w:instrText xml:space="preserve"> PAGEREF _Toc243984931 \h </w:instrText>
             </w:r>
             <w:r>
               <w:rPr>
@@ -664,7 +664,7 @@
               <w14:ligatures w14:val="standardContextual"/>
             </w:rPr>
           </w:pPr>
-          <w:hyperlink w:anchor="_Toc243984512" w:history="1">
+          <w:hyperlink w:anchor="_Toc243984932" w:history="1">
             <w:r>
               <w:rPr>
                 <w:rStyle w:val="Hipervnculo"/>
@@ -688,7 +688,7 @@
               <w:rPr>
                 <w:noProof/>
               </w:rPr>
-              <w:instrText xml:space="preserve"> PAGEREF _Toc243984512 \h </w:instrText>
+              <w:instrText xml:space="preserve"> PAGEREF _Toc243984932 \h </w:instrText>
             </w:r>
             <w:r>
               <w:rPr>
@@ -728,7 +728,7 @@
               <w14:ligatures w14:val="standardContextual"/>
             </w:rPr>
           </w:pPr>
-          <w:hyperlink w:anchor="_Toc243984513" w:history="1">
+          <w:hyperlink w:anchor="_Toc243984933" w:history="1">
             <w:r>
               <w:rPr>
                 <w:rStyle w:val="Hipervnculo"/>
@@ -752,7 +752,7 @@
               <w:rPr>
                 <w:noProof/>
               </w:rPr>
-              <w:instrText xml:space="preserve"> PAGEREF _Toc243984513 \h </w:instrText>
+              <w:instrText xml:space="preserve"> PAGEREF _Toc243984933 \h </w:instrText>
             </w:r>
             <w:r>
               <w:rPr>
@@ -792,7 +792,7 @@
               <w14:ligatures w14:val="standardContextual"/>
             </w:rPr>
           </w:pPr>
-          <w:hyperlink w:anchor="_Toc243984514" w:history="1">
+          <w:hyperlink w:anchor="_Toc243984934" w:history="1">
             <w:r>
               <w:rPr>
                 <w:rStyle w:val="Hipervnculo"/>
@@ -816,7 +816,7 @@
               <w:rPr>
                 <w:noProof/>
               </w:rPr>
-              <w:instrText xml:space="preserve"> PAGEREF _Toc243984514 \h </w:instrText>
+              <w:instrText xml:space="preserve"> PAGEREF _Toc243984934 \h </w:instrText>
             </w:r>
             <w:r>
               <w:rPr>
@@ -856,7 +856,7 @@
               <w14:ligatures w14:val="standardContextual"/>
             </w:rPr>
           </w:pPr>
-          <w:hyperlink w:anchor="_Toc243984515" w:history="1">
+          <w:hyperlink w:anchor="_Toc243984935" w:history="1">
             <w:r>
               <w:rPr>
                 <w:rStyle w:val="Hipervnculo"/>
@@ -880,7 +880,7 @@
               <w:rPr>
                 <w:noProof/>
               </w:rPr>
-              <w:instrText xml:space="preserve"> PAGEREF _Toc243984515 \h </w:instrText>
+              <w:instrText xml:space="preserve"> PAGEREF _Toc243984935 \h </w:instrText>
             </w:r>
             <w:r>
               <w:rPr>
@@ -920,7 +920,7 @@
               <w14:ligatures w14:val="standardContextual"/>
             </w:rPr>
           </w:pPr>
-          <w:hyperlink w:anchor="_Toc243984516" w:history="1">
+          <w:hyperlink w:anchor="_Toc243984936" w:history="1">
             <w:r>
               <w:rPr>
                 <w:rStyle w:val="Hipervnculo"/>
@@ -944,7 +944,7 @@
               <w:rPr>
                 <w:noProof/>
               </w:rPr>
-              <w:instrText xml:space="preserve"> PAGEREF _Toc243984516 \h </w:instrText>
+              <w:instrText xml:space="preserve"> PAGEREF _Toc243984936 \h </w:instrText>
             </w:r>
             <w:r>
               <w:rPr>
@@ -984,7 +984,7 @@
               <w14:ligatures w14:val="standardContextual"/>
             </w:rPr>
           </w:pPr>
-          <w:hyperlink w:anchor="_Toc243984517" w:history="1">
+          <w:hyperlink w:anchor="_Toc243984937" w:history="1">
             <w:r>
               <w:rPr>
                 <w:rStyle w:val="Hipervnculo"/>
@@ -1008,7 +1008,7 @@
               <w:rPr>
                 <w:noProof/>
               </w:rPr>
-              <w:instrText xml:space="preserve"> PAGEREF _Toc243984517 \h </w:instrText>
+              <w:instrText xml:space="preserve"> PAGEREF _Toc243984937 \h </w:instrText>
             </w:r>
             <w:r>
               <w:rPr>
@@ -1048,7 +1048,7 @@
               <w14:ligatures w14:val="standardContextual"/>
             </w:rPr>
           </w:pPr>
-          <w:hyperlink w:anchor="_Toc243984518" w:history="1">
+          <w:hyperlink w:anchor="_Toc243984938" w:history="1">
             <w:r>
               <w:rPr>
                 <w:rStyle w:val="Hipervnculo"/>
@@ -1072,7 +1072,7 @@
               <w:rPr>
                 <w:noProof/>
               </w:rPr>
-              <w:instrText xml:space="preserve"> PAGEREF _Toc243984518 \h </w:instrText>
+              <w:instrText xml:space="preserve"> PAGEREF _Toc243984938 \h </w:instrText>
             </w:r>
             <w:r>
               <w:rPr>
@@ -1112,7 +1112,7 @@
               <w14:ligatures w14:val="standardContextual"/>
             </w:rPr>
           </w:pPr>
-          <w:hyperlink w:anchor="_Toc243984519" w:history="1">
+          <w:hyperlink w:anchor="_Toc243984939" w:history="1">
             <w:r>
               <w:rPr>
                 <w:rStyle w:val="Hipervnculo"/>
@@ -1136,7 +1136,7 @@
               <w:rPr>
                 <w:noProof/>
               </w:rPr>
-              <w:instrText xml:space="preserve"> PAGEREF _Toc243984519 \h </w:instrText>
+              <w:instrText xml:space="preserve"> PAGEREF _Toc243984939 \h </w:instrText>
             </w:r>
             <w:r>
               <w:rPr>
@@ -1176,13 +1176,13 @@
               <w14:ligatures w14:val="standardContextual"/>
             </w:rPr>
           </w:pPr>
-          <w:hyperlink w:anchor="_Toc243984520" w:history="1">
+          <w:hyperlink w:anchor="_Toc243984940" w:history="1">
             <w:r>
               <w:rPr>
                 <w:rStyle w:val="Hipervnculo"/>
                 <w:noProof/>
               </w:rPr>
-              <w:t>8.1 EXTRA: Diagrama de base de datos</w:t>
+              <w:t>8.1 EXTRA: Diagrama de base de datos (UML)</w:t>
             </w:r>
             <w:r>
               <w:rPr>
@@ -1200,7 +1200,7 @@
               <w:rPr>
                 <w:noProof/>
               </w:rPr>
-              <w:instrText xml:space="preserve"> PAGEREF _Toc243984520 \h </w:instrText>
+              <w:instrText xml:space="preserve"> PAGEREF _Toc243984940 \h </w:instrText>
             </w:r>
             <w:r>
               <w:rPr>
@@ -1240,7 +1240,7 @@
               <w14:ligatures w14:val="standardContextual"/>
             </w:rPr>
           </w:pPr>
-          <w:hyperlink w:anchor="_Toc243984521" w:history="1">
+          <w:hyperlink w:anchor="_Toc243984941" w:history="1">
             <w:r>
               <w:rPr>
                 <w:rStyle w:val="Hipervnculo"/>
@@ -1264,7 +1264,7 @@
               <w:rPr>
                 <w:noProof/>
               </w:rPr>
-              <w:instrText xml:space="preserve"> PAGEREF _Toc243984521 \h </w:instrText>
+              <w:instrText xml:space="preserve"> PAGEREF _Toc243984941 \h </w:instrText>
             </w:r>
             <w:r>
               <w:rPr>
@@ -1281,7 +1281,7 @@
               <w:rPr>
                 <w:noProof/>
               </w:rPr>
-              <w:t>15</w:t>
+              <w:t>14</w:t>
             </w:r>
             <w:r>
               <w:rPr>
@@ -1304,7 +1304,7 @@
               <w14:ligatures w14:val="standardContextual"/>
             </w:rPr>
           </w:pPr>
-          <w:hyperlink w:anchor="_Toc243984522" w:history="1">
+          <w:hyperlink w:anchor="_Toc243984942" w:history="1">
             <w:r>
               <w:rPr>
                 <w:rStyle w:val="Hipervnculo"/>
@@ -1328,7 +1328,7 @@
               <w:rPr>
                 <w:noProof/>
               </w:rPr>
-              <w:instrText xml:space="preserve"> PAGEREF _Toc243984522 \h </w:instrText>
+              <w:instrText xml:space="preserve"> PAGEREF _Toc243984942 \h </w:instrText>
             </w:r>
             <w:r>
               <w:rPr>
@@ -1345,7 +1345,7 @@
               <w:rPr>
                 <w:noProof/>
               </w:rPr>
-              <w:t>18</w:t>
+              <w:t>17</w:t>
             </w:r>
             <w:r>
               <w:rPr>
@@ -1368,7 +1368,7 @@
               <w14:ligatures w14:val="standardContextual"/>
             </w:rPr>
           </w:pPr>
-          <w:hyperlink w:anchor="_Toc243984523" w:history="1">
+          <w:hyperlink w:anchor="_Toc243984943" w:history="1">
             <w:r>
               <w:rPr>
                 <w:rStyle w:val="Hipervnculo"/>
@@ -1392,7 +1392,7 @@
               <w:rPr>
                 <w:noProof/>
               </w:rPr>
-              <w:instrText xml:space="preserve"> PAGEREF _Toc243984523 \h </w:instrText>
+              <w:instrText xml:space="preserve"> PAGEREF _Toc243984943 \h </w:instrText>
             </w:r>
             <w:r>
               <w:rPr>
@@ -1409,7 +1409,7 @@
               <w:rPr>
                 <w:noProof/>
               </w:rPr>
-              <w:t>18</w:t>
+              <w:t>17</w:t>
             </w:r>
             <w:r>
               <w:rPr>
@@ -1432,7 +1432,7 @@
               <w14:ligatures w14:val="standardContextual"/>
             </w:rPr>
           </w:pPr>
-          <w:hyperlink w:anchor="_Toc243984524" w:history="1">
+          <w:hyperlink w:anchor="_Toc243984944" w:history="1">
             <w:r>
               <w:rPr>
                 <w:rStyle w:val="Hipervnculo"/>
@@ -1456,7 +1456,7 @@
               <w:rPr>
                 <w:noProof/>
               </w:rPr>
-              <w:instrText xml:space="preserve"> PAGEREF _Toc243984524 \h </w:instrText>
+              <w:instrText xml:space="preserve"> PAGEREF _Toc243984944 \h </w:instrText>
             </w:r>
             <w:r>
               <w:rPr>
@@ -1473,7 +1473,7 @@
               <w:rPr>
                 <w:noProof/>
               </w:rPr>
-              <w:t>19</w:t>
+              <w:t>18</w:t>
             </w:r>
             <w:r>
               <w:rPr>
@@ -1496,7 +1496,7 @@
               <w14:ligatures w14:val="standardContextual"/>
             </w:rPr>
           </w:pPr>
-          <w:hyperlink w:anchor="_Toc243984525" w:history="1">
+          <w:hyperlink w:anchor="_Toc243984945" w:history="1">
             <w:r>
               <w:rPr>
                 <w:rStyle w:val="Hipervnculo"/>
@@ -1520,7 +1520,7 @@
               <w:rPr>
                 <w:noProof/>
               </w:rPr>
-              <w:instrText xml:space="preserve"> PAGEREF _Toc243984525 \h </w:instrText>
+              <w:instrText xml:space="preserve"> PAGEREF _Toc243984945 \h </w:instrText>
             </w:r>
             <w:r>
               <w:rPr>
@@ -1537,7 +1537,7 @@
               <w:rPr>
                 <w:noProof/>
               </w:rPr>
-              <w:t>19</w:t>
+              <w:t>18</w:t>
             </w:r>
             <w:r>
               <w:rPr>
@@ -1560,7 +1560,7 @@
               <w14:ligatures w14:val="standardContextual"/>
             </w:rPr>
           </w:pPr>
-          <w:hyperlink w:anchor="_Toc243984526" w:history="1">
+          <w:hyperlink w:anchor="_Toc243984946" w:history="1">
             <w:r>
               <w:rPr>
                 <w:rStyle w:val="Hipervnculo"/>
@@ -1584,7 +1584,7 @@
               <w:rPr>
                 <w:noProof/>
               </w:rPr>
-              <w:instrText xml:space="preserve"> PAGEREF _Toc243984526 \h </w:instrText>
+              <w:instrText xml:space="preserve"> PAGEREF _Toc243984946 \h </w:instrText>
             </w:r>
             <w:r>
               <w:rPr>
@@ -1601,7 +1601,7 @@
               <w:rPr>
                 <w:noProof/>
               </w:rPr>
-              <w:t>20</w:t>
+              <w:t>19</w:t>
             </w:r>
             <w:r>
               <w:rPr>
@@ -1624,7 +1624,7 @@
               <w14:ligatures w14:val="standardContextual"/>
             </w:rPr>
           </w:pPr>
-          <w:hyperlink w:anchor="_Toc243984527" w:history="1">
+          <w:hyperlink w:anchor="_Toc243984947" w:history="1">
             <w:r>
               <w:rPr>
                 <w:rStyle w:val="Hipervnculo"/>
@@ -1648,7 +1648,7 @@
               <w:rPr>
                 <w:noProof/>
               </w:rPr>
-              <w:instrText xml:space="preserve"> PAGEREF _Toc243984527 \h </w:instrText>
+              <w:instrText xml:space="preserve"> PAGEREF _Toc243984947 \h </w:instrText>
             </w:r>
             <w:r>
               <w:rPr>
@@ -1665,7 +1665,7 @@
               <w:rPr>
                 <w:noProof/>
               </w:rPr>
-              <w:t>24</w:t>
+              <w:t>23</w:t>
             </w:r>
             <w:r>
               <w:rPr>
@@ -1692,7 +1692,7 @@
         <w:pStyle w:val="Ttulo1"/>
         <w:keepNext/>
       </w:pPr>
-      <w:bookmarkStart w:id="0" w:name="_Toc243984506"/>
+      <w:bookmarkStart w:id="0" w:name="_Toc243984926"/>
       <w:r>
         <w:lastRenderedPageBreak/>
         <w:t>1. Alcance de la entrega del 25%</w:t>
@@ -2207,7 +2207,7 @@
         <w:pStyle w:val="Ttulo1"/>
         <w:keepNext/>
       </w:pPr>
-      <w:bookmarkStart w:id="1" w:name="_Toc243984507"/>
+      <w:bookmarkStart w:id="1" w:name="_Toc243984927"/>
       <w:r>
         <w:t>2. Descripción del proyecto</w:t>
       </w:r>
@@ -2229,7 +2229,7 @@
         <w:pStyle w:val="Ttulo2"/>
         <w:keepNext/>
       </w:pPr>
-      <w:bookmarkStart w:id="2" w:name="_Toc243984508"/>
+      <w:bookmarkStart w:id="2" w:name="_Toc243984928"/>
       <w:r>
         <w:t>2.1 Tecnologías</w:t>
       </w:r>
@@ -2715,7 +2715,7 @@
         <w:pStyle w:val="Ttulo1"/>
         <w:keepNext/>
       </w:pPr>
-      <w:bookmarkStart w:id="3" w:name="_Toc243984509"/>
+      <w:bookmarkStart w:id="3" w:name="_Toc243984929"/>
       <w:r>
         <w:lastRenderedPageBreak/>
         <w:t>3. Arquitectura y entorno cloud</w:t>
@@ -2741,10 +2741,10 @@
           <w:noProof/>
         </w:rPr>
         <w:drawing>
-          <wp:inline distT="0" distB="0" distL="0" distR="0" wp14:anchorId="79765D97" wp14:editId="4CF16842">
+          <wp:inline distT="0" distB="0" distL="0" distR="0" wp14:anchorId="136B72AE" wp14:editId="1C1B41C6">
             <wp:extent cx="5762625" cy="4038600"/>
             <wp:effectExtent l="0" t="0" r="0" b="0"/>
-            <wp:docPr id="5" name="Imagen 5"/>
+            <wp:docPr id="4" name="Imagen 4"/>
             <wp:cNvGraphicFramePr>
               <a:graphicFrameLocks xmlns:a="http://schemas.openxmlformats.org/drawingml/2006/main" noChangeAspect="1"/>
             </wp:cNvGraphicFramePr>
@@ -2800,7 +2800,7 @@
         <w:pStyle w:val="Ttulo2"/>
         <w:keepNext/>
       </w:pPr>
-      <w:bookmarkStart w:id="4" w:name="_Toc243984510"/>
+      <w:bookmarkStart w:id="4" w:name="_Toc243984930"/>
       <w:r>
         <w:t>3.1 Recursos del entorno (Terraform)</w:t>
       </w:r>
@@ -3706,7 +3706,7 @@
         <w:pStyle w:val="Ttulo2"/>
         <w:keepNext/>
       </w:pPr>
-      <w:bookmarkStart w:id="5" w:name="_Toc243984511"/>
+      <w:bookmarkStart w:id="5" w:name="_Toc243984931"/>
       <w:r>
         <w:t>3.2 Costo estimado</w:t>
       </w:r>
@@ -4029,7 +4029,7 @@
         <w:pStyle w:val="Ttulo1"/>
         <w:keepNext/>
       </w:pPr>
-      <w:bookmarkStart w:id="6" w:name="_Toc243984512"/>
+      <w:bookmarkStart w:id="6" w:name="_Toc243984932"/>
       <w:r>
         <w:t>4. Endpoints definidos</w:t>
       </w:r>
@@ -5652,7 +5652,7 @@
         <w:pStyle w:val="Ttulo2"/>
         <w:keepNext/>
       </w:pPr>
-      <w:bookmarkStart w:id="7" w:name="_Toc243984513"/>
+      <w:bookmarkStart w:id="7" w:name="_Toc243984933"/>
       <w:r>
         <w:t>4.1 Formato único de respuesta</w:t>
       </w:r>
@@ -5924,7 +5924,7 @@
         <w:pStyle w:val="Ttulo2"/>
         <w:keepNext/>
       </w:pPr>
-      <w:bookmarkStart w:id="8" w:name="_Toc243984514"/>
+      <w:bookmarkStart w:id="8" w:name="_Toc243984934"/>
       <w:r>
         <w:t>4.2 Códigos HTTP</w:t>
       </w:r>
@@ -6691,7 +6691,7 @@
         <w:pStyle w:val="Ttulo1"/>
         <w:keepNext/>
       </w:pPr>
-      <w:bookmarkStart w:id="9" w:name="_Toc243984515"/>
+      <w:bookmarkStart w:id="9" w:name="_Toc243984935"/>
       <w:r>
         <w:lastRenderedPageBreak/>
         <w:t>5. Registro y login diferenciados</w:t>
@@ -7415,10 +7415,10 @@
           <w:noProof/>
         </w:rPr>
         <w:drawing>
-          <wp:inline distT="0" distB="0" distL="0" distR="0" wp14:anchorId="6439964C" wp14:editId="1047D826">
+          <wp:inline distT="0" distB="0" distL="0" distR="0" wp14:anchorId="5CB7041F" wp14:editId="74260621">
             <wp:extent cx="5400675" cy="3371850"/>
             <wp:effectExtent l="0" t="0" r="0" b="0"/>
-            <wp:docPr id="6" name="Imagen 6"/>
+            <wp:docPr id="5" name="Imagen 5"/>
             <wp:cNvGraphicFramePr>
               <a:graphicFrameLocks xmlns:a="http://schemas.openxmlformats.org/drawingml/2006/main" noChangeAspect="1"/>
             </wp:cNvGraphicFramePr>
@@ -7481,10 +7481,10 @@
         </w:rPr>
         <w:lastRenderedPageBreak/>
         <w:drawing>
-          <wp:inline distT="0" distB="0" distL="0" distR="0" wp14:anchorId="2F3BEAEB" wp14:editId="28B00D4B">
+          <wp:inline distT="0" distB="0" distL="0" distR="0" wp14:anchorId="71C61D44" wp14:editId="585DAE84">
             <wp:extent cx="5400675" cy="3371850"/>
             <wp:effectExtent l="0" t="0" r="0" b="0"/>
-            <wp:docPr id="7" name="Imagen 7"/>
+            <wp:docPr id="6" name="Imagen 6"/>
             <wp:cNvGraphicFramePr>
               <a:graphicFrameLocks xmlns:a="http://schemas.openxmlformats.org/drawingml/2006/main" noChangeAspect="1"/>
             </wp:cNvGraphicFramePr>
@@ -7546,10 +7546,10 @@
           <w:noProof/>
         </w:rPr>
         <w:drawing>
-          <wp:inline distT="0" distB="0" distL="0" distR="0" wp14:anchorId="04FABA82" wp14:editId="21D1D2E9">
+          <wp:inline distT="0" distB="0" distL="0" distR="0" wp14:anchorId="1CFCDEB0" wp14:editId="2BF7CC86">
             <wp:extent cx="5400675" cy="3371850"/>
             <wp:effectExtent l="0" t="0" r="0" b="0"/>
-            <wp:docPr id="8" name="Imagen 8"/>
+            <wp:docPr id="7" name="Imagen 7"/>
             <wp:cNvGraphicFramePr>
               <a:graphicFrameLocks xmlns:a="http://schemas.openxmlformats.org/drawingml/2006/main" noChangeAspect="1"/>
             </wp:cNvGraphicFramePr>
@@ -8466,7 +8466,7 @@
         <w:pStyle w:val="Ttulo2"/>
         <w:keepNext/>
       </w:pPr>
-      <w:bookmarkStart w:id="10" w:name="_Toc243984516"/>
+      <w:bookmarkStart w:id="10" w:name="_Toc243984936"/>
       <w:r>
         <w:t>5.1 Pruebas automáticas del registro y login</w:t>
       </w:r>
@@ -9197,7 +9197,7 @@
         <w:pStyle w:val="Ttulo1"/>
         <w:keepNext/>
       </w:pPr>
-      <w:bookmarkStart w:id="11" w:name="_Toc243984517"/>
+      <w:bookmarkStart w:id="11" w:name="_Toc243984937"/>
       <w:r>
         <w:t>6. Registro de incidentes</w:t>
       </w:r>
@@ -9803,7 +9803,7 @@
         <w:pStyle w:val="Ttulo1"/>
         <w:keepNext/>
       </w:pPr>
-      <w:bookmarkStart w:id="12" w:name="_Toc243984518"/>
+      <w:bookmarkStart w:id="12" w:name="_Toc243984938"/>
       <w:r>
         <w:t>7. Conclusiones de la entrega</w:t>
       </w:r>
@@ -9847,7 +9847,7 @@
         <w:pStyle w:val="Ttulo1"/>
         <w:keepNext/>
       </w:pPr>
-      <w:bookmarkStart w:id="13" w:name="_Toc243984519"/>
+      <w:bookmarkStart w:id="13" w:name="_Toc243984939"/>
       <w:r>
         <w:lastRenderedPageBreak/>
         <w:t>8. EXTRAS (adicionales a lo evaluado en el 25%)</w:t>
@@ -9871,9 +9871,9 @@
         <w:pStyle w:val="Ttulo2"/>
         <w:keepNext/>
       </w:pPr>
-      <w:bookmarkStart w:id="14" w:name="_Toc243984520"/>
-      <w:r>
-        <w:t>8.1 EXTRA: Diagrama de base de datos</w:t>
+      <w:bookmarkStart w:id="14" w:name="_Toc243984940"/>
+      <w:r>
+        <w:t>8.1 EXTRA: Diagrama de base de datos (UML)</w:t>
       </w:r>
       <w:bookmarkEnd w:id="14"/>
     </w:p>
@@ -9882,7 +9882,10 @@
         <w:spacing w:after="120" w:line="300" w:lineRule="auto"/>
       </w:pPr>
       <w:r>
-        <w:t>13 tablas del dominio en MySQL 8 con los índices que pide el plan: rooms(status), reservations(check_in, check_out), reservations(client_id), clients(document_number) único e inventory_items(name). La versión editable está en DBML (docs/diagramas/legrandhotel.dbml) y se abre en dbdiagram.io.</w:t>
+        <w:t>Diagrama de clases UML de las 13 entidades (modelos de Laravel sobre MySQL 8) con atributos, métodos y multiplicidades. La tabla intermedia role_user es la asociación muchos a muchos entre User y Role; AuditLog e InventoryMovement guardan qué usuario hizo cada acción. Índices que pide el plan: rooms(status), reservations(check_in, check_out), reservations(client_id), clients(document_number) único e inventory_items(name). Fuentes editables: docs/diagramas/uml-clases.puml (PlantUML) y docs/diagramas/legrandh</w:t>
+      </w:r>
+      <w:r>
+        <w:t>otel.dbml (dbdiagram.io).</w:t>
       </w:r>
     </w:p>
     <w:p>
@@ -9896,8 +9899,8 @@
           <w:noProof/>
         </w:rPr>
         <w:drawing>
-          <wp:inline distT="0" distB="0" distL="0" distR="0" wp14:anchorId="09950BA4" wp14:editId="35EC41A2">
-            <wp:extent cx="7562850" cy="4029075"/>
+          <wp:inline distT="0" distB="0" distL="0" distR="0" wp14:anchorId="5C6DE833" wp14:editId="7F71DD37">
+            <wp:extent cx="5943600" cy="3362325"/>
             <wp:effectExtent l="0" t="0" r="0" b="0"/>
             <wp:docPr id="3" name="Imagen 3"/>
             <wp:cNvGraphicFramePr>
@@ -9922,7 +9925,7 @@
                   <pic:spPr bwMode="auto">
                     <a:xfrm>
                       <a:off x="0" y="0"/>
-                      <a:ext cx="7562850" cy="4029075"/>
+                      <a:ext cx="5943600" cy="3362325"/>
                     </a:xfrm>
                     <a:prstGeom prst="rect">
                       <a:avLst/>
@@ -9939,6 +9942,13 @@
       <w:pPr>
         <w:spacing w:after="200"/>
         <w:jc w:val="center"/>
+        <w:sectPr>
+          <w:footerReference w:type="default" r:id="rId14"/>
+          <w:pgSz w:w="16838" w:h="11906" w:orient="landscape"/>
+          <w:pgMar w:top="1021" w:right="1418" w:bottom="1021" w:left="1418" w:header="708" w:footer="708" w:gutter="0"/>
+          <w:cols w:space="720"/>
+          <w:docGrid w:linePitch="360"/>
+        </w:sectPr>
       </w:pPr>
       <w:r>
         <w:rPr>
@@ -9947,104 +9957,7 @@
           <w:sz w:val="20"/>
           <w:szCs w:val="20"/>
         </w:rPr>
-        <w:t>Figura 5. Modelo entidad-relación de LeGrandHotel.</w:t>
-      </w:r>
-    </w:p>
-    <w:p>
-      <w:pPr>
-        <w:keepNext/>
-        <w:pageBreakBefore/>
-        <w:spacing w:after="120" w:line="300" w:lineRule="auto"/>
-      </w:pPr>
-      <w:r>
-        <w:rPr>
-          <w:b/>
-          <w:bCs/>
-          <w:sz w:val="26"/>
-          <w:szCs w:val="26"/>
-        </w:rPr>
-        <w:lastRenderedPageBreak/>
-        <w:t>Diagrama de clases UML</w:t>
-      </w:r>
-    </w:p>
-    <w:p>
-      <w:pPr>
-        <w:spacing w:after="120" w:line="300" w:lineRule="auto"/>
-      </w:pPr>
-      <w:r>
-        <w:t>Las mismas entidades vistas como clases del sistema (modelos de Laravel), con sus atributos, sus métodos principales y la multiplicidad de cada asociación. En UML, la tabla intermedia role_user es la asociación muchos a muchos entre User y Role; AuditLog e InventoryMovement guardan qué usuario hizo cada acción. La fuente editable está en docs/diagramas/uml-clases.puml (PlantUML).</w:t>
-      </w:r>
-    </w:p>
-    <w:p>
-      <w:pPr>
-        <w:keepNext/>
-        <w:spacing w:after="60"/>
-        <w:jc w:val="center"/>
-      </w:pPr>
-      <w:r>
-        <w:rPr>
-          <w:noProof/>
-        </w:rPr>
-        <w:drawing>
-          <wp:inline distT="0" distB="0" distL="0" distR="0" wp14:anchorId="439EC063" wp14:editId="3C477C51">
-            <wp:extent cx="8277225" cy="4686300"/>
-            <wp:effectExtent l="0" t="0" r="0" b="0"/>
-            <wp:docPr id="4" name="Imagen 4"/>
-            <wp:cNvGraphicFramePr>
-              <a:graphicFrameLocks xmlns:a="http://schemas.openxmlformats.org/drawingml/2006/main" noChangeAspect="1"/>
-            </wp:cNvGraphicFramePr>
-            <a:graphic xmlns:a="http://schemas.openxmlformats.org/drawingml/2006/main">
-              <a:graphicData uri="http://schemas.openxmlformats.org/drawingml/2006/picture">
-                <pic:pic xmlns:pic="http://schemas.openxmlformats.org/drawingml/2006/picture">
-                  <pic:nvPicPr>
-                    <pic:cNvPr id="0" name=""/>
-                    <pic:cNvPicPr>
-                      <a:picLocks noChangeAspect="1" noChangeArrowheads="1"/>
-                    </pic:cNvPicPr>
-                  </pic:nvPicPr>
-                  <pic:blipFill>
-                    <a:blip r:embed="rId14"/>
-                    <a:srcRect/>
-                    <a:stretch>
-                      <a:fillRect/>
-                    </a:stretch>
-                  </pic:blipFill>
-                  <pic:spPr bwMode="auto">
-                    <a:xfrm>
-                      <a:off x="0" y="0"/>
-                      <a:ext cx="8277225" cy="4686300"/>
-                    </a:xfrm>
-                    <a:prstGeom prst="rect">
-                      <a:avLst/>
-                    </a:prstGeom>
-                  </pic:spPr>
-                </pic:pic>
-              </a:graphicData>
-            </a:graphic>
-          </wp:inline>
-        </w:drawing>
-      </w:r>
-    </w:p>
-    <w:p>
-      <w:pPr>
-        <w:spacing w:after="200"/>
-        <w:jc w:val="center"/>
-        <w:sectPr>
-          <w:footerReference w:type="default" r:id="rId15"/>
-          <w:pgSz w:w="16838" w:h="11906" w:orient="landscape"/>
-          <w:pgMar w:top="1021" w:right="1418" w:bottom="1021" w:left="1418" w:header="708" w:footer="708" w:gutter="0"/>
-          <w:cols w:space="720"/>
-          <w:docGrid w:linePitch="360"/>
-        </w:sectPr>
-      </w:pPr>
-      <w:r>
-        <w:rPr>
-          <w:i/>
-          <w:iCs/>
-          <w:sz w:val="20"/>
-          <w:szCs w:val="20"/>
-        </w:rPr>
-        <w:t>Figura 6. Diagrama de clases UML de LeGrandHotel.</w:t>
+        <w:t>Figura 5. Diagrama de clases UML de LeGrandHotel.</w:t>
       </w:r>
     </w:p>
     <w:p>
@@ -10052,7 +9965,7 @@
         <w:pStyle w:val="Ttulo2"/>
         <w:keepNext/>
       </w:pPr>
-      <w:bookmarkStart w:id="15" w:name="_Toc243984521"/>
+      <w:bookmarkStart w:id="15" w:name="_Toc243984941"/>
       <w:r>
         <w:lastRenderedPageBreak/>
         <w:t>8.2 EXTRA: Pruebas de rendimiento y estrés con k6 (varias corridas)</w:t>
@@ -11608,8 +11521,74 @@
           <w:noProof/>
         </w:rPr>
         <w:drawing>
-          <wp:inline distT="0" distB="0" distL="0" distR="0" wp14:anchorId="1D790DEA" wp14:editId="48177F5B">
+          <wp:inline distT="0" distB="0" distL="0" distR="0" wp14:anchorId="4E408E60" wp14:editId="1DA2DB68">
             <wp:extent cx="5400675" cy="3114675"/>
+            <wp:effectExtent l="0" t="0" r="0" b="0"/>
+            <wp:docPr id="8" name="Imagen 8"/>
+            <wp:cNvGraphicFramePr>
+              <a:graphicFrameLocks xmlns:a="http://schemas.openxmlformats.org/drawingml/2006/main" noChangeAspect="1"/>
+            </wp:cNvGraphicFramePr>
+            <a:graphic xmlns:a="http://schemas.openxmlformats.org/drawingml/2006/main">
+              <a:graphicData uri="http://schemas.openxmlformats.org/drawingml/2006/picture">
+                <pic:pic xmlns:pic="http://schemas.openxmlformats.org/drawingml/2006/picture">
+                  <pic:nvPicPr>
+                    <pic:cNvPr id="0" name=""/>
+                    <pic:cNvPicPr>
+                      <a:picLocks noChangeAspect="1" noChangeArrowheads="1"/>
+                    </pic:cNvPicPr>
+                  </pic:nvPicPr>
+                  <pic:blipFill>
+                    <a:blip r:embed="rId15"/>
+                    <a:srcRect/>
+                    <a:stretch>
+                      <a:fillRect/>
+                    </a:stretch>
+                  </pic:blipFill>
+                  <pic:spPr bwMode="auto">
+                    <a:xfrm>
+                      <a:off x="0" y="0"/>
+                      <a:ext cx="5400675" cy="3114675"/>
+                    </a:xfrm>
+                    <a:prstGeom prst="rect">
+                      <a:avLst/>
+                    </a:prstGeom>
+                  </pic:spPr>
+                </pic:pic>
+              </a:graphicData>
+            </a:graphic>
+          </wp:inline>
+        </w:drawing>
+      </w:r>
+    </w:p>
+    <w:p>
+      <w:pPr>
+        <w:spacing w:after="200"/>
+        <w:jc w:val="center"/>
+      </w:pPr>
+      <w:r>
+        <w:rPr>
+          <w:i/>
+          <w:iCs/>
+          <w:sz w:val="20"/>
+          <w:szCs w:val="20"/>
+        </w:rPr>
+        <w:t>Figura 6. Tiempo de respuesta (p50, p90, p95) según la cantidad de usuarios virtuales.</w:t>
+      </w:r>
+    </w:p>
+    <w:p>
+      <w:pPr>
+        <w:keepNext/>
+        <w:spacing w:after="60"/>
+        <w:jc w:val="center"/>
+      </w:pPr>
+      <w:r>
+        <w:rPr>
+          <w:noProof/>
+        </w:rPr>
+        <w:lastRenderedPageBreak/>
+        <w:drawing>
+          <wp:inline distT="0" distB="0" distL="0" distR="0" wp14:anchorId="0BC7F927" wp14:editId="11AE14E1">
+            <wp:extent cx="5400675" cy="2971800"/>
             <wp:effectExtent l="0" t="0" r="0" b="0"/>
             <wp:docPr id="9" name="Imagen 9"/>
             <wp:cNvGraphicFramePr>
@@ -11634,7 +11613,7 @@
                   <pic:spPr bwMode="auto">
                     <a:xfrm>
                       <a:off x="0" y="0"/>
-                      <a:ext cx="5400675" cy="3114675"/>
+                      <a:ext cx="5400675" cy="2971800"/>
                     </a:xfrm>
                     <a:prstGeom prst="rect">
                       <a:avLst/>
@@ -11659,7 +11638,7 @@
           <w:sz w:val="20"/>
           <w:szCs w:val="20"/>
         </w:rPr>
-        <w:t>Figura 7. Tiempo de respuesta (p50, p90, p95) según la cantidad de usuarios virtuales.</w:t>
+        <w:t>Figura 7. Peticiones atendidas por segundo en cada corrida.</w:t>
       </w:r>
     </w:p>
     <w:p>
@@ -11672,10 +11651,9 @@
         <w:rPr>
           <w:noProof/>
         </w:rPr>
-        <w:lastRenderedPageBreak/>
         <w:drawing>
-          <wp:inline distT="0" distB="0" distL="0" distR="0" wp14:anchorId="487DAC7C" wp14:editId="184EF681">
-            <wp:extent cx="5400675" cy="2971800"/>
+          <wp:inline distT="0" distB="0" distL="0" distR="0" wp14:anchorId="5E63A8B2" wp14:editId="304B8DE8">
+            <wp:extent cx="5400675" cy="2733675"/>
             <wp:effectExtent l="0" t="0" r="0" b="0"/>
             <wp:docPr id="10" name="Imagen 10"/>
             <wp:cNvGraphicFramePr>
@@ -11700,7 +11678,7 @@
                   <pic:spPr bwMode="auto">
                     <a:xfrm>
                       <a:off x="0" y="0"/>
-                      <a:ext cx="5400675" cy="2971800"/>
+                      <a:ext cx="5400675" cy="2733675"/>
                     </a:xfrm>
                     <a:prstGeom prst="rect">
                       <a:avLst/>
@@ -11725,7 +11703,7 @@
           <w:sz w:val="20"/>
           <w:szCs w:val="20"/>
         </w:rPr>
-        <w:t>Figura 8. Peticiones atendidas por segundo en cada corrida.</w:t>
+        <w:t>Figura 8. Porcentaje de peticiones fallidas en cada corrida.</w:t>
       </w:r>
     </w:p>
     <w:p>
@@ -11738,9 +11716,10 @@
         <w:rPr>
           <w:noProof/>
         </w:rPr>
+        <w:lastRenderedPageBreak/>
         <w:drawing>
-          <wp:inline distT="0" distB="0" distL="0" distR="0" wp14:anchorId="28536418" wp14:editId="2233AD29">
-            <wp:extent cx="5400675" cy="2733675"/>
+          <wp:inline distT="0" distB="0" distL="0" distR="0" wp14:anchorId="5D8FBD91" wp14:editId="6E685E08">
+            <wp:extent cx="5400675" cy="2981325"/>
             <wp:effectExtent l="0" t="0" r="0" b="0"/>
             <wp:docPr id="11" name="Imagen 11"/>
             <wp:cNvGraphicFramePr>
@@ -11765,7 +11744,7 @@
                   <pic:spPr bwMode="auto">
                     <a:xfrm>
                       <a:off x="0" y="0"/>
-                      <a:ext cx="5400675" cy="2733675"/>
+                      <a:ext cx="5400675" cy="2981325"/>
                     </a:xfrm>
                     <a:prstGeom prst="rect">
                       <a:avLst/>
@@ -11790,7 +11769,7 @@
           <w:sz w:val="20"/>
           <w:szCs w:val="20"/>
         </w:rPr>
-        <w:t>Figura 9. Porcentaje de peticiones fallidas en cada corrida.</w:t>
+        <w:t>Figura 9. p95 por tipo de operación (lecturas, login, crear reserva).</w:t>
       </w:r>
     </w:p>
     <w:p>
@@ -11803,10 +11782,9 @@
         <w:rPr>
           <w:noProof/>
         </w:rPr>
-        <w:lastRenderedPageBreak/>
         <w:drawing>
-          <wp:inline distT="0" distB="0" distL="0" distR="0" wp14:anchorId="3386B977" wp14:editId="5285CD37">
-            <wp:extent cx="5400675" cy="2981325"/>
+          <wp:inline distT="0" distB="0" distL="0" distR="0" wp14:anchorId="34EC4A80" wp14:editId="67F2D20F">
+            <wp:extent cx="5400675" cy="3638550"/>
             <wp:effectExtent l="0" t="0" r="0" b="0"/>
             <wp:docPr id="12" name="Imagen 12"/>
             <wp:cNvGraphicFramePr>
@@ -11831,7 +11809,7 @@
                   <pic:spPr bwMode="auto">
                     <a:xfrm>
                       <a:off x="0" y="0"/>
-                      <a:ext cx="5400675" cy="2981325"/>
+                      <a:ext cx="5400675" cy="3638550"/>
                     </a:xfrm>
                     <a:prstGeom prst="rect">
                       <a:avLst/>
@@ -11856,7 +11834,774 @@
           <w:sz w:val="20"/>
           <w:szCs w:val="20"/>
         </w:rPr>
-        <w:t>Figura 10. p95 por tipo de operación (lecturas, login, crear reserva).</w:t>
+        <w:t>Figura 10. Evolución de la latencia segundo a segundo en la corrida de 50 usuarios.</w:t>
+      </w:r>
+    </w:p>
+    <w:p>
+      <w:pPr>
+        <w:keepNext/>
+        <w:spacing w:before="120" w:after="60"/>
+      </w:pPr>
+      <w:r>
+        <w:rPr>
+          <w:b/>
+          <w:bCs/>
+          <w:sz w:val="21"/>
+          <w:szCs w:val="21"/>
+        </w:rPr>
+        <w:lastRenderedPageBreak/>
+        <w:t xml:space="preserve">Fragmento 9. </w:t>
+      </w:r>
+      <w:r>
+        <w:rPr>
+          <w:i/>
+          <w:iCs/>
+          <w:sz w:val="21"/>
+          <w:szCs w:val="21"/>
+        </w:rPr>
+        <w:t>tests/k6/reservas.js (extracto)</w:t>
+      </w:r>
+    </w:p>
+    <w:tbl>
+      <w:tblPr>
+        <w:tblW w:w="9070" w:type="dxa"/>
+        <w:tblBorders>
+          <w:top w:val="single" w:sz="4" w:space="0" w:color="auto"/>
+          <w:left w:val="single" w:sz="4" w:space="0" w:color="auto"/>
+          <w:bottom w:val="single" w:sz="4" w:space="0" w:color="auto"/>
+          <w:right w:val="single" w:sz="4" w:space="0" w:color="auto"/>
+          <w:insideH w:val="single" w:sz="4" w:space="0" w:color="auto"/>
+          <w:insideV w:val="single" w:sz="4" w:space="0" w:color="auto"/>
+        </w:tblBorders>
+        <w:tblLook w:val="04A0" w:firstRow="1" w:lastRow="0" w:firstColumn="1" w:lastColumn="0" w:noHBand="0" w:noVBand="1"/>
+      </w:tblPr>
+      <w:tblGrid>
+        <w:gridCol w:w="9070"/>
+      </w:tblGrid>
+      <w:tr>
+        <w:trPr>
+          <w:cantSplit/>
+        </w:trPr>
+        <w:tc>
+          <w:tcPr>
+            <w:tcW w:w="9070" w:type="dxa"/>
+            <w:tcBorders>
+              <w:top w:val="single" w:sz="4" w:space="0" w:color="000000"/>
+              <w:left w:val="single" w:sz="4" w:space="0" w:color="000000"/>
+              <w:bottom w:val="single" w:sz="4" w:space="0" w:color="000000"/>
+              <w:right w:val="single" w:sz="4" w:space="0" w:color="000000"/>
+            </w:tcBorders>
+            <w:shd w:val="clear" w:color="auto" w:fill="F2F2F2"/>
+            <w:tcMar>
+              <w:top w:w="80" w:type="dxa"/>
+              <w:left w:w="140" w:type="dxa"/>
+              <w:bottom w:w="80" w:type="dxa"/>
+              <w:right w:w="140" w:type="dxa"/>
+            </w:tcMar>
+          </w:tcPr>
+          <w:p>
+            <w:r>
+              <w:rPr>
+                <w:rFonts w:ascii="Consolas" w:eastAsia="Consolas" w:hAnsi="Consolas" w:cs="Consolas"/>
+                <w:sz w:val="17"/>
+                <w:szCs w:val="17"/>
+              </w:rPr>
+              <w:t>escalon: {</w:t>
+            </w:r>
+          </w:p>
+          <w:p>
+            <w:r>
+              <w:rPr>
+                <w:rFonts w:ascii="Consolas" w:eastAsia="Consolas" w:hAnsi="Consolas" w:cs="Consolas"/>
+                <w:sz w:val="17"/>
+                <w:szCs w:val="17"/>
+              </w:rPr>
+              <w:t xml:space="preserve">  stages: [</w:t>
+            </w:r>
+          </w:p>
+          <w:p>
+            <w:r>
+              <w:rPr>
+                <w:rFonts w:ascii="Consolas" w:eastAsia="Consolas" w:hAnsi="Consolas" w:cs="Consolas"/>
+                <w:sz w:val="17"/>
+                <w:szCs w:val="17"/>
+              </w:rPr>
+              <w:t xml:space="preserve">    { duration: '10s', target: VUS },   // sube hasta VUS usuarios</w:t>
+            </w:r>
+          </w:p>
+          <w:p>
+            <w:r>
+              <w:rPr>
+                <w:rFonts w:ascii="Consolas" w:eastAsia="Consolas" w:hAnsi="Consolas" w:cs="Consolas"/>
+                <w:sz w:val="17"/>
+                <w:szCs w:val="17"/>
+              </w:rPr>
+              <w:t xml:space="preserve">    { duration: '45s', target: VUS },   // mantiene la carga</w:t>
+            </w:r>
+          </w:p>
+          <w:p>
+            <w:r>
+              <w:rPr>
+                <w:rFonts w:ascii="Consolas" w:eastAsia="Consolas" w:hAnsi="Consolas" w:cs="Consolas"/>
+                <w:sz w:val="17"/>
+                <w:szCs w:val="17"/>
+              </w:rPr>
+              <w:t xml:space="preserve">    { duration: '5s',  target: 0 },     // baja</w:t>
+            </w:r>
+          </w:p>
+          <w:p>
+            <w:r>
+              <w:rPr>
+                <w:rFonts w:ascii="Consolas" w:eastAsia="Consolas" w:hAnsi="Consolas" w:cs="Consolas"/>
+                <w:sz w:val="17"/>
+                <w:szCs w:val="17"/>
+              </w:rPr>
+              <w:t xml:space="preserve">  ],</w:t>
+            </w:r>
+          </w:p>
+          <w:p>
+            <w:r>
+              <w:rPr>
+                <w:rFonts w:ascii="Consolas" w:eastAsia="Consolas" w:hAnsi="Consolas" w:cs="Consolas"/>
+                <w:sz w:val="17"/>
+                <w:szCs w:val="17"/>
+              </w:rPr>
+              <w:t xml:space="preserve">  thresholds: {</w:t>
+            </w:r>
+          </w:p>
+          <w:p>
+            <w:r>
+              <w:rPr>
+                <w:rFonts w:ascii="Consolas" w:eastAsia="Consolas" w:hAnsi="Consolas" w:cs="Consolas"/>
+                <w:sz w:val="17"/>
+                <w:szCs w:val="17"/>
+              </w:rPr>
+              <w:t xml:space="preserve">    http_req_duration: ['p(95)&lt;500'],   // meta: p95 menor a 500 ms</w:t>
+            </w:r>
+          </w:p>
+          <w:p>
+            <w:r>
+              <w:rPr>
+                <w:rFonts w:ascii="Consolas" w:eastAsia="Consolas" w:hAnsi="Consolas" w:cs="Consolas"/>
+                <w:sz w:val="17"/>
+                <w:szCs w:val="17"/>
+              </w:rPr>
+              <w:t xml:space="preserve">    http_req_failed: ['rate&lt;0.01'],     // menos de 1% de errores</w:t>
+            </w:r>
+          </w:p>
+          <w:p>
+            <w:r>
+              <w:rPr>
+                <w:rFonts w:ascii="Consolas" w:eastAsia="Consolas" w:hAnsi="Consolas" w:cs="Consolas"/>
+                <w:sz w:val="17"/>
+                <w:szCs w:val="17"/>
+              </w:rPr>
+              <w:t xml:space="preserve">  },</w:t>
+            </w:r>
+          </w:p>
+          <w:p>
+            <w:r>
+              <w:rPr>
+                <w:rFonts w:ascii="Consolas" w:eastAsia="Consolas" w:hAnsi="Consolas" w:cs="Consolas"/>
+                <w:sz w:val="17"/>
+                <w:szCs w:val="17"/>
+              </w:rPr>
+              <w:t>},</w:t>
+            </w:r>
+          </w:p>
+        </w:tc>
+      </w:tr>
+    </w:tbl>
+    <w:p>
+      <w:pPr>
+        <w:spacing w:before="80" w:after="160" w:line="300" w:lineRule="auto"/>
+      </w:pPr>
+      <w:r>
+        <w:rPr>
+          <w:b/>
+          <w:bCs/>
+        </w:rPr>
+        <w:t xml:space="preserve">Por qué se usó: </w:t>
+      </w:r>
+      <w:r>
+        <w:t>el mismo script se corre con distinta cantidad de usuarios (VUS) para comparar corridas entre sí. Los thresholds convierten la meta del plan (p95 menor a 500 ms y menos de 1% de errores) en una regla: si no se cumple, k6 marca la prueba como fallida sin interpretar los números a mano.</w:t>
+      </w:r>
+    </w:p>
+    <w:p>
+      <w:pPr>
+        <w:pStyle w:val="Ttulo2"/>
+        <w:keepNext/>
+      </w:pPr>
+      <w:bookmarkStart w:id="16" w:name="_Toc243984942"/>
+      <w:r>
+        <w:t>8.3 Análisis y cuello de botella encontrado</w:t>
+      </w:r>
+      <w:bookmarkEnd w:id="16"/>
+    </w:p>
+    <w:p>
+      <w:pPr>
+        <w:pStyle w:val="Prrafodelista"/>
+        <w:numPr>
+          <w:ilvl w:val="0"/>
+          <w:numId w:val="2"/>
+        </w:numPr>
+        <w:spacing w:after="60" w:line="288" w:lineRule="auto"/>
+      </w:pPr>
+      <w:r>
+        <w:t>Con 5 usuarios el p95 fue 528 ms; con 50 usuarios llegó a 7,885 ms. Las peticiones por segundo apenas suben (4.4 → 5.3): el servidor ya estaba al máximo de lo que puede atender.</w:t>
+      </w:r>
+    </w:p>
+    <w:p>
+      <w:pPr>
+        <w:pStyle w:val="Prrafodelista"/>
+        <w:numPr>
+          <w:ilvl w:val="0"/>
+          <w:numId w:val="2"/>
+        </w:numPr>
+        <w:spacing w:after="60" w:line="288" w:lineRule="auto"/>
+      </w:pPr>
+      <w:r>
+        <w:t>Causa: el servidor integrado de PHP en Windows procesa una petición a la vez. Cuando llegan más usuarios, las peticiones esperan en cola y el tiempo de respuesta crece de forma casi lineal, aunque el código de cada endpoint sea rápido (en la prueba masiva de Pest, el listado de 5000 reservas responde en menos de 500 ms).</w:t>
+      </w:r>
+    </w:p>
+    <w:p>
+      <w:pPr>
+        <w:pStyle w:val="Prrafodelista"/>
+        <w:numPr>
+          <w:ilvl w:val="0"/>
+          <w:numId w:val="2"/>
+        </w:numPr>
+        <w:spacing w:after="60" w:line="288" w:lineRule="auto"/>
+      </w:pPr>
+      <w:r>
+        <w:t>Con 50 VU, lecturas, login y creación de reservas tienen casi el mismo p95 (7,890, 7,905 y 7,820 ms). El tiempo lo domina la espera en la cola del servidor, no el trabajo de cada endpoint.</w:t>
+      </w:r>
+    </w:p>
+    <w:p>
+      <w:pPr>
+        <w:pStyle w:val="Prrafodelista"/>
+        <w:numPr>
+          <w:ilvl w:val="0"/>
+          <w:numId w:val="2"/>
+        </w:numPr>
+        <w:spacing w:after="60" w:line="288" w:lineRule="auto"/>
+      </w:pPr>
+      <w:r>
+        <w:t>A pesar de la saturación no hubo errores (0% en todas las corridas): la API responde más lento, pero no se cae ni pierde peticiones.</w:t>
+      </w:r>
+    </w:p>
+    <w:p>
+      <w:pPr>
+        <w:pStyle w:val="Prrafodelista"/>
+        <w:numPr>
+          <w:ilvl w:val="0"/>
+          <w:numId w:val="2"/>
+        </w:numPr>
+        <w:spacing w:after="60" w:line="288" w:lineRule="auto"/>
+      </w:pPr>
+      <w:r>
+        <w:t>Corrección prevista para el 80%: Docker con Nginx + PHP-FPM (20 procesos), OPcache, MySQL en RDS y Redis para caché y rate limit. Las mismas corridas se repetirán en AWS con 50–100 y luego 1000–5000 usuarios, para comparar el antes y el después.</w:t>
+      </w:r>
+    </w:p>
+    <w:p>
+      <w:pPr>
+        <w:spacing w:after="120" w:line="300" w:lineRule="auto"/>
+      </w:pPr>
+      <w:r>
+        <w:t>Los reportes HTML interactivos de cada corrida (generados por k6) están en docs/pruebas/local-*.html y los datos crudos en docs/pruebas/datos/.</w:t>
+      </w:r>
+    </w:p>
+    <w:p>
+      <w:pPr>
+        <w:pStyle w:val="Ttulo2"/>
+        <w:keepNext/>
+      </w:pPr>
+      <w:bookmarkStart w:id="17" w:name="_Toc243984943"/>
+      <w:r>
+        <w:t>8.4 EXTRA: Cifrado (ofuscación) del código</w:t>
+      </w:r>
+      <w:bookmarkEnd w:id="17"/>
+    </w:p>
+    <w:p>
+      <w:pPr>
+        <w:spacing w:after="120" w:line="300" w:lineRule="auto"/>
+      </w:pPr>
+      <w:r>
+        <w:t>El build de producción del frontend sale ofuscado con javascript-obfuscator: los nombres se reemplazan por identificadores hexadecimales y los textos se guardan codificados en base64. Comparación del mismo texto de la interfaz («No tienes acceso»):</w:t>
+      </w:r>
+    </w:p>
+    <w:tbl>
+      <w:tblPr>
+        <w:tblW w:w="9070" w:type="dxa"/>
+        <w:tblBorders>
+          <w:top w:val="single" w:sz="4" w:space="0" w:color="auto"/>
+          <w:left w:val="single" w:sz="4" w:space="0" w:color="auto"/>
+          <w:bottom w:val="single" w:sz="4" w:space="0" w:color="auto"/>
+          <w:right w:val="single" w:sz="4" w:space="0" w:color="auto"/>
+          <w:insideH w:val="single" w:sz="4" w:space="0" w:color="auto"/>
+          <w:insideV w:val="single" w:sz="4" w:space="0" w:color="auto"/>
+        </w:tblBorders>
+        <w:tblLook w:val="04A0" w:firstRow="1" w:lastRow="0" w:firstColumn="1" w:lastColumn="0" w:noHBand="0" w:noVBand="1"/>
+      </w:tblPr>
+      <w:tblGrid>
+        <w:gridCol w:w="2474"/>
+        <w:gridCol w:w="3298"/>
+        <w:gridCol w:w="3298"/>
+      </w:tblGrid>
+      <w:tr>
+        <w:trPr>
+          <w:tblHeader/>
+        </w:trPr>
+        <w:tc>
+          <w:tcPr>
+            <w:tcW w:w="2474" w:type="dxa"/>
+            <w:tcBorders>
+              <w:top w:val="single" w:sz="4" w:space="0" w:color="000000"/>
+              <w:left w:val="single" w:sz="4" w:space="0" w:color="000000"/>
+              <w:bottom w:val="single" w:sz="4" w:space="0" w:color="000000"/>
+              <w:right w:val="single" w:sz="4" w:space="0" w:color="000000"/>
+            </w:tcBorders>
+            <w:shd w:val="clear" w:color="auto" w:fill="D9D9D9"/>
+            <w:tcMar>
+              <w:top w:w="60" w:type="dxa"/>
+              <w:left w:w="90" w:type="dxa"/>
+              <w:bottom w:w="60" w:type="dxa"/>
+              <w:right w:w="90" w:type="dxa"/>
+            </w:tcMar>
+            <w:vAlign w:val="center"/>
+          </w:tcPr>
+          <w:p>
+            <w:r>
+              <w:rPr>
+                <w:b/>
+                <w:bCs/>
+                <w:sz w:val="20"/>
+                <w:szCs w:val="20"/>
+              </w:rPr>
+              <w:t>Build</w:t>
+            </w:r>
+          </w:p>
+        </w:tc>
+        <w:tc>
+          <w:tcPr>
+            <w:tcW w:w="3298" w:type="dxa"/>
+            <w:tcBorders>
+              <w:top w:val="single" w:sz="4" w:space="0" w:color="000000"/>
+              <w:left w:val="single" w:sz="4" w:space="0" w:color="000000"/>
+              <w:bottom w:val="single" w:sz="4" w:space="0" w:color="000000"/>
+              <w:right w:val="single" w:sz="4" w:space="0" w:color="000000"/>
+            </w:tcBorders>
+            <w:shd w:val="clear" w:color="auto" w:fill="D9D9D9"/>
+            <w:tcMar>
+              <w:top w:w="60" w:type="dxa"/>
+              <w:left w:w="90" w:type="dxa"/>
+              <w:bottom w:w="60" w:type="dxa"/>
+              <w:right w:w="90" w:type="dxa"/>
+            </w:tcMar>
+            <w:vAlign w:val="center"/>
+          </w:tcPr>
+          <w:p>
+            <w:r>
+              <w:rPr>
+                <w:b/>
+                <w:bCs/>
+                <w:sz w:val="20"/>
+                <w:szCs w:val="20"/>
+              </w:rPr>
+              <w:t>Comando</w:t>
+            </w:r>
+          </w:p>
+        </w:tc>
+        <w:tc>
+          <w:tcPr>
+            <w:tcW w:w="3298" w:type="dxa"/>
+            <w:tcBorders>
+              <w:top w:val="single" w:sz="4" w:space="0" w:color="000000"/>
+              <w:left w:val="single" w:sz="4" w:space="0" w:color="000000"/>
+              <w:bottom w:val="single" w:sz="4" w:space="0" w:color="000000"/>
+              <w:right w:val="single" w:sz="4" w:space="0" w:color="000000"/>
+            </w:tcBorders>
+            <w:shd w:val="clear" w:color="auto" w:fill="D9D9D9"/>
+            <w:tcMar>
+              <w:top w:w="60" w:type="dxa"/>
+              <w:left w:w="90" w:type="dxa"/>
+              <w:bottom w:w="60" w:type="dxa"/>
+              <w:right w:w="90" w:type="dxa"/>
+            </w:tcMar>
+            <w:vAlign w:val="center"/>
+          </w:tcPr>
+          <w:p>
+            <w:r>
+              <w:rPr>
+                <w:b/>
+                <w:bCs/>
+                <w:sz w:val="20"/>
+                <w:szCs w:val="20"/>
+              </w:rPr>
+              <w:t>Veces que aparece legible</w:t>
+            </w:r>
+          </w:p>
+        </w:tc>
+      </w:tr>
+      <w:tr>
+        <w:tc>
+          <w:tcPr>
+            <w:tcW w:w="2474" w:type="dxa"/>
+            <w:tcBorders>
+              <w:top w:val="single" w:sz="4" w:space="0" w:color="000000"/>
+              <w:left w:val="single" w:sz="4" w:space="0" w:color="000000"/>
+              <w:bottom w:val="single" w:sz="4" w:space="0" w:color="000000"/>
+              <w:right w:val="single" w:sz="4" w:space="0" w:color="000000"/>
+            </w:tcBorders>
+            <w:tcMar>
+              <w:top w:w="60" w:type="dxa"/>
+              <w:left w:w="90" w:type="dxa"/>
+              <w:bottom w:w="60" w:type="dxa"/>
+              <w:right w:w="90" w:type="dxa"/>
+            </w:tcMar>
+            <w:vAlign w:val="center"/>
+          </w:tcPr>
+          <w:p>
+            <w:r>
+              <w:rPr>
+                <w:sz w:val="20"/>
+                <w:szCs w:val="20"/>
+              </w:rPr>
+              <w:t>Normal</w:t>
+            </w:r>
+          </w:p>
+        </w:tc>
+        <w:tc>
+          <w:tcPr>
+            <w:tcW w:w="3298" w:type="dxa"/>
+            <w:tcBorders>
+              <w:top w:val="single" w:sz="4" w:space="0" w:color="000000"/>
+              <w:left w:val="single" w:sz="4" w:space="0" w:color="000000"/>
+              <w:bottom w:val="single" w:sz="4" w:space="0" w:color="000000"/>
+              <w:right w:val="single" w:sz="4" w:space="0" w:color="000000"/>
+            </w:tcBorders>
+            <w:tcMar>
+              <w:top w:w="60" w:type="dxa"/>
+              <w:left w:w="90" w:type="dxa"/>
+              <w:bottom w:w="60" w:type="dxa"/>
+              <w:right w:w="90" w:type="dxa"/>
+            </w:tcMar>
+            <w:vAlign w:val="center"/>
+          </w:tcPr>
+          <w:p>
+            <w:r>
+              <w:rPr>
+                <w:sz w:val="20"/>
+                <w:szCs w:val="20"/>
+              </w:rPr>
+              <w:t>npm run build:plain</w:t>
+            </w:r>
+          </w:p>
+        </w:tc>
+        <w:tc>
+          <w:tcPr>
+            <w:tcW w:w="3298" w:type="dxa"/>
+            <w:tcBorders>
+              <w:top w:val="single" w:sz="4" w:space="0" w:color="000000"/>
+              <w:left w:val="single" w:sz="4" w:space="0" w:color="000000"/>
+              <w:bottom w:val="single" w:sz="4" w:space="0" w:color="000000"/>
+              <w:right w:val="single" w:sz="4" w:space="0" w:color="000000"/>
+            </w:tcBorders>
+            <w:tcMar>
+              <w:top w:w="60" w:type="dxa"/>
+              <w:left w:w="90" w:type="dxa"/>
+              <w:bottom w:w="60" w:type="dxa"/>
+              <w:right w:w="90" w:type="dxa"/>
+            </w:tcMar>
+            <w:vAlign w:val="center"/>
+          </w:tcPr>
+          <w:p>
+            <w:r>
+              <w:rPr>
+                <w:sz w:val="20"/>
+                <w:szCs w:val="20"/>
+              </w:rPr>
+              <w:t>1</w:t>
+            </w:r>
+          </w:p>
+        </w:tc>
+      </w:tr>
+      <w:tr>
+        <w:tc>
+          <w:tcPr>
+            <w:tcW w:w="2474" w:type="dxa"/>
+            <w:tcBorders>
+              <w:top w:val="single" w:sz="4" w:space="0" w:color="000000"/>
+              <w:left w:val="single" w:sz="4" w:space="0" w:color="000000"/>
+              <w:bottom w:val="single" w:sz="4" w:space="0" w:color="000000"/>
+              <w:right w:val="single" w:sz="4" w:space="0" w:color="000000"/>
+            </w:tcBorders>
+            <w:tcMar>
+              <w:top w:w="60" w:type="dxa"/>
+              <w:left w:w="90" w:type="dxa"/>
+              <w:bottom w:w="60" w:type="dxa"/>
+              <w:right w:w="90" w:type="dxa"/>
+            </w:tcMar>
+            <w:vAlign w:val="center"/>
+          </w:tcPr>
+          <w:p>
+            <w:r>
+              <w:rPr>
+                <w:sz w:val="20"/>
+                <w:szCs w:val="20"/>
+              </w:rPr>
+              <w:t>Ofuscado (producción)</w:t>
+            </w:r>
+          </w:p>
+        </w:tc>
+        <w:tc>
+          <w:tcPr>
+            <w:tcW w:w="3298" w:type="dxa"/>
+            <w:tcBorders>
+              <w:top w:val="single" w:sz="4" w:space="0" w:color="000000"/>
+              <w:left w:val="single" w:sz="4" w:space="0" w:color="000000"/>
+              <w:bottom w:val="single" w:sz="4" w:space="0" w:color="000000"/>
+              <w:right w:val="single" w:sz="4" w:space="0" w:color="000000"/>
+            </w:tcBorders>
+            <w:tcMar>
+              <w:top w:w="60" w:type="dxa"/>
+              <w:left w:w="90" w:type="dxa"/>
+              <w:bottom w:w="60" w:type="dxa"/>
+              <w:right w:w="90" w:type="dxa"/>
+            </w:tcMar>
+            <w:vAlign w:val="center"/>
+          </w:tcPr>
+          <w:p>
+            <w:r>
+              <w:rPr>
+                <w:sz w:val="20"/>
+                <w:szCs w:val="20"/>
+              </w:rPr>
+              <w:t>npm run build</w:t>
+            </w:r>
+          </w:p>
+        </w:tc>
+        <w:tc>
+          <w:tcPr>
+            <w:tcW w:w="3298" w:type="dxa"/>
+            <w:tcBorders>
+              <w:top w:val="single" w:sz="4" w:space="0" w:color="000000"/>
+              <w:left w:val="single" w:sz="4" w:space="0" w:color="000000"/>
+              <w:bottom w:val="single" w:sz="4" w:space="0" w:color="000000"/>
+              <w:right w:val="single" w:sz="4" w:space="0" w:color="000000"/>
+            </w:tcBorders>
+            <w:tcMar>
+              <w:top w:w="60" w:type="dxa"/>
+              <w:left w:w="90" w:type="dxa"/>
+              <w:bottom w:w="60" w:type="dxa"/>
+              <w:right w:w="90" w:type="dxa"/>
+            </w:tcMar>
+            <w:vAlign w:val="center"/>
+          </w:tcPr>
+          <w:p>
+            <w:r>
+              <w:rPr>
+                <w:sz w:val="20"/>
+                <w:szCs w:val="20"/>
+              </w:rPr>
+              <w:t>0</w:t>
+            </w:r>
+          </w:p>
+        </w:tc>
+      </w:tr>
+    </w:tbl>
+    <w:p>
+      <w:pPr>
+        <w:spacing w:after="80"/>
+      </w:pPr>
+    </w:p>
+    <w:p>
+      <w:pPr>
+        <w:spacing w:after="120" w:line="300" w:lineRule="auto"/>
+      </w:pPr>
+      <w:r>
+        <w:t>El backend no se publica: corre en un servidor privado sin acceso al código.</w:t>
+      </w:r>
+    </w:p>
+    <w:p>
+      <w:pPr>
+        <w:keepNext/>
+        <w:spacing w:before="120" w:after="60"/>
+      </w:pPr>
+      <w:r>
+        <w:rPr>
+          <w:b/>
+          <w:bCs/>
+          <w:sz w:val="21"/>
+          <w:szCs w:val="21"/>
+        </w:rPr>
+        <w:t xml:space="preserve">Fragmento 10. </w:t>
+      </w:r>
+      <w:r>
+        <w:rPr>
+          <w:i/>
+          <w:iCs/>
+          <w:sz w:val="21"/>
+          <w:szCs w:val="21"/>
+        </w:rPr>
+        <w:t>web/vite.config.ts (extracto)</w:t>
+      </w:r>
+    </w:p>
+    <w:tbl>
+      <w:tblPr>
+        <w:tblW w:w="9070" w:type="dxa"/>
+        <w:tblBorders>
+          <w:top w:val="single" w:sz="4" w:space="0" w:color="auto"/>
+          <w:left w:val="single" w:sz="4" w:space="0" w:color="auto"/>
+          <w:bottom w:val="single" w:sz="4" w:space="0" w:color="auto"/>
+          <w:right w:val="single" w:sz="4" w:space="0" w:color="auto"/>
+          <w:insideH w:val="single" w:sz="4" w:space="0" w:color="auto"/>
+          <w:insideV w:val="single" w:sz="4" w:space="0" w:color="auto"/>
+        </w:tblBorders>
+        <w:tblLook w:val="04A0" w:firstRow="1" w:lastRow="0" w:firstColumn="1" w:lastColumn="0" w:noHBand="0" w:noVBand="1"/>
+      </w:tblPr>
+      <w:tblGrid>
+        <w:gridCol w:w="9070"/>
+      </w:tblGrid>
+      <w:tr>
+        <w:trPr>
+          <w:cantSplit/>
+        </w:trPr>
+        <w:tc>
+          <w:tcPr>
+            <w:tcW w:w="9070" w:type="dxa"/>
+            <w:tcBorders>
+              <w:top w:val="single" w:sz="4" w:space="0" w:color="000000"/>
+              <w:left w:val="single" w:sz="4" w:space="0" w:color="000000"/>
+              <w:bottom w:val="single" w:sz="4" w:space="0" w:color="000000"/>
+              <w:right w:val="single" w:sz="4" w:space="0" w:color="000000"/>
+            </w:tcBorders>
+            <w:shd w:val="clear" w:color="auto" w:fill="F2F2F2"/>
+            <w:tcMar>
+              <w:top w:w="80" w:type="dxa"/>
+              <w:left w:w="140" w:type="dxa"/>
+              <w:bottom w:w="80" w:type="dxa"/>
+              <w:right w:w="140" w:type="dxa"/>
+            </w:tcMar>
+          </w:tcPr>
+          <w:p>
+            <w:r>
+              <w:rPr>
+                <w:rFonts w:ascii="Consolas" w:eastAsia="Consolas" w:hAnsi="Consolas" w:cs="Consolas"/>
+                <w:sz w:val="17"/>
+                <w:szCs w:val="17"/>
+              </w:rPr>
+              <w:t>renderChunk(code, chunk) {</w:t>
+            </w:r>
+          </w:p>
+          <w:p>
+            <w:r>
+              <w:rPr>
+                <w:rFonts w:ascii="Consolas" w:eastAsia="Consolas" w:hAnsi="Consolas" w:cs="Consolas"/>
+                <w:sz w:val="17"/>
+                <w:szCs w:val="17"/>
+              </w:rPr>
+              <w:t xml:space="preserve">  const result = JavaScriptObfuscator.obfuscate(code, {</w:t>
+            </w:r>
+          </w:p>
+          <w:p>
+            <w:r>
+              <w:rPr>
+                <w:rFonts w:ascii="Consolas" w:eastAsia="Consolas" w:hAnsi="Consolas" w:cs="Consolas"/>
+                <w:sz w:val="17"/>
+                <w:szCs w:val="17"/>
+              </w:rPr>
+              <w:t xml:space="preserve">    identifierNamesGenerator: 'hexadecimal',   // nombres ilegibles</w:t>
+            </w:r>
+          </w:p>
+          <w:p>
+            <w:r>
+              <w:rPr>
+                <w:rFonts w:ascii="Consolas" w:eastAsia="Consolas" w:hAnsi="Consolas" w:cs="Consolas"/>
+                <w:sz w:val="17"/>
+                <w:szCs w:val="17"/>
+              </w:rPr>
+              <w:t xml:space="preserve">    stringArray: true, stringArrayEncoding: ['base64'],   // textos codificados</w:t>
+            </w:r>
+          </w:p>
+          <w:p>
+            <w:r>
+              <w:rPr>
+                <w:rFonts w:ascii="Consolas" w:eastAsia="Consolas" w:hAnsi="Consolas" w:cs="Consolas"/>
+                <w:sz w:val="17"/>
+                <w:szCs w:val="17"/>
+              </w:rPr>
+              <w:t xml:space="preserve">    splitStrings: true, compact: true,</w:t>
+            </w:r>
+          </w:p>
+          <w:p>
+            <w:r>
+              <w:rPr>
+                <w:rFonts w:ascii="Consolas" w:eastAsia="Consolas" w:hAnsi="Consolas" w:cs="Consolas"/>
+                <w:sz w:val="17"/>
+                <w:szCs w:val="17"/>
+              </w:rPr>
+              <w:t xml:space="preserve">  })</w:t>
+            </w:r>
+          </w:p>
+          <w:p>
+            <w:r>
+              <w:rPr>
+                <w:rFonts w:ascii="Consolas" w:eastAsia="Consolas" w:hAnsi="Consolas" w:cs="Consolas"/>
+                <w:sz w:val="17"/>
+                <w:szCs w:val="17"/>
+              </w:rPr>
+              <w:t xml:space="preserve">  return { code: result.getObfuscatedCode(), map: null }</w:t>
+            </w:r>
+          </w:p>
+          <w:p>
+            <w:r>
+              <w:rPr>
+                <w:rFonts w:ascii="Consolas" w:eastAsia="Consolas" w:hAnsi="Consolas" w:cs="Consolas"/>
+                <w:sz w:val="17"/>
+                <w:szCs w:val="17"/>
+              </w:rPr>
+              <w:t>}</w:t>
+            </w:r>
+          </w:p>
+        </w:tc>
+      </w:tr>
+    </w:tbl>
+    <w:p>
+      <w:pPr>
+        <w:spacing w:before="80" w:after="160" w:line="300" w:lineRule="auto"/>
+      </w:pPr>
+      <w:r>
+        <w:rPr>
+          <w:b/>
+          <w:bCs/>
+        </w:rPr>
+        <w:t xml:space="preserve">Por qué se usó: </w:t>
+      </w:r>
+      <w:r>
+        <w:t>el código de una aplicación web se descarga al navegador, así que cualquiera puede leerlo. La ofuscación se aplica al paquete final de producción para dificultar copiarlo o estudiar su lógica, sin cambiar lo que hace. En desarrollo se trabaja con el código normal (npm run build:plain).</w:t>
+      </w:r>
+    </w:p>
+    <w:p>
+      <w:pPr>
+        <w:pStyle w:val="Ttulo2"/>
+        <w:keepNext/>
+      </w:pPr>
+      <w:bookmarkStart w:id="18" w:name="_Toc243984944"/>
+      <w:r>
+        <w:t>8.5 EXTRA: Vista del programador</w:t>
+      </w:r>
+      <w:bookmarkEnd w:id="18"/>
+    </w:p>
+    <w:p>
+      <w:pPr>
+        <w:spacing w:after="120" w:line="300" w:lineRule="auto"/>
+      </w:pPr>
+      <w:r>
+        <w:t>El rol Programador tiene una pantalla de diagnóstico (/programador) que muestra, sin entrar al servidor: estado de la aplicación, la base de datos y la caché; versión y configuración (vida del token, rate limits, CORS); latencias p50/p95/p99 calculadas del log JSON; rutas más lentas; últimas peticiones; errores buscables por código de incidente, el mismo que ve el usuario en la pantalla 500; y la lista de todas las rutas de la API con su rol de acceso. No muestra contraseñas ni claves, y una prueba automáti</w:t>
+      </w:r>
+      <w:r>
+        <w:t>ca lo verifica.</w:t>
       </w:r>
     </w:p>
     <w:p>
@@ -11870,8 +12615,8 @@
           <w:noProof/>
         </w:rPr>
         <w:drawing>
-          <wp:inline distT="0" distB="0" distL="0" distR="0" wp14:anchorId="721E9FA7" wp14:editId="1BDFC05B">
-            <wp:extent cx="5400675" cy="3638550"/>
+          <wp:inline distT="0" distB="0" distL="0" distR="0" wp14:anchorId="6971872D" wp14:editId="435BC19C">
+            <wp:extent cx="5400675" cy="3371850"/>
             <wp:effectExtent l="0" t="0" r="0" b="0"/>
             <wp:docPr id="13" name="Imagen 13"/>
             <wp:cNvGraphicFramePr>
@@ -11896,7 +12641,7 @@
                   <pic:spPr bwMode="auto">
                     <a:xfrm>
                       <a:off x="0" y="0"/>
-                      <a:ext cx="5400675" cy="3638550"/>
+                      <a:ext cx="5400675" cy="3371850"/>
                     </a:xfrm>
                     <a:prstGeom prst="rect">
                       <a:avLst/>
@@ -11921,32 +12666,106 @@
           <w:sz w:val="20"/>
           <w:szCs w:val="20"/>
         </w:rPr>
-        <w:t>Figura 11. Evolución de la latencia segundo a segundo en la corrida de 50 usuarios.</w:t>
+        <w:t>Figura 11. Vista del programador.</w:t>
       </w:r>
     </w:p>
     <w:p>
       <w:pPr>
+        <w:pStyle w:val="Ttulo2"/>
         <w:keepNext/>
-        <w:spacing w:before="120" w:after="60"/>
       </w:pPr>
-      <w:r>
-        <w:rPr>
-          <w:b/>
-          <w:bCs/>
-          <w:sz w:val="21"/>
-          <w:szCs w:val="21"/>
-        </w:rPr>
+      <w:bookmarkStart w:id="19" w:name="_Toc243984945"/>
+      <w:r>
+        <w:t>8.6 EXTRA: Seguridad y calidad adelantadas</w:t>
+      </w:r>
+      <w:bookmarkEnd w:id="19"/>
+    </w:p>
+    <w:p>
+      <w:pPr>
+        <w:pStyle w:val="Prrafodelista"/>
+        <w:numPr>
+          <w:ilvl w:val="0"/>
+          <w:numId w:val="2"/>
+        </w:numPr>
+        <w:spacing w:after="60" w:line="288" w:lineRule="auto"/>
+      </w:pPr>
+      <w:r>
+        <w:t>Rate limits: login 5/min, registro 3/min y API 60/min, con respuesta 429 y Retry-After (punto del 80%).</w:t>
+      </w:r>
+    </w:p>
+    <w:p>
+      <w:pPr>
+        <w:pStyle w:val="Prrafodelista"/>
+        <w:numPr>
+          <w:ilvl w:val="0"/>
+          <w:numId w:val="2"/>
+        </w:numPr>
+        <w:spacing w:after="60" w:line="288" w:lineRule="auto"/>
+      </w:pPr>
+      <w:r>
         <w:lastRenderedPageBreak/>
-        <w:t xml:space="preserve">Fragmento 9. </w:t>
-      </w:r>
-      <w:r>
-        <w:rPr>
-          <w:i/>
-          <w:iCs/>
-          <w:sz w:val="21"/>
-          <w:szCs w:val="21"/>
-        </w:rPr>
-        <w:t>tests/k6/reservas.js (extracto)</w:t>
+        <w:t>Roles y permisos: el rol se valida antes de buscar el registro, así una ruta pedida a mano responde 403 sin revelar si el id existe.</w:t>
+      </w:r>
+    </w:p>
+    <w:p>
+      <w:pPr>
+        <w:pStyle w:val="Prrafodelista"/>
+        <w:numPr>
+          <w:ilvl w:val="0"/>
+          <w:numId w:val="2"/>
+        </w:numPr>
+        <w:spacing w:after="60" w:line="288" w:lineRule="auto"/>
+      </w:pPr>
+      <w:r>
+        <w:t>Pantallas de error en React: 404, «En construcción», 403, sesión expirada, 500 con código de incidente, 503 con reintento cada 30 s, sin conexión y 429 con cuenta regresiva.</w:t>
+      </w:r>
+    </w:p>
+    <w:p>
+      <w:pPr>
+        <w:pStyle w:val="Prrafodelista"/>
+        <w:numPr>
+          <w:ilvl w:val="0"/>
+          <w:numId w:val="2"/>
+        </w:numPr>
+        <w:spacing w:after="60" w:line="288" w:lineRule="auto"/>
+      </w:pPr>
+      <w:r>
+        <w:t>CI/CD en GitHub Actions: estilo (Pint), análisis (PHPStan), pruebas (Pest y Vitest), auditoría de dependencias y Semgrep en cada cambio. Auditoría actual: 0 vulnerabilidades en composer y npm y 0 hallazgos en Semgrep.</w:t>
+      </w:r>
+    </w:p>
+    <w:p>
+      <w:pPr>
+        <w:pStyle w:val="Prrafodelista"/>
+        <w:numPr>
+          <w:ilvl w:val="0"/>
+          <w:numId w:val="2"/>
+        </w:numPr>
+        <w:spacing w:after="60" w:line="288" w:lineRule="auto"/>
+      </w:pPr>
+      <w:r>
+        <w:t>Logs estructurados en JSON (una línea por petición con request_id, ruta, código y duración), listos para CloudWatch.</w:t>
+      </w:r>
+    </w:p>
+    <w:p>
+      <w:pPr>
+        <w:pStyle w:val="Ttulo2"/>
+        <w:keepNext/>
+      </w:pPr>
+      <w:bookmarkStart w:id="20" w:name="_Toc243984946"/>
+      <w:r>
+        <w:t>8.7 EXTRA: Diseño de la aplicación móvil (Android e iOS)</w:t>
+      </w:r>
+      <w:bookmarkEnd w:id="20"/>
+    </w:p>
+    <w:p>
+      <w:pPr>
+        <w:spacing w:after="120" w:line="300" w:lineRule="auto"/>
+      </w:pPr>
+      <w:r>
+        <w:t>LeGrandHotel tendrá también una aplicación para teléfonos Android e iOS. En esta entrega se presenta su diseño: la tecnología, la arquitectura, las pantallas y el plan de construcción. El código de la app se desarrolla en las entregas del 80% y del 100%. Como la web, es una herramienta interna: solo la usa el personal del hotel, no tiene registro y ningún huésped ni persona externa puede entrar. No reemplaza a la web: cubre las tareas que conviene hacer en movimiento y usa la misma API, sin duplicar la lógi</w:t>
+      </w:r>
+      <w:r>
+        <w:t>ca del negocio.</w:t>
       </w:r>
     </w:p>
     <w:tbl>
@@ -11963,137 +12782,238 @@
         <w:tblLook w:val="04A0" w:firstRow="1" w:lastRow="0" w:firstColumn="1" w:lastColumn="0" w:noHBand="0" w:noVBand="1"/>
       </w:tblPr>
       <w:tblGrid>
-        <w:gridCol w:w="9070"/>
+        <w:gridCol w:w="1972"/>
+        <w:gridCol w:w="7098"/>
       </w:tblGrid>
       <w:tr>
         <w:trPr>
-          <w:cantSplit/>
+          <w:tblHeader/>
         </w:trPr>
         <w:tc>
           <w:tcPr>
-            <w:tcW w:w="9070" w:type="dxa"/>
-            <w:tcBorders>
-              <w:top w:val="single" w:sz="4" w:space="0" w:color="000000"/>
-              <w:left w:val="single" w:sz="4" w:space="0" w:color="000000"/>
-              <w:bottom w:val="single" w:sz="4" w:space="0" w:color="000000"/>
-              <w:right w:val="single" w:sz="4" w:space="0" w:color="000000"/>
-            </w:tcBorders>
-            <w:shd w:val="clear" w:color="auto" w:fill="F2F2F2"/>
-            <w:tcMar>
-              <w:top w:w="80" w:type="dxa"/>
-              <w:left w:w="140" w:type="dxa"/>
-              <w:bottom w:w="80" w:type="dxa"/>
-              <w:right w:w="140" w:type="dxa"/>
-            </w:tcMar>
-          </w:tcPr>
-          <w:p>
-            <w:r>
-              <w:rPr>
-                <w:rFonts w:ascii="Consolas" w:eastAsia="Consolas" w:hAnsi="Consolas" w:cs="Consolas"/>
-                <w:sz w:val="17"/>
-                <w:szCs w:val="17"/>
-              </w:rPr>
-              <w:t>escalon: {</w:t>
-            </w:r>
-          </w:p>
-          <w:p>
-            <w:r>
-              <w:rPr>
-                <w:rFonts w:ascii="Consolas" w:eastAsia="Consolas" w:hAnsi="Consolas" w:cs="Consolas"/>
-                <w:sz w:val="17"/>
-                <w:szCs w:val="17"/>
-              </w:rPr>
-              <w:t xml:space="preserve">  stages: [</w:t>
-            </w:r>
-          </w:p>
-          <w:p>
-            <w:r>
-              <w:rPr>
-                <w:rFonts w:ascii="Consolas" w:eastAsia="Consolas" w:hAnsi="Consolas" w:cs="Consolas"/>
-                <w:sz w:val="17"/>
-                <w:szCs w:val="17"/>
-              </w:rPr>
-              <w:t xml:space="preserve">    { duration: '10s', target: VUS },   // sube hasta VUS usuarios</w:t>
-            </w:r>
-          </w:p>
-          <w:p>
-            <w:r>
-              <w:rPr>
-                <w:rFonts w:ascii="Consolas" w:eastAsia="Consolas" w:hAnsi="Consolas" w:cs="Consolas"/>
-                <w:sz w:val="17"/>
-                <w:szCs w:val="17"/>
-              </w:rPr>
-              <w:t xml:space="preserve">    { duration: '45s', target: VUS },   // mantiene la carga</w:t>
-            </w:r>
-          </w:p>
-          <w:p>
-            <w:r>
-              <w:rPr>
-                <w:rFonts w:ascii="Consolas" w:eastAsia="Consolas" w:hAnsi="Consolas" w:cs="Consolas"/>
-                <w:sz w:val="17"/>
-                <w:szCs w:val="17"/>
-              </w:rPr>
-              <w:t xml:space="preserve">    { duration: '5s',  target: 0 },     // baja</w:t>
-            </w:r>
-          </w:p>
-          <w:p>
-            <w:r>
-              <w:rPr>
-                <w:rFonts w:ascii="Consolas" w:eastAsia="Consolas" w:hAnsi="Consolas" w:cs="Consolas"/>
-                <w:sz w:val="17"/>
-                <w:szCs w:val="17"/>
-              </w:rPr>
-              <w:t xml:space="preserve">  ],</w:t>
-            </w:r>
-          </w:p>
-          <w:p>
-            <w:r>
-              <w:rPr>
-                <w:rFonts w:ascii="Consolas" w:eastAsia="Consolas" w:hAnsi="Consolas" w:cs="Consolas"/>
-                <w:sz w:val="17"/>
-                <w:szCs w:val="17"/>
-              </w:rPr>
-              <w:t xml:space="preserve">  thresholds: {</w:t>
-            </w:r>
-          </w:p>
-          <w:p>
-            <w:r>
-              <w:rPr>
-                <w:rFonts w:ascii="Consolas" w:eastAsia="Consolas" w:hAnsi="Consolas" w:cs="Consolas"/>
-                <w:sz w:val="17"/>
-                <w:szCs w:val="17"/>
-              </w:rPr>
-              <w:t xml:space="preserve">    http_req_duration: ['p(95)&lt;500'],   // meta: p95 menor a 500 ms</w:t>
-            </w:r>
-          </w:p>
-          <w:p>
-            <w:r>
-              <w:rPr>
-                <w:rFonts w:ascii="Consolas" w:eastAsia="Consolas" w:hAnsi="Consolas" w:cs="Consolas"/>
-                <w:sz w:val="17"/>
-                <w:szCs w:val="17"/>
-              </w:rPr>
-              <w:t xml:space="preserve">    http_req_failed: ['rate&lt;0.01'],     // menos de 1% de errores</w:t>
-            </w:r>
-          </w:p>
-          <w:p>
-            <w:r>
-              <w:rPr>
-                <w:rFonts w:ascii="Consolas" w:eastAsia="Consolas" w:hAnsi="Consolas" w:cs="Consolas"/>
-                <w:sz w:val="17"/>
-                <w:szCs w:val="17"/>
-              </w:rPr>
-              <w:t xml:space="preserve">  },</w:t>
-            </w:r>
-          </w:p>
-          <w:p>
-            <w:r>
-              <w:rPr>
-                <w:rFonts w:ascii="Consolas" w:eastAsia="Consolas" w:hAnsi="Consolas" w:cs="Consolas"/>
-                <w:sz w:val="17"/>
-                <w:szCs w:val="17"/>
-              </w:rPr>
-              <w:t>},</w:t>
+            <w:tcW w:w="1972" w:type="dxa"/>
+            <w:tcBorders>
+              <w:top w:val="single" w:sz="4" w:space="0" w:color="000000"/>
+              <w:left w:val="single" w:sz="4" w:space="0" w:color="000000"/>
+              <w:bottom w:val="single" w:sz="4" w:space="0" w:color="000000"/>
+              <w:right w:val="single" w:sz="4" w:space="0" w:color="000000"/>
+            </w:tcBorders>
+            <w:shd w:val="clear" w:color="auto" w:fill="D9D9D9"/>
+            <w:tcMar>
+              <w:top w:w="60" w:type="dxa"/>
+              <w:left w:w="90" w:type="dxa"/>
+              <w:bottom w:w="60" w:type="dxa"/>
+              <w:right w:w="90" w:type="dxa"/>
+            </w:tcMar>
+            <w:vAlign w:val="center"/>
+          </w:tcPr>
+          <w:p>
+            <w:r>
+              <w:rPr>
+                <w:b/>
+                <w:bCs/>
+                <w:sz w:val="20"/>
+                <w:szCs w:val="20"/>
+              </w:rPr>
+              <w:t>Rol del personal</w:t>
+            </w:r>
+          </w:p>
+        </w:tc>
+        <w:tc>
+          <w:tcPr>
+            <w:tcW w:w="7098" w:type="dxa"/>
+            <w:tcBorders>
+              <w:top w:val="single" w:sz="4" w:space="0" w:color="000000"/>
+              <w:left w:val="single" w:sz="4" w:space="0" w:color="000000"/>
+              <w:bottom w:val="single" w:sz="4" w:space="0" w:color="000000"/>
+              <w:right w:val="single" w:sz="4" w:space="0" w:color="000000"/>
+            </w:tcBorders>
+            <w:shd w:val="clear" w:color="auto" w:fill="D9D9D9"/>
+            <w:tcMar>
+              <w:top w:w="60" w:type="dxa"/>
+              <w:left w:w="90" w:type="dxa"/>
+              <w:bottom w:w="60" w:type="dxa"/>
+              <w:right w:w="90" w:type="dxa"/>
+            </w:tcMar>
+            <w:vAlign w:val="center"/>
+          </w:tcPr>
+          <w:p>
+            <w:r>
+              <w:rPr>
+                <w:b/>
+                <w:bCs/>
+                <w:sz w:val="20"/>
+                <w:szCs w:val="20"/>
+              </w:rPr>
+              <w:t>Para qué usará la app</w:t>
+            </w:r>
+          </w:p>
+        </w:tc>
+      </w:tr>
+      <w:tr>
+        <w:tc>
+          <w:tcPr>
+            <w:tcW w:w="1972" w:type="dxa"/>
+            <w:tcBorders>
+              <w:top w:val="single" w:sz="4" w:space="0" w:color="000000"/>
+              <w:left w:val="single" w:sz="4" w:space="0" w:color="000000"/>
+              <w:bottom w:val="single" w:sz="4" w:space="0" w:color="000000"/>
+              <w:right w:val="single" w:sz="4" w:space="0" w:color="000000"/>
+            </w:tcBorders>
+            <w:tcMar>
+              <w:top w:w="60" w:type="dxa"/>
+              <w:left w:w="90" w:type="dxa"/>
+              <w:bottom w:w="60" w:type="dxa"/>
+              <w:right w:w="90" w:type="dxa"/>
+            </w:tcMar>
+            <w:vAlign w:val="center"/>
+          </w:tcPr>
+          <w:p>
+            <w:r>
+              <w:rPr>
+                <w:sz w:val="20"/>
+                <w:szCs w:val="20"/>
+              </w:rPr>
+              <w:t>Recepcionista</w:t>
+            </w:r>
+          </w:p>
+        </w:tc>
+        <w:tc>
+          <w:tcPr>
+            <w:tcW w:w="7098" w:type="dxa"/>
+            <w:tcBorders>
+              <w:top w:val="single" w:sz="4" w:space="0" w:color="000000"/>
+              <w:left w:val="single" w:sz="4" w:space="0" w:color="000000"/>
+              <w:bottom w:val="single" w:sz="4" w:space="0" w:color="000000"/>
+              <w:right w:val="single" w:sz="4" w:space="0" w:color="000000"/>
+            </w:tcBorders>
+            <w:tcMar>
+              <w:top w:w="60" w:type="dxa"/>
+              <w:left w:w="90" w:type="dxa"/>
+              <w:bottom w:w="60" w:type="dxa"/>
+              <w:right w:w="90" w:type="dxa"/>
+            </w:tcMar>
+            <w:vAlign w:val="center"/>
+          </w:tcPr>
+          <w:p>
+            <w:r>
+              <w:rPr>
+                <w:sz w:val="20"/>
+                <w:szCs w:val="20"/>
+              </w:rPr>
+              <w:t>Ver llegadas y salidas del día, hacer check-in y check-out desde el lobby, registrar la reserva de un huésped que llega o llama, cambiar el estado de una habitación, registrar placas en la cochera</w:t>
+            </w:r>
+          </w:p>
+        </w:tc>
+      </w:tr>
+      <w:tr>
+        <w:tc>
+          <w:tcPr>
+            <w:tcW w:w="1972" w:type="dxa"/>
+            <w:tcBorders>
+              <w:top w:val="single" w:sz="4" w:space="0" w:color="000000"/>
+              <w:left w:val="single" w:sz="4" w:space="0" w:color="000000"/>
+              <w:bottom w:val="single" w:sz="4" w:space="0" w:color="000000"/>
+              <w:right w:val="single" w:sz="4" w:space="0" w:color="000000"/>
+            </w:tcBorders>
+            <w:tcMar>
+              <w:top w:w="60" w:type="dxa"/>
+              <w:left w:w="90" w:type="dxa"/>
+              <w:bottom w:w="60" w:type="dxa"/>
+              <w:right w:w="90" w:type="dxa"/>
+            </w:tcMar>
+            <w:vAlign w:val="center"/>
+          </w:tcPr>
+          <w:p>
+            <w:r>
+              <w:rPr>
+                <w:sz w:val="20"/>
+                <w:szCs w:val="20"/>
+              </w:rPr>
+              <w:t>Almacenero</w:t>
+            </w:r>
+          </w:p>
+        </w:tc>
+        <w:tc>
+          <w:tcPr>
+            <w:tcW w:w="7098" w:type="dxa"/>
+            <w:tcBorders>
+              <w:top w:val="single" w:sz="4" w:space="0" w:color="000000"/>
+              <w:left w:val="single" w:sz="4" w:space="0" w:color="000000"/>
+              <w:bottom w:val="single" w:sz="4" w:space="0" w:color="000000"/>
+              <w:right w:val="single" w:sz="4" w:space="0" w:color="000000"/>
+            </w:tcBorders>
+            <w:tcMar>
+              <w:top w:w="60" w:type="dxa"/>
+              <w:left w:w="90" w:type="dxa"/>
+              <w:bottom w:w="60" w:type="dxa"/>
+              <w:right w:w="90" w:type="dxa"/>
+            </w:tcMar>
+            <w:vAlign w:val="center"/>
+          </w:tcPr>
+          <w:p>
+            <w:r>
+              <w:rPr>
+                <w:sz w:val="20"/>
+                <w:szCs w:val="20"/>
+              </w:rPr>
+              <w:t>Registrar entradas y salidas de inventario en el almacén y ver los insumos bajo el mínimo</w:t>
+            </w:r>
+          </w:p>
+        </w:tc>
+      </w:tr>
+      <w:tr>
+        <w:tc>
+          <w:tcPr>
+            <w:tcW w:w="1972" w:type="dxa"/>
+            <w:tcBorders>
+              <w:top w:val="single" w:sz="4" w:space="0" w:color="000000"/>
+              <w:left w:val="single" w:sz="4" w:space="0" w:color="000000"/>
+              <w:bottom w:val="single" w:sz="4" w:space="0" w:color="000000"/>
+              <w:right w:val="single" w:sz="4" w:space="0" w:color="000000"/>
+            </w:tcBorders>
+            <w:tcMar>
+              <w:top w:w="60" w:type="dxa"/>
+              <w:left w:w="90" w:type="dxa"/>
+              <w:bottom w:w="60" w:type="dxa"/>
+              <w:right w:w="90" w:type="dxa"/>
+            </w:tcMar>
+            <w:vAlign w:val="center"/>
+          </w:tcPr>
+          <w:p>
+            <w:r>
+              <w:rPr>
+                <w:sz w:val="20"/>
+                <w:szCs w:val="20"/>
+              </w:rPr>
+              <w:t>Administrador</w:t>
+            </w:r>
+          </w:p>
+        </w:tc>
+        <w:tc>
+          <w:tcPr>
+            <w:tcW w:w="7098" w:type="dxa"/>
+            <w:tcBorders>
+              <w:top w:val="single" w:sz="4" w:space="0" w:color="000000"/>
+              <w:left w:val="single" w:sz="4" w:space="0" w:color="000000"/>
+              <w:bottom w:val="single" w:sz="4" w:space="0" w:color="000000"/>
+              <w:right w:val="single" w:sz="4" w:space="0" w:color="000000"/>
+            </w:tcBorders>
+            <w:tcMar>
+              <w:top w:w="60" w:type="dxa"/>
+              <w:left w:w="90" w:type="dxa"/>
+              <w:bottom w:w="60" w:type="dxa"/>
+              <w:right w:w="90" w:type="dxa"/>
+            </w:tcMar>
+            <w:vAlign w:val="center"/>
+          </w:tcPr>
+          <w:p>
+            <w:r>
+              <w:rPr>
+                <w:sz w:val="20"/>
+                <w:szCs w:val="20"/>
+              </w:rPr>
+              <w:t>Ver el panel resumido (ocupación, ingresos, alertas). La gestión completa sigue en la web</w:t>
             </w:r>
           </w:p>
         </w:tc>
@@ -12101,120 +13021,22 @@
     </w:tbl>
     <w:p>
       <w:pPr>
-        <w:spacing w:before="80" w:after="160" w:line="300" w:lineRule="auto"/>
+        <w:spacing w:after="80"/>
       </w:pPr>
-      <w:r>
-        <w:rPr>
-          <w:b/>
-          <w:bCs/>
-        </w:rPr>
-        <w:t xml:space="preserve">Por qué se usó: </w:t>
-      </w:r>
-      <w:r>
-        <w:t>el mismo script se corre con distinta cantidad de usuarios (VUS) para comparar corridas entre sí. Los thresholds convierten la meta del plan (p95 menor a 500 ms y menos de 1% de errores) en una regla: si no se cumple, k6 marca la prueba como fallida sin interpretar los números a mano.</w:t>
-      </w:r>
-    </w:p>
-    <w:p>
-      <w:pPr>
-        <w:pStyle w:val="Ttulo2"/>
-        <w:keepNext/>
-      </w:pPr>
-      <w:bookmarkStart w:id="16" w:name="_Toc243984522"/>
-      <w:r>
-        <w:t>8.3 Análisis y cuello de botella encontrado</w:t>
-      </w:r>
-      <w:bookmarkEnd w:id="16"/>
-    </w:p>
-    <w:p>
-      <w:pPr>
-        <w:pStyle w:val="Prrafodelista"/>
-        <w:numPr>
-          <w:ilvl w:val="0"/>
-          <w:numId w:val="2"/>
-        </w:numPr>
-        <w:spacing w:after="60" w:line="288" w:lineRule="auto"/>
-      </w:pPr>
-      <w:r>
-        <w:t>Con 5 usuarios el p95 fue 528 ms; con 50 usuarios llegó a 7,885 ms. Las peticiones por segundo apenas suben (4.4 → 5.3): el servidor ya estaba al máximo de lo que puede atender.</w:t>
-      </w:r>
-    </w:p>
-    <w:p>
-      <w:pPr>
-        <w:pStyle w:val="Prrafodelista"/>
-        <w:numPr>
-          <w:ilvl w:val="0"/>
-          <w:numId w:val="2"/>
-        </w:numPr>
-        <w:spacing w:after="60" w:line="288" w:lineRule="auto"/>
-      </w:pPr>
-      <w:r>
-        <w:t>Causa: el servidor integrado de PHP en Windows procesa una petición a la vez. Cuando llegan más usuarios, las peticiones esperan en cola y el tiempo de respuesta crece de forma casi lineal, aunque el código de cada endpoint sea rápido (en la prueba masiva de Pest, el listado de 5000 reservas responde en menos de 500 ms).</w:t>
-      </w:r>
-    </w:p>
-    <w:p>
-      <w:pPr>
-        <w:pStyle w:val="Prrafodelista"/>
-        <w:numPr>
-          <w:ilvl w:val="0"/>
-          <w:numId w:val="2"/>
-        </w:numPr>
-        <w:spacing w:after="60" w:line="288" w:lineRule="auto"/>
-      </w:pPr>
-      <w:r>
-        <w:t>Con 50 VU, lecturas, login y creación de reservas tienen casi el mismo p95 (7,890, 7,905 y 7,820 ms). El tiempo lo domina la espera en la cola del servidor, no el trabajo de cada endpoint.</w:t>
-      </w:r>
-    </w:p>
-    <w:p>
-      <w:pPr>
-        <w:pStyle w:val="Prrafodelista"/>
-        <w:numPr>
-          <w:ilvl w:val="0"/>
-          <w:numId w:val="2"/>
-        </w:numPr>
-        <w:spacing w:after="60" w:line="288" w:lineRule="auto"/>
-      </w:pPr>
-      <w:r>
-        <w:t>A pesar de la saturación no hubo errores (0% en todas las corridas): la API responde más lento, pero no se cae ni pierde peticiones.</w:t>
-      </w:r>
-    </w:p>
-    <w:p>
-      <w:pPr>
-        <w:pStyle w:val="Prrafodelista"/>
-        <w:numPr>
-          <w:ilvl w:val="0"/>
-          <w:numId w:val="2"/>
-        </w:numPr>
-        <w:spacing w:after="60" w:line="288" w:lineRule="auto"/>
-      </w:pPr>
-      <w:r>
-        <w:t>Corrección prevista para el 80%: Docker con Nginx + PHP-FPM (20 procesos), OPcache, MySQL en RDS y Redis para caché y rate limit. Las mismas corridas se repetirán en AWS con 50–100 y luego 1000–5000 usuarios, para comparar el antes y el después.</w:t>
-      </w:r>
     </w:p>
     <w:p>
       <w:pPr>
         <w:spacing w:after="120" w:line="300" w:lineRule="auto"/>
       </w:pPr>
       <w:r>
-        <w:t>Los reportes HTML interactivos de cada corrida (generados por k6) están en docs/pruebas/local-*.html y los datos crudos en docs/pruebas/datos/.</w:t>
-      </w:r>
-    </w:p>
-    <w:p>
-      <w:pPr>
-        <w:pStyle w:val="Ttulo2"/>
-        <w:keepNext/>
-      </w:pPr>
-      <w:bookmarkStart w:id="17" w:name="_Toc243984523"/>
-      <w:r>
-        <w:t>8.4 EXTRA: Cifrado (ofuscación) del código</w:t>
-      </w:r>
-      <w:bookmarkEnd w:id="17"/>
-    </w:p>
-    <w:p>
-      <w:pPr>
-        <w:spacing w:after="120" w:line="300" w:lineRule="auto"/>
-      </w:pPr>
-      <w:r>
-        <w:t>El build de producción del frontend sale ofuscado con javascript-obfuscator: los nombres se reemplazan por identificadores hexadecimales y los textos se guardan codificados en base64. Comparación del mismo texto de la interfaz («No tienes acceso»):</w:t>
+        <w:rPr>
+          <w:b/>
+          <w:bCs/>
+        </w:rPr>
+        <w:t xml:space="preserve">Tecnología elegida: </w:t>
+      </w:r>
+      <w:r>
+        <w:t>React Native con Expo y TypeScript. Con un solo código se generan las dos aplicaciones y se reutiliza lo que el equipo ya usa en la web: React, TypeScript, TanStack Query, Axios y los mismos tipos de datos.</w:t>
       </w:r>
     </w:p>
     <w:tbl>
@@ -12231,9 +13053,10 @@
         <w:tblLook w:val="04A0" w:firstRow="1" w:lastRow="0" w:firstColumn="1" w:lastColumn="0" w:noHBand="0" w:noVBand="1"/>
       </w:tblPr>
       <w:tblGrid>
-        <w:gridCol w:w="2474"/>
-        <w:gridCol w:w="3298"/>
-        <w:gridCol w:w="3298"/>
+        <w:gridCol w:w="1977"/>
+        <w:gridCol w:w="3037"/>
+        <w:gridCol w:w="2742"/>
+        <w:gridCol w:w="1314"/>
       </w:tblGrid>
       <w:tr>
         <w:trPr>
@@ -12241,7 +13064,7 @@
         </w:trPr>
         <w:tc>
           <w:tcPr>
-            <w:tcW w:w="2474" w:type="dxa"/>
+            <w:tcW w:w="1998" w:type="dxa"/>
             <w:tcBorders>
               <w:top w:val="single" w:sz="4" w:space="0" w:color="000000"/>
               <w:left w:val="single" w:sz="4" w:space="0" w:color="000000"/>
@@ -12265,13 +13088,13 @@
                 <w:sz w:val="20"/>
                 <w:szCs w:val="20"/>
               </w:rPr>
-              <w:t>Build</w:t>
-            </w:r>
-          </w:p>
-        </w:tc>
-        <w:tc>
-          <w:tcPr>
-            <w:tcW w:w="3298" w:type="dxa"/>
+              <w:t>Opción</w:t>
+            </w:r>
+          </w:p>
+        </w:tc>
+        <w:tc>
+          <w:tcPr>
+            <w:tcW w:w="3075" w:type="dxa"/>
             <w:tcBorders>
               <w:top w:val="single" w:sz="4" w:space="0" w:color="000000"/>
               <w:left w:val="single" w:sz="4" w:space="0" w:color="000000"/>
@@ -12295,13 +13118,13 @@
                 <w:sz w:val="20"/>
                 <w:szCs w:val="20"/>
               </w:rPr>
-              <w:t>Comando</w:t>
-            </w:r>
-          </w:p>
-        </w:tc>
-        <w:tc>
-          <w:tcPr>
-            <w:tcW w:w="3298" w:type="dxa"/>
+              <w:t>A favor</w:t>
+            </w:r>
+          </w:p>
+        </w:tc>
+        <w:tc>
+          <w:tcPr>
+            <w:tcW w:w="2767" w:type="dxa"/>
             <w:tcBorders>
               <w:top w:val="single" w:sz="4" w:space="0" w:color="000000"/>
               <w:left w:val="single" w:sz="4" w:space="0" w:color="000000"/>
@@ -12325,7 +13148,37 @@
                 <w:sz w:val="20"/>
                 <w:szCs w:val="20"/>
               </w:rPr>
-              <w:t>Veces que aparece legible</w:t>
+              <w:t>En contra</w:t>
+            </w:r>
+          </w:p>
+        </w:tc>
+        <w:tc>
+          <w:tcPr>
+            <w:tcW w:w="1230" w:type="dxa"/>
+            <w:tcBorders>
+              <w:top w:val="single" w:sz="4" w:space="0" w:color="000000"/>
+              <w:left w:val="single" w:sz="4" w:space="0" w:color="000000"/>
+              <w:bottom w:val="single" w:sz="4" w:space="0" w:color="000000"/>
+              <w:right w:val="single" w:sz="4" w:space="0" w:color="000000"/>
+            </w:tcBorders>
+            <w:shd w:val="clear" w:color="auto" w:fill="D9D9D9"/>
+            <w:tcMar>
+              <w:top w:w="60" w:type="dxa"/>
+              <w:left w:w="90" w:type="dxa"/>
+              <w:bottom w:w="60" w:type="dxa"/>
+              <w:right w:w="90" w:type="dxa"/>
+            </w:tcMar>
+            <w:vAlign w:val="center"/>
+          </w:tcPr>
+          <w:p>
+            <w:r>
+              <w:rPr>
+                <w:b/>
+                <w:bCs/>
+                <w:sz w:val="20"/>
+                <w:szCs w:val="20"/>
+              </w:rPr>
+              <w:t>Decisión</w:t>
             </w:r>
           </w:p>
         </w:tc>
@@ -12333,82 +13186,109 @@
       <w:tr>
         <w:tc>
           <w:tcPr>
-            <w:tcW w:w="2474" w:type="dxa"/>
-            <w:tcBorders>
-              <w:top w:val="single" w:sz="4" w:space="0" w:color="000000"/>
-              <w:left w:val="single" w:sz="4" w:space="0" w:color="000000"/>
-              <w:bottom w:val="single" w:sz="4" w:space="0" w:color="000000"/>
-              <w:right w:val="single" w:sz="4" w:space="0" w:color="000000"/>
-            </w:tcBorders>
-            <w:tcMar>
-              <w:top w:w="60" w:type="dxa"/>
-              <w:left w:w="90" w:type="dxa"/>
-              <w:bottom w:w="60" w:type="dxa"/>
-              <w:right w:w="90" w:type="dxa"/>
-            </w:tcMar>
-            <w:vAlign w:val="center"/>
-          </w:tcPr>
-          <w:p>
-            <w:r>
-              <w:rPr>
-                <w:sz w:val="20"/>
-                <w:szCs w:val="20"/>
-              </w:rPr>
-              <w:t>Normal</w:t>
-            </w:r>
-          </w:p>
-        </w:tc>
-        <w:tc>
-          <w:tcPr>
-            <w:tcW w:w="3298" w:type="dxa"/>
-            <w:tcBorders>
-              <w:top w:val="single" w:sz="4" w:space="0" w:color="000000"/>
-              <w:left w:val="single" w:sz="4" w:space="0" w:color="000000"/>
-              <w:bottom w:val="single" w:sz="4" w:space="0" w:color="000000"/>
-              <w:right w:val="single" w:sz="4" w:space="0" w:color="000000"/>
-            </w:tcBorders>
-            <w:tcMar>
-              <w:top w:w="60" w:type="dxa"/>
-              <w:left w:w="90" w:type="dxa"/>
-              <w:bottom w:w="60" w:type="dxa"/>
-              <w:right w:w="90" w:type="dxa"/>
-            </w:tcMar>
-            <w:vAlign w:val="center"/>
-          </w:tcPr>
-          <w:p>
-            <w:r>
-              <w:rPr>
-                <w:sz w:val="20"/>
-                <w:szCs w:val="20"/>
-              </w:rPr>
-              <w:t>npm run build:plain</w:t>
-            </w:r>
-          </w:p>
-        </w:tc>
-        <w:tc>
-          <w:tcPr>
-            <w:tcW w:w="3298" w:type="dxa"/>
-            <w:tcBorders>
-              <w:top w:val="single" w:sz="4" w:space="0" w:color="000000"/>
-              <w:left w:val="single" w:sz="4" w:space="0" w:color="000000"/>
-              <w:bottom w:val="single" w:sz="4" w:space="0" w:color="000000"/>
-              <w:right w:val="single" w:sz="4" w:space="0" w:color="000000"/>
-            </w:tcBorders>
-            <w:tcMar>
-              <w:top w:w="60" w:type="dxa"/>
-              <w:left w:w="90" w:type="dxa"/>
-              <w:bottom w:w="60" w:type="dxa"/>
-              <w:right w:w="90" w:type="dxa"/>
-            </w:tcMar>
-            <w:vAlign w:val="center"/>
-          </w:tcPr>
-          <w:p>
-            <w:r>
-              <w:rPr>
-                <w:sz w:val="20"/>
-                <w:szCs w:val="20"/>
-              </w:rPr>
-              <w:t>1</w:t>
+            <w:tcW w:w="1998" w:type="dxa"/>
+            <w:tcBorders>
+              <w:top w:val="single" w:sz="4" w:space="0" w:color="000000"/>
+              <w:left w:val="single" w:sz="4" w:space="0" w:color="000000"/>
+              <w:bottom w:val="single" w:sz="4" w:space="0" w:color="000000"/>
+              <w:right w:val="single" w:sz="4" w:space="0" w:color="000000"/>
+            </w:tcBorders>
+            <w:tcMar>
+              <w:top w:w="60" w:type="dxa"/>
+              <w:left w:w="90" w:type="dxa"/>
+              <w:bottom w:w="60" w:type="dxa"/>
+              <w:right w:w="90" w:type="dxa"/>
+            </w:tcMar>
+            <w:vAlign w:val="center"/>
+          </w:tcPr>
+          <w:p>
+            <w:r>
+              <w:rPr>
+                <w:sz w:val="20"/>
+                <w:szCs w:val="20"/>
+              </w:rPr>
+              <w:t>React Native + Expo</w:t>
+            </w:r>
+          </w:p>
+        </w:tc>
+        <w:tc>
+          <w:tcPr>
+            <w:tcW w:w="3075" w:type="dxa"/>
+            <w:tcBorders>
+              <w:top w:val="single" w:sz="4" w:space="0" w:color="000000"/>
+              <w:left w:val="single" w:sz="4" w:space="0" w:color="000000"/>
+              <w:bottom w:val="single" w:sz="4" w:space="0" w:color="000000"/>
+              <w:right w:val="single" w:sz="4" w:space="0" w:color="000000"/>
+            </w:tcBorders>
+            <w:tcMar>
+              <w:top w:w="60" w:type="dxa"/>
+              <w:left w:w="90" w:type="dxa"/>
+              <w:bottom w:w="60" w:type="dxa"/>
+              <w:right w:w="90" w:type="dxa"/>
+            </w:tcMar>
+            <w:vAlign w:val="center"/>
+          </w:tcPr>
+          <w:p>
+            <w:r>
+              <w:rPr>
+                <w:sz w:val="20"/>
+                <w:szCs w:val="20"/>
+              </w:rPr>
+              <w:t>Un código para Android e iOS; mismo lenguaje y librerías que la web; compila iOS en la nube sin Mac (EAS Build)</w:t>
+            </w:r>
+          </w:p>
+        </w:tc>
+        <w:tc>
+          <w:tcPr>
+            <w:tcW w:w="2767" w:type="dxa"/>
+            <w:tcBorders>
+              <w:top w:val="single" w:sz="4" w:space="0" w:color="000000"/>
+              <w:left w:val="single" w:sz="4" w:space="0" w:color="000000"/>
+              <w:bottom w:val="single" w:sz="4" w:space="0" w:color="000000"/>
+              <w:right w:val="single" w:sz="4" w:space="0" w:color="000000"/>
+            </w:tcBorders>
+            <w:tcMar>
+              <w:top w:w="60" w:type="dxa"/>
+              <w:left w:w="90" w:type="dxa"/>
+              <w:bottom w:w="60" w:type="dxa"/>
+              <w:right w:w="90" w:type="dxa"/>
+            </w:tcMar>
+            <w:vAlign w:val="center"/>
+          </w:tcPr>
+          <w:p>
+            <w:r>
+              <w:rPr>
+                <w:sz w:val="20"/>
+                <w:szCs w:val="20"/>
+              </w:rPr>
+              <w:t>Funciones nativas muy específicas requieren módulos propios</w:t>
+            </w:r>
+          </w:p>
+        </w:tc>
+        <w:tc>
+          <w:tcPr>
+            <w:tcW w:w="1230" w:type="dxa"/>
+            <w:tcBorders>
+              <w:top w:val="single" w:sz="4" w:space="0" w:color="000000"/>
+              <w:left w:val="single" w:sz="4" w:space="0" w:color="000000"/>
+              <w:bottom w:val="single" w:sz="4" w:space="0" w:color="000000"/>
+              <w:right w:val="single" w:sz="4" w:space="0" w:color="000000"/>
+            </w:tcBorders>
+            <w:tcMar>
+              <w:top w:w="60" w:type="dxa"/>
+              <w:left w:w="90" w:type="dxa"/>
+              <w:bottom w:w="60" w:type="dxa"/>
+              <w:right w:w="90" w:type="dxa"/>
+            </w:tcMar>
+            <w:vAlign w:val="center"/>
+          </w:tcPr>
+          <w:p>
+            <w:r>
+              <w:rPr>
+                <w:sz w:val="20"/>
+                <w:szCs w:val="20"/>
+              </w:rPr>
+              <w:t>Elegida</w:t>
             </w:r>
           </w:p>
         </w:tc>
@@ -12416,82 +13296,338 @@
       <w:tr>
         <w:tc>
           <w:tcPr>
-            <w:tcW w:w="2474" w:type="dxa"/>
-            <w:tcBorders>
-              <w:top w:val="single" w:sz="4" w:space="0" w:color="000000"/>
-              <w:left w:val="single" w:sz="4" w:space="0" w:color="000000"/>
-              <w:bottom w:val="single" w:sz="4" w:space="0" w:color="000000"/>
-              <w:right w:val="single" w:sz="4" w:space="0" w:color="000000"/>
-            </w:tcBorders>
-            <w:tcMar>
-              <w:top w:w="60" w:type="dxa"/>
-              <w:left w:w="90" w:type="dxa"/>
-              <w:bottom w:w="60" w:type="dxa"/>
-              <w:right w:w="90" w:type="dxa"/>
-            </w:tcMar>
-            <w:vAlign w:val="center"/>
-          </w:tcPr>
-          <w:p>
-            <w:r>
-              <w:rPr>
-                <w:sz w:val="20"/>
-                <w:szCs w:val="20"/>
-              </w:rPr>
-              <w:t>Ofuscado (producción)</w:t>
-            </w:r>
-          </w:p>
-        </w:tc>
-        <w:tc>
-          <w:tcPr>
-            <w:tcW w:w="3298" w:type="dxa"/>
-            <w:tcBorders>
-              <w:top w:val="single" w:sz="4" w:space="0" w:color="000000"/>
-              <w:left w:val="single" w:sz="4" w:space="0" w:color="000000"/>
-              <w:bottom w:val="single" w:sz="4" w:space="0" w:color="000000"/>
-              <w:right w:val="single" w:sz="4" w:space="0" w:color="000000"/>
-            </w:tcBorders>
-            <w:tcMar>
-              <w:top w:w="60" w:type="dxa"/>
-              <w:left w:w="90" w:type="dxa"/>
-              <w:bottom w:w="60" w:type="dxa"/>
-              <w:right w:w="90" w:type="dxa"/>
-            </w:tcMar>
-            <w:vAlign w:val="center"/>
-          </w:tcPr>
-          <w:p>
-            <w:r>
-              <w:rPr>
-                <w:sz w:val="20"/>
-                <w:szCs w:val="20"/>
-              </w:rPr>
-              <w:t>npm run build</w:t>
-            </w:r>
-          </w:p>
-        </w:tc>
-        <w:tc>
-          <w:tcPr>
-            <w:tcW w:w="3298" w:type="dxa"/>
-            <w:tcBorders>
-              <w:top w:val="single" w:sz="4" w:space="0" w:color="000000"/>
-              <w:left w:val="single" w:sz="4" w:space="0" w:color="000000"/>
-              <w:bottom w:val="single" w:sz="4" w:space="0" w:color="000000"/>
-              <w:right w:val="single" w:sz="4" w:space="0" w:color="000000"/>
-            </w:tcBorders>
-            <w:tcMar>
-              <w:top w:w="60" w:type="dxa"/>
-              <w:left w:w="90" w:type="dxa"/>
-              <w:bottom w:w="60" w:type="dxa"/>
-              <w:right w:w="90" w:type="dxa"/>
-            </w:tcMar>
-            <w:vAlign w:val="center"/>
-          </w:tcPr>
-          <w:p>
-            <w:r>
-              <w:rPr>
-                <w:sz w:val="20"/>
-                <w:szCs w:val="20"/>
-              </w:rPr>
-              <w:t>0</w:t>
+            <w:tcW w:w="1998" w:type="dxa"/>
+            <w:tcBorders>
+              <w:top w:val="single" w:sz="4" w:space="0" w:color="000000"/>
+              <w:left w:val="single" w:sz="4" w:space="0" w:color="000000"/>
+              <w:bottom w:val="single" w:sz="4" w:space="0" w:color="000000"/>
+              <w:right w:val="single" w:sz="4" w:space="0" w:color="000000"/>
+            </w:tcBorders>
+            <w:tcMar>
+              <w:top w:w="60" w:type="dxa"/>
+              <w:left w:w="90" w:type="dxa"/>
+              <w:bottom w:w="60" w:type="dxa"/>
+              <w:right w:w="90" w:type="dxa"/>
+            </w:tcMar>
+            <w:vAlign w:val="center"/>
+          </w:tcPr>
+          <w:p>
+            <w:r>
+              <w:rPr>
+                <w:sz w:val="20"/>
+                <w:szCs w:val="20"/>
+              </w:rPr>
+              <w:t>Flutter</w:t>
+            </w:r>
+          </w:p>
+        </w:tc>
+        <w:tc>
+          <w:tcPr>
+            <w:tcW w:w="3075" w:type="dxa"/>
+            <w:tcBorders>
+              <w:top w:val="single" w:sz="4" w:space="0" w:color="000000"/>
+              <w:left w:val="single" w:sz="4" w:space="0" w:color="000000"/>
+              <w:bottom w:val="single" w:sz="4" w:space="0" w:color="000000"/>
+              <w:right w:val="single" w:sz="4" w:space="0" w:color="000000"/>
+            </w:tcBorders>
+            <w:tcMar>
+              <w:top w:w="60" w:type="dxa"/>
+              <w:left w:w="90" w:type="dxa"/>
+              <w:bottom w:w="60" w:type="dxa"/>
+              <w:right w:w="90" w:type="dxa"/>
+            </w:tcMar>
+            <w:vAlign w:val="center"/>
+          </w:tcPr>
+          <w:p>
+            <w:r>
+              <w:rPr>
+                <w:sz w:val="20"/>
+                <w:szCs w:val="20"/>
+              </w:rPr>
+              <w:t>Buen rendimiento y diseño uniforme</w:t>
+            </w:r>
+          </w:p>
+        </w:tc>
+        <w:tc>
+          <w:tcPr>
+            <w:tcW w:w="2767" w:type="dxa"/>
+            <w:tcBorders>
+              <w:top w:val="single" w:sz="4" w:space="0" w:color="000000"/>
+              <w:left w:val="single" w:sz="4" w:space="0" w:color="000000"/>
+              <w:bottom w:val="single" w:sz="4" w:space="0" w:color="000000"/>
+              <w:right w:val="single" w:sz="4" w:space="0" w:color="000000"/>
+            </w:tcBorders>
+            <w:tcMar>
+              <w:top w:w="60" w:type="dxa"/>
+              <w:left w:w="90" w:type="dxa"/>
+              <w:bottom w:w="60" w:type="dxa"/>
+              <w:right w:w="90" w:type="dxa"/>
+            </w:tcMar>
+            <w:vAlign w:val="center"/>
+          </w:tcPr>
+          <w:p>
+            <w:r>
+              <w:rPr>
+                <w:sz w:val="20"/>
+                <w:szCs w:val="20"/>
+              </w:rPr>
+              <w:t>Otro lenguaje (Dart): no se reutiliza nada de la web</w:t>
+            </w:r>
+          </w:p>
+        </w:tc>
+        <w:tc>
+          <w:tcPr>
+            <w:tcW w:w="1230" w:type="dxa"/>
+            <w:tcBorders>
+              <w:top w:val="single" w:sz="4" w:space="0" w:color="000000"/>
+              <w:left w:val="single" w:sz="4" w:space="0" w:color="000000"/>
+              <w:bottom w:val="single" w:sz="4" w:space="0" w:color="000000"/>
+              <w:right w:val="single" w:sz="4" w:space="0" w:color="000000"/>
+            </w:tcBorders>
+            <w:tcMar>
+              <w:top w:w="60" w:type="dxa"/>
+              <w:left w:w="90" w:type="dxa"/>
+              <w:bottom w:w="60" w:type="dxa"/>
+              <w:right w:w="90" w:type="dxa"/>
+            </w:tcMar>
+            <w:vAlign w:val="center"/>
+          </w:tcPr>
+          <w:p>
+            <w:r>
+              <w:rPr>
+                <w:sz w:val="20"/>
+                <w:szCs w:val="20"/>
+              </w:rPr>
+              <w:t>Descartada</w:t>
+            </w:r>
+          </w:p>
+        </w:tc>
+      </w:tr>
+      <w:tr>
+        <w:tc>
+          <w:tcPr>
+            <w:tcW w:w="1998" w:type="dxa"/>
+            <w:tcBorders>
+              <w:top w:val="single" w:sz="4" w:space="0" w:color="000000"/>
+              <w:left w:val="single" w:sz="4" w:space="0" w:color="000000"/>
+              <w:bottom w:val="single" w:sz="4" w:space="0" w:color="000000"/>
+              <w:right w:val="single" w:sz="4" w:space="0" w:color="000000"/>
+            </w:tcBorders>
+            <w:tcMar>
+              <w:top w:w="60" w:type="dxa"/>
+              <w:left w:w="90" w:type="dxa"/>
+              <w:bottom w:w="60" w:type="dxa"/>
+              <w:right w:w="90" w:type="dxa"/>
+            </w:tcMar>
+            <w:vAlign w:val="center"/>
+          </w:tcPr>
+          <w:p>
+            <w:r>
+              <w:rPr>
+                <w:sz w:val="20"/>
+                <w:szCs w:val="20"/>
+              </w:rPr>
+              <w:t>Nativo (Kotlin + Swift)</w:t>
+            </w:r>
+          </w:p>
+        </w:tc>
+        <w:tc>
+          <w:tcPr>
+            <w:tcW w:w="3075" w:type="dxa"/>
+            <w:tcBorders>
+              <w:top w:val="single" w:sz="4" w:space="0" w:color="000000"/>
+              <w:left w:val="single" w:sz="4" w:space="0" w:color="000000"/>
+              <w:bottom w:val="single" w:sz="4" w:space="0" w:color="000000"/>
+              <w:right w:val="single" w:sz="4" w:space="0" w:color="000000"/>
+            </w:tcBorders>
+            <w:tcMar>
+              <w:top w:w="60" w:type="dxa"/>
+              <w:left w:w="90" w:type="dxa"/>
+              <w:bottom w:w="60" w:type="dxa"/>
+              <w:right w:w="90" w:type="dxa"/>
+            </w:tcMar>
+            <w:vAlign w:val="center"/>
+          </w:tcPr>
+          <w:p>
+            <w:r>
+              <w:rPr>
+                <w:sz w:val="20"/>
+                <w:szCs w:val="20"/>
+              </w:rPr>
+              <w:t>Acceso total al sistema</w:t>
+            </w:r>
+          </w:p>
+        </w:tc>
+        <w:tc>
+          <w:tcPr>
+            <w:tcW w:w="2767" w:type="dxa"/>
+            <w:tcBorders>
+              <w:top w:val="single" w:sz="4" w:space="0" w:color="000000"/>
+              <w:left w:val="single" w:sz="4" w:space="0" w:color="000000"/>
+              <w:bottom w:val="single" w:sz="4" w:space="0" w:color="000000"/>
+              <w:right w:val="single" w:sz="4" w:space="0" w:color="000000"/>
+            </w:tcBorders>
+            <w:tcMar>
+              <w:top w:w="60" w:type="dxa"/>
+              <w:left w:w="90" w:type="dxa"/>
+              <w:bottom w:w="60" w:type="dxa"/>
+              <w:right w:w="90" w:type="dxa"/>
+            </w:tcMar>
+            <w:vAlign w:val="center"/>
+          </w:tcPr>
+          <w:p>
+            <w:r>
+              <w:rPr>
+                <w:sz w:val="20"/>
+                <w:szCs w:val="20"/>
+              </w:rPr>
+              <w:t>Dos aplicaciones distintas: el doble de trabajo para 4 personas</w:t>
+            </w:r>
+          </w:p>
+        </w:tc>
+        <w:tc>
+          <w:tcPr>
+            <w:tcW w:w="1230" w:type="dxa"/>
+            <w:tcBorders>
+              <w:top w:val="single" w:sz="4" w:space="0" w:color="000000"/>
+              <w:left w:val="single" w:sz="4" w:space="0" w:color="000000"/>
+              <w:bottom w:val="single" w:sz="4" w:space="0" w:color="000000"/>
+              <w:right w:val="single" w:sz="4" w:space="0" w:color="000000"/>
+            </w:tcBorders>
+            <w:tcMar>
+              <w:top w:w="60" w:type="dxa"/>
+              <w:left w:w="90" w:type="dxa"/>
+              <w:bottom w:w="60" w:type="dxa"/>
+              <w:right w:w="90" w:type="dxa"/>
+            </w:tcMar>
+            <w:vAlign w:val="center"/>
+          </w:tcPr>
+          <w:p>
+            <w:r>
+              <w:rPr>
+                <w:sz w:val="20"/>
+                <w:szCs w:val="20"/>
+              </w:rPr>
+              <w:t>Descartada</w:t>
+            </w:r>
+          </w:p>
+        </w:tc>
+      </w:tr>
+      <w:tr>
+        <w:tc>
+          <w:tcPr>
+            <w:tcW w:w="1998" w:type="dxa"/>
+            <w:tcBorders>
+              <w:top w:val="single" w:sz="4" w:space="0" w:color="000000"/>
+              <w:left w:val="single" w:sz="4" w:space="0" w:color="000000"/>
+              <w:bottom w:val="single" w:sz="4" w:space="0" w:color="000000"/>
+              <w:right w:val="single" w:sz="4" w:space="0" w:color="000000"/>
+            </w:tcBorders>
+            <w:tcMar>
+              <w:top w:w="60" w:type="dxa"/>
+              <w:left w:w="90" w:type="dxa"/>
+              <w:bottom w:w="60" w:type="dxa"/>
+              <w:right w:w="90" w:type="dxa"/>
+            </w:tcMar>
+            <w:vAlign w:val="center"/>
+          </w:tcPr>
+          <w:p>
+            <w:r>
+              <w:rPr>
+                <w:sz w:val="20"/>
+                <w:szCs w:val="20"/>
+              </w:rPr>
+              <w:t>Web instalable (PWA)</w:t>
+            </w:r>
+          </w:p>
+        </w:tc>
+        <w:tc>
+          <w:tcPr>
+            <w:tcW w:w="3075" w:type="dxa"/>
+            <w:tcBorders>
+              <w:top w:val="single" w:sz="4" w:space="0" w:color="000000"/>
+              <w:left w:val="single" w:sz="4" w:space="0" w:color="000000"/>
+              <w:bottom w:val="single" w:sz="4" w:space="0" w:color="000000"/>
+              <w:right w:val="single" w:sz="4" w:space="0" w:color="000000"/>
+            </w:tcBorders>
+            <w:tcMar>
+              <w:top w:w="60" w:type="dxa"/>
+              <w:left w:w="90" w:type="dxa"/>
+              <w:bottom w:w="60" w:type="dxa"/>
+              <w:right w:w="90" w:type="dxa"/>
+            </w:tcMar>
+            <w:vAlign w:val="center"/>
+          </w:tcPr>
+          <w:p>
+            <w:r>
+              <w:rPr>
+                <w:sz w:val="20"/>
+                <w:szCs w:val="20"/>
+              </w:rPr>
+              <w:t>Sin código nuevo</w:t>
+            </w:r>
+          </w:p>
+        </w:tc>
+        <w:tc>
+          <w:tcPr>
+            <w:tcW w:w="2767" w:type="dxa"/>
+            <w:tcBorders>
+              <w:top w:val="single" w:sz="4" w:space="0" w:color="000000"/>
+              <w:left w:val="single" w:sz="4" w:space="0" w:color="000000"/>
+              <w:bottom w:val="single" w:sz="4" w:space="0" w:color="000000"/>
+              <w:right w:val="single" w:sz="4" w:space="0" w:color="000000"/>
+            </w:tcBorders>
+            <w:tcMar>
+              <w:top w:w="60" w:type="dxa"/>
+              <w:left w:w="90" w:type="dxa"/>
+              <w:bottom w:w="60" w:type="dxa"/>
+              <w:right w:w="90" w:type="dxa"/>
+            </w:tcMar>
+            <w:vAlign w:val="center"/>
+          </w:tcPr>
+          <w:p>
+            <w:r>
+              <w:rPr>
+                <w:sz w:val="20"/>
+                <w:szCs w:val="20"/>
+              </w:rPr>
+              <w:t xml:space="preserve">Notificaciones y almacenamiento seguro </w:t>
+            </w:r>
+            <w:r>
+              <w:rPr>
+                <w:sz w:val="20"/>
+                <w:szCs w:val="20"/>
+              </w:rPr>
+              <w:lastRenderedPageBreak/>
+              <w:t>limitados en iOS; no está en las tiendas</w:t>
+            </w:r>
+          </w:p>
+        </w:tc>
+        <w:tc>
+          <w:tcPr>
+            <w:tcW w:w="1230" w:type="dxa"/>
+            <w:tcBorders>
+              <w:top w:val="single" w:sz="4" w:space="0" w:color="000000"/>
+              <w:left w:val="single" w:sz="4" w:space="0" w:color="000000"/>
+              <w:bottom w:val="single" w:sz="4" w:space="0" w:color="000000"/>
+              <w:right w:val="single" w:sz="4" w:space="0" w:color="000000"/>
+            </w:tcBorders>
+            <w:tcMar>
+              <w:top w:w="60" w:type="dxa"/>
+              <w:left w:w="90" w:type="dxa"/>
+              <w:bottom w:w="60" w:type="dxa"/>
+              <w:right w:w="90" w:type="dxa"/>
+            </w:tcMar>
+            <w:vAlign w:val="center"/>
+          </w:tcPr>
+          <w:p>
+            <w:r>
+              <w:rPr>
+                <w:sz w:val="20"/>
+                <w:szCs w:val="20"/>
+              </w:rPr>
+              <w:lastRenderedPageBreak/>
+              <w:t>Complemento</w:t>
             </w:r>
           </w:p>
         </w:tc>
@@ -12504,195 +13640,6 @@
     </w:p>
     <w:p>
       <w:pPr>
-        <w:spacing w:after="120" w:line="300" w:lineRule="auto"/>
-      </w:pPr>
-      <w:r>
-        <w:t>El backend no se publica: corre en un servidor privado sin acceso al código.</w:t>
-      </w:r>
-    </w:p>
-    <w:p>
-      <w:pPr>
-        <w:keepNext/>
-        <w:spacing w:before="120" w:after="60"/>
-      </w:pPr>
-      <w:r>
-        <w:rPr>
-          <w:b/>
-          <w:bCs/>
-          <w:sz w:val="21"/>
-          <w:szCs w:val="21"/>
-        </w:rPr>
-        <w:t xml:space="preserve">Fragmento 10. </w:t>
-      </w:r>
-      <w:r>
-        <w:rPr>
-          <w:i/>
-          <w:iCs/>
-          <w:sz w:val="21"/>
-          <w:szCs w:val="21"/>
-        </w:rPr>
-        <w:t>web/vite.config.ts (extracto)</w:t>
-      </w:r>
-    </w:p>
-    <w:tbl>
-      <w:tblPr>
-        <w:tblW w:w="9070" w:type="dxa"/>
-        <w:tblBorders>
-          <w:top w:val="single" w:sz="4" w:space="0" w:color="auto"/>
-          <w:left w:val="single" w:sz="4" w:space="0" w:color="auto"/>
-          <w:bottom w:val="single" w:sz="4" w:space="0" w:color="auto"/>
-          <w:right w:val="single" w:sz="4" w:space="0" w:color="auto"/>
-          <w:insideH w:val="single" w:sz="4" w:space="0" w:color="auto"/>
-          <w:insideV w:val="single" w:sz="4" w:space="0" w:color="auto"/>
-        </w:tblBorders>
-        <w:tblLook w:val="04A0" w:firstRow="1" w:lastRow="0" w:firstColumn="1" w:lastColumn="0" w:noHBand="0" w:noVBand="1"/>
-      </w:tblPr>
-      <w:tblGrid>
-        <w:gridCol w:w="9070"/>
-      </w:tblGrid>
-      <w:tr>
-        <w:trPr>
-          <w:cantSplit/>
-        </w:trPr>
-        <w:tc>
-          <w:tcPr>
-            <w:tcW w:w="9070" w:type="dxa"/>
-            <w:tcBorders>
-              <w:top w:val="single" w:sz="4" w:space="0" w:color="000000"/>
-              <w:left w:val="single" w:sz="4" w:space="0" w:color="000000"/>
-              <w:bottom w:val="single" w:sz="4" w:space="0" w:color="000000"/>
-              <w:right w:val="single" w:sz="4" w:space="0" w:color="000000"/>
-            </w:tcBorders>
-            <w:shd w:val="clear" w:color="auto" w:fill="F2F2F2"/>
-            <w:tcMar>
-              <w:top w:w="80" w:type="dxa"/>
-              <w:left w:w="140" w:type="dxa"/>
-              <w:bottom w:w="80" w:type="dxa"/>
-              <w:right w:w="140" w:type="dxa"/>
-            </w:tcMar>
-          </w:tcPr>
-          <w:p>
-            <w:r>
-              <w:rPr>
-                <w:rFonts w:ascii="Consolas" w:eastAsia="Consolas" w:hAnsi="Consolas" w:cs="Consolas"/>
-                <w:sz w:val="17"/>
-                <w:szCs w:val="17"/>
-              </w:rPr>
-              <w:t>renderChunk(code, chunk) {</w:t>
-            </w:r>
-          </w:p>
-          <w:p>
-            <w:r>
-              <w:rPr>
-                <w:rFonts w:ascii="Consolas" w:eastAsia="Consolas" w:hAnsi="Consolas" w:cs="Consolas"/>
-                <w:sz w:val="17"/>
-                <w:szCs w:val="17"/>
-              </w:rPr>
-              <w:t xml:space="preserve">  const result = JavaScriptObfuscator.obfuscate(code, {</w:t>
-            </w:r>
-          </w:p>
-          <w:p>
-            <w:r>
-              <w:rPr>
-                <w:rFonts w:ascii="Consolas" w:eastAsia="Consolas" w:hAnsi="Consolas" w:cs="Consolas"/>
-                <w:sz w:val="17"/>
-                <w:szCs w:val="17"/>
-              </w:rPr>
-              <w:t xml:space="preserve">    identifierNamesGenerator: 'hexadecimal',   // nombres ilegibles</w:t>
-            </w:r>
-          </w:p>
-          <w:p>
-            <w:r>
-              <w:rPr>
-                <w:rFonts w:ascii="Consolas" w:eastAsia="Consolas" w:hAnsi="Consolas" w:cs="Consolas"/>
-                <w:sz w:val="17"/>
-                <w:szCs w:val="17"/>
-              </w:rPr>
-              <w:t xml:space="preserve">    stringArray: true, stringArrayEncoding: ['base64'],   // textos codificados</w:t>
-            </w:r>
-          </w:p>
-          <w:p>
-            <w:r>
-              <w:rPr>
-                <w:rFonts w:ascii="Consolas" w:eastAsia="Consolas" w:hAnsi="Consolas" w:cs="Consolas"/>
-                <w:sz w:val="17"/>
-                <w:szCs w:val="17"/>
-              </w:rPr>
-              <w:t xml:space="preserve">    splitStrings: true, compact: true,</w:t>
-            </w:r>
-          </w:p>
-          <w:p>
-            <w:r>
-              <w:rPr>
-                <w:rFonts w:ascii="Consolas" w:eastAsia="Consolas" w:hAnsi="Consolas" w:cs="Consolas"/>
-                <w:sz w:val="17"/>
-                <w:szCs w:val="17"/>
-              </w:rPr>
-              <w:t xml:space="preserve">  })</w:t>
-            </w:r>
-          </w:p>
-          <w:p>
-            <w:r>
-              <w:rPr>
-                <w:rFonts w:ascii="Consolas" w:eastAsia="Consolas" w:hAnsi="Consolas" w:cs="Consolas"/>
-                <w:sz w:val="17"/>
-                <w:szCs w:val="17"/>
-              </w:rPr>
-              <w:t xml:space="preserve">  return { code: result.getObfuscatedCode(), map: null }</w:t>
-            </w:r>
-          </w:p>
-          <w:p>
-            <w:r>
-              <w:rPr>
-                <w:rFonts w:ascii="Consolas" w:eastAsia="Consolas" w:hAnsi="Consolas" w:cs="Consolas"/>
-                <w:sz w:val="17"/>
-                <w:szCs w:val="17"/>
-              </w:rPr>
-              <w:t>}</w:t>
-            </w:r>
-          </w:p>
-        </w:tc>
-      </w:tr>
-    </w:tbl>
-    <w:p>
-      <w:pPr>
-        <w:spacing w:before="80" w:after="160" w:line="300" w:lineRule="auto"/>
-      </w:pPr>
-      <w:r>
-        <w:rPr>
-          <w:b/>
-          <w:bCs/>
-        </w:rPr>
-        <w:t xml:space="preserve">Por qué se usó: </w:t>
-      </w:r>
-      <w:r>
-        <w:t>el código de una aplicación web se descarga al navegador, así que cualquiera puede leerlo. La ofuscación se aplica al paquete final de producción para dificultar copiarlo o estudiar su lógica, sin cambiar lo que hace. En desarrollo se trabaja con el código normal (npm run build:plain).</w:t>
-      </w:r>
-    </w:p>
-    <w:p>
-      <w:pPr>
-        <w:pStyle w:val="Ttulo2"/>
-        <w:keepNext/>
-      </w:pPr>
-      <w:bookmarkStart w:id="18" w:name="_Toc243984524"/>
-      <w:r>
-        <w:t>8.5 EXTRA: Vista del programador</w:t>
-      </w:r>
-      <w:bookmarkEnd w:id="18"/>
-    </w:p>
-    <w:p>
-      <w:pPr>
-        <w:spacing w:after="120" w:line="300" w:lineRule="auto"/>
-      </w:pPr>
-      <w:r>
-        <w:t>El rol Programador tiene una pantalla de diagnóstico (/programador) que muestra, sin entrar al servidor: estado de la aplicación, la base de datos y la caché; versión y configuración (vida del token, rate limits, CORS); latencias p50/p95/p99 calculadas del log JSON; rutas más lentas; últimas peticiones; errores buscables por código de incidente, el mismo que ve el usuario en la pantalla 500; y la lista de todas las rutas de la API con su rol de acceso. No muestra contraseñas ni claves, y una prueba automáti</w:t>
-      </w:r>
-      <w:r>
-        <w:t>ca lo verifica.</w:t>
-      </w:r>
-    </w:p>
-    <w:p>
-      <w:pPr>
         <w:keepNext/>
         <w:spacing w:after="60"/>
         <w:jc w:val="center"/>
@@ -12702,8 +13649,8 @@
           <w:noProof/>
         </w:rPr>
         <w:drawing>
-          <wp:inline distT="0" distB="0" distL="0" distR="0" wp14:anchorId="71E3321B" wp14:editId="340627DA">
-            <wp:extent cx="5400675" cy="3371850"/>
+          <wp:inline distT="0" distB="0" distL="0" distR="0" wp14:anchorId="321F459B" wp14:editId="74BE0D2B">
+            <wp:extent cx="5762625" cy="2733675"/>
             <wp:effectExtent l="0" t="0" r="0" b="0"/>
             <wp:docPr id="14" name="Imagen 14"/>
             <wp:cNvGraphicFramePr>
@@ -12728,1040 +13675,6 @@
                   <pic:spPr bwMode="auto">
                     <a:xfrm>
                       <a:off x="0" y="0"/>
-                      <a:ext cx="5400675" cy="3371850"/>
-                    </a:xfrm>
-                    <a:prstGeom prst="rect">
-                      <a:avLst/>
-                    </a:prstGeom>
-                  </pic:spPr>
-                </pic:pic>
-              </a:graphicData>
-            </a:graphic>
-          </wp:inline>
-        </w:drawing>
-      </w:r>
-    </w:p>
-    <w:p>
-      <w:pPr>
-        <w:spacing w:after="200"/>
-        <w:jc w:val="center"/>
-      </w:pPr>
-      <w:r>
-        <w:rPr>
-          <w:i/>
-          <w:iCs/>
-          <w:sz w:val="20"/>
-          <w:szCs w:val="20"/>
-        </w:rPr>
-        <w:t>Figura 12. Vista del programador.</w:t>
-      </w:r>
-    </w:p>
-    <w:p>
-      <w:pPr>
-        <w:pStyle w:val="Ttulo2"/>
-        <w:keepNext/>
-      </w:pPr>
-      <w:bookmarkStart w:id="19" w:name="_Toc243984525"/>
-      <w:r>
-        <w:t>8.6 EXTRA: Seguridad y calidad adelantadas</w:t>
-      </w:r>
-      <w:bookmarkEnd w:id="19"/>
-    </w:p>
-    <w:p>
-      <w:pPr>
-        <w:pStyle w:val="Prrafodelista"/>
-        <w:numPr>
-          <w:ilvl w:val="0"/>
-          <w:numId w:val="2"/>
-        </w:numPr>
-        <w:spacing w:after="60" w:line="288" w:lineRule="auto"/>
-      </w:pPr>
-      <w:r>
-        <w:t>Rate limits: login 5/min, registro 3/min y API 60/min, con respuesta 429 y Retry-After (punto del 80%).</w:t>
-      </w:r>
-    </w:p>
-    <w:p>
-      <w:pPr>
-        <w:pStyle w:val="Prrafodelista"/>
-        <w:numPr>
-          <w:ilvl w:val="0"/>
-          <w:numId w:val="2"/>
-        </w:numPr>
-        <w:spacing w:after="60" w:line="288" w:lineRule="auto"/>
-      </w:pPr>
-      <w:r>
-        <w:lastRenderedPageBreak/>
-        <w:t>Roles y permisos: el rol se valida antes de buscar el registro, así una ruta pedida a mano responde 403 sin revelar si el id existe.</w:t>
-      </w:r>
-    </w:p>
-    <w:p>
-      <w:pPr>
-        <w:pStyle w:val="Prrafodelista"/>
-        <w:numPr>
-          <w:ilvl w:val="0"/>
-          <w:numId w:val="2"/>
-        </w:numPr>
-        <w:spacing w:after="60" w:line="288" w:lineRule="auto"/>
-      </w:pPr>
-      <w:r>
-        <w:t>Pantallas de error en React: 404, «En construcción», 403, sesión expirada, 500 con código de incidente, 503 con reintento cada 30 s, sin conexión y 429 con cuenta regresiva.</w:t>
-      </w:r>
-    </w:p>
-    <w:p>
-      <w:pPr>
-        <w:pStyle w:val="Prrafodelista"/>
-        <w:numPr>
-          <w:ilvl w:val="0"/>
-          <w:numId w:val="2"/>
-        </w:numPr>
-        <w:spacing w:after="60" w:line="288" w:lineRule="auto"/>
-      </w:pPr>
-      <w:r>
-        <w:t>CI/CD en GitHub Actions: estilo (Pint), análisis (PHPStan), pruebas (Pest y Vitest), auditoría de dependencias y Semgrep en cada cambio. Auditoría actual: 0 vulnerabilidades en composer y npm y 0 hallazgos en Semgrep.</w:t>
-      </w:r>
-    </w:p>
-    <w:p>
-      <w:pPr>
-        <w:pStyle w:val="Prrafodelista"/>
-        <w:numPr>
-          <w:ilvl w:val="0"/>
-          <w:numId w:val="2"/>
-        </w:numPr>
-        <w:spacing w:after="60" w:line="288" w:lineRule="auto"/>
-      </w:pPr>
-      <w:r>
-        <w:t>Logs estructurados en JSON (una línea por petición con request_id, ruta, código y duración), listos para CloudWatch.</w:t>
-      </w:r>
-    </w:p>
-    <w:p>
-      <w:pPr>
-        <w:pStyle w:val="Ttulo2"/>
-        <w:keepNext/>
-      </w:pPr>
-      <w:bookmarkStart w:id="20" w:name="_Toc243984526"/>
-      <w:r>
-        <w:t>8.7 EXTRA: Diseño de la aplicación móvil (Android e iOS)</w:t>
-      </w:r>
-      <w:bookmarkEnd w:id="20"/>
-    </w:p>
-    <w:p>
-      <w:pPr>
-        <w:spacing w:after="120" w:line="300" w:lineRule="auto"/>
-      </w:pPr>
-      <w:r>
-        <w:t>LeGrandHotel tendrá también una aplicación para teléfonos Android e iOS. En esta entrega se presenta su diseño: la tecnología, la arquitectura, las pantallas y el plan de construcción. El código de la app se desarrolla en las entregas del 80% y del 100%. Como la web, es una herramienta interna: solo la usa el personal del hotel, no tiene registro y ningún huésped ni persona externa puede entrar. No reemplaza a la web: cubre las tareas que conviene hacer en movimiento y usa la misma API, sin duplicar la lógi</w:t>
-      </w:r>
-      <w:r>
-        <w:t>ca del negocio.</w:t>
-      </w:r>
-    </w:p>
-    <w:tbl>
-      <w:tblPr>
-        <w:tblW w:w="9070" w:type="dxa"/>
-        <w:tblBorders>
-          <w:top w:val="single" w:sz="4" w:space="0" w:color="auto"/>
-          <w:left w:val="single" w:sz="4" w:space="0" w:color="auto"/>
-          <w:bottom w:val="single" w:sz="4" w:space="0" w:color="auto"/>
-          <w:right w:val="single" w:sz="4" w:space="0" w:color="auto"/>
-          <w:insideH w:val="single" w:sz="4" w:space="0" w:color="auto"/>
-          <w:insideV w:val="single" w:sz="4" w:space="0" w:color="auto"/>
-        </w:tblBorders>
-        <w:tblLook w:val="04A0" w:firstRow="1" w:lastRow="0" w:firstColumn="1" w:lastColumn="0" w:noHBand="0" w:noVBand="1"/>
-      </w:tblPr>
-      <w:tblGrid>
-        <w:gridCol w:w="1972"/>
-        <w:gridCol w:w="7098"/>
-      </w:tblGrid>
-      <w:tr>
-        <w:trPr>
-          <w:tblHeader/>
-        </w:trPr>
-        <w:tc>
-          <w:tcPr>
-            <w:tcW w:w="1972" w:type="dxa"/>
-            <w:tcBorders>
-              <w:top w:val="single" w:sz="4" w:space="0" w:color="000000"/>
-              <w:left w:val="single" w:sz="4" w:space="0" w:color="000000"/>
-              <w:bottom w:val="single" w:sz="4" w:space="0" w:color="000000"/>
-              <w:right w:val="single" w:sz="4" w:space="0" w:color="000000"/>
-            </w:tcBorders>
-            <w:shd w:val="clear" w:color="auto" w:fill="D9D9D9"/>
-            <w:tcMar>
-              <w:top w:w="60" w:type="dxa"/>
-              <w:left w:w="90" w:type="dxa"/>
-              <w:bottom w:w="60" w:type="dxa"/>
-              <w:right w:w="90" w:type="dxa"/>
-            </w:tcMar>
-            <w:vAlign w:val="center"/>
-          </w:tcPr>
-          <w:p>
-            <w:r>
-              <w:rPr>
-                <w:b/>
-                <w:bCs/>
-                <w:sz w:val="20"/>
-                <w:szCs w:val="20"/>
-              </w:rPr>
-              <w:t>Rol del personal</w:t>
-            </w:r>
-          </w:p>
-        </w:tc>
-        <w:tc>
-          <w:tcPr>
-            <w:tcW w:w="7098" w:type="dxa"/>
-            <w:tcBorders>
-              <w:top w:val="single" w:sz="4" w:space="0" w:color="000000"/>
-              <w:left w:val="single" w:sz="4" w:space="0" w:color="000000"/>
-              <w:bottom w:val="single" w:sz="4" w:space="0" w:color="000000"/>
-              <w:right w:val="single" w:sz="4" w:space="0" w:color="000000"/>
-            </w:tcBorders>
-            <w:shd w:val="clear" w:color="auto" w:fill="D9D9D9"/>
-            <w:tcMar>
-              <w:top w:w="60" w:type="dxa"/>
-              <w:left w:w="90" w:type="dxa"/>
-              <w:bottom w:w="60" w:type="dxa"/>
-              <w:right w:w="90" w:type="dxa"/>
-            </w:tcMar>
-            <w:vAlign w:val="center"/>
-          </w:tcPr>
-          <w:p>
-            <w:r>
-              <w:rPr>
-                <w:b/>
-                <w:bCs/>
-                <w:sz w:val="20"/>
-                <w:szCs w:val="20"/>
-              </w:rPr>
-              <w:t>Para qué usará la app</w:t>
-            </w:r>
-          </w:p>
-        </w:tc>
-      </w:tr>
-      <w:tr>
-        <w:tc>
-          <w:tcPr>
-            <w:tcW w:w="1972" w:type="dxa"/>
-            <w:tcBorders>
-              <w:top w:val="single" w:sz="4" w:space="0" w:color="000000"/>
-              <w:left w:val="single" w:sz="4" w:space="0" w:color="000000"/>
-              <w:bottom w:val="single" w:sz="4" w:space="0" w:color="000000"/>
-              <w:right w:val="single" w:sz="4" w:space="0" w:color="000000"/>
-            </w:tcBorders>
-            <w:tcMar>
-              <w:top w:w="60" w:type="dxa"/>
-              <w:left w:w="90" w:type="dxa"/>
-              <w:bottom w:w="60" w:type="dxa"/>
-              <w:right w:w="90" w:type="dxa"/>
-            </w:tcMar>
-            <w:vAlign w:val="center"/>
-          </w:tcPr>
-          <w:p>
-            <w:r>
-              <w:rPr>
-                <w:sz w:val="20"/>
-                <w:szCs w:val="20"/>
-              </w:rPr>
-              <w:t>Recepcionista</w:t>
-            </w:r>
-          </w:p>
-        </w:tc>
-        <w:tc>
-          <w:tcPr>
-            <w:tcW w:w="7098" w:type="dxa"/>
-            <w:tcBorders>
-              <w:top w:val="single" w:sz="4" w:space="0" w:color="000000"/>
-              <w:left w:val="single" w:sz="4" w:space="0" w:color="000000"/>
-              <w:bottom w:val="single" w:sz="4" w:space="0" w:color="000000"/>
-              <w:right w:val="single" w:sz="4" w:space="0" w:color="000000"/>
-            </w:tcBorders>
-            <w:tcMar>
-              <w:top w:w="60" w:type="dxa"/>
-              <w:left w:w="90" w:type="dxa"/>
-              <w:bottom w:w="60" w:type="dxa"/>
-              <w:right w:w="90" w:type="dxa"/>
-            </w:tcMar>
-            <w:vAlign w:val="center"/>
-          </w:tcPr>
-          <w:p>
-            <w:r>
-              <w:rPr>
-                <w:sz w:val="20"/>
-                <w:szCs w:val="20"/>
-              </w:rPr>
-              <w:t>Ver llegadas y salidas del día, hacer check-in y check-out desde el lobby, registrar la reserva de un huésped que llega o llama, cambiar el estado de una habitación, registrar placas en la cochera</w:t>
-            </w:r>
-          </w:p>
-        </w:tc>
-      </w:tr>
-      <w:tr>
-        <w:tc>
-          <w:tcPr>
-            <w:tcW w:w="1972" w:type="dxa"/>
-            <w:tcBorders>
-              <w:top w:val="single" w:sz="4" w:space="0" w:color="000000"/>
-              <w:left w:val="single" w:sz="4" w:space="0" w:color="000000"/>
-              <w:bottom w:val="single" w:sz="4" w:space="0" w:color="000000"/>
-              <w:right w:val="single" w:sz="4" w:space="0" w:color="000000"/>
-            </w:tcBorders>
-            <w:tcMar>
-              <w:top w:w="60" w:type="dxa"/>
-              <w:left w:w="90" w:type="dxa"/>
-              <w:bottom w:w="60" w:type="dxa"/>
-              <w:right w:w="90" w:type="dxa"/>
-            </w:tcMar>
-            <w:vAlign w:val="center"/>
-          </w:tcPr>
-          <w:p>
-            <w:r>
-              <w:rPr>
-                <w:sz w:val="20"/>
-                <w:szCs w:val="20"/>
-              </w:rPr>
-              <w:t>Almacenero</w:t>
-            </w:r>
-          </w:p>
-        </w:tc>
-        <w:tc>
-          <w:tcPr>
-            <w:tcW w:w="7098" w:type="dxa"/>
-            <w:tcBorders>
-              <w:top w:val="single" w:sz="4" w:space="0" w:color="000000"/>
-              <w:left w:val="single" w:sz="4" w:space="0" w:color="000000"/>
-              <w:bottom w:val="single" w:sz="4" w:space="0" w:color="000000"/>
-              <w:right w:val="single" w:sz="4" w:space="0" w:color="000000"/>
-            </w:tcBorders>
-            <w:tcMar>
-              <w:top w:w="60" w:type="dxa"/>
-              <w:left w:w="90" w:type="dxa"/>
-              <w:bottom w:w="60" w:type="dxa"/>
-              <w:right w:w="90" w:type="dxa"/>
-            </w:tcMar>
-            <w:vAlign w:val="center"/>
-          </w:tcPr>
-          <w:p>
-            <w:r>
-              <w:rPr>
-                <w:sz w:val="20"/>
-                <w:szCs w:val="20"/>
-              </w:rPr>
-              <w:t>Registrar entradas y salidas de inventario en el almacén y ver los insumos bajo el mínimo</w:t>
-            </w:r>
-          </w:p>
-        </w:tc>
-      </w:tr>
-      <w:tr>
-        <w:tc>
-          <w:tcPr>
-            <w:tcW w:w="1972" w:type="dxa"/>
-            <w:tcBorders>
-              <w:top w:val="single" w:sz="4" w:space="0" w:color="000000"/>
-              <w:left w:val="single" w:sz="4" w:space="0" w:color="000000"/>
-              <w:bottom w:val="single" w:sz="4" w:space="0" w:color="000000"/>
-              <w:right w:val="single" w:sz="4" w:space="0" w:color="000000"/>
-            </w:tcBorders>
-            <w:tcMar>
-              <w:top w:w="60" w:type="dxa"/>
-              <w:left w:w="90" w:type="dxa"/>
-              <w:bottom w:w="60" w:type="dxa"/>
-              <w:right w:w="90" w:type="dxa"/>
-            </w:tcMar>
-            <w:vAlign w:val="center"/>
-          </w:tcPr>
-          <w:p>
-            <w:r>
-              <w:rPr>
-                <w:sz w:val="20"/>
-                <w:szCs w:val="20"/>
-              </w:rPr>
-              <w:t>Administrador</w:t>
-            </w:r>
-          </w:p>
-        </w:tc>
-        <w:tc>
-          <w:tcPr>
-            <w:tcW w:w="7098" w:type="dxa"/>
-            <w:tcBorders>
-              <w:top w:val="single" w:sz="4" w:space="0" w:color="000000"/>
-              <w:left w:val="single" w:sz="4" w:space="0" w:color="000000"/>
-              <w:bottom w:val="single" w:sz="4" w:space="0" w:color="000000"/>
-              <w:right w:val="single" w:sz="4" w:space="0" w:color="000000"/>
-            </w:tcBorders>
-            <w:tcMar>
-              <w:top w:w="60" w:type="dxa"/>
-              <w:left w:w="90" w:type="dxa"/>
-              <w:bottom w:w="60" w:type="dxa"/>
-              <w:right w:w="90" w:type="dxa"/>
-            </w:tcMar>
-            <w:vAlign w:val="center"/>
-          </w:tcPr>
-          <w:p>
-            <w:r>
-              <w:rPr>
-                <w:sz w:val="20"/>
-                <w:szCs w:val="20"/>
-              </w:rPr>
-              <w:t>Ver el panel resumido (ocupación, ingresos, alertas). La gestión completa sigue en la web</w:t>
-            </w:r>
-          </w:p>
-        </w:tc>
-      </w:tr>
-    </w:tbl>
-    <w:p>
-      <w:pPr>
-        <w:spacing w:after="80"/>
-      </w:pPr>
-    </w:p>
-    <w:p>
-      <w:pPr>
-        <w:spacing w:after="120" w:line="300" w:lineRule="auto"/>
-      </w:pPr>
-      <w:r>
-        <w:rPr>
-          <w:b/>
-          <w:bCs/>
-        </w:rPr>
-        <w:t xml:space="preserve">Tecnología elegida: </w:t>
-      </w:r>
-      <w:r>
-        <w:t>React Native con Expo y TypeScript. Con un solo código se generan las dos aplicaciones y se reutiliza lo que el equipo ya usa en la web: React, TypeScript, TanStack Query, Axios y los mismos tipos de datos.</w:t>
-      </w:r>
-    </w:p>
-    <w:tbl>
-      <w:tblPr>
-        <w:tblW w:w="9070" w:type="dxa"/>
-        <w:tblBorders>
-          <w:top w:val="single" w:sz="4" w:space="0" w:color="auto"/>
-          <w:left w:val="single" w:sz="4" w:space="0" w:color="auto"/>
-          <w:bottom w:val="single" w:sz="4" w:space="0" w:color="auto"/>
-          <w:right w:val="single" w:sz="4" w:space="0" w:color="auto"/>
-          <w:insideH w:val="single" w:sz="4" w:space="0" w:color="auto"/>
-          <w:insideV w:val="single" w:sz="4" w:space="0" w:color="auto"/>
-        </w:tblBorders>
-        <w:tblLook w:val="04A0" w:firstRow="1" w:lastRow="0" w:firstColumn="1" w:lastColumn="0" w:noHBand="0" w:noVBand="1"/>
-      </w:tblPr>
-      <w:tblGrid>
-        <w:gridCol w:w="1977"/>
-        <w:gridCol w:w="3037"/>
-        <w:gridCol w:w="2742"/>
-        <w:gridCol w:w="1314"/>
-      </w:tblGrid>
-      <w:tr>
-        <w:trPr>
-          <w:tblHeader/>
-        </w:trPr>
-        <w:tc>
-          <w:tcPr>
-            <w:tcW w:w="1998" w:type="dxa"/>
-            <w:tcBorders>
-              <w:top w:val="single" w:sz="4" w:space="0" w:color="000000"/>
-              <w:left w:val="single" w:sz="4" w:space="0" w:color="000000"/>
-              <w:bottom w:val="single" w:sz="4" w:space="0" w:color="000000"/>
-              <w:right w:val="single" w:sz="4" w:space="0" w:color="000000"/>
-            </w:tcBorders>
-            <w:shd w:val="clear" w:color="auto" w:fill="D9D9D9"/>
-            <w:tcMar>
-              <w:top w:w="60" w:type="dxa"/>
-              <w:left w:w="90" w:type="dxa"/>
-              <w:bottom w:w="60" w:type="dxa"/>
-              <w:right w:w="90" w:type="dxa"/>
-            </w:tcMar>
-            <w:vAlign w:val="center"/>
-          </w:tcPr>
-          <w:p>
-            <w:r>
-              <w:rPr>
-                <w:b/>
-                <w:bCs/>
-                <w:sz w:val="20"/>
-                <w:szCs w:val="20"/>
-              </w:rPr>
-              <w:t>Opción</w:t>
-            </w:r>
-          </w:p>
-        </w:tc>
-        <w:tc>
-          <w:tcPr>
-            <w:tcW w:w="3075" w:type="dxa"/>
-            <w:tcBorders>
-              <w:top w:val="single" w:sz="4" w:space="0" w:color="000000"/>
-              <w:left w:val="single" w:sz="4" w:space="0" w:color="000000"/>
-              <w:bottom w:val="single" w:sz="4" w:space="0" w:color="000000"/>
-              <w:right w:val="single" w:sz="4" w:space="0" w:color="000000"/>
-            </w:tcBorders>
-            <w:shd w:val="clear" w:color="auto" w:fill="D9D9D9"/>
-            <w:tcMar>
-              <w:top w:w="60" w:type="dxa"/>
-              <w:left w:w="90" w:type="dxa"/>
-              <w:bottom w:w="60" w:type="dxa"/>
-              <w:right w:w="90" w:type="dxa"/>
-            </w:tcMar>
-            <w:vAlign w:val="center"/>
-          </w:tcPr>
-          <w:p>
-            <w:r>
-              <w:rPr>
-                <w:b/>
-                <w:bCs/>
-                <w:sz w:val="20"/>
-                <w:szCs w:val="20"/>
-              </w:rPr>
-              <w:t>A favor</w:t>
-            </w:r>
-          </w:p>
-        </w:tc>
-        <w:tc>
-          <w:tcPr>
-            <w:tcW w:w="2767" w:type="dxa"/>
-            <w:tcBorders>
-              <w:top w:val="single" w:sz="4" w:space="0" w:color="000000"/>
-              <w:left w:val="single" w:sz="4" w:space="0" w:color="000000"/>
-              <w:bottom w:val="single" w:sz="4" w:space="0" w:color="000000"/>
-              <w:right w:val="single" w:sz="4" w:space="0" w:color="000000"/>
-            </w:tcBorders>
-            <w:shd w:val="clear" w:color="auto" w:fill="D9D9D9"/>
-            <w:tcMar>
-              <w:top w:w="60" w:type="dxa"/>
-              <w:left w:w="90" w:type="dxa"/>
-              <w:bottom w:w="60" w:type="dxa"/>
-              <w:right w:w="90" w:type="dxa"/>
-            </w:tcMar>
-            <w:vAlign w:val="center"/>
-          </w:tcPr>
-          <w:p>
-            <w:r>
-              <w:rPr>
-                <w:b/>
-                <w:bCs/>
-                <w:sz w:val="20"/>
-                <w:szCs w:val="20"/>
-              </w:rPr>
-              <w:t>En contra</w:t>
-            </w:r>
-          </w:p>
-        </w:tc>
-        <w:tc>
-          <w:tcPr>
-            <w:tcW w:w="1230" w:type="dxa"/>
-            <w:tcBorders>
-              <w:top w:val="single" w:sz="4" w:space="0" w:color="000000"/>
-              <w:left w:val="single" w:sz="4" w:space="0" w:color="000000"/>
-              <w:bottom w:val="single" w:sz="4" w:space="0" w:color="000000"/>
-              <w:right w:val="single" w:sz="4" w:space="0" w:color="000000"/>
-            </w:tcBorders>
-            <w:shd w:val="clear" w:color="auto" w:fill="D9D9D9"/>
-            <w:tcMar>
-              <w:top w:w="60" w:type="dxa"/>
-              <w:left w:w="90" w:type="dxa"/>
-              <w:bottom w:w="60" w:type="dxa"/>
-              <w:right w:w="90" w:type="dxa"/>
-            </w:tcMar>
-            <w:vAlign w:val="center"/>
-          </w:tcPr>
-          <w:p>
-            <w:r>
-              <w:rPr>
-                <w:b/>
-                <w:bCs/>
-                <w:sz w:val="20"/>
-                <w:szCs w:val="20"/>
-              </w:rPr>
-              <w:t>Decisión</w:t>
-            </w:r>
-          </w:p>
-        </w:tc>
-      </w:tr>
-      <w:tr>
-        <w:tc>
-          <w:tcPr>
-            <w:tcW w:w="1998" w:type="dxa"/>
-            <w:tcBorders>
-              <w:top w:val="single" w:sz="4" w:space="0" w:color="000000"/>
-              <w:left w:val="single" w:sz="4" w:space="0" w:color="000000"/>
-              <w:bottom w:val="single" w:sz="4" w:space="0" w:color="000000"/>
-              <w:right w:val="single" w:sz="4" w:space="0" w:color="000000"/>
-            </w:tcBorders>
-            <w:tcMar>
-              <w:top w:w="60" w:type="dxa"/>
-              <w:left w:w="90" w:type="dxa"/>
-              <w:bottom w:w="60" w:type="dxa"/>
-              <w:right w:w="90" w:type="dxa"/>
-            </w:tcMar>
-            <w:vAlign w:val="center"/>
-          </w:tcPr>
-          <w:p>
-            <w:r>
-              <w:rPr>
-                <w:sz w:val="20"/>
-                <w:szCs w:val="20"/>
-              </w:rPr>
-              <w:t>React Native + Expo</w:t>
-            </w:r>
-          </w:p>
-        </w:tc>
-        <w:tc>
-          <w:tcPr>
-            <w:tcW w:w="3075" w:type="dxa"/>
-            <w:tcBorders>
-              <w:top w:val="single" w:sz="4" w:space="0" w:color="000000"/>
-              <w:left w:val="single" w:sz="4" w:space="0" w:color="000000"/>
-              <w:bottom w:val="single" w:sz="4" w:space="0" w:color="000000"/>
-              <w:right w:val="single" w:sz="4" w:space="0" w:color="000000"/>
-            </w:tcBorders>
-            <w:tcMar>
-              <w:top w:w="60" w:type="dxa"/>
-              <w:left w:w="90" w:type="dxa"/>
-              <w:bottom w:w="60" w:type="dxa"/>
-              <w:right w:w="90" w:type="dxa"/>
-            </w:tcMar>
-            <w:vAlign w:val="center"/>
-          </w:tcPr>
-          <w:p>
-            <w:r>
-              <w:rPr>
-                <w:sz w:val="20"/>
-                <w:szCs w:val="20"/>
-              </w:rPr>
-              <w:t>Un código para Android e iOS; mismo lenguaje y librerías que la web; compila iOS en la nube sin Mac (EAS Build)</w:t>
-            </w:r>
-          </w:p>
-        </w:tc>
-        <w:tc>
-          <w:tcPr>
-            <w:tcW w:w="2767" w:type="dxa"/>
-            <w:tcBorders>
-              <w:top w:val="single" w:sz="4" w:space="0" w:color="000000"/>
-              <w:left w:val="single" w:sz="4" w:space="0" w:color="000000"/>
-              <w:bottom w:val="single" w:sz="4" w:space="0" w:color="000000"/>
-              <w:right w:val="single" w:sz="4" w:space="0" w:color="000000"/>
-            </w:tcBorders>
-            <w:tcMar>
-              <w:top w:w="60" w:type="dxa"/>
-              <w:left w:w="90" w:type="dxa"/>
-              <w:bottom w:w="60" w:type="dxa"/>
-              <w:right w:w="90" w:type="dxa"/>
-            </w:tcMar>
-            <w:vAlign w:val="center"/>
-          </w:tcPr>
-          <w:p>
-            <w:r>
-              <w:rPr>
-                <w:sz w:val="20"/>
-                <w:szCs w:val="20"/>
-              </w:rPr>
-              <w:t>Funciones nativas muy específicas requieren módulos propios</w:t>
-            </w:r>
-          </w:p>
-        </w:tc>
-        <w:tc>
-          <w:tcPr>
-            <w:tcW w:w="1230" w:type="dxa"/>
-            <w:tcBorders>
-              <w:top w:val="single" w:sz="4" w:space="0" w:color="000000"/>
-              <w:left w:val="single" w:sz="4" w:space="0" w:color="000000"/>
-              <w:bottom w:val="single" w:sz="4" w:space="0" w:color="000000"/>
-              <w:right w:val="single" w:sz="4" w:space="0" w:color="000000"/>
-            </w:tcBorders>
-            <w:tcMar>
-              <w:top w:w="60" w:type="dxa"/>
-              <w:left w:w="90" w:type="dxa"/>
-              <w:bottom w:w="60" w:type="dxa"/>
-              <w:right w:w="90" w:type="dxa"/>
-            </w:tcMar>
-            <w:vAlign w:val="center"/>
-          </w:tcPr>
-          <w:p>
-            <w:r>
-              <w:rPr>
-                <w:sz w:val="20"/>
-                <w:szCs w:val="20"/>
-              </w:rPr>
-              <w:t>Elegida</w:t>
-            </w:r>
-          </w:p>
-        </w:tc>
-      </w:tr>
-      <w:tr>
-        <w:tc>
-          <w:tcPr>
-            <w:tcW w:w="1998" w:type="dxa"/>
-            <w:tcBorders>
-              <w:top w:val="single" w:sz="4" w:space="0" w:color="000000"/>
-              <w:left w:val="single" w:sz="4" w:space="0" w:color="000000"/>
-              <w:bottom w:val="single" w:sz="4" w:space="0" w:color="000000"/>
-              <w:right w:val="single" w:sz="4" w:space="0" w:color="000000"/>
-            </w:tcBorders>
-            <w:tcMar>
-              <w:top w:w="60" w:type="dxa"/>
-              <w:left w:w="90" w:type="dxa"/>
-              <w:bottom w:w="60" w:type="dxa"/>
-              <w:right w:w="90" w:type="dxa"/>
-            </w:tcMar>
-            <w:vAlign w:val="center"/>
-          </w:tcPr>
-          <w:p>
-            <w:r>
-              <w:rPr>
-                <w:sz w:val="20"/>
-                <w:szCs w:val="20"/>
-              </w:rPr>
-              <w:t>Flutter</w:t>
-            </w:r>
-          </w:p>
-        </w:tc>
-        <w:tc>
-          <w:tcPr>
-            <w:tcW w:w="3075" w:type="dxa"/>
-            <w:tcBorders>
-              <w:top w:val="single" w:sz="4" w:space="0" w:color="000000"/>
-              <w:left w:val="single" w:sz="4" w:space="0" w:color="000000"/>
-              <w:bottom w:val="single" w:sz="4" w:space="0" w:color="000000"/>
-              <w:right w:val="single" w:sz="4" w:space="0" w:color="000000"/>
-            </w:tcBorders>
-            <w:tcMar>
-              <w:top w:w="60" w:type="dxa"/>
-              <w:left w:w="90" w:type="dxa"/>
-              <w:bottom w:w="60" w:type="dxa"/>
-              <w:right w:w="90" w:type="dxa"/>
-            </w:tcMar>
-            <w:vAlign w:val="center"/>
-          </w:tcPr>
-          <w:p>
-            <w:r>
-              <w:rPr>
-                <w:sz w:val="20"/>
-                <w:szCs w:val="20"/>
-              </w:rPr>
-              <w:t>Buen rendimiento y diseño uniforme</w:t>
-            </w:r>
-          </w:p>
-        </w:tc>
-        <w:tc>
-          <w:tcPr>
-            <w:tcW w:w="2767" w:type="dxa"/>
-            <w:tcBorders>
-              <w:top w:val="single" w:sz="4" w:space="0" w:color="000000"/>
-              <w:left w:val="single" w:sz="4" w:space="0" w:color="000000"/>
-              <w:bottom w:val="single" w:sz="4" w:space="0" w:color="000000"/>
-              <w:right w:val="single" w:sz="4" w:space="0" w:color="000000"/>
-            </w:tcBorders>
-            <w:tcMar>
-              <w:top w:w="60" w:type="dxa"/>
-              <w:left w:w="90" w:type="dxa"/>
-              <w:bottom w:w="60" w:type="dxa"/>
-              <w:right w:w="90" w:type="dxa"/>
-            </w:tcMar>
-            <w:vAlign w:val="center"/>
-          </w:tcPr>
-          <w:p>
-            <w:r>
-              <w:rPr>
-                <w:sz w:val="20"/>
-                <w:szCs w:val="20"/>
-              </w:rPr>
-              <w:t>Otro lenguaje (Dart): no se reutiliza nada de la web</w:t>
-            </w:r>
-          </w:p>
-        </w:tc>
-        <w:tc>
-          <w:tcPr>
-            <w:tcW w:w="1230" w:type="dxa"/>
-            <w:tcBorders>
-              <w:top w:val="single" w:sz="4" w:space="0" w:color="000000"/>
-              <w:left w:val="single" w:sz="4" w:space="0" w:color="000000"/>
-              <w:bottom w:val="single" w:sz="4" w:space="0" w:color="000000"/>
-              <w:right w:val="single" w:sz="4" w:space="0" w:color="000000"/>
-            </w:tcBorders>
-            <w:tcMar>
-              <w:top w:w="60" w:type="dxa"/>
-              <w:left w:w="90" w:type="dxa"/>
-              <w:bottom w:w="60" w:type="dxa"/>
-              <w:right w:w="90" w:type="dxa"/>
-            </w:tcMar>
-            <w:vAlign w:val="center"/>
-          </w:tcPr>
-          <w:p>
-            <w:r>
-              <w:rPr>
-                <w:sz w:val="20"/>
-                <w:szCs w:val="20"/>
-              </w:rPr>
-              <w:t>Descartada</w:t>
-            </w:r>
-          </w:p>
-        </w:tc>
-      </w:tr>
-      <w:tr>
-        <w:tc>
-          <w:tcPr>
-            <w:tcW w:w="1998" w:type="dxa"/>
-            <w:tcBorders>
-              <w:top w:val="single" w:sz="4" w:space="0" w:color="000000"/>
-              <w:left w:val="single" w:sz="4" w:space="0" w:color="000000"/>
-              <w:bottom w:val="single" w:sz="4" w:space="0" w:color="000000"/>
-              <w:right w:val="single" w:sz="4" w:space="0" w:color="000000"/>
-            </w:tcBorders>
-            <w:tcMar>
-              <w:top w:w="60" w:type="dxa"/>
-              <w:left w:w="90" w:type="dxa"/>
-              <w:bottom w:w="60" w:type="dxa"/>
-              <w:right w:w="90" w:type="dxa"/>
-            </w:tcMar>
-            <w:vAlign w:val="center"/>
-          </w:tcPr>
-          <w:p>
-            <w:r>
-              <w:rPr>
-                <w:sz w:val="20"/>
-                <w:szCs w:val="20"/>
-              </w:rPr>
-              <w:t>Nativo (Kotlin + Swift)</w:t>
-            </w:r>
-          </w:p>
-        </w:tc>
-        <w:tc>
-          <w:tcPr>
-            <w:tcW w:w="3075" w:type="dxa"/>
-            <w:tcBorders>
-              <w:top w:val="single" w:sz="4" w:space="0" w:color="000000"/>
-              <w:left w:val="single" w:sz="4" w:space="0" w:color="000000"/>
-              <w:bottom w:val="single" w:sz="4" w:space="0" w:color="000000"/>
-              <w:right w:val="single" w:sz="4" w:space="0" w:color="000000"/>
-            </w:tcBorders>
-            <w:tcMar>
-              <w:top w:w="60" w:type="dxa"/>
-              <w:left w:w="90" w:type="dxa"/>
-              <w:bottom w:w="60" w:type="dxa"/>
-              <w:right w:w="90" w:type="dxa"/>
-            </w:tcMar>
-            <w:vAlign w:val="center"/>
-          </w:tcPr>
-          <w:p>
-            <w:r>
-              <w:rPr>
-                <w:sz w:val="20"/>
-                <w:szCs w:val="20"/>
-              </w:rPr>
-              <w:t>Acceso total al sistema</w:t>
-            </w:r>
-          </w:p>
-        </w:tc>
-        <w:tc>
-          <w:tcPr>
-            <w:tcW w:w="2767" w:type="dxa"/>
-            <w:tcBorders>
-              <w:top w:val="single" w:sz="4" w:space="0" w:color="000000"/>
-              <w:left w:val="single" w:sz="4" w:space="0" w:color="000000"/>
-              <w:bottom w:val="single" w:sz="4" w:space="0" w:color="000000"/>
-              <w:right w:val="single" w:sz="4" w:space="0" w:color="000000"/>
-            </w:tcBorders>
-            <w:tcMar>
-              <w:top w:w="60" w:type="dxa"/>
-              <w:left w:w="90" w:type="dxa"/>
-              <w:bottom w:w="60" w:type="dxa"/>
-              <w:right w:w="90" w:type="dxa"/>
-            </w:tcMar>
-            <w:vAlign w:val="center"/>
-          </w:tcPr>
-          <w:p>
-            <w:r>
-              <w:rPr>
-                <w:sz w:val="20"/>
-                <w:szCs w:val="20"/>
-              </w:rPr>
-              <w:t>Dos aplicaciones distintas: el doble de trabajo para 4 personas</w:t>
-            </w:r>
-          </w:p>
-        </w:tc>
-        <w:tc>
-          <w:tcPr>
-            <w:tcW w:w="1230" w:type="dxa"/>
-            <w:tcBorders>
-              <w:top w:val="single" w:sz="4" w:space="0" w:color="000000"/>
-              <w:left w:val="single" w:sz="4" w:space="0" w:color="000000"/>
-              <w:bottom w:val="single" w:sz="4" w:space="0" w:color="000000"/>
-              <w:right w:val="single" w:sz="4" w:space="0" w:color="000000"/>
-            </w:tcBorders>
-            <w:tcMar>
-              <w:top w:w="60" w:type="dxa"/>
-              <w:left w:w="90" w:type="dxa"/>
-              <w:bottom w:w="60" w:type="dxa"/>
-              <w:right w:w="90" w:type="dxa"/>
-            </w:tcMar>
-            <w:vAlign w:val="center"/>
-          </w:tcPr>
-          <w:p>
-            <w:r>
-              <w:rPr>
-                <w:sz w:val="20"/>
-                <w:szCs w:val="20"/>
-              </w:rPr>
-              <w:t>Descartada</w:t>
-            </w:r>
-          </w:p>
-        </w:tc>
-      </w:tr>
-      <w:tr>
-        <w:tc>
-          <w:tcPr>
-            <w:tcW w:w="1998" w:type="dxa"/>
-            <w:tcBorders>
-              <w:top w:val="single" w:sz="4" w:space="0" w:color="000000"/>
-              <w:left w:val="single" w:sz="4" w:space="0" w:color="000000"/>
-              <w:bottom w:val="single" w:sz="4" w:space="0" w:color="000000"/>
-              <w:right w:val="single" w:sz="4" w:space="0" w:color="000000"/>
-            </w:tcBorders>
-            <w:tcMar>
-              <w:top w:w="60" w:type="dxa"/>
-              <w:left w:w="90" w:type="dxa"/>
-              <w:bottom w:w="60" w:type="dxa"/>
-              <w:right w:w="90" w:type="dxa"/>
-            </w:tcMar>
-            <w:vAlign w:val="center"/>
-          </w:tcPr>
-          <w:p>
-            <w:r>
-              <w:rPr>
-                <w:sz w:val="20"/>
-                <w:szCs w:val="20"/>
-              </w:rPr>
-              <w:t>Web instalable (PWA)</w:t>
-            </w:r>
-          </w:p>
-        </w:tc>
-        <w:tc>
-          <w:tcPr>
-            <w:tcW w:w="3075" w:type="dxa"/>
-            <w:tcBorders>
-              <w:top w:val="single" w:sz="4" w:space="0" w:color="000000"/>
-              <w:left w:val="single" w:sz="4" w:space="0" w:color="000000"/>
-              <w:bottom w:val="single" w:sz="4" w:space="0" w:color="000000"/>
-              <w:right w:val="single" w:sz="4" w:space="0" w:color="000000"/>
-            </w:tcBorders>
-            <w:tcMar>
-              <w:top w:w="60" w:type="dxa"/>
-              <w:left w:w="90" w:type="dxa"/>
-              <w:bottom w:w="60" w:type="dxa"/>
-              <w:right w:w="90" w:type="dxa"/>
-            </w:tcMar>
-            <w:vAlign w:val="center"/>
-          </w:tcPr>
-          <w:p>
-            <w:r>
-              <w:rPr>
-                <w:sz w:val="20"/>
-                <w:szCs w:val="20"/>
-              </w:rPr>
-              <w:t>Sin código nuevo</w:t>
-            </w:r>
-          </w:p>
-        </w:tc>
-        <w:tc>
-          <w:tcPr>
-            <w:tcW w:w="2767" w:type="dxa"/>
-            <w:tcBorders>
-              <w:top w:val="single" w:sz="4" w:space="0" w:color="000000"/>
-              <w:left w:val="single" w:sz="4" w:space="0" w:color="000000"/>
-              <w:bottom w:val="single" w:sz="4" w:space="0" w:color="000000"/>
-              <w:right w:val="single" w:sz="4" w:space="0" w:color="000000"/>
-            </w:tcBorders>
-            <w:tcMar>
-              <w:top w:w="60" w:type="dxa"/>
-              <w:left w:w="90" w:type="dxa"/>
-              <w:bottom w:w="60" w:type="dxa"/>
-              <w:right w:w="90" w:type="dxa"/>
-            </w:tcMar>
-            <w:vAlign w:val="center"/>
-          </w:tcPr>
-          <w:p>
-            <w:r>
-              <w:rPr>
-                <w:sz w:val="20"/>
-                <w:szCs w:val="20"/>
-              </w:rPr>
-              <w:t xml:space="preserve">Notificaciones y almacenamiento seguro </w:t>
-            </w:r>
-            <w:r>
-              <w:rPr>
-                <w:sz w:val="20"/>
-                <w:szCs w:val="20"/>
-              </w:rPr>
-              <w:lastRenderedPageBreak/>
-              <w:t>limitados en iOS; no está en las tiendas</w:t>
-            </w:r>
-          </w:p>
-        </w:tc>
-        <w:tc>
-          <w:tcPr>
-            <w:tcW w:w="1230" w:type="dxa"/>
-            <w:tcBorders>
-              <w:top w:val="single" w:sz="4" w:space="0" w:color="000000"/>
-              <w:left w:val="single" w:sz="4" w:space="0" w:color="000000"/>
-              <w:bottom w:val="single" w:sz="4" w:space="0" w:color="000000"/>
-              <w:right w:val="single" w:sz="4" w:space="0" w:color="000000"/>
-            </w:tcBorders>
-            <w:tcMar>
-              <w:top w:w="60" w:type="dxa"/>
-              <w:left w:w="90" w:type="dxa"/>
-              <w:bottom w:w="60" w:type="dxa"/>
-              <w:right w:w="90" w:type="dxa"/>
-            </w:tcMar>
-            <w:vAlign w:val="center"/>
-          </w:tcPr>
-          <w:p>
-            <w:r>
-              <w:rPr>
-                <w:sz w:val="20"/>
-                <w:szCs w:val="20"/>
-              </w:rPr>
-              <w:lastRenderedPageBreak/>
-              <w:t>Complemento</w:t>
-            </w:r>
-          </w:p>
-        </w:tc>
-      </w:tr>
-    </w:tbl>
-    <w:p>
-      <w:pPr>
-        <w:spacing w:after="80"/>
-      </w:pPr>
-    </w:p>
-    <w:p>
-      <w:pPr>
-        <w:keepNext/>
-        <w:spacing w:after="60"/>
-        <w:jc w:val="center"/>
-      </w:pPr>
-      <w:r>
-        <w:rPr>
-          <w:noProof/>
-        </w:rPr>
-        <w:drawing>
-          <wp:inline distT="0" distB="0" distL="0" distR="0" wp14:anchorId="6B339B5A" wp14:editId="35DBBEA3">
-            <wp:extent cx="5762625" cy="2733675"/>
-            <wp:effectExtent l="0" t="0" r="0" b="0"/>
-            <wp:docPr id="15" name="Imagen 15"/>
-            <wp:cNvGraphicFramePr>
-              <a:graphicFrameLocks xmlns:a="http://schemas.openxmlformats.org/drawingml/2006/main" noChangeAspect="1"/>
-            </wp:cNvGraphicFramePr>
-            <a:graphic xmlns:a="http://schemas.openxmlformats.org/drawingml/2006/main">
-              <a:graphicData uri="http://schemas.openxmlformats.org/drawingml/2006/picture">
-                <pic:pic xmlns:pic="http://schemas.openxmlformats.org/drawingml/2006/picture">
-                  <pic:nvPicPr>
-                    <pic:cNvPr id="0" name=""/>
-                    <pic:cNvPicPr>
-                      <a:picLocks noChangeAspect="1" noChangeArrowheads="1"/>
-                    </pic:cNvPicPr>
-                  </pic:nvPicPr>
-                  <pic:blipFill>
-                    <a:blip r:embed="rId22"/>
-                    <a:srcRect/>
-                    <a:stretch>
-                      <a:fillRect/>
-                    </a:stretch>
-                  </pic:blipFill>
-                  <pic:spPr bwMode="auto">
-                    <a:xfrm>
-                      <a:off x="0" y="0"/>
                       <a:ext cx="5762625" cy="2733675"/>
                     </a:xfrm>
                     <a:prstGeom prst="rect">
@@ -13787,7 +13700,7 @@
           <w:sz w:val="20"/>
           <w:szCs w:val="20"/>
         </w:rPr>
-        <w:t>Figura 13. Arquitectura de la aplicación móvil: misma API y notificaciones por FCM (Android) y APNs (iOS).</w:t>
+        <w:t>Figura 12. Arquitectura de la aplicación móvil: misma API y notificaciones por FCM (Android) y APNs (iOS).</w:t>
       </w:r>
     </w:p>
     <w:tbl>
@@ -14830,7 +14743,7 @@
       <w:pPr>
         <w:spacing w:after="120" w:line="300" w:lineRule="auto"/>
         <w:sectPr>
-          <w:footerReference w:type="default" r:id="rId23"/>
+          <w:footerReference w:type="default" r:id="rId22"/>
           <w:pgSz w:w="11906" w:h="16838"/>
           <w:pgMar w:top="1418" w:right="1418" w:bottom="1418" w:left="1418" w:header="708" w:footer="708" w:gutter="0"/>
           <w:cols w:space="720"/>
@@ -14883,7 +14796,7 @@
           <w:noProof/>
         </w:rPr>
         <w:drawing>
-          <wp:inline distT="0" distB="0" distL="0" distR="0" wp14:anchorId="4A2D3F44" wp14:editId="44E0FB8E">
+          <wp:inline distT="0" distB="0" distL="0" distR="0" wp14:anchorId="3A0C1DDD" wp14:editId="7DE268D8">
             <wp:extent cx="8820150" cy="3857625"/>
             <wp:effectExtent l="0" t="0" r="0" b="0"/>
             <wp:docPr id="2" name="Imagen 2"/>
@@ -14900,7 +14813,7 @@
                     </pic:cNvPicPr>
                   </pic:nvPicPr>
                   <pic:blipFill>
-                    <a:blip r:embed="rId24"/>
+                    <a:blip r:embed="rId23"/>
                     <a:srcRect/>
                     <a:stretch>
                       <a:fillRect/>
@@ -14927,7 +14840,7 @@
         <w:spacing w:after="200"/>
         <w:jc w:val="center"/>
         <w:sectPr>
-          <w:footerReference w:type="default" r:id="rId25"/>
+          <w:footerReference w:type="default" r:id="rId24"/>
           <w:pgSz w:w="16838" w:h="11906" w:orient="landscape"/>
           <w:pgMar w:top="1021" w:right="1418" w:bottom="1021" w:left="1418" w:header="708" w:footer="708" w:gutter="0"/>
           <w:cols w:space="720"/>
@@ -14941,7 +14854,7 @@
           <w:sz w:val="20"/>
           <w:szCs w:val="20"/>
         </w:rPr>
-        <w:t>Figura 14. Bocetos: login del personal; «Hoy», nueva reserva y habitaciones de recepción; inventario del almacén.</w:t>
+        <w:t>Figura 13. Bocetos: login del personal; «Hoy», nueva reserva y habitaciones de recepción; inventario del almacén.</w:t>
       </w:r>
     </w:p>
     <w:p>
@@ -14949,7 +14862,7 @@
         <w:pStyle w:val="Ttulo1"/>
         <w:keepNext/>
       </w:pPr>
-      <w:bookmarkStart w:id="21" w:name="_Toc243984527"/>
+      <w:bookmarkStart w:id="21" w:name="_Toc243984947"/>
       <w:r>
         <w:lastRenderedPageBreak/>
         <w:t>9. Siguientes pasos (entrega del 80%)</w:t>
@@ -15009,7 +14922,7 @@
       </w:r>
     </w:p>
     <w:sectPr>
-      <w:footerReference w:type="default" r:id="rId26"/>
+      <w:footerReference w:type="default" r:id="rId25"/>
       <w:pgSz w:w="11906" w:h="16838"/>
       <w:pgMar w:top="1418" w:right="1418" w:bottom="1418" w:left="1418" w:header="708" w:footer="708" w:gutter="0"/>
       <w:cols w:space="720"/>
@@ -15163,7 +15076,7 @@
         <w:sz w:val="20"/>
         <w:szCs w:val="20"/>
       </w:rPr>
-      <w:t>15</w:t>
+      <w:t>14</w:t>
     </w:r>
     <w:r>
       <w:rPr>
@@ -15209,7 +15122,7 @@
         <w:sz w:val="20"/>
         <w:szCs w:val="20"/>
       </w:rPr>
-      <w:t>23</w:t>
+      <w:t>22</w:t>
     </w:r>
     <w:r>
       <w:rPr>
@@ -15255,7 +15168,7 @@
         <w:sz w:val="20"/>
         <w:szCs w:val="20"/>
       </w:rPr>
-      <w:t>24</w:t>
+      <w:t>23</w:t>
     </w:r>
     <w:r>
       <w:rPr>
@@ -15290,64 +15203,10 @@
 <file path=word/numbering.xml><?xml version="1.0" encoding="utf-8"?>
 <w:numbering xmlns:wpc="http://schemas.microsoft.com/office/word/2010/wordprocessingCanvas" xmlns:cx="http://schemas.microsoft.com/office/drawing/2014/chartex" xmlns:cx1="http://schemas.microsoft.com/office/drawing/2015/9/8/chartex" xmlns:cx2="http://schemas.microsoft.com/office/drawing/2015/10/21/chartex" xmlns:cx3="http://schemas.microsoft.com/office/drawing/2016/5/9/chartex" xmlns:cx4="http://schemas.microsoft.com/office/drawing/2016/5/10/chartex" xmlns:cx5="http://schemas.microsoft.com/office/drawing/2016/5/11/chartex" xmlns:cx6="http://schemas.microsoft.com/office/drawing/2016/5/12/chartex" xmlns:cx7="http://schemas.microsoft.com/office/drawing/2016/5/13/chartex" xmlns:cx8="http://schemas.microsoft.com/office/drawing/2016/5/14/chartex" xmlns:mc="http://schemas.openxmlformats.org/markup-compatibility/2006" xmlns:aink="http://schemas.microsoft.com/office/drawing/2016/ink" xmlns:am3d="http://schemas.microsoft.com/office/drawing/2017/model3d" xmlns:o="urn:schemas-microsoft-com:office:office" xmlns:oel="http://schemas.microsoft.com/office/2019/extlst" xmlns:r="http://schemas.openxmlformats.org/officeDocument/2006/relationships" xmlns:m="http://schemas.openxmlformats.org/officeDocument/2006/math" xmlns:v="urn:schemas-microsoft-com:vml" xmlns:wp14="http://schemas.microsoft.com/office/word/2010/wordprocessingDrawing" xmlns:wp="http://schemas.openxmlformats.org/drawingml/2006/wordprocessingDrawing" xmlns:w10="urn:schemas-microsoft-com:office:word" xmlns:w="http://schemas.openxmlformats.org/wordprocessingml/2006/main" xmlns:w14="http://schemas.microsoft.com/office/word/2010/wordml" xmlns:w15="http://schemas.microsoft.com/office/word/2012/wordml" xmlns:w16cex="http://schemas.microsoft.com/office/word/2018/wordml/cex" xmlns:w16cid="http://schemas.microsoft.com/office/word/2016/wordml/cid" xmlns:w16="http://schemas.microsoft.com/office/word/2018/wordml" xmlns:w16sdtdh="http://schemas.microsoft.com/office/word/2020/wordml/sdtdatahash" xmlns:w16se="http://schemas.microsoft.com/office/word/2015/wordml/symex" xmlns:wpg="http://schemas.microsoft.com/office/word/2010/wordprocessingGroup" xmlns:wpi="http://schemas.microsoft.com/office/word/2010/wordprocessingInk" xmlns:wne="http://schemas.microsoft.com/office/word/2006/wordml" xmlns:wps="http://schemas.microsoft.com/office/word/2010/wordprocessingShape" mc:Ignorable="w14 w15 w16se w16cid w16 w16cex w16sdtdh wp14">
   <w:abstractNum w:abstractNumId="0" w15:restartNumberingAfterBreak="0">
-    <w:nsid w:val="219F7FAF"/>
+    <w:nsid w:val="29803EC4"/>
     <w:multiLevelType w:val="hybridMultilevel"/>
-    <w:tmpl w:val="4F1C33B0"/>
-    <w:lvl w:ilvl="0" w:tplc="54C808F2">
-      <w:start w:val="1"/>
-      <w:numFmt w:val="bullet"/>
-      <w:lvlText w:val="•"/>
-      <w:lvlJc w:val="left"/>
-      <w:pPr>
-        <w:ind w:left="540" w:hanging="270"/>
-      </w:pPr>
-    </w:lvl>
-    <w:lvl w:ilvl="1" w:tplc="A11AF974">
-      <w:numFmt w:val="decimal"/>
-      <w:lvlText w:val=""/>
-      <w:lvlJc w:val="left"/>
-    </w:lvl>
-    <w:lvl w:ilvl="2" w:tplc="9EAA69E8">
-      <w:numFmt w:val="decimal"/>
-      <w:lvlText w:val=""/>
-      <w:lvlJc w:val="left"/>
-    </w:lvl>
-    <w:lvl w:ilvl="3" w:tplc="52DAE0CA">
-      <w:numFmt w:val="decimal"/>
-      <w:lvlText w:val=""/>
-      <w:lvlJc w:val="left"/>
-    </w:lvl>
-    <w:lvl w:ilvl="4" w:tplc="5C28F35A">
-      <w:numFmt w:val="decimal"/>
-      <w:lvlText w:val=""/>
-      <w:lvlJc w:val="left"/>
-    </w:lvl>
-    <w:lvl w:ilvl="5" w:tplc="6BA6527A">
-      <w:numFmt w:val="decimal"/>
-      <w:lvlText w:val=""/>
-      <w:lvlJc w:val="left"/>
-    </w:lvl>
-    <w:lvl w:ilvl="6" w:tplc="A5A07FE2">
-      <w:numFmt w:val="decimal"/>
-      <w:lvlText w:val=""/>
-      <w:lvlJc w:val="left"/>
-    </w:lvl>
-    <w:lvl w:ilvl="7" w:tplc="A912A540">
-      <w:numFmt w:val="decimal"/>
-      <w:lvlText w:val=""/>
-      <w:lvlJc w:val="left"/>
-    </w:lvl>
-    <w:lvl w:ilvl="8" w:tplc="157206C4">
-      <w:numFmt w:val="decimal"/>
-      <w:lvlText w:val=""/>
-      <w:lvlJc w:val="left"/>
-    </w:lvl>
-  </w:abstractNum>
-  <w:abstractNum w:abstractNumId="1" w15:restartNumberingAfterBreak="0">
-    <w:nsid w:val="46185BB7"/>
-    <w:multiLevelType w:val="hybridMultilevel"/>
-    <w:tmpl w:val="6F1ACB94"/>
-    <w:lvl w:ilvl="0" w:tplc="60BEF448" w:tentative="1">
+    <w:tmpl w:val="46CEC9E2"/>
+    <w:lvl w:ilvl="0" w:tplc="96B40F64" w:tentative="1">
       <w:start w:val="1"/>
       <w:numFmt w:val="bullet"/>
       <w:lvlText w:val="●"/>
@@ -15356,7 +15215,7 @@
         <w:ind w:left="720" w:hanging="360"/>
       </w:pPr>
     </w:lvl>
-    <w:lvl w:ilvl="1" w:tplc="0A3E2CB2" w:tentative="1">
+    <w:lvl w:ilvl="1" w:tplc="EA381892" w:tentative="1">
       <w:start w:val="1"/>
       <w:numFmt w:val="bullet"/>
       <w:lvlText w:val="○"/>
@@ -15365,7 +15224,7 @@
         <w:ind w:left="1440" w:hanging="360"/>
       </w:pPr>
     </w:lvl>
-    <w:lvl w:ilvl="2" w:tplc="216EECD4" w:tentative="1">
+    <w:lvl w:ilvl="2" w:tplc="203634BE" w:tentative="1">
       <w:start w:val="1"/>
       <w:numFmt w:val="bullet"/>
       <w:lvlText w:val="■"/>
@@ -15374,7 +15233,7 @@
         <w:ind w:left="2160" w:hanging="360"/>
       </w:pPr>
     </w:lvl>
-    <w:lvl w:ilvl="3" w:tplc="24D8DC62" w:tentative="1">
+    <w:lvl w:ilvl="3" w:tplc="C20CE888" w:tentative="1">
       <w:start w:val="1"/>
       <w:numFmt w:val="bullet"/>
       <w:lvlText w:val="●"/>
@@ -15383,7 +15242,7 @@
         <w:ind w:left="2880" w:hanging="360"/>
       </w:pPr>
     </w:lvl>
-    <w:lvl w:ilvl="4" w:tplc="55808694" w:tentative="1">
+    <w:lvl w:ilvl="4" w:tplc="6DB8C928" w:tentative="1">
       <w:start w:val="1"/>
       <w:numFmt w:val="bullet"/>
       <w:lvlText w:val="○"/>
@@ -15392,7 +15251,7 @@
         <w:ind w:left="3600" w:hanging="360"/>
       </w:pPr>
     </w:lvl>
-    <w:lvl w:ilvl="5" w:tplc="70AAA328" w:tentative="1">
+    <w:lvl w:ilvl="5" w:tplc="BFC47C5A" w:tentative="1">
       <w:start w:val="1"/>
       <w:numFmt w:val="bullet"/>
       <w:lvlText w:val="■"/>
@@ -15401,7 +15260,7 @@
         <w:ind w:left="4320" w:hanging="360"/>
       </w:pPr>
     </w:lvl>
-    <w:lvl w:ilvl="6" w:tplc="B81813B0" w:tentative="1">
+    <w:lvl w:ilvl="6" w:tplc="0422D7F2" w:tentative="1">
       <w:start w:val="1"/>
       <w:numFmt w:val="bullet"/>
       <w:lvlText w:val="●"/>
@@ -15410,7 +15269,7 @@
         <w:ind w:left="5040" w:hanging="360"/>
       </w:pPr>
     </w:lvl>
-    <w:lvl w:ilvl="7" w:tplc="B4781210" w:tentative="1">
+    <w:lvl w:ilvl="7" w:tplc="0B9CBABC" w:tentative="1">
       <w:start w:val="1"/>
       <w:numFmt w:val="bullet"/>
       <w:lvlText w:val="●"/>
@@ -15419,7 +15278,7 @@
         <w:ind w:left="5760" w:hanging="360"/>
       </w:pPr>
     </w:lvl>
-    <w:lvl w:ilvl="8" w:tplc="4C885040" w:tentative="1">
+    <w:lvl w:ilvl="8" w:tplc="7206DAE4" w:tentative="1">
       <w:start w:val="1"/>
       <w:numFmt w:val="bullet"/>
       <w:lvlText w:val="●"/>
@@ -15429,14 +15288,68 @@
       </w:pPr>
     </w:lvl>
   </w:abstractNum>
-  <w:num w:numId="1" w16cid:durableId="430660484">
-    <w:abstractNumId w:val="1"/>
+  <w:abstractNum w:abstractNumId="1" w15:restartNumberingAfterBreak="0">
+    <w:nsid w:val="2AF81D54"/>
+    <w:multiLevelType w:val="hybridMultilevel"/>
+    <w:tmpl w:val="C4162BCC"/>
+    <w:lvl w:ilvl="0" w:tplc="A512133E">
+      <w:start w:val="1"/>
+      <w:numFmt w:val="bullet"/>
+      <w:lvlText w:val="•"/>
+      <w:lvlJc w:val="left"/>
+      <w:pPr>
+        <w:ind w:left="540" w:hanging="270"/>
+      </w:pPr>
+    </w:lvl>
+    <w:lvl w:ilvl="1" w:tplc="853E35FA">
+      <w:numFmt w:val="decimal"/>
+      <w:lvlText w:val=""/>
+      <w:lvlJc w:val="left"/>
+    </w:lvl>
+    <w:lvl w:ilvl="2" w:tplc="0952E84C">
+      <w:numFmt w:val="decimal"/>
+      <w:lvlText w:val=""/>
+      <w:lvlJc w:val="left"/>
+    </w:lvl>
+    <w:lvl w:ilvl="3" w:tplc="6804E4B6">
+      <w:numFmt w:val="decimal"/>
+      <w:lvlText w:val=""/>
+      <w:lvlJc w:val="left"/>
+    </w:lvl>
+    <w:lvl w:ilvl="4" w:tplc="A0265EFA">
+      <w:numFmt w:val="decimal"/>
+      <w:lvlText w:val=""/>
+      <w:lvlJc w:val="left"/>
+    </w:lvl>
+    <w:lvl w:ilvl="5" w:tplc="15BE948A">
+      <w:numFmt w:val="decimal"/>
+      <w:lvlText w:val=""/>
+      <w:lvlJc w:val="left"/>
+    </w:lvl>
+    <w:lvl w:ilvl="6" w:tplc="08F62D06">
+      <w:numFmt w:val="decimal"/>
+      <w:lvlText w:val=""/>
+      <w:lvlJc w:val="left"/>
+    </w:lvl>
+    <w:lvl w:ilvl="7" w:tplc="8E385BAE">
+      <w:numFmt w:val="decimal"/>
+      <w:lvlText w:val=""/>
+      <w:lvlJc w:val="left"/>
+    </w:lvl>
+    <w:lvl w:ilvl="8" w:tplc="7618D5D8">
+      <w:numFmt w:val="decimal"/>
+      <w:lvlText w:val=""/>
+      <w:lvlJc w:val="left"/>
+    </w:lvl>
+  </w:abstractNum>
+  <w:num w:numId="1" w16cid:durableId="685442496">
+    <w:abstractNumId w:val="0"/>
     <w:lvlOverride w:ilvl="0">
       <w:startOverride w:val="1"/>
     </w:lvlOverride>
   </w:num>
-  <w:num w:numId="2" w16cid:durableId="1748267303">
-    <w:abstractNumId w:val="0"/>
+  <w:num w:numId="2" w16cid:durableId="1163738181">
+    <w:abstractNumId w:val="1"/>
     <w:lvlOverride w:ilvl="0">
       <w:startOverride w:val="1"/>
     </w:lvlOverride>

</xml_diff>

<commit_message>
Informe 25%: diagrama UML vectorial (SVG) y más legible, en página propia
Co-Authored-By: Claude Opus 5.5 <noreply@anthropic.com>
</commit_message>
<xml_diff>
--- a/docs/informes/LeGrandHotel_Entrega_25.docx
+++ b/docs/informes/LeGrandHotel_Entrega_25.docx
@@ -34,7 +34,7 @@
           <w:noProof/>
         </w:rPr>
         <w:drawing>
-          <wp:inline distT="0" distB="0" distL="0" distR="0" wp14:anchorId="66EE3DC9" wp14:editId="5CC52D65">
+          <wp:inline distT="0" distB="0" distL="0" distR="0" wp14:anchorId="19BCE397" wp14:editId="7E73C5A2">
             <wp:extent cx="1800225" cy="1076325"/>
             <wp:effectExtent l="0" t="0" r="0" b="0"/>
             <wp:docPr id="1" name="Imagen 1"/>
@@ -254,7 +254,7 @@
     <w:sdt>
       <w:sdtPr>
         <w:alias w:val="Índice"/>
-        <w:id w:val="353395164"/>
+        <w:id w:val="1233128722"/>
       </w:sdtPr>
       <w:sdtEndPr/>
       <w:sdtContent>
@@ -280,7 +280,7 @@
           <w:r>
             <w:fldChar w:fldCharType="separate"/>
           </w:r>
-          <w:hyperlink w:anchor="_Toc243984926" w:history="1">
+          <w:hyperlink w:anchor="_Toc243985825" w:history="1">
             <w:r>
               <w:rPr>
                 <w:rStyle w:val="Hipervnculo"/>
@@ -304,7 +304,7 @@
               <w:rPr>
                 <w:noProof/>
               </w:rPr>
-              <w:instrText xml:space="preserve"> PAGEREF _Toc243984926 \h </w:instrText>
+              <w:instrText xml:space="preserve"> PAGEREF _Toc243985825 \h </w:instrText>
             </w:r>
             <w:r>
               <w:rPr>
@@ -344,7 +344,7 @@
               <w14:ligatures w14:val="standardContextual"/>
             </w:rPr>
           </w:pPr>
-          <w:hyperlink w:anchor="_Toc243984927" w:history="1">
+          <w:hyperlink w:anchor="_Toc243985826" w:history="1">
             <w:r>
               <w:rPr>
                 <w:rStyle w:val="Hipervnculo"/>
@@ -368,7 +368,7 @@
               <w:rPr>
                 <w:noProof/>
               </w:rPr>
-              <w:instrText xml:space="preserve"> PAGEREF _Toc243984927 \h </w:instrText>
+              <w:instrText xml:space="preserve"> PAGEREF _Toc243985826 \h </w:instrText>
             </w:r>
             <w:r>
               <w:rPr>
@@ -408,7 +408,7 @@
               <w14:ligatures w14:val="standardContextual"/>
             </w:rPr>
           </w:pPr>
-          <w:hyperlink w:anchor="_Toc243984928" w:history="1">
+          <w:hyperlink w:anchor="_Toc243985827" w:history="1">
             <w:r>
               <w:rPr>
                 <w:rStyle w:val="Hipervnculo"/>
@@ -432,7 +432,7 @@
               <w:rPr>
                 <w:noProof/>
               </w:rPr>
-              <w:instrText xml:space="preserve"> PAGEREF _Toc243984928 \h </w:instrText>
+              <w:instrText xml:space="preserve"> PAGEREF _Toc243985827 \h </w:instrText>
             </w:r>
             <w:r>
               <w:rPr>
@@ -472,7 +472,7 @@
               <w14:ligatures w14:val="standardContextual"/>
             </w:rPr>
           </w:pPr>
-          <w:hyperlink w:anchor="_Toc243984929" w:history="1">
+          <w:hyperlink w:anchor="_Toc243985828" w:history="1">
             <w:r>
               <w:rPr>
                 <w:rStyle w:val="Hipervnculo"/>
@@ -496,7 +496,7 @@
               <w:rPr>
                 <w:noProof/>
               </w:rPr>
-              <w:instrText xml:space="preserve"> PAGEREF _Toc243984929 \h </w:instrText>
+              <w:instrText xml:space="preserve"> PAGEREF _Toc243985828 \h </w:instrText>
             </w:r>
             <w:r>
               <w:rPr>
@@ -536,7 +536,7 @@
               <w14:ligatures w14:val="standardContextual"/>
             </w:rPr>
           </w:pPr>
-          <w:hyperlink w:anchor="_Toc243984930" w:history="1">
+          <w:hyperlink w:anchor="_Toc243985829" w:history="1">
             <w:r>
               <w:rPr>
                 <w:rStyle w:val="Hipervnculo"/>
@@ -560,7 +560,7 @@
               <w:rPr>
                 <w:noProof/>
               </w:rPr>
-              <w:instrText xml:space="preserve"> PAGEREF _Toc243984930 \h </w:instrText>
+              <w:instrText xml:space="preserve"> PAGEREF _Toc243985829 \h </w:instrText>
             </w:r>
             <w:r>
               <w:rPr>
@@ -600,7 +600,7 @@
               <w14:ligatures w14:val="standardContextual"/>
             </w:rPr>
           </w:pPr>
-          <w:hyperlink w:anchor="_Toc243984931" w:history="1">
+          <w:hyperlink w:anchor="_Toc243985830" w:history="1">
             <w:r>
               <w:rPr>
                 <w:rStyle w:val="Hipervnculo"/>
@@ -624,7 +624,7 @@
               <w:rPr>
                 <w:noProof/>
               </w:rPr>
-              <w:instrText xml:space="preserve"> PAGEREF _Toc243984931 \h </w:instrText>
+              <w:instrText xml:space="preserve"> PAGEREF _Toc243985830 \h </w:instrText>
             </w:r>
             <w:r>
               <w:rPr>
@@ -664,7 +664,7 @@
               <w14:ligatures w14:val="standardContextual"/>
             </w:rPr>
           </w:pPr>
-          <w:hyperlink w:anchor="_Toc243984932" w:history="1">
+          <w:hyperlink w:anchor="_Toc243985831" w:history="1">
             <w:r>
               <w:rPr>
                 <w:rStyle w:val="Hipervnculo"/>
@@ -688,7 +688,7 @@
               <w:rPr>
                 <w:noProof/>
               </w:rPr>
-              <w:instrText xml:space="preserve"> PAGEREF _Toc243984932 \h </w:instrText>
+              <w:instrText xml:space="preserve"> PAGEREF _Toc243985831 \h </w:instrText>
             </w:r>
             <w:r>
               <w:rPr>
@@ -728,7 +728,7 @@
               <w14:ligatures w14:val="standardContextual"/>
             </w:rPr>
           </w:pPr>
-          <w:hyperlink w:anchor="_Toc243984933" w:history="1">
+          <w:hyperlink w:anchor="_Toc243985832" w:history="1">
             <w:r>
               <w:rPr>
                 <w:rStyle w:val="Hipervnculo"/>
@@ -752,7 +752,7 @@
               <w:rPr>
                 <w:noProof/>
               </w:rPr>
-              <w:instrText xml:space="preserve"> PAGEREF _Toc243984933 \h </w:instrText>
+              <w:instrText xml:space="preserve"> PAGEREF _Toc243985832 \h </w:instrText>
             </w:r>
             <w:r>
               <w:rPr>
@@ -792,7 +792,7 @@
               <w14:ligatures w14:val="standardContextual"/>
             </w:rPr>
           </w:pPr>
-          <w:hyperlink w:anchor="_Toc243984934" w:history="1">
+          <w:hyperlink w:anchor="_Toc243985833" w:history="1">
             <w:r>
               <w:rPr>
                 <w:rStyle w:val="Hipervnculo"/>
@@ -816,7 +816,7 @@
               <w:rPr>
                 <w:noProof/>
               </w:rPr>
-              <w:instrText xml:space="preserve"> PAGEREF _Toc243984934 \h </w:instrText>
+              <w:instrText xml:space="preserve"> PAGEREF _Toc243985833 \h </w:instrText>
             </w:r>
             <w:r>
               <w:rPr>
@@ -856,7 +856,7 @@
               <w14:ligatures w14:val="standardContextual"/>
             </w:rPr>
           </w:pPr>
-          <w:hyperlink w:anchor="_Toc243984935" w:history="1">
+          <w:hyperlink w:anchor="_Toc243985834" w:history="1">
             <w:r>
               <w:rPr>
                 <w:rStyle w:val="Hipervnculo"/>
@@ -880,7 +880,7 @@
               <w:rPr>
                 <w:noProof/>
               </w:rPr>
-              <w:instrText xml:space="preserve"> PAGEREF _Toc243984935 \h </w:instrText>
+              <w:instrText xml:space="preserve"> PAGEREF _Toc243985834 \h </w:instrText>
             </w:r>
             <w:r>
               <w:rPr>
@@ -920,7 +920,7 @@
               <w14:ligatures w14:val="standardContextual"/>
             </w:rPr>
           </w:pPr>
-          <w:hyperlink w:anchor="_Toc243984936" w:history="1">
+          <w:hyperlink w:anchor="_Toc243985835" w:history="1">
             <w:r>
               <w:rPr>
                 <w:rStyle w:val="Hipervnculo"/>
@@ -944,7 +944,7 @@
               <w:rPr>
                 <w:noProof/>
               </w:rPr>
-              <w:instrText xml:space="preserve"> PAGEREF _Toc243984936 \h </w:instrText>
+              <w:instrText xml:space="preserve"> PAGEREF _Toc243985835 \h </w:instrText>
             </w:r>
             <w:r>
               <w:rPr>
@@ -984,7 +984,7 @@
               <w14:ligatures w14:val="standardContextual"/>
             </w:rPr>
           </w:pPr>
-          <w:hyperlink w:anchor="_Toc243984937" w:history="1">
+          <w:hyperlink w:anchor="_Toc243985836" w:history="1">
             <w:r>
               <w:rPr>
                 <w:rStyle w:val="Hipervnculo"/>
@@ -1008,7 +1008,7 @@
               <w:rPr>
                 <w:noProof/>
               </w:rPr>
-              <w:instrText xml:space="preserve"> PAGEREF _Toc243984937 \h </w:instrText>
+              <w:instrText xml:space="preserve"> PAGEREF _Toc243985836 \h </w:instrText>
             </w:r>
             <w:r>
               <w:rPr>
@@ -1048,7 +1048,7 @@
               <w14:ligatures w14:val="standardContextual"/>
             </w:rPr>
           </w:pPr>
-          <w:hyperlink w:anchor="_Toc243984938" w:history="1">
+          <w:hyperlink w:anchor="_Toc243985837" w:history="1">
             <w:r>
               <w:rPr>
                 <w:rStyle w:val="Hipervnculo"/>
@@ -1072,7 +1072,7 @@
               <w:rPr>
                 <w:noProof/>
               </w:rPr>
-              <w:instrText xml:space="preserve"> PAGEREF _Toc243984938 \h </w:instrText>
+              <w:instrText xml:space="preserve"> PAGEREF _Toc243985837 \h </w:instrText>
             </w:r>
             <w:r>
               <w:rPr>
@@ -1112,7 +1112,7 @@
               <w14:ligatures w14:val="standardContextual"/>
             </w:rPr>
           </w:pPr>
-          <w:hyperlink w:anchor="_Toc243984939" w:history="1">
+          <w:hyperlink w:anchor="_Toc243985838" w:history="1">
             <w:r>
               <w:rPr>
                 <w:rStyle w:val="Hipervnculo"/>
@@ -1136,7 +1136,7 @@
               <w:rPr>
                 <w:noProof/>
               </w:rPr>
-              <w:instrText xml:space="preserve"> PAGEREF _Toc243984939 \h </w:instrText>
+              <w:instrText xml:space="preserve"> PAGEREF _Toc243985838 \h </w:instrText>
             </w:r>
             <w:r>
               <w:rPr>
@@ -1153,7 +1153,7 @@
               <w:rPr>
                 <w:noProof/>
               </w:rPr>
-              <w:t>13</w:t>
+              <w:t>12</w:t>
             </w:r>
             <w:r>
               <w:rPr>
@@ -1176,7 +1176,7 @@
               <w14:ligatures w14:val="standardContextual"/>
             </w:rPr>
           </w:pPr>
-          <w:hyperlink w:anchor="_Toc243984940" w:history="1">
+          <w:hyperlink w:anchor="_Toc243985839" w:history="1">
             <w:r>
               <w:rPr>
                 <w:rStyle w:val="Hipervnculo"/>
@@ -1200,7 +1200,7 @@
               <w:rPr>
                 <w:noProof/>
               </w:rPr>
-              <w:instrText xml:space="preserve"> PAGEREF _Toc243984940 \h </w:instrText>
+              <w:instrText xml:space="preserve"> PAGEREF _Toc243985839 \h </w:instrText>
             </w:r>
             <w:r>
               <w:rPr>
@@ -1217,7 +1217,7 @@
               <w:rPr>
                 <w:noProof/>
               </w:rPr>
-              <w:t>13</w:t>
+              <w:t>12</w:t>
             </w:r>
             <w:r>
               <w:rPr>
@@ -1240,7 +1240,7 @@
               <w14:ligatures w14:val="standardContextual"/>
             </w:rPr>
           </w:pPr>
-          <w:hyperlink w:anchor="_Toc243984941" w:history="1">
+          <w:hyperlink w:anchor="_Toc243985840" w:history="1">
             <w:r>
               <w:rPr>
                 <w:rStyle w:val="Hipervnculo"/>
@@ -1264,7 +1264,7 @@
               <w:rPr>
                 <w:noProof/>
               </w:rPr>
-              <w:instrText xml:space="preserve"> PAGEREF _Toc243984941 \h </w:instrText>
+              <w:instrText xml:space="preserve"> PAGEREF _Toc243985840 \h </w:instrText>
             </w:r>
             <w:r>
               <w:rPr>
@@ -1304,7 +1304,7 @@
               <w14:ligatures w14:val="standardContextual"/>
             </w:rPr>
           </w:pPr>
-          <w:hyperlink w:anchor="_Toc243984942" w:history="1">
+          <w:hyperlink w:anchor="_Toc243985841" w:history="1">
             <w:r>
               <w:rPr>
                 <w:rStyle w:val="Hipervnculo"/>
@@ -1328,7 +1328,7 @@
               <w:rPr>
                 <w:noProof/>
               </w:rPr>
-              <w:instrText xml:space="preserve"> PAGEREF _Toc243984942 \h </w:instrText>
+              <w:instrText xml:space="preserve"> PAGEREF _Toc243985841 \h </w:instrText>
             </w:r>
             <w:r>
               <w:rPr>
@@ -1368,7 +1368,7 @@
               <w14:ligatures w14:val="standardContextual"/>
             </w:rPr>
           </w:pPr>
-          <w:hyperlink w:anchor="_Toc243984943" w:history="1">
+          <w:hyperlink w:anchor="_Toc243985842" w:history="1">
             <w:r>
               <w:rPr>
                 <w:rStyle w:val="Hipervnculo"/>
@@ -1392,7 +1392,7 @@
               <w:rPr>
                 <w:noProof/>
               </w:rPr>
-              <w:instrText xml:space="preserve"> PAGEREF _Toc243984943 \h </w:instrText>
+              <w:instrText xml:space="preserve"> PAGEREF _Toc243985842 \h </w:instrText>
             </w:r>
             <w:r>
               <w:rPr>
@@ -1432,7 +1432,7 @@
               <w14:ligatures w14:val="standardContextual"/>
             </w:rPr>
           </w:pPr>
-          <w:hyperlink w:anchor="_Toc243984944" w:history="1">
+          <w:hyperlink w:anchor="_Toc243985843" w:history="1">
             <w:r>
               <w:rPr>
                 <w:rStyle w:val="Hipervnculo"/>
@@ -1456,7 +1456,7 @@
               <w:rPr>
                 <w:noProof/>
               </w:rPr>
-              <w:instrText xml:space="preserve"> PAGEREF _Toc243984944 \h </w:instrText>
+              <w:instrText xml:space="preserve"> PAGEREF _Toc243985843 \h </w:instrText>
             </w:r>
             <w:r>
               <w:rPr>
@@ -1496,7 +1496,7 @@
               <w14:ligatures w14:val="standardContextual"/>
             </w:rPr>
           </w:pPr>
-          <w:hyperlink w:anchor="_Toc243984945" w:history="1">
+          <w:hyperlink w:anchor="_Toc243985844" w:history="1">
             <w:r>
               <w:rPr>
                 <w:rStyle w:val="Hipervnculo"/>
@@ -1520,7 +1520,7 @@
               <w:rPr>
                 <w:noProof/>
               </w:rPr>
-              <w:instrText xml:space="preserve"> PAGEREF _Toc243984945 \h </w:instrText>
+              <w:instrText xml:space="preserve"> PAGEREF _Toc243985844 \h </w:instrText>
             </w:r>
             <w:r>
               <w:rPr>
@@ -1560,7 +1560,7 @@
               <w14:ligatures w14:val="standardContextual"/>
             </w:rPr>
           </w:pPr>
-          <w:hyperlink w:anchor="_Toc243984946" w:history="1">
+          <w:hyperlink w:anchor="_Toc243985845" w:history="1">
             <w:r>
               <w:rPr>
                 <w:rStyle w:val="Hipervnculo"/>
@@ -1584,7 +1584,7 @@
               <w:rPr>
                 <w:noProof/>
               </w:rPr>
-              <w:instrText xml:space="preserve"> PAGEREF _Toc243984946 \h </w:instrText>
+              <w:instrText xml:space="preserve"> PAGEREF _Toc243985845 \h </w:instrText>
             </w:r>
             <w:r>
               <w:rPr>
@@ -1624,7 +1624,7 @@
               <w14:ligatures w14:val="standardContextual"/>
             </w:rPr>
           </w:pPr>
-          <w:hyperlink w:anchor="_Toc243984947" w:history="1">
+          <w:hyperlink w:anchor="_Toc243985846" w:history="1">
             <w:r>
               <w:rPr>
                 <w:rStyle w:val="Hipervnculo"/>
@@ -1648,7 +1648,7 @@
               <w:rPr>
                 <w:noProof/>
               </w:rPr>
-              <w:instrText xml:space="preserve"> PAGEREF _Toc243984947 \h </w:instrText>
+              <w:instrText xml:space="preserve"> PAGEREF _Toc243985846 \h </w:instrText>
             </w:r>
             <w:r>
               <w:rPr>
@@ -1692,7 +1692,7 @@
         <w:pStyle w:val="Ttulo1"/>
         <w:keepNext/>
       </w:pPr>
-      <w:bookmarkStart w:id="0" w:name="_Toc243984926"/>
+      <w:bookmarkStart w:id="0" w:name="_Toc243985825"/>
       <w:r>
         <w:lastRenderedPageBreak/>
         <w:t>1. Alcance de la entrega del 25%</w:t>
@@ -2207,7 +2207,7 @@
         <w:pStyle w:val="Ttulo1"/>
         <w:keepNext/>
       </w:pPr>
-      <w:bookmarkStart w:id="1" w:name="_Toc243984927"/>
+      <w:bookmarkStart w:id="1" w:name="_Toc243985826"/>
       <w:r>
         <w:t>2. Descripción del proyecto</w:t>
       </w:r>
@@ -2229,7 +2229,7 @@
         <w:pStyle w:val="Ttulo2"/>
         <w:keepNext/>
       </w:pPr>
-      <w:bookmarkStart w:id="2" w:name="_Toc243984928"/>
+      <w:bookmarkStart w:id="2" w:name="_Toc243985827"/>
       <w:r>
         <w:t>2.1 Tecnologías</w:t>
       </w:r>
@@ -2715,7 +2715,7 @@
         <w:pStyle w:val="Ttulo1"/>
         <w:keepNext/>
       </w:pPr>
-      <w:bookmarkStart w:id="3" w:name="_Toc243984929"/>
+      <w:bookmarkStart w:id="3" w:name="_Toc243985828"/>
       <w:r>
         <w:lastRenderedPageBreak/>
         <w:t>3. Arquitectura y entorno cloud</w:t>
@@ -2741,7 +2741,7 @@
           <w:noProof/>
         </w:rPr>
         <w:drawing>
-          <wp:inline distT="0" distB="0" distL="0" distR="0" wp14:anchorId="136B72AE" wp14:editId="1C1B41C6">
+          <wp:inline distT="0" distB="0" distL="0" distR="0" wp14:anchorId="3A71D761" wp14:editId="3C608412">
             <wp:extent cx="5762625" cy="4038600"/>
             <wp:effectExtent l="0" t="0" r="0" b="0"/>
             <wp:docPr id="4" name="Imagen 4"/>
@@ -2800,7 +2800,7 @@
         <w:pStyle w:val="Ttulo2"/>
         <w:keepNext/>
       </w:pPr>
-      <w:bookmarkStart w:id="4" w:name="_Toc243984930"/>
+      <w:bookmarkStart w:id="4" w:name="_Toc243985829"/>
       <w:r>
         <w:t>3.1 Recursos del entorno (Terraform)</w:t>
       </w:r>
@@ -3706,7 +3706,7 @@
         <w:pStyle w:val="Ttulo2"/>
         <w:keepNext/>
       </w:pPr>
-      <w:bookmarkStart w:id="5" w:name="_Toc243984931"/>
+      <w:bookmarkStart w:id="5" w:name="_Toc243985830"/>
       <w:r>
         <w:t>3.2 Costo estimado</w:t>
       </w:r>
@@ -4029,7 +4029,7 @@
         <w:pStyle w:val="Ttulo1"/>
         <w:keepNext/>
       </w:pPr>
-      <w:bookmarkStart w:id="6" w:name="_Toc243984932"/>
+      <w:bookmarkStart w:id="6" w:name="_Toc243985831"/>
       <w:r>
         <w:t>4. Endpoints definidos</w:t>
       </w:r>
@@ -5652,7 +5652,7 @@
         <w:pStyle w:val="Ttulo2"/>
         <w:keepNext/>
       </w:pPr>
-      <w:bookmarkStart w:id="7" w:name="_Toc243984933"/>
+      <w:bookmarkStart w:id="7" w:name="_Toc243985832"/>
       <w:r>
         <w:t>4.1 Formato único de respuesta</w:t>
       </w:r>
@@ -5924,7 +5924,7 @@
         <w:pStyle w:val="Ttulo2"/>
         <w:keepNext/>
       </w:pPr>
-      <w:bookmarkStart w:id="8" w:name="_Toc243984934"/>
+      <w:bookmarkStart w:id="8" w:name="_Toc243985833"/>
       <w:r>
         <w:t>4.2 Códigos HTTP</w:t>
       </w:r>
@@ -6691,7 +6691,7 @@
         <w:pStyle w:val="Ttulo1"/>
         <w:keepNext/>
       </w:pPr>
-      <w:bookmarkStart w:id="9" w:name="_Toc243984935"/>
+      <w:bookmarkStart w:id="9" w:name="_Toc243985834"/>
       <w:r>
         <w:lastRenderedPageBreak/>
         <w:t>5. Registro y login diferenciados</w:t>
@@ -7415,7 +7415,7 @@
           <w:noProof/>
         </w:rPr>
         <w:drawing>
-          <wp:inline distT="0" distB="0" distL="0" distR="0" wp14:anchorId="5CB7041F" wp14:editId="74260621">
+          <wp:inline distT="0" distB="0" distL="0" distR="0" wp14:anchorId="5DB78C97" wp14:editId="659965D4">
             <wp:extent cx="5400675" cy="3371850"/>
             <wp:effectExtent l="0" t="0" r="0" b="0"/>
             <wp:docPr id="5" name="Imagen 5"/>
@@ -7481,7 +7481,7 @@
         </w:rPr>
         <w:lastRenderedPageBreak/>
         <w:drawing>
-          <wp:inline distT="0" distB="0" distL="0" distR="0" wp14:anchorId="71C61D44" wp14:editId="585DAE84">
+          <wp:inline distT="0" distB="0" distL="0" distR="0" wp14:anchorId="48E46236" wp14:editId="7C98968B">
             <wp:extent cx="5400675" cy="3371850"/>
             <wp:effectExtent l="0" t="0" r="0" b="0"/>
             <wp:docPr id="6" name="Imagen 6"/>
@@ -7546,7 +7546,7 @@
           <w:noProof/>
         </w:rPr>
         <w:drawing>
-          <wp:inline distT="0" distB="0" distL="0" distR="0" wp14:anchorId="1CFCDEB0" wp14:editId="2BF7CC86">
+          <wp:inline distT="0" distB="0" distL="0" distR="0" wp14:anchorId="04D4460A" wp14:editId="5E8FA4B4">
             <wp:extent cx="5400675" cy="3371850"/>
             <wp:effectExtent l="0" t="0" r="0" b="0"/>
             <wp:docPr id="7" name="Imagen 7"/>
@@ -8466,7 +8466,7 @@
         <w:pStyle w:val="Ttulo2"/>
         <w:keepNext/>
       </w:pPr>
-      <w:bookmarkStart w:id="10" w:name="_Toc243984936"/>
+      <w:bookmarkStart w:id="10" w:name="_Toc243985835"/>
       <w:r>
         <w:t>5.1 Pruebas automáticas del registro y login</w:t>
       </w:r>
@@ -9197,7 +9197,7 @@
         <w:pStyle w:val="Ttulo1"/>
         <w:keepNext/>
       </w:pPr>
-      <w:bookmarkStart w:id="11" w:name="_Toc243984937"/>
+      <w:bookmarkStart w:id="11" w:name="_Toc243985836"/>
       <w:r>
         <w:t>6. Registro de incidentes</w:t>
       </w:r>
@@ -9803,7 +9803,7 @@
         <w:pStyle w:val="Ttulo1"/>
         <w:keepNext/>
       </w:pPr>
-      <w:bookmarkStart w:id="12" w:name="_Toc243984938"/>
+      <w:bookmarkStart w:id="12" w:name="_Toc243985837"/>
       <w:r>
         <w:t>7. Conclusiones de la entrega</w:t>
       </w:r>
@@ -9830,6 +9830,48 @@
           <w:numId w:val="2"/>
         </w:numPr>
         <w:spacing w:after="60" w:line="288" w:lineRule="auto"/>
+      </w:pPr>
+      <w:r>
+        <w:t>Las pruebas de carga locales (sección 8.2) muestran que el servidor de desarrollo se satura con pocos usuarios. En la entrega del 80% se repetirán en AWS con Nginx + PHP-FPM, que atiende varias peticiones a la vez.</w:t>
+      </w:r>
+    </w:p>
+    <w:p>
+      <w:pPr>
+        <w:pStyle w:val="Ttulo1"/>
+        <w:keepNext/>
+      </w:pPr>
+      <w:bookmarkStart w:id="13" w:name="_Toc243985838"/>
+      <w:r>
+        <w:t>8. EXTRAS (adicionales a lo evaluado en el 25%)</w:t>
+      </w:r>
+      <w:bookmarkEnd w:id="13"/>
+    </w:p>
+    <w:p>
+      <w:pPr>
+        <w:spacing w:after="120" w:line="300" w:lineRule="auto"/>
+      </w:pPr>
+      <w:r>
+        <w:rPr>
+          <w:b/>
+          <w:bCs/>
+        </w:rPr>
+        <w:t>Todo lo de esta sección es EXTRA: no forma parte de lo evaluado en el 25% y se presenta como avance adicional.</w:t>
+      </w:r>
+    </w:p>
+    <w:p>
+      <w:pPr>
+        <w:pStyle w:val="Ttulo2"/>
+        <w:keepNext/>
+      </w:pPr>
+      <w:bookmarkStart w:id="14" w:name="_Toc243985839"/>
+      <w:r>
+        <w:t>8.1 EXTRA: Diagrama de base de datos (UML)</w:t>
+      </w:r>
+      <w:bookmarkEnd w:id="14"/>
+    </w:p>
+    <w:p>
+      <w:pPr>
+        <w:spacing w:after="120" w:line="300" w:lineRule="auto"/>
         <w:sectPr>
           <w:footerReference w:type="default" r:id="rId12"/>
           <w:pgSz w:w="11906" w:h="16838"/>
@@ -9839,49 +9881,6 @@
         </w:sectPr>
       </w:pPr>
       <w:r>
-        <w:t>Las pruebas de carga locales (sección 8.2) muestran que el servidor de desarrollo se satura con pocos usuarios. En la entrega del 80% se repetirán en AWS con Nginx + PHP-FPM, que atiende varias peticiones a la vez.</w:t>
-      </w:r>
-    </w:p>
-    <w:p>
-      <w:pPr>
-        <w:pStyle w:val="Ttulo1"/>
-        <w:keepNext/>
-      </w:pPr>
-      <w:bookmarkStart w:id="13" w:name="_Toc243984939"/>
-      <w:r>
-        <w:lastRenderedPageBreak/>
-        <w:t>8. EXTRAS (adicionales a lo evaluado en el 25%)</w:t>
-      </w:r>
-      <w:bookmarkEnd w:id="13"/>
-    </w:p>
-    <w:p>
-      <w:pPr>
-        <w:spacing w:after="120" w:line="300" w:lineRule="auto"/>
-      </w:pPr>
-      <w:r>
-        <w:rPr>
-          <w:b/>
-          <w:bCs/>
-        </w:rPr>
-        <w:t>Todo lo de esta sección es EXTRA: no forma parte de lo evaluado en el 25% y se presenta como avance adicional.</w:t>
-      </w:r>
-    </w:p>
-    <w:p>
-      <w:pPr>
-        <w:pStyle w:val="Ttulo2"/>
-        <w:keepNext/>
-      </w:pPr>
-      <w:bookmarkStart w:id="14" w:name="_Toc243984940"/>
-      <w:r>
-        <w:t>8.1 EXTRA: Diagrama de base de datos (UML)</w:t>
-      </w:r>
-      <w:bookmarkEnd w:id="14"/>
-    </w:p>
-    <w:p>
-      <w:pPr>
-        <w:spacing w:after="120" w:line="300" w:lineRule="auto"/>
-      </w:pPr>
-      <w:r>
         <w:t>Diagrama de clases UML de las 13 entidades (modelos de Laravel sobre MySQL 8) con atributos, métodos y multiplicidades. La tabla intermedia role_user es la asociación muchos a muchos entre User y Role; AuditLog e InventoryMovement guardan qué usuario hizo cada acción. Índices que pide el plan: rooms(status), reservations(check_in, check_out), reservations(client_id), clients(document_number) único e inventory_items(name). Fuentes editables: docs/diagramas/uml-clases.puml (PlantUML) y docs/diagramas/legrandh</w:t>
       </w:r>
       <w:r>
@@ -9898,11 +9897,12 @@
         <w:rPr>
           <w:noProof/>
         </w:rPr>
+        <w:lastRenderedPageBreak/>
         <w:drawing>
-          <wp:inline distT="0" distB="0" distL="0" distR="0" wp14:anchorId="5C6DE833" wp14:editId="7F71DD37">
-            <wp:extent cx="5943600" cy="3362325"/>
+          <wp:inline distT="0" distB="0" distL="0" distR="0" wp14:anchorId="47AE7AA3" wp14:editId="0BA3929D">
+            <wp:extent cx="8820150" cy="4772025"/>
             <wp:effectExtent l="0" t="0" r="0" b="0"/>
-            <wp:docPr id="3" name="Imagen 3"/>
+            <wp:docPr id="3" name="Gráfico 3"/>
             <wp:cNvGraphicFramePr>
               <a:graphicFrameLocks xmlns:a="http://schemas.openxmlformats.org/drawingml/2006/main" noChangeAspect="1"/>
             </wp:cNvGraphicFramePr>
@@ -9916,7 +9916,13 @@
                     </pic:cNvPicPr>
                   </pic:nvPicPr>
                   <pic:blipFill>
-                    <a:blip r:embed="rId13"/>
+                    <a:blip r:embed="rId13">
+                      <a:extLst>
+                        <a:ext uri="{96DAC541-7B7A-43D3-8B79-37D633B846F1}">
+                          <asvg:svgBlip xmlns:asvg="http://schemas.microsoft.com/office/drawing/2016/SVG/main" r:embed="rId14"/>
+                        </a:ext>
+                      </a:extLst>
+                    </a:blip>
                     <a:srcRect/>
                     <a:stretch>
                       <a:fillRect/>
@@ -9925,7 +9931,7 @@
                   <pic:spPr bwMode="auto">
                     <a:xfrm>
                       <a:off x="0" y="0"/>
-                      <a:ext cx="5943600" cy="3362325"/>
+                      <a:ext cx="8820150" cy="4772025"/>
                     </a:xfrm>
                     <a:prstGeom prst="rect">
                       <a:avLst/>
@@ -9943,7 +9949,7 @@
         <w:spacing w:after="200"/>
         <w:jc w:val="center"/>
         <w:sectPr>
-          <w:footerReference w:type="default" r:id="rId14"/>
+          <w:footerReference w:type="default" r:id="rId15"/>
           <w:pgSz w:w="16838" w:h="11906" w:orient="landscape"/>
           <w:pgMar w:top="1021" w:right="1418" w:bottom="1021" w:left="1418" w:header="708" w:footer="708" w:gutter="0"/>
           <w:cols w:space="720"/>
@@ -9965,7 +9971,7 @@
         <w:pStyle w:val="Ttulo2"/>
         <w:keepNext/>
       </w:pPr>
-      <w:bookmarkStart w:id="15" w:name="_Toc243984941"/>
+      <w:bookmarkStart w:id="15" w:name="_Toc243985840"/>
       <w:r>
         <w:lastRenderedPageBreak/>
         <w:t>8.2 EXTRA: Pruebas de rendimiento y estrés con k6 (varias corridas)</w:t>
@@ -11521,76 +11527,10 @@
           <w:noProof/>
         </w:rPr>
         <w:drawing>
-          <wp:inline distT="0" distB="0" distL="0" distR="0" wp14:anchorId="4E408E60" wp14:editId="1DA2DB68">
+          <wp:inline distT="0" distB="0" distL="0" distR="0" wp14:anchorId="1D3C4AE2" wp14:editId="2D117C45">
             <wp:extent cx="5400675" cy="3114675"/>
             <wp:effectExtent l="0" t="0" r="0" b="0"/>
             <wp:docPr id="8" name="Imagen 8"/>
-            <wp:cNvGraphicFramePr>
-              <a:graphicFrameLocks xmlns:a="http://schemas.openxmlformats.org/drawingml/2006/main" noChangeAspect="1"/>
-            </wp:cNvGraphicFramePr>
-            <a:graphic xmlns:a="http://schemas.openxmlformats.org/drawingml/2006/main">
-              <a:graphicData uri="http://schemas.openxmlformats.org/drawingml/2006/picture">
-                <pic:pic xmlns:pic="http://schemas.openxmlformats.org/drawingml/2006/picture">
-                  <pic:nvPicPr>
-                    <pic:cNvPr id="0" name=""/>
-                    <pic:cNvPicPr>
-                      <a:picLocks noChangeAspect="1" noChangeArrowheads="1"/>
-                    </pic:cNvPicPr>
-                  </pic:nvPicPr>
-                  <pic:blipFill>
-                    <a:blip r:embed="rId15"/>
-                    <a:srcRect/>
-                    <a:stretch>
-                      <a:fillRect/>
-                    </a:stretch>
-                  </pic:blipFill>
-                  <pic:spPr bwMode="auto">
-                    <a:xfrm>
-                      <a:off x="0" y="0"/>
-                      <a:ext cx="5400675" cy="3114675"/>
-                    </a:xfrm>
-                    <a:prstGeom prst="rect">
-                      <a:avLst/>
-                    </a:prstGeom>
-                  </pic:spPr>
-                </pic:pic>
-              </a:graphicData>
-            </a:graphic>
-          </wp:inline>
-        </w:drawing>
-      </w:r>
-    </w:p>
-    <w:p>
-      <w:pPr>
-        <w:spacing w:after="200"/>
-        <w:jc w:val="center"/>
-      </w:pPr>
-      <w:r>
-        <w:rPr>
-          <w:i/>
-          <w:iCs/>
-          <w:sz w:val="20"/>
-          <w:szCs w:val="20"/>
-        </w:rPr>
-        <w:t>Figura 6. Tiempo de respuesta (p50, p90, p95) según la cantidad de usuarios virtuales.</w:t>
-      </w:r>
-    </w:p>
-    <w:p>
-      <w:pPr>
-        <w:keepNext/>
-        <w:spacing w:after="60"/>
-        <w:jc w:val="center"/>
-      </w:pPr>
-      <w:r>
-        <w:rPr>
-          <w:noProof/>
-        </w:rPr>
-        <w:lastRenderedPageBreak/>
-        <w:drawing>
-          <wp:inline distT="0" distB="0" distL="0" distR="0" wp14:anchorId="0BC7F927" wp14:editId="11AE14E1">
-            <wp:extent cx="5400675" cy="2971800"/>
-            <wp:effectExtent l="0" t="0" r="0" b="0"/>
-            <wp:docPr id="9" name="Imagen 9"/>
             <wp:cNvGraphicFramePr>
               <a:graphicFrameLocks xmlns:a="http://schemas.openxmlformats.org/drawingml/2006/main" noChangeAspect="1"/>
             </wp:cNvGraphicFramePr>
@@ -11613,7 +11553,7 @@
                   <pic:spPr bwMode="auto">
                     <a:xfrm>
                       <a:off x="0" y="0"/>
-                      <a:ext cx="5400675" cy="2971800"/>
+                      <a:ext cx="5400675" cy="3114675"/>
                     </a:xfrm>
                     <a:prstGeom prst="rect">
                       <a:avLst/>
@@ -11638,7 +11578,7 @@
           <w:sz w:val="20"/>
           <w:szCs w:val="20"/>
         </w:rPr>
-        <w:t>Figura 7. Peticiones atendidas por segundo en cada corrida.</w:t>
+        <w:t>Figura 6. Tiempo de respuesta (p50, p90, p95) según la cantidad de usuarios virtuales.</w:t>
       </w:r>
     </w:p>
     <w:p>
@@ -11651,11 +11591,12 @@
         <w:rPr>
           <w:noProof/>
         </w:rPr>
+        <w:lastRenderedPageBreak/>
         <w:drawing>
-          <wp:inline distT="0" distB="0" distL="0" distR="0" wp14:anchorId="5E63A8B2" wp14:editId="304B8DE8">
-            <wp:extent cx="5400675" cy="2733675"/>
+          <wp:inline distT="0" distB="0" distL="0" distR="0" wp14:anchorId="12D93770" wp14:editId="32308B65">
+            <wp:extent cx="5400675" cy="2971800"/>
             <wp:effectExtent l="0" t="0" r="0" b="0"/>
-            <wp:docPr id="10" name="Imagen 10"/>
+            <wp:docPr id="9" name="Imagen 9"/>
             <wp:cNvGraphicFramePr>
               <a:graphicFrameLocks xmlns:a="http://schemas.openxmlformats.org/drawingml/2006/main" noChangeAspect="1"/>
             </wp:cNvGraphicFramePr>
@@ -11678,7 +11619,7 @@
                   <pic:spPr bwMode="auto">
                     <a:xfrm>
                       <a:off x="0" y="0"/>
-                      <a:ext cx="5400675" cy="2733675"/>
+                      <a:ext cx="5400675" cy="2971800"/>
                     </a:xfrm>
                     <a:prstGeom prst="rect">
                       <a:avLst/>
@@ -11703,7 +11644,7 @@
           <w:sz w:val="20"/>
           <w:szCs w:val="20"/>
         </w:rPr>
-        <w:t>Figura 8. Porcentaje de peticiones fallidas en cada corrida.</w:t>
+        <w:t>Figura 7. Peticiones atendidas por segundo en cada corrida.</w:t>
       </w:r>
     </w:p>
     <w:p>
@@ -11716,12 +11657,11 @@
         <w:rPr>
           <w:noProof/>
         </w:rPr>
-        <w:lastRenderedPageBreak/>
         <w:drawing>
-          <wp:inline distT="0" distB="0" distL="0" distR="0" wp14:anchorId="5D8FBD91" wp14:editId="6E685E08">
-            <wp:extent cx="5400675" cy="2981325"/>
+          <wp:inline distT="0" distB="0" distL="0" distR="0" wp14:anchorId="0B607504" wp14:editId="0E75CD55">
+            <wp:extent cx="5400675" cy="2733675"/>
             <wp:effectExtent l="0" t="0" r="0" b="0"/>
-            <wp:docPr id="11" name="Imagen 11"/>
+            <wp:docPr id="10" name="Imagen 10"/>
             <wp:cNvGraphicFramePr>
               <a:graphicFrameLocks xmlns:a="http://schemas.openxmlformats.org/drawingml/2006/main" noChangeAspect="1"/>
             </wp:cNvGraphicFramePr>
@@ -11744,7 +11684,7 @@
                   <pic:spPr bwMode="auto">
                     <a:xfrm>
                       <a:off x="0" y="0"/>
-                      <a:ext cx="5400675" cy="2981325"/>
+                      <a:ext cx="5400675" cy="2733675"/>
                     </a:xfrm>
                     <a:prstGeom prst="rect">
                       <a:avLst/>
@@ -11769,7 +11709,7 @@
           <w:sz w:val="20"/>
           <w:szCs w:val="20"/>
         </w:rPr>
-        <w:t>Figura 9. p95 por tipo de operación (lecturas, login, crear reserva).</w:t>
+        <w:t>Figura 8. Porcentaje de peticiones fallidas en cada corrida.</w:t>
       </w:r>
     </w:p>
     <w:p>
@@ -11782,11 +11722,12 @@
         <w:rPr>
           <w:noProof/>
         </w:rPr>
+        <w:lastRenderedPageBreak/>
         <w:drawing>
-          <wp:inline distT="0" distB="0" distL="0" distR="0" wp14:anchorId="34EC4A80" wp14:editId="67F2D20F">
-            <wp:extent cx="5400675" cy="3638550"/>
+          <wp:inline distT="0" distB="0" distL="0" distR="0" wp14:anchorId="5852F62B" wp14:editId="01BAA39F">
+            <wp:extent cx="5400675" cy="2981325"/>
             <wp:effectExtent l="0" t="0" r="0" b="0"/>
-            <wp:docPr id="12" name="Imagen 12"/>
+            <wp:docPr id="11" name="Imagen 11"/>
             <wp:cNvGraphicFramePr>
               <a:graphicFrameLocks xmlns:a="http://schemas.openxmlformats.org/drawingml/2006/main" noChangeAspect="1"/>
             </wp:cNvGraphicFramePr>
@@ -11809,6 +11750,71 @@
                   <pic:spPr bwMode="auto">
                     <a:xfrm>
                       <a:off x="0" y="0"/>
+                      <a:ext cx="5400675" cy="2981325"/>
+                    </a:xfrm>
+                    <a:prstGeom prst="rect">
+                      <a:avLst/>
+                    </a:prstGeom>
+                  </pic:spPr>
+                </pic:pic>
+              </a:graphicData>
+            </a:graphic>
+          </wp:inline>
+        </w:drawing>
+      </w:r>
+    </w:p>
+    <w:p>
+      <w:pPr>
+        <w:spacing w:after="200"/>
+        <w:jc w:val="center"/>
+      </w:pPr>
+      <w:r>
+        <w:rPr>
+          <w:i/>
+          <w:iCs/>
+          <w:sz w:val="20"/>
+          <w:szCs w:val="20"/>
+        </w:rPr>
+        <w:t>Figura 9. p95 por tipo de operación (lecturas, login, crear reserva).</w:t>
+      </w:r>
+    </w:p>
+    <w:p>
+      <w:pPr>
+        <w:keepNext/>
+        <w:spacing w:after="60"/>
+        <w:jc w:val="center"/>
+      </w:pPr>
+      <w:r>
+        <w:rPr>
+          <w:noProof/>
+        </w:rPr>
+        <w:drawing>
+          <wp:inline distT="0" distB="0" distL="0" distR="0" wp14:anchorId="7023AFA0" wp14:editId="2415750E">
+            <wp:extent cx="5400675" cy="3638550"/>
+            <wp:effectExtent l="0" t="0" r="0" b="0"/>
+            <wp:docPr id="12" name="Imagen 12"/>
+            <wp:cNvGraphicFramePr>
+              <a:graphicFrameLocks xmlns:a="http://schemas.openxmlformats.org/drawingml/2006/main" noChangeAspect="1"/>
+            </wp:cNvGraphicFramePr>
+            <a:graphic xmlns:a="http://schemas.openxmlformats.org/drawingml/2006/main">
+              <a:graphicData uri="http://schemas.openxmlformats.org/drawingml/2006/picture">
+                <pic:pic xmlns:pic="http://schemas.openxmlformats.org/drawingml/2006/picture">
+                  <pic:nvPicPr>
+                    <pic:cNvPr id="0" name=""/>
+                    <pic:cNvPicPr>
+                      <a:picLocks noChangeAspect="1" noChangeArrowheads="1"/>
+                    </pic:cNvPicPr>
+                  </pic:nvPicPr>
+                  <pic:blipFill>
+                    <a:blip r:embed="rId20"/>
+                    <a:srcRect/>
+                    <a:stretch>
+                      <a:fillRect/>
+                    </a:stretch>
+                  </pic:blipFill>
+                  <pic:spPr bwMode="auto">
+                    <a:xfrm>
+                      <a:off x="0" y="0"/>
                       <a:ext cx="5400675" cy="3638550"/>
                     </a:xfrm>
                     <a:prstGeom prst="rect">
@@ -12032,7 +12038,7 @@
         <w:pStyle w:val="Ttulo2"/>
         <w:keepNext/>
       </w:pPr>
-      <w:bookmarkStart w:id="16" w:name="_Toc243984942"/>
+      <w:bookmarkStart w:id="16" w:name="_Toc243985841"/>
       <w:r>
         <w:t>8.3 Análisis y cuello de botella encontrado</w:t>
       </w:r>
@@ -12116,7 +12122,7 @@
         <w:pStyle w:val="Ttulo2"/>
         <w:keepNext/>
       </w:pPr>
-      <w:bookmarkStart w:id="17" w:name="_Toc243984943"/>
+      <w:bookmarkStart w:id="17" w:name="_Toc243985842"/>
       <w:r>
         <w:t>8.4 EXTRA: Cifrado (ofuscación) del código</w:t>
       </w:r>
@@ -12587,7 +12593,7 @@
         <w:pStyle w:val="Ttulo2"/>
         <w:keepNext/>
       </w:pPr>
-      <w:bookmarkStart w:id="18" w:name="_Toc243984944"/>
+      <w:bookmarkStart w:id="18" w:name="_Toc243985843"/>
       <w:r>
         <w:t>8.5 EXTRA: Vista del programador</w:t>
       </w:r>
@@ -12615,7 +12621,7 @@
           <w:noProof/>
         </w:rPr>
         <w:drawing>
-          <wp:inline distT="0" distB="0" distL="0" distR="0" wp14:anchorId="6971872D" wp14:editId="435BC19C">
+          <wp:inline distT="0" distB="0" distL="0" distR="0" wp14:anchorId="66386217" wp14:editId="1C17FB8D">
             <wp:extent cx="5400675" cy="3371850"/>
             <wp:effectExtent l="0" t="0" r="0" b="0"/>
             <wp:docPr id="13" name="Imagen 13"/>
@@ -12632,7 +12638,7 @@
                     </pic:cNvPicPr>
                   </pic:nvPicPr>
                   <pic:blipFill>
-                    <a:blip r:embed="rId20"/>
+                    <a:blip r:embed="rId21"/>
                     <a:srcRect/>
                     <a:stretch>
                       <a:fillRect/>
@@ -12674,7 +12680,7 @@
         <w:pStyle w:val="Ttulo2"/>
         <w:keepNext/>
       </w:pPr>
-      <w:bookmarkStart w:id="19" w:name="_Toc243984945"/>
+      <w:bookmarkStart w:id="19" w:name="_Toc243985844"/>
       <w:r>
         <w:t>8.6 EXTRA: Seguridad y calidad adelantadas</w:t>
       </w:r>
@@ -12751,7 +12757,7 @@
         <w:pStyle w:val="Ttulo2"/>
         <w:keepNext/>
       </w:pPr>
-      <w:bookmarkStart w:id="20" w:name="_Toc243984946"/>
+      <w:bookmarkStart w:id="20" w:name="_Toc243985845"/>
       <w:r>
         <w:t>8.7 EXTRA: Diseño de la aplicación móvil (Android e iOS)</w:t>
       </w:r>
@@ -13649,7 +13655,7 @@
           <w:noProof/>
         </w:rPr>
         <w:drawing>
-          <wp:inline distT="0" distB="0" distL="0" distR="0" wp14:anchorId="321F459B" wp14:editId="74BE0D2B">
+          <wp:inline distT="0" distB="0" distL="0" distR="0" wp14:anchorId="5F1A18FA" wp14:editId="073D16F9">
             <wp:extent cx="5762625" cy="2733675"/>
             <wp:effectExtent l="0" t="0" r="0" b="0"/>
             <wp:docPr id="14" name="Imagen 14"/>
@@ -13666,7 +13672,7 @@
                     </pic:cNvPicPr>
                   </pic:nvPicPr>
                   <pic:blipFill>
-                    <a:blip r:embed="rId21"/>
+                    <a:blip r:embed="rId22"/>
                     <a:srcRect/>
                     <a:stretch>
                       <a:fillRect/>
@@ -14743,7 +14749,7 @@
       <w:pPr>
         <w:spacing w:after="120" w:line="300" w:lineRule="auto"/>
         <w:sectPr>
-          <w:footerReference w:type="default" r:id="rId22"/>
+          <w:footerReference w:type="default" r:id="rId23"/>
           <w:pgSz w:w="11906" w:h="16838"/>
           <w:pgMar w:top="1418" w:right="1418" w:bottom="1418" w:left="1418" w:header="708" w:footer="708" w:gutter="0"/>
           <w:cols w:space="720"/>
@@ -14796,7 +14802,7 @@
           <w:noProof/>
         </w:rPr>
         <w:drawing>
-          <wp:inline distT="0" distB="0" distL="0" distR="0" wp14:anchorId="3A0C1DDD" wp14:editId="7DE268D8">
+          <wp:inline distT="0" distB="0" distL="0" distR="0" wp14:anchorId="4DA7145D" wp14:editId="1DC51FAF">
             <wp:extent cx="8820150" cy="3857625"/>
             <wp:effectExtent l="0" t="0" r="0" b="0"/>
             <wp:docPr id="2" name="Imagen 2"/>
@@ -14813,7 +14819,7 @@
                     </pic:cNvPicPr>
                   </pic:nvPicPr>
                   <pic:blipFill>
-                    <a:blip r:embed="rId23"/>
+                    <a:blip r:embed="rId24"/>
                     <a:srcRect/>
                     <a:stretch>
                       <a:fillRect/>
@@ -14840,7 +14846,7 @@
         <w:spacing w:after="200"/>
         <w:jc w:val="center"/>
         <w:sectPr>
-          <w:footerReference w:type="default" r:id="rId24"/>
+          <w:footerReference w:type="default" r:id="rId25"/>
           <w:pgSz w:w="16838" w:h="11906" w:orient="landscape"/>
           <w:pgMar w:top="1021" w:right="1418" w:bottom="1021" w:left="1418" w:header="708" w:footer="708" w:gutter="0"/>
           <w:cols w:space="720"/>
@@ -14862,7 +14868,7 @@
         <w:pStyle w:val="Ttulo1"/>
         <w:keepNext/>
       </w:pPr>
-      <w:bookmarkStart w:id="21" w:name="_Toc243984947"/>
+      <w:bookmarkStart w:id="21" w:name="_Toc243985846"/>
       <w:r>
         <w:lastRenderedPageBreak/>
         <w:t>9. Siguientes pasos (entrega del 80%)</w:t>
@@ -14922,7 +14928,7 @@
       </w:r>
     </w:p>
     <w:sectPr>
-      <w:footerReference w:type="default" r:id="rId25"/>
+      <w:footerReference w:type="default" r:id="rId26"/>
       <w:pgSz w:w="11906" w:h="16838"/>
       <w:pgMar w:top="1418" w:right="1418" w:bottom="1418" w:left="1418" w:header="708" w:footer="708" w:gutter="0"/>
       <w:cols w:space="720"/>
@@ -15203,10 +15209,10 @@
 <file path=word/numbering.xml><?xml version="1.0" encoding="utf-8"?>
 <w:numbering xmlns:wpc="http://schemas.microsoft.com/office/word/2010/wordprocessingCanvas" xmlns:cx="http://schemas.microsoft.com/office/drawing/2014/chartex" xmlns:cx1="http://schemas.microsoft.com/office/drawing/2015/9/8/chartex" xmlns:cx2="http://schemas.microsoft.com/office/drawing/2015/10/21/chartex" xmlns:cx3="http://schemas.microsoft.com/office/drawing/2016/5/9/chartex" xmlns:cx4="http://schemas.microsoft.com/office/drawing/2016/5/10/chartex" xmlns:cx5="http://schemas.microsoft.com/office/drawing/2016/5/11/chartex" xmlns:cx6="http://schemas.microsoft.com/office/drawing/2016/5/12/chartex" xmlns:cx7="http://schemas.microsoft.com/office/drawing/2016/5/13/chartex" xmlns:cx8="http://schemas.microsoft.com/office/drawing/2016/5/14/chartex" xmlns:mc="http://schemas.openxmlformats.org/markup-compatibility/2006" xmlns:aink="http://schemas.microsoft.com/office/drawing/2016/ink" xmlns:am3d="http://schemas.microsoft.com/office/drawing/2017/model3d" xmlns:o="urn:schemas-microsoft-com:office:office" xmlns:oel="http://schemas.microsoft.com/office/2019/extlst" xmlns:r="http://schemas.openxmlformats.org/officeDocument/2006/relationships" xmlns:m="http://schemas.openxmlformats.org/officeDocument/2006/math" xmlns:v="urn:schemas-microsoft-com:vml" xmlns:wp14="http://schemas.microsoft.com/office/word/2010/wordprocessingDrawing" xmlns:wp="http://schemas.openxmlformats.org/drawingml/2006/wordprocessingDrawing" xmlns:w10="urn:schemas-microsoft-com:office:word" xmlns:w="http://schemas.openxmlformats.org/wordprocessingml/2006/main" xmlns:w14="http://schemas.microsoft.com/office/word/2010/wordml" xmlns:w15="http://schemas.microsoft.com/office/word/2012/wordml" xmlns:w16cex="http://schemas.microsoft.com/office/word/2018/wordml/cex" xmlns:w16cid="http://schemas.microsoft.com/office/word/2016/wordml/cid" xmlns:w16="http://schemas.microsoft.com/office/word/2018/wordml" xmlns:w16sdtdh="http://schemas.microsoft.com/office/word/2020/wordml/sdtdatahash" xmlns:w16se="http://schemas.microsoft.com/office/word/2015/wordml/symex" xmlns:wpg="http://schemas.microsoft.com/office/word/2010/wordprocessingGroup" xmlns:wpi="http://schemas.microsoft.com/office/word/2010/wordprocessingInk" xmlns:wne="http://schemas.microsoft.com/office/word/2006/wordml" xmlns:wps="http://schemas.microsoft.com/office/word/2010/wordprocessingShape" mc:Ignorable="w14 w15 w16se w16cid w16 w16cex w16sdtdh wp14">
   <w:abstractNum w:abstractNumId="0" w15:restartNumberingAfterBreak="0">
-    <w:nsid w:val="29803EC4"/>
+    <w:nsid w:val="3C9C7A80"/>
     <w:multiLevelType w:val="hybridMultilevel"/>
-    <w:tmpl w:val="46CEC9E2"/>
-    <w:lvl w:ilvl="0" w:tplc="96B40F64" w:tentative="1">
+    <w:tmpl w:val="885000A4"/>
+    <w:lvl w:ilvl="0" w:tplc="1526AC58" w:tentative="1">
       <w:start w:val="1"/>
       <w:numFmt w:val="bullet"/>
       <w:lvlText w:val="●"/>
@@ -15215,7 +15221,7 @@
         <w:ind w:left="720" w:hanging="360"/>
       </w:pPr>
     </w:lvl>
-    <w:lvl w:ilvl="1" w:tplc="EA381892" w:tentative="1">
+    <w:lvl w:ilvl="1" w:tplc="216ECC20" w:tentative="1">
       <w:start w:val="1"/>
       <w:numFmt w:val="bullet"/>
       <w:lvlText w:val="○"/>
@@ -15224,7 +15230,7 @@
         <w:ind w:left="1440" w:hanging="360"/>
       </w:pPr>
     </w:lvl>
-    <w:lvl w:ilvl="2" w:tplc="203634BE" w:tentative="1">
+    <w:lvl w:ilvl="2" w:tplc="9C7E3B70" w:tentative="1">
       <w:start w:val="1"/>
       <w:numFmt w:val="bullet"/>
       <w:lvlText w:val="■"/>
@@ -15233,7 +15239,7 @@
         <w:ind w:left="2160" w:hanging="360"/>
       </w:pPr>
     </w:lvl>
-    <w:lvl w:ilvl="3" w:tplc="C20CE888" w:tentative="1">
+    <w:lvl w:ilvl="3" w:tplc="BE322754" w:tentative="1">
       <w:start w:val="1"/>
       <w:numFmt w:val="bullet"/>
       <w:lvlText w:val="●"/>
@@ -15242,7 +15248,7 @@
         <w:ind w:left="2880" w:hanging="360"/>
       </w:pPr>
     </w:lvl>
-    <w:lvl w:ilvl="4" w:tplc="6DB8C928" w:tentative="1">
+    <w:lvl w:ilvl="4" w:tplc="4B487F66" w:tentative="1">
       <w:start w:val="1"/>
       <w:numFmt w:val="bullet"/>
       <w:lvlText w:val="○"/>
@@ -15251,7 +15257,7 @@
         <w:ind w:left="3600" w:hanging="360"/>
       </w:pPr>
     </w:lvl>
-    <w:lvl w:ilvl="5" w:tplc="BFC47C5A" w:tentative="1">
+    <w:lvl w:ilvl="5" w:tplc="F7643BFA" w:tentative="1">
       <w:start w:val="1"/>
       <w:numFmt w:val="bullet"/>
       <w:lvlText w:val="■"/>
@@ -15260,7 +15266,7 @@
         <w:ind w:left="4320" w:hanging="360"/>
       </w:pPr>
     </w:lvl>
-    <w:lvl w:ilvl="6" w:tplc="0422D7F2" w:tentative="1">
+    <w:lvl w:ilvl="6" w:tplc="4ADEA1CC" w:tentative="1">
       <w:start w:val="1"/>
       <w:numFmt w:val="bullet"/>
       <w:lvlText w:val="●"/>
@@ -15269,7 +15275,7 @@
         <w:ind w:left="5040" w:hanging="360"/>
       </w:pPr>
     </w:lvl>
-    <w:lvl w:ilvl="7" w:tplc="0B9CBABC" w:tentative="1">
+    <w:lvl w:ilvl="7" w:tplc="BC6627FC" w:tentative="1">
       <w:start w:val="1"/>
       <w:numFmt w:val="bullet"/>
       <w:lvlText w:val="●"/>
@@ -15278,7 +15284,7 @@
         <w:ind w:left="5760" w:hanging="360"/>
       </w:pPr>
     </w:lvl>
-    <w:lvl w:ilvl="8" w:tplc="7206DAE4" w:tentative="1">
+    <w:lvl w:ilvl="8" w:tplc="4A3EA50A" w:tentative="1">
       <w:start w:val="1"/>
       <w:numFmt w:val="bullet"/>
       <w:lvlText w:val="●"/>
@@ -15289,10 +15295,10 @@
     </w:lvl>
   </w:abstractNum>
   <w:abstractNum w:abstractNumId="1" w15:restartNumberingAfterBreak="0">
-    <w:nsid w:val="2AF81D54"/>
+    <w:nsid w:val="62662467"/>
     <w:multiLevelType w:val="hybridMultilevel"/>
-    <w:tmpl w:val="C4162BCC"/>
-    <w:lvl w:ilvl="0" w:tplc="A512133E">
+    <w:tmpl w:val="6B480878"/>
+    <w:lvl w:ilvl="0" w:tplc="597C674E">
       <w:start w:val="1"/>
       <w:numFmt w:val="bullet"/>
       <w:lvlText w:val="•"/>
@@ -15301,54 +15307,54 @@
         <w:ind w:left="540" w:hanging="270"/>
       </w:pPr>
     </w:lvl>
-    <w:lvl w:ilvl="1" w:tplc="853E35FA">
+    <w:lvl w:ilvl="1" w:tplc="8BC465A6">
       <w:numFmt w:val="decimal"/>
       <w:lvlText w:val=""/>
       <w:lvlJc w:val="left"/>
     </w:lvl>
-    <w:lvl w:ilvl="2" w:tplc="0952E84C">
+    <w:lvl w:ilvl="2" w:tplc="0118358E">
       <w:numFmt w:val="decimal"/>
       <w:lvlText w:val=""/>
       <w:lvlJc w:val="left"/>
     </w:lvl>
-    <w:lvl w:ilvl="3" w:tplc="6804E4B6">
+    <w:lvl w:ilvl="3" w:tplc="F01E5AD0">
       <w:numFmt w:val="decimal"/>
       <w:lvlText w:val=""/>
       <w:lvlJc w:val="left"/>
     </w:lvl>
-    <w:lvl w:ilvl="4" w:tplc="A0265EFA">
+    <w:lvl w:ilvl="4" w:tplc="31364AC6">
       <w:numFmt w:val="decimal"/>
       <w:lvlText w:val=""/>
       <w:lvlJc w:val="left"/>
     </w:lvl>
-    <w:lvl w:ilvl="5" w:tplc="15BE948A">
+    <w:lvl w:ilvl="5" w:tplc="02C0C778">
       <w:numFmt w:val="decimal"/>
       <w:lvlText w:val=""/>
       <w:lvlJc w:val="left"/>
     </w:lvl>
-    <w:lvl w:ilvl="6" w:tplc="08F62D06">
+    <w:lvl w:ilvl="6" w:tplc="FD44E766">
       <w:numFmt w:val="decimal"/>
       <w:lvlText w:val=""/>
       <w:lvlJc w:val="left"/>
     </w:lvl>
-    <w:lvl w:ilvl="7" w:tplc="8E385BAE">
+    <w:lvl w:ilvl="7" w:tplc="BA200E8E">
       <w:numFmt w:val="decimal"/>
       <w:lvlText w:val=""/>
       <w:lvlJc w:val="left"/>
     </w:lvl>
-    <w:lvl w:ilvl="8" w:tplc="7618D5D8">
+    <w:lvl w:ilvl="8" w:tplc="9870A2C4">
       <w:numFmt w:val="decimal"/>
       <w:lvlText w:val=""/>
       <w:lvlJc w:val="left"/>
     </w:lvl>
   </w:abstractNum>
-  <w:num w:numId="1" w16cid:durableId="685442496">
+  <w:num w:numId="1" w16cid:durableId="2121755081">
     <w:abstractNumId w:val="0"/>
     <w:lvlOverride w:ilvl="0">
       <w:startOverride w:val="1"/>
     </w:lvlOverride>
   </w:num>
-  <w:num w:numId="2" w16cid:durableId="1163738181">
+  <w:num w:numId="2" w16cid:durableId="191042768">
     <w:abstractNumId w:val="1"/>
     <w:lvlOverride w:ilvl="0">
       <w:startOverride w:val="1"/>

</xml_diff>